<commit_message>
Update report generation to generate an actual report.
</commit_message>
<xml_diff>
--- a/app/assets/default_template.docx
+++ b/app/assets/default_template.docx
@@ -92,9 +92,21 @@
           <w:sz w:val="20"/>
           <w:lang w:bidi="en-US"/>
         </w:rPr>
-        <w:t>report_date.month</w:t>
+        <w:t>report_</w:t>
+      </w:r>
+      <w:proofErr w:type="gramStart"/>
+      <w:r>
+        <w:rPr>
+          <w:rFonts w:ascii="Arial" w:hAnsi="Arial"/>
+          <w:b/>
+          <w:color w:val="000000"/>
+          <w:sz w:val="20"/>
+          <w:lang w:bidi="en-US"/>
+        </w:rPr>
+        <w:t>date.month</w:t>
       </w:r>
       <w:proofErr w:type="spellEnd"/>
+      <w:proofErr w:type="gramEnd"/>
       <w:r>
         <w:rPr>
           <w:rFonts w:ascii="Arial" w:hAnsi="Arial"/>
@@ -186,9 +198,21 @@
           <w:sz w:val="20"/>
           <w:lang w:bidi="en-US"/>
         </w:rPr>
-        <w:t>report_date.year</w:t>
+        <w:t>report_</w:t>
+      </w:r>
+      <w:proofErr w:type="gramStart"/>
+      <w:r>
+        <w:rPr>
+          <w:rFonts w:ascii="Arial" w:hAnsi="Arial"/>
+          <w:b/>
+          <w:color w:val="000000"/>
+          <w:sz w:val="20"/>
+          <w:lang w:bidi="en-US"/>
+        </w:rPr>
+        <w:t>date.year</w:t>
       </w:r>
       <w:proofErr w:type="spellEnd"/>
+      <w:proofErr w:type="gramEnd"/>
       <w:r>
         <w:rPr>
           <w:rFonts w:ascii="Arial" w:hAnsi="Arial"/>
@@ -324,36 +348,107 @@
           <w:u w:val="single"/>
           <w:lang w:bidi="en-US"/>
         </w:rPr>
+        <w:t>{{section.</w:t>
+      </w:r>
+      <w:r>
+        <w:rPr>
+          <w:rFonts w:ascii="Arial" w:hAnsi="Arial"/>
+          <w:b/>
+          <w:color w:val="000000"/>
+          <w:u w:val="single"/>
+          <w:lang w:bidi="en-US"/>
+        </w:rPr>
+        <w:t>name</w:t>
+      </w:r>
+      <w:r>
+        <w:rPr>
+          <w:rFonts w:ascii="Arial" w:hAnsi="Arial"/>
+          <w:b/>
+          <w:color w:val="000000"/>
+          <w:u w:val="single"/>
+          <w:lang w:bidi="en-US"/>
+        </w:rPr>
+        <w:t>}}</w:t>
+      </w:r>
+    </w:p>
+    <w:p>
+      <w:pPr>
+        <w:rPr>
+          <w:lang w:bidi="en-US"/>
+        </w:rPr>
+      </w:pPr>
+    </w:p>
+    <w:p>
+      <w:pPr>
+        <w:rPr>
+          <w:lang w:bidi="en-US"/>
+        </w:rPr>
+      </w:pPr>
+      <w:r>
+        <w:rPr>
+          <w:lang w:bidi="en-US"/>
+        </w:rPr>
+        <w:t xml:space="preserve">{% for article in </w:t>
+      </w:r>
+      <w:proofErr w:type="spellStart"/>
+      <w:proofErr w:type="gramStart"/>
+      <w:r>
+        <w:rPr>
+          <w:lang w:bidi="en-US"/>
+        </w:rPr>
+        <w:t>section.articles</w:t>
+      </w:r>
+      <w:proofErr w:type="spellEnd"/>
+      <w:proofErr w:type="gramEnd"/>
+      <w:r>
+        <w:rPr>
+          <w:lang w:bidi="en-US"/>
+        </w:rPr>
+        <w:t xml:space="preserve"> %}</w:t>
+      </w:r>
+    </w:p>
+    <w:p>
+      <w:pPr>
+        <w:rPr>
+          <w:color w:val="000000" w:themeColor="text1"/>
+          <w:lang w:bidi="en-US"/>
+        </w:rPr>
+      </w:pPr>
+      <w:r>
+        <w:rPr>
+          <w:color w:val="000000" w:themeColor="text1"/>
+          <w:lang w:bidi="en-US"/>
+        </w:rPr>
         <w:t>{{</w:t>
       </w:r>
+      <w:r>
+        <w:rPr>
+          <w:color w:val="000000" w:themeColor="text1"/>
+          <w:lang w:bidi="en-US"/>
+        </w:rPr>
+        <w:t xml:space="preserve">r </w:t>
+      </w:r>
       <w:proofErr w:type="spellStart"/>
-      <w:r>
-        <w:rPr>
-          <w:rFonts w:ascii="Arial" w:hAnsi="Arial"/>
-          <w:b/>
-          <w:color w:val="000000"/>
-          <w:u w:val="single"/>
-          <w:lang w:bidi="en-US"/>
-        </w:rPr>
-        <w:t>section.</w:t>
-      </w:r>
-      <w:r>
-        <w:rPr>
-          <w:rFonts w:ascii="Arial" w:hAnsi="Arial"/>
-          <w:b/>
-          <w:color w:val="000000"/>
-          <w:u w:val="single"/>
-          <w:lang w:bidi="en-US"/>
-        </w:rPr>
-        <w:t>title</w:t>
+      <w:proofErr w:type="gramStart"/>
+      <w:r>
+        <w:rPr>
+          <w:color w:val="000000" w:themeColor="text1"/>
+          <w:lang w:bidi="en-US"/>
+        </w:rPr>
+        <w:t>article.title</w:t>
+      </w:r>
+      <w:proofErr w:type="gramEnd"/>
+      <w:r>
+        <w:rPr>
+          <w:color w:val="000000" w:themeColor="text1"/>
+          <w:lang w:bidi="en-US"/>
+        </w:rPr>
+        <w:t>_with_link</w:t>
       </w:r>
       <w:proofErr w:type="spellEnd"/>
       <w:r>
         <w:rPr>
-          <w:rFonts w:ascii="Arial" w:hAnsi="Arial"/>
-          <w:b/>
-          <w:color w:val="000000"/>
-          <w:u w:val="single"/>
+          <w:color w:val="000000" w:themeColor="text1"/>
           <w:lang w:bidi="en-US"/>
         </w:rPr>
         <w:t>}}</w:t>
@@ -365,36 +460,111 @@
           <w:lang w:bidi="en-US"/>
         </w:rPr>
       </w:pPr>
-    </w:p>
-    <w:p>
-      <w:pPr>
-        <w:rPr>
-          <w:lang w:bidi="en-US"/>
-        </w:rPr>
-      </w:pPr>
+      <w:r>
+        <w:rPr>
+          <w:lang w:bidi="en-US"/>
+        </w:rPr>
+        <w:t>(</w:t>
+      </w:r>
       <w:r>
         <w:rPr>
           <w:lang w:bidi="en-US"/>
         </w:rPr>
         <w:t>{{</w:t>
       </w:r>
-      <w:r>
-        <w:rPr>
-          <w:lang w:bidi="en-US"/>
-        </w:rPr>
-        <w:t>section.</w:t>
-      </w:r>
-      <w:r>
-        <w:rPr>
-          <w:lang w:bidi="en-US"/>
-        </w:rPr>
-        <w:t>url</w:t>
-      </w:r>
+      <w:proofErr w:type="spellStart"/>
+      <w:proofErr w:type="gramStart"/>
+      <w:r>
+        <w:rPr>
+          <w:lang w:bidi="en-US"/>
+        </w:rPr>
+        <w:t>article.source</w:t>
+      </w:r>
+      <w:proofErr w:type="spellEnd"/>
+      <w:proofErr w:type="gramEnd"/>
       <w:r>
         <w:rPr>
           <w:lang w:bidi="en-US"/>
         </w:rPr>
         <w:t>}}</w:t>
+      </w:r>
+      <w:r>
+        <w:rPr>
+          <w:lang w:bidi="en-US"/>
+        </w:rPr>
+        <w:t>) {{</w:t>
+      </w:r>
+      <w:proofErr w:type="spellStart"/>
+      <w:proofErr w:type="gramStart"/>
+      <w:r>
+        <w:rPr>
+          <w:lang w:bidi="en-US"/>
+        </w:rPr>
+        <w:t>article.date</w:t>
+      </w:r>
+      <w:proofErr w:type="spellEnd"/>
+      <w:proofErr w:type="gramEnd"/>
+      <w:r>
+        <w:rPr>
+          <w:lang w:bidi="en-US"/>
+        </w:rPr>
+        <w:t>}}</w:t>
+      </w:r>
+    </w:p>
+    <w:p>
+      <w:pPr>
+        <w:rPr>
+          <w:lang w:bidi="en-US"/>
+        </w:rPr>
+      </w:pPr>
+      <w:r>
+        <w:rPr>
+          <w:lang w:bidi="en-US"/>
+        </w:rPr>
+        <w:t>{{</w:t>
+      </w:r>
+      <w:proofErr w:type="spellStart"/>
+      <w:proofErr w:type="gramStart"/>
+      <w:r>
+        <w:rPr>
+          <w:lang w:bidi="en-US"/>
+        </w:rPr>
+        <w:t>article.summary</w:t>
+      </w:r>
+      <w:proofErr w:type="spellEnd"/>
+      <w:proofErr w:type="gramEnd"/>
+      <w:r>
+        <w:rPr>
+          <w:lang w:bidi="en-US"/>
+        </w:rPr>
+        <w:t>}}</w:t>
+      </w:r>
+    </w:p>
+    <w:p>
+      <w:pPr>
+        <w:rPr>
+          <w:lang w:bidi="en-US"/>
+        </w:rPr>
+      </w:pPr>
+      <w:r>
+        <w:rPr>
+          <w:lang w:bidi="en-US"/>
+        </w:rPr>
+        <w:t xml:space="preserve">{% </w:t>
+      </w:r>
+      <w:proofErr w:type="spellStart"/>
+      <w:r>
+        <w:rPr>
+          <w:lang w:bidi="en-US"/>
+        </w:rPr>
+        <w:t>endfor</w:t>
+      </w:r>
+      <w:proofErr w:type="spellEnd"/>
+      <w:r>
+        <w:rPr>
+          <w:lang w:bidi="en-US"/>
+        </w:rPr>
+        <w:t xml:space="preserve"> %}</w:t>
       </w:r>
     </w:p>
     <w:p>
@@ -694,9 +864,8 @@
           <w:u w:val="single"/>
           <w:lang w:bidi="en-US"/>
         </w:rPr>
-        <w:t>{{</w:t>
-      </w:r>
-      <w:proofErr w:type="spellStart"/>
+        <w:t>{{section.</w:t>
+      </w:r>
       <w:r>
         <w:rPr>
           <w:rFonts w:ascii="Arial" w:hAnsi="Arial"/>
@@ -705,19 +874,8 @@
           <w:u w:val="single"/>
           <w:lang w:bidi="en-US"/>
         </w:rPr>
-        <w:t>section.</w:t>
-      </w:r>
-      <w:r>
-        <w:rPr>
-          <w:rFonts w:ascii="Arial" w:hAnsi="Arial"/>
-          <w:b/>
-          <w:color w:val="000000"/>
-          <w:u w:val="single"/>
-          <w:lang w:bidi="en-US"/>
-        </w:rPr>
-        <w:t>title</w:t>
-      </w:r>
-      <w:proofErr w:type="spellEnd"/>
+        <w:t>name</w:t>
+      </w:r>
       <w:r>
         <w:rPr>
           <w:rFonts w:ascii="Arial" w:hAnsi="Arial"/>
@@ -745,58 +903,193 @@
     <w:p>
       <w:pPr>
         <w:rPr>
-          <w:rFonts w:ascii="Arial" w:hAnsi="Arial" w:cs="Arial"/>
-          <w:sz w:val="20"/>
-          <w:szCs w:val="20"/>
-          <w:lang w:bidi="en-US"/>
-        </w:rPr>
-      </w:pPr>
-      <w:r>
-        <w:rPr>
-          <w:rFonts w:ascii="Arial" w:hAnsi="Arial" w:cs="Arial"/>
-          <w:sz w:val="20"/>
-          <w:szCs w:val="20"/>
+          <w:lang w:bidi="en-US"/>
+        </w:rPr>
+      </w:pPr>
+      <w:r>
+        <w:rPr>
+          <w:lang w:bidi="en-US"/>
+        </w:rPr>
+        <w:t xml:space="preserve">{% for article in </w:t>
+      </w:r>
+      <w:proofErr w:type="spellStart"/>
+      <w:proofErr w:type="gramStart"/>
+      <w:r>
+        <w:rPr>
+          <w:lang w:bidi="en-US"/>
+        </w:rPr>
+        <w:t>section.articles</w:t>
+      </w:r>
+      <w:proofErr w:type="spellEnd"/>
+      <w:proofErr w:type="gramEnd"/>
+      <w:r>
+        <w:rPr>
+          <w:lang w:bidi="en-US"/>
+        </w:rPr>
+        <w:t xml:space="preserve"> %}</w:t>
+      </w:r>
+    </w:p>
+    <w:p>
+      <w:pPr>
+        <w:rPr>
+          <w:color w:val="000000" w:themeColor="text1"/>
+          <w:lang w:bidi="en-US"/>
+        </w:rPr>
+      </w:pPr>
+      <w:r>
+        <w:rPr>
+          <w:color w:val="000000" w:themeColor="text1"/>
           <w:lang w:bidi="en-US"/>
         </w:rPr>
         <w:t>{{</w:t>
       </w:r>
+      <w:r>
+        <w:rPr>
+          <w:color w:val="000000" w:themeColor="text1"/>
+          <w:lang w:bidi="en-US"/>
+        </w:rPr>
+        <w:t xml:space="preserve">r </w:t>
+      </w:r>
       <w:proofErr w:type="spellStart"/>
-      <w:r>
-        <w:rPr>
-          <w:rFonts w:ascii="Arial" w:hAnsi="Arial" w:cs="Arial"/>
-          <w:sz w:val="20"/>
-          <w:szCs w:val="20"/>
-          <w:lang w:bidi="en-US"/>
-        </w:rPr>
-        <w:t>section.</w:t>
-      </w:r>
-      <w:r>
-        <w:rPr>
-          <w:rFonts w:ascii="Arial" w:hAnsi="Arial" w:cs="Arial"/>
-          <w:sz w:val="20"/>
-          <w:szCs w:val="20"/>
-          <w:lang w:bidi="en-US"/>
-        </w:rPr>
-        <w:t>text</w:t>
+      <w:proofErr w:type="gramStart"/>
+      <w:r>
+        <w:rPr>
+          <w:color w:val="000000" w:themeColor="text1"/>
+          <w:lang w:bidi="en-US"/>
+        </w:rPr>
+        <w:t>article.title</w:t>
+      </w:r>
+      <w:proofErr w:type="gramEnd"/>
+      <w:r>
+        <w:rPr>
+          <w:color w:val="000000" w:themeColor="text1"/>
+          <w:lang w:bidi="en-US"/>
+        </w:rPr>
+        <w:t>_with_link</w:t>
       </w:r>
       <w:proofErr w:type="spellEnd"/>
       <w:r>
         <w:rPr>
-          <w:rFonts w:ascii="Arial" w:hAnsi="Arial" w:cs="Arial"/>
-          <w:sz w:val="20"/>
-          <w:szCs w:val="20"/>
-          <w:lang w:bidi="en-US"/>
-        </w:rPr>
-        <w:t xml:space="preserve"> </w:t>
-      </w:r>
-      <w:r>
-        <w:rPr>
-          <w:rFonts w:ascii="Arial" w:hAnsi="Arial" w:cs="Arial"/>
-          <w:sz w:val="20"/>
-          <w:szCs w:val="20"/>
+          <w:color w:val="000000" w:themeColor="text1"/>
           <w:lang w:bidi="en-US"/>
         </w:rPr>
         <w:t>}}</w:t>
+      </w:r>
+    </w:p>
+    <w:p>
+      <w:pPr>
+        <w:rPr>
+          <w:color w:val="0000FF"/>
+          <w:lang w:bidi="en-US"/>
+        </w:rPr>
+      </w:pPr>
+      <w:r>
+        <w:rPr>
+          <w:lang w:bidi="en-US"/>
+        </w:rPr>
+        <w:t>(</w:t>
+      </w:r>
+      <w:r>
+        <w:rPr>
+          <w:lang w:bidi="en-US"/>
+        </w:rPr>
+        <w:t>{{</w:t>
+      </w:r>
+      <w:proofErr w:type="spellStart"/>
+      <w:r>
+        <w:rPr>
+          <w:lang w:bidi="en-US"/>
+        </w:rPr>
+        <w:t>article.source</w:t>
+      </w:r>
+      <w:proofErr w:type="spellEnd"/>
+      <w:r>
+        <w:rPr>
+          <w:lang w:bidi="en-US"/>
+        </w:rPr>
+        <w:t>}})</w:t>
+      </w:r>
+      <w:r>
+        <w:rPr>
+          <w:lang w:bidi="en-US"/>
+        </w:rPr>
+        <w:t xml:space="preserve"> {{</w:t>
+      </w:r>
+      <w:proofErr w:type="spellStart"/>
+      <w:r>
+        <w:rPr>
+          <w:lang w:bidi="en-US"/>
+        </w:rPr>
+        <w:t>article.date</w:t>
+      </w:r>
+      <w:proofErr w:type="spellEnd"/>
+      <w:r>
+        <w:rPr>
+          <w:lang w:bidi="en-US"/>
+        </w:rPr>
+        <w:t>}}</w:t>
+      </w:r>
+    </w:p>
+    <w:p>
+      <w:pPr>
+        <w:rPr>
+          <w:lang w:bidi="en-US"/>
+        </w:rPr>
+      </w:pPr>
+      <w:r>
+        <w:rPr>
+          <w:lang w:bidi="en-US"/>
+        </w:rPr>
+        <w:t>{{</w:t>
+      </w:r>
+      <w:proofErr w:type="spellStart"/>
+      <w:proofErr w:type="gramStart"/>
+      <w:r>
+        <w:rPr>
+          <w:lang w:bidi="en-US"/>
+        </w:rPr>
+        <w:t>article.full</w:t>
+      </w:r>
+      <w:proofErr w:type="gramEnd"/>
+      <w:r>
+        <w:rPr>
+          <w:lang w:bidi="en-US"/>
+        </w:rPr>
+        <w:t>_text</w:t>
+      </w:r>
+      <w:proofErr w:type="spellEnd"/>
+      <w:r>
+        <w:rPr>
+          <w:lang w:bidi="en-US"/>
+        </w:rPr>
+        <w:t>}}</w:t>
+      </w:r>
+    </w:p>
+    <w:p>
+      <w:pPr>
+        <w:rPr>
+          <w:lang w:bidi="en-US"/>
+        </w:rPr>
+      </w:pPr>
+      <w:r>
+        <w:rPr>
+          <w:lang w:bidi="en-US"/>
+        </w:rPr>
+        <w:t xml:space="preserve">{% </w:t>
+      </w:r>
+      <w:proofErr w:type="spellStart"/>
+      <w:r>
+        <w:rPr>
+          <w:lang w:bidi="en-US"/>
+        </w:rPr>
+        <w:t>endfor</w:t>
+      </w:r>
+      <w:proofErr w:type="spellEnd"/>
+      <w:r>
+        <w:rPr>
+          <w:lang w:bidi="en-US"/>
+        </w:rPr>
+        <w:t xml:space="preserve"> %}</w:t>
       </w:r>
     </w:p>
     <w:p>
@@ -3455,12 +3748,7 @@
 </file>
 
 <file path=customXml/item2.xml><?xml version="1.0" encoding="utf-8"?>
-<?mso-contentType ?>
-<FormTemplates xmlns="http://schemas.microsoft.com/sharepoint/v3/contenttype/forms">
-  <Display>DocumentLibraryForm</Display>
-  <Edit>DocumentLibraryForm</Edit>
-  <New>DocumentLibraryForm</New>
-</FormTemplates>
+<b:Sources xmlns:b="http://schemas.openxmlformats.org/officeDocument/2006/bibliography" xmlns="http://schemas.openxmlformats.org/officeDocument/2006/bibliography" SelectedStyle="\APA.XSL" StyleName="APA"/>
 </file>
 
 <file path=customXml/item3.xml><?xml version="1.0" encoding="utf-8"?>
@@ -3477,7 +3765,12 @@
 </file>
 
 <file path=customXml/item4.xml><?xml version="1.0" encoding="utf-8"?>
-<b:Sources xmlns:b="http://schemas.openxmlformats.org/officeDocument/2006/bibliography" xmlns="http://schemas.openxmlformats.org/officeDocument/2006/bibliography" SelectedStyle="\APA.XSL" StyleName="APA"/>
+<?mso-contentType ?>
+<FormTemplates xmlns="http://schemas.microsoft.com/sharepoint/v3/contenttype/forms">
+  <Display>DocumentLibraryForm</Display>
+  <Edit>DocumentLibraryForm</Edit>
+  <New>DocumentLibraryForm</New>
+</FormTemplates>
 </file>
 
 <file path=customXml/itemProps1.xml><?xml version="1.0" encoding="utf-8"?>
@@ -3501,9 +3794,9 @@
 </file>
 
 <file path=customXml/itemProps2.xml><?xml version="1.0" encoding="utf-8"?>
-<ds:datastoreItem xmlns:ds="http://schemas.openxmlformats.org/officeDocument/2006/customXml" ds:itemID="{2ACA00A0-0EB9-4F25-B1A0-9480A1DEA0B5}">
+<ds:datastoreItem xmlns:ds="http://schemas.openxmlformats.org/officeDocument/2006/customXml" ds:itemID="{4202E056-596C-4D43-866F-DBCC294656E0}">
   <ds:schemaRefs>
-    <ds:schemaRef ds:uri="http://schemas.microsoft.com/sharepoint/v3/contenttype/forms"/>
+    <ds:schemaRef ds:uri="http://schemas.openxmlformats.org/officeDocument/2006/bibliography"/>
   </ds:schemaRefs>
 </ds:datastoreItem>
 </file>
@@ -3521,9 +3814,9 @@
 </file>
 
 <file path=customXml/itemProps4.xml><?xml version="1.0" encoding="utf-8"?>
-<ds:datastoreItem xmlns:ds="http://schemas.openxmlformats.org/officeDocument/2006/customXml" ds:itemID="{4202E056-596C-4D43-866F-DBCC294656E0}">
+<ds:datastoreItem xmlns:ds="http://schemas.openxmlformats.org/officeDocument/2006/customXml" ds:itemID="{2ACA00A0-0EB9-4F25-B1A0-9480A1DEA0B5}">
   <ds:schemaRefs>
-    <ds:schemaRef ds:uri="http://schemas.openxmlformats.org/officeDocument/2006/bibliography"/>
+    <ds:schemaRef ds:uri="http://schemas.microsoft.com/sharepoint/v3/contenttype/forms"/>
   </ds:schemaRefs>
 </ds:datastoreItem>
 </file>

</xml_diff>

<commit_message>
Make report use the layout object.
</commit_message>
<xml_diff>
--- a/app/assets/default_template.docx
+++ b/app/assets/default_template.docx
@@ -546,48 +546,9 @@
           <w:lang w:bidi="en-US"/>
         </w:rPr>
       </w:pPr>
-      <w:r>
-        <w:rPr>
-          <w:lang w:bidi="en-US"/>
-        </w:rPr>
-        <w:t xml:space="preserve">{% </w:t>
-      </w:r>
-      <w:proofErr w:type="spellStart"/>
-      <w:r>
-        <w:rPr>
-          <w:lang w:bidi="en-US"/>
-        </w:rPr>
-        <w:t>endfor</w:t>
-      </w:r>
-      <w:proofErr w:type="spellEnd"/>
-      <w:r>
-        <w:rPr>
-          <w:lang w:bidi="en-US"/>
-        </w:rPr>
-        <w:t xml:space="preserve"> %}</w:t>
-      </w:r>
-    </w:p>
-    <w:p>
-      <w:pPr>
-        <w:rPr>
-          <w:rFonts w:ascii="Arial" w:hAnsi="Arial"/>
-          <w:b/>
-          <w:color w:val="000000"/>
-          <w:sz w:val="20"/>
-          <w:szCs w:val="20"/>
-          <w:u w:val="single"/>
-          <w:lang w:bidi="en-US"/>
-        </w:rPr>
-      </w:pPr>
     </w:p>
     <w:bookmarkStart w:id="7" w:name="_Hlk190227748"/>
     <w:p>
-      <w:pPr>
-        <w:rPr>
-          <w:sz w:val="18"/>
-          <w:szCs w:val="18"/>
-        </w:rPr>
-      </w:pPr>
       <w:r>
         <w:fldChar w:fldCharType="begin"/>
       </w:r>
@@ -654,15 +615,37 @@
     <w:p>
       <w:pPr>
         <w:rPr>
-          <w:rFonts w:ascii="Arial" w:hAnsi="Arial"/>
-          <w:b/>
-          <w:color w:val="000000"/>
-          <w:sz w:val="20"/>
-          <w:szCs w:val="20"/>
-          <w:u w:val="single"/>
-          <w:lang w:bidi="en-US"/>
-        </w:rPr>
-      </w:pPr>
+          <w:sz w:val="18"/>
+          <w:szCs w:val="18"/>
+        </w:rPr>
+      </w:pPr>
+    </w:p>
+    <w:p>
+      <w:pPr>
+        <w:rPr>
+          <w:lang w:bidi="en-US"/>
+        </w:rPr>
+      </w:pPr>
+      <w:r>
+        <w:rPr>
+          <w:lang w:bidi="en-US"/>
+        </w:rPr>
+        <w:t xml:space="preserve">{% </w:t>
+      </w:r>
+      <w:proofErr w:type="spellStart"/>
+      <w:r>
+        <w:rPr>
+          <w:lang w:bidi="en-US"/>
+        </w:rPr>
+        <w:t>endfor</w:t>
+      </w:r>
+      <w:proofErr w:type="spellEnd"/>
+      <w:r>
+        <w:rPr>
+          <w:lang w:bidi="en-US"/>
+        </w:rPr>
+        <w:t xml:space="preserve"> %}</w:t>
+      </w:r>
     </w:p>
     <w:p>
       <w:pPr>
@@ -1068,33 +1051,6 @@
     <w:p>
       <w:pPr>
         <w:rPr>
-          <w:lang w:bidi="en-US"/>
-        </w:rPr>
-      </w:pPr>
-      <w:r>
-        <w:rPr>
-          <w:lang w:bidi="en-US"/>
-        </w:rPr>
-        <w:t xml:space="preserve">{% </w:t>
-      </w:r>
-      <w:proofErr w:type="spellStart"/>
-      <w:r>
-        <w:rPr>
-          <w:lang w:bidi="en-US"/>
-        </w:rPr>
-        <w:t>endfor</w:t>
-      </w:r>
-      <w:proofErr w:type="spellEnd"/>
-      <w:r>
-        <w:rPr>
-          <w:lang w:bidi="en-US"/>
-        </w:rPr>
-        <w:t xml:space="preserve"> %}</w:t>
-      </w:r>
-    </w:p>
-    <w:p>
-      <w:pPr>
-        <w:rPr>
           <w:rFonts w:ascii="Arial" w:hAnsi="Arial" w:cs="Arial"/>
           <w:sz w:val="20"/>
           <w:szCs w:val="20"/>
@@ -1103,12 +1059,6 @@
       </w:pPr>
     </w:p>
     <w:p>
-      <w:pPr>
-        <w:rPr>
-          <w:sz w:val="18"/>
-          <w:szCs w:val="18"/>
-        </w:rPr>
-      </w:pPr>
       <w:hyperlink w:anchor="_Increase_Joint_Force_2" w:history="1">
         <w:r>
           <w:rPr>
@@ -1123,7 +1073,41 @@
         </w:r>
       </w:hyperlink>
     </w:p>
-    <w:p/>
+    <w:p>
+      <w:pPr>
+        <w:rPr>
+          <w:sz w:val="18"/>
+          <w:szCs w:val="18"/>
+        </w:rPr>
+      </w:pPr>
+    </w:p>
+    <w:p>
+      <w:pPr>
+        <w:rPr>
+          <w:lang w:bidi="en-US"/>
+        </w:rPr>
+      </w:pPr>
+      <w:r>
+        <w:rPr>
+          <w:lang w:bidi="en-US"/>
+        </w:rPr>
+        <w:t xml:space="preserve">{% </w:t>
+      </w:r>
+      <w:proofErr w:type="spellStart"/>
+      <w:r>
+        <w:rPr>
+          <w:lang w:bidi="en-US"/>
+        </w:rPr>
+        <w:t>endfor</w:t>
+      </w:r>
+      <w:proofErr w:type="spellEnd"/>
+      <w:r>
+        <w:rPr>
+          <w:lang w:bidi="en-US"/>
+        </w:rPr>
+        <w:t xml:space="preserve"> %}</w:t>
+      </w:r>
+    </w:p>
     <w:p>
       <w:r>
         <w:rPr>
@@ -3502,6 +3486,32 @@
 </file>
 
 <file path=customXml/item1.xml><?xml version="1.0" encoding="utf-8"?>
+<?mso-contentType ?>
+<FormTemplates xmlns="http://schemas.microsoft.com/sharepoint/v3/contenttype/forms">
+  <Display>DocumentLibraryForm</Display>
+  <Edit>DocumentLibraryForm</Edit>
+  <New>DocumentLibraryForm</New>
+</FormTemplates>
+</file>
+
+<file path=customXml/item2.xml><?xml version="1.0" encoding="utf-8"?>
+<p:properties xmlns:p="http://schemas.microsoft.com/office/2006/metadata/properties" xmlns:xsi="http://www.w3.org/2001/XMLSchema-instance" xmlns:pc="http://schemas.microsoft.com/office/infopath/2007/PartnerControls">
+  <documentManagement>
+    <TaxCatchAll xmlns="38d2a309-d798-495b-b1a3-e97c37808eef"/>
+    <_ip_UnifiedCompliancePolicyUIAction xmlns="http://schemas.microsoft.com/sharepoint/v3" xsi:nil="true"/>
+    <_ip_UnifiedCompliancePolicyProperties xmlns="http://schemas.microsoft.com/sharepoint/v3" xsi:nil="true"/>
+    <lcf76f155ced4ddcb4097134ff3c332f xmlns="416eecfc-56a7-4354-8013-4a2d9c92e153">
+      <Terms xmlns="http://schemas.microsoft.com/office/infopath/2007/PartnerControls"/>
+    </lcf76f155ced4ddcb4097134ff3c332f>
+  </documentManagement>
+</p:properties>
+</file>
+
+<file path=customXml/item3.xml><?xml version="1.0" encoding="utf-8"?>
+<b:Sources xmlns:b="http://schemas.openxmlformats.org/officeDocument/2006/bibliography" xmlns="http://schemas.openxmlformats.org/officeDocument/2006/bibliography" SelectedStyle="\APA.XSL" StyleName="APA"/>
+</file>
+
+<file path=customXml/item4.xml><?xml version="1.0" encoding="utf-8"?>
 <ct:contentTypeSchema xmlns:ct="http://schemas.microsoft.com/office/2006/metadata/contentType" xmlns:ma="http://schemas.microsoft.com/office/2006/metadata/properties/metaAttributes" ct:_="" ma:_="" ma:contentTypeName="Document" ma:contentTypeID="0x010100E48B1925F2EFB241960044EC5F64C034" ma:contentTypeVersion="16" ma:contentTypeDescription="Create a new document." ma:contentTypeScope="" ma:versionID="b193f1a1adb628ee5f7d642c4cb4fead">
   <xsd:schema xmlns:xsd="http://www.w3.org/2001/XMLSchema" xmlns:xs="http://www.w3.org/2001/XMLSchema" xmlns:p="http://schemas.microsoft.com/office/2006/metadata/properties" xmlns:ns1="http://schemas.microsoft.com/sharepoint/v3" xmlns:ns2="416eecfc-56a7-4354-8013-4a2d9c92e153" xmlns:ns3="38d2a309-d798-495b-b1a3-e97c37808eef" targetNamespace="http://schemas.microsoft.com/office/2006/metadata/properties" ma:root="true" ma:fieldsID="f4c72206c132b1461c2865266b50231c" ns1:_="" ns2:_="" ns3:_="">
     <xsd:import namespace="http://schemas.microsoft.com/sharepoint/v3"/>
@@ -3747,33 +3757,35 @@
 </ct:contentTypeSchema>
 </file>
 
-<file path=customXml/item2.xml><?xml version="1.0" encoding="utf-8"?>
-<b:Sources xmlns:b="http://schemas.openxmlformats.org/officeDocument/2006/bibliography" xmlns="http://schemas.openxmlformats.org/officeDocument/2006/bibliography" SelectedStyle="\APA.XSL" StyleName="APA"/>
+<file path=customXml/itemProps1.xml><?xml version="1.0" encoding="utf-8"?>
+<ds:datastoreItem xmlns:ds="http://schemas.openxmlformats.org/officeDocument/2006/customXml" ds:itemID="{2ACA00A0-0EB9-4F25-B1A0-9480A1DEA0B5}">
+  <ds:schemaRefs>
+    <ds:schemaRef ds:uri="http://schemas.microsoft.com/sharepoint/v3/contenttype/forms"/>
+  </ds:schemaRefs>
+</ds:datastoreItem>
 </file>
 
-<file path=customXml/item3.xml><?xml version="1.0" encoding="utf-8"?>
-<p:properties xmlns:p="http://schemas.microsoft.com/office/2006/metadata/properties" xmlns:xsi="http://www.w3.org/2001/XMLSchema-instance" xmlns:pc="http://schemas.microsoft.com/office/infopath/2007/PartnerControls">
-  <documentManagement>
-    <TaxCatchAll xmlns="38d2a309-d798-495b-b1a3-e97c37808eef"/>
-    <_ip_UnifiedCompliancePolicyUIAction xmlns="http://schemas.microsoft.com/sharepoint/v3" xsi:nil="true"/>
-    <_ip_UnifiedCompliancePolicyProperties xmlns="http://schemas.microsoft.com/sharepoint/v3" xsi:nil="true"/>
-    <lcf76f155ced4ddcb4097134ff3c332f xmlns="416eecfc-56a7-4354-8013-4a2d9c92e153">
-      <Terms xmlns="http://schemas.microsoft.com/office/infopath/2007/PartnerControls"/>
-    </lcf76f155ced4ddcb4097134ff3c332f>
-  </documentManagement>
-</p:properties>
+<file path=customXml/itemProps2.xml><?xml version="1.0" encoding="utf-8"?>
+<ds:datastoreItem xmlns:ds="http://schemas.openxmlformats.org/officeDocument/2006/customXml" ds:itemID="{5D491C04-0035-45EA-BE2E-2976A5F7A397}">
+  <ds:schemaRefs>
+    <ds:schemaRef ds:uri="http://schemas.microsoft.com/office/2006/metadata/properties"/>
+    <ds:schemaRef ds:uri="http://schemas.microsoft.com/office/infopath/2007/PartnerControls"/>
+    <ds:schemaRef ds:uri="38d2a309-d798-495b-b1a3-e97c37808eef"/>
+    <ds:schemaRef ds:uri="http://schemas.microsoft.com/sharepoint/v3"/>
+    <ds:schemaRef ds:uri="416eecfc-56a7-4354-8013-4a2d9c92e153"/>
+  </ds:schemaRefs>
+</ds:datastoreItem>
 </file>
 
-<file path=customXml/item4.xml><?xml version="1.0" encoding="utf-8"?>
-<?mso-contentType ?>
-<FormTemplates xmlns="http://schemas.microsoft.com/sharepoint/v3/contenttype/forms">
-  <Display>DocumentLibraryForm</Display>
-  <Edit>DocumentLibraryForm</Edit>
-  <New>DocumentLibraryForm</New>
-</FormTemplates>
+<file path=customXml/itemProps3.xml><?xml version="1.0" encoding="utf-8"?>
+<ds:datastoreItem xmlns:ds="http://schemas.openxmlformats.org/officeDocument/2006/customXml" ds:itemID="{4202E056-596C-4D43-866F-DBCC294656E0}">
+  <ds:schemaRefs>
+    <ds:schemaRef ds:uri="http://schemas.openxmlformats.org/officeDocument/2006/bibliography"/>
+  </ds:schemaRefs>
+</ds:datastoreItem>
 </file>
 
-<file path=customXml/itemProps1.xml><?xml version="1.0" encoding="utf-8"?>
+<file path=customXml/itemProps4.xml><?xml version="1.0" encoding="utf-8"?>
 <ds:datastoreItem xmlns:ds="http://schemas.openxmlformats.org/officeDocument/2006/customXml" ds:itemID="{3AA634C4-AFF1-45A4-BEEC-3BC128C36838}">
   <ds:schemaRefs>
     <ds:schemaRef ds:uri="http://schemas.microsoft.com/office/2006/metadata/contentType"/>
@@ -3793,34 +3805,6 @@
 </ds:datastoreItem>
 </file>
 
-<file path=customXml/itemProps2.xml><?xml version="1.0" encoding="utf-8"?>
-<ds:datastoreItem xmlns:ds="http://schemas.openxmlformats.org/officeDocument/2006/customXml" ds:itemID="{4202E056-596C-4D43-866F-DBCC294656E0}">
-  <ds:schemaRefs>
-    <ds:schemaRef ds:uri="http://schemas.openxmlformats.org/officeDocument/2006/bibliography"/>
-  </ds:schemaRefs>
-</ds:datastoreItem>
-</file>
-
-<file path=customXml/itemProps3.xml><?xml version="1.0" encoding="utf-8"?>
-<ds:datastoreItem xmlns:ds="http://schemas.openxmlformats.org/officeDocument/2006/customXml" ds:itemID="{5D491C04-0035-45EA-BE2E-2976A5F7A397}">
-  <ds:schemaRefs>
-    <ds:schemaRef ds:uri="http://schemas.microsoft.com/office/2006/metadata/properties"/>
-    <ds:schemaRef ds:uri="http://schemas.microsoft.com/office/infopath/2007/PartnerControls"/>
-    <ds:schemaRef ds:uri="38d2a309-d798-495b-b1a3-e97c37808eef"/>
-    <ds:schemaRef ds:uri="http://schemas.microsoft.com/sharepoint/v3"/>
-    <ds:schemaRef ds:uri="416eecfc-56a7-4354-8013-4a2d9c92e153"/>
-  </ds:schemaRefs>
-</ds:datastoreItem>
-</file>
-
-<file path=customXml/itemProps4.xml><?xml version="1.0" encoding="utf-8"?>
-<ds:datastoreItem xmlns:ds="http://schemas.openxmlformats.org/officeDocument/2006/customXml" ds:itemID="{2ACA00A0-0EB9-4F25-B1A0-9480A1DEA0B5}">
-  <ds:schemaRefs>
-    <ds:schemaRef ds:uri="http://schemas.microsoft.com/sharepoint/v3/contenttype/forms"/>
-  </ds:schemaRefs>
-</ds:datastoreItem>
-</file>
-
 <file path=docMetadata/LabelInfo.xml><?xml version="1.0" encoding="utf-8"?>
 <clbl:labelList xmlns:clbl="http://schemas.microsoft.com/office/2020/mipLabelMetadata">
   <clbl:label id="{3de9faa6-9fe1-49b3-9a08-227a296b54a6}" enabled="1" method="Privileged" siteId="{66d73691-ea97-48b1-95d5-e94f0a46b878}" contentBits="0" removed="0"/>

</xml_diff>

<commit_message>
Fix hyperlinks in docx template.
</commit_message>
<xml_diff>
--- a/app/assets/default_template.docx
+++ b/app/assets/default_template.docx
@@ -1,6 +1,6 @@
 
 <file path=word/document.xml><?xml version="1.0" encoding="utf-8"?>
-<w:document xmlns:wpc="http://schemas.microsoft.com/office/word/2010/wordprocessingCanvas" xmlns:cx="http://schemas.microsoft.com/office/drawing/2014/chartex" xmlns:cx1="http://schemas.microsoft.com/office/drawing/2015/9/8/chartex" xmlns:cx2="http://schemas.microsoft.com/office/drawing/2015/10/21/chartex" xmlns:cx3="http://schemas.microsoft.com/office/drawing/2016/5/9/chartex" xmlns:cx4="http://schemas.microsoft.com/office/drawing/2016/5/10/chartex" xmlns:cx5="http://schemas.microsoft.com/office/drawing/2016/5/11/chartex" xmlns:cx6="http://schemas.microsoft.com/office/drawing/2016/5/12/chartex" xmlns:cx7="http://schemas.microsoft.com/office/drawing/2016/5/13/chartex" xmlns:cx8="http://schemas.microsoft.com/office/drawing/2016/5/14/chartex" xmlns:mc="http://schemas.openxmlformats.org/markup-compatibility/2006" xmlns:aink="http://schemas.microsoft.com/office/drawing/2016/ink" xmlns:am3d="http://schemas.microsoft.com/office/drawing/2017/model3d" xmlns:o="urn:schemas-microsoft-com:office:office" xmlns:oel="http://schemas.microsoft.com/office/2019/extlst" xmlns:r="http://schemas.openxmlformats.org/officeDocument/2006/relationships" xmlns:m="http://schemas.openxmlformats.org/officeDocument/2006/math" xmlns:v="urn:schemas-microsoft-com:vml" xmlns:wp14="http://schemas.microsoft.com/office/word/2010/wordprocessingDrawing" xmlns:wp="http://schemas.openxmlformats.org/drawingml/2006/wordprocessingDrawing" xmlns:w10="urn:schemas-microsoft-com:office:word" xmlns:w="http://schemas.openxmlformats.org/wordprocessingml/2006/main" xmlns:w14="http://schemas.microsoft.com/office/word/2010/wordml" xmlns:w15="http://schemas.microsoft.com/office/word/2012/wordml" xmlns:w16cex="http://schemas.microsoft.com/office/word/2018/wordml/cex" xmlns:w16cid="http://schemas.microsoft.com/office/word/2016/wordml/cid" xmlns:w16="http://schemas.microsoft.com/office/word/2018/wordml" xmlns:w16du="http://schemas.microsoft.com/office/word/2023/wordml/word16du" xmlns:w16sdtdh="http://schemas.microsoft.com/office/word/2020/wordml/sdtdatahash" xmlns:w16sdtfl="http://schemas.microsoft.com/office/word/2024/wordml/sdtformatlock" xmlns:w16se="http://schemas.microsoft.com/office/word/2015/wordml/symex" xmlns:wpg="http://schemas.microsoft.com/office/word/2010/wordprocessingGroup" xmlns:wpi="http://schemas.microsoft.com/office/word/2010/wordprocessingInk" xmlns:wne="http://schemas.microsoft.com/office/word/2006/wordml" xmlns:wps="http://schemas.microsoft.com/office/word/2010/wordprocessingShape" mc:Ignorable="w14 w15 w16se w16cid w16 w16cex w16sdtdh w16sdtfl w16du wp14">
+<w:document xmlns:wpc="http://schemas.microsoft.com/office/word/2010/wordprocessingCanvas" xmlns:cx="http://schemas.microsoft.com/office/drawing/2014/chartex" xmlns:cx1="http://schemas.microsoft.com/office/drawing/2015/9/8/chartex" xmlns:cx2="http://schemas.microsoft.com/office/drawing/2015/10/21/chartex" xmlns:cx3="http://schemas.microsoft.com/office/drawing/2016/5/9/chartex" xmlns:cx4="http://schemas.microsoft.com/office/drawing/2016/5/10/chartex" xmlns:cx5="http://schemas.microsoft.com/office/drawing/2016/5/11/chartex" xmlns:cx6="http://schemas.microsoft.com/office/drawing/2016/5/12/chartex" xmlns:cx7="http://schemas.microsoft.com/office/drawing/2016/5/13/chartex" xmlns:cx8="http://schemas.microsoft.com/office/drawing/2016/5/14/chartex" xmlns:mc="http://schemas.openxmlformats.org/markup-compatibility/2006" xmlns:m="http://schemas.openxmlformats.org/officeDocument/2006/math" xmlns:aink="http://schemas.microsoft.com/office/drawing/2016/ink" xmlns:am3d="http://schemas.microsoft.com/office/drawing/2017/model3d" xmlns:oel="http://schemas.microsoft.com/office/2019/extlst" xmlns:r="http://schemas.openxmlformats.org/officeDocument/2006/relationships" xmlns:wp14="http://schemas.microsoft.com/office/word/2010/wordprocessingDrawing" xmlns:wp="http://schemas.openxmlformats.org/drawingml/2006/wordprocessingDrawing" xmlns:wpg="http://schemas.microsoft.com/office/word/2010/wordprocessingGroup" xmlns:wpi="http://schemas.microsoft.com/office/word/2010/wordprocessingInk" xmlns:wps="http://schemas.microsoft.com/office/word/2010/wordprocessingShape" xmlns:o="urn:schemas-microsoft-com:office:office" xmlns:v="urn:schemas-microsoft-com:vml" xmlns:w10="urn:schemas-microsoft-com:office:word" xmlns:w="http://schemas.openxmlformats.org/wordprocessingml/2006/main" xmlns:w14="http://schemas.microsoft.com/office/word/2010/wordml" xmlns:w15="http://schemas.microsoft.com/office/word/2012/wordml" xmlns:w16cex="http://schemas.microsoft.com/office/word/2018/wordml/cex" xmlns:w16cid="http://schemas.microsoft.com/office/word/2016/wordml/cid" xmlns:w16="http://schemas.microsoft.com/office/word/2018/wordml" xmlns:w16sdtdh="http://schemas.microsoft.com/office/word/2020/wordml/sdtdatahash" xmlns:w16sdtfl="http://schemas.microsoft.com/office/word/2024/wordml/sdtformatlock" xmlns:w16se="http://schemas.microsoft.com/office/word/2015/wordml/symex" xmlns:w16du="http://schemas.microsoft.com/office/word/2023/wordml/word16du" xmlns:wne="http://schemas.microsoft.com/office/word/2006/wordml" mc:Ignorable="w14 w15 w16se w16cid w16 w16cex w16sdtdh w16sdtfl w16du wp14">
   <w:body>
     <w:p>
       <w:pPr>
@@ -338,8 +338,10 @@
       </w:pPr>
       <w:bookmarkStart w:id="5" w:name="_Exercises,_Experimentation_and_1"/>
       <w:bookmarkStart w:id="6" w:name="_HAWAII,_WASHINGTON_ST,_1"/>
+      <w:bookmarkStart w:id="7" w:name="_{{section.name}}"/>
       <w:bookmarkEnd w:id="5"/>
       <w:bookmarkEnd w:id="6"/>
+      <w:bookmarkEnd w:id="7"/>
       <w:r>
         <w:rPr>
           <w:rFonts w:ascii="Arial" w:hAnsi="Arial"/>
@@ -547,17 +549,13 @@
         </w:rPr>
       </w:pPr>
     </w:p>
-    <w:bookmarkStart w:id="7" w:name="_Hlk190227748"/>
+    <w:bookmarkStart w:id="8" w:name="_Hlk190227748"/>
     <w:p>
       <w:r>
         <w:fldChar w:fldCharType="begin"/>
       </w:r>
       <w:r>
-        <w:rPr>
-          <w:sz w:val="18"/>
-          <w:szCs w:val="18"/>
-        </w:rPr>
-        <w:instrText>HYPERLINK  \l "_Build_Lethality_&amp;"</w:instrText>
+        <w:instrText>HYPERLINK  \l "_Exercises,_Experimentation_and_1"</w:instrText>
       </w:r>
       <w:r>
         <w:fldChar w:fldCharType="separate"/>
@@ -608,9 +606,9 @@
           <w:t>Back to Top</w:t>
         </w:r>
       </w:hyperlink>
-      <w:bookmarkStart w:id="8" w:name="_ALASKA,_ARCTIC_1"/>
-      <w:bookmarkEnd w:id="7"/>
+      <w:bookmarkStart w:id="9" w:name="_ALASKA,_ARCTIC_1"/>
       <w:bookmarkEnd w:id="8"/>
+      <w:bookmarkEnd w:id="9"/>
     </w:p>
     <w:p>
       <w:pPr>
@@ -721,8 +719,8 @@
           <w:lang w:bidi="en-US"/>
         </w:rPr>
       </w:pPr>
-      <w:bookmarkStart w:id="9" w:name="_Build_Lethality_&amp;"/>
-      <w:bookmarkEnd w:id="9"/>
+      <w:bookmarkStart w:id="10" w:name="_Build_Lethality_&amp;"/>
+      <w:bookmarkEnd w:id="10"/>
     </w:p>
     <w:p>
       <w:pPr>
@@ -1059,7 +1057,7 @@
       </w:pPr>
     </w:p>
     <w:p>
-      <w:hyperlink w:anchor="_Increase_Joint_Force_2" w:history="1">
+      <w:hyperlink w:anchor="_{{section.name}}" w:history="1">
         <w:r>
           <w:rPr>
             <w:rStyle w:val="Hyperlink"/>
@@ -1069,7 +1067,29 @@
             <w:szCs w:val="18"/>
             <w:lang w:bidi="en-US"/>
           </w:rPr>
-          <w:t>Back to Summaries</w:t>
+          <w:t>Back to Summari</w:t>
+        </w:r>
+        <w:r>
+          <w:rPr>
+            <w:rStyle w:val="Hyperlink"/>
+            <w:rFonts w:ascii="Arial" w:hAnsi="Arial"/>
+            <w:b/>
+            <w:sz w:val="18"/>
+            <w:szCs w:val="18"/>
+            <w:lang w:bidi="en-US"/>
+          </w:rPr>
+          <w:t>e</w:t>
+        </w:r>
+        <w:r>
+          <w:rPr>
+            <w:rStyle w:val="Hyperlink"/>
+            <w:rFonts w:ascii="Arial" w:hAnsi="Arial"/>
+            <w:b/>
+            <w:sz w:val="18"/>
+            <w:szCs w:val="18"/>
+            <w:lang w:bidi="en-US"/>
+          </w:rPr>
+          <w:t>s</w:t>
         </w:r>
       </w:hyperlink>
     </w:p>
@@ -1314,7 +1334,7 @@
 </file>
 
 <file path=word/endnotes.xml><?xml version="1.0" encoding="utf-8"?>
-<w:endnotes xmlns:wpc="http://schemas.microsoft.com/office/word/2010/wordprocessingCanvas" xmlns:cx="http://schemas.microsoft.com/office/drawing/2014/chartex" xmlns:cx1="http://schemas.microsoft.com/office/drawing/2015/9/8/chartex" xmlns:cx2="http://schemas.microsoft.com/office/drawing/2015/10/21/chartex" xmlns:cx3="http://schemas.microsoft.com/office/drawing/2016/5/9/chartex" xmlns:cx4="http://schemas.microsoft.com/office/drawing/2016/5/10/chartex" xmlns:cx5="http://schemas.microsoft.com/office/drawing/2016/5/11/chartex" xmlns:cx6="http://schemas.microsoft.com/office/drawing/2016/5/12/chartex" xmlns:cx7="http://schemas.microsoft.com/office/drawing/2016/5/13/chartex" xmlns:cx8="http://schemas.microsoft.com/office/drawing/2016/5/14/chartex" xmlns:mc="http://schemas.openxmlformats.org/markup-compatibility/2006" xmlns:aink="http://schemas.microsoft.com/office/drawing/2016/ink" xmlns:am3d="http://schemas.microsoft.com/office/drawing/2017/model3d" xmlns:o="urn:schemas-microsoft-com:office:office" xmlns:oel="http://schemas.microsoft.com/office/2019/extlst" xmlns:r="http://schemas.openxmlformats.org/officeDocument/2006/relationships" xmlns:m="http://schemas.openxmlformats.org/officeDocument/2006/math" xmlns:v="urn:schemas-microsoft-com:vml" xmlns:wp14="http://schemas.microsoft.com/office/word/2010/wordprocessingDrawing" xmlns:wp="http://schemas.openxmlformats.org/drawingml/2006/wordprocessingDrawing" xmlns:w10="urn:schemas-microsoft-com:office:word" xmlns:w="http://schemas.openxmlformats.org/wordprocessingml/2006/main" xmlns:w14="http://schemas.microsoft.com/office/word/2010/wordml" xmlns:w15="http://schemas.microsoft.com/office/word/2012/wordml" xmlns:w16cex="http://schemas.microsoft.com/office/word/2018/wordml/cex" xmlns:w16cid="http://schemas.microsoft.com/office/word/2016/wordml/cid" xmlns:w16="http://schemas.microsoft.com/office/word/2018/wordml" xmlns:w16du="http://schemas.microsoft.com/office/word/2023/wordml/word16du" xmlns:w16sdtdh="http://schemas.microsoft.com/office/word/2020/wordml/sdtdatahash" xmlns:w16sdtfl="http://schemas.microsoft.com/office/word/2024/wordml/sdtformatlock" xmlns:w16se="http://schemas.microsoft.com/office/word/2015/wordml/symex" xmlns:wpg="http://schemas.microsoft.com/office/word/2010/wordprocessingGroup" xmlns:wpi="http://schemas.microsoft.com/office/word/2010/wordprocessingInk" xmlns:wne="http://schemas.microsoft.com/office/word/2006/wordml" xmlns:wps="http://schemas.microsoft.com/office/word/2010/wordprocessingShape" mc:Ignorable="w14 w15 w16se w16cid w16 w16cex w16sdtdh w16sdtfl w16du wp14">
+<w:endnotes xmlns:wpc="http://schemas.microsoft.com/office/word/2010/wordprocessingCanvas" xmlns:cx="http://schemas.microsoft.com/office/drawing/2014/chartex" xmlns:cx1="http://schemas.microsoft.com/office/drawing/2015/9/8/chartex" xmlns:cx2="http://schemas.microsoft.com/office/drawing/2015/10/21/chartex" xmlns:cx3="http://schemas.microsoft.com/office/drawing/2016/5/9/chartex" xmlns:cx4="http://schemas.microsoft.com/office/drawing/2016/5/10/chartex" xmlns:cx5="http://schemas.microsoft.com/office/drawing/2016/5/11/chartex" xmlns:cx6="http://schemas.microsoft.com/office/drawing/2016/5/12/chartex" xmlns:cx7="http://schemas.microsoft.com/office/drawing/2016/5/13/chartex" xmlns:cx8="http://schemas.microsoft.com/office/drawing/2016/5/14/chartex" xmlns:mc="http://schemas.openxmlformats.org/markup-compatibility/2006" xmlns:m="http://schemas.openxmlformats.org/officeDocument/2006/math" xmlns:aink="http://schemas.microsoft.com/office/drawing/2016/ink" xmlns:am3d="http://schemas.microsoft.com/office/drawing/2017/model3d" xmlns:oel="http://schemas.microsoft.com/office/2019/extlst" xmlns:r="http://schemas.openxmlformats.org/officeDocument/2006/relationships" xmlns:wp14="http://schemas.microsoft.com/office/word/2010/wordprocessingDrawing" xmlns:wp="http://schemas.openxmlformats.org/drawingml/2006/wordprocessingDrawing" xmlns:wpg="http://schemas.microsoft.com/office/word/2010/wordprocessingGroup" xmlns:wpi="http://schemas.microsoft.com/office/word/2010/wordprocessingInk" xmlns:wps="http://schemas.microsoft.com/office/word/2010/wordprocessingShape" xmlns:o="urn:schemas-microsoft-com:office:office" xmlns:v="urn:schemas-microsoft-com:vml" xmlns:w10="urn:schemas-microsoft-com:office:word" xmlns:w="http://schemas.openxmlformats.org/wordprocessingml/2006/main" xmlns:w14="http://schemas.microsoft.com/office/word/2010/wordml" xmlns:w15="http://schemas.microsoft.com/office/word/2012/wordml" xmlns:w16cex="http://schemas.microsoft.com/office/word/2018/wordml/cex" xmlns:w16cid="http://schemas.microsoft.com/office/word/2016/wordml/cid" xmlns:w16="http://schemas.microsoft.com/office/word/2018/wordml" xmlns:w16sdtdh="http://schemas.microsoft.com/office/word/2020/wordml/sdtdatahash" xmlns:w16sdtfl="http://schemas.microsoft.com/office/word/2024/wordml/sdtformatlock" xmlns:w16se="http://schemas.microsoft.com/office/word/2015/wordml/symex" xmlns:w16du="http://schemas.microsoft.com/office/word/2023/wordml/word16du" xmlns:wne="http://schemas.microsoft.com/office/word/2006/wordml" mc:Ignorable="w14 w15 w16se w16cid w16 w16cex w16sdtdh w16sdtfl w16du wp14">
   <w:endnote w:type="separator" w:id="-1">
     <w:p>
       <w:r>
@@ -1333,7 +1353,7 @@
 </file>
 
 <file path=word/footer1.xml><?xml version="1.0" encoding="utf-8"?>
-<w:ftr xmlns:wpc="http://schemas.microsoft.com/office/word/2010/wordprocessingCanvas" xmlns:cx="http://schemas.microsoft.com/office/drawing/2014/chartex" xmlns:cx1="http://schemas.microsoft.com/office/drawing/2015/9/8/chartex" xmlns:cx2="http://schemas.microsoft.com/office/drawing/2015/10/21/chartex" xmlns:cx3="http://schemas.microsoft.com/office/drawing/2016/5/9/chartex" xmlns:cx4="http://schemas.microsoft.com/office/drawing/2016/5/10/chartex" xmlns:cx5="http://schemas.microsoft.com/office/drawing/2016/5/11/chartex" xmlns:cx6="http://schemas.microsoft.com/office/drawing/2016/5/12/chartex" xmlns:cx7="http://schemas.microsoft.com/office/drawing/2016/5/13/chartex" xmlns:cx8="http://schemas.microsoft.com/office/drawing/2016/5/14/chartex" xmlns:mc="http://schemas.openxmlformats.org/markup-compatibility/2006" xmlns:aink="http://schemas.microsoft.com/office/drawing/2016/ink" xmlns:am3d="http://schemas.microsoft.com/office/drawing/2017/model3d" xmlns:o="urn:schemas-microsoft-com:office:office" xmlns:oel="http://schemas.microsoft.com/office/2019/extlst" xmlns:r="http://schemas.openxmlformats.org/officeDocument/2006/relationships" xmlns:m="http://schemas.openxmlformats.org/officeDocument/2006/math" xmlns:v="urn:schemas-microsoft-com:vml" xmlns:wp14="http://schemas.microsoft.com/office/word/2010/wordprocessingDrawing" xmlns:wp="http://schemas.openxmlformats.org/drawingml/2006/wordprocessingDrawing" xmlns:w10="urn:schemas-microsoft-com:office:word" xmlns:w="http://schemas.openxmlformats.org/wordprocessingml/2006/main" xmlns:w14="http://schemas.microsoft.com/office/word/2010/wordml" xmlns:w15="http://schemas.microsoft.com/office/word/2012/wordml" xmlns:w16cex="http://schemas.microsoft.com/office/word/2018/wordml/cex" xmlns:w16cid="http://schemas.microsoft.com/office/word/2016/wordml/cid" xmlns:w16="http://schemas.microsoft.com/office/word/2018/wordml" xmlns:w16du="http://schemas.microsoft.com/office/word/2023/wordml/word16du" xmlns:w16sdtdh="http://schemas.microsoft.com/office/word/2020/wordml/sdtdatahash" xmlns:w16sdtfl="http://schemas.microsoft.com/office/word/2024/wordml/sdtformatlock" xmlns:w16se="http://schemas.microsoft.com/office/word/2015/wordml/symex" xmlns:wpg="http://schemas.microsoft.com/office/word/2010/wordprocessingGroup" xmlns:wpi="http://schemas.microsoft.com/office/word/2010/wordprocessingInk" xmlns:wne="http://schemas.microsoft.com/office/word/2006/wordml" xmlns:wps="http://schemas.microsoft.com/office/word/2010/wordprocessingShape" mc:Ignorable="w14 w15 w16se w16cid w16 w16cex w16sdtdh w16sdtfl w16du wp14">
+<w:ftr xmlns:wpc="http://schemas.microsoft.com/office/word/2010/wordprocessingCanvas" xmlns:cx="http://schemas.microsoft.com/office/drawing/2014/chartex" xmlns:cx1="http://schemas.microsoft.com/office/drawing/2015/9/8/chartex" xmlns:cx2="http://schemas.microsoft.com/office/drawing/2015/10/21/chartex" xmlns:cx3="http://schemas.microsoft.com/office/drawing/2016/5/9/chartex" xmlns:cx4="http://schemas.microsoft.com/office/drawing/2016/5/10/chartex" xmlns:cx5="http://schemas.microsoft.com/office/drawing/2016/5/11/chartex" xmlns:cx6="http://schemas.microsoft.com/office/drawing/2016/5/12/chartex" xmlns:cx7="http://schemas.microsoft.com/office/drawing/2016/5/13/chartex" xmlns:cx8="http://schemas.microsoft.com/office/drawing/2016/5/14/chartex" xmlns:mc="http://schemas.openxmlformats.org/markup-compatibility/2006" xmlns:m="http://schemas.openxmlformats.org/officeDocument/2006/math" xmlns:aink="http://schemas.microsoft.com/office/drawing/2016/ink" xmlns:am3d="http://schemas.microsoft.com/office/drawing/2017/model3d" xmlns:oel="http://schemas.microsoft.com/office/2019/extlst" xmlns:r="http://schemas.openxmlformats.org/officeDocument/2006/relationships" xmlns:wp14="http://schemas.microsoft.com/office/word/2010/wordprocessingDrawing" xmlns:wp="http://schemas.openxmlformats.org/drawingml/2006/wordprocessingDrawing" xmlns:wpg="http://schemas.microsoft.com/office/word/2010/wordprocessingGroup" xmlns:wpi="http://schemas.microsoft.com/office/word/2010/wordprocessingInk" xmlns:wps="http://schemas.microsoft.com/office/word/2010/wordprocessingShape" xmlns:o="urn:schemas-microsoft-com:office:office" xmlns:v="urn:schemas-microsoft-com:vml" xmlns:w10="urn:schemas-microsoft-com:office:word" xmlns:w="http://schemas.openxmlformats.org/wordprocessingml/2006/main" xmlns:w14="http://schemas.microsoft.com/office/word/2010/wordml" xmlns:w15="http://schemas.microsoft.com/office/word/2012/wordml" xmlns:w16cex="http://schemas.microsoft.com/office/word/2018/wordml/cex" xmlns:w16cid="http://schemas.microsoft.com/office/word/2016/wordml/cid" xmlns:w16="http://schemas.microsoft.com/office/word/2018/wordml" xmlns:w16sdtdh="http://schemas.microsoft.com/office/word/2020/wordml/sdtdatahash" xmlns:w16sdtfl="http://schemas.microsoft.com/office/word/2024/wordml/sdtformatlock" xmlns:w16se="http://schemas.microsoft.com/office/word/2015/wordml/symex" xmlns:w16du="http://schemas.microsoft.com/office/word/2023/wordml/word16du" xmlns:wne="http://schemas.microsoft.com/office/word/2006/wordml" mc:Ignorable="w14 w15 w16se w16cid w16 w16cex w16sdtdh w16sdtfl w16du wp14">
   <w:p>
     <w:pPr>
       <w:pStyle w:val="Footer"/>
@@ -1343,7 +1363,7 @@
 </file>
 
 <file path=word/footer2.xml><?xml version="1.0" encoding="utf-8"?>
-<w:ftr xmlns:wpc="http://schemas.microsoft.com/office/word/2010/wordprocessingCanvas" xmlns:cx="http://schemas.microsoft.com/office/drawing/2014/chartex" xmlns:cx1="http://schemas.microsoft.com/office/drawing/2015/9/8/chartex" xmlns:cx2="http://schemas.microsoft.com/office/drawing/2015/10/21/chartex" xmlns:cx3="http://schemas.microsoft.com/office/drawing/2016/5/9/chartex" xmlns:cx4="http://schemas.microsoft.com/office/drawing/2016/5/10/chartex" xmlns:cx5="http://schemas.microsoft.com/office/drawing/2016/5/11/chartex" xmlns:cx6="http://schemas.microsoft.com/office/drawing/2016/5/12/chartex" xmlns:cx7="http://schemas.microsoft.com/office/drawing/2016/5/13/chartex" xmlns:cx8="http://schemas.microsoft.com/office/drawing/2016/5/14/chartex" xmlns:mc="http://schemas.openxmlformats.org/markup-compatibility/2006" xmlns:aink="http://schemas.microsoft.com/office/drawing/2016/ink" xmlns:am3d="http://schemas.microsoft.com/office/drawing/2017/model3d" xmlns:o="urn:schemas-microsoft-com:office:office" xmlns:oel="http://schemas.microsoft.com/office/2019/extlst" xmlns:r="http://schemas.openxmlformats.org/officeDocument/2006/relationships" xmlns:m="http://schemas.openxmlformats.org/officeDocument/2006/math" xmlns:v="urn:schemas-microsoft-com:vml" xmlns:wp14="http://schemas.microsoft.com/office/word/2010/wordprocessingDrawing" xmlns:wp="http://schemas.openxmlformats.org/drawingml/2006/wordprocessingDrawing" xmlns:w10="urn:schemas-microsoft-com:office:word" xmlns:w="http://schemas.openxmlformats.org/wordprocessingml/2006/main" xmlns:w14="http://schemas.microsoft.com/office/word/2010/wordml" xmlns:w15="http://schemas.microsoft.com/office/word/2012/wordml" xmlns:w16cex="http://schemas.microsoft.com/office/word/2018/wordml/cex" xmlns:w16cid="http://schemas.microsoft.com/office/word/2016/wordml/cid" xmlns:w16="http://schemas.microsoft.com/office/word/2018/wordml" xmlns:w16du="http://schemas.microsoft.com/office/word/2023/wordml/word16du" xmlns:w16sdtdh="http://schemas.microsoft.com/office/word/2020/wordml/sdtdatahash" xmlns:w16sdtfl="http://schemas.microsoft.com/office/word/2024/wordml/sdtformatlock" xmlns:w16se="http://schemas.microsoft.com/office/word/2015/wordml/symex" xmlns:wpg="http://schemas.microsoft.com/office/word/2010/wordprocessingGroup" xmlns:wpi="http://schemas.microsoft.com/office/word/2010/wordprocessingInk" xmlns:wne="http://schemas.microsoft.com/office/word/2006/wordml" xmlns:wps="http://schemas.microsoft.com/office/word/2010/wordprocessingShape" mc:Ignorable="w14 w15 w16se w16cid w16 w16cex w16sdtdh w16sdtfl w16du wp14">
+<w:ftr xmlns:wpc="http://schemas.microsoft.com/office/word/2010/wordprocessingCanvas" xmlns:cx="http://schemas.microsoft.com/office/drawing/2014/chartex" xmlns:cx1="http://schemas.microsoft.com/office/drawing/2015/9/8/chartex" xmlns:cx2="http://schemas.microsoft.com/office/drawing/2015/10/21/chartex" xmlns:cx3="http://schemas.microsoft.com/office/drawing/2016/5/9/chartex" xmlns:cx4="http://schemas.microsoft.com/office/drawing/2016/5/10/chartex" xmlns:cx5="http://schemas.microsoft.com/office/drawing/2016/5/11/chartex" xmlns:cx6="http://schemas.microsoft.com/office/drawing/2016/5/12/chartex" xmlns:cx7="http://schemas.microsoft.com/office/drawing/2016/5/13/chartex" xmlns:cx8="http://schemas.microsoft.com/office/drawing/2016/5/14/chartex" xmlns:mc="http://schemas.openxmlformats.org/markup-compatibility/2006" xmlns:m="http://schemas.openxmlformats.org/officeDocument/2006/math" xmlns:aink="http://schemas.microsoft.com/office/drawing/2016/ink" xmlns:am3d="http://schemas.microsoft.com/office/drawing/2017/model3d" xmlns:oel="http://schemas.microsoft.com/office/2019/extlst" xmlns:r="http://schemas.openxmlformats.org/officeDocument/2006/relationships" xmlns:wp14="http://schemas.microsoft.com/office/word/2010/wordprocessingDrawing" xmlns:wp="http://schemas.openxmlformats.org/drawingml/2006/wordprocessingDrawing" xmlns:wpg="http://schemas.microsoft.com/office/word/2010/wordprocessingGroup" xmlns:wpi="http://schemas.microsoft.com/office/word/2010/wordprocessingInk" xmlns:wps="http://schemas.microsoft.com/office/word/2010/wordprocessingShape" xmlns:o="urn:schemas-microsoft-com:office:office" xmlns:v="urn:schemas-microsoft-com:vml" xmlns:w10="urn:schemas-microsoft-com:office:word" xmlns:w="http://schemas.openxmlformats.org/wordprocessingml/2006/main" xmlns:w14="http://schemas.microsoft.com/office/word/2010/wordml" xmlns:w15="http://schemas.microsoft.com/office/word/2012/wordml" xmlns:w16cex="http://schemas.microsoft.com/office/word/2018/wordml/cex" xmlns:w16cid="http://schemas.microsoft.com/office/word/2016/wordml/cid" xmlns:w16="http://schemas.microsoft.com/office/word/2018/wordml" xmlns:w16sdtdh="http://schemas.microsoft.com/office/word/2020/wordml/sdtdatahash" xmlns:w16sdtfl="http://schemas.microsoft.com/office/word/2024/wordml/sdtformatlock" xmlns:w16se="http://schemas.microsoft.com/office/word/2015/wordml/symex" xmlns:w16du="http://schemas.microsoft.com/office/word/2023/wordml/word16du" xmlns:wne="http://schemas.microsoft.com/office/word/2006/wordml" mc:Ignorable="w14 w15 w16se w16cid w16 w16cex w16sdtdh w16sdtfl w16du wp14">
   <w:p>
     <w:pPr>
       <w:pStyle w:val="Footer"/>
@@ -1354,7 +1374,7 @@
 </file>
 
 <file path=word/footer3.xml><?xml version="1.0" encoding="utf-8"?>
-<w:ftr xmlns:wpc="http://schemas.microsoft.com/office/word/2010/wordprocessingCanvas" xmlns:cx="http://schemas.microsoft.com/office/drawing/2014/chartex" xmlns:cx1="http://schemas.microsoft.com/office/drawing/2015/9/8/chartex" xmlns:cx2="http://schemas.microsoft.com/office/drawing/2015/10/21/chartex" xmlns:cx3="http://schemas.microsoft.com/office/drawing/2016/5/9/chartex" xmlns:cx4="http://schemas.microsoft.com/office/drawing/2016/5/10/chartex" xmlns:cx5="http://schemas.microsoft.com/office/drawing/2016/5/11/chartex" xmlns:cx6="http://schemas.microsoft.com/office/drawing/2016/5/12/chartex" xmlns:cx7="http://schemas.microsoft.com/office/drawing/2016/5/13/chartex" xmlns:cx8="http://schemas.microsoft.com/office/drawing/2016/5/14/chartex" xmlns:mc="http://schemas.openxmlformats.org/markup-compatibility/2006" xmlns:aink="http://schemas.microsoft.com/office/drawing/2016/ink" xmlns:am3d="http://schemas.microsoft.com/office/drawing/2017/model3d" xmlns:o="urn:schemas-microsoft-com:office:office" xmlns:oel="http://schemas.microsoft.com/office/2019/extlst" xmlns:r="http://schemas.openxmlformats.org/officeDocument/2006/relationships" xmlns:m="http://schemas.openxmlformats.org/officeDocument/2006/math" xmlns:v="urn:schemas-microsoft-com:vml" xmlns:wp14="http://schemas.microsoft.com/office/word/2010/wordprocessingDrawing" xmlns:wp="http://schemas.openxmlformats.org/drawingml/2006/wordprocessingDrawing" xmlns:w10="urn:schemas-microsoft-com:office:word" xmlns:w="http://schemas.openxmlformats.org/wordprocessingml/2006/main" xmlns:w14="http://schemas.microsoft.com/office/word/2010/wordml" xmlns:w15="http://schemas.microsoft.com/office/word/2012/wordml" xmlns:w16cex="http://schemas.microsoft.com/office/word/2018/wordml/cex" xmlns:w16cid="http://schemas.microsoft.com/office/word/2016/wordml/cid" xmlns:w16="http://schemas.microsoft.com/office/word/2018/wordml" xmlns:w16du="http://schemas.microsoft.com/office/word/2023/wordml/word16du" xmlns:w16sdtdh="http://schemas.microsoft.com/office/word/2020/wordml/sdtdatahash" xmlns:w16sdtfl="http://schemas.microsoft.com/office/word/2024/wordml/sdtformatlock" xmlns:w16se="http://schemas.microsoft.com/office/word/2015/wordml/symex" xmlns:wpg="http://schemas.microsoft.com/office/word/2010/wordprocessingGroup" xmlns:wpi="http://schemas.microsoft.com/office/word/2010/wordprocessingInk" xmlns:wne="http://schemas.microsoft.com/office/word/2006/wordml" xmlns:wps="http://schemas.microsoft.com/office/word/2010/wordprocessingShape" mc:Ignorable="w14 w15 w16se w16cid w16 w16cex w16sdtdh w16sdtfl w16du wp14">
+<w:ftr xmlns:wpc="http://schemas.microsoft.com/office/word/2010/wordprocessingCanvas" xmlns:cx="http://schemas.microsoft.com/office/drawing/2014/chartex" xmlns:cx1="http://schemas.microsoft.com/office/drawing/2015/9/8/chartex" xmlns:cx2="http://schemas.microsoft.com/office/drawing/2015/10/21/chartex" xmlns:cx3="http://schemas.microsoft.com/office/drawing/2016/5/9/chartex" xmlns:cx4="http://schemas.microsoft.com/office/drawing/2016/5/10/chartex" xmlns:cx5="http://schemas.microsoft.com/office/drawing/2016/5/11/chartex" xmlns:cx6="http://schemas.microsoft.com/office/drawing/2016/5/12/chartex" xmlns:cx7="http://schemas.microsoft.com/office/drawing/2016/5/13/chartex" xmlns:cx8="http://schemas.microsoft.com/office/drawing/2016/5/14/chartex" xmlns:mc="http://schemas.openxmlformats.org/markup-compatibility/2006" xmlns:m="http://schemas.openxmlformats.org/officeDocument/2006/math" xmlns:aink="http://schemas.microsoft.com/office/drawing/2016/ink" xmlns:am3d="http://schemas.microsoft.com/office/drawing/2017/model3d" xmlns:oel="http://schemas.microsoft.com/office/2019/extlst" xmlns:r="http://schemas.openxmlformats.org/officeDocument/2006/relationships" xmlns:wp14="http://schemas.microsoft.com/office/word/2010/wordprocessingDrawing" xmlns:wp="http://schemas.openxmlformats.org/drawingml/2006/wordprocessingDrawing" xmlns:wpg="http://schemas.microsoft.com/office/word/2010/wordprocessingGroup" xmlns:wpi="http://schemas.microsoft.com/office/word/2010/wordprocessingInk" xmlns:wps="http://schemas.microsoft.com/office/word/2010/wordprocessingShape" xmlns:o="urn:schemas-microsoft-com:office:office" xmlns:v="urn:schemas-microsoft-com:vml" xmlns:w10="urn:schemas-microsoft-com:office:word" xmlns:w="http://schemas.openxmlformats.org/wordprocessingml/2006/main" xmlns:w14="http://schemas.microsoft.com/office/word/2010/wordml" xmlns:w15="http://schemas.microsoft.com/office/word/2012/wordml" xmlns:w16cex="http://schemas.microsoft.com/office/word/2018/wordml/cex" xmlns:w16cid="http://schemas.microsoft.com/office/word/2016/wordml/cid" xmlns:w16="http://schemas.microsoft.com/office/word/2018/wordml" xmlns:w16sdtdh="http://schemas.microsoft.com/office/word/2020/wordml/sdtdatahash" xmlns:w16sdtfl="http://schemas.microsoft.com/office/word/2024/wordml/sdtformatlock" xmlns:w16se="http://schemas.microsoft.com/office/word/2015/wordml/symex" xmlns:w16du="http://schemas.microsoft.com/office/word/2023/wordml/word16du" xmlns:wne="http://schemas.microsoft.com/office/word/2006/wordml" mc:Ignorable="w14 w15 w16se w16cid w16 w16cex w16sdtdh w16sdtfl w16du wp14">
   <w:p>
     <w:pPr>
       <w:tabs>
@@ -1373,7 +1393,7 @@
 </file>
 
 <file path=word/footnotes.xml><?xml version="1.0" encoding="utf-8"?>
-<w:footnotes xmlns:wpc="http://schemas.microsoft.com/office/word/2010/wordprocessingCanvas" xmlns:cx="http://schemas.microsoft.com/office/drawing/2014/chartex" xmlns:cx1="http://schemas.microsoft.com/office/drawing/2015/9/8/chartex" xmlns:cx2="http://schemas.microsoft.com/office/drawing/2015/10/21/chartex" xmlns:cx3="http://schemas.microsoft.com/office/drawing/2016/5/9/chartex" xmlns:cx4="http://schemas.microsoft.com/office/drawing/2016/5/10/chartex" xmlns:cx5="http://schemas.microsoft.com/office/drawing/2016/5/11/chartex" xmlns:cx6="http://schemas.microsoft.com/office/drawing/2016/5/12/chartex" xmlns:cx7="http://schemas.microsoft.com/office/drawing/2016/5/13/chartex" xmlns:cx8="http://schemas.microsoft.com/office/drawing/2016/5/14/chartex" xmlns:mc="http://schemas.openxmlformats.org/markup-compatibility/2006" xmlns:aink="http://schemas.microsoft.com/office/drawing/2016/ink" xmlns:am3d="http://schemas.microsoft.com/office/drawing/2017/model3d" xmlns:o="urn:schemas-microsoft-com:office:office" xmlns:oel="http://schemas.microsoft.com/office/2019/extlst" xmlns:r="http://schemas.openxmlformats.org/officeDocument/2006/relationships" xmlns:m="http://schemas.openxmlformats.org/officeDocument/2006/math" xmlns:v="urn:schemas-microsoft-com:vml" xmlns:wp14="http://schemas.microsoft.com/office/word/2010/wordprocessingDrawing" xmlns:wp="http://schemas.openxmlformats.org/drawingml/2006/wordprocessingDrawing" xmlns:w10="urn:schemas-microsoft-com:office:word" xmlns:w="http://schemas.openxmlformats.org/wordprocessingml/2006/main" xmlns:w14="http://schemas.microsoft.com/office/word/2010/wordml" xmlns:w15="http://schemas.microsoft.com/office/word/2012/wordml" xmlns:w16cex="http://schemas.microsoft.com/office/word/2018/wordml/cex" xmlns:w16cid="http://schemas.microsoft.com/office/word/2016/wordml/cid" xmlns:w16="http://schemas.microsoft.com/office/word/2018/wordml" xmlns:w16du="http://schemas.microsoft.com/office/word/2023/wordml/word16du" xmlns:w16sdtdh="http://schemas.microsoft.com/office/word/2020/wordml/sdtdatahash" xmlns:w16sdtfl="http://schemas.microsoft.com/office/word/2024/wordml/sdtformatlock" xmlns:w16se="http://schemas.microsoft.com/office/word/2015/wordml/symex" xmlns:wpg="http://schemas.microsoft.com/office/word/2010/wordprocessingGroup" xmlns:wpi="http://schemas.microsoft.com/office/word/2010/wordprocessingInk" xmlns:wne="http://schemas.microsoft.com/office/word/2006/wordml" xmlns:wps="http://schemas.microsoft.com/office/word/2010/wordprocessingShape" mc:Ignorable="w14 w15 w16se w16cid w16 w16cex w16sdtdh w16sdtfl w16du wp14">
+<w:footnotes xmlns:wpc="http://schemas.microsoft.com/office/word/2010/wordprocessingCanvas" xmlns:cx="http://schemas.microsoft.com/office/drawing/2014/chartex" xmlns:cx1="http://schemas.microsoft.com/office/drawing/2015/9/8/chartex" xmlns:cx2="http://schemas.microsoft.com/office/drawing/2015/10/21/chartex" xmlns:cx3="http://schemas.microsoft.com/office/drawing/2016/5/9/chartex" xmlns:cx4="http://schemas.microsoft.com/office/drawing/2016/5/10/chartex" xmlns:cx5="http://schemas.microsoft.com/office/drawing/2016/5/11/chartex" xmlns:cx6="http://schemas.microsoft.com/office/drawing/2016/5/12/chartex" xmlns:cx7="http://schemas.microsoft.com/office/drawing/2016/5/13/chartex" xmlns:cx8="http://schemas.microsoft.com/office/drawing/2016/5/14/chartex" xmlns:mc="http://schemas.openxmlformats.org/markup-compatibility/2006" xmlns:m="http://schemas.openxmlformats.org/officeDocument/2006/math" xmlns:aink="http://schemas.microsoft.com/office/drawing/2016/ink" xmlns:am3d="http://schemas.microsoft.com/office/drawing/2017/model3d" xmlns:oel="http://schemas.microsoft.com/office/2019/extlst" xmlns:r="http://schemas.openxmlformats.org/officeDocument/2006/relationships" xmlns:wp14="http://schemas.microsoft.com/office/word/2010/wordprocessingDrawing" xmlns:wp="http://schemas.openxmlformats.org/drawingml/2006/wordprocessingDrawing" xmlns:wpg="http://schemas.microsoft.com/office/word/2010/wordprocessingGroup" xmlns:wpi="http://schemas.microsoft.com/office/word/2010/wordprocessingInk" xmlns:wps="http://schemas.microsoft.com/office/word/2010/wordprocessingShape" xmlns:o="urn:schemas-microsoft-com:office:office" xmlns:v="urn:schemas-microsoft-com:vml" xmlns:w10="urn:schemas-microsoft-com:office:word" xmlns:w="http://schemas.openxmlformats.org/wordprocessingml/2006/main" xmlns:w14="http://schemas.microsoft.com/office/word/2010/wordml" xmlns:w15="http://schemas.microsoft.com/office/word/2012/wordml" xmlns:w16cex="http://schemas.microsoft.com/office/word/2018/wordml/cex" xmlns:w16cid="http://schemas.microsoft.com/office/word/2016/wordml/cid" xmlns:w16="http://schemas.microsoft.com/office/word/2018/wordml" xmlns:w16sdtdh="http://schemas.microsoft.com/office/word/2020/wordml/sdtdatahash" xmlns:w16sdtfl="http://schemas.microsoft.com/office/word/2024/wordml/sdtformatlock" xmlns:w16se="http://schemas.microsoft.com/office/word/2015/wordml/symex" xmlns:w16du="http://schemas.microsoft.com/office/word/2023/wordml/word16du" xmlns:wne="http://schemas.microsoft.com/office/word/2006/wordml" mc:Ignorable="w14 w15 w16se w16cid w16 w16cex w16sdtdh w16sdtfl w16du wp14">
   <w:footnote w:type="separator" w:id="-1">
     <w:p>
       <w:r>
@@ -1392,7 +1412,7 @@
 </file>
 
 <file path=word/header1.xml><?xml version="1.0" encoding="utf-8"?>
-<w:hdr xmlns:wpc="http://schemas.microsoft.com/office/word/2010/wordprocessingCanvas" xmlns:cx="http://schemas.microsoft.com/office/drawing/2014/chartex" xmlns:cx1="http://schemas.microsoft.com/office/drawing/2015/9/8/chartex" xmlns:cx2="http://schemas.microsoft.com/office/drawing/2015/10/21/chartex" xmlns:cx3="http://schemas.microsoft.com/office/drawing/2016/5/9/chartex" xmlns:cx4="http://schemas.microsoft.com/office/drawing/2016/5/10/chartex" xmlns:cx5="http://schemas.microsoft.com/office/drawing/2016/5/11/chartex" xmlns:cx6="http://schemas.microsoft.com/office/drawing/2016/5/12/chartex" xmlns:cx7="http://schemas.microsoft.com/office/drawing/2016/5/13/chartex" xmlns:cx8="http://schemas.microsoft.com/office/drawing/2016/5/14/chartex" xmlns:mc="http://schemas.openxmlformats.org/markup-compatibility/2006" xmlns:aink="http://schemas.microsoft.com/office/drawing/2016/ink" xmlns:am3d="http://schemas.microsoft.com/office/drawing/2017/model3d" xmlns:o="urn:schemas-microsoft-com:office:office" xmlns:oel="http://schemas.microsoft.com/office/2019/extlst" xmlns:r="http://schemas.openxmlformats.org/officeDocument/2006/relationships" xmlns:m="http://schemas.openxmlformats.org/officeDocument/2006/math" xmlns:v="urn:schemas-microsoft-com:vml" xmlns:wp14="http://schemas.microsoft.com/office/word/2010/wordprocessingDrawing" xmlns:wp="http://schemas.openxmlformats.org/drawingml/2006/wordprocessingDrawing" xmlns:w10="urn:schemas-microsoft-com:office:word" xmlns:w="http://schemas.openxmlformats.org/wordprocessingml/2006/main" xmlns:w14="http://schemas.microsoft.com/office/word/2010/wordml" xmlns:w15="http://schemas.microsoft.com/office/word/2012/wordml" xmlns:w16cex="http://schemas.microsoft.com/office/word/2018/wordml/cex" xmlns:w16cid="http://schemas.microsoft.com/office/word/2016/wordml/cid" xmlns:w16="http://schemas.microsoft.com/office/word/2018/wordml" xmlns:w16du="http://schemas.microsoft.com/office/word/2023/wordml/word16du" xmlns:w16sdtdh="http://schemas.microsoft.com/office/word/2020/wordml/sdtdatahash" xmlns:w16sdtfl="http://schemas.microsoft.com/office/word/2024/wordml/sdtformatlock" xmlns:w16se="http://schemas.microsoft.com/office/word/2015/wordml/symex" xmlns:wpg="http://schemas.microsoft.com/office/word/2010/wordprocessingGroup" xmlns:wpi="http://schemas.microsoft.com/office/word/2010/wordprocessingInk" xmlns:wne="http://schemas.microsoft.com/office/word/2006/wordml" xmlns:wps="http://schemas.microsoft.com/office/word/2010/wordprocessingShape" mc:Ignorable="w14 w15 w16se w16cid w16 w16cex w16sdtdh w16sdtfl w16du wp14">
+<w:hdr xmlns:wpc="http://schemas.microsoft.com/office/word/2010/wordprocessingCanvas" xmlns:cx="http://schemas.microsoft.com/office/drawing/2014/chartex" xmlns:cx1="http://schemas.microsoft.com/office/drawing/2015/9/8/chartex" xmlns:cx2="http://schemas.microsoft.com/office/drawing/2015/10/21/chartex" xmlns:cx3="http://schemas.microsoft.com/office/drawing/2016/5/9/chartex" xmlns:cx4="http://schemas.microsoft.com/office/drawing/2016/5/10/chartex" xmlns:cx5="http://schemas.microsoft.com/office/drawing/2016/5/11/chartex" xmlns:cx6="http://schemas.microsoft.com/office/drawing/2016/5/12/chartex" xmlns:cx7="http://schemas.microsoft.com/office/drawing/2016/5/13/chartex" xmlns:cx8="http://schemas.microsoft.com/office/drawing/2016/5/14/chartex" xmlns:mc="http://schemas.openxmlformats.org/markup-compatibility/2006" xmlns:m="http://schemas.openxmlformats.org/officeDocument/2006/math" xmlns:aink="http://schemas.microsoft.com/office/drawing/2016/ink" xmlns:am3d="http://schemas.microsoft.com/office/drawing/2017/model3d" xmlns:oel="http://schemas.microsoft.com/office/2019/extlst" xmlns:r="http://schemas.openxmlformats.org/officeDocument/2006/relationships" xmlns:wp14="http://schemas.microsoft.com/office/word/2010/wordprocessingDrawing" xmlns:wp="http://schemas.openxmlformats.org/drawingml/2006/wordprocessingDrawing" xmlns:wpg="http://schemas.microsoft.com/office/word/2010/wordprocessingGroup" xmlns:wpi="http://schemas.microsoft.com/office/word/2010/wordprocessingInk" xmlns:wps="http://schemas.microsoft.com/office/word/2010/wordprocessingShape" xmlns:o="urn:schemas-microsoft-com:office:office" xmlns:v="urn:schemas-microsoft-com:vml" xmlns:w10="urn:schemas-microsoft-com:office:word" xmlns:w="http://schemas.openxmlformats.org/wordprocessingml/2006/main" xmlns:w14="http://schemas.microsoft.com/office/word/2010/wordml" xmlns:w15="http://schemas.microsoft.com/office/word/2012/wordml" xmlns:w16cex="http://schemas.microsoft.com/office/word/2018/wordml/cex" xmlns:w16cid="http://schemas.microsoft.com/office/word/2016/wordml/cid" xmlns:w16="http://schemas.microsoft.com/office/word/2018/wordml" xmlns:w16sdtdh="http://schemas.microsoft.com/office/word/2020/wordml/sdtdatahash" xmlns:w16sdtfl="http://schemas.microsoft.com/office/word/2024/wordml/sdtformatlock" xmlns:w16se="http://schemas.microsoft.com/office/word/2015/wordml/symex" xmlns:w16du="http://schemas.microsoft.com/office/word/2023/wordml/word16du" xmlns:wne="http://schemas.microsoft.com/office/word/2006/wordml" mc:Ignorable="w14 w15 w16se w16cid w16 w16cex w16sdtdh w16sdtfl w16du wp14">
   <w:p>
     <w:pPr>
       <w:pStyle w:val="Header"/>
@@ -1402,7 +1422,7 @@
 </file>
 
 <file path=word/header2.xml><?xml version="1.0" encoding="utf-8"?>
-<w:hdr xmlns:wpc="http://schemas.microsoft.com/office/word/2010/wordprocessingCanvas" xmlns:cx="http://schemas.microsoft.com/office/drawing/2014/chartex" xmlns:cx1="http://schemas.microsoft.com/office/drawing/2015/9/8/chartex" xmlns:cx2="http://schemas.microsoft.com/office/drawing/2015/10/21/chartex" xmlns:cx3="http://schemas.microsoft.com/office/drawing/2016/5/9/chartex" xmlns:cx4="http://schemas.microsoft.com/office/drawing/2016/5/10/chartex" xmlns:cx5="http://schemas.microsoft.com/office/drawing/2016/5/11/chartex" xmlns:cx6="http://schemas.microsoft.com/office/drawing/2016/5/12/chartex" xmlns:cx7="http://schemas.microsoft.com/office/drawing/2016/5/13/chartex" xmlns:cx8="http://schemas.microsoft.com/office/drawing/2016/5/14/chartex" xmlns:mc="http://schemas.openxmlformats.org/markup-compatibility/2006" xmlns:aink="http://schemas.microsoft.com/office/drawing/2016/ink" xmlns:am3d="http://schemas.microsoft.com/office/drawing/2017/model3d" xmlns:o="urn:schemas-microsoft-com:office:office" xmlns:oel="http://schemas.microsoft.com/office/2019/extlst" xmlns:r="http://schemas.openxmlformats.org/officeDocument/2006/relationships" xmlns:m="http://schemas.openxmlformats.org/officeDocument/2006/math" xmlns:v="urn:schemas-microsoft-com:vml" xmlns:wp14="http://schemas.microsoft.com/office/word/2010/wordprocessingDrawing" xmlns:wp="http://schemas.openxmlformats.org/drawingml/2006/wordprocessingDrawing" xmlns:w10="urn:schemas-microsoft-com:office:word" xmlns:w="http://schemas.openxmlformats.org/wordprocessingml/2006/main" xmlns:w14="http://schemas.microsoft.com/office/word/2010/wordml" xmlns:w15="http://schemas.microsoft.com/office/word/2012/wordml" xmlns:w16cex="http://schemas.microsoft.com/office/word/2018/wordml/cex" xmlns:w16cid="http://schemas.microsoft.com/office/word/2016/wordml/cid" xmlns:w16="http://schemas.microsoft.com/office/word/2018/wordml" xmlns:w16du="http://schemas.microsoft.com/office/word/2023/wordml/word16du" xmlns:w16sdtdh="http://schemas.microsoft.com/office/word/2020/wordml/sdtdatahash" xmlns:w16sdtfl="http://schemas.microsoft.com/office/word/2024/wordml/sdtformatlock" xmlns:w16se="http://schemas.microsoft.com/office/word/2015/wordml/symex" xmlns:wpg="http://schemas.microsoft.com/office/word/2010/wordprocessingGroup" xmlns:wpi="http://schemas.microsoft.com/office/word/2010/wordprocessingInk" xmlns:wne="http://schemas.microsoft.com/office/word/2006/wordml" xmlns:wps="http://schemas.microsoft.com/office/word/2010/wordprocessingShape" mc:Ignorable="w14 w15 w16se w16cid w16 w16cex w16sdtdh w16sdtfl w16du wp14">
+<w:hdr xmlns:wpc="http://schemas.microsoft.com/office/word/2010/wordprocessingCanvas" xmlns:cx="http://schemas.microsoft.com/office/drawing/2014/chartex" xmlns:cx1="http://schemas.microsoft.com/office/drawing/2015/9/8/chartex" xmlns:cx2="http://schemas.microsoft.com/office/drawing/2015/10/21/chartex" xmlns:cx3="http://schemas.microsoft.com/office/drawing/2016/5/9/chartex" xmlns:cx4="http://schemas.microsoft.com/office/drawing/2016/5/10/chartex" xmlns:cx5="http://schemas.microsoft.com/office/drawing/2016/5/11/chartex" xmlns:cx6="http://schemas.microsoft.com/office/drawing/2016/5/12/chartex" xmlns:cx7="http://schemas.microsoft.com/office/drawing/2016/5/13/chartex" xmlns:cx8="http://schemas.microsoft.com/office/drawing/2016/5/14/chartex" xmlns:mc="http://schemas.openxmlformats.org/markup-compatibility/2006" xmlns:m="http://schemas.openxmlformats.org/officeDocument/2006/math" xmlns:aink="http://schemas.microsoft.com/office/drawing/2016/ink" xmlns:am3d="http://schemas.microsoft.com/office/drawing/2017/model3d" xmlns:oel="http://schemas.microsoft.com/office/2019/extlst" xmlns:r="http://schemas.openxmlformats.org/officeDocument/2006/relationships" xmlns:wp14="http://schemas.microsoft.com/office/word/2010/wordprocessingDrawing" xmlns:wp="http://schemas.openxmlformats.org/drawingml/2006/wordprocessingDrawing" xmlns:wpg="http://schemas.microsoft.com/office/word/2010/wordprocessingGroup" xmlns:wpi="http://schemas.microsoft.com/office/word/2010/wordprocessingInk" xmlns:wps="http://schemas.microsoft.com/office/word/2010/wordprocessingShape" xmlns:o="urn:schemas-microsoft-com:office:office" xmlns:v="urn:schemas-microsoft-com:vml" xmlns:w10="urn:schemas-microsoft-com:office:word" xmlns:w="http://schemas.openxmlformats.org/wordprocessingml/2006/main" xmlns:w14="http://schemas.microsoft.com/office/word/2010/wordml" xmlns:w15="http://schemas.microsoft.com/office/word/2012/wordml" xmlns:w16cex="http://schemas.microsoft.com/office/word/2018/wordml/cex" xmlns:w16cid="http://schemas.microsoft.com/office/word/2016/wordml/cid" xmlns:w16="http://schemas.microsoft.com/office/word/2018/wordml" xmlns:w16sdtdh="http://schemas.microsoft.com/office/word/2020/wordml/sdtdatahash" xmlns:w16sdtfl="http://schemas.microsoft.com/office/word/2024/wordml/sdtformatlock" xmlns:w16se="http://schemas.microsoft.com/office/word/2015/wordml/symex" xmlns:w16du="http://schemas.microsoft.com/office/word/2023/wordml/word16du" xmlns:wne="http://schemas.microsoft.com/office/word/2006/wordml" mc:Ignorable="w14 w15 w16se w16cid w16 w16cex w16sdtdh w16sdtfl w16du wp14">
   <w:p>
     <w:pPr>
       <w:pStyle w:val="Header"/>
@@ -1432,7 +1452,7 @@
 </file>
 
 <file path=word/header3.xml><?xml version="1.0" encoding="utf-8"?>
-<w:hdr xmlns:wpc="http://schemas.microsoft.com/office/word/2010/wordprocessingCanvas" xmlns:cx="http://schemas.microsoft.com/office/drawing/2014/chartex" xmlns:cx1="http://schemas.microsoft.com/office/drawing/2015/9/8/chartex" xmlns:cx2="http://schemas.microsoft.com/office/drawing/2015/10/21/chartex" xmlns:cx3="http://schemas.microsoft.com/office/drawing/2016/5/9/chartex" xmlns:cx4="http://schemas.microsoft.com/office/drawing/2016/5/10/chartex" xmlns:cx5="http://schemas.microsoft.com/office/drawing/2016/5/11/chartex" xmlns:cx6="http://schemas.microsoft.com/office/drawing/2016/5/12/chartex" xmlns:cx7="http://schemas.microsoft.com/office/drawing/2016/5/13/chartex" xmlns:cx8="http://schemas.microsoft.com/office/drawing/2016/5/14/chartex" xmlns:mc="http://schemas.openxmlformats.org/markup-compatibility/2006" xmlns:aink="http://schemas.microsoft.com/office/drawing/2016/ink" xmlns:am3d="http://schemas.microsoft.com/office/drawing/2017/model3d" xmlns:o="urn:schemas-microsoft-com:office:office" xmlns:oel="http://schemas.microsoft.com/office/2019/extlst" xmlns:r="http://schemas.openxmlformats.org/officeDocument/2006/relationships" xmlns:m="http://schemas.openxmlformats.org/officeDocument/2006/math" xmlns:v="urn:schemas-microsoft-com:vml" xmlns:wp14="http://schemas.microsoft.com/office/word/2010/wordprocessingDrawing" xmlns:wp="http://schemas.openxmlformats.org/drawingml/2006/wordprocessingDrawing" xmlns:w10="urn:schemas-microsoft-com:office:word" xmlns:w="http://schemas.openxmlformats.org/wordprocessingml/2006/main" xmlns:w14="http://schemas.microsoft.com/office/word/2010/wordml" xmlns:w15="http://schemas.microsoft.com/office/word/2012/wordml" xmlns:w16cex="http://schemas.microsoft.com/office/word/2018/wordml/cex" xmlns:w16cid="http://schemas.microsoft.com/office/word/2016/wordml/cid" xmlns:w16="http://schemas.microsoft.com/office/word/2018/wordml" xmlns:w16du="http://schemas.microsoft.com/office/word/2023/wordml/word16du" xmlns:w16sdtdh="http://schemas.microsoft.com/office/word/2020/wordml/sdtdatahash" xmlns:w16sdtfl="http://schemas.microsoft.com/office/word/2024/wordml/sdtformatlock" xmlns:w16se="http://schemas.microsoft.com/office/word/2015/wordml/symex" xmlns:wpg="http://schemas.microsoft.com/office/word/2010/wordprocessingGroup" xmlns:wpi="http://schemas.microsoft.com/office/word/2010/wordprocessingInk" xmlns:wne="http://schemas.microsoft.com/office/word/2006/wordml" xmlns:wps="http://schemas.microsoft.com/office/word/2010/wordprocessingShape" mc:Ignorable="w14 w15 w16se w16cid w16 w16cex w16sdtdh w16sdtfl w16du wp14">
+<w:hdr xmlns:wpc="http://schemas.microsoft.com/office/word/2010/wordprocessingCanvas" xmlns:cx="http://schemas.microsoft.com/office/drawing/2014/chartex" xmlns:cx1="http://schemas.microsoft.com/office/drawing/2015/9/8/chartex" xmlns:cx2="http://schemas.microsoft.com/office/drawing/2015/10/21/chartex" xmlns:cx3="http://schemas.microsoft.com/office/drawing/2016/5/9/chartex" xmlns:cx4="http://schemas.microsoft.com/office/drawing/2016/5/10/chartex" xmlns:cx5="http://schemas.microsoft.com/office/drawing/2016/5/11/chartex" xmlns:cx6="http://schemas.microsoft.com/office/drawing/2016/5/12/chartex" xmlns:cx7="http://schemas.microsoft.com/office/drawing/2016/5/13/chartex" xmlns:cx8="http://schemas.microsoft.com/office/drawing/2016/5/14/chartex" xmlns:mc="http://schemas.openxmlformats.org/markup-compatibility/2006" xmlns:m="http://schemas.openxmlformats.org/officeDocument/2006/math" xmlns:aink="http://schemas.microsoft.com/office/drawing/2016/ink" xmlns:am3d="http://schemas.microsoft.com/office/drawing/2017/model3d" xmlns:oel="http://schemas.microsoft.com/office/2019/extlst" xmlns:r="http://schemas.openxmlformats.org/officeDocument/2006/relationships" xmlns:wp14="http://schemas.microsoft.com/office/word/2010/wordprocessingDrawing" xmlns:wp="http://schemas.openxmlformats.org/drawingml/2006/wordprocessingDrawing" xmlns:wpg="http://schemas.microsoft.com/office/word/2010/wordprocessingGroup" xmlns:wpi="http://schemas.microsoft.com/office/word/2010/wordprocessingInk" xmlns:wps="http://schemas.microsoft.com/office/word/2010/wordprocessingShape" xmlns:o="urn:schemas-microsoft-com:office:office" xmlns:v="urn:schemas-microsoft-com:vml" xmlns:w10="urn:schemas-microsoft-com:office:word" xmlns:w="http://schemas.openxmlformats.org/wordprocessingml/2006/main" xmlns:w14="http://schemas.microsoft.com/office/word/2010/wordml" xmlns:w15="http://schemas.microsoft.com/office/word/2012/wordml" xmlns:w16cex="http://schemas.microsoft.com/office/word/2018/wordml/cex" xmlns:w16cid="http://schemas.microsoft.com/office/word/2016/wordml/cid" xmlns:w16="http://schemas.microsoft.com/office/word/2018/wordml" xmlns:w16sdtdh="http://schemas.microsoft.com/office/word/2020/wordml/sdtdatahash" xmlns:w16sdtfl="http://schemas.microsoft.com/office/word/2024/wordml/sdtformatlock" xmlns:w16se="http://schemas.microsoft.com/office/word/2015/wordml/symex" xmlns:w16du="http://schemas.microsoft.com/office/word/2023/wordml/word16du" xmlns:wne="http://schemas.microsoft.com/office/word/2006/wordml" mc:Ignorable="w14 w15 w16se w16cid w16 w16cex w16sdtdh w16sdtfl w16du wp14">
   <w:p>
     <w:pPr>
       <w:pStyle w:val="Header"/>
@@ -1465,7 +1485,7 @@
 </file>
 
 <file path=word/numbering.xml><?xml version="1.0" encoding="utf-8"?>
-<w:numbering xmlns:wpc="http://schemas.microsoft.com/office/word/2010/wordprocessingCanvas" xmlns:cx="http://schemas.microsoft.com/office/drawing/2014/chartex" xmlns:cx1="http://schemas.microsoft.com/office/drawing/2015/9/8/chartex" xmlns:cx2="http://schemas.microsoft.com/office/drawing/2015/10/21/chartex" xmlns:cx3="http://schemas.microsoft.com/office/drawing/2016/5/9/chartex" xmlns:cx4="http://schemas.microsoft.com/office/drawing/2016/5/10/chartex" xmlns:cx5="http://schemas.microsoft.com/office/drawing/2016/5/11/chartex" xmlns:cx6="http://schemas.microsoft.com/office/drawing/2016/5/12/chartex" xmlns:cx7="http://schemas.microsoft.com/office/drawing/2016/5/13/chartex" xmlns:cx8="http://schemas.microsoft.com/office/drawing/2016/5/14/chartex" xmlns:mc="http://schemas.openxmlformats.org/markup-compatibility/2006" xmlns:aink="http://schemas.microsoft.com/office/drawing/2016/ink" xmlns:am3d="http://schemas.microsoft.com/office/drawing/2017/model3d" xmlns:o="urn:schemas-microsoft-com:office:office" xmlns:oel="http://schemas.microsoft.com/office/2019/extlst" xmlns:r="http://schemas.openxmlformats.org/officeDocument/2006/relationships" xmlns:m="http://schemas.openxmlformats.org/officeDocument/2006/math" xmlns:v="urn:schemas-microsoft-com:vml" xmlns:wp14="http://schemas.microsoft.com/office/word/2010/wordprocessingDrawing" xmlns:wp="http://schemas.openxmlformats.org/drawingml/2006/wordprocessingDrawing" xmlns:w10="urn:schemas-microsoft-com:office:word" xmlns:w="http://schemas.openxmlformats.org/wordprocessingml/2006/main" xmlns:w14="http://schemas.microsoft.com/office/word/2010/wordml" xmlns:w15="http://schemas.microsoft.com/office/word/2012/wordml" xmlns:w16cex="http://schemas.microsoft.com/office/word/2018/wordml/cex" xmlns:w16cid="http://schemas.microsoft.com/office/word/2016/wordml/cid" xmlns:w16="http://schemas.microsoft.com/office/word/2018/wordml" xmlns:w16du="http://schemas.microsoft.com/office/word/2023/wordml/word16du" xmlns:w16sdtdh="http://schemas.microsoft.com/office/word/2020/wordml/sdtdatahash" xmlns:w16sdtfl="http://schemas.microsoft.com/office/word/2024/wordml/sdtformatlock" xmlns:w16se="http://schemas.microsoft.com/office/word/2015/wordml/symex" xmlns:wpg="http://schemas.microsoft.com/office/word/2010/wordprocessingGroup" xmlns:wpi="http://schemas.microsoft.com/office/word/2010/wordprocessingInk" xmlns:wne="http://schemas.microsoft.com/office/word/2006/wordml" xmlns:wps="http://schemas.microsoft.com/office/word/2010/wordprocessingShape" mc:Ignorable="w14 w15 w16se w16cid w16 w16cex w16sdtdh w16sdtfl w16du wp14">
+<w:numbering xmlns:wpc="http://schemas.microsoft.com/office/word/2010/wordprocessingCanvas" xmlns:cx="http://schemas.microsoft.com/office/drawing/2014/chartex" xmlns:cx1="http://schemas.microsoft.com/office/drawing/2015/9/8/chartex" xmlns:cx2="http://schemas.microsoft.com/office/drawing/2015/10/21/chartex" xmlns:cx3="http://schemas.microsoft.com/office/drawing/2016/5/9/chartex" xmlns:cx4="http://schemas.microsoft.com/office/drawing/2016/5/10/chartex" xmlns:cx5="http://schemas.microsoft.com/office/drawing/2016/5/11/chartex" xmlns:cx6="http://schemas.microsoft.com/office/drawing/2016/5/12/chartex" xmlns:cx7="http://schemas.microsoft.com/office/drawing/2016/5/13/chartex" xmlns:cx8="http://schemas.microsoft.com/office/drawing/2016/5/14/chartex" xmlns:mc="http://schemas.openxmlformats.org/markup-compatibility/2006" xmlns:m="http://schemas.openxmlformats.org/officeDocument/2006/math" xmlns:aink="http://schemas.microsoft.com/office/drawing/2016/ink" xmlns:am3d="http://schemas.microsoft.com/office/drawing/2017/model3d" xmlns:oel="http://schemas.microsoft.com/office/2019/extlst" xmlns:r="http://schemas.openxmlformats.org/officeDocument/2006/relationships" xmlns:wp14="http://schemas.microsoft.com/office/word/2010/wordprocessingDrawing" xmlns:wp="http://schemas.openxmlformats.org/drawingml/2006/wordprocessingDrawing" xmlns:wpg="http://schemas.microsoft.com/office/word/2010/wordprocessingGroup" xmlns:wpi="http://schemas.microsoft.com/office/word/2010/wordprocessingInk" xmlns:wps="http://schemas.microsoft.com/office/word/2010/wordprocessingShape" xmlns:o="urn:schemas-microsoft-com:office:office" xmlns:v="urn:schemas-microsoft-com:vml" xmlns:w10="urn:schemas-microsoft-com:office:word" xmlns:w="http://schemas.openxmlformats.org/wordprocessingml/2006/main" xmlns:w14="http://schemas.microsoft.com/office/word/2010/wordml" xmlns:w15="http://schemas.microsoft.com/office/word/2012/wordml" xmlns:w16cex="http://schemas.microsoft.com/office/word/2018/wordml/cex" xmlns:w16cid="http://schemas.microsoft.com/office/word/2016/wordml/cid" xmlns:w16="http://schemas.microsoft.com/office/word/2018/wordml" xmlns:w16sdtdh="http://schemas.microsoft.com/office/word/2020/wordml/sdtdatahash" xmlns:w16sdtfl="http://schemas.microsoft.com/office/word/2024/wordml/sdtformatlock" xmlns:w16se="http://schemas.microsoft.com/office/word/2015/wordml/symex" xmlns:w16du="http://schemas.microsoft.com/office/word/2023/wordml/word16du" xmlns:wne="http://schemas.microsoft.com/office/word/2006/wordml" mc:Ignorable="w14 w15 w16se w16cid w16 w16cex w16sdtdh w16sdtfl w16du wp14">
   <w:abstractNum w:abstractNumId="0" w15:restartNumberingAfterBreak="0">
     <w:nsid w:val="061B5C9E"/>
     <w:multiLevelType w:val="hybridMultilevel"/>
@@ -2312,7 +2332,7 @@
 </file>
 
 <file path=word/styles.xml><?xml version="1.0" encoding="utf-8"?>
-<w:styles xmlns:mc="http://schemas.openxmlformats.org/markup-compatibility/2006" xmlns:r="http://schemas.openxmlformats.org/officeDocument/2006/relationships" xmlns:w="http://schemas.openxmlformats.org/wordprocessingml/2006/main" xmlns:w14="http://schemas.microsoft.com/office/word/2010/wordml" xmlns:w15="http://schemas.microsoft.com/office/word/2012/wordml" xmlns:w16cex="http://schemas.microsoft.com/office/word/2018/wordml/cex" xmlns:w16cid="http://schemas.microsoft.com/office/word/2016/wordml/cid" xmlns:w16="http://schemas.microsoft.com/office/word/2018/wordml" xmlns:w16du="http://schemas.microsoft.com/office/word/2023/wordml/word16du" xmlns:w16sdtdh="http://schemas.microsoft.com/office/word/2020/wordml/sdtdatahash" xmlns:w16sdtfl="http://schemas.microsoft.com/office/word/2024/wordml/sdtformatlock" xmlns:w16se="http://schemas.microsoft.com/office/word/2015/wordml/symex" mc:Ignorable="w14 w15 w16se w16cid w16 w16cex w16sdtdh w16sdtfl w16du">
+<w:styles xmlns:mc="http://schemas.openxmlformats.org/markup-compatibility/2006" xmlns:r="http://schemas.openxmlformats.org/officeDocument/2006/relationships" xmlns:w="http://schemas.openxmlformats.org/wordprocessingml/2006/main" xmlns:w14="http://schemas.microsoft.com/office/word/2010/wordml" xmlns:w15="http://schemas.microsoft.com/office/word/2012/wordml" xmlns:w16cex="http://schemas.microsoft.com/office/word/2018/wordml/cex" xmlns:w16cid="http://schemas.microsoft.com/office/word/2016/wordml/cid" xmlns:w16="http://schemas.microsoft.com/office/word/2018/wordml" xmlns:w16sdtdh="http://schemas.microsoft.com/office/word/2020/wordml/sdtdatahash" xmlns:w16sdtfl="http://schemas.microsoft.com/office/word/2024/wordml/sdtformatlock" xmlns:w16se="http://schemas.microsoft.com/office/word/2015/wordml/symex" xmlns:w16du="http://schemas.microsoft.com/office/word/2023/wordml/word16du" mc:Ignorable="w14 w15 w16se w16cid w16 w16cex w16sdtdh w16sdtfl w16du">
   <w:docDefaults>
     <w:rPrDefault>
       <w:rPr>
@@ -3486,32 +3506,6 @@
 </file>
 
 <file path=customXml/item1.xml><?xml version="1.0" encoding="utf-8"?>
-<?mso-contentType ?>
-<FormTemplates xmlns="http://schemas.microsoft.com/sharepoint/v3/contenttype/forms">
-  <Display>DocumentLibraryForm</Display>
-  <Edit>DocumentLibraryForm</Edit>
-  <New>DocumentLibraryForm</New>
-</FormTemplates>
-</file>
-
-<file path=customXml/item2.xml><?xml version="1.0" encoding="utf-8"?>
-<p:properties xmlns:p="http://schemas.microsoft.com/office/2006/metadata/properties" xmlns:xsi="http://www.w3.org/2001/XMLSchema-instance" xmlns:pc="http://schemas.microsoft.com/office/infopath/2007/PartnerControls">
-  <documentManagement>
-    <TaxCatchAll xmlns="38d2a309-d798-495b-b1a3-e97c37808eef"/>
-    <_ip_UnifiedCompliancePolicyUIAction xmlns="http://schemas.microsoft.com/sharepoint/v3" xsi:nil="true"/>
-    <_ip_UnifiedCompliancePolicyProperties xmlns="http://schemas.microsoft.com/sharepoint/v3" xsi:nil="true"/>
-    <lcf76f155ced4ddcb4097134ff3c332f xmlns="416eecfc-56a7-4354-8013-4a2d9c92e153">
-      <Terms xmlns="http://schemas.microsoft.com/office/infopath/2007/PartnerControls"/>
-    </lcf76f155ced4ddcb4097134ff3c332f>
-  </documentManagement>
-</p:properties>
-</file>
-
-<file path=customXml/item3.xml><?xml version="1.0" encoding="utf-8"?>
-<b:Sources xmlns:b="http://schemas.openxmlformats.org/officeDocument/2006/bibliography" xmlns="http://schemas.openxmlformats.org/officeDocument/2006/bibliography" SelectedStyle="\APA.XSL" StyleName="APA"/>
-</file>
-
-<file path=customXml/item4.xml><?xml version="1.0" encoding="utf-8"?>
 <ct:contentTypeSchema xmlns:ct="http://schemas.microsoft.com/office/2006/metadata/contentType" xmlns:ma="http://schemas.microsoft.com/office/2006/metadata/properties/metaAttributes" ct:_="" ma:_="" ma:contentTypeName="Document" ma:contentTypeID="0x010100E48B1925F2EFB241960044EC5F64C034" ma:contentTypeVersion="16" ma:contentTypeDescription="Create a new document." ma:contentTypeScope="" ma:versionID="b193f1a1adb628ee5f7d642c4cb4fead">
   <xsd:schema xmlns:xsd="http://www.w3.org/2001/XMLSchema" xmlns:xs="http://www.w3.org/2001/XMLSchema" xmlns:p="http://schemas.microsoft.com/office/2006/metadata/properties" xmlns:ns1="http://schemas.microsoft.com/sharepoint/v3" xmlns:ns2="416eecfc-56a7-4354-8013-4a2d9c92e153" xmlns:ns3="38d2a309-d798-495b-b1a3-e97c37808eef" targetNamespace="http://schemas.microsoft.com/office/2006/metadata/properties" ma:root="true" ma:fieldsID="f4c72206c132b1461c2865266b50231c" ns1:_="" ns2:_="" ns3:_="">
     <xsd:import namespace="http://schemas.microsoft.com/sharepoint/v3"/>
@@ -3757,35 +3751,33 @@
 </ct:contentTypeSchema>
 </file>
 
-<file path=customXml/itemProps1.xml><?xml version="1.0" encoding="utf-8"?>
-<ds:datastoreItem xmlns:ds="http://schemas.openxmlformats.org/officeDocument/2006/customXml" ds:itemID="{2ACA00A0-0EB9-4F25-B1A0-9480A1DEA0B5}">
-  <ds:schemaRefs>
-    <ds:schemaRef ds:uri="http://schemas.microsoft.com/sharepoint/v3/contenttype/forms"/>
-  </ds:schemaRefs>
-</ds:datastoreItem>
+<file path=customXml/item2.xml><?xml version="1.0" encoding="utf-8"?>
+<b:Sources xmlns:b="http://schemas.openxmlformats.org/officeDocument/2006/bibliography" xmlns="http://schemas.openxmlformats.org/officeDocument/2006/bibliography" SelectedStyle="\APA.XSL" StyleName="APA"/>
 </file>
 
-<file path=customXml/itemProps2.xml><?xml version="1.0" encoding="utf-8"?>
-<ds:datastoreItem xmlns:ds="http://schemas.openxmlformats.org/officeDocument/2006/customXml" ds:itemID="{5D491C04-0035-45EA-BE2E-2976A5F7A397}">
-  <ds:schemaRefs>
-    <ds:schemaRef ds:uri="http://schemas.microsoft.com/office/2006/metadata/properties"/>
-    <ds:schemaRef ds:uri="http://schemas.microsoft.com/office/infopath/2007/PartnerControls"/>
-    <ds:schemaRef ds:uri="38d2a309-d798-495b-b1a3-e97c37808eef"/>
-    <ds:schemaRef ds:uri="http://schemas.microsoft.com/sharepoint/v3"/>
-    <ds:schemaRef ds:uri="416eecfc-56a7-4354-8013-4a2d9c92e153"/>
-  </ds:schemaRefs>
-</ds:datastoreItem>
+<file path=customXml/item3.xml><?xml version="1.0" encoding="utf-8"?>
+<p:properties xmlns:p="http://schemas.microsoft.com/office/2006/metadata/properties" xmlns:xsi="http://www.w3.org/2001/XMLSchema-instance" xmlns:pc="http://schemas.microsoft.com/office/infopath/2007/PartnerControls">
+  <documentManagement>
+    <TaxCatchAll xmlns="38d2a309-d798-495b-b1a3-e97c37808eef"/>
+    <_ip_UnifiedCompliancePolicyUIAction xmlns="http://schemas.microsoft.com/sharepoint/v3" xsi:nil="true"/>
+    <_ip_UnifiedCompliancePolicyProperties xmlns="http://schemas.microsoft.com/sharepoint/v3" xsi:nil="true"/>
+    <lcf76f155ced4ddcb4097134ff3c332f xmlns="416eecfc-56a7-4354-8013-4a2d9c92e153">
+      <Terms xmlns="http://schemas.microsoft.com/office/infopath/2007/PartnerControls"/>
+    </lcf76f155ced4ddcb4097134ff3c332f>
+  </documentManagement>
+</p:properties>
 </file>
 
-<file path=customXml/itemProps3.xml><?xml version="1.0" encoding="utf-8"?>
-<ds:datastoreItem xmlns:ds="http://schemas.openxmlformats.org/officeDocument/2006/customXml" ds:itemID="{4202E056-596C-4D43-866F-DBCC294656E0}">
-  <ds:schemaRefs>
-    <ds:schemaRef ds:uri="http://schemas.openxmlformats.org/officeDocument/2006/bibliography"/>
-  </ds:schemaRefs>
-</ds:datastoreItem>
+<file path=customXml/item4.xml><?xml version="1.0" encoding="utf-8"?>
+<?mso-contentType ?>
+<FormTemplates xmlns="http://schemas.microsoft.com/sharepoint/v3/contenttype/forms">
+  <Display>DocumentLibraryForm</Display>
+  <Edit>DocumentLibraryForm</Edit>
+  <New>DocumentLibraryForm</New>
+</FormTemplates>
 </file>
 
-<file path=customXml/itemProps4.xml><?xml version="1.0" encoding="utf-8"?>
+<file path=customXml/itemProps1.xml><?xml version="1.0" encoding="utf-8"?>
 <ds:datastoreItem xmlns:ds="http://schemas.openxmlformats.org/officeDocument/2006/customXml" ds:itemID="{3AA634C4-AFF1-45A4-BEEC-3BC128C36838}">
   <ds:schemaRefs>
     <ds:schemaRef ds:uri="http://schemas.microsoft.com/office/2006/metadata/contentType"/>
@@ -3805,6 +3797,34 @@
 </ds:datastoreItem>
 </file>
 
+<file path=customXml/itemProps2.xml><?xml version="1.0" encoding="utf-8"?>
+<ds:datastoreItem xmlns:ds="http://schemas.openxmlformats.org/officeDocument/2006/customXml" ds:itemID="{4202E056-596C-4D43-866F-DBCC294656E0}">
+  <ds:schemaRefs>
+    <ds:schemaRef ds:uri="http://schemas.openxmlformats.org/officeDocument/2006/bibliography"/>
+  </ds:schemaRefs>
+</ds:datastoreItem>
+</file>
+
+<file path=customXml/itemProps3.xml><?xml version="1.0" encoding="utf-8"?>
+<ds:datastoreItem xmlns:ds="http://schemas.openxmlformats.org/officeDocument/2006/customXml" ds:itemID="{5D491C04-0035-45EA-BE2E-2976A5F7A397}">
+  <ds:schemaRefs>
+    <ds:schemaRef ds:uri="http://schemas.microsoft.com/office/2006/metadata/properties"/>
+    <ds:schemaRef ds:uri="http://schemas.microsoft.com/office/infopath/2007/PartnerControls"/>
+    <ds:schemaRef ds:uri="38d2a309-d798-495b-b1a3-e97c37808eef"/>
+    <ds:schemaRef ds:uri="http://schemas.microsoft.com/sharepoint/v3"/>
+    <ds:schemaRef ds:uri="416eecfc-56a7-4354-8013-4a2d9c92e153"/>
+  </ds:schemaRefs>
+</ds:datastoreItem>
+</file>
+
+<file path=customXml/itemProps4.xml><?xml version="1.0" encoding="utf-8"?>
+<ds:datastoreItem xmlns:ds="http://schemas.openxmlformats.org/officeDocument/2006/customXml" ds:itemID="{2ACA00A0-0EB9-4F25-B1A0-9480A1DEA0B5}">
+  <ds:schemaRefs>
+    <ds:schemaRef ds:uri="http://schemas.microsoft.com/sharepoint/v3/contenttype/forms"/>
+  </ds:schemaRefs>
+</ds:datastoreItem>
+</file>
+
 <file path=docMetadata/LabelInfo.xml><?xml version="1.0" encoding="utf-8"?>
 <clbl:labelList xmlns:clbl="http://schemas.microsoft.com/office/2020/mipLabelMetadata">
   <clbl:label id="{3de9faa6-9fe1-49b3-9a08-227a296b54a6}" enabled="1" method="Privileged" siteId="{66d73691-ea97-48b1-95d5-e94f0a46b878}" contentBits="0" removed="0"/>

</xml_diff>

<commit_message>
Update fomatting and fonts for docx template.
</commit_message>
<xml_diff>
--- a/app/assets/default_template.docx
+++ b/app/assets/default_template.docx
@@ -6,7 +6,7 @@
       <w:pPr>
         <w:jc w:val="center"/>
         <w:rPr>
-          <w:rFonts w:ascii="Arial" w:hAnsi="Arial"/>
+          <w:rFonts w:ascii="Arial" w:hAnsi="Arial" w:cs="Arial"/>
           <w:color w:val="000000"/>
           <w:sz w:val="20"/>
           <w:lang w:bidi="en-US"/>
@@ -19,7 +19,7 @@
       <w:pPr>
         <w:jc w:val="center"/>
         <w:rPr>
-          <w:rFonts w:ascii="Arial" w:hAnsi="Arial"/>
+          <w:rFonts w:ascii="Arial" w:hAnsi="Arial" w:cs="Arial"/>
           <w:b/>
           <w:color w:val="000000"/>
           <w:sz w:val="20"/>
@@ -30,7 +30,7 @@
     <w:p>
       <w:pPr>
         <w:rPr>
-          <w:rFonts w:ascii="Arial" w:hAnsi="Arial"/>
+          <w:rFonts w:ascii="Arial" w:hAnsi="Arial" w:cs="Arial"/>
           <w:b/>
           <w:color w:val="000000"/>
           <w:sz w:val="20"/>
@@ -42,7 +42,7 @@
       <w:pPr>
         <w:jc w:val="center"/>
         <w:rPr>
-          <w:rFonts w:ascii="Arial" w:hAnsi="Arial"/>
+          <w:rFonts w:ascii="Arial" w:hAnsi="Arial" w:cs="Arial"/>
           <w:b/>
           <w:color w:val="000000"/>
           <w:sz w:val="20"/>
@@ -54,7 +54,7 @@
       <w:pPr>
         <w:jc w:val="center"/>
         <w:rPr>
-          <w:rFonts w:ascii="Arial" w:hAnsi="Arial"/>
+          <w:rFonts w:ascii="Arial" w:hAnsi="Arial" w:cs="Arial"/>
           <w:b/>
           <w:color w:val="000000"/>
           <w:sz w:val="20"/>
@@ -66,7 +66,7 @@
       <w:pPr>
         <w:jc w:val="center"/>
         <w:rPr>
-          <w:rFonts w:ascii="Arial" w:hAnsi="Arial"/>
+          <w:rFonts w:ascii="Arial" w:hAnsi="Arial" w:cs="Arial"/>
           <w:b/>
           <w:color w:val="000000"/>
           <w:sz w:val="20"/>
@@ -75,159 +75,69 @@
       </w:pPr>
       <w:r>
         <w:rPr>
-          <w:rFonts w:ascii="Arial" w:hAnsi="Arial"/>
+          <w:rFonts w:ascii="Arial" w:hAnsi="Arial" w:cs="Arial"/>
           <w:b/>
           <w:color w:val="000000"/>
           <w:sz w:val="20"/>
           <w:lang w:bidi="en-US"/>
         </w:rPr>
-        <w:t>{{</w:t>
-      </w:r>
-      <w:proofErr w:type="spellStart"/>
-      <w:r>
-        <w:rPr>
-          <w:rFonts w:ascii="Arial" w:hAnsi="Arial"/>
+        <w:t xml:space="preserve">{{report_date.month}} </w:t>
+      </w:r>
+      <w:r>
+        <w:rPr>
+          <w:rFonts w:ascii="Arial" w:hAnsi="Arial" w:cs="Arial"/>
           <w:b/>
           <w:color w:val="000000"/>
           <w:sz w:val="20"/>
           <w:lang w:bidi="en-US"/>
         </w:rPr>
-        <w:t>report_</w:t>
-      </w:r>
-      <w:proofErr w:type="gramStart"/>
-      <w:r>
-        <w:rPr>
-          <w:rFonts w:ascii="Arial" w:hAnsi="Arial"/>
+        <w:t>{</w:t>
+      </w:r>
+      <w:r>
+        <w:rPr>
+          <w:rFonts w:ascii="Arial" w:hAnsi="Arial" w:cs="Arial"/>
           <w:b/>
           <w:color w:val="000000"/>
           <w:sz w:val="20"/>
           <w:lang w:bidi="en-US"/>
         </w:rPr>
-        <w:t>date.month</w:t>
-      </w:r>
-      <w:proofErr w:type="spellEnd"/>
-      <w:proofErr w:type="gramEnd"/>
-      <w:r>
-        <w:rPr>
-          <w:rFonts w:ascii="Arial" w:hAnsi="Arial"/>
+        <w:t>{report_date.day}}</w:t>
+      </w:r>
+      <w:r>
+        <w:rPr>
+          <w:rFonts w:ascii="Arial" w:hAnsi="Arial" w:cs="Arial"/>
           <w:b/>
           <w:color w:val="000000"/>
           <w:sz w:val="20"/>
           <w:lang w:bidi="en-US"/>
         </w:rPr>
-        <w:t xml:space="preserve">}} </w:t>
-      </w:r>
-      <w:r>
-        <w:rPr>
-          <w:rFonts w:ascii="Arial" w:hAnsi="Arial"/>
+        <w:t>,</w:t>
+      </w:r>
+      <w:r>
+        <w:rPr>
+          <w:rFonts w:ascii="Arial" w:hAnsi="Arial" w:cs="Arial"/>
           <w:b/>
           <w:color w:val="000000"/>
           <w:sz w:val="20"/>
           <w:lang w:bidi="en-US"/>
         </w:rPr>
-        <w:t>{</w:t>
-      </w:r>
-      <w:r>
-        <w:rPr>
-          <w:rFonts w:ascii="Arial" w:hAnsi="Arial"/>
+        <w:t xml:space="preserve"> </w:t>
+      </w:r>
+      <w:r>
+        <w:rPr>
+          <w:rFonts w:ascii="Arial" w:hAnsi="Arial" w:cs="Arial"/>
           <w:b/>
           <w:color w:val="000000"/>
           <w:sz w:val="20"/>
           <w:lang w:bidi="en-US"/>
         </w:rPr>
-        <w:t>{</w:t>
-      </w:r>
-      <w:proofErr w:type="spellStart"/>
-      <w:r>
-        <w:rPr>
-          <w:rFonts w:ascii="Arial" w:hAnsi="Arial"/>
-          <w:b/>
-          <w:color w:val="000000"/>
-          <w:sz w:val="20"/>
-          <w:lang w:bidi="en-US"/>
-        </w:rPr>
-        <w:t>report_date.day</w:t>
-      </w:r>
-      <w:proofErr w:type="spellEnd"/>
-      <w:r>
-        <w:rPr>
-          <w:rFonts w:ascii="Arial" w:hAnsi="Arial"/>
-          <w:b/>
-          <w:color w:val="000000"/>
-          <w:sz w:val="20"/>
-          <w:lang w:bidi="en-US"/>
-        </w:rPr>
-        <w:t>}}</w:t>
-      </w:r>
-      <w:r>
-        <w:rPr>
-          <w:rFonts w:ascii="Arial" w:hAnsi="Arial"/>
-          <w:b/>
-          <w:color w:val="000000"/>
-          <w:sz w:val="20"/>
-          <w:lang w:bidi="en-US"/>
-        </w:rPr>
-        <w:t>,</w:t>
-      </w:r>
-      <w:r>
-        <w:rPr>
-          <w:rFonts w:ascii="Arial" w:hAnsi="Arial"/>
-          <w:b/>
-          <w:color w:val="000000"/>
-          <w:sz w:val="20"/>
-          <w:lang w:bidi="en-US"/>
-        </w:rPr>
-        <w:t xml:space="preserve"> </w:t>
-      </w:r>
-      <w:r>
-        <w:rPr>
-          <w:rFonts w:ascii="Arial" w:hAnsi="Arial"/>
-          <w:b/>
-          <w:color w:val="000000"/>
-          <w:sz w:val="20"/>
-          <w:lang w:bidi="en-US"/>
-        </w:rPr>
-        <w:t>{{</w:t>
-      </w:r>
-      <w:proofErr w:type="spellStart"/>
-      <w:r>
-        <w:rPr>
-          <w:rFonts w:ascii="Arial" w:hAnsi="Arial"/>
-          <w:b/>
-          <w:color w:val="000000"/>
-          <w:sz w:val="20"/>
-          <w:lang w:bidi="en-US"/>
-        </w:rPr>
-        <w:t>report_</w:t>
-      </w:r>
-      <w:proofErr w:type="gramStart"/>
-      <w:r>
-        <w:rPr>
-          <w:rFonts w:ascii="Arial" w:hAnsi="Arial"/>
-          <w:b/>
-          <w:color w:val="000000"/>
-          <w:sz w:val="20"/>
-          <w:lang w:bidi="en-US"/>
-        </w:rPr>
-        <w:t>date.year</w:t>
-      </w:r>
-      <w:proofErr w:type="spellEnd"/>
-      <w:proofErr w:type="gramEnd"/>
-      <w:r>
-        <w:rPr>
-          <w:rFonts w:ascii="Arial" w:hAnsi="Arial"/>
-          <w:b/>
-          <w:color w:val="000000"/>
-          <w:sz w:val="20"/>
-          <w:lang w:bidi="en-US"/>
-        </w:rPr>
-        <w:t>}}</w:t>
-      </w:r>
-    </w:p>
-    <w:p>
-      <w:pPr>
-        <w:rPr>
-          <w:rFonts w:ascii="Arial" w:hAnsi="Arial"/>
+        <w:t>{{report_date.year}}</w:t>
+      </w:r>
+    </w:p>
+    <w:p>
+      <w:pPr>
+        <w:rPr>
+          <w:rFonts w:ascii="Arial" w:hAnsi="Arial" w:cs="Arial"/>
           <w:b/>
           <w:color w:val="000000"/>
           <w:sz w:val="20"/>
@@ -248,7 +158,7 @@
     <w:p>
       <w:pPr>
         <w:rPr>
-          <w:rFonts w:ascii="Arial" w:hAnsi="Arial"/>
+          <w:rFonts w:ascii="Arial" w:hAnsi="Arial" w:cs="Arial"/>
           <w:b/>
           <w:color w:val="000000"/>
           <w:sz w:val="20"/>
@@ -261,7 +171,7 @@
     <w:p>
       <w:pPr>
         <w:rPr>
-          <w:rFonts w:ascii="Arial" w:hAnsi="Arial"/>
+          <w:rFonts w:ascii="Arial" w:hAnsi="Arial" w:cs="Arial"/>
           <w:bCs/>
           <w:color w:val="000000"/>
           <w:sz w:val="20"/>
@@ -271,65 +181,21 @@
       </w:pPr>
       <w:r>
         <w:rPr>
-          <w:rFonts w:ascii="Arial" w:hAnsi="Arial"/>
+          <w:rFonts w:ascii="Arial" w:hAnsi="Arial" w:cs="Arial"/>
           <w:bCs/>
           <w:color w:val="000000"/>
           <w:sz w:val="20"/>
           <w:szCs w:val="20"/>
           <w:lang w:bidi="en-US"/>
         </w:rPr>
-        <w:t xml:space="preserve">{% for </w:t>
-      </w:r>
-      <w:r>
-        <w:rPr>
-          <w:rFonts w:ascii="Arial" w:hAnsi="Arial"/>
-          <w:bCs/>
-          <w:color w:val="000000"/>
-          <w:sz w:val="20"/>
-          <w:szCs w:val="20"/>
-          <w:lang w:bidi="en-US"/>
-        </w:rPr>
-        <w:t>section</w:t>
-      </w:r>
-      <w:r>
-        <w:rPr>
-          <w:rFonts w:ascii="Arial" w:hAnsi="Arial"/>
-          <w:bCs/>
-          <w:color w:val="000000"/>
-          <w:sz w:val="20"/>
-          <w:szCs w:val="20"/>
-          <w:lang w:bidi="en-US"/>
-        </w:rPr>
-        <w:t xml:space="preserve"> in </w:t>
-      </w:r>
-      <w:r>
-        <w:rPr>
-          <w:rFonts w:ascii="Arial" w:hAnsi="Arial"/>
-          <w:bCs/>
-          <w:color w:val="000000"/>
-          <w:sz w:val="20"/>
-          <w:szCs w:val="20"/>
-          <w:lang w:bidi="en-US"/>
-        </w:rPr>
-        <w:t>sections</w:t>
-      </w:r>
-      <w:r>
-        <w:rPr>
-          <w:rFonts w:ascii="Arial" w:hAnsi="Arial"/>
-          <w:bCs/>
-          <w:color w:val="000000"/>
-          <w:sz w:val="20"/>
-          <w:szCs w:val="20"/>
-          <w:lang w:bidi="en-US"/>
-        </w:rPr>
-        <w:t xml:space="preserve"> %}</w:t>
+        <w:t>{% for section in sections %}</w:t>
       </w:r>
     </w:p>
     <w:p>
       <w:pPr>
         <w:pStyle w:val="Heading1"/>
         <w:rPr>
-          <w:rFonts w:ascii="Arial" w:hAnsi="Arial"/>
+          <w:rFonts w:ascii="Arial" w:hAnsi="Arial" w:cs="Arial"/>
           <w:b/>
           <w:color w:val="000000"/>
           <w:u w:val="single"/>
@@ -344,7 +210,7 @@
       <w:bookmarkEnd w:id="7"/>
       <w:r>
         <w:rPr>
-          <w:rFonts w:ascii="Arial" w:hAnsi="Arial"/>
+          <w:rFonts w:ascii="Arial" w:hAnsi="Arial" w:cs="Arial"/>
           <w:b/>
           <w:color w:val="000000"/>
           <w:u w:val="single"/>
@@ -354,7 +220,7 @@
       </w:r>
       <w:r>
         <w:rPr>
-          <w:rFonts w:ascii="Arial" w:hAnsi="Arial"/>
+          <w:rFonts w:ascii="Arial" w:hAnsi="Arial" w:cs="Arial"/>
           <w:b/>
           <w:color w:val="000000"/>
           <w:u w:val="single"/>
@@ -364,7 +230,7 @@
       </w:r>
       <w:r>
         <w:rPr>
-          <w:rFonts w:ascii="Arial" w:hAnsi="Arial"/>
+          <w:rFonts w:ascii="Arial" w:hAnsi="Arial" w:cs="Arial"/>
           <w:b/>
           <w:color w:val="000000"/>
           <w:u w:val="single"/>
@@ -376,186 +242,145 @@
     <w:p>
       <w:pPr>
         <w:rPr>
-          <w:lang w:bidi="en-US"/>
-        </w:rPr>
-      </w:pPr>
-    </w:p>
-    <w:p>
-      <w:pPr>
-        <w:rPr>
-          <w:lang w:bidi="en-US"/>
-        </w:rPr>
-      </w:pPr>
-      <w:r>
-        <w:rPr>
-          <w:lang w:bidi="en-US"/>
-        </w:rPr>
-        <w:t xml:space="preserve">{% for article in </w:t>
-      </w:r>
-      <w:proofErr w:type="spellStart"/>
-      <w:proofErr w:type="gramStart"/>
-      <w:r>
-        <w:rPr>
-          <w:lang w:bidi="en-US"/>
-        </w:rPr>
-        <w:t>section.articles</w:t>
-      </w:r>
-      <w:proofErr w:type="spellEnd"/>
-      <w:proofErr w:type="gramEnd"/>
-      <w:r>
-        <w:rPr>
-          <w:lang w:bidi="en-US"/>
-        </w:rPr>
-        <w:t xml:space="preserve"> %}</w:t>
-      </w:r>
-    </w:p>
-    <w:p>
-      <w:pPr>
-        <w:rPr>
+          <w:rFonts w:ascii="Arial" w:hAnsi="Arial" w:cs="Arial"/>
+          <w:lang w:bidi="en-US"/>
+        </w:rPr>
+      </w:pPr>
+    </w:p>
+    <w:p>
+      <w:pPr>
+        <w:rPr>
+          <w:rFonts w:ascii="Arial" w:hAnsi="Arial" w:cs="Arial"/>
+          <w:lang w:bidi="en-US"/>
+        </w:rPr>
+      </w:pPr>
+      <w:r>
+        <w:rPr>
+          <w:rFonts w:ascii="Arial" w:hAnsi="Arial" w:cs="Arial"/>
+          <w:lang w:bidi="en-US"/>
+        </w:rPr>
+        <w:t>{% for article in section.articles %}</w:t>
+      </w:r>
+    </w:p>
+    <w:p>
+      <w:pPr>
+        <w:rPr>
+          <w:rFonts w:ascii="Arial" w:hAnsi="Arial" w:cs="Arial"/>
           <w:color w:val="000000" w:themeColor="text1"/>
-          <w:lang w:bidi="en-US"/>
-        </w:rPr>
-      </w:pPr>
-      <w:r>
-        <w:rPr>
+          <w:sz w:val="20"/>
+          <w:szCs w:val="20"/>
+          <w:lang w:bidi="en-US"/>
+        </w:rPr>
+      </w:pPr>
+      <w:r>
+        <w:rPr>
+          <w:rFonts w:ascii="Arial" w:hAnsi="Arial" w:cs="Arial"/>
           <w:color w:val="000000" w:themeColor="text1"/>
+          <w:sz w:val="20"/>
+          <w:szCs w:val="20"/>
           <w:lang w:bidi="en-US"/>
         </w:rPr>
         <w:t>{{</w:t>
       </w:r>
       <w:r>
         <w:rPr>
+          <w:rFonts w:ascii="Arial" w:hAnsi="Arial" w:cs="Arial"/>
           <w:color w:val="000000" w:themeColor="text1"/>
+          <w:sz w:val="20"/>
+          <w:szCs w:val="20"/>
           <w:lang w:bidi="en-US"/>
         </w:rPr>
         <w:t xml:space="preserve">r </w:t>
       </w:r>
-      <w:proofErr w:type="spellStart"/>
-      <w:proofErr w:type="gramStart"/>
-      <w:r>
-        <w:rPr>
+      <w:r>
+        <w:rPr>
+          <w:rFonts w:ascii="Arial" w:hAnsi="Arial" w:cs="Arial"/>
           <w:color w:val="000000" w:themeColor="text1"/>
-          <w:lang w:bidi="en-US"/>
-        </w:rPr>
-        <w:t>article.title</w:t>
-      </w:r>
-      <w:proofErr w:type="gramEnd"/>
-      <w:r>
-        <w:rPr>
-          <w:color w:val="000000" w:themeColor="text1"/>
-          <w:lang w:bidi="en-US"/>
-        </w:rPr>
-        <w:t>_with_link</w:t>
-      </w:r>
-      <w:proofErr w:type="spellEnd"/>
-      <w:r>
-        <w:rPr>
-          <w:color w:val="000000" w:themeColor="text1"/>
-          <w:lang w:bidi="en-US"/>
-        </w:rPr>
-        <w:t>}}</w:t>
-      </w:r>
-    </w:p>
-    <w:p>
-      <w:pPr>
-        <w:rPr>
-          <w:lang w:bidi="en-US"/>
-        </w:rPr>
-      </w:pPr>
-      <w:r>
-        <w:rPr>
+          <w:sz w:val="20"/>
+          <w:szCs w:val="20"/>
+          <w:lang w:bidi="en-US"/>
+        </w:rPr>
+        <w:t>article.title_with_link}}</w:t>
+      </w:r>
+    </w:p>
+    <w:p>
+      <w:pPr>
+        <w:rPr>
+          <w:rFonts w:ascii="Arial" w:hAnsi="Arial" w:cs="Arial"/>
+          <w:sz w:val="20"/>
+          <w:szCs w:val="20"/>
+          <w:lang w:bidi="en-US"/>
+        </w:rPr>
+      </w:pPr>
+      <w:r>
+        <w:rPr>
+          <w:rFonts w:ascii="Arial" w:hAnsi="Arial" w:cs="Arial"/>
+          <w:sz w:val="20"/>
+          <w:szCs w:val="20"/>
           <w:lang w:bidi="en-US"/>
         </w:rPr>
         <w:t>(</w:t>
       </w:r>
       <w:r>
         <w:rPr>
-          <w:lang w:bidi="en-US"/>
-        </w:rPr>
-        <w:t>{{</w:t>
-      </w:r>
-      <w:proofErr w:type="spellStart"/>
-      <w:proofErr w:type="gramStart"/>
-      <w:r>
-        <w:rPr>
-          <w:lang w:bidi="en-US"/>
-        </w:rPr>
-        <w:t>article.source</w:t>
-      </w:r>
-      <w:proofErr w:type="spellEnd"/>
-      <w:proofErr w:type="gramEnd"/>
-      <w:r>
-        <w:rPr>
-          <w:lang w:bidi="en-US"/>
-        </w:rPr>
-        <w:t>}}</w:t>
-      </w:r>
-      <w:r>
-        <w:rPr>
-          <w:lang w:bidi="en-US"/>
-        </w:rPr>
-        <w:t>) {{</w:t>
-      </w:r>
-      <w:proofErr w:type="spellStart"/>
-      <w:proofErr w:type="gramStart"/>
-      <w:r>
-        <w:rPr>
-          <w:lang w:bidi="en-US"/>
-        </w:rPr>
-        <w:t>article.date</w:t>
-      </w:r>
-      <w:proofErr w:type="spellEnd"/>
-      <w:proofErr w:type="gramEnd"/>
-      <w:r>
-        <w:rPr>
-          <w:lang w:bidi="en-US"/>
-        </w:rPr>
-        <w:t>}}</w:t>
-      </w:r>
-    </w:p>
-    <w:p>
-      <w:pPr>
-        <w:rPr>
-          <w:lang w:bidi="en-US"/>
-        </w:rPr>
-      </w:pPr>
-      <w:r>
-        <w:rPr>
-          <w:lang w:bidi="en-US"/>
-        </w:rPr>
-        <w:t>{{</w:t>
-      </w:r>
-      <w:proofErr w:type="spellStart"/>
-      <w:proofErr w:type="gramStart"/>
-      <w:r>
-        <w:rPr>
-          <w:lang w:bidi="en-US"/>
-        </w:rPr>
-        <w:t>article.summary</w:t>
-      </w:r>
-      <w:proofErr w:type="spellEnd"/>
-      <w:proofErr w:type="gramEnd"/>
-      <w:r>
-        <w:rPr>
-          <w:lang w:bidi="en-US"/>
-        </w:rPr>
-        <w:t>}}</w:t>
-      </w:r>
-    </w:p>
-    <w:p>
-      <w:pPr>
-        <w:rPr>
+          <w:rFonts w:ascii="Arial" w:hAnsi="Arial" w:cs="Arial"/>
+          <w:sz w:val="20"/>
+          <w:szCs w:val="20"/>
+          <w:lang w:bidi="en-US"/>
+        </w:rPr>
+        <w:t>{{article.source}}</w:t>
+      </w:r>
+      <w:r>
+        <w:rPr>
+          <w:rFonts w:ascii="Arial" w:hAnsi="Arial" w:cs="Arial"/>
+          <w:sz w:val="20"/>
+          <w:szCs w:val="20"/>
+          <w:lang w:bidi="en-US"/>
+        </w:rPr>
+        <w:t>) {{article.date}}</w:t>
+      </w:r>
+    </w:p>
+    <w:p>
+      <w:pPr>
+        <w:rPr>
+          <w:rFonts w:ascii="Arial" w:hAnsi="Arial" w:cs="Arial"/>
+          <w:sz w:val="20"/>
+          <w:szCs w:val="20"/>
+          <w:lang w:bidi="en-US"/>
+        </w:rPr>
+      </w:pPr>
+      <w:r>
+        <w:rPr>
+          <w:rFonts w:ascii="Arial" w:hAnsi="Arial" w:cs="Arial"/>
+          <w:sz w:val="20"/>
+          <w:szCs w:val="20"/>
+          <w:lang w:bidi="en-US"/>
+        </w:rPr>
+        <w:t>{{article.summary}}</w:t>
+      </w:r>
+    </w:p>
+    <w:p>
+      <w:pPr>
+        <w:rPr>
+          <w:rFonts w:ascii="Arial" w:hAnsi="Arial" w:cs="Arial"/>
           <w:lang w:bidi="en-US"/>
         </w:rPr>
       </w:pPr>
     </w:p>
     <w:bookmarkStart w:id="8" w:name="_Hlk190227748"/>
     <w:p>
+      <w:pPr>
+        <w:rPr>
+          <w:rFonts w:ascii="Arial" w:hAnsi="Arial" w:cs="Arial"/>
+          <w:sz w:val="18"/>
+          <w:szCs w:val="18"/>
+        </w:rPr>
+      </w:pPr>
       <w:r>
         <w:fldChar w:fldCharType="begin"/>
       </w:r>
       <w:r>
-        <w:instrText>HYPERLINK  \l "_Exercises,_Experimentation_and_1"</w:instrText>
+        <w:instrText>HYPERLINK  \l "_FULL_ARTICLES"</w:instrText>
       </w:r>
       <w:r>
         <w:fldChar w:fldCharType="separate"/>
@@ -563,7 +388,7 @@
       <w:r>
         <w:rPr>
           <w:rStyle w:val="Hyperlink"/>
-          <w:rFonts w:ascii="Arial" w:hAnsi="Arial"/>
+          <w:rFonts w:ascii="Arial" w:hAnsi="Arial" w:cs="Arial"/>
           <w:b/>
           <w:sz w:val="18"/>
           <w:szCs w:val="18"/>
@@ -574,7 +399,7 @@
       <w:r>
         <w:rPr>
           <w:rStyle w:val="Hyperlink"/>
-          <w:rFonts w:ascii="Arial" w:hAnsi="Arial"/>
+          <w:rFonts w:ascii="Arial" w:hAnsi="Arial" w:cs="Arial"/>
           <w:b/>
           <w:sz w:val="18"/>
           <w:szCs w:val="18"/>
@@ -584,7 +409,7 @@
       </w:r>
       <w:r>
         <w:rPr>
-          <w:rFonts w:ascii="Arial" w:hAnsi="Arial"/>
+          <w:rFonts w:ascii="Arial" w:hAnsi="Arial" w:cs="Arial"/>
           <w:b/>
           <w:color w:val="000000"/>
           <w:sz w:val="18"/>
@@ -597,7 +422,7 @@
         <w:r>
           <w:rPr>
             <w:rStyle w:val="Hyperlink"/>
-            <w:rFonts w:ascii="Arial" w:hAnsi="Arial"/>
+            <w:rFonts w:ascii="Arial" w:hAnsi="Arial" w:cs="Arial"/>
             <w:b/>
             <w:sz w:val="18"/>
             <w:szCs w:val="18"/>
@@ -613,6 +438,7 @@
     <w:p>
       <w:pPr>
         <w:rPr>
+          <w:rFonts w:ascii="Arial" w:hAnsi="Arial" w:cs="Arial"/>
           <w:sz w:val="18"/>
           <w:szCs w:val="18"/>
         </w:rPr>
@@ -621,28 +447,16 @@
     <w:p>
       <w:pPr>
         <w:rPr>
-          <w:lang w:bidi="en-US"/>
-        </w:rPr>
-      </w:pPr>
-      <w:r>
-        <w:rPr>
-          <w:lang w:bidi="en-US"/>
-        </w:rPr>
-        <w:t xml:space="preserve">{% </w:t>
-      </w:r>
-      <w:proofErr w:type="spellStart"/>
-      <w:r>
-        <w:rPr>
-          <w:lang w:bidi="en-US"/>
-        </w:rPr>
-        <w:t>endfor</w:t>
-      </w:r>
-      <w:proofErr w:type="spellEnd"/>
-      <w:r>
-        <w:rPr>
-          <w:lang w:bidi="en-US"/>
-        </w:rPr>
-        <w:t xml:space="preserve"> %}</w:t>
+          <w:rFonts w:ascii="Arial" w:hAnsi="Arial" w:cs="Arial"/>
+          <w:lang w:bidi="en-US"/>
+        </w:rPr>
+      </w:pPr>
+      <w:r>
+        <w:rPr>
+          <w:rFonts w:ascii="Arial" w:hAnsi="Arial" w:cs="Arial"/>
+          <w:lang w:bidi="en-US"/>
+        </w:rPr>
+        <w:t>{% endfor %}</w:t>
       </w:r>
     </w:p>
     <w:p>
@@ -651,7 +465,7 @@
           <w:bottom w:val="single" w:sz="6" w:space="1" w:color="auto"/>
         </w:pBdr>
         <w:rPr>
-          <w:rFonts w:ascii="Arial" w:hAnsi="Arial"/>
+          <w:rFonts w:ascii="Arial" w:hAnsi="Arial" w:cs="Arial"/>
           <w:bCs/>
           <w:color w:val="000000"/>
           <w:sz w:val="20"/>
@@ -661,38 +475,14 @@
       </w:pPr>
       <w:r>
         <w:rPr>
-          <w:rFonts w:ascii="Arial" w:hAnsi="Arial"/>
+          <w:rFonts w:ascii="Arial" w:hAnsi="Arial" w:cs="Arial"/>
           <w:bCs/>
           <w:color w:val="000000"/>
           <w:sz w:val="20"/>
           <w:szCs w:val="20"/>
           <w:lang w:bidi="en-US"/>
         </w:rPr>
-        <w:t xml:space="preserve">{% </w:t>
-      </w:r>
-      <w:proofErr w:type="spellStart"/>
-      <w:r>
-        <w:rPr>
-          <w:rFonts w:ascii="Arial" w:hAnsi="Arial"/>
-          <w:bCs/>
-          <w:color w:val="000000"/>
-          <w:sz w:val="20"/>
-          <w:szCs w:val="20"/>
-          <w:lang w:bidi="en-US"/>
-        </w:rPr>
-        <w:t>endfor</w:t>
-      </w:r>
-      <w:proofErr w:type="spellEnd"/>
-      <w:r>
-        <w:rPr>
-          <w:rFonts w:ascii="Arial" w:hAnsi="Arial"/>
-          <w:bCs/>
-          <w:color w:val="000000"/>
-          <w:sz w:val="20"/>
-          <w:szCs w:val="20"/>
-          <w:lang w:bidi="en-US"/>
-        </w:rPr>
-        <w:t xml:space="preserve"> %}</w:t>
+        <w:t>{% endfor %}</w:t>
       </w:r>
     </w:p>
     <w:p>
@@ -701,16 +491,23 @@
           <w:bottom w:val="single" w:sz="6" w:space="1" w:color="auto"/>
         </w:pBdr>
         <w:rPr>
-          <w:lang w:bidi="en-US"/>
-        </w:rPr>
-      </w:pPr>
-    </w:p>
-    <w:p/>
+          <w:rFonts w:ascii="Arial" w:hAnsi="Arial" w:cs="Arial"/>
+          <w:lang w:bidi="en-US"/>
+        </w:rPr>
+      </w:pPr>
+    </w:p>
+    <w:p>
+      <w:pPr>
+        <w:rPr>
+          <w:rFonts w:ascii="Arial" w:hAnsi="Arial" w:cs="Arial"/>
+        </w:rPr>
+      </w:pPr>
+    </w:p>
     <w:p>
       <w:pPr>
         <w:jc w:val="center"/>
         <w:rPr>
-          <w:rFonts w:ascii="Arial" w:hAnsi="Arial"/>
+          <w:rFonts w:ascii="Arial" w:hAnsi="Arial" w:cs="Arial"/>
           <w:b/>
           <w:color w:val="000000"/>
           <w:sz w:val="20"/>
@@ -726,7 +523,7 @@
       <w:pPr>
         <w:pStyle w:val="Heading1"/>
         <w:rPr>
-          <w:rFonts w:ascii="Arial" w:hAnsi="Arial"/>
+          <w:rFonts w:ascii="Arial" w:hAnsi="Arial" w:cs="Arial"/>
           <w:b/>
           <w:color w:val="000000"/>
           <w:sz w:val="20"/>
@@ -735,9 +532,11 @@
           <w:lang w:bidi="en-US"/>
         </w:rPr>
       </w:pPr>
-      <w:r>
-        <w:rPr>
-          <w:rFonts w:ascii="Arial" w:hAnsi="Arial"/>
+      <w:bookmarkStart w:id="11" w:name="_FULL_ARTICLES"/>
+      <w:bookmarkEnd w:id="11"/>
+      <w:r>
+        <w:rPr>
+          <w:rFonts w:ascii="Arial" w:hAnsi="Arial" w:cs="Arial"/>
           <w:b/>
           <w:color w:val="000000"/>
           <w:u w:val="single"/>
@@ -749,7 +548,7 @@
     <w:p>
       <w:pPr>
         <w:rPr>
-          <w:rFonts w:ascii="Arial" w:hAnsi="Arial"/>
+          <w:rFonts w:ascii="Arial" w:hAnsi="Arial" w:cs="Arial"/>
           <w:b/>
           <w:color w:val="000000"/>
           <w:sz w:val="20"/>
@@ -762,7 +561,7 @@
     <w:p>
       <w:pPr>
         <w:rPr>
-          <w:rFonts w:ascii="Arial" w:hAnsi="Arial"/>
+          <w:rFonts w:ascii="Arial" w:hAnsi="Arial" w:cs="Arial"/>
           <w:bCs/>
           <w:color w:val="000000"/>
           <w:sz w:val="20"/>
@@ -772,65 +571,21 @@
       </w:pPr>
       <w:r>
         <w:rPr>
-          <w:rFonts w:ascii="Arial" w:hAnsi="Arial"/>
+          <w:rFonts w:ascii="Arial" w:hAnsi="Arial" w:cs="Arial"/>
           <w:bCs/>
           <w:color w:val="000000"/>
           <w:sz w:val="20"/>
           <w:szCs w:val="20"/>
           <w:lang w:bidi="en-US"/>
         </w:rPr>
-        <w:t xml:space="preserve">{% for </w:t>
-      </w:r>
-      <w:r>
-        <w:rPr>
-          <w:rFonts w:ascii="Arial" w:hAnsi="Arial"/>
-          <w:bCs/>
-          <w:color w:val="000000"/>
-          <w:sz w:val="20"/>
-          <w:szCs w:val="20"/>
-          <w:lang w:bidi="en-US"/>
-        </w:rPr>
-        <w:t>section</w:t>
-      </w:r>
-      <w:r>
-        <w:rPr>
-          <w:rFonts w:ascii="Arial" w:hAnsi="Arial"/>
-          <w:bCs/>
-          <w:color w:val="000000"/>
-          <w:sz w:val="20"/>
-          <w:szCs w:val="20"/>
-          <w:lang w:bidi="en-US"/>
-        </w:rPr>
-        <w:t xml:space="preserve"> in </w:t>
-      </w:r>
-      <w:r>
-        <w:rPr>
-          <w:rFonts w:ascii="Arial" w:hAnsi="Arial"/>
-          <w:bCs/>
-          <w:color w:val="000000"/>
-          <w:sz w:val="20"/>
-          <w:szCs w:val="20"/>
-          <w:lang w:bidi="en-US"/>
-        </w:rPr>
-        <w:t>sections</w:t>
-      </w:r>
-      <w:r>
-        <w:rPr>
-          <w:rFonts w:ascii="Arial" w:hAnsi="Arial"/>
-          <w:bCs/>
-          <w:color w:val="000000"/>
-          <w:sz w:val="20"/>
-          <w:szCs w:val="20"/>
-          <w:lang w:bidi="en-US"/>
-        </w:rPr>
-        <w:t xml:space="preserve"> %}</w:t>
+        <w:t>{% for section in sections %}</w:t>
       </w:r>
     </w:p>
     <w:p>
       <w:pPr>
         <w:pStyle w:val="Heading1"/>
         <w:rPr>
-          <w:rFonts w:ascii="Arial" w:hAnsi="Arial"/>
+          <w:rFonts w:ascii="Arial" w:hAnsi="Arial" w:cs="Arial"/>
           <w:b/>
           <w:color w:val="000000"/>
           <w:u w:val="single"/>
@@ -839,7 +594,7 @@
       </w:pPr>
       <w:r>
         <w:rPr>
-          <w:rFonts w:ascii="Arial" w:hAnsi="Arial"/>
+          <w:rFonts w:ascii="Arial" w:hAnsi="Arial" w:cs="Arial"/>
           <w:b/>
           <w:color w:val="000000"/>
           <w:u w:val="single"/>
@@ -849,7 +604,7 @@
       </w:r>
       <w:r>
         <w:rPr>
-          <w:rFonts w:ascii="Arial" w:hAnsi="Arial"/>
+          <w:rFonts w:ascii="Arial" w:hAnsi="Arial" w:cs="Arial"/>
           <w:b/>
           <w:color w:val="000000"/>
           <w:u w:val="single"/>
@@ -859,7 +614,7 @@
       </w:r>
       <w:r>
         <w:rPr>
-          <w:rFonts w:ascii="Arial" w:hAnsi="Arial"/>
+          <w:rFonts w:ascii="Arial" w:hAnsi="Arial" w:cs="Arial"/>
           <w:b/>
           <w:color w:val="000000"/>
           <w:u w:val="single"/>
@@ -871,7 +626,7 @@
     <w:p>
       <w:pPr>
         <w:rPr>
-          <w:rFonts w:ascii="Arial" w:hAnsi="Arial"/>
+          <w:rFonts w:ascii="Arial" w:hAnsi="Arial" w:cs="Arial"/>
           <w:b/>
           <w:color w:val="000000"/>
           <w:sz w:val="20"/>
@@ -884,218 +639,152 @@
     <w:p>
       <w:pPr>
         <w:rPr>
-          <w:lang w:bidi="en-US"/>
-        </w:rPr>
-      </w:pPr>
-      <w:r>
-        <w:rPr>
-          <w:lang w:bidi="en-US"/>
-        </w:rPr>
-        <w:t xml:space="preserve">{% for article in </w:t>
-      </w:r>
-      <w:proofErr w:type="spellStart"/>
-      <w:proofErr w:type="gramStart"/>
-      <w:r>
-        <w:rPr>
-          <w:lang w:bidi="en-US"/>
-        </w:rPr>
-        <w:t>section.articles</w:t>
-      </w:r>
-      <w:proofErr w:type="spellEnd"/>
-      <w:proofErr w:type="gramEnd"/>
-      <w:r>
-        <w:rPr>
-          <w:lang w:bidi="en-US"/>
-        </w:rPr>
-        <w:t xml:space="preserve"> %}</w:t>
-      </w:r>
-    </w:p>
-    <w:p>
-      <w:pPr>
-        <w:rPr>
+          <w:rFonts w:ascii="Arial" w:hAnsi="Arial" w:cs="Arial"/>
+          <w:lang w:bidi="en-US"/>
+        </w:rPr>
+      </w:pPr>
+      <w:r>
+        <w:rPr>
+          <w:rFonts w:ascii="Arial" w:hAnsi="Arial" w:cs="Arial"/>
+          <w:lang w:bidi="en-US"/>
+        </w:rPr>
+        <w:t>{% for article in section.articles %}</w:t>
+      </w:r>
+    </w:p>
+    <w:p>
+      <w:pPr>
+        <w:rPr>
+          <w:rFonts w:ascii="Arial" w:hAnsi="Arial" w:cs="Arial"/>
           <w:color w:val="000000" w:themeColor="text1"/>
-          <w:lang w:bidi="en-US"/>
-        </w:rPr>
-      </w:pPr>
-      <w:r>
-        <w:rPr>
+          <w:sz w:val="20"/>
+          <w:szCs w:val="20"/>
+          <w:lang w:bidi="en-US"/>
+        </w:rPr>
+      </w:pPr>
+      <w:r>
+        <w:rPr>
+          <w:rFonts w:ascii="Arial" w:hAnsi="Arial" w:cs="Arial"/>
           <w:color w:val="000000" w:themeColor="text1"/>
+          <w:sz w:val="20"/>
+          <w:szCs w:val="20"/>
           <w:lang w:bidi="en-US"/>
         </w:rPr>
         <w:t>{{</w:t>
       </w:r>
       <w:r>
         <w:rPr>
+          <w:rFonts w:ascii="Arial" w:hAnsi="Arial" w:cs="Arial"/>
           <w:color w:val="000000" w:themeColor="text1"/>
+          <w:sz w:val="20"/>
+          <w:szCs w:val="20"/>
           <w:lang w:bidi="en-US"/>
         </w:rPr>
         <w:t xml:space="preserve">r </w:t>
       </w:r>
-      <w:proofErr w:type="spellStart"/>
-      <w:proofErr w:type="gramStart"/>
-      <w:r>
-        <w:rPr>
+      <w:r>
+        <w:rPr>
+          <w:rFonts w:ascii="Arial" w:hAnsi="Arial" w:cs="Arial"/>
           <w:color w:val="000000" w:themeColor="text1"/>
-          <w:lang w:bidi="en-US"/>
-        </w:rPr>
-        <w:t>article.title</w:t>
-      </w:r>
-      <w:proofErr w:type="gramEnd"/>
-      <w:r>
-        <w:rPr>
-          <w:color w:val="000000" w:themeColor="text1"/>
-          <w:lang w:bidi="en-US"/>
-        </w:rPr>
-        <w:t>_with_link</w:t>
-      </w:r>
-      <w:proofErr w:type="spellEnd"/>
-      <w:r>
-        <w:rPr>
-          <w:color w:val="000000" w:themeColor="text1"/>
-          <w:lang w:bidi="en-US"/>
-        </w:rPr>
-        <w:t>}}</w:t>
-      </w:r>
-    </w:p>
-    <w:p>
-      <w:pPr>
-        <w:rPr>
+          <w:sz w:val="20"/>
+          <w:szCs w:val="20"/>
+          <w:lang w:bidi="en-US"/>
+        </w:rPr>
+        <w:t>article.title_with_link}}</w:t>
+      </w:r>
+    </w:p>
+    <w:p>
+      <w:pPr>
+        <w:rPr>
+          <w:rFonts w:ascii="Arial" w:hAnsi="Arial" w:cs="Arial"/>
           <w:color w:val="0000FF"/>
-          <w:lang w:bidi="en-US"/>
-        </w:rPr>
-      </w:pPr>
-      <w:r>
-        <w:rPr>
+          <w:sz w:val="20"/>
+          <w:szCs w:val="20"/>
+          <w:lang w:bidi="en-US"/>
+        </w:rPr>
+      </w:pPr>
+      <w:r>
+        <w:rPr>
+          <w:rFonts w:ascii="Arial" w:hAnsi="Arial" w:cs="Arial"/>
+          <w:sz w:val="20"/>
+          <w:szCs w:val="20"/>
           <w:lang w:bidi="en-US"/>
         </w:rPr>
         <w:t>(</w:t>
       </w:r>
       <w:r>
         <w:rPr>
-          <w:lang w:bidi="en-US"/>
-        </w:rPr>
-        <w:t>{{</w:t>
-      </w:r>
-      <w:proofErr w:type="spellStart"/>
-      <w:r>
-        <w:rPr>
-          <w:lang w:bidi="en-US"/>
-        </w:rPr>
-        <w:t>article.source</w:t>
-      </w:r>
-      <w:proofErr w:type="spellEnd"/>
-      <w:r>
-        <w:rPr>
-          <w:lang w:bidi="en-US"/>
-        </w:rPr>
-        <w:t>}})</w:t>
-      </w:r>
-      <w:r>
-        <w:rPr>
-          <w:lang w:bidi="en-US"/>
-        </w:rPr>
-        <w:t xml:space="preserve"> {{</w:t>
-      </w:r>
-      <w:proofErr w:type="spellStart"/>
-      <w:r>
-        <w:rPr>
-          <w:lang w:bidi="en-US"/>
-        </w:rPr>
-        <w:t>article.date</w:t>
-      </w:r>
-      <w:proofErr w:type="spellEnd"/>
-      <w:r>
-        <w:rPr>
-          <w:lang w:bidi="en-US"/>
-        </w:rPr>
-        <w:t>}}</w:t>
-      </w:r>
-    </w:p>
-    <w:p>
-      <w:pPr>
-        <w:rPr>
-          <w:lang w:bidi="en-US"/>
-        </w:rPr>
-      </w:pPr>
-      <w:r>
-        <w:rPr>
-          <w:lang w:bidi="en-US"/>
-        </w:rPr>
-        <w:t>{{</w:t>
-      </w:r>
-      <w:proofErr w:type="spellStart"/>
-      <w:proofErr w:type="gramStart"/>
-      <w:r>
-        <w:rPr>
-          <w:lang w:bidi="en-US"/>
-        </w:rPr>
-        <w:t>article.full</w:t>
-      </w:r>
-      <w:proofErr w:type="gramEnd"/>
-      <w:r>
-        <w:rPr>
-          <w:lang w:bidi="en-US"/>
-        </w:rPr>
-        <w:t>_text</w:t>
-      </w:r>
-      <w:proofErr w:type="spellEnd"/>
-      <w:r>
-        <w:rPr>
-          <w:lang w:bidi="en-US"/>
-        </w:rPr>
-        <w:t>}}</w:t>
-      </w:r>
-    </w:p>
-    <w:p>
-      <w:pPr>
-        <w:rPr>
-          <w:rFonts w:ascii="Arial" w:hAnsi="Arial" w:cs="Arial"/>
-          <w:sz w:val="20"/>
-          <w:szCs w:val="20"/>
-          <w:lang w:bidi="en-US"/>
-        </w:rPr>
-      </w:pPr>
-    </w:p>
-    <w:p>
-      <w:hyperlink w:anchor="_{{section.name}}" w:history="1">
+          <w:rFonts w:ascii="Arial" w:hAnsi="Arial" w:cs="Arial"/>
+          <w:sz w:val="20"/>
+          <w:szCs w:val="20"/>
+          <w:lang w:bidi="en-US"/>
+        </w:rPr>
+        <w:t>{{article.source}})</w:t>
+      </w:r>
+      <w:r>
+        <w:rPr>
+          <w:rFonts w:ascii="Arial" w:hAnsi="Arial" w:cs="Arial"/>
+          <w:sz w:val="20"/>
+          <w:szCs w:val="20"/>
+          <w:lang w:bidi="en-US"/>
+        </w:rPr>
+        <w:t xml:space="preserve"> {{article.date}}</w:t>
+      </w:r>
+    </w:p>
+    <w:p>
+      <w:pPr>
+        <w:rPr>
+          <w:rFonts w:ascii="Arial" w:hAnsi="Arial" w:cs="Arial"/>
+          <w:sz w:val="20"/>
+          <w:szCs w:val="20"/>
+          <w:lang w:bidi="en-US"/>
+        </w:rPr>
+      </w:pPr>
+      <w:r>
+        <w:rPr>
+          <w:rFonts w:ascii="Arial" w:hAnsi="Arial" w:cs="Arial"/>
+          <w:sz w:val="20"/>
+          <w:szCs w:val="20"/>
+          <w:lang w:bidi="en-US"/>
+        </w:rPr>
+        <w:t>{{article.full_text}}</w:t>
+      </w:r>
+    </w:p>
+    <w:p>
+      <w:pPr>
+        <w:rPr>
+          <w:rFonts w:ascii="Arial" w:hAnsi="Arial" w:cs="Arial"/>
+          <w:sz w:val="20"/>
+          <w:szCs w:val="20"/>
+          <w:lang w:bidi="en-US"/>
+        </w:rPr>
+      </w:pPr>
+    </w:p>
+    <w:p>
+      <w:pPr>
+        <w:rPr>
+          <w:rFonts w:ascii="Arial" w:hAnsi="Arial" w:cs="Arial"/>
+          <w:sz w:val="18"/>
+          <w:szCs w:val="18"/>
+        </w:rPr>
+      </w:pPr>
+      <w:hyperlink w:anchor="_top" w:history="1">
         <w:r>
           <w:rPr>
             <w:rStyle w:val="Hyperlink"/>
-            <w:rFonts w:ascii="Arial" w:hAnsi="Arial"/>
+            <w:rFonts w:ascii="Arial" w:hAnsi="Arial" w:cs="Arial"/>
             <w:b/>
             <w:sz w:val="18"/>
             <w:szCs w:val="18"/>
             <w:lang w:bidi="en-US"/>
           </w:rPr>
-          <w:t>Back to Summari</w:t>
-        </w:r>
-        <w:r>
-          <w:rPr>
-            <w:rStyle w:val="Hyperlink"/>
-            <w:rFonts w:ascii="Arial" w:hAnsi="Arial"/>
-            <w:b/>
-            <w:sz w:val="18"/>
-            <w:szCs w:val="18"/>
-            <w:lang w:bidi="en-US"/>
-          </w:rPr>
-          <w:t>e</w:t>
-        </w:r>
-        <w:r>
-          <w:rPr>
-            <w:rStyle w:val="Hyperlink"/>
-            <w:rFonts w:ascii="Arial" w:hAnsi="Arial"/>
-            <w:b/>
-            <w:sz w:val="18"/>
-            <w:szCs w:val="18"/>
-            <w:lang w:bidi="en-US"/>
-          </w:rPr>
-          <w:t>s</w:t>
+          <w:t>Back to Summaries</w:t>
         </w:r>
       </w:hyperlink>
     </w:p>
     <w:p>
       <w:pPr>
         <w:rPr>
+          <w:rFonts w:ascii="Arial" w:hAnsi="Arial" w:cs="Arial"/>
           <w:sz w:val="18"/>
           <w:szCs w:val="18"/>
         </w:rPr>
@@ -1104,72 +793,41 @@
     <w:p>
       <w:pPr>
         <w:rPr>
-          <w:lang w:bidi="en-US"/>
-        </w:rPr>
-      </w:pPr>
-      <w:r>
-        <w:rPr>
-          <w:lang w:bidi="en-US"/>
-        </w:rPr>
-        <w:t xml:space="preserve">{% </w:t>
-      </w:r>
-      <w:proofErr w:type="spellStart"/>
-      <w:r>
-        <w:rPr>
-          <w:lang w:bidi="en-US"/>
-        </w:rPr>
-        <w:t>endfor</w:t>
-      </w:r>
-      <w:proofErr w:type="spellEnd"/>
-      <w:r>
-        <w:rPr>
-          <w:lang w:bidi="en-US"/>
-        </w:rPr>
-        <w:t xml:space="preserve"> %}</w:t>
-      </w:r>
-    </w:p>
-    <w:p>
-      <w:r>
-        <w:rPr>
-          <w:rFonts w:ascii="Arial" w:hAnsi="Arial"/>
+          <w:rFonts w:ascii="Arial" w:hAnsi="Arial" w:cs="Arial"/>
+          <w:lang w:bidi="en-US"/>
+        </w:rPr>
+      </w:pPr>
+      <w:r>
+        <w:rPr>
+          <w:rFonts w:ascii="Arial" w:hAnsi="Arial" w:cs="Arial"/>
+          <w:lang w:bidi="en-US"/>
+        </w:rPr>
+        <w:t>{% endfor %}</w:t>
+      </w:r>
+    </w:p>
+    <w:p>
+      <w:pPr>
+        <w:rPr>
+          <w:rFonts w:ascii="Arial" w:hAnsi="Arial" w:cs="Arial"/>
+        </w:rPr>
+      </w:pPr>
+      <w:r>
+        <w:rPr>
+          <w:rFonts w:ascii="Arial" w:hAnsi="Arial" w:cs="Arial"/>
           <w:bCs/>
           <w:color w:val="000000"/>
           <w:sz w:val="20"/>
           <w:szCs w:val="20"/>
           <w:lang w:bidi="en-US"/>
         </w:rPr>
-        <w:t xml:space="preserve">{% </w:t>
-      </w:r>
-      <w:proofErr w:type="spellStart"/>
-      <w:r>
-        <w:rPr>
-          <w:rFonts w:ascii="Arial" w:hAnsi="Arial"/>
-          <w:bCs/>
-          <w:color w:val="000000"/>
-          <w:sz w:val="20"/>
-          <w:szCs w:val="20"/>
-          <w:lang w:bidi="en-US"/>
-        </w:rPr>
-        <w:t>endfor</w:t>
-      </w:r>
-      <w:proofErr w:type="spellEnd"/>
-      <w:r>
-        <w:rPr>
-          <w:rFonts w:ascii="Arial" w:hAnsi="Arial"/>
-          <w:bCs/>
-          <w:color w:val="000000"/>
-          <w:sz w:val="20"/>
-          <w:szCs w:val="20"/>
-          <w:lang w:bidi="en-US"/>
-        </w:rPr>
-        <w:t xml:space="preserve"> %}</w:t>
+        <w:t>{% endfor %}</w:t>
       </w:r>
     </w:p>
     <w:p>
       <w:pPr>
         <w:jc w:val="center"/>
         <w:rPr>
-          <w:rFonts w:ascii="Arial" w:hAnsi="Arial"/>
+          <w:rFonts w:ascii="Arial" w:hAnsi="Arial" w:cs="Arial"/>
           <w:b/>
           <w:color w:val="000000"/>
           <w:sz w:val="20"/>
@@ -1183,7 +841,7 @@
       <w:pPr>
         <w:jc w:val="center"/>
         <w:rPr>
-          <w:rFonts w:ascii="Arial" w:hAnsi="Arial"/>
+          <w:rFonts w:ascii="Arial" w:hAnsi="Arial" w:cs="Arial"/>
           <w:b/>
           <w:color w:val="000000"/>
           <w:sz w:val="20"/>
@@ -1197,16 +855,16 @@
       <w:pPr>
         <w:jc w:val="center"/>
         <w:rPr>
-          <w:rFonts w:ascii="Arial" w:hAnsi="Arial"/>
-          <w:color w:val="000000"/>
-          <w:sz w:val="20"/>
-          <w:szCs w:val="20"/>
-          <w:lang w:bidi="en-US"/>
-        </w:rPr>
-      </w:pPr>
-      <w:r>
-        <w:rPr>
-          <w:rFonts w:ascii="Arial" w:hAnsi="Arial"/>
+          <w:rFonts w:ascii="Arial" w:hAnsi="Arial" w:cs="Arial"/>
+          <w:color w:val="000000"/>
+          <w:sz w:val="20"/>
+          <w:szCs w:val="20"/>
+          <w:lang w:bidi="en-US"/>
+        </w:rPr>
+      </w:pPr>
+      <w:r>
+        <w:rPr>
+          <w:rFonts w:ascii="Arial" w:hAnsi="Arial" w:cs="Arial"/>
           <w:color w:val="000000"/>
           <w:sz w:val="20"/>
           <w:szCs w:val="20"/>
@@ -1258,7 +916,7 @@
     <w:p>
       <w:pPr>
         <w:rPr>
-          <w:rFonts w:ascii="Consolas" w:eastAsia="Calibri" w:hAnsi="Consolas"/>
+          <w:rFonts w:ascii="Arial" w:eastAsia="Calibri" w:hAnsi="Arial" w:cs="Arial"/>
           <w:color w:val="000000"/>
           <w:sz w:val="21"/>
           <w:szCs w:val="21"/>
@@ -1280,17 +938,17 @@
     <w:p>
       <w:pPr>
         <w:rPr>
-          <w:rFonts w:ascii="Arial" w:hAnsi="Arial"/>
-          <w:color w:val="000000"/>
-          <w:sz w:val="20"/>
-          <w:lang w:bidi="en-US"/>
-        </w:rPr>
-      </w:pPr>
-    </w:p>
-    <w:p>
-      <w:pPr>
-        <w:rPr>
-          <w:rFonts w:ascii="Arial" w:hAnsi="Arial"/>
+          <w:rFonts w:ascii="Arial" w:hAnsi="Arial" w:cs="Arial"/>
+          <w:color w:val="000000"/>
+          <w:sz w:val="20"/>
+          <w:lang w:bidi="en-US"/>
+        </w:rPr>
+      </w:pPr>
+    </w:p>
+    <w:p>
+      <w:pPr>
+        <w:rPr>
+          <w:rFonts w:ascii="Arial" w:hAnsi="Arial" w:cs="Arial"/>
           <w:color w:val="000000"/>
           <w:sz w:val="20"/>
           <w:lang w:bidi="en-US"/>

</xml_diff>

<commit_message>
Attempt dynamic internal linking in docx
</commit_message>
<xml_diff>
--- a/app/assets/default_template.docx
+++ b/app/assets/default_template.docx
@@ -81,7 +81,41 @@
           <w:sz w:val="20"/>
           <w:lang w:bidi="en-US"/>
         </w:rPr>
-        <w:t xml:space="preserve">{{report_date.month}} </w:t>
+        <w:t>{{</w:t>
+      </w:r>
+      <w:proofErr w:type="spellStart"/>
+      <w:r>
+        <w:rPr>
+          <w:rFonts w:ascii="Arial" w:hAnsi="Arial" w:cs="Arial"/>
+          <w:b/>
+          <w:color w:val="000000"/>
+          <w:sz w:val="20"/>
+          <w:lang w:bidi="en-US"/>
+        </w:rPr>
+        <w:t>report_</w:t>
+      </w:r>
+      <w:proofErr w:type="gramStart"/>
+      <w:r>
+        <w:rPr>
+          <w:rFonts w:ascii="Arial" w:hAnsi="Arial" w:cs="Arial"/>
+          <w:b/>
+          <w:color w:val="000000"/>
+          <w:sz w:val="20"/>
+          <w:lang w:bidi="en-US"/>
+        </w:rPr>
+        <w:t>date.month</w:t>
+      </w:r>
+      <w:proofErr w:type="spellEnd"/>
+      <w:proofErr w:type="gramEnd"/>
+      <w:r>
+        <w:rPr>
+          <w:rFonts w:ascii="Arial" w:hAnsi="Arial" w:cs="Arial"/>
+          <w:b/>
+          <w:color w:val="000000"/>
+          <w:sz w:val="20"/>
+          <w:lang w:bidi="en-US"/>
+        </w:rPr>
+        <w:t xml:space="preserve">}} </w:t>
       </w:r>
       <w:r>
         <w:rPr>
@@ -101,7 +135,29 @@
           <w:sz w:val="20"/>
           <w:lang w:bidi="en-US"/>
         </w:rPr>
-        <w:t>{report_date.day}}</w:t>
+        <w:t>{</w:t>
+      </w:r>
+      <w:proofErr w:type="spellStart"/>
+      <w:r>
+        <w:rPr>
+          <w:rFonts w:ascii="Arial" w:hAnsi="Arial" w:cs="Arial"/>
+          <w:b/>
+          <w:color w:val="000000"/>
+          <w:sz w:val="20"/>
+          <w:lang w:bidi="en-US"/>
+        </w:rPr>
+        <w:t>report_date.day</w:t>
+      </w:r>
+      <w:proofErr w:type="spellEnd"/>
+      <w:r>
+        <w:rPr>
+          <w:rFonts w:ascii="Arial" w:hAnsi="Arial" w:cs="Arial"/>
+          <w:b/>
+          <w:color w:val="000000"/>
+          <w:sz w:val="20"/>
+          <w:lang w:bidi="en-US"/>
+        </w:rPr>
+        <w:t>}}</w:t>
       </w:r>
       <w:r>
         <w:rPr>
@@ -131,7 +187,41 @@
           <w:sz w:val="20"/>
           <w:lang w:bidi="en-US"/>
         </w:rPr>
-        <w:t>{{report_date.year}}</w:t>
+        <w:t>{{</w:t>
+      </w:r>
+      <w:proofErr w:type="spellStart"/>
+      <w:r>
+        <w:rPr>
+          <w:rFonts w:ascii="Arial" w:hAnsi="Arial" w:cs="Arial"/>
+          <w:b/>
+          <w:color w:val="000000"/>
+          <w:sz w:val="20"/>
+          <w:lang w:bidi="en-US"/>
+        </w:rPr>
+        <w:t>report_</w:t>
+      </w:r>
+      <w:proofErr w:type="gramStart"/>
+      <w:r>
+        <w:rPr>
+          <w:rFonts w:ascii="Arial" w:hAnsi="Arial" w:cs="Arial"/>
+          <w:b/>
+          <w:color w:val="000000"/>
+          <w:sz w:val="20"/>
+          <w:lang w:bidi="en-US"/>
+        </w:rPr>
+        <w:t>date.year</w:t>
+      </w:r>
+      <w:proofErr w:type="spellEnd"/>
+      <w:proofErr w:type="gramEnd"/>
+      <w:r>
+        <w:rPr>
+          <w:rFonts w:ascii="Arial" w:hAnsi="Arial" w:cs="Arial"/>
+          <w:b/>
+          <w:color w:val="000000"/>
+          <w:sz w:val="20"/>
+          <w:lang w:bidi="en-US"/>
+        </w:rPr>
+        <w:t>}}</w:t>
       </w:r>
     </w:p>
     <w:p>
@@ -193,6 +283,138 @@
     </w:p>
     <w:p>
       <w:pPr>
+        <w:rPr>
+          <w:rFonts w:ascii="Arial" w:hAnsi="Arial" w:cs="Arial"/>
+          <w:bCs/>
+          <w:color w:val="000000"/>
+          <w:sz w:val="20"/>
+          <w:szCs w:val="20"/>
+          <w:lang w:bidi="en-US"/>
+        </w:rPr>
+      </w:pPr>
+      <w:r>
+        <w:rPr>
+          <w:rFonts w:ascii="Arial" w:hAnsi="Arial" w:cs="Arial"/>
+          <w:bCs/>
+          <w:color w:val="000000"/>
+          <w:sz w:val="20"/>
+          <w:szCs w:val="20"/>
+          <w:lang w:bidi="en-US"/>
+        </w:rPr>
+        <w:t>&lt;</w:t>
+      </w:r>
+      <w:proofErr w:type="spellStart"/>
+      <w:proofErr w:type="gramStart"/>
+      <w:r>
+        <w:rPr>
+          <w:rFonts w:ascii="Arial" w:hAnsi="Arial" w:cs="Arial"/>
+          <w:bCs/>
+          <w:color w:val="000000"/>
+          <w:sz w:val="20"/>
+          <w:szCs w:val="20"/>
+          <w:lang w:bidi="en-US"/>
+        </w:rPr>
+        <w:t>w:bookmarkStart</w:t>
+      </w:r>
+      <w:proofErr w:type="spellEnd"/>
+      <w:proofErr w:type="gramEnd"/>
+      <w:r>
+        <w:rPr>
+          <w:rFonts w:ascii="Arial" w:hAnsi="Arial" w:cs="Arial"/>
+          <w:bCs/>
+          <w:color w:val="000000"/>
+          <w:sz w:val="20"/>
+          <w:szCs w:val="20"/>
+          <w:lang w:bidi="en-US"/>
+        </w:rPr>
+        <w:t xml:space="preserve"> </w:t>
+      </w:r>
+      <w:proofErr w:type="spellStart"/>
+      <w:r>
+        <w:rPr>
+          <w:rFonts w:ascii="Arial" w:hAnsi="Arial" w:cs="Arial"/>
+          <w:bCs/>
+          <w:color w:val="000000"/>
+          <w:sz w:val="20"/>
+          <w:szCs w:val="20"/>
+          <w:lang w:bidi="en-US"/>
+        </w:rPr>
+        <w:t>w:name</w:t>
+      </w:r>
+      <w:proofErr w:type="spellEnd"/>
+      <w:r>
+        <w:rPr>
+          <w:rFonts w:ascii="Arial" w:hAnsi="Arial" w:cs="Arial"/>
+          <w:bCs/>
+          <w:color w:val="000000"/>
+          <w:sz w:val="20"/>
+          <w:szCs w:val="20"/>
+          <w:lang w:bidi="en-US"/>
+        </w:rPr>
+        <w:t>="</w:t>
+      </w:r>
+      <w:r>
+        <w:rPr>
+          <w:rFonts w:ascii="Arial" w:hAnsi="Arial" w:cs="Arial"/>
+          <w:bCs/>
+          <w:color w:val="000000"/>
+          <w:sz w:val="20"/>
+          <w:szCs w:val="20"/>
+          <w:lang w:bidi="en-US"/>
+        </w:rPr>
+        <w:t>summaries</w:t>
+      </w:r>
+      <w:proofErr w:type="gramStart"/>
+      <w:r>
+        <w:rPr>
+          <w:rFonts w:ascii="Arial" w:hAnsi="Arial" w:cs="Arial"/>
+          <w:bCs/>
+          <w:color w:val="000000"/>
+          <w:sz w:val="20"/>
+          <w:szCs w:val="20"/>
+          <w:lang w:bidi="en-US"/>
+        </w:rPr>
+        <w:t>_{{ loop</w:t>
+      </w:r>
+      <w:proofErr w:type="gramEnd"/>
+      <w:r>
+        <w:rPr>
+          <w:rFonts w:ascii="Arial" w:hAnsi="Arial" w:cs="Arial"/>
+          <w:bCs/>
+          <w:color w:val="000000"/>
+          <w:sz w:val="20"/>
+          <w:szCs w:val="20"/>
+          <w:lang w:bidi="en-US"/>
+        </w:rPr>
+        <w:t>.index</w:t>
+      </w:r>
+      <w:proofErr w:type="gramStart"/>
+      <w:r>
+        <w:rPr>
+          <w:rFonts w:ascii="Arial" w:hAnsi="Arial" w:cs="Arial"/>
+          <w:bCs/>
+          <w:color w:val="000000"/>
+          <w:sz w:val="20"/>
+          <w:szCs w:val="20"/>
+          <w:lang w:bidi="en-US"/>
+        </w:rPr>
+        <w:t>0 }}"</w:t>
+      </w:r>
+      <w:proofErr w:type="gramEnd"/>
+      <w:r>
+        <w:rPr>
+          <w:rFonts w:ascii="Arial" w:hAnsi="Arial" w:cs="Arial"/>
+          <w:bCs/>
+          <w:color w:val="000000"/>
+          <w:sz w:val="20"/>
+          <w:szCs w:val="20"/>
+          <w:lang w:bidi="en-US"/>
+        </w:rPr>
+        <w:t>/&gt;</w:t>
+      </w:r>
+    </w:p>
+    <w:p>
+      <w:pPr>
         <w:pStyle w:val="Heading1"/>
         <w:rPr>
           <w:rFonts w:ascii="Arial" w:hAnsi="Arial" w:cs="Arial"/>
@@ -243,23 +465,80 @@
       <w:pPr>
         <w:rPr>
           <w:rFonts w:ascii="Arial" w:hAnsi="Arial" w:cs="Arial"/>
-          <w:lang w:bidi="en-US"/>
-        </w:rPr>
-      </w:pPr>
-    </w:p>
-    <w:p>
-      <w:pPr>
-        <w:rPr>
-          <w:rFonts w:ascii="Arial" w:hAnsi="Arial" w:cs="Arial"/>
-          <w:lang w:bidi="en-US"/>
-        </w:rPr>
-      </w:pPr>
-      <w:r>
-        <w:rPr>
-          <w:rFonts w:ascii="Arial" w:hAnsi="Arial" w:cs="Arial"/>
-          <w:lang w:bidi="en-US"/>
-        </w:rPr>
-        <w:t>{% for article in section.articles %}</w:t>
+          <w:sz w:val="20"/>
+          <w:szCs w:val="20"/>
+        </w:rPr>
+      </w:pPr>
+      <w:r>
+        <w:rPr>
+          <w:rFonts w:ascii="Arial" w:hAnsi="Arial" w:cs="Arial"/>
+          <w:sz w:val="20"/>
+          <w:szCs w:val="20"/>
+        </w:rPr>
+        <w:t>&lt;</w:t>
+      </w:r>
+      <w:proofErr w:type="spellStart"/>
+      <w:proofErr w:type="gramStart"/>
+      <w:r>
+        <w:rPr>
+          <w:rFonts w:ascii="Arial" w:hAnsi="Arial" w:cs="Arial"/>
+          <w:sz w:val="20"/>
+          <w:szCs w:val="20"/>
+        </w:rPr>
+        <w:t>w:bookmarkEnd</w:t>
+      </w:r>
+      <w:proofErr w:type="spellEnd"/>
+      <w:proofErr w:type="gramEnd"/>
+      <w:r>
+        <w:rPr>
+          <w:rFonts w:ascii="Arial" w:hAnsi="Arial" w:cs="Arial"/>
+          <w:sz w:val="20"/>
+          <w:szCs w:val="20"/>
+        </w:rPr>
+        <w:t>/&gt;</w:t>
+      </w:r>
+    </w:p>
+    <w:p>
+      <w:pPr>
+        <w:rPr>
+          <w:rFonts w:ascii="Arial" w:hAnsi="Arial" w:cs="Arial"/>
+          <w:sz w:val="20"/>
+          <w:szCs w:val="20"/>
+          <w:lang w:bidi="en-US"/>
+        </w:rPr>
+      </w:pPr>
+    </w:p>
+    <w:p>
+      <w:pPr>
+        <w:rPr>
+          <w:rFonts w:ascii="Arial" w:hAnsi="Arial" w:cs="Arial"/>
+          <w:lang w:bidi="en-US"/>
+        </w:rPr>
+      </w:pPr>
+      <w:r>
+        <w:rPr>
+          <w:rFonts w:ascii="Arial" w:hAnsi="Arial" w:cs="Arial"/>
+          <w:lang w:bidi="en-US"/>
+        </w:rPr>
+        <w:t xml:space="preserve">{% for article in </w:t>
+      </w:r>
+      <w:proofErr w:type="spellStart"/>
+      <w:proofErr w:type="gramStart"/>
+      <w:r>
+        <w:rPr>
+          <w:rFonts w:ascii="Arial" w:hAnsi="Arial" w:cs="Arial"/>
+          <w:lang w:bidi="en-US"/>
+        </w:rPr>
+        <w:t>section.articles</w:t>
+      </w:r>
+      <w:proofErr w:type="spellEnd"/>
+      <w:proofErr w:type="gramEnd"/>
+      <w:r>
+        <w:rPr>
+          <w:rFonts w:ascii="Arial" w:hAnsi="Arial" w:cs="Arial"/>
+          <w:lang w:bidi="en-US"/>
+        </w:rPr>
+        <w:t xml:space="preserve"> %}</w:t>
       </w:r>
     </w:p>
     <w:p>
@@ -292,6 +571,8 @@
         </w:rPr>
         <w:t xml:space="preserve">r </w:t>
       </w:r>
+      <w:proofErr w:type="spellStart"/>
+      <w:proofErr w:type="gramStart"/>
       <w:r>
         <w:rPr>
           <w:rFonts w:ascii="Arial" w:hAnsi="Arial" w:cs="Arial"/>
@@ -300,7 +581,29 @@
           <w:szCs w:val="20"/>
           <w:lang w:bidi="en-US"/>
         </w:rPr>
-        <w:t>article.title_with_link}}</w:t>
+        <w:t>article.title</w:t>
+      </w:r>
+      <w:proofErr w:type="gramEnd"/>
+      <w:r>
+        <w:rPr>
+          <w:rFonts w:ascii="Arial" w:hAnsi="Arial" w:cs="Arial"/>
+          <w:color w:val="000000" w:themeColor="text1"/>
+          <w:sz w:val="20"/>
+          <w:szCs w:val="20"/>
+          <w:lang w:bidi="en-US"/>
+        </w:rPr>
+        <w:t>_with_link</w:t>
+      </w:r>
+      <w:proofErr w:type="spellEnd"/>
+      <w:r>
+        <w:rPr>
+          <w:rFonts w:ascii="Arial" w:hAnsi="Arial" w:cs="Arial"/>
+          <w:color w:val="000000" w:themeColor="text1"/>
+          <w:sz w:val="20"/>
+          <w:szCs w:val="20"/>
+          <w:lang w:bidi="en-US"/>
+        </w:rPr>
+        <w:t>}}</w:t>
       </w:r>
     </w:p>
     <w:p>
@@ -328,46 +631,111 @@
           <w:szCs w:val="20"/>
           <w:lang w:bidi="en-US"/>
         </w:rPr>
-        <w:t>{{article.source}}</w:t>
-      </w:r>
-      <w:r>
-        <w:rPr>
-          <w:rFonts w:ascii="Arial" w:hAnsi="Arial" w:cs="Arial"/>
-          <w:sz w:val="20"/>
-          <w:szCs w:val="20"/>
-          <w:lang w:bidi="en-US"/>
-        </w:rPr>
-        <w:t>) {{article.date}}</w:t>
-      </w:r>
-    </w:p>
-    <w:p>
-      <w:pPr>
-        <w:rPr>
-          <w:rFonts w:ascii="Arial" w:hAnsi="Arial" w:cs="Arial"/>
-          <w:sz w:val="20"/>
-          <w:szCs w:val="20"/>
-          <w:lang w:bidi="en-US"/>
-        </w:rPr>
-      </w:pPr>
-      <w:r>
-        <w:rPr>
-          <w:rFonts w:ascii="Arial" w:hAnsi="Arial" w:cs="Arial"/>
-          <w:sz w:val="20"/>
-          <w:szCs w:val="20"/>
-          <w:lang w:bidi="en-US"/>
-        </w:rPr>
-        <w:t>{{article.summary}}</w:t>
-      </w:r>
-    </w:p>
-    <w:p>
-      <w:pPr>
-        <w:rPr>
-          <w:rFonts w:ascii="Arial" w:hAnsi="Arial" w:cs="Arial"/>
-          <w:lang w:bidi="en-US"/>
-        </w:rPr>
-      </w:pPr>
-    </w:p>
-    <w:bookmarkStart w:id="8" w:name="_Hlk190227748"/>
+        <w:t>{{</w:t>
+      </w:r>
+      <w:proofErr w:type="spellStart"/>
+      <w:proofErr w:type="gramStart"/>
+      <w:r>
+        <w:rPr>
+          <w:rFonts w:ascii="Arial" w:hAnsi="Arial" w:cs="Arial"/>
+          <w:sz w:val="20"/>
+          <w:szCs w:val="20"/>
+          <w:lang w:bidi="en-US"/>
+        </w:rPr>
+        <w:t>article.source</w:t>
+      </w:r>
+      <w:proofErr w:type="spellEnd"/>
+      <w:proofErr w:type="gramEnd"/>
+      <w:r>
+        <w:rPr>
+          <w:rFonts w:ascii="Arial" w:hAnsi="Arial" w:cs="Arial"/>
+          <w:sz w:val="20"/>
+          <w:szCs w:val="20"/>
+          <w:lang w:bidi="en-US"/>
+        </w:rPr>
+        <w:t>}}</w:t>
+      </w:r>
+      <w:r>
+        <w:rPr>
+          <w:rFonts w:ascii="Arial" w:hAnsi="Arial" w:cs="Arial"/>
+          <w:sz w:val="20"/>
+          <w:szCs w:val="20"/>
+          <w:lang w:bidi="en-US"/>
+        </w:rPr>
+        <w:t>) {{</w:t>
+      </w:r>
+      <w:proofErr w:type="spellStart"/>
+      <w:proofErr w:type="gramStart"/>
+      <w:r>
+        <w:rPr>
+          <w:rFonts w:ascii="Arial" w:hAnsi="Arial" w:cs="Arial"/>
+          <w:sz w:val="20"/>
+          <w:szCs w:val="20"/>
+          <w:lang w:bidi="en-US"/>
+        </w:rPr>
+        <w:t>article.date</w:t>
+      </w:r>
+      <w:proofErr w:type="spellEnd"/>
+      <w:proofErr w:type="gramEnd"/>
+      <w:r>
+        <w:rPr>
+          <w:rFonts w:ascii="Arial" w:hAnsi="Arial" w:cs="Arial"/>
+          <w:sz w:val="20"/>
+          <w:szCs w:val="20"/>
+          <w:lang w:bidi="en-US"/>
+        </w:rPr>
+        <w:t>}}</w:t>
+      </w:r>
+    </w:p>
+    <w:p>
+      <w:pPr>
+        <w:rPr>
+          <w:rFonts w:ascii="Arial" w:hAnsi="Arial" w:cs="Arial"/>
+          <w:sz w:val="20"/>
+          <w:szCs w:val="20"/>
+          <w:lang w:bidi="en-US"/>
+        </w:rPr>
+      </w:pPr>
+      <w:r>
+        <w:rPr>
+          <w:rFonts w:ascii="Arial" w:hAnsi="Arial" w:cs="Arial"/>
+          <w:sz w:val="20"/>
+          <w:szCs w:val="20"/>
+          <w:lang w:bidi="en-US"/>
+        </w:rPr>
+        <w:t>{{</w:t>
+      </w:r>
+      <w:proofErr w:type="spellStart"/>
+      <w:proofErr w:type="gramStart"/>
+      <w:r>
+        <w:rPr>
+          <w:rFonts w:ascii="Arial" w:hAnsi="Arial" w:cs="Arial"/>
+          <w:sz w:val="20"/>
+          <w:szCs w:val="20"/>
+          <w:lang w:bidi="en-US"/>
+        </w:rPr>
+        <w:t>article.summary</w:t>
+      </w:r>
+      <w:proofErr w:type="spellEnd"/>
+      <w:proofErr w:type="gramEnd"/>
+      <w:r>
+        <w:rPr>
+          <w:rFonts w:ascii="Arial" w:hAnsi="Arial" w:cs="Arial"/>
+          <w:sz w:val="20"/>
+          <w:szCs w:val="20"/>
+          <w:lang w:bidi="en-US"/>
+        </w:rPr>
+        <w:t>}}</w:t>
+      </w:r>
+    </w:p>
+    <w:p>
+      <w:pPr>
+        <w:rPr>
+          <w:rFonts w:ascii="Arial" w:hAnsi="Arial" w:cs="Arial"/>
+          <w:lang w:bidi="en-US"/>
+        </w:rPr>
+      </w:pPr>
+    </w:p>
     <w:p>
       <w:pPr>
         <w:rPr>
@@ -376,47 +744,186 @@
           <w:szCs w:val="18"/>
         </w:rPr>
       </w:pPr>
-      <w:r>
-        <w:fldChar w:fldCharType="begin"/>
-      </w:r>
-      <w:r>
-        <w:instrText>HYPERLINK  \l "_FULL_ARTICLES"</w:instrText>
-      </w:r>
-      <w:r>
-        <w:fldChar w:fldCharType="separate"/>
-      </w:r>
-      <w:r>
-        <w:rPr>
-          <w:rStyle w:val="Hyperlink"/>
-          <w:rFonts w:ascii="Arial" w:hAnsi="Arial" w:cs="Arial"/>
-          <w:b/>
+      <w:bookmarkStart w:id="8" w:name="_Hlk190227748"/>
+      <w:proofErr w:type="gramStart"/>
+      <w:r>
+        <w:rPr>
+          <w:rFonts w:ascii="Arial" w:hAnsi="Arial" w:cs="Arial"/>
+          <w:b/>
+          <w:bCs/>
+          <w:color w:val="3D0DFF"/>
           <w:sz w:val="18"/>
           <w:szCs w:val="18"/>
-          <w:lang w:bidi="en-US"/>
-        </w:rPr>
-        <w:t>Full Articles</w:t>
-      </w:r>
-      <w:r>
-        <w:rPr>
-          <w:rStyle w:val="Hyperlink"/>
-          <w:rFonts w:ascii="Arial" w:hAnsi="Arial" w:cs="Arial"/>
-          <w:b/>
+          <w:u w:val="single"/>
+        </w:rPr>
+        <w:t>{{</w:t>
+      </w:r>
+      <w:r>
+        <w:rPr>
+          <w:rFonts w:ascii="Arial" w:hAnsi="Arial" w:cs="Arial"/>
+          <w:b/>
+          <w:bCs/>
+          <w:color w:val="3D0DFF"/>
           <w:sz w:val="18"/>
           <w:szCs w:val="18"/>
-          <w:lang w:bidi="en-US"/>
-        </w:rPr>
-        <w:fldChar w:fldCharType="end"/>
-      </w:r>
-      <w:r>
-        <w:rPr>
-          <w:rFonts w:ascii="Arial" w:hAnsi="Arial" w:cs="Arial"/>
-          <w:b/>
-          <w:color w:val="000000"/>
+          <w:u w:val="single"/>
+        </w:rPr>
+        <w:t xml:space="preserve"> </w:t>
+      </w:r>
+      <w:proofErr w:type="spellStart"/>
+      <w:r>
+        <w:rPr>
+          <w:rFonts w:ascii="Arial" w:hAnsi="Arial" w:cs="Arial"/>
+          <w:b/>
+          <w:bCs/>
+          <w:color w:val="3D0DFF"/>
           <w:sz w:val="18"/>
           <w:szCs w:val="18"/>
-          <w:lang w:bidi="en-US"/>
-        </w:rPr>
-        <w:t xml:space="preserve"> </w:t>
+          <w:u w:val="single"/>
+        </w:rPr>
+        <w:t>make</w:t>
+      </w:r>
+      <w:proofErr w:type="gramEnd"/>
+      <w:r>
+        <w:rPr>
+          <w:rFonts w:ascii="Arial" w:hAnsi="Arial" w:cs="Arial"/>
+          <w:b/>
+          <w:bCs/>
+          <w:color w:val="3D0DFF"/>
+          <w:sz w:val="18"/>
+          <w:szCs w:val="18"/>
+          <w:u w:val="single"/>
+        </w:rPr>
+        <w:t>_</w:t>
+      </w:r>
+      <w:proofErr w:type="gramStart"/>
+      <w:r>
+        <w:rPr>
+          <w:rFonts w:ascii="Arial" w:hAnsi="Arial" w:cs="Arial"/>
+          <w:b/>
+          <w:bCs/>
+          <w:color w:val="3D0DFF"/>
+          <w:sz w:val="18"/>
+          <w:szCs w:val="18"/>
+          <w:u w:val="single"/>
+        </w:rPr>
+        <w:t>link</w:t>
+      </w:r>
+      <w:proofErr w:type="spellEnd"/>
+      <w:r>
+        <w:rPr>
+          <w:rFonts w:ascii="Arial" w:hAnsi="Arial" w:cs="Arial"/>
+          <w:b/>
+          <w:bCs/>
+          <w:color w:val="3D0DFF"/>
+          <w:sz w:val="18"/>
+          <w:szCs w:val="18"/>
+          <w:u w:val="single"/>
+        </w:rPr>
+        <w:t>(</w:t>
+      </w:r>
+      <w:proofErr w:type="gramEnd"/>
+      <w:r>
+        <w:rPr>
+          <w:rFonts w:ascii="Arial" w:hAnsi="Arial" w:cs="Arial"/>
+          <w:b/>
+          <w:bCs/>
+          <w:color w:val="3D0DFF"/>
+          <w:sz w:val="18"/>
+          <w:szCs w:val="18"/>
+          <w:u w:val="single"/>
+        </w:rPr>
+        <w:t>“Full Text”, “</w:t>
+      </w:r>
+      <w:proofErr w:type="spellStart"/>
+      <w:r>
+        <w:rPr>
+          <w:rFonts w:ascii="Arial" w:hAnsi="Arial" w:cs="Arial"/>
+          <w:b/>
+          <w:bCs/>
+          <w:color w:val="3D0DFF"/>
+          <w:sz w:val="18"/>
+          <w:szCs w:val="18"/>
+          <w:u w:val="single"/>
+        </w:rPr>
+        <w:t>fulltext</w:t>
+      </w:r>
+      <w:proofErr w:type="spellEnd"/>
+      <w:r>
+        <w:rPr>
+          <w:rFonts w:ascii="Arial" w:hAnsi="Arial" w:cs="Arial"/>
+          <w:b/>
+          <w:bCs/>
+          <w:color w:val="3D0DFF"/>
+          <w:sz w:val="18"/>
+          <w:szCs w:val="18"/>
+          <w:u w:val="single"/>
+        </w:rPr>
+        <w:t xml:space="preserve">_” ~ </w:t>
+      </w:r>
+      <w:proofErr w:type="gramStart"/>
+      <w:r>
+        <w:rPr>
+          <w:rFonts w:ascii="Arial" w:hAnsi="Arial" w:cs="Arial"/>
+          <w:b/>
+          <w:bCs/>
+          <w:color w:val="3D0DFF"/>
+          <w:sz w:val="18"/>
+          <w:szCs w:val="18"/>
+          <w:u w:val="single"/>
+        </w:rPr>
+        <w:t>loop.index</w:t>
+      </w:r>
+      <w:proofErr w:type="gramEnd"/>
+      <w:r>
+        <w:rPr>
+          <w:rFonts w:ascii="Arial" w:hAnsi="Arial" w:cs="Arial"/>
+          <w:b/>
+          <w:bCs/>
+          <w:color w:val="3D0DFF"/>
+          <w:sz w:val="18"/>
+          <w:szCs w:val="18"/>
+          <w:u w:val="single"/>
+        </w:rPr>
+        <w:t>0</w:t>
+      </w:r>
+      <w:proofErr w:type="gramStart"/>
+      <w:r>
+        <w:rPr>
+          <w:rFonts w:ascii="Arial" w:hAnsi="Arial" w:cs="Arial"/>
+          <w:b/>
+          <w:bCs/>
+          <w:color w:val="3D0DFF"/>
+          <w:sz w:val="18"/>
+          <w:szCs w:val="18"/>
+          <w:u w:val="single"/>
+        </w:rPr>
+        <w:t xml:space="preserve">) </w:t>
+      </w:r>
+      <w:r>
+        <w:rPr>
+          <w:rFonts w:ascii="Arial" w:hAnsi="Arial" w:cs="Arial"/>
+          <w:b/>
+          <w:bCs/>
+          <w:color w:val="3D0DFF"/>
+          <w:sz w:val="18"/>
+          <w:szCs w:val="18"/>
+          <w:u w:val="single"/>
+        </w:rPr>
+        <w:t>}</w:t>
+      </w:r>
+      <w:proofErr w:type="gramEnd"/>
+      <w:r>
+        <w:rPr>
+          <w:rFonts w:ascii="Arial" w:hAnsi="Arial" w:cs="Arial"/>
+          <w:b/>
+          <w:bCs/>
+          <w:color w:val="3D0DFF"/>
+          <w:sz w:val="18"/>
+          <w:szCs w:val="18"/>
+          <w:u w:val="single"/>
+        </w:rPr>
+        <w:t xml:space="preserve">} </w:t>
       </w:r>
       <w:hyperlink w:anchor="_top" w:history="1">
         <w:r>
@@ -456,7 +963,23 @@
           <w:rFonts w:ascii="Arial" w:hAnsi="Arial" w:cs="Arial"/>
           <w:lang w:bidi="en-US"/>
         </w:rPr>
-        <w:t>{% endfor %}</w:t>
+        <w:t xml:space="preserve">{% </w:t>
+      </w:r>
+      <w:proofErr w:type="spellStart"/>
+      <w:r>
+        <w:rPr>
+          <w:rFonts w:ascii="Arial" w:hAnsi="Arial" w:cs="Arial"/>
+          <w:lang w:bidi="en-US"/>
+        </w:rPr>
+        <w:t>endfor</w:t>
+      </w:r>
+      <w:proofErr w:type="spellEnd"/>
+      <w:r>
+        <w:rPr>
+          <w:rFonts w:ascii="Arial" w:hAnsi="Arial" w:cs="Arial"/>
+          <w:lang w:bidi="en-US"/>
+        </w:rPr>
+        <w:t xml:space="preserve"> %}</w:t>
       </w:r>
     </w:p>
     <w:p>
@@ -482,7 +1005,31 @@
           <w:szCs w:val="20"/>
           <w:lang w:bidi="en-US"/>
         </w:rPr>
-        <w:t>{% endfor %}</w:t>
+        <w:t xml:space="preserve">{% </w:t>
+      </w:r>
+      <w:proofErr w:type="spellStart"/>
+      <w:r>
+        <w:rPr>
+          <w:rFonts w:ascii="Arial" w:hAnsi="Arial" w:cs="Arial"/>
+          <w:bCs/>
+          <w:color w:val="000000"/>
+          <w:sz w:val="20"/>
+          <w:szCs w:val="20"/>
+          <w:lang w:bidi="en-US"/>
+        </w:rPr>
+        <w:t>endfor</w:t>
+      </w:r>
+      <w:proofErr w:type="spellEnd"/>
+      <w:r>
+        <w:rPr>
+          <w:rFonts w:ascii="Arial" w:hAnsi="Arial" w:cs="Arial"/>
+          <w:bCs/>
+          <w:color w:val="000000"/>
+          <w:sz w:val="20"/>
+          <w:szCs w:val="20"/>
+          <w:lang w:bidi="en-US"/>
+        </w:rPr>
+        <w:t xml:space="preserve"> %}</w:t>
       </w:r>
     </w:p>
     <w:p>
@@ -583,6 +1130,140 @@
     </w:p>
     <w:p>
       <w:pPr>
+        <w:rPr>
+          <w:rFonts w:ascii="Arial" w:hAnsi="Arial" w:cs="Arial"/>
+          <w:bCs/>
+          <w:color w:val="000000"/>
+          <w:sz w:val="20"/>
+          <w:szCs w:val="20"/>
+          <w:lang w:bidi="en-US"/>
+        </w:rPr>
+      </w:pPr>
+      <w:r>
+        <w:rPr>
+          <w:rFonts w:ascii="Arial" w:hAnsi="Arial" w:cs="Arial"/>
+          <w:bCs/>
+          <w:color w:val="000000"/>
+          <w:sz w:val="20"/>
+          <w:szCs w:val="20"/>
+          <w:lang w:bidi="en-US"/>
+        </w:rPr>
+        <w:t>&lt;</w:t>
+      </w:r>
+      <w:proofErr w:type="spellStart"/>
+      <w:proofErr w:type="gramStart"/>
+      <w:r>
+        <w:rPr>
+          <w:rFonts w:ascii="Arial" w:hAnsi="Arial" w:cs="Arial"/>
+          <w:bCs/>
+          <w:color w:val="000000"/>
+          <w:sz w:val="20"/>
+          <w:szCs w:val="20"/>
+          <w:lang w:bidi="en-US"/>
+        </w:rPr>
+        <w:t>w:bookmarkStart</w:t>
+      </w:r>
+      <w:proofErr w:type="spellEnd"/>
+      <w:proofErr w:type="gramEnd"/>
+      <w:r>
+        <w:rPr>
+          <w:rFonts w:ascii="Arial" w:hAnsi="Arial" w:cs="Arial"/>
+          <w:bCs/>
+          <w:color w:val="000000"/>
+          <w:sz w:val="20"/>
+          <w:szCs w:val="20"/>
+          <w:lang w:bidi="en-US"/>
+        </w:rPr>
+        <w:t xml:space="preserve"> </w:t>
+      </w:r>
+      <w:proofErr w:type="spellStart"/>
+      <w:r>
+        <w:rPr>
+          <w:rFonts w:ascii="Arial" w:hAnsi="Arial" w:cs="Arial"/>
+          <w:bCs/>
+          <w:color w:val="000000"/>
+          <w:sz w:val="20"/>
+          <w:szCs w:val="20"/>
+          <w:lang w:bidi="en-US"/>
+        </w:rPr>
+        <w:t>w:name</w:t>
+      </w:r>
+      <w:proofErr w:type="spellEnd"/>
+      <w:r>
+        <w:rPr>
+          <w:rFonts w:ascii="Arial" w:hAnsi="Arial" w:cs="Arial"/>
+          <w:bCs/>
+          <w:color w:val="000000"/>
+          <w:sz w:val="20"/>
+          <w:szCs w:val="20"/>
+          <w:lang w:bidi="en-US"/>
+        </w:rPr>
+        <w:t>="</w:t>
+      </w:r>
+      <w:proofErr w:type="spellStart"/>
+      <w:r>
+        <w:rPr>
+          <w:rFonts w:ascii="Arial" w:hAnsi="Arial" w:cs="Arial"/>
+          <w:bCs/>
+          <w:color w:val="000000"/>
+          <w:sz w:val="20"/>
+          <w:szCs w:val="20"/>
+          <w:lang w:bidi="en-US"/>
+        </w:rPr>
+        <w:t>fulltext</w:t>
+      </w:r>
+      <w:proofErr w:type="spellEnd"/>
+      <w:proofErr w:type="gramStart"/>
+      <w:r>
+        <w:rPr>
+          <w:rFonts w:ascii="Arial" w:hAnsi="Arial" w:cs="Arial"/>
+          <w:bCs/>
+          <w:color w:val="000000"/>
+          <w:sz w:val="20"/>
+          <w:szCs w:val="20"/>
+          <w:lang w:bidi="en-US"/>
+        </w:rPr>
+        <w:t>_{{ loop</w:t>
+      </w:r>
+      <w:proofErr w:type="gramEnd"/>
+      <w:r>
+        <w:rPr>
+          <w:rFonts w:ascii="Arial" w:hAnsi="Arial" w:cs="Arial"/>
+          <w:bCs/>
+          <w:color w:val="000000"/>
+          <w:sz w:val="20"/>
+          <w:szCs w:val="20"/>
+          <w:lang w:bidi="en-US"/>
+        </w:rPr>
+        <w:t>.index</w:t>
+      </w:r>
+      <w:proofErr w:type="gramStart"/>
+      <w:r>
+        <w:rPr>
+          <w:rFonts w:ascii="Arial" w:hAnsi="Arial" w:cs="Arial"/>
+          <w:bCs/>
+          <w:color w:val="000000"/>
+          <w:sz w:val="20"/>
+          <w:szCs w:val="20"/>
+          <w:lang w:bidi="en-US"/>
+        </w:rPr>
+        <w:t>0 }}"</w:t>
+      </w:r>
+      <w:proofErr w:type="gramEnd"/>
+      <w:r>
+        <w:rPr>
+          <w:rFonts w:ascii="Arial" w:hAnsi="Arial" w:cs="Arial"/>
+          <w:bCs/>
+          <w:color w:val="000000"/>
+          <w:sz w:val="20"/>
+          <w:szCs w:val="20"/>
+          <w:lang w:bidi="en-US"/>
+        </w:rPr>
+        <w:t>/&gt;</w:t>
+      </w:r>
+    </w:p>
+    <w:p>
+      <w:pPr>
         <w:pStyle w:val="Heading1"/>
         <w:rPr>
           <w:rFonts w:ascii="Arial" w:hAnsi="Arial" w:cs="Arial"/>
@@ -627,6 +1308,43 @@
       <w:pPr>
         <w:rPr>
           <w:rFonts w:ascii="Arial" w:hAnsi="Arial" w:cs="Arial"/>
+          <w:sz w:val="20"/>
+          <w:szCs w:val="20"/>
+        </w:rPr>
+      </w:pPr>
+      <w:r>
+        <w:rPr>
+          <w:rFonts w:ascii="Arial" w:hAnsi="Arial" w:cs="Arial"/>
+          <w:sz w:val="20"/>
+          <w:szCs w:val="20"/>
+        </w:rPr>
+        <w:t>&lt;</w:t>
+      </w:r>
+      <w:proofErr w:type="spellStart"/>
+      <w:proofErr w:type="gramStart"/>
+      <w:r>
+        <w:rPr>
+          <w:rFonts w:ascii="Arial" w:hAnsi="Arial" w:cs="Arial"/>
+          <w:sz w:val="20"/>
+          <w:szCs w:val="20"/>
+        </w:rPr>
+        <w:t>w:bookmarkEnd</w:t>
+      </w:r>
+      <w:proofErr w:type="spellEnd"/>
+      <w:proofErr w:type="gramEnd"/>
+      <w:r>
+        <w:rPr>
+          <w:rFonts w:ascii="Arial" w:hAnsi="Arial" w:cs="Arial"/>
+          <w:sz w:val="20"/>
+          <w:szCs w:val="20"/>
+        </w:rPr>
+        <w:t>/&gt;</w:t>
+      </w:r>
+    </w:p>
+    <w:p>
+      <w:pPr>
+        <w:rPr>
+          <w:rFonts w:ascii="Arial" w:hAnsi="Arial" w:cs="Arial"/>
           <w:b/>
           <w:color w:val="000000"/>
           <w:sz w:val="20"/>
@@ -648,7 +1366,25 @@
           <w:rFonts w:ascii="Arial" w:hAnsi="Arial" w:cs="Arial"/>
           <w:lang w:bidi="en-US"/>
         </w:rPr>
-        <w:t>{% for article in section.articles %}</w:t>
+        <w:t xml:space="preserve">{% for article in </w:t>
+      </w:r>
+      <w:proofErr w:type="spellStart"/>
+      <w:proofErr w:type="gramStart"/>
+      <w:r>
+        <w:rPr>
+          <w:rFonts w:ascii="Arial" w:hAnsi="Arial" w:cs="Arial"/>
+          <w:lang w:bidi="en-US"/>
+        </w:rPr>
+        <w:t>section.articles</w:t>
+      </w:r>
+      <w:proofErr w:type="spellEnd"/>
+      <w:proofErr w:type="gramEnd"/>
+      <w:r>
+        <w:rPr>
+          <w:rFonts w:ascii="Arial" w:hAnsi="Arial" w:cs="Arial"/>
+          <w:lang w:bidi="en-US"/>
+        </w:rPr>
+        <w:t xml:space="preserve"> %}</w:t>
       </w:r>
     </w:p>
     <w:p>
@@ -681,6 +1417,8 @@
         </w:rPr>
         <w:t xml:space="preserve">r </w:t>
       </w:r>
+      <w:proofErr w:type="spellStart"/>
+      <w:proofErr w:type="gramStart"/>
       <w:r>
         <w:rPr>
           <w:rFonts w:ascii="Arial" w:hAnsi="Arial" w:cs="Arial"/>
@@ -689,7 +1427,29 @@
           <w:szCs w:val="20"/>
           <w:lang w:bidi="en-US"/>
         </w:rPr>
-        <w:t>article.title_with_link}}</w:t>
+        <w:t>article.title</w:t>
+      </w:r>
+      <w:proofErr w:type="gramEnd"/>
+      <w:r>
+        <w:rPr>
+          <w:rFonts w:ascii="Arial" w:hAnsi="Arial" w:cs="Arial"/>
+          <w:color w:val="000000" w:themeColor="text1"/>
+          <w:sz w:val="20"/>
+          <w:szCs w:val="20"/>
+          <w:lang w:bidi="en-US"/>
+        </w:rPr>
+        <w:t>_with_link</w:t>
+      </w:r>
+      <w:proofErr w:type="spellEnd"/>
+      <w:r>
+        <w:rPr>
+          <w:rFonts w:ascii="Arial" w:hAnsi="Arial" w:cs="Arial"/>
+          <w:color w:val="000000" w:themeColor="text1"/>
+          <w:sz w:val="20"/>
+          <w:szCs w:val="20"/>
+          <w:lang w:bidi="en-US"/>
+        </w:rPr>
+        <w:t>}}</w:t>
       </w:r>
     </w:p>
     <w:p>
@@ -718,35 +1478,110 @@
           <w:szCs w:val="20"/>
           <w:lang w:bidi="en-US"/>
         </w:rPr>
-        <w:t>{{article.source}})</w:t>
-      </w:r>
-      <w:r>
-        <w:rPr>
-          <w:rFonts w:ascii="Arial" w:hAnsi="Arial" w:cs="Arial"/>
-          <w:sz w:val="20"/>
-          <w:szCs w:val="20"/>
-          <w:lang w:bidi="en-US"/>
-        </w:rPr>
-        <w:t xml:space="preserve"> {{article.date}}</w:t>
-      </w:r>
-    </w:p>
-    <w:p>
-      <w:pPr>
-        <w:rPr>
-          <w:rFonts w:ascii="Arial" w:hAnsi="Arial" w:cs="Arial"/>
-          <w:sz w:val="20"/>
-          <w:szCs w:val="20"/>
-          <w:lang w:bidi="en-US"/>
-        </w:rPr>
-      </w:pPr>
-      <w:r>
-        <w:rPr>
-          <w:rFonts w:ascii="Arial" w:hAnsi="Arial" w:cs="Arial"/>
-          <w:sz w:val="20"/>
-          <w:szCs w:val="20"/>
-          <w:lang w:bidi="en-US"/>
-        </w:rPr>
-        <w:t>{{article.full_text}}</w:t>
+        <w:t>{{</w:t>
+      </w:r>
+      <w:proofErr w:type="spellStart"/>
+      <w:proofErr w:type="gramStart"/>
+      <w:r>
+        <w:rPr>
+          <w:rFonts w:ascii="Arial" w:hAnsi="Arial" w:cs="Arial"/>
+          <w:sz w:val="20"/>
+          <w:szCs w:val="20"/>
+          <w:lang w:bidi="en-US"/>
+        </w:rPr>
+        <w:t>article.source</w:t>
+      </w:r>
+      <w:proofErr w:type="spellEnd"/>
+      <w:proofErr w:type="gramEnd"/>
+      <w:r>
+        <w:rPr>
+          <w:rFonts w:ascii="Arial" w:hAnsi="Arial" w:cs="Arial"/>
+          <w:sz w:val="20"/>
+          <w:szCs w:val="20"/>
+          <w:lang w:bidi="en-US"/>
+        </w:rPr>
+        <w:t>}})</w:t>
+      </w:r>
+      <w:r>
+        <w:rPr>
+          <w:rFonts w:ascii="Arial" w:hAnsi="Arial" w:cs="Arial"/>
+          <w:sz w:val="20"/>
+          <w:szCs w:val="20"/>
+          <w:lang w:bidi="en-US"/>
+        </w:rPr>
+        <w:t xml:space="preserve"> {{</w:t>
+      </w:r>
+      <w:proofErr w:type="spellStart"/>
+      <w:proofErr w:type="gramStart"/>
+      <w:r>
+        <w:rPr>
+          <w:rFonts w:ascii="Arial" w:hAnsi="Arial" w:cs="Arial"/>
+          <w:sz w:val="20"/>
+          <w:szCs w:val="20"/>
+          <w:lang w:bidi="en-US"/>
+        </w:rPr>
+        <w:t>article.date</w:t>
+      </w:r>
+      <w:proofErr w:type="spellEnd"/>
+      <w:proofErr w:type="gramEnd"/>
+      <w:r>
+        <w:rPr>
+          <w:rFonts w:ascii="Arial" w:hAnsi="Arial" w:cs="Arial"/>
+          <w:sz w:val="20"/>
+          <w:szCs w:val="20"/>
+          <w:lang w:bidi="en-US"/>
+        </w:rPr>
+        <w:t>}}</w:t>
+      </w:r>
+    </w:p>
+    <w:p>
+      <w:pPr>
+        <w:rPr>
+          <w:rFonts w:ascii="Arial" w:hAnsi="Arial" w:cs="Arial"/>
+          <w:sz w:val="20"/>
+          <w:szCs w:val="20"/>
+          <w:lang w:bidi="en-US"/>
+        </w:rPr>
+      </w:pPr>
+      <w:r>
+        <w:rPr>
+          <w:rFonts w:ascii="Arial" w:hAnsi="Arial" w:cs="Arial"/>
+          <w:sz w:val="20"/>
+          <w:szCs w:val="20"/>
+          <w:lang w:bidi="en-US"/>
+        </w:rPr>
+        <w:t>{{</w:t>
+      </w:r>
+      <w:proofErr w:type="spellStart"/>
+      <w:proofErr w:type="gramStart"/>
+      <w:r>
+        <w:rPr>
+          <w:rFonts w:ascii="Arial" w:hAnsi="Arial" w:cs="Arial"/>
+          <w:sz w:val="20"/>
+          <w:szCs w:val="20"/>
+          <w:lang w:bidi="en-US"/>
+        </w:rPr>
+        <w:t>article.full</w:t>
+      </w:r>
+      <w:proofErr w:type="gramEnd"/>
+      <w:r>
+        <w:rPr>
+          <w:rFonts w:ascii="Arial" w:hAnsi="Arial" w:cs="Arial"/>
+          <w:sz w:val="20"/>
+          <w:szCs w:val="20"/>
+          <w:lang w:bidi="en-US"/>
+        </w:rPr>
+        <w:t>_text</w:t>
+      </w:r>
+      <w:proofErr w:type="spellEnd"/>
+      <w:r>
+        <w:rPr>
+          <w:rFonts w:ascii="Arial" w:hAnsi="Arial" w:cs="Arial"/>
+          <w:sz w:val="20"/>
+          <w:szCs w:val="20"/>
+          <w:lang w:bidi="en-US"/>
+        </w:rPr>
+        <w:t>}}</w:t>
       </w:r>
     </w:p>
     <w:p>
@@ -767,60 +1602,197 @@
           <w:szCs w:val="18"/>
         </w:rPr>
       </w:pPr>
-      <w:hyperlink w:anchor="_top" w:history="1">
-        <w:r>
-          <w:rPr>
-            <w:rStyle w:val="Hyperlink"/>
-            <w:rFonts w:ascii="Arial" w:hAnsi="Arial" w:cs="Arial"/>
-            <w:b/>
-            <w:sz w:val="18"/>
-            <w:szCs w:val="18"/>
-            <w:lang w:bidi="en-US"/>
-          </w:rPr>
-          <w:t>Back to Summaries</w:t>
-        </w:r>
-      </w:hyperlink>
-    </w:p>
-    <w:p>
-      <w:pPr>
-        <w:rPr>
-          <w:rFonts w:ascii="Arial" w:hAnsi="Arial" w:cs="Arial"/>
+      <w:r>
+        <w:rPr>
+          <w:rFonts w:ascii="Arial" w:hAnsi="Arial" w:cs="Arial"/>
+          <w:b/>
+          <w:bCs/>
+          <w:color w:val="3D0DFF"/>
           <w:sz w:val="18"/>
           <w:szCs w:val="18"/>
-        </w:rPr>
-      </w:pPr>
-    </w:p>
-    <w:p>
-      <w:pPr>
-        <w:rPr>
-          <w:rFonts w:ascii="Arial" w:hAnsi="Arial" w:cs="Arial"/>
-          <w:lang w:bidi="en-US"/>
-        </w:rPr>
-      </w:pPr>
-      <w:r>
-        <w:rPr>
-          <w:rFonts w:ascii="Arial" w:hAnsi="Arial" w:cs="Arial"/>
-          <w:lang w:bidi="en-US"/>
-        </w:rPr>
-        <w:t>{% endfor %}</w:t>
-      </w:r>
-    </w:p>
-    <w:p>
-      <w:pPr>
-        <w:rPr>
-          <w:rFonts w:ascii="Arial" w:hAnsi="Arial" w:cs="Arial"/>
-        </w:rPr>
-      </w:pPr>
-      <w:r>
-        <w:rPr>
-          <w:rFonts w:ascii="Arial" w:hAnsi="Arial" w:cs="Arial"/>
-          <w:bCs/>
-          <w:color w:val="000000"/>
-          <w:sz w:val="20"/>
-          <w:szCs w:val="20"/>
-          <w:lang w:bidi="en-US"/>
-        </w:rPr>
-        <w:t>{% endfor %}</w:t>
+          <w:u w:val="single"/>
+        </w:rPr>
+        <w:t>{{</w:t>
+      </w:r>
+      <w:r>
+        <w:rPr>
+          <w:rFonts w:ascii="Arial" w:hAnsi="Arial" w:cs="Arial"/>
+          <w:b/>
+          <w:bCs/>
+          <w:color w:val="3D0DFF"/>
+          <w:sz w:val="18"/>
+          <w:szCs w:val="18"/>
+          <w:u w:val="single"/>
+        </w:rPr>
+        <w:t xml:space="preserve"> </w:t>
+      </w:r>
+      <w:proofErr w:type="spellStart"/>
+      <w:r>
+        <w:rPr>
+          <w:rFonts w:ascii="Arial" w:hAnsi="Arial" w:cs="Arial"/>
+          <w:b/>
+          <w:bCs/>
+          <w:color w:val="3D0DFF"/>
+          <w:sz w:val="18"/>
+          <w:szCs w:val="18"/>
+          <w:u w:val="single"/>
+        </w:rPr>
+        <w:t>make_link</w:t>
+      </w:r>
+      <w:proofErr w:type="spellEnd"/>
+      <w:r>
+        <w:rPr>
+          <w:rFonts w:ascii="Arial" w:hAnsi="Arial" w:cs="Arial"/>
+          <w:b/>
+          <w:bCs/>
+          <w:color w:val="3D0DFF"/>
+          <w:sz w:val="18"/>
+          <w:szCs w:val="18"/>
+          <w:u w:val="single"/>
+        </w:rPr>
+        <w:t>(“</w:t>
+      </w:r>
+      <w:r>
+        <w:rPr>
+          <w:rFonts w:ascii="Arial" w:hAnsi="Arial" w:cs="Arial"/>
+          <w:b/>
+          <w:bCs/>
+          <w:color w:val="3D0DFF"/>
+          <w:sz w:val="18"/>
+          <w:szCs w:val="18"/>
+          <w:u w:val="single"/>
+        </w:rPr>
+        <w:t>Back to Summaries</w:t>
+      </w:r>
+      <w:r>
+        <w:rPr>
+          <w:rFonts w:ascii="Arial" w:hAnsi="Arial" w:cs="Arial"/>
+          <w:b/>
+          <w:bCs/>
+          <w:color w:val="3D0DFF"/>
+          <w:sz w:val="18"/>
+          <w:szCs w:val="18"/>
+          <w:u w:val="single"/>
+        </w:rPr>
+        <w:t>”, “</w:t>
+      </w:r>
+      <w:r>
+        <w:rPr>
+          <w:rFonts w:ascii="Arial" w:hAnsi="Arial" w:cs="Arial"/>
+          <w:b/>
+          <w:bCs/>
+          <w:color w:val="3D0DFF"/>
+          <w:sz w:val="18"/>
+          <w:szCs w:val="18"/>
+          <w:u w:val="single"/>
+        </w:rPr>
+        <w:t>summaries</w:t>
+      </w:r>
+      <w:r>
+        <w:rPr>
+          <w:rFonts w:ascii="Arial" w:hAnsi="Arial" w:cs="Arial"/>
+          <w:b/>
+          <w:bCs/>
+          <w:color w:val="3D0DFF"/>
+          <w:sz w:val="18"/>
+          <w:szCs w:val="18"/>
+          <w:u w:val="single"/>
+        </w:rPr>
+        <w:t xml:space="preserve">_” ~ loop.index0) </w:t>
+      </w:r>
+      <w:r>
+        <w:rPr>
+          <w:rFonts w:ascii="Arial" w:hAnsi="Arial" w:cs="Arial"/>
+          <w:b/>
+          <w:bCs/>
+          <w:color w:val="3D0DFF"/>
+          <w:sz w:val="18"/>
+          <w:szCs w:val="18"/>
+          <w:u w:val="single"/>
+        </w:rPr>
+        <w:t>}}</w:t>
+      </w:r>
+    </w:p>
+    <w:p>
+      <w:pPr>
+        <w:rPr>
+          <w:rFonts w:ascii="Arial" w:hAnsi="Arial" w:cs="Arial"/>
+          <w:sz w:val="18"/>
+          <w:szCs w:val="18"/>
+        </w:rPr>
+      </w:pPr>
+    </w:p>
+    <w:p>
+      <w:pPr>
+        <w:rPr>
+          <w:rFonts w:ascii="Arial" w:hAnsi="Arial" w:cs="Arial"/>
+          <w:lang w:bidi="en-US"/>
+        </w:rPr>
+      </w:pPr>
+      <w:r>
+        <w:rPr>
+          <w:rFonts w:ascii="Arial" w:hAnsi="Arial" w:cs="Arial"/>
+          <w:lang w:bidi="en-US"/>
+        </w:rPr>
+        <w:t xml:space="preserve">{% </w:t>
+      </w:r>
+      <w:proofErr w:type="spellStart"/>
+      <w:r>
+        <w:rPr>
+          <w:rFonts w:ascii="Arial" w:hAnsi="Arial" w:cs="Arial"/>
+          <w:lang w:bidi="en-US"/>
+        </w:rPr>
+        <w:t>endfor</w:t>
+      </w:r>
+      <w:proofErr w:type="spellEnd"/>
+      <w:r>
+        <w:rPr>
+          <w:rFonts w:ascii="Arial" w:hAnsi="Arial" w:cs="Arial"/>
+          <w:lang w:bidi="en-US"/>
+        </w:rPr>
+        <w:t xml:space="preserve"> %}</w:t>
+      </w:r>
+    </w:p>
+    <w:p>
+      <w:pPr>
+        <w:rPr>
+          <w:rFonts w:ascii="Arial" w:hAnsi="Arial" w:cs="Arial"/>
+        </w:rPr>
+      </w:pPr>
+      <w:r>
+        <w:rPr>
+          <w:rFonts w:ascii="Arial" w:hAnsi="Arial" w:cs="Arial"/>
+          <w:bCs/>
+          <w:color w:val="000000"/>
+          <w:sz w:val="20"/>
+          <w:szCs w:val="20"/>
+          <w:lang w:bidi="en-US"/>
+        </w:rPr>
+        <w:t xml:space="preserve">{% </w:t>
+      </w:r>
+      <w:proofErr w:type="spellStart"/>
+      <w:r>
+        <w:rPr>
+          <w:rFonts w:ascii="Arial" w:hAnsi="Arial" w:cs="Arial"/>
+          <w:bCs/>
+          <w:color w:val="000000"/>
+          <w:sz w:val="20"/>
+          <w:szCs w:val="20"/>
+          <w:lang w:bidi="en-US"/>
+        </w:rPr>
+        <w:t>endfor</w:t>
+      </w:r>
+      <w:proofErr w:type="spellEnd"/>
+      <w:r>
+        <w:rPr>
+          <w:rFonts w:ascii="Arial" w:hAnsi="Arial" w:cs="Arial"/>
+          <w:bCs/>
+          <w:color w:val="000000"/>
+          <w:sz w:val="20"/>
+          <w:szCs w:val="20"/>
+          <w:lang w:bidi="en-US"/>
+        </w:rPr>
+        <w:t xml:space="preserve"> %}</w:t>
       </w:r>
     </w:p>
     <w:p>
@@ -3164,6 +4136,32 @@
 </file>
 
 <file path=customXml/item1.xml><?xml version="1.0" encoding="utf-8"?>
+<?mso-contentType ?>
+<FormTemplates xmlns="http://schemas.microsoft.com/sharepoint/v3/contenttype/forms">
+  <Display>DocumentLibraryForm</Display>
+  <Edit>DocumentLibraryForm</Edit>
+  <New>DocumentLibraryForm</New>
+</FormTemplates>
+</file>
+
+<file path=customXml/item2.xml><?xml version="1.0" encoding="utf-8"?>
+<p:properties xmlns:p="http://schemas.microsoft.com/office/2006/metadata/properties" xmlns:xsi="http://www.w3.org/2001/XMLSchema-instance" xmlns:pc="http://schemas.microsoft.com/office/infopath/2007/PartnerControls">
+  <documentManagement>
+    <TaxCatchAll xmlns="38d2a309-d798-495b-b1a3-e97c37808eef"/>
+    <_ip_UnifiedCompliancePolicyUIAction xmlns="http://schemas.microsoft.com/sharepoint/v3" xsi:nil="true"/>
+    <_ip_UnifiedCompliancePolicyProperties xmlns="http://schemas.microsoft.com/sharepoint/v3" xsi:nil="true"/>
+    <lcf76f155ced4ddcb4097134ff3c332f xmlns="416eecfc-56a7-4354-8013-4a2d9c92e153">
+      <Terms xmlns="http://schemas.microsoft.com/office/infopath/2007/PartnerControls"/>
+    </lcf76f155ced4ddcb4097134ff3c332f>
+  </documentManagement>
+</p:properties>
+</file>
+
+<file path=customXml/item3.xml><?xml version="1.0" encoding="utf-8"?>
+<b:Sources xmlns:b="http://schemas.openxmlformats.org/officeDocument/2006/bibliography" xmlns="http://schemas.openxmlformats.org/officeDocument/2006/bibliography" SelectedStyle="\APA.XSL" StyleName="APA"/>
+</file>
+
+<file path=customXml/item4.xml><?xml version="1.0" encoding="utf-8"?>
 <ct:contentTypeSchema xmlns:ct="http://schemas.microsoft.com/office/2006/metadata/contentType" xmlns:ma="http://schemas.microsoft.com/office/2006/metadata/properties/metaAttributes" ct:_="" ma:_="" ma:contentTypeName="Document" ma:contentTypeID="0x010100E48B1925F2EFB241960044EC5F64C034" ma:contentTypeVersion="16" ma:contentTypeDescription="Create a new document." ma:contentTypeScope="" ma:versionID="b193f1a1adb628ee5f7d642c4cb4fead">
   <xsd:schema xmlns:xsd="http://www.w3.org/2001/XMLSchema" xmlns:xs="http://www.w3.org/2001/XMLSchema" xmlns:p="http://schemas.microsoft.com/office/2006/metadata/properties" xmlns:ns1="http://schemas.microsoft.com/sharepoint/v3" xmlns:ns2="416eecfc-56a7-4354-8013-4a2d9c92e153" xmlns:ns3="38d2a309-d798-495b-b1a3-e97c37808eef" targetNamespace="http://schemas.microsoft.com/office/2006/metadata/properties" ma:root="true" ma:fieldsID="f4c72206c132b1461c2865266b50231c" ns1:_="" ns2:_="" ns3:_="">
     <xsd:import namespace="http://schemas.microsoft.com/sharepoint/v3"/>
@@ -3409,33 +4407,35 @@
 </ct:contentTypeSchema>
 </file>
 
-<file path=customXml/item2.xml><?xml version="1.0" encoding="utf-8"?>
-<b:Sources xmlns:b="http://schemas.openxmlformats.org/officeDocument/2006/bibliography" xmlns="http://schemas.openxmlformats.org/officeDocument/2006/bibliography" SelectedStyle="\APA.XSL" StyleName="APA"/>
+<file path=customXml/itemProps1.xml><?xml version="1.0" encoding="utf-8"?>
+<ds:datastoreItem xmlns:ds="http://schemas.openxmlformats.org/officeDocument/2006/customXml" ds:itemID="{2ACA00A0-0EB9-4F25-B1A0-9480A1DEA0B5}">
+  <ds:schemaRefs>
+    <ds:schemaRef ds:uri="http://schemas.microsoft.com/sharepoint/v3/contenttype/forms"/>
+  </ds:schemaRefs>
+</ds:datastoreItem>
 </file>
 
-<file path=customXml/item3.xml><?xml version="1.0" encoding="utf-8"?>
-<p:properties xmlns:p="http://schemas.microsoft.com/office/2006/metadata/properties" xmlns:xsi="http://www.w3.org/2001/XMLSchema-instance" xmlns:pc="http://schemas.microsoft.com/office/infopath/2007/PartnerControls">
-  <documentManagement>
-    <TaxCatchAll xmlns="38d2a309-d798-495b-b1a3-e97c37808eef"/>
-    <_ip_UnifiedCompliancePolicyUIAction xmlns="http://schemas.microsoft.com/sharepoint/v3" xsi:nil="true"/>
-    <_ip_UnifiedCompliancePolicyProperties xmlns="http://schemas.microsoft.com/sharepoint/v3" xsi:nil="true"/>
-    <lcf76f155ced4ddcb4097134ff3c332f xmlns="416eecfc-56a7-4354-8013-4a2d9c92e153">
-      <Terms xmlns="http://schemas.microsoft.com/office/infopath/2007/PartnerControls"/>
-    </lcf76f155ced4ddcb4097134ff3c332f>
-  </documentManagement>
-</p:properties>
+<file path=customXml/itemProps2.xml><?xml version="1.0" encoding="utf-8"?>
+<ds:datastoreItem xmlns:ds="http://schemas.openxmlformats.org/officeDocument/2006/customXml" ds:itemID="{5D491C04-0035-45EA-BE2E-2976A5F7A397}">
+  <ds:schemaRefs>
+    <ds:schemaRef ds:uri="http://schemas.microsoft.com/office/2006/metadata/properties"/>
+    <ds:schemaRef ds:uri="http://schemas.microsoft.com/office/infopath/2007/PartnerControls"/>
+    <ds:schemaRef ds:uri="38d2a309-d798-495b-b1a3-e97c37808eef"/>
+    <ds:schemaRef ds:uri="http://schemas.microsoft.com/sharepoint/v3"/>
+    <ds:schemaRef ds:uri="416eecfc-56a7-4354-8013-4a2d9c92e153"/>
+  </ds:schemaRefs>
+</ds:datastoreItem>
 </file>
 
-<file path=customXml/item4.xml><?xml version="1.0" encoding="utf-8"?>
-<?mso-contentType ?>
-<FormTemplates xmlns="http://schemas.microsoft.com/sharepoint/v3/contenttype/forms">
-  <Display>DocumentLibraryForm</Display>
-  <Edit>DocumentLibraryForm</Edit>
-  <New>DocumentLibraryForm</New>
-</FormTemplates>
+<file path=customXml/itemProps3.xml><?xml version="1.0" encoding="utf-8"?>
+<ds:datastoreItem xmlns:ds="http://schemas.openxmlformats.org/officeDocument/2006/customXml" ds:itemID="{4202E056-596C-4D43-866F-DBCC294656E0}">
+  <ds:schemaRefs>
+    <ds:schemaRef ds:uri="http://schemas.openxmlformats.org/officeDocument/2006/bibliography"/>
+  </ds:schemaRefs>
+</ds:datastoreItem>
 </file>
 
-<file path=customXml/itemProps1.xml><?xml version="1.0" encoding="utf-8"?>
+<file path=customXml/itemProps4.xml><?xml version="1.0" encoding="utf-8"?>
 <ds:datastoreItem xmlns:ds="http://schemas.openxmlformats.org/officeDocument/2006/customXml" ds:itemID="{3AA634C4-AFF1-45A4-BEEC-3BC128C36838}">
   <ds:schemaRefs>
     <ds:schemaRef ds:uri="http://schemas.microsoft.com/office/2006/metadata/contentType"/>
@@ -3455,34 +4455,6 @@
 </ds:datastoreItem>
 </file>
 
-<file path=customXml/itemProps2.xml><?xml version="1.0" encoding="utf-8"?>
-<ds:datastoreItem xmlns:ds="http://schemas.openxmlformats.org/officeDocument/2006/customXml" ds:itemID="{4202E056-596C-4D43-866F-DBCC294656E0}">
-  <ds:schemaRefs>
-    <ds:schemaRef ds:uri="http://schemas.openxmlformats.org/officeDocument/2006/bibliography"/>
-  </ds:schemaRefs>
-</ds:datastoreItem>
-</file>
-
-<file path=customXml/itemProps3.xml><?xml version="1.0" encoding="utf-8"?>
-<ds:datastoreItem xmlns:ds="http://schemas.openxmlformats.org/officeDocument/2006/customXml" ds:itemID="{5D491C04-0035-45EA-BE2E-2976A5F7A397}">
-  <ds:schemaRefs>
-    <ds:schemaRef ds:uri="http://schemas.microsoft.com/office/2006/metadata/properties"/>
-    <ds:schemaRef ds:uri="http://schemas.microsoft.com/office/infopath/2007/PartnerControls"/>
-    <ds:schemaRef ds:uri="38d2a309-d798-495b-b1a3-e97c37808eef"/>
-    <ds:schemaRef ds:uri="http://schemas.microsoft.com/sharepoint/v3"/>
-    <ds:schemaRef ds:uri="416eecfc-56a7-4354-8013-4a2d9c92e153"/>
-  </ds:schemaRefs>
-</ds:datastoreItem>
-</file>
-
-<file path=customXml/itemProps4.xml><?xml version="1.0" encoding="utf-8"?>
-<ds:datastoreItem xmlns:ds="http://schemas.openxmlformats.org/officeDocument/2006/customXml" ds:itemID="{2ACA00A0-0EB9-4F25-B1A0-9480A1DEA0B5}">
-  <ds:schemaRefs>
-    <ds:schemaRef ds:uri="http://schemas.microsoft.com/sharepoint/v3/contenttype/forms"/>
-  </ds:schemaRefs>
-</ds:datastoreItem>
-</file>
-
 <file path=docMetadata/LabelInfo.xml><?xml version="1.0" encoding="utf-8"?>
 <clbl:labelList xmlns:clbl="http://schemas.microsoft.com/office/2020/mipLabelMetadata">
   <clbl:label id="{3de9faa6-9fe1-49b3-9a08-227a296b54a6}" enabled="1" method="Privileged" siteId="{66d73691-ea97-48b1-95d5-e94f0a46b878}" contentBits="0" removed="0"/>

</xml_diff>

<commit_message>
Revert back to stable commit.
</commit_message>
<xml_diff>
--- a/app/assets/default_template.docx
+++ b/app/assets/default_template.docx
@@ -81,9 +81,8 @@
           <w:sz w:val="20"/>
           <w:lang w:bidi="en-US"/>
         </w:rPr>
-        <w:t>{{</w:t>
-      </w:r>
-      <w:proofErr w:type="spellStart"/>
+        <w:t xml:space="preserve">{{report_date.month}} </w:t>
+      </w:r>
       <w:r>
         <w:rPr>
           <w:rFonts w:ascii="Arial" w:hAnsi="Arial" w:cs="Arial"/>
@@ -92,9 +91,8 @@
           <w:sz w:val="20"/>
           <w:lang w:bidi="en-US"/>
         </w:rPr>
-        <w:t>report_</w:t>
-      </w:r>
-      <w:proofErr w:type="gramStart"/>
+        <w:t>{</w:t>
+      </w:r>
       <w:r>
         <w:rPr>
           <w:rFonts w:ascii="Arial" w:hAnsi="Arial" w:cs="Arial"/>
@@ -103,10 +101,8 @@
           <w:sz w:val="20"/>
           <w:lang w:bidi="en-US"/>
         </w:rPr>
-        <w:t>date.month</w:t>
-      </w:r>
-      <w:proofErr w:type="spellEnd"/>
-      <w:proofErr w:type="gramEnd"/>
+        <w:t>{report_date.day}}</w:t>
+      </w:r>
       <w:r>
         <w:rPr>
           <w:rFonts w:ascii="Arial" w:hAnsi="Arial" w:cs="Arial"/>
@@ -115,7 +111,7 @@
           <w:sz w:val="20"/>
           <w:lang w:bidi="en-US"/>
         </w:rPr>
-        <w:t xml:space="preserve">}} </w:t>
+        <w:t>,</w:t>
       </w:r>
       <w:r>
         <w:rPr>
@@ -125,7 +121,7 @@
           <w:sz w:val="20"/>
           <w:lang w:bidi="en-US"/>
         </w:rPr>
-        <w:t>{</w:t>
+        <w:t xml:space="preserve"> </w:t>
       </w:r>
       <w:r>
         <w:rPr>
@@ -135,93 +131,7 @@
           <w:sz w:val="20"/>
           <w:lang w:bidi="en-US"/>
         </w:rPr>
-        <w:t>{</w:t>
-      </w:r>
-      <w:proofErr w:type="spellStart"/>
-      <w:r>
-        <w:rPr>
-          <w:rFonts w:ascii="Arial" w:hAnsi="Arial" w:cs="Arial"/>
-          <w:b/>
-          <w:color w:val="000000"/>
-          <w:sz w:val="20"/>
-          <w:lang w:bidi="en-US"/>
-        </w:rPr>
-        <w:t>report_date.day</w:t>
-      </w:r>
-      <w:proofErr w:type="spellEnd"/>
-      <w:r>
-        <w:rPr>
-          <w:rFonts w:ascii="Arial" w:hAnsi="Arial" w:cs="Arial"/>
-          <w:b/>
-          <w:color w:val="000000"/>
-          <w:sz w:val="20"/>
-          <w:lang w:bidi="en-US"/>
-        </w:rPr>
-        <w:t>}}</w:t>
-      </w:r>
-      <w:r>
-        <w:rPr>
-          <w:rFonts w:ascii="Arial" w:hAnsi="Arial" w:cs="Arial"/>
-          <w:b/>
-          <w:color w:val="000000"/>
-          <w:sz w:val="20"/>
-          <w:lang w:bidi="en-US"/>
-        </w:rPr>
-        <w:t>,</w:t>
-      </w:r>
-      <w:r>
-        <w:rPr>
-          <w:rFonts w:ascii="Arial" w:hAnsi="Arial" w:cs="Arial"/>
-          <w:b/>
-          <w:color w:val="000000"/>
-          <w:sz w:val="20"/>
-          <w:lang w:bidi="en-US"/>
-        </w:rPr>
-        <w:t xml:space="preserve"> </w:t>
-      </w:r>
-      <w:r>
-        <w:rPr>
-          <w:rFonts w:ascii="Arial" w:hAnsi="Arial" w:cs="Arial"/>
-          <w:b/>
-          <w:color w:val="000000"/>
-          <w:sz w:val="20"/>
-          <w:lang w:bidi="en-US"/>
-        </w:rPr>
-        <w:t>{{</w:t>
-      </w:r>
-      <w:proofErr w:type="spellStart"/>
-      <w:r>
-        <w:rPr>
-          <w:rFonts w:ascii="Arial" w:hAnsi="Arial" w:cs="Arial"/>
-          <w:b/>
-          <w:color w:val="000000"/>
-          <w:sz w:val="20"/>
-          <w:lang w:bidi="en-US"/>
-        </w:rPr>
-        <w:t>report_</w:t>
-      </w:r>
-      <w:proofErr w:type="gramStart"/>
-      <w:r>
-        <w:rPr>
-          <w:rFonts w:ascii="Arial" w:hAnsi="Arial" w:cs="Arial"/>
-          <w:b/>
-          <w:color w:val="000000"/>
-          <w:sz w:val="20"/>
-          <w:lang w:bidi="en-US"/>
-        </w:rPr>
-        <w:t>date.year</w:t>
-      </w:r>
-      <w:proofErr w:type="spellEnd"/>
-      <w:proofErr w:type="gramEnd"/>
-      <w:r>
-        <w:rPr>
-          <w:rFonts w:ascii="Arial" w:hAnsi="Arial" w:cs="Arial"/>
-          <w:b/>
-          <w:color w:val="000000"/>
-          <w:sz w:val="20"/>
-          <w:lang w:bidi="en-US"/>
-        </w:rPr>
-        <w:t>}}</w:t>
+        <w:t>{{report_date.year}}</w:t>
       </w:r>
     </w:p>
     <w:p>
@@ -283,138 +193,6 @@
     </w:p>
     <w:p>
       <w:pPr>
-        <w:rPr>
-          <w:rFonts w:ascii="Arial" w:hAnsi="Arial" w:cs="Arial"/>
-          <w:bCs/>
-          <w:color w:val="000000"/>
-          <w:sz w:val="20"/>
-          <w:szCs w:val="20"/>
-          <w:lang w:bidi="en-US"/>
-        </w:rPr>
-      </w:pPr>
-      <w:r>
-        <w:rPr>
-          <w:rFonts w:ascii="Arial" w:hAnsi="Arial" w:cs="Arial"/>
-          <w:bCs/>
-          <w:color w:val="000000"/>
-          <w:sz w:val="20"/>
-          <w:szCs w:val="20"/>
-          <w:lang w:bidi="en-US"/>
-        </w:rPr>
-        <w:t>&lt;</w:t>
-      </w:r>
-      <w:proofErr w:type="spellStart"/>
-      <w:proofErr w:type="gramStart"/>
-      <w:r>
-        <w:rPr>
-          <w:rFonts w:ascii="Arial" w:hAnsi="Arial" w:cs="Arial"/>
-          <w:bCs/>
-          <w:color w:val="000000"/>
-          <w:sz w:val="20"/>
-          <w:szCs w:val="20"/>
-          <w:lang w:bidi="en-US"/>
-        </w:rPr>
-        <w:t>w:bookmarkStart</w:t>
-      </w:r>
-      <w:proofErr w:type="spellEnd"/>
-      <w:proofErr w:type="gramEnd"/>
-      <w:r>
-        <w:rPr>
-          <w:rFonts w:ascii="Arial" w:hAnsi="Arial" w:cs="Arial"/>
-          <w:bCs/>
-          <w:color w:val="000000"/>
-          <w:sz w:val="20"/>
-          <w:szCs w:val="20"/>
-          <w:lang w:bidi="en-US"/>
-        </w:rPr>
-        <w:t xml:space="preserve"> </w:t>
-      </w:r>
-      <w:proofErr w:type="spellStart"/>
-      <w:r>
-        <w:rPr>
-          <w:rFonts w:ascii="Arial" w:hAnsi="Arial" w:cs="Arial"/>
-          <w:bCs/>
-          <w:color w:val="000000"/>
-          <w:sz w:val="20"/>
-          <w:szCs w:val="20"/>
-          <w:lang w:bidi="en-US"/>
-        </w:rPr>
-        <w:t>w:name</w:t>
-      </w:r>
-      <w:proofErr w:type="spellEnd"/>
-      <w:r>
-        <w:rPr>
-          <w:rFonts w:ascii="Arial" w:hAnsi="Arial" w:cs="Arial"/>
-          <w:bCs/>
-          <w:color w:val="000000"/>
-          <w:sz w:val="20"/>
-          <w:szCs w:val="20"/>
-          <w:lang w:bidi="en-US"/>
-        </w:rPr>
-        <w:t>="</w:t>
-      </w:r>
-      <w:r>
-        <w:rPr>
-          <w:rFonts w:ascii="Arial" w:hAnsi="Arial" w:cs="Arial"/>
-          <w:bCs/>
-          <w:color w:val="000000"/>
-          <w:sz w:val="20"/>
-          <w:szCs w:val="20"/>
-          <w:lang w:bidi="en-US"/>
-        </w:rPr>
-        <w:t>summaries</w:t>
-      </w:r>
-      <w:proofErr w:type="gramStart"/>
-      <w:r>
-        <w:rPr>
-          <w:rFonts w:ascii="Arial" w:hAnsi="Arial" w:cs="Arial"/>
-          <w:bCs/>
-          <w:color w:val="000000"/>
-          <w:sz w:val="20"/>
-          <w:szCs w:val="20"/>
-          <w:lang w:bidi="en-US"/>
-        </w:rPr>
-        <w:t>_{{ loop</w:t>
-      </w:r>
-      <w:proofErr w:type="gramEnd"/>
-      <w:r>
-        <w:rPr>
-          <w:rFonts w:ascii="Arial" w:hAnsi="Arial" w:cs="Arial"/>
-          <w:bCs/>
-          <w:color w:val="000000"/>
-          <w:sz w:val="20"/>
-          <w:szCs w:val="20"/>
-          <w:lang w:bidi="en-US"/>
-        </w:rPr>
-        <w:t>.index</w:t>
-      </w:r>
-      <w:proofErr w:type="gramStart"/>
-      <w:r>
-        <w:rPr>
-          <w:rFonts w:ascii="Arial" w:hAnsi="Arial" w:cs="Arial"/>
-          <w:bCs/>
-          <w:color w:val="000000"/>
-          <w:sz w:val="20"/>
-          <w:szCs w:val="20"/>
-          <w:lang w:bidi="en-US"/>
-        </w:rPr>
-        <w:t>0 }}"</w:t>
-      </w:r>
-      <w:proofErr w:type="gramEnd"/>
-      <w:r>
-        <w:rPr>
-          <w:rFonts w:ascii="Arial" w:hAnsi="Arial" w:cs="Arial"/>
-          <w:bCs/>
-          <w:color w:val="000000"/>
-          <w:sz w:val="20"/>
-          <w:szCs w:val="20"/>
-          <w:lang w:bidi="en-US"/>
-        </w:rPr>
-        <w:t>/&gt;</w:t>
-      </w:r>
-    </w:p>
-    <w:p>
-      <w:pPr>
         <w:pStyle w:val="Heading1"/>
         <w:rPr>
           <w:rFonts w:ascii="Arial" w:hAnsi="Arial" w:cs="Arial"/>
@@ -465,80 +243,23 @@
       <w:pPr>
         <w:rPr>
           <w:rFonts w:ascii="Arial" w:hAnsi="Arial" w:cs="Arial"/>
-          <w:sz w:val="20"/>
-          <w:szCs w:val="20"/>
-        </w:rPr>
-      </w:pPr>
-      <w:r>
-        <w:rPr>
-          <w:rFonts w:ascii="Arial" w:hAnsi="Arial" w:cs="Arial"/>
-          <w:sz w:val="20"/>
-          <w:szCs w:val="20"/>
-        </w:rPr>
-        <w:t>&lt;</w:t>
-      </w:r>
-      <w:proofErr w:type="spellStart"/>
-      <w:proofErr w:type="gramStart"/>
-      <w:r>
-        <w:rPr>
-          <w:rFonts w:ascii="Arial" w:hAnsi="Arial" w:cs="Arial"/>
-          <w:sz w:val="20"/>
-          <w:szCs w:val="20"/>
-        </w:rPr>
-        <w:t>w:bookmarkEnd</w:t>
-      </w:r>
-      <w:proofErr w:type="spellEnd"/>
-      <w:proofErr w:type="gramEnd"/>
-      <w:r>
-        <w:rPr>
-          <w:rFonts w:ascii="Arial" w:hAnsi="Arial" w:cs="Arial"/>
-          <w:sz w:val="20"/>
-          <w:szCs w:val="20"/>
-        </w:rPr>
-        <w:t>/&gt;</w:t>
-      </w:r>
-    </w:p>
-    <w:p>
-      <w:pPr>
-        <w:rPr>
-          <w:rFonts w:ascii="Arial" w:hAnsi="Arial" w:cs="Arial"/>
-          <w:sz w:val="20"/>
-          <w:szCs w:val="20"/>
-          <w:lang w:bidi="en-US"/>
-        </w:rPr>
-      </w:pPr>
-    </w:p>
-    <w:p>
-      <w:pPr>
-        <w:rPr>
-          <w:rFonts w:ascii="Arial" w:hAnsi="Arial" w:cs="Arial"/>
-          <w:lang w:bidi="en-US"/>
-        </w:rPr>
-      </w:pPr>
-      <w:r>
-        <w:rPr>
-          <w:rFonts w:ascii="Arial" w:hAnsi="Arial" w:cs="Arial"/>
-          <w:lang w:bidi="en-US"/>
-        </w:rPr>
-        <w:t xml:space="preserve">{% for article in </w:t>
-      </w:r>
-      <w:proofErr w:type="spellStart"/>
-      <w:proofErr w:type="gramStart"/>
-      <w:r>
-        <w:rPr>
-          <w:rFonts w:ascii="Arial" w:hAnsi="Arial" w:cs="Arial"/>
-          <w:lang w:bidi="en-US"/>
-        </w:rPr>
-        <w:t>section.articles</w:t>
-      </w:r>
-      <w:proofErr w:type="spellEnd"/>
-      <w:proofErr w:type="gramEnd"/>
-      <w:r>
-        <w:rPr>
-          <w:rFonts w:ascii="Arial" w:hAnsi="Arial" w:cs="Arial"/>
-          <w:lang w:bidi="en-US"/>
-        </w:rPr>
-        <w:t xml:space="preserve"> %}</w:t>
+          <w:lang w:bidi="en-US"/>
+        </w:rPr>
+      </w:pPr>
+    </w:p>
+    <w:p>
+      <w:pPr>
+        <w:rPr>
+          <w:rFonts w:ascii="Arial" w:hAnsi="Arial" w:cs="Arial"/>
+          <w:lang w:bidi="en-US"/>
+        </w:rPr>
+      </w:pPr>
+      <w:r>
+        <w:rPr>
+          <w:rFonts w:ascii="Arial" w:hAnsi="Arial" w:cs="Arial"/>
+          <w:lang w:bidi="en-US"/>
+        </w:rPr>
+        <w:t>{% for article in section.articles %}</w:t>
       </w:r>
     </w:p>
     <w:p>
@@ -571,8 +292,6 @@
         </w:rPr>
         <w:t xml:space="preserve">r </w:t>
       </w:r>
-      <w:proofErr w:type="spellStart"/>
-      <w:proofErr w:type="gramStart"/>
       <w:r>
         <w:rPr>
           <w:rFonts w:ascii="Arial" w:hAnsi="Arial" w:cs="Arial"/>
@@ -581,29 +300,7 @@
           <w:szCs w:val="20"/>
           <w:lang w:bidi="en-US"/>
         </w:rPr>
-        <w:t>article.title</w:t>
-      </w:r>
-      <w:proofErr w:type="gramEnd"/>
-      <w:r>
-        <w:rPr>
-          <w:rFonts w:ascii="Arial" w:hAnsi="Arial" w:cs="Arial"/>
-          <w:color w:val="000000" w:themeColor="text1"/>
-          <w:sz w:val="20"/>
-          <w:szCs w:val="20"/>
-          <w:lang w:bidi="en-US"/>
-        </w:rPr>
-        <w:t>_with_link</w:t>
-      </w:r>
-      <w:proofErr w:type="spellEnd"/>
-      <w:r>
-        <w:rPr>
-          <w:rFonts w:ascii="Arial" w:hAnsi="Arial" w:cs="Arial"/>
-          <w:color w:val="000000" w:themeColor="text1"/>
-          <w:sz w:val="20"/>
-          <w:szCs w:val="20"/>
-          <w:lang w:bidi="en-US"/>
-        </w:rPr>
-        <w:t>}}</w:t>
+        <w:t>article.title_with_link}}</w:t>
       </w:r>
     </w:p>
     <w:p>
@@ -631,111 +328,46 @@
           <w:szCs w:val="20"/>
           <w:lang w:bidi="en-US"/>
         </w:rPr>
-        <w:t>{{</w:t>
-      </w:r>
-      <w:proofErr w:type="spellStart"/>
-      <w:proofErr w:type="gramStart"/>
-      <w:r>
-        <w:rPr>
-          <w:rFonts w:ascii="Arial" w:hAnsi="Arial" w:cs="Arial"/>
-          <w:sz w:val="20"/>
-          <w:szCs w:val="20"/>
-          <w:lang w:bidi="en-US"/>
-        </w:rPr>
-        <w:t>article.source</w:t>
-      </w:r>
-      <w:proofErr w:type="spellEnd"/>
-      <w:proofErr w:type="gramEnd"/>
-      <w:r>
-        <w:rPr>
-          <w:rFonts w:ascii="Arial" w:hAnsi="Arial" w:cs="Arial"/>
-          <w:sz w:val="20"/>
-          <w:szCs w:val="20"/>
-          <w:lang w:bidi="en-US"/>
-        </w:rPr>
-        <w:t>}}</w:t>
-      </w:r>
-      <w:r>
-        <w:rPr>
-          <w:rFonts w:ascii="Arial" w:hAnsi="Arial" w:cs="Arial"/>
-          <w:sz w:val="20"/>
-          <w:szCs w:val="20"/>
-          <w:lang w:bidi="en-US"/>
-        </w:rPr>
-        <w:t>) {{</w:t>
-      </w:r>
-      <w:proofErr w:type="spellStart"/>
-      <w:proofErr w:type="gramStart"/>
-      <w:r>
-        <w:rPr>
-          <w:rFonts w:ascii="Arial" w:hAnsi="Arial" w:cs="Arial"/>
-          <w:sz w:val="20"/>
-          <w:szCs w:val="20"/>
-          <w:lang w:bidi="en-US"/>
-        </w:rPr>
-        <w:t>article.date</w:t>
-      </w:r>
-      <w:proofErr w:type="spellEnd"/>
-      <w:proofErr w:type="gramEnd"/>
-      <w:r>
-        <w:rPr>
-          <w:rFonts w:ascii="Arial" w:hAnsi="Arial" w:cs="Arial"/>
-          <w:sz w:val="20"/>
-          <w:szCs w:val="20"/>
-          <w:lang w:bidi="en-US"/>
-        </w:rPr>
-        <w:t>}}</w:t>
-      </w:r>
-    </w:p>
-    <w:p>
-      <w:pPr>
-        <w:rPr>
-          <w:rFonts w:ascii="Arial" w:hAnsi="Arial" w:cs="Arial"/>
-          <w:sz w:val="20"/>
-          <w:szCs w:val="20"/>
-          <w:lang w:bidi="en-US"/>
-        </w:rPr>
-      </w:pPr>
-      <w:r>
-        <w:rPr>
-          <w:rFonts w:ascii="Arial" w:hAnsi="Arial" w:cs="Arial"/>
-          <w:sz w:val="20"/>
-          <w:szCs w:val="20"/>
-          <w:lang w:bidi="en-US"/>
-        </w:rPr>
-        <w:t>{{</w:t>
-      </w:r>
-      <w:proofErr w:type="spellStart"/>
-      <w:proofErr w:type="gramStart"/>
-      <w:r>
-        <w:rPr>
-          <w:rFonts w:ascii="Arial" w:hAnsi="Arial" w:cs="Arial"/>
-          <w:sz w:val="20"/>
-          <w:szCs w:val="20"/>
-          <w:lang w:bidi="en-US"/>
-        </w:rPr>
-        <w:t>article.summary</w:t>
-      </w:r>
-      <w:proofErr w:type="spellEnd"/>
-      <w:proofErr w:type="gramEnd"/>
-      <w:r>
-        <w:rPr>
-          <w:rFonts w:ascii="Arial" w:hAnsi="Arial" w:cs="Arial"/>
-          <w:sz w:val="20"/>
-          <w:szCs w:val="20"/>
-          <w:lang w:bidi="en-US"/>
-        </w:rPr>
-        <w:t>}}</w:t>
-      </w:r>
-    </w:p>
-    <w:p>
-      <w:pPr>
-        <w:rPr>
-          <w:rFonts w:ascii="Arial" w:hAnsi="Arial" w:cs="Arial"/>
-          <w:lang w:bidi="en-US"/>
-        </w:rPr>
-      </w:pPr>
-    </w:p>
+        <w:t>{{article.source}}</w:t>
+      </w:r>
+      <w:r>
+        <w:rPr>
+          <w:rFonts w:ascii="Arial" w:hAnsi="Arial" w:cs="Arial"/>
+          <w:sz w:val="20"/>
+          <w:szCs w:val="20"/>
+          <w:lang w:bidi="en-US"/>
+        </w:rPr>
+        <w:t>) {{article.date}}</w:t>
+      </w:r>
+    </w:p>
+    <w:p>
+      <w:pPr>
+        <w:rPr>
+          <w:rFonts w:ascii="Arial" w:hAnsi="Arial" w:cs="Arial"/>
+          <w:sz w:val="20"/>
+          <w:szCs w:val="20"/>
+          <w:lang w:bidi="en-US"/>
+        </w:rPr>
+      </w:pPr>
+      <w:r>
+        <w:rPr>
+          <w:rFonts w:ascii="Arial" w:hAnsi="Arial" w:cs="Arial"/>
+          <w:sz w:val="20"/>
+          <w:szCs w:val="20"/>
+          <w:lang w:bidi="en-US"/>
+        </w:rPr>
+        <w:t>{{article.summary}}</w:t>
+      </w:r>
+    </w:p>
+    <w:p>
+      <w:pPr>
+        <w:rPr>
+          <w:rFonts w:ascii="Arial" w:hAnsi="Arial" w:cs="Arial"/>
+          <w:lang w:bidi="en-US"/>
+        </w:rPr>
+      </w:pPr>
+    </w:p>
+    <w:bookmarkStart w:id="8" w:name="_Hlk190227748"/>
     <w:p>
       <w:pPr>
         <w:rPr>
@@ -744,186 +376,47 @@
           <w:szCs w:val="18"/>
         </w:rPr>
       </w:pPr>
-      <w:bookmarkStart w:id="8" w:name="_Hlk190227748"/>
-      <w:proofErr w:type="gramStart"/>
-      <w:r>
-        <w:rPr>
+      <w:r>
+        <w:fldChar w:fldCharType="begin"/>
+      </w:r>
+      <w:r>
+        <w:instrText>HYPERLINK  \l "_FULL_ARTICLES"</w:instrText>
+      </w:r>
+      <w:r>
+        <w:fldChar w:fldCharType="separate"/>
+      </w:r>
+      <w:r>
+        <w:rPr>
+          <w:rStyle w:val="Hyperlink"/>
           <w:rFonts w:ascii="Arial" w:hAnsi="Arial" w:cs="Arial"/>
           <w:b/>
-          <w:bCs/>
-          <w:color w:val="3D0DFF"/>
           <w:sz w:val="18"/>
           <w:szCs w:val="18"/>
-          <w:u w:val="single"/>
-        </w:rPr>
-        <w:t>{{</w:t>
-      </w:r>
-      <w:r>
-        <w:rPr>
+          <w:lang w:bidi="en-US"/>
+        </w:rPr>
+        <w:t>Full Articles</w:t>
+      </w:r>
+      <w:r>
+        <w:rPr>
+          <w:rStyle w:val="Hyperlink"/>
           <w:rFonts w:ascii="Arial" w:hAnsi="Arial" w:cs="Arial"/>
           <w:b/>
-          <w:bCs/>
-          <w:color w:val="3D0DFF"/>
           <w:sz w:val="18"/>
           <w:szCs w:val="18"/>
-          <w:u w:val="single"/>
-        </w:rPr>
-        <w:t xml:space="preserve"> </w:t>
-      </w:r>
-      <w:proofErr w:type="spellStart"/>
+          <w:lang w:bidi="en-US"/>
+        </w:rPr>
+        <w:fldChar w:fldCharType="end"/>
+      </w:r>
       <w:r>
         <w:rPr>
           <w:rFonts w:ascii="Arial" w:hAnsi="Arial" w:cs="Arial"/>
           <w:b/>
-          <w:bCs/>
-          <w:color w:val="3D0DFF"/>
+          <w:color w:val="000000"/>
           <w:sz w:val="18"/>
           <w:szCs w:val="18"/>
-          <w:u w:val="single"/>
-        </w:rPr>
-        <w:t>make</w:t>
-      </w:r>
-      <w:proofErr w:type="gramEnd"/>
-      <w:r>
-        <w:rPr>
-          <w:rFonts w:ascii="Arial" w:hAnsi="Arial" w:cs="Arial"/>
-          <w:b/>
-          <w:bCs/>
-          <w:color w:val="3D0DFF"/>
-          <w:sz w:val="18"/>
-          <w:szCs w:val="18"/>
-          <w:u w:val="single"/>
-        </w:rPr>
-        <w:t>_</w:t>
-      </w:r>
-      <w:proofErr w:type="gramStart"/>
-      <w:r>
-        <w:rPr>
-          <w:rFonts w:ascii="Arial" w:hAnsi="Arial" w:cs="Arial"/>
-          <w:b/>
-          <w:bCs/>
-          <w:color w:val="3D0DFF"/>
-          <w:sz w:val="18"/>
-          <w:szCs w:val="18"/>
-          <w:u w:val="single"/>
-        </w:rPr>
-        <w:t>link</w:t>
-      </w:r>
-      <w:proofErr w:type="spellEnd"/>
-      <w:r>
-        <w:rPr>
-          <w:rFonts w:ascii="Arial" w:hAnsi="Arial" w:cs="Arial"/>
-          <w:b/>
-          <w:bCs/>
-          <w:color w:val="3D0DFF"/>
-          <w:sz w:val="18"/>
-          <w:szCs w:val="18"/>
-          <w:u w:val="single"/>
-        </w:rPr>
-        <w:t>(</w:t>
-      </w:r>
-      <w:proofErr w:type="gramEnd"/>
-      <w:r>
-        <w:rPr>
-          <w:rFonts w:ascii="Arial" w:hAnsi="Arial" w:cs="Arial"/>
-          <w:b/>
-          <w:bCs/>
-          <w:color w:val="3D0DFF"/>
-          <w:sz w:val="18"/>
-          <w:szCs w:val="18"/>
-          <w:u w:val="single"/>
-        </w:rPr>
-        <w:t>“Full Text”, “</w:t>
-      </w:r>
-      <w:proofErr w:type="spellStart"/>
-      <w:r>
-        <w:rPr>
-          <w:rFonts w:ascii="Arial" w:hAnsi="Arial" w:cs="Arial"/>
-          <w:b/>
-          <w:bCs/>
-          <w:color w:val="3D0DFF"/>
-          <w:sz w:val="18"/>
-          <w:szCs w:val="18"/>
-          <w:u w:val="single"/>
-        </w:rPr>
-        <w:t>fulltext</w:t>
-      </w:r>
-      <w:proofErr w:type="spellEnd"/>
-      <w:r>
-        <w:rPr>
-          <w:rFonts w:ascii="Arial" w:hAnsi="Arial" w:cs="Arial"/>
-          <w:b/>
-          <w:bCs/>
-          <w:color w:val="3D0DFF"/>
-          <w:sz w:val="18"/>
-          <w:szCs w:val="18"/>
-          <w:u w:val="single"/>
-        </w:rPr>
-        <w:t xml:space="preserve">_” ~ </w:t>
-      </w:r>
-      <w:proofErr w:type="gramStart"/>
-      <w:r>
-        <w:rPr>
-          <w:rFonts w:ascii="Arial" w:hAnsi="Arial" w:cs="Arial"/>
-          <w:b/>
-          <w:bCs/>
-          <w:color w:val="3D0DFF"/>
-          <w:sz w:val="18"/>
-          <w:szCs w:val="18"/>
-          <w:u w:val="single"/>
-        </w:rPr>
-        <w:t>loop.index</w:t>
-      </w:r>
-      <w:proofErr w:type="gramEnd"/>
-      <w:r>
-        <w:rPr>
-          <w:rFonts w:ascii="Arial" w:hAnsi="Arial" w:cs="Arial"/>
-          <w:b/>
-          <w:bCs/>
-          <w:color w:val="3D0DFF"/>
-          <w:sz w:val="18"/>
-          <w:szCs w:val="18"/>
-          <w:u w:val="single"/>
-        </w:rPr>
-        <w:t>0</w:t>
-      </w:r>
-      <w:proofErr w:type="gramStart"/>
-      <w:r>
-        <w:rPr>
-          <w:rFonts w:ascii="Arial" w:hAnsi="Arial" w:cs="Arial"/>
-          <w:b/>
-          <w:bCs/>
-          <w:color w:val="3D0DFF"/>
-          <w:sz w:val="18"/>
-          <w:szCs w:val="18"/>
-          <w:u w:val="single"/>
-        </w:rPr>
-        <w:t xml:space="preserve">) </w:t>
-      </w:r>
-      <w:r>
-        <w:rPr>
-          <w:rFonts w:ascii="Arial" w:hAnsi="Arial" w:cs="Arial"/>
-          <w:b/>
-          <w:bCs/>
-          <w:color w:val="3D0DFF"/>
-          <w:sz w:val="18"/>
-          <w:szCs w:val="18"/>
-          <w:u w:val="single"/>
-        </w:rPr>
-        <w:t>}</w:t>
-      </w:r>
-      <w:proofErr w:type="gramEnd"/>
-      <w:r>
-        <w:rPr>
-          <w:rFonts w:ascii="Arial" w:hAnsi="Arial" w:cs="Arial"/>
-          <w:b/>
-          <w:bCs/>
-          <w:color w:val="3D0DFF"/>
-          <w:sz w:val="18"/>
-          <w:szCs w:val="18"/>
-          <w:u w:val="single"/>
-        </w:rPr>
-        <w:t xml:space="preserve">} </w:t>
+          <w:lang w:bidi="en-US"/>
+        </w:rPr>
+        <w:t xml:space="preserve"> </w:t>
       </w:r>
       <w:hyperlink w:anchor="_top" w:history="1">
         <w:r>
@@ -963,23 +456,7 @@
           <w:rFonts w:ascii="Arial" w:hAnsi="Arial" w:cs="Arial"/>
           <w:lang w:bidi="en-US"/>
         </w:rPr>
-        <w:t xml:space="preserve">{% </w:t>
-      </w:r>
-      <w:proofErr w:type="spellStart"/>
-      <w:r>
-        <w:rPr>
-          <w:rFonts w:ascii="Arial" w:hAnsi="Arial" w:cs="Arial"/>
-          <w:lang w:bidi="en-US"/>
-        </w:rPr>
-        <w:t>endfor</w:t>
-      </w:r>
-      <w:proofErr w:type="spellEnd"/>
-      <w:r>
-        <w:rPr>
-          <w:rFonts w:ascii="Arial" w:hAnsi="Arial" w:cs="Arial"/>
-          <w:lang w:bidi="en-US"/>
-        </w:rPr>
-        <w:t xml:space="preserve"> %}</w:t>
+        <w:t>{% endfor %}</w:t>
       </w:r>
     </w:p>
     <w:p>
@@ -1005,31 +482,7 @@
           <w:szCs w:val="20"/>
           <w:lang w:bidi="en-US"/>
         </w:rPr>
-        <w:t xml:space="preserve">{% </w:t>
-      </w:r>
-      <w:proofErr w:type="spellStart"/>
-      <w:r>
-        <w:rPr>
-          <w:rFonts w:ascii="Arial" w:hAnsi="Arial" w:cs="Arial"/>
-          <w:bCs/>
-          <w:color w:val="000000"/>
-          <w:sz w:val="20"/>
-          <w:szCs w:val="20"/>
-          <w:lang w:bidi="en-US"/>
-        </w:rPr>
-        <w:t>endfor</w:t>
-      </w:r>
-      <w:proofErr w:type="spellEnd"/>
-      <w:r>
-        <w:rPr>
-          <w:rFonts w:ascii="Arial" w:hAnsi="Arial" w:cs="Arial"/>
-          <w:bCs/>
-          <w:color w:val="000000"/>
-          <w:sz w:val="20"/>
-          <w:szCs w:val="20"/>
-          <w:lang w:bidi="en-US"/>
-        </w:rPr>
-        <w:t xml:space="preserve"> %}</w:t>
+        <w:t>{% endfor %}</w:t>
       </w:r>
     </w:p>
     <w:p>
@@ -1130,140 +583,6 @@
     </w:p>
     <w:p>
       <w:pPr>
-        <w:rPr>
-          <w:rFonts w:ascii="Arial" w:hAnsi="Arial" w:cs="Arial"/>
-          <w:bCs/>
-          <w:color w:val="000000"/>
-          <w:sz w:val="20"/>
-          <w:szCs w:val="20"/>
-          <w:lang w:bidi="en-US"/>
-        </w:rPr>
-      </w:pPr>
-      <w:r>
-        <w:rPr>
-          <w:rFonts w:ascii="Arial" w:hAnsi="Arial" w:cs="Arial"/>
-          <w:bCs/>
-          <w:color w:val="000000"/>
-          <w:sz w:val="20"/>
-          <w:szCs w:val="20"/>
-          <w:lang w:bidi="en-US"/>
-        </w:rPr>
-        <w:t>&lt;</w:t>
-      </w:r>
-      <w:proofErr w:type="spellStart"/>
-      <w:proofErr w:type="gramStart"/>
-      <w:r>
-        <w:rPr>
-          <w:rFonts w:ascii="Arial" w:hAnsi="Arial" w:cs="Arial"/>
-          <w:bCs/>
-          <w:color w:val="000000"/>
-          <w:sz w:val="20"/>
-          <w:szCs w:val="20"/>
-          <w:lang w:bidi="en-US"/>
-        </w:rPr>
-        <w:t>w:bookmarkStart</w:t>
-      </w:r>
-      <w:proofErr w:type="spellEnd"/>
-      <w:proofErr w:type="gramEnd"/>
-      <w:r>
-        <w:rPr>
-          <w:rFonts w:ascii="Arial" w:hAnsi="Arial" w:cs="Arial"/>
-          <w:bCs/>
-          <w:color w:val="000000"/>
-          <w:sz w:val="20"/>
-          <w:szCs w:val="20"/>
-          <w:lang w:bidi="en-US"/>
-        </w:rPr>
-        <w:t xml:space="preserve"> </w:t>
-      </w:r>
-      <w:proofErr w:type="spellStart"/>
-      <w:r>
-        <w:rPr>
-          <w:rFonts w:ascii="Arial" w:hAnsi="Arial" w:cs="Arial"/>
-          <w:bCs/>
-          <w:color w:val="000000"/>
-          <w:sz w:val="20"/>
-          <w:szCs w:val="20"/>
-          <w:lang w:bidi="en-US"/>
-        </w:rPr>
-        <w:t>w:name</w:t>
-      </w:r>
-      <w:proofErr w:type="spellEnd"/>
-      <w:r>
-        <w:rPr>
-          <w:rFonts w:ascii="Arial" w:hAnsi="Arial" w:cs="Arial"/>
-          <w:bCs/>
-          <w:color w:val="000000"/>
-          <w:sz w:val="20"/>
-          <w:szCs w:val="20"/>
-          <w:lang w:bidi="en-US"/>
-        </w:rPr>
-        <w:t>="</w:t>
-      </w:r>
-      <w:proofErr w:type="spellStart"/>
-      <w:r>
-        <w:rPr>
-          <w:rFonts w:ascii="Arial" w:hAnsi="Arial" w:cs="Arial"/>
-          <w:bCs/>
-          <w:color w:val="000000"/>
-          <w:sz w:val="20"/>
-          <w:szCs w:val="20"/>
-          <w:lang w:bidi="en-US"/>
-        </w:rPr>
-        <w:t>fulltext</w:t>
-      </w:r>
-      <w:proofErr w:type="spellEnd"/>
-      <w:proofErr w:type="gramStart"/>
-      <w:r>
-        <w:rPr>
-          <w:rFonts w:ascii="Arial" w:hAnsi="Arial" w:cs="Arial"/>
-          <w:bCs/>
-          <w:color w:val="000000"/>
-          <w:sz w:val="20"/>
-          <w:szCs w:val="20"/>
-          <w:lang w:bidi="en-US"/>
-        </w:rPr>
-        <w:t>_{{ loop</w:t>
-      </w:r>
-      <w:proofErr w:type="gramEnd"/>
-      <w:r>
-        <w:rPr>
-          <w:rFonts w:ascii="Arial" w:hAnsi="Arial" w:cs="Arial"/>
-          <w:bCs/>
-          <w:color w:val="000000"/>
-          <w:sz w:val="20"/>
-          <w:szCs w:val="20"/>
-          <w:lang w:bidi="en-US"/>
-        </w:rPr>
-        <w:t>.index</w:t>
-      </w:r>
-      <w:proofErr w:type="gramStart"/>
-      <w:r>
-        <w:rPr>
-          <w:rFonts w:ascii="Arial" w:hAnsi="Arial" w:cs="Arial"/>
-          <w:bCs/>
-          <w:color w:val="000000"/>
-          <w:sz w:val="20"/>
-          <w:szCs w:val="20"/>
-          <w:lang w:bidi="en-US"/>
-        </w:rPr>
-        <w:t>0 }}"</w:t>
-      </w:r>
-      <w:proofErr w:type="gramEnd"/>
-      <w:r>
-        <w:rPr>
-          <w:rFonts w:ascii="Arial" w:hAnsi="Arial" w:cs="Arial"/>
-          <w:bCs/>
-          <w:color w:val="000000"/>
-          <w:sz w:val="20"/>
-          <w:szCs w:val="20"/>
-          <w:lang w:bidi="en-US"/>
-        </w:rPr>
-        <w:t>/&gt;</w:t>
-      </w:r>
-    </w:p>
-    <w:p>
-      <w:pPr>
         <w:pStyle w:val="Heading1"/>
         <w:rPr>
           <w:rFonts w:ascii="Arial" w:hAnsi="Arial" w:cs="Arial"/>
@@ -1308,43 +627,6 @@
       <w:pPr>
         <w:rPr>
           <w:rFonts w:ascii="Arial" w:hAnsi="Arial" w:cs="Arial"/>
-          <w:sz w:val="20"/>
-          <w:szCs w:val="20"/>
-        </w:rPr>
-      </w:pPr>
-      <w:r>
-        <w:rPr>
-          <w:rFonts w:ascii="Arial" w:hAnsi="Arial" w:cs="Arial"/>
-          <w:sz w:val="20"/>
-          <w:szCs w:val="20"/>
-        </w:rPr>
-        <w:t>&lt;</w:t>
-      </w:r>
-      <w:proofErr w:type="spellStart"/>
-      <w:proofErr w:type="gramStart"/>
-      <w:r>
-        <w:rPr>
-          <w:rFonts w:ascii="Arial" w:hAnsi="Arial" w:cs="Arial"/>
-          <w:sz w:val="20"/>
-          <w:szCs w:val="20"/>
-        </w:rPr>
-        <w:t>w:bookmarkEnd</w:t>
-      </w:r>
-      <w:proofErr w:type="spellEnd"/>
-      <w:proofErr w:type="gramEnd"/>
-      <w:r>
-        <w:rPr>
-          <w:rFonts w:ascii="Arial" w:hAnsi="Arial" w:cs="Arial"/>
-          <w:sz w:val="20"/>
-          <w:szCs w:val="20"/>
-        </w:rPr>
-        <w:t>/&gt;</w:t>
-      </w:r>
-    </w:p>
-    <w:p>
-      <w:pPr>
-        <w:rPr>
-          <w:rFonts w:ascii="Arial" w:hAnsi="Arial" w:cs="Arial"/>
           <w:b/>
           <w:color w:val="000000"/>
           <w:sz w:val="20"/>
@@ -1366,25 +648,7 @@
           <w:rFonts w:ascii="Arial" w:hAnsi="Arial" w:cs="Arial"/>
           <w:lang w:bidi="en-US"/>
         </w:rPr>
-        <w:t xml:space="preserve">{% for article in </w:t>
-      </w:r>
-      <w:proofErr w:type="spellStart"/>
-      <w:proofErr w:type="gramStart"/>
-      <w:r>
-        <w:rPr>
-          <w:rFonts w:ascii="Arial" w:hAnsi="Arial" w:cs="Arial"/>
-          <w:lang w:bidi="en-US"/>
-        </w:rPr>
-        <w:t>section.articles</w:t>
-      </w:r>
-      <w:proofErr w:type="spellEnd"/>
-      <w:proofErr w:type="gramEnd"/>
-      <w:r>
-        <w:rPr>
-          <w:rFonts w:ascii="Arial" w:hAnsi="Arial" w:cs="Arial"/>
-          <w:lang w:bidi="en-US"/>
-        </w:rPr>
-        <w:t xml:space="preserve"> %}</w:t>
+        <w:t>{% for article in section.articles %}</w:t>
       </w:r>
     </w:p>
     <w:p>
@@ -1417,8 +681,6 @@
         </w:rPr>
         <w:t xml:space="preserve">r </w:t>
       </w:r>
-      <w:proofErr w:type="spellStart"/>
-      <w:proofErr w:type="gramStart"/>
       <w:r>
         <w:rPr>
           <w:rFonts w:ascii="Arial" w:hAnsi="Arial" w:cs="Arial"/>
@@ -1427,29 +689,7 @@
           <w:szCs w:val="20"/>
           <w:lang w:bidi="en-US"/>
         </w:rPr>
-        <w:t>article.title</w:t>
-      </w:r>
-      <w:proofErr w:type="gramEnd"/>
-      <w:r>
-        <w:rPr>
-          <w:rFonts w:ascii="Arial" w:hAnsi="Arial" w:cs="Arial"/>
-          <w:color w:val="000000" w:themeColor="text1"/>
-          <w:sz w:val="20"/>
-          <w:szCs w:val="20"/>
-          <w:lang w:bidi="en-US"/>
-        </w:rPr>
-        <w:t>_with_link</w:t>
-      </w:r>
-      <w:proofErr w:type="spellEnd"/>
-      <w:r>
-        <w:rPr>
-          <w:rFonts w:ascii="Arial" w:hAnsi="Arial" w:cs="Arial"/>
-          <w:color w:val="000000" w:themeColor="text1"/>
-          <w:sz w:val="20"/>
-          <w:szCs w:val="20"/>
-          <w:lang w:bidi="en-US"/>
-        </w:rPr>
-        <w:t>}}</w:t>
+        <w:t>article.title_with_link}}</w:t>
       </w:r>
     </w:p>
     <w:p>
@@ -1478,110 +718,35 @@
           <w:szCs w:val="20"/>
           <w:lang w:bidi="en-US"/>
         </w:rPr>
-        <w:t>{{</w:t>
-      </w:r>
-      <w:proofErr w:type="spellStart"/>
-      <w:proofErr w:type="gramStart"/>
-      <w:r>
-        <w:rPr>
-          <w:rFonts w:ascii="Arial" w:hAnsi="Arial" w:cs="Arial"/>
-          <w:sz w:val="20"/>
-          <w:szCs w:val="20"/>
-          <w:lang w:bidi="en-US"/>
-        </w:rPr>
-        <w:t>article.source</w:t>
-      </w:r>
-      <w:proofErr w:type="spellEnd"/>
-      <w:proofErr w:type="gramEnd"/>
-      <w:r>
-        <w:rPr>
-          <w:rFonts w:ascii="Arial" w:hAnsi="Arial" w:cs="Arial"/>
-          <w:sz w:val="20"/>
-          <w:szCs w:val="20"/>
-          <w:lang w:bidi="en-US"/>
-        </w:rPr>
-        <w:t>}})</w:t>
-      </w:r>
-      <w:r>
-        <w:rPr>
-          <w:rFonts w:ascii="Arial" w:hAnsi="Arial" w:cs="Arial"/>
-          <w:sz w:val="20"/>
-          <w:szCs w:val="20"/>
-          <w:lang w:bidi="en-US"/>
-        </w:rPr>
-        <w:t xml:space="preserve"> {{</w:t>
-      </w:r>
-      <w:proofErr w:type="spellStart"/>
-      <w:proofErr w:type="gramStart"/>
-      <w:r>
-        <w:rPr>
-          <w:rFonts w:ascii="Arial" w:hAnsi="Arial" w:cs="Arial"/>
-          <w:sz w:val="20"/>
-          <w:szCs w:val="20"/>
-          <w:lang w:bidi="en-US"/>
-        </w:rPr>
-        <w:t>article.date</w:t>
-      </w:r>
-      <w:proofErr w:type="spellEnd"/>
-      <w:proofErr w:type="gramEnd"/>
-      <w:r>
-        <w:rPr>
-          <w:rFonts w:ascii="Arial" w:hAnsi="Arial" w:cs="Arial"/>
-          <w:sz w:val="20"/>
-          <w:szCs w:val="20"/>
-          <w:lang w:bidi="en-US"/>
-        </w:rPr>
-        <w:t>}}</w:t>
-      </w:r>
-    </w:p>
-    <w:p>
-      <w:pPr>
-        <w:rPr>
-          <w:rFonts w:ascii="Arial" w:hAnsi="Arial" w:cs="Arial"/>
-          <w:sz w:val="20"/>
-          <w:szCs w:val="20"/>
-          <w:lang w:bidi="en-US"/>
-        </w:rPr>
-      </w:pPr>
-      <w:r>
-        <w:rPr>
-          <w:rFonts w:ascii="Arial" w:hAnsi="Arial" w:cs="Arial"/>
-          <w:sz w:val="20"/>
-          <w:szCs w:val="20"/>
-          <w:lang w:bidi="en-US"/>
-        </w:rPr>
-        <w:t>{{</w:t>
-      </w:r>
-      <w:proofErr w:type="spellStart"/>
-      <w:proofErr w:type="gramStart"/>
-      <w:r>
-        <w:rPr>
-          <w:rFonts w:ascii="Arial" w:hAnsi="Arial" w:cs="Arial"/>
-          <w:sz w:val="20"/>
-          <w:szCs w:val="20"/>
-          <w:lang w:bidi="en-US"/>
-        </w:rPr>
-        <w:t>article.full</w:t>
-      </w:r>
-      <w:proofErr w:type="gramEnd"/>
-      <w:r>
-        <w:rPr>
-          <w:rFonts w:ascii="Arial" w:hAnsi="Arial" w:cs="Arial"/>
-          <w:sz w:val="20"/>
-          <w:szCs w:val="20"/>
-          <w:lang w:bidi="en-US"/>
-        </w:rPr>
-        <w:t>_text</w:t>
-      </w:r>
-      <w:proofErr w:type="spellEnd"/>
-      <w:r>
-        <w:rPr>
-          <w:rFonts w:ascii="Arial" w:hAnsi="Arial" w:cs="Arial"/>
-          <w:sz w:val="20"/>
-          <w:szCs w:val="20"/>
-          <w:lang w:bidi="en-US"/>
-        </w:rPr>
-        <w:t>}}</w:t>
+        <w:t>{{article.source}})</w:t>
+      </w:r>
+      <w:r>
+        <w:rPr>
+          <w:rFonts w:ascii="Arial" w:hAnsi="Arial" w:cs="Arial"/>
+          <w:sz w:val="20"/>
+          <w:szCs w:val="20"/>
+          <w:lang w:bidi="en-US"/>
+        </w:rPr>
+        <w:t xml:space="preserve"> {{article.date}}</w:t>
+      </w:r>
+    </w:p>
+    <w:p>
+      <w:pPr>
+        <w:rPr>
+          <w:rFonts w:ascii="Arial" w:hAnsi="Arial" w:cs="Arial"/>
+          <w:sz w:val="20"/>
+          <w:szCs w:val="20"/>
+          <w:lang w:bidi="en-US"/>
+        </w:rPr>
+      </w:pPr>
+      <w:r>
+        <w:rPr>
+          <w:rFonts w:ascii="Arial" w:hAnsi="Arial" w:cs="Arial"/>
+          <w:sz w:val="20"/>
+          <w:szCs w:val="20"/>
+          <w:lang w:bidi="en-US"/>
+        </w:rPr>
+        <w:t>{{article.full_text}}</w:t>
       </w:r>
     </w:p>
     <w:p>
@@ -1602,197 +767,60 @@
           <w:szCs w:val="18"/>
         </w:rPr>
       </w:pPr>
-      <w:r>
-        <w:rPr>
-          <w:rFonts w:ascii="Arial" w:hAnsi="Arial" w:cs="Arial"/>
-          <w:b/>
-          <w:bCs/>
-          <w:color w:val="3D0DFF"/>
+      <w:hyperlink w:anchor="_top" w:history="1">
+        <w:r>
+          <w:rPr>
+            <w:rStyle w:val="Hyperlink"/>
+            <w:rFonts w:ascii="Arial" w:hAnsi="Arial" w:cs="Arial"/>
+            <w:b/>
+            <w:sz w:val="18"/>
+            <w:szCs w:val="18"/>
+            <w:lang w:bidi="en-US"/>
+          </w:rPr>
+          <w:t>Back to Summaries</w:t>
+        </w:r>
+      </w:hyperlink>
+    </w:p>
+    <w:p>
+      <w:pPr>
+        <w:rPr>
+          <w:rFonts w:ascii="Arial" w:hAnsi="Arial" w:cs="Arial"/>
           <w:sz w:val="18"/>
           <w:szCs w:val="18"/>
-          <w:u w:val="single"/>
-        </w:rPr>
-        <w:t>{{</w:t>
-      </w:r>
-      <w:r>
-        <w:rPr>
-          <w:rFonts w:ascii="Arial" w:hAnsi="Arial" w:cs="Arial"/>
-          <w:b/>
+        </w:rPr>
+      </w:pPr>
+    </w:p>
+    <w:p>
+      <w:pPr>
+        <w:rPr>
+          <w:rFonts w:ascii="Arial" w:hAnsi="Arial" w:cs="Arial"/>
+          <w:lang w:bidi="en-US"/>
+        </w:rPr>
+      </w:pPr>
+      <w:r>
+        <w:rPr>
+          <w:rFonts w:ascii="Arial" w:hAnsi="Arial" w:cs="Arial"/>
+          <w:lang w:bidi="en-US"/>
+        </w:rPr>
+        <w:t>{% endfor %}</w:t>
+      </w:r>
+    </w:p>
+    <w:p>
+      <w:pPr>
+        <w:rPr>
+          <w:rFonts w:ascii="Arial" w:hAnsi="Arial" w:cs="Arial"/>
+        </w:rPr>
+      </w:pPr>
+      <w:r>
+        <w:rPr>
+          <w:rFonts w:ascii="Arial" w:hAnsi="Arial" w:cs="Arial"/>
           <w:bCs/>
-          <w:color w:val="3D0DFF"/>
-          <w:sz w:val="18"/>
-          <w:szCs w:val="18"/>
-          <w:u w:val="single"/>
-        </w:rPr>
-        <w:t xml:space="preserve"> </w:t>
-      </w:r>
-      <w:proofErr w:type="spellStart"/>
-      <w:r>
-        <w:rPr>
-          <w:rFonts w:ascii="Arial" w:hAnsi="Arial" w:cs="Arial"/>
-          <w:b/>
-          <w:bCs/>
-          <w:color w:val="3D0DFF"/>
-          <w:sz w:val="18"/>
-          <w:szCs w:val="18"/>
-          <w:u w:val="single"/>
-        </w:rPr>
-        <w:t>make_link</w:t>
-      </w:r>
-      <w:proofErr w:type="spellEnd"/>
-      <w:r>
-        <w:rPr>
-          <w:rFonts w:ascii="Arial" w:hAnsi="Arial" w:cs="Arial"/>
-          <w:b/>
-          <w:bCs/>
-          <w:color w:val="3D0DFF"/>
-          <w:sz w:val="18"/>
-          <w:szCs w:val="18"/>
-          <w:u w:val="single"/>
-        </w:rPr>
-        <w:t>(“</w:t>
-      </w:r>
-      <w:r>
-        <w:rPr>
-          <w:rFonts w:ascii="Arial" w:hAnsi="Arial" w:cs="Arial"/>
-          <w:b/>
-          <w:bCs/>
-          <w:color w:val="3D0DFF"/>
-          <w:sz w:val="18"/>
-          <w:szCs w:val="18"/>
-          <w:u w:val="single"/>
-        </w:rPr>
-        <w:t>Back to Summaries</w:t>
-      </w:r>
-      <w:r>
-        <w:rPr>
-          <w:rFonts w:ascii="Arial" w:hAnsi="Arial" w:cs="Arial"/>
-          <w:b/>
-          <w:bCs/>
-          <w:color w:val="3D0DFF"/>
-          <w:sz w:val="18"/>
-          <w:szCs w:val="18"/>
-          <w:u w:val="single"/>
-        </w:rPr>
-        <w:t>”, “</w:t>
-      </w:r>
-      <w:r>
-        <w:rPr>
-          <w:rFonts w:ascii="Arial" w:hAnsi="Arial" w:cs="Arial"/>
-          <w:b/>
-          <w:bCs/>
-          <w:color w:val="3D0DFF"/>
-          <w:sz w:val="18"/>
-          <w:szCs w:val="18"/>
-          <w:u w:val="single"/>
-        </w:rPr>
-        <w:t>summaries</w:t>
-      </w:r>
-      <w:r>
-        <w:rPr>
-          <w:rFonts w:ascii="Arial" w:hAnsi="Arial" w:cs="Arial"/>
-          <w:b/>
-          <w:bCs/>
-          <w:color w:val="3D0DFF"/>
-          <w:sz w:val="18"/>
-          <w:szCs w:val="18"/>
-          <w:u w:val="single"/>
-        </w:rPr>
-        <w:t xml:space="preserve">_” ~ loop.index0) </w:t>
-      </w:r>
-      <w:r>
-        <w:rPr>
-          <w:rFonts w:ascii="Arial" w:hAnsi="Arial" w:cs="Arial"/>
-          <w:b/>
-          <w:bCs/>
-          <w:color w:val="3D0DFF"/>
-          <w:sz w:val="18"/>
-          <w:szCs w:val="18"/>
-          <w:u w:val="single"/>
-        </w:rPr>
-        <w:t>}}</w:t>
-      </w:r>
-    </w:p>
-    <w:p>
-      <w:pPr>
-        <w:rPr>
-          <w:rFonts w:ascii="Arial" w:hAnsi="Arial" w:cs="Arial"/>
-          <w:sz w:val="18"/>
-          <w:szCs w:val="18"/>
-        </w:rPr>
-      </w:pPr>
-    </w:p>
-    <w:p>
-      <w:pPr>
-        <w:rPr>
-          <w:rFonts w:ascii="Arial" w:hAnsi="Arial" w:cs="Arial"/>
-          <w:lang w:bidi="en-US"/>
-        </w:rPr>
-      </w:pPr>
-      <w:r>
-        <w:rPr>
-          <w:rFonts w:ascii="Arial" w:hAnsi="Arial" w:cs="Arial"/>
-          <w:lang w:bidi="en-US"/>
-        </w:rPr>
-        <w:t xml:space="preserve">{% </w:t>
-      </w:r>
-      <w:proofErr w:type="spellStart"/>
-      <w:r>
-        <w:rPr>
-          <w:rFonts w:ascii="Arial" w:hAnsi="Arial" w:cs="Arial"/>
-          <w:lang w:bidi="en-US"/>
-        </w:rPr>
-        <w:t>endfor</w:t>
-      </w:r>
-      <w:proofErr w:type="spellEnd"/>
-      <w:r>
-        <w:rPr>
-          <w:rFonts w:ascii="Arial" w:hAnsi="Arial" w:cs="Arial"/>
-          <w:lang w:bidi="en-US"/>
-        </w:rPr>
-        <w:t xml:space="preserve"> %}</w:t>
-      </w:r>
-    </w:p>
-    <w:p>
-      <w:pPr>
-        <w:rPr>
-          <w:rFonts w:ascii="Arial" w:hAnsi="Arial" w:cs="Arial"/>
-        </w:rPr>
-      </w:pPr>
-      <w:r>
-        <w:rPr>
-          <w:rFonts w:ascii="Arial" w:hAnsi="Arial" w:cs="Arial"/>
-          <w:bCs/>
-          <w:color w:val="000000"/>
-          <w:sz w:val="20"/>
-          <w:szCs w:val="20"/>
-          <w:lang w:bidi="en-US"/>
-        </w:rPr>
-        <w:t xml:space="preserve">{% </w:t>
-      </w:r>
-      <w:proofErr w:type="spellStart"/>
-      <w:r>
-        <w:rPr>
-          <w:rFonts w:ascii="Arial" w:hAnsi="Arial" w:cs="Arial"/>
-          <w:bCs/>
-          <w:color w:val="000000"/>
-          <w:sz w:val="20"/>
-          <w:szCs w:val="20"/>
-          <w:lang w:bidi="en-US"/>
-        </w:rPr>
-        <w:t>endfor</w:t>
-      </w:r>
-      <w:proofErr w:type="spellEnd"/>
-      <w:r>
-        <w:rPr>
-          <w:rFonts w:ascii="Arial" w:hAnsi="Arial" w:cs="Arial"/>
-          <w:bCs/>
-          <w:color w:val="000000"/>
-          <w:sz w:val="20"/>
-          <w:szCs w:val="20"/>
-          <w:lang w:bidi="en-US"/>
-        </w:rPr>
-        <w:t xml:space="preserve"> %}</w:t>
+          <w:color w:val="000000"/>
+          <w:sz w:val="20"/>
+          <w:szCs w:val="20"/>
+          <w:lang w:bidi="en-US"/>
+        </w:rPr>
+        <w:t>{% endfor %}</w:t>
       </w:r>
     </w:p>
     <w:p>
@@ -4136,32 +3164,6 @@
 </file>
 
 <file path=customXml/item1.xml><?xml version="1.0" encoding="utf-8"?>
-<?mso-contentType ?>
-<FormTemplates xmlns="http://schemas.microsoft.com/sharepoint/v3/contenttype/forms">
-  <Display>DocumentLibraryForm</Display>
-  <Edit>DocumentLibraryForm</Edit>
-  <New>DocumentLibraryForm</New>
-</FormTemplates>
-</file>
-
-<file path=customXml/item2.xml><?xml version="1.0" encoding="utf-8"?>
-<p:properties xmlns:p="http://schemas.microsoft.com/office/2006/metadata/properties" xmlns:xsi="http://www.w3.org/2001/XMLSchema-instance" xmlns:pc="http://schemas.microsoft.com/office/infopath/2007/PartnerControls">
-  <documentManagement>
-    <TaxCatchAll xmlns="38d2a309-d798-495b-b1a3-e97c37808eef"/>
-    <_ip_UnifiedCompliancePolicyUIAction xmlns="http://schemas.microsoft.com/sharepoint/v3" xsi:nil="true"/>
-    <_ip_UnifiedCompliancePolicyProperties xmlns="http://schemas.microsoft.com/sharepoint/v3" xsi:nil="true"/>
-    <lcf76f155ced4ddcb4097134ff3c332f xmlns="416eecfc-56a7-4354-8013-4a2d9c92e153">
-      <Terms xmlns="http://schemas.microsoft.com/office/infopath/2007/PartnerControls"/>
-    </lcf76f155ced4ddcb4097134ff3c332f>
-  </documentManagement>
-</p:properties>
-</file>
-
-<file path=customXml/item3.xml><?xml version="1.0" encoding="utf-8"?>
-<b:Sources xmlns:b="http://schemas.openxmlformats.org/officeDocument/2006/bibliography" xmlns="http://schemas.openxmlformats.org/officeDocument/2006/bibliography" SelectedStyle="\APA.XSL" StyleName="APA"/>
-</file>
-
-<file path=customXml/item4.xml><?xml version="1.0" encoding="utf-8"?>
 <ct:contentTypeSchema xmlns:ct="http://schemas.microsoft.com/office/2006/metadata/contentType" xmlns:ma="http://schemas.microsoft.com/office/2006/metadata/properties/metaAttributes" ct:_="" ma:_="" ma:contentTypeName="Document" ma:contentTypeID="0x010100E48B1925F2EFB241960044EC5F64C034" ma:contentTypeVersion="16" ma:contentTypeDescription="Create a new document." ma:contentTypeScope="" ma:versionID="b193f1a1adb628ee5f7d642c4cb4fead">
   <xsd:schema xmlns:xsd="http://www.w3.org/2001/XMLSchema" xmlns:xs="http://www.w3.org/2001/XMLSchema" xmlns:p="http://schemas.microsoft.com/office/2006/metadata/properties" xmlns:ns1="http://schemas.microsoft.com/sharepoint/v3" xmlns:ns2="416eecfc-56a7-4354-8013-4a2d9c92e153" xmlns:ns3="38d2a309-d798-495b-b1a3-e97c37808eef" targetNamespace="http://schemas.microsoft.com/office/2006/metadata/properties" ma:root="true" ma:fieldsID="f4c72206c132b1461c2865266b50231c" ns1:_="" ns2:_="" ns3:_="">
     <xsd:import namespace="http://schemas.microsoft.com/sharepoint/v3"/>
@@ -4407,35 +3409,33 @@
 </ct:contentTypeSchema>
 </file>
 
-<file path=customXml/itemProps1.xml><?xml version="1.0" encoding="utf-8"?>
-<ds:datastoreItem xmlns:ds="http://schemas.openxmlformats.org/officeDocument/2006/customXml" ds:itemID="{2ACA00A0-0EB9-4F25-B1A0-9480A1DEA0B5}">
-  <ds:schemaRefs>
-    <ds:schemaRef ds:uri="http://schemas.microsoft.com/sharepoint/v3/contenttype/forms"/>
-  </ds:schemaRefs>
-</ds:datastoreItem>
+<file path=customXml/item2.xml><?xml version="1.0" encoding="utf-8"?>
+<b:Sources xmlns:b="http://schemas.openxmlformats.org/officeDocument/2006/bibliography" xmlns="http://schemas.openxmlformats.org/officeDocument/2006/bibliography" SelectedStyle="\APA.XSL" StyleName="APA"/>
 </file>
 
-<file path=customXml/itemProps2.xml><?xml version="1.0" encoding="utf-8"?>
-<ds:datastoreItem xmlns:ds="http://schemas.openxmlformats.org/officeDocument/2006/customXml" ds:itemID="{5D491C04-0035-45EA-BE2E-2976A5F7A397}">
-  <ds:schemaRefs>
-    <ds:schemaRef ds:uri="http://schemas.microsoft.com/office/2006/metadata/properties"/>
-    <ds:schemaRef ds:uri="http://schemas.microsoft.com/office/infopath/2007/PartnerControls"/>
-    <ds:schemaRef ds:uri="38d2a309-d798-495b-b1a3-e97c37808eef"/>
-    <ds:schemaRef ds:uri="http://schemas.microsoft.com/sharepoint/v3"/>
-    <ds:schemaRef ds:uri="416eecfc-56a7-4354-8013-4a2d9c92e153"/>
-  </ds:schemaRefs>
-</ds:datastoreItem>
+<file path=customXml/item3.xml><?xml version="1.0" encoding="utf-8"?>
+<p:properties xmlns:p="http://schemas.microsoft.com/office/2006/metadata/properties" xmlns:xsi="http://www.w3.org/2001/XMLSchema-instance" xmlns:pc="http://schemas.microsoft.com/office/infopath/2007/PartnerControls">
+  <documentManagement>
+    <TaxCatchAll xmlns="38d2a309-d798-495b-b1a3-e97c37808eef"/>
+    <_ip_UnifiedCompliancePolicyUIAction xmlns="http://schemas.microsoft.com/sharepoint/v3" xsi:nil="true"/>
+    <_ip_UnifiedCompliancePolicyProperties xmlns="http://schemas.microsoft.com/sharepoint/v3" xsi:nil="true"/>
+    <lcf76f155ced4ddcb4097134ff3c332f xmlns="416eecfc-56a7-4354-8013-4a2d9c92e153">
+      <Terms xmlns="http://schemas.microsoft.com/office/infopath/2007/PartnerControls"/>
+    </lcf76f155ced4ddcb4097134ff3c332f>
+  </documentManagement>
+</p:properties>
 </file>
 
-<file path=customXml/itemProps3.xml><?xml version="1.0" encoding="utf-8"?>
-<ds:datastoreItem xmlns:ds="http://schemas.openxmlformats.org/officeDocument/2006/customXml" ds:itemID="{4202E056-596C-4D43-866F-DBCC294656E0}">
-  <ds:schemaRefs>
-    <ds:schemaRef ds:uri="http://schemas.openxmlformats.org/officeDocument/2006/bibliography"/>
-  </ds:schemaRefs>
-</ds:datastoreItem>
+<file path=customXml/item4.xml><?xml version="1.0" encoding="utf-8"?>
+<?mso-contentType ?>
+<FormTemplates xmlns="http://schemas.microsoft.com/sharepoint/v3/contenttype/forms">
+  <Display>DocumentLibraryForm</Display>
+  <Edit>DocumentLibraryForm</Edit>
+  <New>DocumentLibraryForm</New>
+</FormTemplates>
 </file>
 
-<file path=customXml/itemProps4.xml><?xml version="1.0" encoding="utf-8"?>
+<file path=customXml/itemProps1.xml><?xml version="1.0" encoding="utf-8"?>
 <ds:datastoreItem xmlns:ds="http://schemas.openxmlformats.org/officeDocument/2006/customXml" ds:itemID="{3AA634C4-AFF1-45A4-BEEC-3BC128C36838}">
   <ds:schemaRefs>
     <ds:schemaRef ds:uri="http://schemas.microsoft.com/office/2006/metadata/contentType"/>
@@ -4455,6 +3455,34 @@
 </ds:datastoreItem>
 </file>
 
+<file path=customXml/itemProps2.xml><?xml version="1.0" encoding="utf-8"?>
+<ds:datastoreItem xmlns:ds="http://schemas.openxmlformats.org/officeDocument/2006/customXml" ds:itemID="{4202E056-596C-4D43-866F-DBCC294656E0}">
+  <ds:schemaRefs>
+    <ds:schemaRef ds:uri="http://schemas.openxmlformats.org/officeDocument/2006/bibliography"/>
+  </ds:schemaRefs>
+</ds:datastoreItem>
+</file>
+
+<file path=customXml/itemProps3.xml><?xml version="1.0" encoding="utf-8"?>
+<ds:datastoreItem xmlns:ds="http://schemas.openxmlformats.org/officeDocument/2006/customXml" ds:itemID="{5D491C04-0035-45EA-BE2E-2976A5F7A397}">
+  <ds:schemaRefs>
+    <ds:schemaRef ds:uri="http://schemas.microsoft.com/office/2006/metadata/properties"/>
+    <ds:schemaRef ds:uri="http://schemas.microsoft.com/office/infopath/2007/PartnerControls"/>
+    <ds:schemaRef ds:uri="38d2a309-d798-495b-b1a3-e97c37808eef"/>
+    <ds:schemaRef ds:uri="http://schemas.microsoft.com/sharepoint/v3"/>
+    <ds:schemaRef ds:uri="416eecfc-56a7-4354-8013-4a2d9c92e153"/>
+  </ds:schemaRefs>
+</ds:datastoreItem>
+</file>
+
+<file path=customXml/itemProps4.xml><?xml version="1.0" encoding="utf-8"?>
+<ds:datastoreItem xmlns:ds="http://schemas.openxmlformats.org/officeDocument/2006/customXml" ds:itemID="{2ACA00A0-0EB9-4F25-B1A0-9480A1DEA0B5}">
+  <ds:schemaRefs>
+    <ds:schemaRef ds:uri="http://schemas.microsoft.com/sharepoint/v3/contenttype/forms"/>
+  </ds:schemaRefs>
+</ds:datastoreItem>
+</file>
+
 <file path=docMetadata/LabelInfo.xml><?xml version="1.0" encoding="utf-8"?>
 <clbl:labelList xmlns:clbl="http://schemas.microsoft.com/office/2020/mipLabelMetadata">
   <clbl:label id="{3de9faa6-9fe1-49b3-9a08-227a296b54a6}" enabled="1" method="Privileged" siteId="{66d73691-ea97-48b1-95d5-e94f0a46b878}" contentBits="0" removed="0"/>

</xml_diff>

<commit_message>
Update default report template
</commit_message>
<xml_diff>
--- a/app/assets/default_template.docx
+++ b/app/assets/default_template.docx
@@ -1,12 +1,120 @@
 
 <file path=word/document.xml><?xml version="1.0" encoding="utf-8"?>
-<w:document xmlns:wpc="http://schemas.microsoft.com/office/word/2010/wordprocessingCanvas" xmlns:cx="http://schemas.microsoft.com/office/drawing/2014/chartex" xmlns:cx1="http://schemas.microsoft.com/office/drawing/2015/9/8/chartex" xmlns:cx2="http://schemas.microsoft.com/office/drawing/2015/10/21/chartex" xmlns:cx3="http://schemas.microsoft.com/office/drawing/2016/5/9/chartex" xmlns:cx4="http://schemas.microsoft.com/office/drawing/2016/5/10/chartex" xmlns:cx5="http://schemas.microsoft.com/office/drawing/2016/5/11/chartex" xmlns:cx6="http://schemas.microsoft.com/office/drawing/2016/5/12/chartex" xmlns:cx7="http://schemas.microsoft.com/office/drawing/2016/5/13/chartex" xmlns:cx8="http://schemas.microsoft.com/office/drawing/2016/5/14/chartex" xmlns:mc="http://schemas.openxmlformats.org/markup-compatibility/2006" xmlns:m="http://schemas.openxmlformats.org/officeDocument/2006/math" xmlns:aink="http://schemas.microsoft.com/office/drawing/2016/ink" xmlns:am3d="http://schemas.microsoft.com/office/drawing/2017/model3d" xmlns:oel="http://schemas.microsoft.com/office/2019/extlst" xmlns:r="http://schemas.openxmlformats.org/officeDocument/2006/relationships" xmlns:wp14="http://schemas.microsoft.com/office/word/2010/wordprocessingDrawing" xmlns:wp="http://schemas.openxmlformats.org/drawingml/2006/wordprocessingDrawing" xmlns:wpg="http://schemas.microsoft.com/office/word/2010/wordprocessingGroup" xmlns:wpi="http://schemas.microsoft.com/office/word/2010/wordprocessingInk" xmlns:wps="http://schemas.microsoft.com/office/word/2010/wordprocessingShape" xmlns:o="urn:schemas-microsoft-com:office:office" xmlns:v="urn:schemas-microsoft-com:vml" xmlns:w10="urn:schemas-microsoft-com:office:word" xmlns:w="http://schemas.openxmlformats.org/wordprocessingml/2006/main" xmlns:w14="http://schemas.microsoft.com/office/word/2010/wordml" xmlns:w15="http://schemas.microsoft.com/office/word/2012/wordml" xmlns:w16cex="http://schemas.microsoft.com/office/word/2018/wordml/cex" xmlns:w16cid="http://schemas.microsoft.com/office/word/2016/wordml/cid" xmlns:w16="http://schemas.microsoft.com/office/word/2018/wordml" xmlns:w16sdtdh="http://schemas.microsoft.com/office/word/2020/wordml/sdtdatahash" xmlns:w16sdtfl="http://schemas.microsoft.com/office/word/2024/wordml/sdtformatlock" xmlns:w16se="http://schemas.microsoft.com/office/word/2015/wordml/symex" xmlns:w16du="http://schemas.microsoft.com/office/word/2023/wordml/word16du" xmlns:wne="http://schemas.microsoft.com/office/word/2006/wordml" mc:Ignorable="w14 w15 w16se w16cid w16 w16cex w16sdtdh w16sdtfl w16du wp14">
+<w:document xmlns:wpc="http://schemas.microsoft.com/office/word/2010/wordprocessingCanvas" xmlns:cx="http://schemas.microsoft.com/office/drawing/2014/chartex" xmlns:cx1="http://schemas.microsoft.com/office/drawing/2015/9/8/chartex" xmlns:cx2="http://schemas.microsoft.com/office/drawing/2015/10/21/chartex" xmlns:cx3="http://schemas.microsoft.com/office/drawing/2016/5/9/chartex" xmlns:cx4="http://schemas.microsoft.com/office/drawing/2016/5/10/chartex" xmlns:cx5="http://schemas.microsoft.com/office/drawing/2016/5/11/chartex" xmlns:cx6="http://schemas.microsoft.com/office/drawing/2016/5/12/chartex" xmlns:cx7="http://schemas.microsoft.com/office/drawing/2016/5/13/chartex" xmlns:cx8="http://schemas.microsoft.com/office/drawing/2016/5/14/chartex" xmlns:mc="http://schemas.openxmlformats.org/markup-compatibility/2006" xmlns:aink="http://schemas.microsoft.com/office/drawing/2016/ink" xmlns:am3d="http://schemas.microsoft.com/office/drawing/2017/model3d" xmlns:o="urn:schemas-microsoft-com:office:office" xmlns:oel="http://schemas.microsoft.com/office/2019/extlst" xmlns:r="http://schemas.openxmlformats.org/officeDocument/2006/relationships" xmlns:m="http://schemas.openxmlformats.org/officeDocument/2006/math" xmlns:v="urn:schemas-microsoft-com:vml" xmlns:wp14="http://schemas.microsoft.com/office/word/2010/wordprocessingDrawing" xmlns:wp="http://schemas.openxmlformats.org/drawingml/2006/wordprocessingDrawing" xmlns:w10="urn:schemas-microsoft-com:office:word" xmlns:w="http://schemas.openxmlformats.org/wordprocessingml/2006/main" xmlns:w14="http://schemas.microsoft.com/office/word/2010/wordml" xmlns:w15="http://schemas.microsoft.com/office/word/2012/wordml" xmlns:w16cex="http://schemas.microsoft.com/office/word/2018/wordml/cex" xmlns:w16cid="http://schemas.microsoft.com/office/word/2016/wordml/cid" xmlns:w16="http://schemas.microsoft.com/office/word/2018/wordml" xmlns:w16du="http://schemas.microsoft.com/office/word/2023/wordml/word16du" xmlns:w16sdtdh="http://schemas.microsoft.com/office/word/2020/wordml/sdtdatahash" xmlns:w16sdtfl="http://schemas.microsoft.com/office/word/2024/wordml/sdtformatlock" xmlns:w16se="http://schemas.microsoft.com/office/word/2015/wordml/symex" xmlns:wpg="http://schemas.microsoft.com/office/word/2010/wordprocessingGroup" xmlns:wpi="http://schemas.microsoft.com/office/word/2010/wordprocessingInk" xmlns:wne="http://schemas.microsoft.com/office/word/2006/wordml" xmlns:wps="http://schemas.microsoft.com/office/word/2010/wordprocessingShape" mc:Ignorable="w14 w15 w16se w16cid w16 w16cex w16sdtdh w16sdtfl w16du wp14">
   <w:body>
     <w:p>
       <w:pPr>
         <w:jc w:val="center"/>
         <w:rPr>
           <w:rFonts w:ascii="Arial" w:hAnsi="Arial" w:cs="Arial"/>
+          <w:color w:val="000000"/>
+          <w:sz w:val="20"/>
+          <w:lang w:bidi="en-US"/>
+        </w:rPr>
+      </w:pPr>
+      <w:r>
+        <w:rPr>
+          <w:noProof/>
+        </w:rPr>
+        <mc:AlternateContent>
+          <mc:Choice Requires="wpg">
+            <w:drawing>
+              <wp:anchor distT="0" distB="0" distL="114300" distR="114300" simplePos="0" relativeHeight="251659264" behindDoc="0" locked="0" layoutInCell="1" allowOverlap="1" wp14:anchorId="274F378E" wp14:editId="6787CBF1">
+                <wp:simplePos x="0" y="0"/>
+                <wp:positionH relativeFrom="column">
+                  <wp:posOffset>-228600</wp:posOffset>
+                </wp:positionH>
+                <wp:positionV relativeFrom="paragraph">
+                  <wp:posOffset>139065</wp:posOffset>
+                </wp:positionV>
+                <wp:extent cx="5715000" cy="49530"/>
+                <wp:effectExtent l="0" t="38100" r="38100" b="45720"/>
+                <wp:wrapNone/>
+                <wp:docPr id="7" name="Group 11"/>
+                <wp:cNvGraphicFramePr>
+                  <a:graphicFrameLocks xmlns:a="http://schemas.openxmlformats.org/drawingml/2006/main"/>
+                </wp:cNvGraphicFramePr>
+                <a:graphic xmlns:a="http://schemas.openxmlformats.org/drawingml/2006/main">
+                  <a:graphicData uri="http://schemas.microsoft.com/office/word/2010/wordprocessingGroup">
+                    <wpg:wgp>
+                      <wpg:cNvGrpSpPr>
+                        <a:grpSpLocks/>
+                      </wpg:cNvGrpSpPr>
+                      <wpg:grpSpPr bwMode="auto">
+                        <a:xfrm>
+                          <a:off x="0" y="0"/>
+                          <a:ext cx="5715000" cy="49530"/>
+                          <a:chOff x="990600" y="730250"/>
+                          <a:chExt cx="6858000" cy="108099"/>
+                        </a:xfrm>
+                      </wpg:grpSpPr>
+                      <wps:wsp>
+                        <wps:cNvPr id="8" name="Straight Connector 8"/>
+                        <wps:cNvCnPr/>
+                        <wps:spPr>
+                          <a:xfrm>
+                            <a:off x="990600" y="730250"/>
+                            <a:ext cx="6858000" cy="0"/>
+                          </a:xfrm>
+                          <a:prstGeom prst="line">
+                            <a:avLst/>
+                          </a:prstGeom>
+                          <a:noFill/>
+                          <a:ln w="76200" cap="flat" cmpd="sng" algn="ctr">
+                            <a:solidFill>
+                              <a:srgbClr val="FFC000"/>
+                            </a:solidFill>
+                            <a:prstDash val="solid"/>
+                          </a:ln>
+                          <a:effectLst/>
+                        </wps:spPr>
+                        <wps:bodyPr/>
+                      </wps:wsp>
+                      <wps:wsp>
+                        <wps:cNvPr id="9" name="Straight Connector 9"/>
+                        <wps:cNvCnPr/>
+                        <wps:spPr>
+                          <a:xfrm>
+                            <a:off x="990600" y="838349"/>
+                            <a:ext cx="6858000" cy="0"/>
+                          </a:xfrm>
+                          <a:prstGeom prst="line">
+                            <a:avLst/>
+                          </a:prstGeom>
+                          <a:noFill/>
+                          <a:ln w="76200" cap="flat" cmpd="sng" algn="ctr">
+                            <a:solidFill>
+                              <a:sysClr val="windowText" lastClr="000000"/>
+                            </a:solidFill>
+                            <a:prstDash val="solid"/>
+                          </a:ln>
+                          <a:effectLst/>
+                        </wps:spPr>
+                        <wps:bodyPr/>
+                      </wps:wsp>
+                    </wpg:wgp>
+                  </a:graphicData>
+                </a:graphic>
+              </wp:anchor>
+            </w:drawing>
+          </mc:Choice>
+          <mc:Fallback>
+            <w:pict>
+              <v:group w14:anchorId="08AC1105" id="Group 11" o:spid="_x0000_s1026" style="position:absolute;margin-left:-18pt;margin-top:10.95pt;width:450pt;height:3.9pt;z-index:251659264" coordorigin="9906,7302" coordsize="68580,1080" o:gfxdata="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">
+                <v:line id="Straight Connector 8" o:spid="_x0000_s1027" style="position:absolute;visibility:visible;mso-wrap-style:square" from="9906,7302" to="78486,7302" o:connectortype="straight" o:gfxdata="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" strokecolor="#ffc000" strokeweight="6pt"/>
+                <v:line id="Straight Connector 9" o:spid="_x0000_s1028" style="position:absolute;visibility:visible;mso-wrap-style:square" from="9906,8383" to="78486,8383" o:connectortype="straight" o:gfxdata="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" strokecolor="windowText" strokeweight="6pt"/>
+              </v:group>
+            </w:pict>
+          </mc:Fallback>
+        </mc:AlternateContent>
+      </w:r>
+    </w:p>
+    <w:p>
+      <w:pPr>
+        <w:jc w:val="center"/>
+        <w:rPr>
+          <w:rFonts w:ascii="Arial" w:hAnsi="Arial" w:cs="Arial"/>
+          <w:b/>
           <w:color w:val="000000"/>
           <w:sz w:val="20"/>
           <w:lang w:bidi="en-US"/>
@@ -14,18 +122,6 @@
       </w:pPr>
       <w:bookmarkStart w:id="0" w:name="_top"/>
       <w:bookmarkEnd w:id="0"/>
-    </w:p>
-    <w:p>
-      <w:pPr>
-        <w:jc w:val="center"/>
-        <w:rPr>
-          <w:rFonts w:ascii="Arial" w:hAnsi="Arial" w:cs="Arial"/>
-          <w:b/>
-          <w:color w:val="000000"/>
-          <w:sz w:val="20"/>
-          <w:lang w:bidi="en-US"/>
-        </w:rPr>
-      </w:pPr>
     </w:p>
     <w:p>
       <w:pPr>
@@ -975,12 +1071,10 @@
       </w:pPr>
     </w:p>
     <w:sectPr>
-      <w:headerReference w:type="even" r:id="rId11"/>
-      <w:headerReference w:type="default" r:id="rId12"/>
-      <w:footerReference w:type="even" r:id="rId13"/>
-      <w:footerReference w:type="default" r:id="rId14"/>
-      <w:headerReference w:type="first" r:id="rId15"/>
-      <w:footerReference w:type="first" r:id="rId16"/>
+      <w:headerReference w:type="default" r:id="rId11"/>
+      <w:footerReference w:type="default" r:id="rId12"/>
+      <w:headerReference w:type="first" r:id="rId13"/>
+      <w:footerReference w:type="first" r:id="rId14"/>
       <w:pgSz w:w="12240" w:h="15840" w:code="1"/>
       <w:pgMar w:top="1440" w:right="1440" w:bottom="1080" w:left="1800" w:header="0" w:footer="720" w:gutter="0"/>
       <w:cols w:space="720"/>
@@ -992,7 +1086,7 @@
 </file>
 
 <file path=word/endnotes.xml><?xml version="1.0" encoding="utf-8"?>
-<w:endnotes xmlns:wpc="http://schemas.microsoft.com/office/word/2010/wordprocessingCanvas" xmlns:cx="http://schemas.microsoft.com/office/drawing/2014/chartex" xmlns:cx1="http://schemas.microsoft.com/office/drawing/2015/9/8/chartex" xmlns:cx2="http://schemas.microsoft.com/office/drawing/2015/10/21/chartex" xmlns:cx3="http://schemas.microsoft.com/office/drawing/2016/5/9/chartex" xmlns:cx4="http://schemas.microsoft.com/office/drawing/2016/5/10/chartex" xmlns:cx5="http://schemas.microsoft.com/office/drawing/2016/5/11/chartex" xmlns:cx6="http://schemas.microsoft.com/office/drawing/2016/5/12/chartex" xmlns:cx7="http://schemas.microsoft.com/office/drawing/2016/5/13/chartex" xmlns:cx8="http://schemas.microsoft.com/office/drawing/2016/5/14/chartex" xmlns:mc="http://schemas.openxmlformats.org/markup-compatibility/2006" xmlns:m="http://schemas.openxmlformats.org/officeDocument/2006/math" xmlns:aink="http://schemas.microsoft.com/office/drawing/2016/ink" xmlns:am3d="http://schemas.microsoft.com/office/drawing/2017/model3d" xmlns:oel="http://schemas.microsoft.com/office/2019/extlst" xmlns:r="http://schemas.openxmlformats.org/officeDocument/2006/relationships" xmlns:wp14="http://schemas.microsoft.com/office/word/2010/wordprocessingDrawing" xmlns:wp="http://schemas.openxmlformats.org/drawingml/2006/wordprocessingDrawing" xmlns:wpg="http://schemas.microsoft.com/office/word/2010/wordprocessingGroup" xmlns:wpi="http://schemas.microsoft.com/office/word/2010/wordprocessingInk" xmlns:wps="http://schemas.microsoft.com/office/word/2010/wordprocessingShape" xmlns:o="urn:schemas-microsoft-com:office:office" xmlns:v="urn:schemas-microsoft-com:vml" xmlns:w10="urn:schemas-microsoft-com:office:word" xmlns:w="http://schemas.openxmlformats.org/wordprocessingml/2006/main" xmlns:w14="http://schemas.microsoft.com/office/word/2010/wordml" xmlns:w15="http://schemas.microsoft.com/office/word/2012/wordml" xmlns:w16cex="http://schemas.microsoft.com/office/word/2018/wordml/cex" xmlns:w16cid="http://schemas.microsoft.com/office/word/2016/wordml/cid" xmlns:w16="http://schemas.microsoft.com/office/word/2018/wordml" xmlns:w16sdtdh="http://schemas.microsoft.com/office/word/2020/wordml/sdtdatahash" xmlns:w16sdtfl="http://schemas.microsoft.com/office/word/2024/wordml/sdtformatlock" xmlns:w16se="http://schemas.microsoft.com/office/word/2015/wordml/symex" xmlns:w16du="http://schemas.microsoft.com/office/word/2023/wordml/word16du" xmlns:wne="http://schemas.microsoft.com/office/word/2006/wordml" mc:Ignorable="w14 w15 w16se w16cid w16 w16cex w16sdtdh w16sdtfl w16du wp14">
+<w:endnotes xmlns:wpc="http://schemas.microsoft.com/office/word/2010/wordprocessingCanvas" xmlns:cx="http://schemas.microsoft.com/office/drawing/2014/chartex" xmlns:cx1="http://schemas.microsoft.com/office/drawing/2015/9/8/chartex" xmlns:cx2="http://schemas.microsoft.com/office/drawing/2015/10/21/chartex" xmlns:cx3="http://schemas.microsoft.com/office/drawing/2016/5/9/chartex" xmlns:cx4="http://schemas.microsoft.com/office/drawing/2016/5/10/chartex" xmlns:cx5="http://schemas.microsoft.com/office/drawing/2016/5/11/chartex" xmlns:cx6="http://schemas.microsoft.com/office/drawing/2016/5/12/chartex" xmlns:cx7="http://schemas.microsoft.com/office/drawing/2016/5/13/chartex" xmlns:cx8="http://schemas.microsoft.com/office/drawing/2016/5/14/chartex" xmlns:mc="http://schemas.openxmlformats.org/markup-compatibility/2006" xmlns:aink="http://schemas.microsoft.com/office/drawing/2016/ink" xmlns:am3d="http://schemas.microsoft.com/office/drawing/2017/model3d" xmlns:o="urn:schemas-microsoft-com:office:office" xmlns:oel="http://schemas.microsoft.com/office/2019/extlst" xmlns:r="http://schemas.openxmlformats.org/officeDocument/2006/relationships" xmlns:m="http://schemas.openxmlformats.org/officeDocument/2006/math" xmlns:v="urn:schemas-microsoft-com:vml" xmlns:wp14="http://schemas.microsoft.com/office/word/2010/wordprocessingDrawing" xmlns:wp="http://schemas.openxmlformats.org/drawingml/2006/wordprocessingDrawing" xmlns:w10="urn:schemas-microsoft-com:office:word" xmlns:w="http://schemas.openxmlformats.org/wordprocessingml/2006/main" xmlns:w14="http://schemas.microsoft.com/office/word/2010/wordml" xmlns:w15="http://schemas.microsoft.com/office/word/2012/wordml" xmlns:w16cex="http://schemas.microsoft.com/office/word/2018/wordml/cex" xmlns:w16cid="http://schemas.microsoft.com/office/word/2016/wordml/cid" xmlns:w16="http://schemas.microsoft.com/office/word/2018/wordml" xmlns:w16du="http://schemas.microsoft.com/office/word/2023/wordml/word16du" xmlns:w16sdtdh="http://schemas.microsoft.com/office/word/2020/wordml/sdtdatahash" xmlns:w16sdtfl="http://schemas.microsoft.com/office/word/2024/wordml/sdtformatlock" xmlns:w16se="http://schemas.microsoft.com/office/word/2015/wordml/symex" xmlns:wpg="http://schemas.microsoft.com/office/word/2010/wordprocessingGroup" xmlns:wpi="http://schemas.microsoft.com/office/word/2010/wordprocessingInk" xmlns:wne="http://schemas.microsoft.com/office/word/2006/wordml" xmlns:wps="http://schemas.microsoft.com/office/word/2010/wordprocessingShape" mc:Ignorable="w14 w15 w16se w16cid w16 w16cex w16sdtdh w16sdtfl w16du wp14">
   <w:endnote w:type="separator" w:id="-1">
     <w:p>
       <w:r>
@@ -1011,17 +1105,7 @@
 </file>
 
 <file path=word/footer1.xml><?xml version="1.0" encoding="utf-8"?>
-<w:ftr xmlns:wpc="http://schemas.microsoft.com/office/word/2010/wordprocessingCanvas" xmlns:cx="http://schemas.microsoft.com/office/drawing/2014/chartex" xmlns:cx1="http://schemas.microsoft.com/office/drawing/2015/9/8/chartex" xmlns:cx2="http://schemas.microsoft.com/office/drawing/2015/10/21/chartex" xmlns:cx3="http://schemas.microsoft.com/office/drawing/2016/5/9/chartex" xmlns:cx4="http://schemas.microsoft.com/office/drawing/2016/5/10/chartex" xmlns:cx5="http://schemas.microsoft.com/office/drawing/2016/5/11/chartex" xmlns:cx6="http://schemas.microsoft.com/office/drawing/2016/5/12/chartex" xmlns:cx7="http://schemas.microsoft.com/office/drawing/2016/5/13/chartex" xmlns:cx8="http://schemas.microsoft.com/office/drawing/2016/5/14/chartex" xmlns:mc="http://schemas.openxmlformats.org/markup-compatibility/2006" xmlns:m="http://schemas.openxmlformats.org/officeDocument/2006/math" xmlns:aink="http://schemas.microsoft.com/office/drawing/2016/ink" xmlns:am3d="http://schemas.microsoft.com/office/drawing/2017/model3d" xmlns:oel="http://schemas.microsoft.com/office/2019/extlst" xmlns:r="http://schemas.openxmlformats.org/officeDocument/2006/relationships" xmlns:wp14="http://schemas.microsoft.com/office/word/2010/wordprocessingDrawing" xmlns:wp="http://schemas.openxmlformats.org/drawingml/2006/wordprocessingDrawing" xmlns:wpg="http://schemas.microsoft.com/office/word/2010/wordprocessingGroup" xmlns:wpi="http://schemas.microsoft.com/office/word/2010/wordprocessingInk" xmlns:wps="http://schemas.microsoft.com/office/word/2010/wordprocessingShape" xmlns:o="urn:schemas-microsoft-com:office:office" xmlns:v="urn:schemas-microsoft-com:vml" xmlns:w10="urn:schemas-microsoft-com:office:word" xmlns:w="http://schemas.openxmlformats.org/wordprocessingml/2006/main" xmlns:w14="http://schemas.microsoft.com/office/word/2010/wordml" xmlns:w15="http://schemas.microsoft.com/office/word/2012/wordml" xmlns:w16cex="http://schemas.microsoft.com/office/word/2018/wordml/cex" xmlns:w16cid="http://schemas.microsoft.com/office/word/2016/wordml/cid" xmlns:w16="http://schemas.microsoft.com/office/word/2018/wordml" xmlns:w16sdtdh="http://schemas.microsoft.com/office/word/2020/wordml/sdtdatahash" xmlns:w16sdtfl="http://schemas.microsoft.com/office/word/2024/wordml/sdtformatlock" xmlns:w16se="http://schemas.microsoft.com/office/word/2015/wordml/symex" xmlns:w16du="http://schemas.microsoft.com/office/word/2023/wordml/word16du" xmlns:wne="http://schemas.microsoft.com/office/word/2006/wordml" mc:Ignorable="w14 w15 w16se w16cid w16 w16cex w16sdtdh w16sdtfl w16du wp14">
-  <w:p>
-    <w:pPr>
-      <w:pStyle w:val="Footer"/>
-    </w:pPr>
-  </w:p>
-</w:ftr>
-</file>
-
-<file path=word/footer2.xml><?xml version="1.0" encoding="utf-8"?>
-<w:ftr xmlns:wpc="http://schemas.microsoft.com/office/word/2010/wordprocessingCanvas" xmlns:cx="http://schemas.microsoft.com/office/drawing/2014/chartex" xmlns:cx1="http://schemas.microsoft.com/office/drawing/2015/9/8/chartex" xmlns:cx2="http://schemas.microsoft.com/office/drawing/2015/10/21/chartex" xmlns:cx3="http://schemas.microsoft.com/office/drawing/2016/5/9/chartex" xmlns:cx4="http://schemas.microsoft.com/office/drawing/2016/5/10/chartex" xmlns:cx5="http://schemas.microsoft.com/office/drawing/2016/5/11/chartex" xmlns:cx6="http://schemas.microsoft.com/office/drawing/2016/5/12/chartex" xmlns:cx7="http://schemas.microsoft.com/office/drawing/2016/5/13/chartex" xmlns:cx8="http://schemas.microsoft.com/office/drawing/2016/5/14/chartex" xmlns:mc="http://schemas.openxmlformats.org/markup-compatibility/2006" xmlns:m="http://schemas.openxmlformats.org/officeDocument/2006/math" xmlns:aink="http://schemas.microsoft.com/office/drawing/2016/ink" xmlns:am3d="http://schemas.microsoft.com/office/drawing/2017/model3d" xmlns:oel="http://schemas.microsoft.com/office/2019/extlst" xmlns:r="http://schemas.openxmlformats.org/officeDocument/2006/relationships" xmlns:wp14="http://schemas.microsoft.com/office/word/2010/wordprocessingDrawing" xmlns:wp="http://schemas.openxmlformats.org/drawingml/2006/wordprocessingDrawing" xmlns:wpg="http://schemas.microsoft.com/office/word/2010/wordprocessingGroup" xmlns:wpi="http://schemas.microsoft.com/office/word/2010/wordprocessingInk" xmlns:wps="http://schemas.microsoft.com/office/word/2010/wordprocessingShape" xmlns:o="urn:schemas-microsoft-com:office:office" xmlns:v="urn:schemas-microsoft-com:vml" xmlns:w10="urn:schemas-microsoft-com:office:word" xmlns:w="http://schemas.openxmlformats.org/wordprocessingml/2006/main" xmlns:w14="http://schemas.microsoft.com/office/word/2010/wordml" xmlns:w15="http://schemas.microsoft.com/office/word/2012/wordml" xmlns:w16cex="http://schemas.microsoft.com/office/word/2018/wordml/cex" xmlns:w16cid="http://schemas.microsoft.com/office/word/2016/wordml/cid" xmlns:w16="http://schemas.microsoft.com/office/word/2018/wordml" xmlns:w16sdtdh="http://schemas.microsoft.com/office/word/2020/wordml/sdtdatahash" xmlns:w16sdtfl="http://schemas.microsoft.com/office/word/2024/wordml/sdtformatlock" xmlns:w16se="http://schemas.microsoft.com/office/word/2015/wordml/symex" xmlns:w16du="http://schemas.microsoft.com/office/word/2023/wordml/word16du" xmlns:wne="http://schemas.microsoft.com/office/word/2006/wordml" mc:Ignorable="w14 w15 w16se w16cid w16 w16cex w16sdtdh w16sdtfl w16du wp14">
+<w:ftr xmlns:wpc="http://schemas.microsoft.com/office/word/2010/wordprocessingCanvas" xmlns:cx="http://schemas.microsoft.com/office/drawing/2014/chartex" xmlns:cx1="http://schemas.microsoft.com/office/drawing/2015/9/8/chartex" xmlns:cx2="http://schemas.microsoft.com/office/drawing/2015/10/21/chartex" xmlns:cx3="http://schemas.microsoft.com/office/drawing/2016/5/9/chartex" xmlns:cx4="http://schemas.microsoft.com/office/drawing/2016/5/10/chartex" xmlns:cx5="http://schemas.microsoft.com/office/drawing/2016/5/11/chartex" xmlns:cx6="http://schemas.microsoft.com/office/drawing/2016/5/12/chartex" xmlns:cx7="http://schemas.microsoft.com/office/drawing/2016/5/13/chartex" xmlns:cx8="http://schemas.microsoft.com/office/drawing/2016/5/14/chartex" xmlns:mc="http://schemas.openxmlformats.org/markup-compatibility/2006" xmlns:aink="http://schemas.microsoft.com/office/drawing/2016/ink" xmlns:am3d="http://schemas.microsoft.com/office/drawing/2017/model3d" xmlns:o="urn:schemas-microsoft-com:office:office" xmlns:oel="http://schemas.microsoft.com/office/2019/extlst" xmlns:r="http://schemas.openxmlformats.org/officeDocument/2006/relationships" xmlns:m="http://schemas.openxmlformats.org/officeDocument/2006/math" xmlns:v="urn:schemas-microsoft-com:vml" xmlns:wp14="http://schemas.microsoft.com/office/word/2010/wordprocessingDrawing" xmlns:wp="http://schemas.openxmlformats.org/drawingml/2006/wordprocessingDrawing" xmlns:w10="urn:schemas-microsoft-com:office:word" xmlns:w="http://schemas.openxmlformats.org/wordprocessingml/2006/main" xmlns:w14="http://schemas.microsoft.com/office/word/2010/wordml" xmlns:w15="http://schemas.microsoft.com/office/word/2012/wordml" xmlns:w16cex="http://schemas.microsoft.com/office/word/2018/wordml/cex" xmlns:w16cid="http://schemas.microsoft.com/office/word/2016/wordml/cid" xmlns:w16="http://schemas.microsoft.com/office/word/2018/wordml" xmlns:w16du="http://schemas.microsoft.com/office/word/2023/wordml/word16du" xmlns:w16sdtdh="http://schemas.microsoft.com/office/word/2020/wordml/sdtdatahash" xmlns:w16sdtfl="http://schemas.microsoft.com/office/word/2024/wordml/sdtformatlock" xmlns:w16se="http://schemas.microsoft.com/office/word/2015/wordml/symex" xmlns:wpg="http://schemas.microsoft.com/office/word/2010/wordprocessingGroup" xmlns:wpi="http://schemas.microsoft.com/office/word/2010/wordprocessingInk" xmlns:wne="http://schemas.microsoft.com/office/word/2006/wordml" xmlns:wps="http://schemas.microsoft.com/office/word/2010/wordprocessingShape" mc:Ignorable="w14 w15 w16se w16cid w16 w16cex w16sdtdh w16sdtfl w16du wp14">
   <w:p>
     <w:pPr>
       <w:pStyle w:val="Footer"/>
@@ -1031,8 +1115,8 @@
 </w:ftr>
 </file>
 
-<file path=word/footer3.xml><?xml version="1.0" encoding="utf-8"?>
-<w:ftr xmlns:wpc="http://schemas.microsoft.com/office/word/2010/wordprocessingCanvas" xmlns:cx="http://schemas.microsoft.com/office/drawing/2014/chartex" xmlns:cx1="http://schemas.microsoft.com/office/drawing/2015/9/8/chartex" xmlns:cx2="http://schemas.microsoft.com/office/drawing/2015/10/21/chartex" xmlns:cx3="http://schemas.microsoft.com/office/drawing/2016/5/9/chartex" xmlns:cx4="http://schemas.microsoft.com/office/drawing/2016/5/10/chartex" xmlns:cx5="http://schemas.microsoft.com/office/drawing/2016/5/11/chartex" xmlns:cx6="http://schemas.microsoft.com/office/drawing/2016/5/12/chartex" xmlns:cx7="http://schemas.microsoft.com/office/drawing/2016/5/13/chartex" xmlns:cx8="http://schemas.microsoft.com/office/drawing/2016/5/14/chartex" xmlns:mc="http://schemas.openxmlformats.org/markup-compatibility/2006" xmlns:m="http://schemas.openxmlformats.org/officeDocument/2006/math" xmlns:aink="http://schemas.microsoft.com/office/drawing/2016/ink" xmlns:am3d="http://schemas.microsoft.com/office/drawing/2017/model3d" xmlns:oel="http://schemas.microsoft.com/office/2019/extlst" xmlns:r="http://schemas.openxmlformats.org/officeDocument/2006/relationships" xmlns:wp14="http://schemas.microsoft.com/office/word/2010/wordprocessingDrawing" xmlns:wp="http://schemas.openxmlformats.org/drawingml/2006/wordprocessingDrawing" xmlns:wpg="http://schemas.microsoft.com/office/word/2010/wordprocessingGroup" xmlns:wpi="http://schemas.microsoft.com/office/word/2010/wordprocessingInk" xmlns:wps="http://schemas.microsoft.com/office/word/2010/wordprocessingShape" xmlns:o="urn:schemas-microsoft-com:office:office" xmlns:v="urn:schemas-microsoft-com:vml" xmlns:w10="urn:schemas-microsoft-com:office:word" xmlns:w="http://schemas.openxmlformats.org/wordprocessingml/2006/main" xmlns:w14="http://schemas.microsoft.com/office/word/2010/wordml" xmlns:w15="http://schemas.microsoft.com/office/word/2012/wordml" xmlns:w16cex="http://schemas.microsoft.com/office/word/2018/wordml/cex" xmlns:w16cid="http://schemas.microsoft.com/office/word/2016/wordml/cid" xmlns:w16="http://schemas.microsoft.com/office/word/2018/wordml" xmlns:w16sdtdh="http://schemas.microsoft.com/office/word/2020/wordml/sdtdatahash" xmlns:w16sdtfl="http://schemas.microsoft.com/office/word/2024/wordml/sdtformatlock" xmlns:w16se="http://schemas.microsoft.com/office/word/2015/wordml/symex" xmlns:w16du="http://schemas.microsoft.com/office/word/2023/wordml/word16du" xmlns:wne="http://schemas.microsoft.com/office/word/2006/wordml" mc:Ignorable="w14 w15 w16se w16cid w16 w16cex w16sdtdh w16sdtfl w16du wp14">
+<file path=word/footer2.xml><?xml version="1.0" encoding="utf-8"?>
+<w:ftr xmlns:wpc="http://schemas.microsoft.com/office/word/2010/wordprocessingCanvas" xmlns:cx="http://schemas.microsoft.com/office/drawing/2014/chartex" xmlns:cx1="http://schemas.microsoft.com/office/drawing/2015/9/8/chartex" xmlns:cx2="http://schemas.microsoft.com/office/drawing/2015/10/21/chartex" xmlns:cx3="http://schemas.microsoft.com/office/drawing/2016/5/9/chartex" xmlns:cx4="http://schemas.microsoft.com/office/drawing/2016/5/10/chartex" xmlns:cx5="http://schemas.microsoft.com/office/drawing/2016/5/11/chartex" xmlns:cx6="http://schemas.microsoft.com/office/drawing/2016/5/12/chartex" xmlns:cx7="http://schemas.microsoft.com/office/drawing/2016/5/13/chartex" xmlns:cx8="http://schemas.microsoft.com/office/drawing/2016/5/14/chartex" xmlns:mc="http://schemas.openxmlformats.org/markup-compatibility/2006" xmlns:aink="http://schemas.microsoft.com/office/drawing/2016/ink" xmlns:am3d="http://schemas.microsoft.com/office/drawing/2017/model3d" xmlns:o="urn:schemas-microsoft-com:office:office" xmlns:oel="http://schemas.microsoft.com/office/2019/extlst" xmlns:r="http://schemas.openxmlformats.org/officeDocument/2006/relationships" xmlns:m="http://schemas.openxmlformats.org/officeDocument/2006/math" xmlns:v="urn:schemas-microsoft-com:vml" xmlns:wp14="http://schemas.microsoft.com/office/word/2010/wordprocessingDrawing" xmlns:wp="http://schemas.openxmlformats.org/drawingml/2006/wordprocessingDrawing" xmlns:w10="urn:schemas-microsoft-com:office:word" xmlns:w="http://schemas.openxmlformats.org/wordprocessingml/2006/main" xmlns:w14="http://schemas.microsoft.com/office/word/2010/wordml" xmlns:w15="http://schemas.microsoft.com/office/word/2012/wordml" xmlns:w16cex="http://schemas.microsoft.com/office/word/2018/wordml/cex" xmlns:w16cid="http://schemas.microsoft.com/office/word/2016/wordml/cid" xmlns:w16="http://schemas.microsoft.com/office/word/2018/wordml" xmlns:w16du="http://schemas.microsoft.com/office/word/2023/wordml/word16du" xmlns:w16sdtdh="http://schemas.microsoft.com/office/word/2020/wordml/sdtdatahash" xmlns:w16sdtfl="http://schemas.microsoft.com/office/word/2024/wordml/sdtformatlock" xmlns:w16se="http://schemas.microsoft.com/office/word/2015/wordml/symex" xmlns:wpg="http://schemas.microsoft.com/office/word/2010/wordprocessingGroup" xmlns:wpi="http://schemas.microsoft.com/office/word/2010/wordprocessingInk" xmlns:wne="http://schemas.microsoft.com/office/word/2006/wordml" xmlns:wps="http://schemas.microsoft.com/office/word/2010/wordprocessingShape" mc:Ignorable="w14 w15 w16se w16cid w16 w16cex w16sdtdh w16sdtfl w16du wp14">
   <w:p>
     <w:pPr>
       <w:tabs>
@@ -1051,7 +1135,7 @@
 </file>
 
 <file path=word/footnotes.xml><?xml version="1.0" encoding="utf-8"?>
-<w:footnotes xmlns:wpc="http://schemas.microsoft.com/office/word/2010/wordprocessingCanvas" xmlns:cx="http://schemas.microsoft.com/office/drawing/2014/chartex" xmlns:cx1="http://schemas.microsoft.com/office/drawing/2015/9/8/chartex" xmlns:cx2="http://schemas.microsoft.com/office/drawing/2015/10/21/chartex" xmlns:cx3="http://schemas.microsoft.com/office/drawing/2016/5/9/chartex" xmlns:cx4="http://schemas.microsoft.com/office/drawing/2016/5/10/chartex" xmlns:cx5="http://schemas.microsoft.com/office/drawing/2016/5/11/chartex" xmlns:cx6="http://schemas.microsoft.com/office/drawing/2016/5/12/chartex" xmlns:cx7="http://schemas.microsoft.com/office/drawing/2016/5/13/chartex" xmlns:cx8="http://schemas.microsoft.com/office/drawing/2016/5/14/chartex" xmlns:mc="http://schemas.openxmlformats.org/markup-compatibility/2006" xmlns:m="http://schemas.openxmlformats.org/officeDocument/2006/math" xmlns:aink="http://schemas.microsoft.com/office/drawing/2016/ink" xmlns:am3d="http://schemas.microsoft.com/office/drawing/2017/model3d" xmlns:oel="http://schemas.microsoft.com/office/2019/extlst" xmlns:r="http://schemas.openxmlformats.org/officeDocument/2006/relationships" xmlns:wp14="http://schemas.microsoft.com/office/word/2010/wordprocessingDrawing" xmlns:wp="http://schemas.openxmlformats.org/drawingml/2006/wordprocessingDrawing" xmlns:wpg="http://schemas.microsoft.com/office/word/2010/wordprocessingGroup" xmlns:wpi="http://schemas.microsoft.com/office/word/2010/wordprocessingInk" xmlns:wps="http://schemas.microsoft.com/office/word/2010/wordprocessingShape" xmlns:o="urn:schemas-microsoft-com:office:office" xmlns:v="urn:schemas-microsoft-com:vml" xmlns:w10="urn:schemas-microsoft-com:office:word" xmlns:w="http://schemas.openxmlformats.org/wordprocessingml/2006/main" xmlns:w14="http://schemas.microsoft.com/office/word/2010/wordml" xmlns:w15="http://schemas.microsoft.com/office/word/2012/wordml" xmlns:w16cex="http://schemas.microsoft.com/office/word/2018/wordml/cex" xmlns:w16cid="http://schemas.microsoft.com/office/word/2016/wordml/cid" xmlns:w16="http://schemas.microsoft.com/office/word/2018/wordml" xmlns:w16sdtdh="http://schemas.microsoft.com/office/word/2020/wordml/sdtdatahash" xmlns:w16sdtfl="http://schemas.microsoft.com/office/word/2024/wordml/sdtformatlock" xmlns:w16se="http://schemas.microsoft.com/office/word/2015/wordml/symex" xmlns:w16du="http://schemas.microsoft.com/office/word/2023/wordml/word16du" xmlns:wne="http://schemas.microsoft.com/office/word/2006/wordml" mc:Ignorable="w14 w15 w16se w16cid w16 w16cex w16sdtdh w16sdtfl w16du wp14">
+<w:footnotes xmlns:wpc="http://schemas.microsoft.com/office/word/2010/wordprocessingCanvas" xmlns:cx="http://schemas.microsoft.com/office/drawing/2014/chartex" xmlns:cx1="http://schemas.microsoft.com/office/drawing/2015/9/8/chartex" xmlns:cx2="http://schemas.microsoft.com/office/drawing/2015/10/21/chartex" xmlns:cx3="http://schemas.microsoft.com/office/drawing/2016/5/9/chartex" xmlns:cx4="http://schemas.microsoft.com/office/drawing/2016/5/10/chartex" xmlns:cx5="http://schemas.microsoft.com/office/drawing/2016/5/11/chartex" xmlns:cx6="http://schemas.microsoft.com/office/drawing/2016/5/12/chartex" xmlns:cx7="http://schemas.microsoft.com/office/drawing/2016/5/13/chartex" xmlns:cx8="http://schemas.microsoft.com/office/drawing/2016/5/14/chartex" xmlns:mc="http://schemas.openxmlformats.org/markup-compatibility/2006" xmlns:aink="http://schemas.microsoft.com/office/drawing/2016/ink" xmlns:am3d="http://schemas.microsoft.com/office/drawing/2017/model3d" xmlns:o="urn:schemas-microsoft-com:office:office" xmlns:oel="http://schemas.microsoft.com/office/2019/extlst" xmlns:r="http://schemas.openxmlformats.org/officeDocument/2006/relationships" xmlns:m="http://schemas.openxmlformats.org/officeDocument/2006/math" xmlns:v="urn:schemas-microsoft-com:vml" xmlns:wp14="http://schemas.microsoft.com/office/word/2010/wordprocessingDrawing" xmlns:wp="http://schemas.openxmlformats.org/drawingml/2006/wordprocessingDrawing" xmlns:w10="urn:schemas-microsoft-com:office:word" xmlns:w="http://schemas.openxmlformats.org/wordprocessingml/2006/main" xmlns:w14="http://schemas.microsoft.com/office/word/2010/wordml" xmlns:w15="http://schemas.microsoft.com/office/word/2012/wordml" xmlns:w16cex="http://schemas.microsoft.com/office/word/2018/wordml/cex" xmlns:w16cid="http://schemas.microsoft.com/office/word/2016/wordml/cid" xmlns:w16="http://schemas.microsoft.com/office/word/2018/wordml" xmlns:w16du="http://schemas.microsoft.com/office/word/2023/wordml/word16du" xmlns:w16sdtdh="http://schemas.microsoft.com/office/word/2020/wordml/sdtdatahash" xmlns:w16sdtfl="http://schemas.microsoft.com/office/word/2024/wordml/sdtformatlock" xmlns:w16se="http://schemas.microsoft.com/office/word/2015/wordml/symex" xmlns:wpg="http://schemas.microsoft.com/office/word/2010/wordprocessingGroup" xmlns:wpi="http://schemas.microsoft.com/office/word/2010/wordprocessingInk" xmlns:wne="http://schemas.microsoft.com/office/word/2006/wordml" xmlns:wps="http://schemas.microsoft.com/office/word/2010/wordprocessingShape" mc:Ignorable="w14 w15 w16se w16cid w16 w16cex w16sdtdh w16sdtfl w16du wp14">
   <w:footnote w:type="separator" w:id="-1">
     <w:p>
       <w:r>
@@ -1070,17 +1154,7 @@
 </file>
 
 <file path=word/header1.xml><?xml version="1.0" encoding="utf-8"?>
-<w:hdr xmlns:wpc="http://schemas.microsoft.com/office/word/2010/wordprocessingCanvas" xmlns:cx="http://schemas.microsoft.com/office/drawing/2014/chartex" xmlns:cx1="http://schemas.microsoft.com/office/drawing/2015/9/8/chartex" xmlns:cx2="http://schemas.microsoft.com/office/drawing/2015/10/21/chartex" xmlns:cx3="http://schemas.microsoft.com/office/drawing/2016/5/9/chartex" xmlns:cx4="http://schemas.microsoft.com/office/drawing/2016/5/10/chartex" xmlns:cx5="http://schemas.microsoft.com/office/drawing/2016/5/11/chartex" xmlns:cx6="http://schemas.microsoft.com/office/drawing/2016/5/12/chartex" xmlns:cx7="http://schemas.microsoft.com/office/drawing/2016/5/13/chartex" xmlns:cx8="http://schemas.microsoft.com/office/drawing/2016/5/14/chartex" xmlns:mc="http://schemas.openxmlformats.org/markup-compatibility/2006" xmlns:m="http://schemas.openxmlformats.org/officeDocument/2006/math" xmlns:aink="http://schemas.microsoft.com/office/drawing/2016/ink" xmlns:am3d="http://schemas.microsoft.com/office/drawing/2017/model3d" xmlns:oel="http://schemas.microsoft.com/office/2019/extlst" xmlns:r="http://schemas.openxmlformats.org/officeDocument/2006/relationships" xmlns:wp14="http://schemas.microsoft.com/office/word/2010/wordprocessingDrawing" xmlns:wp="http://schemas.openxmlformats.org/drawingml/2006/wordprocessingDrawing" xmlns:wpg="http://schemas.microsoft.com/office/word/2010/wordprocessingGroup" xmlns:wpi="http://schemas.microsoft.com/office/word/2010/wordprocessingInk" xmlns:wps="http://schemas.microsoft.com/office/word/2010/wordprocessingShape" xmlns:o="urn:schemas-microsoft-com:office:office" xmlns:v="urn:schemas-microsoft-com:vml" xmlns:w10="urn:schemas-microsoft-com:office:word" xmlns:w="http://schemas.openxmlformats.org/wordprocessingml/2006/main" xmlns:w14="http://schemas.microsoft.com/office/word/2010/wordml" xmlns:w15="http://schemas.microsoft.com/office/word/2012/wordml" xmlns:w16cex="http://schemas.microsoft.com/office/word/2018/wordml/cex" xmlns:w16cid="http://schemas.microsoft.com/office/word/2016/wordml/cid" xmlns:w16="http://schemas.microsoft.com/office/word/2018/wordml" xmlns:w16sdtdh="http://schemas.microsoft.com/office/word/2020/wordml/sdtdatahash" xmlns:w16sdtfl="http://schemas.microsoft.com/office/word/2024/wordml/sdtformatlock" xmlns:w16se="http://schemas.microsoft.com/office/word/2015/wordml/symex" xmlns:w16du="http://schemas.microsoft.com/office/word/2023/wordml/word16du" xmlns:wne="http://schemas.microsoft.com/office/word/2006/wordml" mc:Ignorable="w14 w15 w16se w16cid w16 w16cex w16sdtdh w16sdtfl w16du wp14">
-  <w:p>
-    <w:pPr>
-      <w:pStyle w:val="Header"/>
-    </w:pPr>
-  </w:p>
-</w:hdr>
-</file>
-
-<file path=word/header2.xml><?xml version="1.0" encoding="utf-8"?>
-<w:hdr xmlns:wpc="http://schemas.microsoft.com/office/word/2010/wordprocessingCanvas" xmlns:cx="http://schemas.microsoft.com/office/drawing/2014/chartex" xmlns:cx1="http://schemas.microsoft.com/office/drawing/2015/9/8/chartex" xmlns:cx2="http://schemas.microsoft.com/office/drawing/2015/10/21/chartex" xmlns:cx3="http://schemas.microsoft.com/office/drawing/2016/5/9/chartex" xmlns:cx4="http://schemas.microsoft.com/office/drawing/2016/5/10/chartex" xmlns:cx5="http://schemas.microsoft.com/office/drawing/2016/5/11/chartex" xmlns:cx6="http://schemas.microsoft.com/office/drawing/2016/5/12/chartex" xmlns:cx7="http://schemas.microsoft.com/office/drawing/2016/5/13/chartex" xmlns:cx8="http://schemas.microsoft.com/office/drawing/2016/5/14/chartex" xmlns:mc="http://schemas.openxmlformats.org/markup-compatibility/2006" xmlns:m="http://schemas.openxmlformats.org/officeDocument/2006/math" xmlns:aink="http://schemas.microsoft.com/office/drawing/2016/ink" xmlns:am3d="http://schemas.microsoft.com/office/drawing/2017/model3d" xmlns:oel="http://schemas.microsoft.com/office/2019/extlst" xmlns:r="http://schemas.openxmlformats.org/officeDocument/2006/relationships" xmlns:wp14="http://schemas.microsoft.com/office/word/2010/wordprocessingDrawing" xmlns:wp="http://schemas.openxmlformats.org/drawingml/2006/wordprocessingDrawing" xmlns:wpg="http://schemas.microsoft.com/office/word/2010/wordprocessingGroup" xmlns:wpi="http://schemas.microsoft.com/office/word/2010/wordprocessingInk" xmlns:wps="http://schemas.microsoft.com/office/word/2010/wordprocessingShape" xmlns:o="urn:schemas-microsoft-com:office:office" xmlns:v="urn:schemas-microsoft-com:vml" xmlns:w10="urn:schemas-microsoft-com:office:word" xmlns:w="http://schemas.openxmlformats.org/wordprocessingml/2006/main" xmlns:w14="http://schemas.microsoft.com/office/word/2010/wordml" xmlns:w15="http://schemas.microsoft.com/office/word/2012/wordml" xmlns:w16cex="http://schemas.microsoft.com/office/word/2018/wordml/cex" xmlns:w16cid="http://schemas.microsoft.com/office/word/2016/wordml/cid" xmlns:w16="http://schemas.microsoft.com/office/word/2018/wordml" xmlns:w16sdtdh="http://schemas.microsoft.com/office/word/2020/wordml/sdtdatahash" xmlns:w16sdtfl="http://schemas.microsoft.com/office/word/2024/wordml/sdtformatlock" xmlns:w16se="http://schemas.microsoft.com/office/word/2015/wordml/symex" xmlns:w16du="http://schemas.microsoft.com/office/word/2023/wordml/word16du" xmlns:wne="http://schemas.microsoft.com/office/word/2006/wordml" mc:Ignorable="w14 w15 w16se w16cid w16 w16cex w16sdtdh w16sdtfl w16du wp14">
+<w:hdr xmlns:wpc="http://schemas.microsoft.com/office/word/2010/wordprocessingCanvas" xmlns:cx="http://schemas.microsoft.com/office/drawing/2014/chartex" xmlns:cx1="http://schemas.microsoft.com/office/drawing/2015/9/8/chartex" xmlns:cx2="http://schemas.microsoft.com/office/drawing/2015/10/21/chartex" xmlns:cx3="http://schemas.microsoft.com/office/drawing/2016/5/9/chartex" xmlns:cx4="http://schemas.microsoft.com/office/drawing/2016/5/10/chartex" xmlns:cx5="http://schemas.microsoft.com/office/drawing/2016/5/11/chartex" xmlns:cx6="http://schemas.microsoft.com/office/drawing/2016/5/12/chartex" xmlns:cx7="http://schemas.microsoft.com/office/drawing/2016/5/13/chartex" xmlns:cx8="http://schemas.microsoft.com/office/drawing/2016/5/14/chartex" xmlns:mc="http://schemas.openxmlformats.org/markup-compatibility/2006" xmlns:aink="http://schemas.microsoft.com/office/drawing/2016/ink" xmlns:am3d="http://schemas.microsoft.com/office/drawing/2017/model3d" xmlns:o="urn:schemas-microsoft-com:office:office" xmlns:oel="http://schemas.microsoft.com/office/2019/extlst" xmlns:r="http://schemas.openxmlformats.org/officeDocument/2006/relationships" xmlns:m="http://schemas.openxmlformats.org/officeDocument/2006/math" xmlns:v="urn:schemas-microsoft-com:vml" xmlns:wp14="http://schemas.microsoft.com/office/word/2010/wordprocessingDrawing" xmlns:wp="http://schemas.openxmlformats.org/drawingml/2006/wordprocessingDrawing" xmlns:w10="urn:schemas-microsoft-com:office:word" xmlns:w="http://schemas.openxmlformats.org/wordprocessingml/2006/main" xmlns:w14="http://schemas.microsoft.com/office/word/2010/wordml" xmlns:w15="http://schemas.microsoft.com/office/word/2012/wordml" xmlns:w16cex="http://schemas.microsoft.com/office/word/2018/wordml/cex" xmlns:w16cid="http://schemas.microsoft.com/office/word/2016/wordml/cid" xmlns:w16="http://schemas.microsoft.com/office/word/2018/wordml" xmlns:w16du="http://schemas.microsoft.com/office/word/2023/wordml/word16du" xmlns:w16sdtdh="http://schemas.microsoft.com/office/word/2020/wordml/sdtdatahash" xmlns:w16sdtfl="http://schemas.microsoft.com/office/word/2024/wordml/sdtformatlock" xmlns:w16se="http://schemas.microsoft.com/office/word/2015/wordml/symex" xmlns:wpg="http://schemas.microsoft.com/office/word/2010/wordprocessingGroup" xmlns:wpi="http://schemas.microsoft.com/office/word/2010/wordprocessingInk" xmlns:wne="http://schemas.microsoft.com/office/word/2006/wordml" xmlns:wps="http://schemas.microsoft.com/office/word/2010/wordprocessingShape" mc:Ignorable="w14 w15 w16se w16cid w16 w16cex w16sdtdh w16sdtfl w16du wp14">
   <w:p>
     <w:pPr>
       <w:pStyle w:val="Header"/>
@@ -1109,14 +1183,8 @@
 </w:hdr>
 </file>
 
-<file path=word/header3.xml><?xml version="1.0" encoding="utf-8"?>
-<w:hdr xmlns:wpc="http://schemas.microsoft.com/office/word/2010/wordprocessingCanvas" xmlns:cx="http://schemas.microsoft.com/office/drawing/2014/chartex" xmlns:cx1="http://schemas.microsoft.com/office/drawing/2015/9/8/chartex" xmlns:cx2="http://schemas.microsoft.com/office/drawing/2015/10/21/chartex" xmlns:cx3="http://schemas.microsoft.com/office/drawing/2016/5/9/chartex" xmlns:cx4="http://schemas.microsoft.com/office/drawing/2016/5/10/chartex" xmlns:cx5="http://schemas.microsoft.com/office/drawing/2016/5/11/chartex" xmlns:cx6="http://schemas.microsoft.com/office/drawing/2016/5/12/chartex" xmlns:cx7="http://schemas.microsoft.com/office/drawing/2016/5/13/chartex" xmlns:cx8="http://schemas.microsoft.com/office/drawing/2016/5/14/chartex" xmlns:mc="http://schemas.openxmlformats.org/markup-compatibility/2006" xmlns:m="http://schemas.openxmlformats.org/officeDocument/2006/math" xmlns:aink="http://schemas.microsoft.com/office/drawing/2016/ink" xmlns:am3d="http://schemas.microsoft.com/office/drawing/2017/model3d" xmlns:oel="http://schemas.microsoft.com/office/2019/extlst" xmlns:r="http://schemas.openxmlformats.org/officeDocument/2006/relationships" xmlns:wp14="http://schemas.microsoft.com/office/word/2010/wordprocessingDrawing" xmlns:wp="http://schemas.openxmlformats.org/drawingml/2006/wordprocessingDrawing" xmlns:wpg="http://schemas.microsoft.com/office/word/2010/wordprocessingGroup" xmlns:wpi="http://schemas.microsoft.com/office/word/2010/wordprocessingInk" xmlns:wps="http://schemas.microsoft.com/office/word/2010/wordprocessingShape" xmlns:o="urn:schemas-microsoft-com:office:office" xmlns:v="urn:schemas-microsoft-com:vml" xmlns:w10="urn:schemas-microsoft-com:office:word" xmlns:w="http://schemas.openxmlformats.org/wordprocessingml/2006/main" xmlns:w14="http://schemas.microsoft.com/office/word/2010/wordml" xmlns:w15="http://schemas.microsoft.com/office/word/2012/wordml" xmlns:w16cex="http://schemas.microsoft.com/office/word/2018/wordml/cex" xmlns:w16cid="http://schemas.microsoft.com/office/word/2016/wordml/cid" xmlns:w16="http://schemas.microsoft.com/office/word/2018/wordml" xmlns:w16sdtdh="http://schemas.microsoft.com/office/word/2020/wordml/sdtdatahash" xmlns:w16sdtfl="http://schemas.microsoft.com/office/word/2024/wordml/sdtformatlock" xmlns:w16se="http://schemas.microsoft.com/office/word/2015/wordml/symex" xmlns:w16du="http://schemas.microsoft.com/office/word/2023/wordml/word16du" xmlns:wne="http://schemas.microsoft.com/office/word/2006/wordml" mc:Ignorable="w14 w15 w16se w16cid w16 w16cex w16sdtdh w16sdtfl w16du wp14">
-  <w:p>
-    <w:pPr>
-      <w:pStyle w:val="Header"/>
-      <w:ind w:hanging="1350"/>
-    </w:pPr>
-  </w:p>
+<file path=word/header2.xml><?xml version="1.0" encoding="utf-8"?>
+<w:hdr xmlns:wpc="http://schemas.microsoft.com/office/word/2010/wordprocessingCanvas" xmlns:cx="http://schemas.microsoft.com/office/drawing/2014/chartex" xmlns:cx1="http://schemas.microsoft.com/office/drawing/2015/9/8/chartex" xmlns:cx2="http://schemas.microsoft.com/office/drawing/2015/10/21/chartex" xmlns:cx3="http://schemas.microsoft.com/office/drawing/2016/5/9/chartex" xmlns:cx4="http://schemas.microsoft.com/office/drawing/2016/5/10/chartex" xmlns:cx5="http://schemas.microsoft.com/office/drawing/2016/5/11/chartex" xmlns:cx6="http://schemas.microsoft.com/office/drawing/2016/5/12/chartex" xmlns:cx7="http://schemas.microsoft.com/office/drawing/2016/5/13/chartex" xmlns:cx8="http://schemas.microsoft.com/office/drawing/2016/5/14/chartex" xmlns:mc="http://schemas.openxmlformats.org/markup-compatibility/2006" xmlns:aink="http://schemas.microsoft.com/office/drawing/2016/ink" xmlns:am3d="http://schemas.microsoft.com/office/drawing/2017/model3d" xmlns:o="urn:schemas-microsoft-com:office:office" xmlns:oel="http://schemas.microsoft.com/office/2019/extlst" xmlns:r="http://schemas.openxmlformats.org/officeDocument/2006/relationships" xmlns:m="http://schemas.openxmlformats.org/officeDocument/2006/math" xmlns:v="urn:schemas-microsoft-com:vml" xmlns:wp14="http://schemas.microsoft.com/office/word/2010/wordprocessingDrawing" xmlns:wp="http://schemas.openxmlformats.org/drawingml/2006/wordprocessingDrawing" xmlns:w10="urn:schemas-microsoft-com:office:word" xmlns:w="http://schemas.openxmlformats.org/wordprocessingml/2006/main" xmlns:w14="http://schemas.microsoft.com/office/word/2010/wordml" xmlns:w15="http://schemas.microsoft.com/office/word/2012/wordml" xmlns:w16cex="http://schemas.microsoft.com/office/word/2018/wordml/cex" xmlns:w16cid="http://schemas.microsoft.com/office/word/2016/wordml/cid" xmlns:w16="http://schemas.microsoft.com/office/word/2018/wordml" xmlns:w16du="http://schemas.microsoft.com/office/word/2023/wordml/word16du" xmlns:w16sdtdh="http://schemas.microsoft.com/office/word/2020/wordml/sdtdatahash" xmlns:w16sdtfl="http://schemas.microsoft.com/office/word/2024/wordml/sdtformatlock" xmlns:w16se="http://schemas.microsoft.com/office/word/2015/wordml/symex" xmlns:wpg="http://schemas.microsoft.com/office/word/2010/wordprocessingGroup" xmlns:wpi="http://schemas.microsoft.com/office/word/2010/wordprocessingInk" xmlns:wne="http://schemas.microsoft.com/office/word/2006/wordml" xmlns:wps="http://schemas.microsoft.com/office/word/2010/wordprocessingShape" mc:Ignorable="w14 w15 w16se w16cid w16 w16cex w16sdtdh w16sdtfl w16du wp14">
   <w:p>
     <w:pPr>
       <w:pStyle w:val="Header"/>
@@ -1129,7 +1197,328 @@
       <w:ind w:hanging="1350"/>
     </w:pPr>
     <w:r>
+      <w:rPr>
+        <w:noProof/>
+      </w:rPr>
+      <mc:AlternateContent>
+        <mc:Choice Requires="wps">
+          <w:drawing>
+            <wp:anchor distT="0" distB="0" distL="114300" distR="114300" simplePos="0" relativeHeight="251659264" behindDoc="0" locked="0" layoutInCell="1" allowOverlap="1" wp14:anchorId="6DE74C12" wp14:editId="1E5821A5">
+              <wp:simplePos x="0" y="0"/>
+              <wp:positionH relativeFrom="column">
+                <wp:posOffset>0</wp:posOffset>
+              </wp:positionH>
+              <wp:positionV relativeFrom="paragraph">
+                <wp:posOffset>81915</wp:posOffset>
+              </wp:positionV>
+              <wp:extent cx="5286375" cy="844550"/>
+              <wp:effectExtent l="38100" t="57150" r="47625" b="50800"/>
+              <wp:wrapNone/>
+              <wp:docPr id="4" name="Text Box 2"/>
+              <wp:cNvGraphicFramePr>
+                <a:graphicFrameLocks xmlns:a="http://schemas.openxmlformats.org/drawingml/2006/main"/>
+              </wp:cNvGraphicFramePr>
+              <a:graphic xmlns:a="http://schemas.openxmlformats.org/drawingml/2006/main">
+                <a:graphicData uri="http://schemas.microsoft.com/office/word/2010/wordprocessingShape">
+                  <wps:wsp>
+                    <wps:cNvSpPr txBox="1">
+                      <a:spLocks noChangeArrowheads="1"/>
+                    </wps:cNvSpPr>
+                    <wps:spPr bwMode="auto">
+                      <a:xfrm>
+                        <a:off x="0" y="0"/>
+                        <a:ext cx="5286375" cy="844550"/>
+                      </a:xfrm>
+                      <a:prstGeom prst="rect">
+                        <a:avLst/>
+                      </a:prstGeom>
+                      <a:solidFill>
+                        <a:srgbClr val="FFFFFF"/>
+                      </a:solidFill>
+                      <a:ln>
+                        <a:noFill/>
+                      </a:ln>
+                      <a:scene3d>
+                        <a:camera prst="orthographicFront"/>
+                        <a:lightRig rig="threePt" dir="t"/>
+                      </a:scene3d>
+                      <a:sp3d>
+                        <a:bevelT/>
+                      </a:sp3d>
+                      <a:extLst>
+                        <a:ext uri="{91240B29-F687-4F45-9708-019B960494DF}">
+                          <a14:hiddenLine xmlns:a14="http://schemas.microsoft.com/office/drawing/2010/main" w="9525">
+                            <a:solidFill>
+                              <a:srgbClr val="000000"/>
+                            </a:solidFill>
+                            <a:miter lim="800000"/>
+                            <a:headEnd/>
+                            <a:tailEnd/>
+                          </a14:hiddenLine>
+                        </a:ext>
+                      </a:extLst>
+                    </wps:spPr>
+                    <wps:txbx>
+                      <w:txbxContent>
+                        <w:p>
+                          <w:pPr>
+                            <w:pStyle w:val="PlainText"/>
+                            <w:jc w:val="center"/>
+                            <w:rPr>
+                              <w:rFonts w:ascii="Times New Roman" w:hAnsi="Times New Roman"/>
+                              <w:b/>
+                              <w:sz w:val="48"/>
+                              <w:szCs w:val="48"/>
+                            </w:rPr>
+                          </w:pPr>
+                          <w:r>
+                            <w:rPr>
+                              <w:rFonts w:ascii="Times New Roman" w:hAnsi="Times New Roman"/>
+                              <w:b/>
+                              <w:sz w:val="48"/>
+                              <w:szCs w:val="48"/>
+                            </w:rPr>
+                            <w:t>U.S. Army Pacific News Summary</w:t>
+                          </w:r>
+                        </w:p>
+                        <w:p>
+                          <w:pPr>
+                            <w:pStyle w:val="PlainText"/>
+                            <w:jc w:val="center"/>
+                            <w:rPr>
+                              <w:rFonts w:ascii="Times New Roman" w:hAnsi="Times New Roman"/>
+                              <w:b/>
+                              <w:sz w:val="24"/>
+                              <w:szCs w:val="24"/>
+                            </w:rPr>
+                          </w:pPr>
+                          <w:r>
+                            <w:rPr>
+                              <w:rFonts w:ascii="Times New Roman" w:hAnsi="Times New Roman"/>
+                              <w:b/>
+                              <w:sz w:val="24"/>
+                              <w:szCs w:val="24"/>
+                            </w:rPr>
+                            <w:t>One Team-America’s Theater Army in the Indo-Pacific</w:t>
+                          </w:r>
+                          <w:r>
+                            <w:rPr>
+                              <w:rFonts w:ascii="Times New Roman" w:hAnsi="Times New Roman"/>
+                              <w:b/>
+                              <w:sz w:val="24"/>
+                              <w:szCs w:val="24"/>
+                            </w:rPr>
+                            <w:t>. Compete, Deter, and when necessary, Win as part of a lethal Joint Force.</w:t>
+                          </w:r>
+                        </w:p>
+                      </w:txbxContent>
+                    </wps:txbx>
+                    <wps:bodyPr rot="0" vert="horz" wrap="square" lIns="91440" tIns="45720" rIns="91440" bIns="45720" anchor="t" anchorCtr="0" upright="1">
+                      <a:noAutofit/>
+                    </wps:bodyPr>
+                  </wps:wsp>
+                </a:graphicData>
+              </a:graphic>
+              <wp14:sizeRelV relativeFrom="margin">
+                <wp14:pctHeight>0</wp14:pctHeight>
+              </wp14:sizeRelV>
+            </wp:anchor>
+          </w:drawing>
+        </mc:Choice>
+        <mc:Fallback>
+          <w:pict>
+            <v:shapetype w14:anchorId="6DE74C12" id="_x0000_t202" coordsize="21600,21600" o:spt="202" path="m,l,21600r21600,l21600,xe">
+              <v:stroke joinstyle="miter"/>
+              <v:path gradientshapeok="t" o:connecttype="rect"/>
+            </v:shapetype>
+            <v:shape id="Text Box 2" o:spid="_x0000_s1026" type="#_x0000_t202" style="position:absolute;margin-left:0;margin-top:6.45pt;width:416.25pt;height:66.5pt;z-index:251659264;visibility:visible;mso-wrap-style:square;mso-height-percent:0;mso-wrap-distance-left:9pt;mso-wrap-distance-top:0;mso-wrap-distance-right:9pt;mso-wrap-distance-bottom:0;mso-position-horizontal:absolute;mso-position-horizontal-relative:text;mso-position-vertical:absolute;mso-position-vertical-relative:text;mso-height-percent:0;mso-height-relative:margin;v-text-anchor:top" o:gfxdata="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" stroked="f">
+              <v:textbox>
+                <w:txbxContent>
+                  <w:p>
+                    <w:pPr>
+                      <w:pStyle w:val="PlainText"/>
+                      <w:jc w:val="center"/>
+                      <w:rPr>
+                        <w:rFonts w:ascii="Times New Roman" w:hAnsi="Times New Roman"/>
+                        <w:b/>
+                        <w:sz w:val="48"/>
+                        <w:szCs w:val="48"/>
+                      </w:rPr>
+                    </w:pPr>
+                    <w:r>
+                      <w:rPr>
+                        <w:rFonts w:ascii="Times New Roman" w:hAnsi="Times New Roman"/>
+                        <w:b/>
+                        <w:sz w:val="48"/>
+                        <w:szCs w:val="48"/>
+                      </w:rPr>
+                      <w:t>U.S. Army Pacific News Summary</w:t>
+                    </w:r>
+                  </w:p>
+                  <w:p>
+                    <w:pPr>
+                      <w:pStyle w:val="PlainText"/>
+                      <w:jc w:val="center"/>
+                      <w:rPr>
+                        <w:rFonts w:ascii="Times New Roman" w:hAnsi="Times New Roman"/>
+                        <w:b/>
+                        <w:sz w:val="24"/>
+                        <w:szCs w:val="24"/>
+                      </w:rPr>
+                    </w:pPr>
+                    <w:r>
+                      <w:rPr>
+                        <w:rFonts w:ascii="Times New Roman" w:hAnsi="Times New Roman"/>
+                        <w:b/>
+                        <w:sz w:val="24"/>
+                        <w:szCs w:val="24"/>
+                      </w:rPr>
+                      <w:t>One Team-America’s Theater Army in the Indo-Pacific</w:t>
+                    </w:r>
+                    <w:r>
+                      <w:rPr>
+                        <w:rFonts w:ascii="Times New Roman" w:hAnsi="Times New Roman"/>
+                        <w:b/>
+                        <w:sz w:val="24"/>
+                        <w:szCs w:val="24"/>
+                      </w:rPr>
+                      <w:t>. Compete, Deter, and when necessary, Win as part of a lethal Joint Force.</w:t>
+                    </w:r>
+                  </w:p>
+                </w:txbxContent>
+              </v:textbox>
+            </v:shape>
+          </w:pict>
+        </mc:Fallback>
+      </mc:AlternateContent>
+    </w:r>
+  </w:p>
+  <w:p>
+    <w:pPr>
+      <w:pStyle w:val="Header"/>
+      <w:ind w:hanging="1350"/>
+    </w:pPr>
+    <w:r>
+      <w:rPr>
+        <w:noProof/>
+      </w:rPr>
+      <w:drawing>
+        <wp:anchor distT="0" distB="0" distL="114300" distR="114300" simplePos="0" relativeHeight="251661312" behindDoc="0" locked="0" layoutInCell="1" allowOverlap="1" wp14:anchorId="45379F77" wp14:editId="7EDBDC84">
+          <wp:simplePos x="0" y="0"/>
+          <wp:positionH relativeFrom="column">
+            <wp:posOffset>5486400</wp:posOffset>
+          </wp:positionH>
+          <wp:positionV relativeFrom="paragraph">
+            <wp:posOffset>-635</wp:posOffset>
+          </wp:positionV>
+          <wp:extent cx="885825" cy="749627"/>
+          <wp:effectExtent l="0" t="0" r="0" b="0"/>
+          <wp:wrapNone/>
+          <wp:docPr id="18" name="Picture 9" descr="U_S_ Army Pacific Shoulder Sleeve Insignia.png"/>
+          <wp:cNvGraphicFramePr/>
+          <a:graphic xmlns:a="http://schemas.openxmlformats.org/drawingml/2006/main">
+            <a:graphicData uri="http://schemas.openxmlformats.org/drawingml/2006/picture">
+              <pic:pic xmlns:pic="http://schemas.openxmlformats.org/drawingml/2006/picture">
+                <pic:nvPicPr>
+                  <pic:cNvPr id="18" name="Picture 9" descr="U_S_ Army Pacific Shoulder Sleeve Insignia.png"/>
+                  <pic:cNvPicPr/>
+                </pic:nvPicPr>
+                <pic:blipFill>
+                  <a:blip r:embed="rId1" cstate="print">
+                    <a:extLst>
+                      <a:ext uri="{28A0092B-C50C-407E-A947-70E740481C1C}">
+                        <a14:useLocalDpi xmlns:a14="http://schemas.microsoft.com/office/drawing/2010/main" val="0"/>
+                      </a:ext>
+                    </a:extLst>
+                  </a:blip>
+                  <a:srcRect/>
+                  <a:stretch>
+                    <a:fillRect/>
+                  </a:stretch>
+                </pic:blipFill>
+                <pic:spPr bwMode="auto">
+                  <a:xfrm>
+                    <a:off x="0" y="0"/>
+                    <a:ext cx="885825" cy="749627"/>
+                  </a:xfrm>
+                  <a:prstGeom prst="rect">
+                    <a:avLst/>
+                  </a:prstGeom>
+                  <a:noFill/>
+                  <a:ln w="9525">
+                    <a:noFill/>
+                    <a:miter lim="800000"/>
+                    <a:headEnd/>
+                    <a:tailEnd/>
+                  </a:ln>
+                </pic:spPr>
+              </pic:pic>
+            </a:graphicData>
+          </a:graphic>
+          <wp14:sizeRelH relativeFrom="margin">
+            <wp14:pctWidth>0</wp14:pctWidth>
+          </wp14:sizeRelH>
+          <wp14:sizeRelV relativeFrom="margin">
+            <wp14:pctHeight>0</wp14:pctHeight>
+          </wp14:sizeRelV>
+        </wp:anchor>
+      </w:drawing>
+    </w:r>
+    <w:r>
       <w:t xml:space="preserve">    </w:t>
+    </w:r>
+    <w:r>
+      <w:rPr>
+        <w:noProof/>
+      </w:rPr>
+      <w:drawing>
+        <wp:inline distT="0" distB="0" distL="0" distR="0" wp14:anchorId="6770B751" wp14:editId="15108B3B">
+          <wp:extent cx="552450" cy="685800"/>
+          <wp:effectExtent l="0" t="0" r="0" b="0"/>
+          <wp:docPr id="1407770853" name="Picture 1"/>
+          <wp:cNvGraphicFramePr>
+            <a:graphicFrameLocks xmlns:a="http://schemas.openxmlformats.org/drawingml/2006/main" noChangeAspect="1"/>
+          </wp:cNvGraphicFramePr>
+          <a:graphic xmlns:a="http://schemas.openxmlformats.org/drawingml/2006/main">
+            <a:graphicData uri="http://schemas.openxmlformats.org/drawingml/2006/picture">
+              <pic:pic xmlns:pic="http://schemas.openxmlformats.org/drawingml/2006/picture">
+                <pic:nvPicPr>
+                  <pic:cNvPr id="0" name="Picture 1"/>
+                  <pic:cNvPicPr>
+                    <a:picLocks noChangeAspect="1" noChangeArrowheads="1"/>
+                  </pic:cNvPicPr>
+                </pic:nvPicPr>
+                <pic:blipFill>
+                  <a:blip r:embed="rId2">
+                    <a:extLst>
+                      <a:ext uri="{28A0092B-C50C-407E-A947-70E740481C1C}">
+                        <a14:useLocalDpi xmlns:a14="http://schemas.microsoft.com/office/drawing/2010/main" val="0"/>
+                      </a:ext>
+                    </a:extLst>
+                  </a:blip>
+                  <a:srcRect/>
+                  <a:stretch>
+                    <a:fillRect/>
+                  </a:stretch>
+                </pic:blipFill>
+                <pic:spPr bwMode="auto">
+                  <a:xfrm>
+                    <a:off x="0" y="0"/>
+                    <a:ext cx="552450" cy="685800"/>
+                  </a:xfrm>
+                  <a:prstGeom prst="rect">
+                    <a:avLst/>
+                  </a:prstGeom>
+                  <a:noFill/>
+                  <a:ln>
+                    <a:noFill/>
+                  </a:ln>
+                </pic:spPr>
+              </pic:pic>
+            </a:graphicData>
+          </a:graphic>
+        </wp:inline>
+      </w:drawing>
     </w:r>
   </w:p>
   <w:p>
@@ -1143,7 +1532,7 @@
 </file>
 
 <file path=word/numbering.xml><?xml version="1.0" encoding="utf-8"?>
-<w:numbering xmlns:wpc="http://schemas.microsoft.com/office/word/2010/wordprocessingCanvas" xmlns:cx="http://schemas.microsoft.com/office/drawing/2014/chartex" xmlns:cx1="http://schemas.microsoft.com/office/drawing/2015/9/8/chartex" xmlns:cx2="http://schemas.microsoft.com/office/drawing/2015/10/21/chartex" xmlns:cx3="http://schemas.microsoft.com/office/drawing/2016/5/9/chartex" xmlns:cx4="http://schemas.microsoft.com/office/drawing/2016/5/10/chartex" xmlns:cx5="http://schemas.microsoft.com/office/drawing/2016/5/11/chartex" xmlns:cx6="http://schemas.microsoft.com/office/drawing/2016/5/12/chartex" xmlns:cx7="http://schemas.microsoft.com/office/drawing/2016/5/13/chartex" xmlns:cx8="http://schemas.microsoft.com/office/drawing/2016/5/14/chartex" xmlns:mc="http://schemas.openxmlformats.org/markup-compatibility/2006" xmlns:m="http://schemas.openxmlformats.org/officeDocument/2006/math" xmlns:aink="http://schemas.microsoft.com/office/drawing/2016/ink" xmlns:am3d="http://schemas.microsoft.com/office/drawing/2017/model3d" xmlns:oel="http://schemas.microsoft.com/office/2019/extlst" xmlns:r="http://schemas.openxmlformats.org/officeDocument/2006/relationships" xmlns:wp14="http://schemas.microsoft.com/office/word/2010/wordprocessingDrawing" xmlns:wp="http://schemas.openxmlformats.org/drawingml/2006/wordprocessingDrawing" xmlns:wpg="http://schemas.microsoft.com/office/word/2010/wordprocessingGroup" xmlns:wpi="http://schemas.microsoft.com/office/word/2010/wordprocessingInk" xmlns:wps="http://schemas.microsoft.com/office/word/2010/wordprocessingShape" xmlns:o="urn:schemas-microsoft-com:office:office" xmlns:v="urn:schemas-microsoft-com:vml" xmlns:w10="urn:schemas-microsoft-com:office:word" xmlns:w="http://schemas.openxmlformats.org/wordprocessingml/2006/main" xmlns:w14="http://schemas.microsoft.com/office/word/2010/wordml" xmlns:w15="http://schemas.microsoft.com/office/word/2012/wordml" xmlns:w16cex="http://schemas.microsoft.com/office/word/2018/wordml/cex" xmlns:w16cid="http://schemas.microsoft.com/office/word/2016/wordml/cid" xmlns:w16="http://schemas.microsoft.com/office/word/2018/wordml" xmlns:w16sdtdh="http://schemas.microsoft.com/office/word/2020/wordml/sdtdatahash" xmlns:w16sdtfl="http://schemas.microsoft.com/office/word/2024/wordml/sdtformatlock" xmlns:w16se="http://schemas.microsoft.com/office/word/2015/wordml/symex" xmlns:w16du="http://schemas.microsoft.com/office/word/2023/wordml/word16du" xmlns:wne="http://schemas.microsoft.com/office/word/2006/wordml" mc:Ignorable="w14 w15 w16se w16cid w16 w16cex w16sdtdh w16sdtfl w16du wp14">
+<w:numbering xmlns:wpc="http://schemas.microsoft.com/office/word/2010/wordprocessingCanvas" xmlns:cx="http://schemas.microsoft.com/office/drawing/2014/chartex" xmlns:cx1="http://schemas.microsoft.com/office/drawing/2015/9/8/chartex" xmlns:cx2="http://schemas.microsoft.com/office/drawing/2015/10/21/chartex" xmlns:cx3="http://schemas.microsoft.com/office/drawing/2016/5/9/chartex" xmlns:cx4="http://schemas.microsoft.com/office/drawing/2016/5/10/chartex" xmlns:cx5="http://schemas.microsoft.com/office/drawing/2016/5/11/chartex" xmlns:cx6="http://schemas.microsoft.com/office/drawing/2016/5/12/chartex" xmlns:cx7="http://schemas.microsoft.com/office/drawing/2016/5/13/chartex" xmlns:cx8="http://schemas.microsoft.com/office/drawing/2016/5/14/chartex" xmlns:mc="http://schemas.openxmlformats.org/markup-compatibility/2006" xmlns:aink="http://schemas.microsoft.com/office/drawing/2016/ink" xmlns:am3d="http://schemas.microsoft.com/office/drawing/2017/model3d" xmlns:o="urn:schemas-microsoft-com:office:office" xmlns:oel="http://schemas.microsoft.com/office/2019/extlst" xmlns:r="http://schemas.openxmlformats.org/officeDocument/2006/relationships" xmlns:m="http://schemas.openxmlformats.org/officeDocument/2006/math" xmlns:v="urn:schemas-microsoft-com:vml" xmlns:wp14="http://schemas.microsoft.com/office/word/2010/wordprocessingDrawing" xmlns:wp="http://schemas.openxmlformats.org/drawingml/2006/wordprocessingDrawing" xmlns:w10="urn:schemas-microsoft-com:office:word" xmlns:w="http://schemas.openxmlformats.org/wordprocessingml/2006/main" xmlns:w14="http://schemas.microsoft.com/office/word/2010/wordml" xmlns:w15="http://schemas.microsoft.com/office/word/2012/wordml" xmlns:w16cex="http://schemas.microsoft.com/office/word/2018/wordml/cex" xmlns:w16cid="http://schemas.microsoft.com/office/word/2016/wordml/cid" xmlns:w16="http://schemas.microsoft.com/office/word/2018/wordml" xmlns:w16du="http://schemas.microsoft.com/office/word/2023/wordml/word16du" xmlns:w16sdtdh="http://schemas.microsoft.com/office/word/2020/wordml/sdtdatahash" xmlns:w16sdtfl="http://schemas.microsoft.com/office/word/2024/wordml/sdtformatlock" xmlns:w16se="http://schemas.microsoft.com/office/word/2015/wordml/symex" xmlns:wpg="http://schemas.microsoft.com/office/word/2010/wordprocessingGroup" xmlns:wpi="http://schemas.microsoft.com/office/word/2010/wordprocessingInk" xmlns:wne="http://schemas.microsoft.com/office/word/2006/wordml" xmlns:wps="http://schemas.microsoft.com/office/word/2010/wordprocessingShape" mc:Ignorable="w14 w15 w16se w16cid w16 w16cex w16sdtdh w16sdtfl w16du wp14">
   <w:abstractNum w:abstractNumId="0" w15:restartNumberingAfterBreak="0">
     <w:nsid w:val="061B5C9E"/>
     <w:multiLevelType w:val="hybridMultilevel"/>
@@ -1990,7 +2379,7 @@
 </file>
 
 <file path=word/styles.xml><?xml version="1.0" encoding="utf-8"?>
-<w:styles xmlns:mc="http://schemas.openxmlformats.org/markup-compatibility/2006" xmlns:r="http://schemas.openxmlformats.org/officeDocument/2006/relationships" xmlns:w="http://schemas.openxmlformats.org/wordprocessingml/2006/main" xmlns:w14="http://schemas.microsoft.com/office/word/2010/wordml" xmlns:w15="http://schemas.microsoft.com/office/word/2012/wordml" xmlns:w16cex="http://schemas.microsoft.com/office/word/2018/wordml/cex" xmlns:w16cid="http://schemas.microsoft.com/office/word/2016/wordml/cid" xmlns:w16="http://schemas.microsoft.com/office/word/2018/wordml" xmlns:w16sdtdh="http://schemas.microsoft.com/office/word/2020/wordml/sdtdatahash" xmlns:w16sdtfl="http://schemas.microsoft.com/office/word/2024/wordml/sdtformatlock" xmlns:w16se="http://schemas.microsoft.com/office/word/2015/wordml/symex" xmlns:w16du="http://schemas.microsoft.com/office/word/2023/wordml/word16du" mc:Ignorable="w14 w15 w16se w16cid w16 w16cex w16sdtdh w16sdtfl w16du">
+<w:styles xmlns:mc="http://schemas.openxmlformats.org/markup-compatibility/2006" xmlns:r="http://schemas.openxmlformats.org/officeDocument/2006/relationships" xmlns:w="http://schemas.openxmlformats.org/wordprocessingml/2006/main" xmlns:w14="http://schemas.microsoft.com/office/word/2010/wordml" xmlns:w15="http://schemas.microsoft.com/office/word/2012/wordml" xmlns:w16cex="http://schemas.microsoft.com/office/word/2018/wordml/cex" xmlns:w16cid="http://schemas.microsoft.com/office/word/2016/wordml/cid" xmlns:w16="http://schemas.microsoft.com/office/word/2018/wordml" xmlns:w16du="http://schemas.microsoft.com/office/word/2023/wordml/word16du" xmlns:w16sdtdh="http://schemas.microsoft.com/office/word/2020/wordml/sdtdatahash" xmlns:w16sdtfl="http://schemas.microsoft.com/office/word/2024/wordml/sdtformatlock" xmlns:w16se="http://schemas.microsoft.com/office/word/2015/wordml/symex" mc:Ignorable="w14 w15 w16se w16cid w16 w16cex w16sdtdh w16sdtfl w16du">
   <w:docDefaults>
     <w:rPrDefault>
       <w:rPr>
@@ -3164,6 +3553,32 @@
 </file>
 
 <file path=customXml/item1.xml><?xml version="1.0" encoding="utf-8"?>
+<?mso-contentType ?>
+<FormTemplates xmlns="http://schemas.microsoft.com/sharepoint/v3/contenttype/forms">
+  <Display>DocumentLibraryForm</Display>
+  <Edit>DocumentLibraryForm</Edit>
+  <New>DocumentLibraryForm</New>
+</FormTemplates>
+</file>
+
+<file path=customXml/item2.xml><?xml version="1.0" encoding="utf-8"?>
+<p:properties xmlns:p="http://schemas.microsoft.com/office/2006/metadata/properties" xmlns:xsi="http://www.w3.org/2001/XMLSchema-instance" xmlns:pc="http://schemas.microsoft.com/office/infopath/2007/PartnerControls">
+  <documentManagement>
+    <TaxCatchAll xmlns="38d2a309-d798-495b-b1a3-e97c37808eef"/>
+    <_ip_UnifiedCompliancePolicyUIAction xmlns="http://schemas.microsoft.com/sharepoint/v3" xsi:nil="true"/>
+    <_ip_UnifiedCompliancePolicyProperties xmlns="http://schemas.microsoft.com/sharepoint/v3" xsi:nil="true"/>
+    <lcf76f155ced4ddcb4097134ff3c332f xmlns="416eecfc-56a7-4354-8013-4a2d9c92e153">
+      <Terms xmlns="http://schemas.microsoft.com/office/infopath/2007/PartnerControls"/>
+    </lcf76f155ced4ddcb4097134ff3c332f>
+  </documentManagement>
+</p:properties>
+</file>
+
+<file path=customXml/item3.xml><?xml version="1.0" encoding="utf-8"?>
+<b:Sources xmlns:b="http://schemas.openxmlformats.org/officeDocument/2006/bibliography" xmlns="http://schemas.openxmlformats.org/officeDocument/2006/bibliography" SelectedStyle="\APA.XSL" StyleName="APA"/>
+</file>
+
+<file path=customXml/item4.xml><?xml version="1.0" encoding="utf-8"?>
 <ct:contentTypeSchema xmlns:ct="http://schemas.microsoft.com/office/2006/metadata/contentType" xmlns:ma="http://schemas.microsoft.com/office/2006/metadata/properties/metaAttributes" ct:_="" ma:_="" ma:contentTypeName="Document" ma:contentTypeID="0x010100E48B1925F2EFB241960044EC5F64C034" ma:contentTypeVersion="16" ma:contentTypeDescription="Create a new document." ma:contentTypeScope="" ma:versionID="b193f1a1adb628ee5f7d642c4cb4fead">
   <xsd:schema xmlns:xsd="http://www.w3.org/2001/XMLSchema" xmlns:xs="http://www.w3.org/2001/XMLSchema" xmlns:p="http://schemas.microsoft.com/office/2006/metadata/properties" xmlns:ns1="http://schemas.microsoft.com/sharepoint/v3" xmlns:ns2="416eecfc-56a7-4354-8013-4a2d9c92e153" xmlns:ns3="38d2a309-d798-495b-b1a3-e97c37808eef" targetNamespace="http://schemas.microsoft.com/office/2006/metadata/properties" ma:root="true" ma:fieldsID="f4c72206c132b1461c2865266b50231c" ns1:_="" ns2:_="" ns3:_="">
     <xsd:import namespace="http://schemas.microsoft.com/sharepoint/v3"/>
@@ -3409,33 +3824,35 @@
 </ct:contentTypeSchema>
 </file>
 
-<file path=customXml/item2.xml><?xml version="1.0" encoding="utf-8"?>
-<b:Sources xmlns:b="http://schemas.openxmlformats.org/officeDocument/2006/bibliography" xmlns="http://schemas.openxmlformats.org/officeDocument/2006/bibliography" SelectedStyle="\APA.XSL" StyleName="APA"/>
+<file path=customXml/itemProps1.xml><?xml version="1.0" encoding="utf-8"?>
+<ds:datastoreItem xmlns:ds="http://schemas.openxmlformats.org/officeDocument/2006/customXml" ds:itemID="{2ACA00A0-0EB9-4F25-B1A0-9480A1DEA0B5}">
+  <ds:schemaRefs>
+    <ds:schemaRef ds:uri="http://schemas.microsoft.com/sharepoint/v3/contenttype/forms"/>
+  </ds:schemaRefs>
+</ds:datastoreItem>
 </file>
 
-<file path=customXml/item3.xml><?xml version="1.0" encoding="utf-8"?>
-<p:properties xmlns:p="http://schemas.microsoft.com/office/2006/metadata/properties" xmlns:xsi="http://www.w3.org/2001/XMLSchema-instance" xmlns:pc="http://schemas.microsoft.com/office/infopath/2007/PartnerControls">
-  <documentManagement>
-    <TaxCatchAll xmlns="38d2a309-d798-495b-b1a3-e97c37808eef"/>
-    <_ip_UnifiedCompliancePolicyUIAction xmlns="http://schemas.microsoft.com/sharepoint/v3" xsi:nil="true"/>
-    <_ip_UnifiedCompliancePolicyProperties xmlns="http://schemas.microsoft.com/sharepoint/v3" xsi:nil="true"/>
-    <lcf76f155ced4ddcb4097134ff3c332f xmlns="416eecfc-56a7-4354-8013-4a2d9c92e153">
-      <Terms xmlns="http://schemas.microsoft.com/office/infopath/2007/PartnerControls"/>
-    </lcf76f155ced4ddcb4097134ff3c332f>
-  </documentManagement>
-</p:properties>
+<file path=customXml/itemProps2.xml><?xml version="1.0" encoding="utf-8"?>
+<ds:datastoreItem xmlns:ds="http://schemas.openxmlformats.org/officeDocument/2006/customXml" ds:itemID="{5D491C04-0035-45EA-BE2E-2976A5F7A397}">
+  <ds:schemaRefs>
+    <ds:schemaRef ds:uri="http://schemas.microsoft.com/office/2006/metadata/properties"/>
+    <ds:schemaRef ds:uri="http://schemas.microsoft.com/office/infopath/2007/PartnerControls"/>
+    <ds:schemaRef ds:uri="38d2a309-d798-495b-b1a3-e97c37808eef"/>
+    <ds:schemaRef ds:uri="http://schemas.microsoft.com/sharepoint/v3"/>
+    <ds:schemaRef ds:uri="416eecfc-56a7-4354-8013-4a2d9c92e153"/>
+  </ds:schemaRefs>
+</ds:datastoreItem>
 </file>
 
-<file path=customXml/item4.xml><?xml version="1.0" encoding="utf-8"?>
-<?mso-contentType ?>
-<FormTemplates xmlns="http://schemas.microsoft.com/sharepoint/v3/contenttype/forms">
-  <Display>DocumentLibraryForm</Display>
-  <Edit>DocumentLibraryForm</Edit>
-  <New>DocumentLibraryForm</New>
-</FormTemplates>
+<file path=customXml/itemProps3.xml><?xml version="1.0" encoding="utf-8"?>
+<ds:datastoreItem xmlns:ds="http://schemas.openxmlformats.org/officeDocument/2006/customXml" ds:itemID="{4202E056-596C-4D43-866F-DBCC294656E0}">
+  <ds:schemaRefs>
+    <ds:schemaRef ds:uri="http://schemas.openxmlformats.org/officeDocument/2006/bibliography"/>
+  </ds:schemaRefs>
+</ds:datastoreItem>
 </file>
 
-<file path=customXml/itemProps1.xml><?xml version="1.0" encoding="utf-8"?>
+<file path=customXml/itemProps4.xml><?xml version="1.0" encoding="utf-8"?>
 <ds:datastoreItem xmlns:ds="http://schemas.openxmlformats.org/officeDocument/2006/customXml" ds:itemID="{3AA634C4-AFF1-45A4-BEEC-3BC128C36838}">
   <ds:schemaRefs>
     <ds:schemaRef ds:uri="http://schemas.microsoft.com/office/2006/metadata/contentType"/>
@@ -3455,34 +3872,6 @@
 </ds:datastoreItem>
 </file>
 
-<file path=customXml/itemProps2.xml><?xml version="1.0" encoding="utf-8"?>
-<ds:datastoreItem xmlns:ds="http://schemas.openxmlformats.org/officeDocument/2006/customXml" ds:itemID="{4202E056-596C-4D43-866F-DBCC294656E0}">
-  <ds:schemaRefs>
-    <ds:schemaRef ds:uri="http://schemas.openxmlformats.org/officeDocument/2006/bibliography"/>
-  </ds:schemaRefs>
-</ds:datastoreItem>
-</file>
-
-<file path=customXml/itemProps3.xml><?xml version="1.0" encoding="utf-8"?>
-<ds:datastoreItem xmlns:ds="http://schemas.openxmlformats.org/officeDocument/2006/customXml" ds:itemID="{5D491C04-0035-45EA-BE2E-2976A5F7A397}">
-  <ds:schemaRefs>
-    <ds:schemaRef ds:uri="http://schemas.microsoft.com/office/2006/metadata/properties"/>
-    <ds:schemaRef ds:uri="http://schemas.microsoft.com/office/infopath/2007/PartnerControls"/>
-    <ds:schemaRef ds:uri="38d2a309-d798-495b-b1a3-e97c37808eef"/>
-    <ds:schemaRef ds:uri="http://schemas.microsoft.com/sharepoint/v3"/>
-    <ds:schemaRef ds:uri="416eecfc-56a7-4354-8013-4a2d9c92e153"/>
-  </ds:schemaRefs>
-</ds:datastoreItem>
-</file>
-
-<file path=customXml/itemProps4.xml><?xml version="1.0" encoding="utf-8"?>
-<ds:datastoreItem xmlns:ds="http://schemas.openxmlformats.org/officeDocument/2006/customXml" ds:itemID="{2ACA00A0-0EB9-4F25-B1A0-9480A1DEA0B5}">
-  <ds:schemaRefs>
-    <ds:schemaRef ds:uri="http://schemas.microsoft.com/sharepoint/v3/contenttype/forms"/>
-  </ds:schemaRefs>
-</ds:datastoreItem>
-</file>
-
 <file path=docMetadata/LabelInfo.xml><?xml version="1.0" encoding="utf-8"?>
 <clbl:labelList xmlns:clbl="http://schemas.microsoft.com/office/2020/mipLabelMetadata">
   <clbl:label id="{3de9faa6-9fe1-49b3-9a08-227a296b54a6}" enabled="1" method="Privileged" siteId="{66d73691-ea97-48b1-95d5-e94f0a46b878}" contentBits="0" removed="0"/>

</xml_diff>

<commit_message>
Added sites to filter on and author capabilities
</commit_message>
<xml_diff>
--- a/app/assets/default_template.docx
+++ b/app/assets/default_template.docx
@@ -1,6 +1,6 @@
 
 <file path=word/document.xml><?xml version="1.0" encoding="utf-8"?>
-<w:document xmlns:wpc="http://schemas.microsoft.com/office/word/2010/wordprocessingCanvas" xmlns:cx="http://schemas.microsoft.com/office/drawing/2014/chartex" xmlns:cx1="http://schemas.microsoft.com/office/drawing/2015/9/8/chartex" xmlns:cx2="http://schemas.microsoft.com/office/drawing/2015/10/21/chartex" xmlns:cx3="http://schemas.microsoft.com/office/drawing/2016/5/9/chartex" xmlns:cx4="http://schemas.microsoft.com/office/drawing/2016/5/10/chartex" xmlns:cx5="http://schemas.microsoft.com/office/drawing/2016/5/11/chartex" xmlns:cx6="http://schemas.microsoft.com/office/drawing/2016/5/12/chartex" xmlns:cx7="http://schemas.microsoft.com/office/drawing/2016/5/13/chartex" xmlns:cx8="http://schemas.microsoft.com/office/drawing/2016/5/14/chartex" xmlns:mc="http://schemas.openxmlformats.org/markup-compatibility/2006" xmlns:aink="http://schemas.microsoft.com/office/drawing/2016/ink" xmlns:am3d="http://schemas.microsoft.com/office/drawing/2017/model3d" xmlns:o="urn:schemas-microsoft-com:office:office" xmlns:oel="http://schemas.microsoft.com/office/2019/extlst" xmlns:r="http://schemas.openxmlformats.org/officeDocument/2006/relationships" xmlns:m="http://schemas.openxmlformats.org/officeDocument/2006/math" xmlns:v="urn:schemas-microsoft-com:vml" xmlns:wp14="http://schemas.microsoft.com/office/word/2010/wordprocessingDrawing" xmlns:wp="http://schemas.openxmlformats.org/drawingml/2006/wordprocessingDrawing" xmlns:w10="urn:schemas-microsoft-com:office:word" xmlns:w="http://schemas.openxmlformats.org/wordprocessingml/2006/main" xmlns:w14="http://schemas.microsoft.com/office/word/2010/wordml" xmlns:w15="http://schemas.microsoft.com/office/word/2012/wordml" xmlns:w16cex="http://schemas.microsoft.com/office/word/2018/wordml/cex" xmlns:w16cid="http://schemas.microsoft.com/office/word/2016/wordml/cid" xmlns:w16="http://schemas.microsoft.com/office/word/2018/wordml" xmlns:w16du="http://schemas.microsoft.com/office/word/2023/wordml/word16du" xmlns:w16sdtdh="http://schemas.microsoft.com/office/word/2020/wordml/sdtdatahash" xmlns:w16sdtfl="http://schemas.microsoft.com/office/word/2024/wordml/sdtformatlock" xmlns:w16se="http://schemas.microsoft.com/office/word/2015/wordml/symex" xmlns:wpg="http://schemas.microsoft.com/office/word/2010/wordprocessingGroup" xmlns:wpi="http://schemas.microsoft.com/office/word/2010/wordprocessingInk" xmlns:wne="http://schemas.microsoft.com/office/word/2006/wordml" xmlns:wps="http://schemas.microsoft.com/office/word/2010/wordprocessingShape" mc:Ignorable="w14 w15 w16se w16cid w16 w16cex w16sdtdh w16sdtfl w16du wp14">
+<w:document xmlns:wpc="http://schemas.microsoft.com/office/word/2010/wordprocessingCanvas" xmlns:cx="http://schemas.microsoft.com/office/drawing/2014/chartex" xmlns:cx1="http://schemas.microsoft.com/office/drawing/2015/9/8/chartex" xmlns:cx2="http://schemas.microsoft.com/office/drawing/2015/10/21/chartex" xmlns:cx3="http://schemas.microsoft.com/office/drawing/2016/5/9/chartex" xmlns:cx4="http://schemas.microsoft.com/office/drawing/2016/5/10/chartex" xmlns:cx5="http://schemas.microsoft.com/office/drawing/2016/5/11/chartex" xmlns:cx6="http://schemas.microsoft.com/office/drawing/2016/5/12/chartex" xmlns:cx7="http://schemas.microsoft.com/office/drawing/2016/5/13/chartex" xmlns:cx8="http://schemas.microsoft.com/office/drawing/2016/5/14/chartex" xmlns:mc="http://schemas.openxmlformats.org/markup-compatibility/2006" xmlns:m="http://schemas.openxmlformats.org/officeDocument/2006/math" xmlns:aink="http://schemas.microsoft.com/office/drawing/2016/ink" xmlns:am3d="http://schemas.microsoft.com/office/drawing/2017/model3d" xmlns:oel="http://schemas.microsoft.com/office/2019/extlst" xmlns:r="http://schemas.openxmlformats.org/officeDocument/2006/relationships" xmlns:wp14="http://schemas.microsoft.com/office/word/2010/wordprocessingDrawing" xmlns:wp="http://schemas.openxmlformats.org/drawingml/2006/wordprocessingDrawing" xmlns:wpg="http://schemas.microsoft.com/office/word/2010/wordprocessingGroup" xmlns:wpi="http://schemas.microsoft.com/office/word/2010/wordprocessingInk" xmlns:wps="http://schemas.microsoft.com/office/word/2010/wordprocessingShape" xmlns:o="urn:schemas-microsoft-com:office:office" xmlns:v="urn:schemas-microsoft-com:vml" xmlns:w10="urn:schemas-microsoft-com:office:word" xmlns:w="http://schemas.openxmlformats.org/wordprocessingml/2006/main" xmlns:w14="http://schemas.microsoft.com/office/word/2010/wordml" xmlns:w15="http://schemas.microsoft.com/office/word/2012/wordml" xmlns:w16cei="http://schemas.microsoft.com/office/word/2026/wordml/cei" xmlns:w16cex="http://schemas.microsoft.com/office/word/2018/wordml/cex" xmlns:w16cid="http://schemas.microsoft.com/office/word/2016/wordml/cid" xmlns:w16="http://schemas.microsoft.com/office/word/2018/wordml" xmlns:w16sdtdh="http://schemas.microsoft.com/office/word/2020/wordml/sdtdatahash" xmlns:w16sdtfl="http://schemas.microsoft.com/office/word/2024/wordml/sdtformatlock" xmlns:w16se="http://schemas.microsoft.com/office/word/2015/wordml/symex" xmlns:w16du="http://schemas.microsoft.com/office/word/2023/wordml/word16du" xmlns:wne="http://schemas.microsoft.com/office/word/2006/wordml" mc:Ignorable="w14 w15 w16se w16cid w16 w16cex w16sdtdh w16sdtfl w16du wp14">
   <w:body>
     <w:p>
       <w:pPr>
@@ -424,16 +424,91 @@
           <w:szCs w:val="20"/>
           <w:lang w:bidi="en-US"/>
         </w:rPr>
-        <w:t>{{article.source}}</w:t>
-      </w:r>
-      <w:r>
-        <w:rPr>
-          <w:rFonts w:ascii="Arial" w:hAnsi="Arial" w:cs="Arial"/>
-          <w:sz w:val="20"/>
-          <w:szCs w:val="20"/>
-          <w:lang w:bidi="en-US"/>
-        </w:rPr>
-        <w:t>) {{article.date}}</w:t>
+        <w:t>{{</w:t>
+      </w:r>
+      <w:proofErr w:type="spellStart"/>
+      <w:proofErr w:type="gramStart"/>
+      <w:r>
+        <w:rPr>
+          <w:rFonts w:ascii="Arial" w:hAnsi="Arial" w:cs="Arial"/>
+          <w:sz w:val="20"/>
+          <w:szCs w:val="20"/>
+          <w:lang w:bidi="en-US"/>
+        </w:rPr>
+        <w:t>article.source</w:t>
+      </w:r>
+      <w:proofErr w:type="spellEnd"/>
+      <w:proofErr w:type="gramEnd"/>
+      <w:r>
+        <w:rPr>
+          <w:rFonts w:ascii="Arial" w:hAnsi="Arial" w:cs="Arial"/>
+          <w:sz w:val="20"/>
+          <w:szCs w:val="20"/>
+          <w:lang w:bidi="en-US"/>
+        </w:rPr>
+        <w:t>}}</w:t>
+      </w:r>
+      <w:r>
+        <w:rPr>
+          <w:rFonts w:ascii="Arial" w:hAnsi="Arial" w:cs="Arial"/>
+          <w:sz w:val="20"/>
+          <w:szCs w:val="20"/>
+          <w:lang w:bidi="en-US"/>
+        </w:rPr>
+        <w:t>/{{</w:t>
+      </w:r>
+      <w:proofErr w:type="spellStart"/>
+      <w:proofErr w:type="gramStart"/>
+      <w:r>
+        <w:rPr>
+          <w:rFonts w:ascii="Arial" w:hAnsi="Arial" w:cs="Arial"/>
+          <w:sz w:val="20"/>
+          <w:szCs w:val="20"/>
+          <w:lang w:bidi="en-US"/>
+        </w:rPr>
+        <w:t>article.author</w:t>
+      </w:r>
+      <w:proofErr w:type="spellEnd"/>
+      <w:proofErr w:type="gramEnd"/>
+      <w:r>
+        <w:rPr>
+          <w:rFonts w:ascii="Arial" w:hAnsi="Arial" w:cs="Arial"/>
+          <w:sz w:val="20"/>
+          <w:szCs w:val="20"/>
+          <w:lang w:bidi="en-US"/>
+        </w:rPr>
+        <w:t>}}</w:t>
+      </w:r>
+      <w:r>
+        <w:rPr>
+          <w:rFonts w:ascii="Arial" w:hAnsi="Arial" w:cs="Arial"/>
+          <w:sz w:val="20"/>
+          <w:szCs w:val="20"/>
+          <w:lang w:bidi="en-US"/>
+        </w:rPr>
+        <w:t>) {{</w:t>
+      </w:r>
+      <w:proofErr w:type="spellStart"/>
+      <w:proofErr w:type="gramStart"/>
+      <w:r>
+        <w:rPr>
+          <w:rFonts w:ascii="Arial" w:hAnsi="Arial" w:cs="Arial"/>
+          <w:sz w:val="20"/>
+          <w:szCs w:val="20"/>
+          <w:lang w:bidi="en-US"/>
+        </w:rPr>
+        <w:t>article.date</w:t>
+      </w:r>
+      <w:proofErr w:type="spellEnd"/>
+      <w:proofErr w:type="gramEnd"/>
+      <w:r>
+        <w:rPr>
+          <w:rFonts w:ascii="Arial" w:hAnsi="Arial" w:cs="Arial"/>
+          <w:sz w:val="20"/>
+          <w:szCs w:val="20"/>
+          <w:lang w:bidi="en-US"/>
+        </w:rPr>
+        <w:t>}}</w:t>
       </w:r>
     </w:p>
     <w:p>
@@ -805,25 +880,74 @@
           <w:szCs w:val="20"/>
           <w:lang w:bidi="en-US"/>
         </w:rPr>
-        <w:t>(</w:t>
-      </w:r>
-      <w:r>
-        <w:rPr>
-          <w:rFonts w:ascii="Arial" w:hAnsi="Arial" w:cs="Arial"/>
-          <w:sz w:val="20"/>
-          <w:szCs w:val="20"/>
-          <w:lang w:bidi="en-US"/>
-        </w:rPr>
-        <w:t>{{article.source}})</w:t>
-      </w:r>
-      <w:r>
-        <w:rPr>
-          <w:rFonts w:ascii="Arial" w:hAnsi="Arial" w:cs="Arial"/>
-          <w:sz w:val="20"/>
-          <w:szCs w:val="20"/>
-          <w:lang w:bidi="en-US"/>
-        </w:rPr>
-        <w:t xml:space="preserve"> {{article.date}}</w:t>
+        <w:t>({{</w:t>
+      </w:r>
+      <w:proofErr w:type="spellStart"/>
+      <w:r>
+        <w:rPr>
+          <w:rFonts w:ascii="Arial" w:hAnsi="Arial" w:cs="Arial"/>
+          <w:sz w:val="20"/>
+          <w:szCs w:val="20"/>
+          <w:lang w:bidi="en-US"/>
+        </w:rPr>
+        <w:t>article.source</w:t>
+      </w:r>
+      <w:proofErr w:type="spellEnd"/>
+      <w:r>
+        <w:rPr>
+          <w:rFonts w:ascii="Arial" w:hAnsi="Arial" w:cs="Arial"/>
+          <w:sz w:val="20"/>
+          <w:szCs w:val="20"/>
+          <w:lang w:bidi="en-US"/>
+        </w:rPr>
+        <w:t>}}</w:t>
+      </w:r>
+      <w:r>
+        <w:rPr>
+          <w:rFonts w:ascii="Arial" w:hAnsi="Arial" w:cs="Arial"/>
+          <w:sz w:val="20"/>
+          <w:szCs w:val="20"/>
+          <w:lang w:bidi="en-US"/>
+        </w:rPr>
+        <w:t>/{{</w:t>
+      </w:r>
+      <w:proofErr w:type="spellStart"/>
+      <w:r>
+        <w:rPr>
+          <w:rFonts w:ascii="Arial" w:hAnsi="Arial" w:cs="Arial"/>
+          <w:sz w:val="20"/>
+          <w:szCs w:val="20"/>
+          <w:lang w:bidi="en-US"/>
+        </w:rPr>
+        <w:t>article.author</w:t>
+      </w:r>
+      <w:proofErr w:type="spellEnd"/>
+      <w:r>
+        <w:rPr>
+          <w:rFonts w:ascii="Arial" w:hAnsi="Arial" w:cs="Arial"/>
+          <w:sz w:val="20"/>
+          <w:szCs w:val="20"/>
+          <w:lang w:bidi="en-US"/>
+        </w:rPr>
+        <w:t>}}</w:t>
+      </w:r>
+      <w:r>
+        <w:rPr>
+          <w:rFonts w:ascii="Arial" w:hAnsi="Arial" w:cs="Arial"/>
+          <w:sz w:val="20"/>
+          <w:szCs w:val="20"/>
+          <w:lang w:bidi="en-US"/>
+        </w:rPr>
+        <w:t xml:space="preserve">) </w:t>
+      </w:r>
+      <w:r>
+        <w:rPr>
+          <w:rFonts w:ascii="Arial" w:hAnsi="Arial" w:cs="Arial"/>
+          <w:sz w:val="20"/>
+          <w:szCs w:val="20"/>
+          <w:lang w:bidi="en-US"/>
+        </w:rPr>
+        <w:t>{{article.date}}</w:t>
       </w:r>
     </w:p>
     <w:p>
@@ -1086,7 +1210,7 @@
 </file>
 
 <file path=word/endnotes.xml><?xml version="1.0" encoding="utf-8"?>
-<w:endnotes xmlns:wpc="http://schemas.microsoft.com/office/word/2010/wordprocessingCanvas" xmlns:cx="http://schemas.microsoft.com/office/drawing/2014/chartex" xmlns:cx1="http://schemas.microsoft.com/office/drawing/2015/9/8/chartex" xmlns:cx2="http://schemas.microsoft.com/office/drawing/2015/10/21/chartex" xmlns:cx3="http://schemas.microsoft.com/office/drawing/2016/5/9/chartex" xmlns:cx4="http://schemas.microsoft.com/office/drawing/2016/5/10/chartex" xmlns:cx5="http://schemas.microsoft.com/office/drawing/2016/5/11/chartex" xmlns:cx6="http://schemas.microsoft.com/office/drawing/2016/5/12/chartex" xmlns:cx7="http://schemas.microsoft.com/office/drawing/2016/5/13/chartex" xmlns:cx8="http://schemas.microsoft.com/office/drawing/2016/5/14/chartex" xmlns:mc="http://schemas.openxmlformats.org/markup-compatibility/2006" xmlns:aink="http://schemas.microsoft.com/office/drawing/2016/ink" xmlns:am3d="http://schemas.microsoft.com/office/drawing/2017/model3d" xmlns:o="urn:schemas-microsoft-com:office:office" xmlns:oel="http://schemas.microsoft.com/office/2019/extlst" xmlns:r="http://schemas.openxmlformats.org/officeDocument/2006/relationships" xmlns:m="http://schemas.openxmlformats.org/officeDocument/2006/math" xmlns:v="urn:schemas-microsoft-com:vml" xmlns:wp14="http://schemas.microsoft.com/office/word/2010/wordprocessingDrawing" xmlns:wp="http://schemas.openxmlformats.org/drawingml/2006/wordprocessingDrawing" xmlns:w10="urn:schemas-microsoft-com:office:word" xmlns:w="http://schemas.openxmlformats.org/wordprocessingml/2006/main" xmlns:w14="http://schemas.microsoft.com/office/word/2010/wordml" xmlns:w15="http://schemas.microsoft.com/office/word/2012/wordml" xmlns:w16cex="http://schemas.microsoft.com/office/word/2018/wordml/cex" xmlns:w16cid="http://schemas.microsoft.com/office/word/2016/wordml/cid" xmlns:w16="http://schemas.microsoft.com/office/word/2018/wordml" xmlns:w16du="http://schemas.microsoft.com/office/word/2023/wordml/word16du" xmlns:w16sdtdh="http://schemas.microsoft.com/office/word/2020/wordml/sdtdatahash" xmlns:w16sdtfl="http://schemas.microsoft.com/office/word/2024/wordml/sdtformatlock" xmlns:w16se="http://schemas.microsoft.com/office/word/2015/wordml/symex" xmlns:wpg="http://schemas.microsoft.com/office/word/2010/wordprocessingGroup" xmlns:wpi="http://schemas.microsoft.com/office/word/2010/wordprocessingInk" xmlns:wne="http://schemas.microsoft.com/office/word/2006/wordml" xmlns:wps="http://schemas.microsoft.com/office/word/2010/wordprocessingShape" mc:Ignorable="w14 w15 w16se w16cid w16 w16cex w16sdtdh w16sdtfl w16du wp14">
+<w:endnotes xmlns:wpc="http://schemas.microsoft.com/office/word/2010/wordprocessingCanvas" xmlns:cx="http://schemas.microsoft.com/office/drawing/2014/chartex" xmlns:cx1="http://schemas.microsoft.com/office/drawing/2015/9/8/chartex" xmlns:cx2="http://schemas.microsoft.com/office/drawing/2015/10/21/chartex" xmlns:cx3="http://schemas.microsoft.com/office/drawing/2016/5/9/chartex" xmlns:cx4="http://schemas.microsoft.com/office/drawing/2016/5/10/chartex" xmlns:cx5="http://schemas.microsoft.com/office/drawing/2016/5/11/chartex" xmlns:cx6="http://schemas.microsoft.com/office/drawing/2016/5/12/chartex" xmlns:cx7="http://schemas.microsoft.com/office/drawing/2016/5/13/chartex" xmlns:cx8="http://schemas.microsoft.com/office/drawing/2016/5/14/chartex" xmlns:mc="http://schemas.openxmlformats.org/markup-compatibility/2006" xmlns:m="http://schemas.openxmlformats.org/officeDocument/2006/math" xmlns:aink="http://schemas.microsoft.com/office/drawing/2016/ink" xmlns:am3d="http://schemas.microsoft.com/office/drawing/2017/model3d" xmlns:oel="http://schemas.microsoft.com/office/2019/extlst" xmlns:r="http://schemas.openxmlformats.org/officeDocument/2006/relationships" xmlns:wp14="http://schemas.microsoft.com/office/word/2010/wordprocessingDrawing" xmlns:wp="http://schemas.openxmlformats.org/drawingml/2006/wordprocessingDrawing" xmlns:wpg="http://schemas.microsoft.com/office/word/2010/wordprocessingGroup" xmlns:wpi="http://schemas.microsoft.com/office/word/2010/wordprocessingInk" xmlns:wps="http://schemas.microsoft.com/office/word/2010/wordprocessingShape" xmlns:o="urn:schemas-microsoft-com:office:office" xmlns:v="urn:schemas-microsoft-com:vml" xmlns:w10="urn:schemas-microsoft-com:office:word" xmlns:w="http://schemas.openxmlformats.org/wordprocessingml/2006/main" xmlns:w14="http://schemas.microsoft.com/office/word/2010/wordml" xmlns:w15="http://schemas.microsoft.com/office/word/2012/wordml" xmlns:w16cei="http://schemas.microsoft.com/office/word/2026/wordml/cei" xmlns:w16cex="http://schemas.microsoft.com/office/word/2018/wordml/cex" xmlns:w16cid="http://schemas.microsoft.com/office/word/2016/wordml/cid" xmlns:w16="http://schemas.microsoft.com/office/word/2018/wordml" xmlns:w16sdtdh="http://schemas.microsoft.com/office/word/2020/wordml/sdtdatahash" xmlns:w16sdtfl="http://schemas.microsoft.com/office/word/2024/wordml/sdtformatlock" xmlns:w16se="http://schemas.microsoft.com/office/word/2015/wordml/symex" xmlns:w16du="http://schemas.microsoft.com/office/word/2023/wordml/word16du" xmlns:wne="http://schemas.microsoft.com/office/word/2006/wordml" mc:Ignorable="w14 w15 w16se w16cid w16 w16cex w16sdtdh w16sdtfl w16du wp14">
   <w:endnote w:type="separator" w:id="-1">
     <w:p>
       <w:r>
@@ -1105,7 +1229,7 @@
 </file>
 
 <file path=word/footer1.xml><?xml version="1.0" encoding="utf-8"?>
-<w:ftr xmlns:wpc="http://schemas.microsoft.com/office/word/2010/wordprocessingCanvas" xmlns:cx="http://schemas.microsoft.com/office/drawing/2014/chartex" xmlns:cx1="http://schemas.microsoft.com/office/drawing/2015/9/8/chartex" xmlns:cx2="http://schemas.microsoft.com/office/drawing/2015/10/21/chartex" xmlns:cx3="http://schemas.microsoft.com/office/drawing/2016/5/9/chartex" xmlns:cx4="http://schemas.microsoft.com/office/drawing/2016/5/10/chartex" xmlns:cx5="http://schemas.microsoft.com/office/drawing/2016/5/11/chartex" xmlns:cx6="http://schemas.microsoft.com/office/drawing/2016/5/12/chartex" xmlns:cx7="http://schemas.microsoft.com/office/drawing/2016/5/13/chartex" xmlns:cx8="http://schemas.microsoft.com/office/drawing/2016/5/14/chartex" xmlns:mc="http://schemas.openxmlformats.org/markup-compatibility/2006" xmlns:aink="http://schemas.microsoft.com/office/drawing/2016/ink" xmlns:am3d="http://schemas.microsoft.com/office/drawing/2017/model3d" xmlns:o="urn:schemas-microsoft-com:office:office" xmlns:oel="http://schemas.microsoft.com/office/2019/extlst" xmlns:r="http://schemas.openxmlformats.org/officeDocument/2006/relationships" xmlns:m="http://schemas.openxmlformats.org/officeDocument/2006/math" xmlns:v="urn:schemas-microsoft-com:vml" xmlns:wp14="http://schemas.microsoft.com/office/word/2010/wordprocessingDrawing" xmlns:wp="http://schemas.openxmlformats.org/drawingml/2006/wordprocessingDrawing" xmlns:w10="urn:schemas-microsoft-com:office:word" xmlns:w="http://schemas.openxmlformats.org/wordprocessingml/2006/main" xmlns:w14="http://schemas.microsoft.com/office/word/2010/wordml" xmlns:w15="http://schemas.microsoft.com/office/word/2012/wordml" xmlns:w16cex="http://schemas.microsoft.com/office/word/2018/wordml/cex" xmlns:w16cid="http://schemas.microsoft.com/office/word/2016/wordml/cid" xmlns:w16="http://schemas.microsoft.com/office/word/2018/wordml" xmlns:w16du="http://schemas.microsoft.com/office/word/2023/wordml/word16du" xmlns:w16sdtdh="http://schemas.microsoft.com/office/word/2020/wordml/sdtdatahash" xmlns:w16sdtfl="http://schemas.microsoft.com/office/word/2024/wordml/sdtformatlock" xmlns:w16se="http://schemas.microsoft.com/office/word/2015/wordml/symex" xmlns:wpg="http://schemas.microsoft.com/office/word/2010/wordprocessingGroup" xmlns:wpi="http://schemas.microsoft.com/office/word/2010/wordprocessingInk" xmlns:wne="http://schemas.microsoft.com/office/word/2006/wordml" xmlns:wps="http://schemas.microsoft.com/office/word/2010/wordprocessingShape" mc:Ignorable="w14 w15 w16se w16cid w16 w16cex w16sdtdh w16sdtfl w16du wp14">
+<w:ftr xmlns:wpc="http://schemas.microsoft.com/office/word/2010/wordprocessingCanvas" xmlns:cx="http://schemas.microsoft.com/office/drawing/2014/chartex" xmlns:cx1="http://schemas.microsoft.com/office/drawing/2015/9/8/chartex" xmlns:cx2="http://schemas.microsoft.com/office/drawing/2015/10/21/chartex" xmlns:cx3="http://schemas.microsoft.com/office/drawing/2016/5/9/chartex" xmlns:cx4="http://schemas.microsoft.com/office/drawing/2016/5/10/chartex" xmlns:cx5="http://schemas.microsoft.com/office/drawing/2016/5/11/chartex" xmlns:cx6="http://schemas.microsoft.com/office/drawing/2016/5/12/chartex" xmlns:cx7="http://schemas.microsoft.com/office/drawing/2016/5/13/chartex" xmlns:cx8="http://schemas.microsoft.com/office/drawing/2016/5/14/chartex" xmlns:mc="http://schemas.openxmlformats.org/markup-compatibility/2006" xmlns:m="http://schemas.openxmlformats.org/officeDocument/2006/math" xmlns:aink="http://schemas.microsoft.com/office/drawing/2016/ink" xmlns:am3d="http://schemas.microsoft.com/office/drawing/2017/model3d" xmlns:oel="http://schemas.microsoft.com/office/2019/extlst" xmlns:r="http://schemas.openxmlformats.org/officeDocument/2006/relationships" xmlns:wp14="http://schemas.microsoft.com/office/word/2010/wordprocessingDrawing" xmlns:wp="http://schemas.openxmlformats.org/drawingml/2006/wordprocessingDrawing" xmlns:wpg="http://schemas.microsoft.com/office/word/2010/wordprocessingGroup" xmlns:wpi="http://schemas.microsoft.com/office/word/2010/wordprocessingInk" xmlns:wps="http://schemas.microsoft.com/office/word/2010/wordprocessingShape" xmlns:o="urn:schemas-microsoft-com:office:office" xmlns:v="urn:schemas-microsoft-com:vml" xmlns:w10="urn:schemas-microsoft-com:office:word" xmlns:w="http://schemas.openxmlformats.org/wordprocessingml/2006/main" xmlns:w14="http://schemas.microsoft.com/office/word/2010/wordml" xmlns:w15="http://schemas.microsoft.com/office/word/2012/wordml" xmlns:w16cei="http://schemas.microsoft.com/office/word/2026/wordml/cei" xmlns:w16cex="http://schemas.microsoft.com/office/word/2018/wordml/cex" xmlns:w16cid="http://schemas.microsoft.com/office/word/2016/wordml/cid" xmlns:w16="http://schemas.microsoft.com/office/word/2018/wordml" xmlns:w16sdtdh="http://schemas.microsoft.com/office/word/2020/wordml/sdtdatahash" xmlns:w16sdtfl="http://schemas.microsoft.com/office/word/2024/wordml/sdtformatlock" xmlns:w16se="http://schemas.microsoft.com/office/word/2015/wordml/symex" xmlns:w16du="http://schemas.microsoft.com/office/word/2023/wordml/word16du" xmlns:wne="http://schemas.microsoft.com/office/word/2006/wordml" mc:Ignorable="w14 w15 w16se w16cid w16 w16cex w16sdtdh w16sdtfl w16du wp14">
   <w:p>
     <w:pPr>
       <w:pStyle w:val="Footer"/>
@@ -1116,7 +1240,7 @@
 </file>
 
 <file path=word/footer2.xml><?xml version="1.0" encoding="utf-8"?>
-<w:ftr xmlns:wpc="http://schemas.microsoft.com/office/word/2010/wordprocessingCanvas" xmlns:cx="http://schemas.microsoft.com/office/drawing/2014/chartex" xmlns:cx1="http://schemas.microsoft.com/office/drawing/2015/9/8/chartex" xmlns:cx2="http://schemas.microsoft.com/office/drawing/2015/10/21/chartex" xmlns:cx3="http://schemas.microsoft.com/office/drawing/2016/5/9/chartex" xmlns:cx4="http://schemas.microsoft.com/office/drawing/2016/5/10/chartex" xmlns:cx5="http://schemas.microsoft.com/office/drawing/2016/5/11/chartex" xmlns:cx6="http://schemas.microsoft.com/office/drawing/2016/5/12/chartex" xmlns:cx7="http://schemas.microsoft.com/office/drawing/2016/5/13/chartex" xmlns:cx8="http://schemas.microsoft.com/office/drawing/2016/5/14/chartex" xmlns:mc="http://schemas.openxmlformats.org/markup-compatibility/2006" xmlns:aink="http://schemas.microsoft.com/office/drawing/2016/ink" xmlns:am3d="http://schemas.microsoft.com/office/drawing/2017/model3d" xmlns:o="urn:schemas-microsoft-com:office:office" xmlns:oel="http://schemas.microsoft.com/office/2019/extlst" xmlns:r="http://schemas.openxmlformats.org/officeDocument/2006/relationships" xmlns:m="http://schemas.openxmlformats.org/officeDocument/2006/math" xmlns:v="urn:schemas-microsoft-com:vml" xmlns:wp14="http://schemas.microsoft.com/office/word/2010/wordprocessingDrawing" xmlns:wp="http://schemas.openxmlformats.org/drawingml/2006/wordprocessingDrawing" xmlns:w10="urn:schemas-microsoft-com:office:word" xmlns:w="http://schemas.openxmlformats.org/wordprocessingml/2006/main" xmlns:w14="http://schemas.microsoft.com/office/word/2010/wordml" xmlns:w15="http://schemas.microsoft.com/office/word/2012/wordml" xmlns:w16cex="http://schemas.microsoft.com/office/word/2018/wordml/cex" xmlns:w16cid="http://schemas.microsoft.com/office/word/2016/wordml/cid" xmlns:w16="http://schemas.microsoft.com/office/word/2018/wordml" xmlns:w16du="http://schemas.microsoft.com/office/word/2023/wordml/word16du" xmlns:w16sdtdh="http://schemas.microsoft.com/office/word/2020/wordml/sdtdatahash" xmlns:w16sdtfl="http://schemas.microsoft.com/office/word/2024/wordml/sdtformatlock" xmlns:w16se="http://schemas.microsoft.com/office/word/2015/wordml/symex" xmlns:wpg="http://schemas.microsoft.com/office/word/2010/wordprocessingGroup" xmlns:wpi="http://schemas.microsoft.com/office/word/2010/wordprocessingInk" xmlns:wne="http://schemas.microsoft.com/office/word/2006/wordml" xmlns:wps="http://schemas.microsoft.com/office/word/2010/wordprocessingShape" mc:Ignorable="w14 w15 w16se w16cid w16 w16cex w16sdtdh w16sdtfl w16du wp14">
+<w:ftr xmlns:wpc="http://schemas.microsoft.com/office/word/2010/wordprocessingCanvas" xmlns:cx="http://schemas.microsoft.com/office/drawing/2014/chartex" xmlns:cx1="http://schemas.microsoft.com/office/drawing/2015/9/8/chartex" xmlns:cx2="http://schemas.microsoft.com/office/drawing/2015/10/21/chartex" xmlns:cx3="http://schemas.microsoft.com/office/drawing/2016/5/9/chartex" xmlns:cx4="http://schemas.microsoft.com/office/drawing/2016/5/10/chartex" xmlns:cx5="http://schemas.microsoft.com/office/drawing/2016/5/11/chartex" xmlns:cx6="http://schemas.microsoft.com/office/drawing/2016/5/12/chartex" xmlns:cx7="http://schemas.microsoft.com/office/drawing/2016/5/13/chartex" xmlns:cx8="http://schemas.microsoft.com/office/drawing/2016/5/14/chartex" xmlns:mc="http://schemas.openxmlformats.org/markup-compatibility/2006" xmlns:m="http://schemas.openxmlformats.org/officeDocument/2006/math" xmlns:aink="http://schemas.microsoft.com/office/drawing/2016/ink" xmlns:am3d="http://schemas.microsoft.com/office/drawing/2017/model3d" xmlns:oel="http://schemas.microsoft.com/office/2019/extlst" xmlns:r="http://schemas.openxmlformats.org/officeDocument/2006/relationships" xmlns:wp14="http://schemas.microsoft.com/office/word/2010/wordprocessingDrawing" xmlns:wp="http://schemas.openxmlformats.org/drawingml/2006/wordprocessingDrawing" xmlns:wpg="http://schemas.microsoft.com/office/word/2010/wordprocessingGroup" xmlns:wpi="http://schemas.microsoft.com/office/word/2010/wordprocessingInk" xmlns:wps="http://schemas.microsoft.com/office/word/2010/wordprocessingShape" xmlns:o="urn:schemas-microsoft-com:office:office" xmlns:v="urn:schemas-microsoft-com:vml" xmlns:w10="urn:schemas-microsoft-com:office:word" xmlns:w="http://schemas.openxmlformats.org/wordprocessingml/2006/main" xmlns:w14="http://schemas.microsoft.com/office/word/2010/wordml" xmlns:w15="http://schemas.microsoft.com/office/word/2012/wordml" xmlns:w16cei="http://schemas.microsoft.com/office/word/2026/wordml/cei" xmlns:w16cex="http://schemas.microsoft.com/office/word/2018/wordml/cex" xmlns:w16cid="http://schemas.microsoft.com/office/word/2016/wordml/cid" xmlns:w16="http://schemas.microsoft.com/office/word/2018/wordml" xmlns:w16sdtdh="http://schemas.microsoft.com/office/word/2020/wordml/sdtdatahash" xmlns:w16sdtfl="http://schemas.microsoft.com/office/word/2024/wordml/sdtformatlock" xmlns:w16se="http://schemas.microsoft.com/office/word/2015/wordml/symex" xmlns:w16du="http://schemas.microsoft.com/office/word/2023/wordml/word16du" xmlns:wne="http://schemas.microsoft.com/office/word/2006/wordml" mc:Ignorable="w14 w15 w16se w16cid w16 w16cex w16sdtdh w16sdtfl w16du wp14">
   <w:p>
     <w:pPr>
       <w:tabs>
@@ -1135,7 +1259,7 @@
 </file>
 
 <file path=word/footnotes.xml><?xml version="1.0" encoding="utf-8"?>
-<w:footnotes xmlns:wpc="http://schemas.microsoft.com/office/word/2010/wordprocessingCanvas" xmlns:cx="http://schemas.microsoft.com/office/drawing/2014/chartex" xmlns:cx1="http://schemas.microsoft.com/office/drawing/2015/9/8/chartex" xmlns:cx2="http://schemas.microsoft.com/office/drawing/2015/10/21/chartex" xmlns:cx3="http://schemas.microsoft.com/office/drawing/2016/5/9/chartex" xmlns:cx4="http://schemas.microsoft.com/office/drawing/2016/5/10/chartex" xmlns:cx5="http://schemas.microsoft.com/office/drawing/2016/5/11/chartex" xmlns:cx6="http://schemas.microsoft.com/office/drawing/2016/5/12/chartex" xmlns:cx7="http://schemas.microsoft.com/office/drawing/2016/5/13/chartex" xmlns:cx8="http://schemas.microsoft.com/office/drawing/2016/5/14/chartex" xmlns:mc="http://schemas.openxmlformats.org/markup-compatibility/2006" xmlns:aink="http://schemas.microsoft.com/office/drawing/2016/ink" xmlns:am3d="http://schemas.microsoft.com/office/drawing/2017/model3d" xmlns:o="urn:schemas-microsoft-com:office:office" xmlns:oel="http://schemas.microsoft.com/office/2019/extlst" xmlns:r="http://schemas.openxmlformats.org/officeDocument/2006/relationships" xmlns:m="http://schemas.openxmlformats.org/officeDocument/2006/math" xmlns:v="urn:schemas-microsoft-com:vml" xmlns:wp14="http://schemas.microsoft.com/office/word/2010/wordprocessingDrawing" xmlns:wp="http://schemas.openxmlformats.org/drawingml/2006/wordprocessingDrawing" xmlns:w10="urn:schemas-microsoft-com:office:word" xmlns:w="http://schemas.openxmlformats.org/wordprocessingml/2006/main" xmlns:w14="http://schemas.microsoft.com/office/word/2010/wordml" xmlns:w15="http://schemas.microsoft.com/office/word/2012/wordml" xmlns:w16cex="http://schemas.microsoft.com/office/word/2018/wordml/cex" xmlns:w16cid="http://schemas.microsoft.com/office/word/2016/wordml/cid" xmlns:w16="http://schemas.microsoft.com/office/word/2018/wordml" xmlns:w16du="http://schemas.microsoft.com/office/word/2023/wordml/word16du" xmlns:w16sdtdh="http://schemas.microsoft.com/office/word/2020/wordml/sdtdatahash" xmlns:w16sdtfl="http://schemas.microsoft.com/office/word/2024/wordml/sdtformatlock" xmlns:w16se="http://schemas.microsoft.com/office/word/2015/wordml/symex" xmlns:wpg="http://schemas.microsoft.com/office/word/2010/wordprocessingGroup" xmlns:wpi="http://schemas.microsoft.com/office/word/2010/wordprocessingInk" xmlns:wne="http://schemas.microsoft.com/office/word/2006/wordml" xmlns:wps="http://schemas.microsoft.com/office/word/2010/wordprocessingShape" mc:Ignorable="w14 w15 w16se w16cid w16 w16cex w16sdtdh w16sdtfl w16du wp14">
+<w:footnotes xmlns:wpc="http://schemas.microsoft.com/office/word/2010/wordprocessingCanvas" xmlns:cx="http://schemas.microsoft.com/office/drawing/2014/chartex" xmlns:cx1="http://schemas.microsoft.com/office/drawing/2015/9/8/chartex" xmlns:cx2="http://schemas.microsoft.com/office/drawing/2015/10/21/chartex" xmlns:cx3="http://schemas.microsoft.com/office/drawing/2016/5/9/chartex" xmlns:cx4="http://schemas.microsoft.com/office/drawing/2016/5/10/chartex" xmlns:cx5="http://schemas.microsoft.com/office/drawing/2016/5/11/chartex" xmlns:cx6="http://schemas.microsoft.com/office/drawing/2016/5/12/chartex" xmlns:cx7="http://schemas.microsoft.com/office/drawing/2016/5/13/chartex" xmlns:cx8="http://schemas.microsoft.com/office/drawing/2016/5/14/chartex" xmlns:mc="http://schemas.openxmlformats.org/markup-compatibility/2006" xmlns:m="http://schemas.openxmlformats.org/officeDocument/2006/math" xmlns:aink="http://schemas.microsoft.com/office/drawing/2016/ink" xmlns:am3d="http://schemas.microsoft.com/office/drawing/2017/model3d" xmlns:oel="http://schemas.microsoft.com/office/2019/extlst" xmlns:r="http://schemas.openxmlformats.org/officeDocument/2006/relationships" xmlns:wp14="http://schemas.microsoft.com/office/word/2010/wordprocessingDrawing" xmlns:wp="http://schemas.openxmlformats.org/drawingml/2006/wordprocessingDrawing" xmlns:wpg="http://schemas.microsoft.com/office/word/2010/wordprocessingGroup" xmlns:wpi="http://schemas.microsoft.com/office/word/2010/wordprocessingInk" xmlns:wps="http://schemas.microsoft.com/office/word/2010/wordprocessingShape" xmlns:o="urn:schemas-microsoft-com:office:office" xmlns:v="urn:schemas-microsoft-com:vml" xmlns:w10="urn:schemas-microsoft-com:office:word" xmlns:w="http://schemas.openxmlformats.org/wordprocessingml/2006/main" xmlns:w14="http://schemas.microsoft.com/office/word/2010/wordml" xmlns:w15="http://schemas.microsoft.com/office/word/2012/wordml" xmlns:w16cei="http://schemas.microsoft.com/office/word/2026/wordml/cei" xmlns:w16cex="http://schemas.microsoft.com/office/word/2018/wordml/cex" xmlns:w16cid="http://schemas.microsoft.com/office/word/2016/wordml/cid" xmlns:w16="http://schemas.microsoft.com/office/word/2018/wordml" xmlns:w16sdtdh="http://schemas.microsoft.com/office/word/2020/wordml/sdtdatahash" xmlns:w16sdtfl="http://schemas.microsoft.com/office/word/2024/wordml/sdtformatlock" xmlns:w16se="http://schemas.microsoft.com/office/word/2015/wordml/symex" xmlns:w16du="http://schemas.microsoft.com/office/word/2023/wordml/word16du" xmlns:wne="http://schemas.microsoft.com/office/word/2006/wordml" mc:Ignorable="w14 w15 w16se w16cid w16 w16cex w16sdtdh w16sdtfl w16du wp14">
   <w:footnote w:type="separator" w:id="-1">
     <w:p>
       <w:r>
@@ -1154,7 +1278,7 @@
 </file>
 
 <file path=word/header1.xml><?xml version="1.0" encoding="utf-8"?>
-<w:hdr xmlns:wpc="http://schemas.microsoft.com/office/word/2010/wordprocessingCanvas" xmlns:cx="http://schemas.microsoft.com/office/drawing/2014/chartex" xmlns:cx1="http://schemas.microsoft.com/office/drawing/2015/9/8/chartex" xmlns:cx2="http://schemas.microsoft.com/office/drawing/2015/10/21/chartex" xmlns:cx3="http://schemas.microsoft.com/office/drawing/2016/5/9/chartex" xmlns:cx4="http://schemas.microsoft.com/office/drawing/2016/5/10/chartex" xmlns:cx5="http://schemas.microsoft.com/office/drawing/2016/5/11/chartex" xmlns:cx6="http://schemas.microsoft.com/office/drawing/2016/5/12/chartex" xmlns:cx7="http://schemas.microsoft.com/office/drawing/2016/5/13/chartex" xmlns:cx8="http://schemas.microsoft.com/office/drawing/2016/5/14/chartex" xmlns:mc="http://schemas.openxmlformats.org/markup-compatibility/2006" xmlns:aink="http://schemas.microsoft.com/office/drawing/2016/ink" xmlns:am3d="http://schemas.microsoft.com/office/drawing/2017/model3d" xmlns:o="urn:schemas-microsoft-com:office:office" xmlns:oel="http://schemas.microsoft.com/office/2019/extlst" xmlns:r="http://schemas.openxmlformats.org/officeDocument/2006/relationships" xmlns:m="http://schemas.openxmlformats.org/officeDocument/2006/math" xmlns:v="urn:schemas-microsoft-com:vml" xmlns:wp14="http://schemas.microsoft.com/office/word/2010/wordprocessingDrawing" xmlns:wp="http://schemas.openxmlformats.org/drawingml/2006/wordprocessingDrawing" xmlns:w10="urn:schemas-microsoft-com:office:word" xmlns:w="http://schemas.openxmlformats.org/wordprocessingml/2006/main" xmlns:w14="http://schemas.microsoft.com/office/word/2010/wordml" xmlns:w15="http://schemas.microsoft.com/office/word/2012/wordml" xmlns:w16cex="http://schemas.microsoft.com/office/word/2018/wordml/cex" xmlns:w16cid="http://schemas.microsoft.com/office/word/2016/wordml/cid" xmlns:w16="http://schemas.microsoft.com/office/word/2018/wordml" xmlns:w16du="http://schemas.microsoft.com/office/word/2023/wordml/word16du" xmlns:w16sdtdh="http://schemas.microsoft.com/office/word/2020/wordml/sdtdatahash" xmlns:w16sdtfl="http://schemas.microsoft.com/office/word/2024/wordml/sdtformatlock" xmlns:w16se="http://schemas.microsoft.com/office/word/2015/wordml/symex" xmlns:wpg="http://schemas.microsoft.com/office/word/2010/wordprocessingGroup" xmlns:wpi="http://schemas.microsoft.com/office/word/2010/wordprocessingInk" xmlns:wne="http://schemas.microsoft.com/office/word/2006/wordml" xmlns:wps="http://schemas.microsoft.com/office/word/2010/wordprocessingShape" mc:Ignorable="w14 w15 w16se w16cid w16 w16cex w16sdtdh w16sdtfl w16du wp14">
+<w:hdr xmlns:wpc="http://schemas.microsoft.com/office/word/2010/wordprocessingCanvas" xmlns:cx="http://schemas.microsoft.com/office/drawing/2014/chartex" xmlns:cx1="http://schemas.microsoft.com/office/drawing/2015/9/8/chartex" xmlns:cx2="http://schemas.microsoft.com/office/drawing/2015/10/21/chartex" xmlns:cx3="http://schemas.microsoft.com/office/drawing/2016/5/9/chartex" xmlns:cx4="http://schemas.microsoft.com/office/drawing/2016/5/10/chartex" xmlns:cx5="http://schemas.microsoft.com/office/drawing/2016/5/11/chartex" xmlns:cx6="http://schemas.microsoft.com/office/drawing/2016/5/12/chartex" xmlns:cx7="http://schemas.microsoft.com/office/drawing/2016/5/13/chartex" xmlns:cx8="http://schemas.microsoft.com/office/drawing/2016/5/14/chartex" xmlns:mc="http://schemas.openxmlformats.org/markup-compatibility/2006" xmlns:m="http://schemas.openxmlformats.org/officeDocument/2006/math" xmlns:aink="http://schemas.microsoft.com/office/drawing/2016/ink" xmlns:am3d="http://schemas.microsoft.com/office/drawing/2017/model3d" xmlns:oel="http://schemas.microsoft.com/office/2019/extlst" xmlns:r="http://schemas.openxmlformats.org/officeDocument/2006/relationships" xmlns:wp14="http://schemas.microsoft.com/office/word/2010/wordprocessingDrawing" xmlns:wp="http://schemas.openxmlformats.org/drawingml/2006/wordprocessingDrawing" xmlns:wpg="http://schemas.microsoft.com/office/word/2010/wordprocessingGroup" xmlns:wpi="http://schemas.microsoft.com/office/word/2010/wordprocessingInk" xmlns:wps="http://schemas.microsoft.com/office/word/2010/wordprocessingShape" xmlns:o="urn:schemas-microsoft-com:office:office" xmlns:v="urn:schemas-microsoft-com:vml" xmlns:w10="urn:schemas-microsoft-com:office:word" xmlns:w="http://schemas.openxmlformats.org/wordprocessingml/2006/main" xmlns:w14="http://schemas.microsoft.com/office/word/2010/wordml" xmlns:w15="http://schemas.microsoft.com/office/word/2012/wordml" xmlns:w16cei="http://schemas.microsoft.com/office/word/2026/wordml/cei" xmlns:w16cex="http://schemas.microsoft.com/office/word/2018/wordml/cex" xmlns:w16cid="http://schemas.microsoft.com/office/word/2016/wordml/cid" xmlns:w16="http://schemas.microsoft.com/office/word/2018/wordml" xmlns:w16sdtdh="http://schemas.microsoft.com/office/word/2020/wordml/sdtdatahash" xmlns:w16sdtfl="http://schemas.microsoft.com/office/word/2024/wordml/sdtformatlock" xmlns:w16se="http://schemas.microsoft.com/office/word/2015/wordml/symex" xmlns:w16du="http://schemas.microsoft.com/office/word/2023/wordml/word16du" xmlns:wne="http://schemas.microsoft.com/office/word/2006/wordml" mc:Ignorable="w14 w15 w16se w16cid w16 w16cex w16sdtdh w16sdtfl w16du wp14">
   <w:p>
     <w:pPr>
       <w:pStyle w:val="Header"/>
@@ -1184,7 +1308,7 @@
 </file>
 
 <file path=word/header2.xml><?xml version="1.0" encoding="utf-8"?>
-<w:hdr xmlns:wpc="http://schemas.microsoft.com/office/word/2010/wordprocessingCanvas" xmlns:cx="http://schemas.microsoft.com/office/drawing/2014/chartex" xmlns:cx1="http://schemas.microsoft.com/office/drawing/2015/9/8/chartex" xmlns:cx2="http://schemas.microsoft.com/office/drawing/2015/10/21/chartex" xmlns:cx3="http://schemas.microsoft.com/office/drawing/2016/5/9/chartex" xmlns:cx4="http://schemas.microsoft.com/office/drawing/2016/5/10/chartex" xmlns:cx5="http://schemas.microsoft.com/office/drawing/2016/5/11/chartex" xmlns:cx6="http://schemas.microsoft.com/office/drawing/2016/5/12/chartex" xmlns:cx7="http://schemas.microsoft.com/office/drawing/2016/5/13/chartex" xmlns:cx8="http://schemas.microsoft.com/office/drawing/2016/5/14/chartex" xmlns:mc="http://schemas.openxmlformats.org/markup-compatibility/2006" xmlns:aink="http://schemas.microsoft.com/office/drawing/2016/ink" xmlns:am3d="http://schemas.microsoft.com/office/drawing/2017/model3d" xmlns:o="urn:schemas-microsoft-com:office:office" xmlns:oel="http://schemas.microsoft.com/office/2019/extlst" xmlns:r="http://schemas.openxmlformats.org/officeDocument/2006/relationships" xmlns:m="http://schemas.openxmlformats.org/officeDocument/2006/math" xmlns:v="urn:schemas-microsoft-com:vml" xmlns:wp14="http://schemas.microsoft.com/office/word/2010/wordprocessingDrawing" xmlns:wp="http://schemas.openxmlformats.org/drawingml/2006/wordprocessingDrawing" xmlns:w10="urn:schemas-microsoft-com:office:word" xmlns:w="http://schemas.openxmlformats.org/wordprocessingml/2006/main" xmlns:w14="http://schemas.microsoft.com/office/word/2010/wordml" xmlns:w15="http://schemas.microsoft.com/office/word/2012/wordml" xmlns:w16cex="http://schemas.microsoft.com/office/word/2018/wordml/cex" xmlns:w16cid="http://schemas.microsoft.com/office/word/2016/wordml/cid" xmlns:w16="http://schemas.microsoft.com/office/word/2018/wordml" xmlns:w16du="http://schemas.microsoft.com/office/word/2023/wordml/word16du" xmlns:w16sdtdh="http://schemas.microsoft.com/office/word/2020/wordml/sdtdatahash" xmlns:w16sdtfl="http://schemas.microsoft.com/office/word/2024/wordml/sdtformatlock" xmlns:w16se="http://schemas.microsoft.com/office/word/2015/wordml/symex" xmlns:wpg="http://schemas.microsoft.com/office/word/2010/wordprocessingGroup" xmlns:wpi="http://schemas.microsoft.com/office/word/2010/wordprocessingInk" xmlns:wne="http://schemas.microsoft.com/office/word/2006/wordml" xmlns:wps="http://schemas.microsoft.com/office/word/2010/wordprocessingShape" mc:Ignorable="w14 w15 w16se w16cid w16 w16cex w16sdtdh w16sdtfl w16du wp14">
+<w:hdr xmlns:wpc="http://schemas.microsoft.com/office/word/2010/wordprocessingCanvas" xmlns:cx="http://schemas.microsoft.com/office/drawing/2014/chartex" xmlns:cx1="http://schemas.microsoft.com/office/drawing/2015/9/8/chartex" xmlns:cx2="http://schemas.microsoft.com/office/drawing/2015/10/21/chartex" xmlns:cx3="http://schemas.microsoft.com/office/drawing/2016/5/9/chartex" xmlns:cx4="http://schemas.microsoft.com/office/drawing/2016/5/10/chartex" xmlns:cx5="http://schemas.microsoft.com/office/drawing/2016/5/11/chartex" xmlns:cx6="http://schemas.microsoft.com/office/drawing/2016/5/12/chartex" xmlns:cx7="http://schemas.microsoft.com/office/drawing/2016/5/13/chartex" xmlns:cx8="http://schemas.microsoft.com/office/drawing/2016/5/14/chartex" xmlns:mc="http://schemas.openxmlformats.org/markup-compatibility/2006" xmlns:m="http://schemas.openxmlformats.org/officeDocument/2006/math" xmlns:aink="http://schemas.microsoft.com/office/drawing/2016/ink" xmlns:am3d="http://schemas.microsoft.com/office/drawing/2017/model3d" xmlns:oel="http://schemas.microsoft.com/office/2019/extlst" xmlns:r="http://schemas.openxmlformats.org/officeDocument/2006/relationships" xmlns:wp14="http://schemas.microsoft.com/office/word/2010/wordprocessingDrawing" xmlns:wp="http://schemas.openxmlformats.org/drawingml/2006/wordprocessingDrawing" xmlns:wpg="http://schemas.microsoft.com/office/word/2010/wordprocessingGroup" xmlns:wpi="http://schemas.microsoft.com/office/word/2010/wordprocessingInk" xmlns:wps="http://schemas.microsoft.com/office/word/2010/wordprocessingShape" xmlns:o="urn:schemas-microsoft-com:office:office" xmlns:v="urn:schemas-microsoft-com:vml" xmlns:w10="urn:schemas-microsoft-com:office:word" xmlns:w="http://schemas.openxmlformats.org/wordprocessingml/2006/main" xmlns:w14="http://schemas.microsoft.com/office/word/2010/wordml" xmlns:w15="http://schemas.microsoft.com/office/word/2012/wordml" xmlns:w16cei="http://schemas.microsoft.com/office/word/2026/wordml/cei" xmlns:w16cex="http://schemas.microsoft.com/office/word/2018/wordml/cex" xmlns:w16cid="http://schemas.microsoft.com/office/word/2016/wordml/cid" xmlns:w16="http://schemas.microsoft.com/office/word/2018/wordml" xmlns:w16sdtdh="http://schemas.microsoft.com/office/word/2020/wordml/sdtdatahash" xmlns:w16sdtfl="http://schemas.microsoft.com/office/word/2024/wordml/sdtformatlock" xmlns:w16se="http://schemas.microsoft.com/office/word/2015/wordml/symex" xmlns:w16du="http://schemas.microsoft.com/office/word/2023/wordml/word16du" xmlns:wne="http://schemas.microsoft.com/office/word/2006/wordml" mc:Ignorable="w14 w15 w16se w16cid w16 w16cex w16sdtdh w16sdtfl w16du wp14">
   <w:p>
     <w:pPr>
       <w:pStyle w:val="Header"/>
@@ -1532,7 +1656,7 @@
 </file>
 
 <file path=word/numbering.xml><?xml version="1.0" encoding="utf-8"?>
-<w:numbering xmlns:wpc="http://schemas.microsoft.com/office/word/2010/wordprocessingCanvas" xmlns:cx="http://schemas.microsoft.com/office/drawing/2014/chartex" xmlns:cx1="http://schemas.microsoft.com/office/drawing/2015/9/8/chartex" xmlns:cx2="http://schemas.microsoft.com/office/drawing/2015/10/21/chartex" xmlns:cx3="http://schemas.microsoft.com/office/drawing/2016/5/9/chartex" xmlns:cx4="http://schemas.microsoft.com/office/drawing/2016/5/10/chartex" xmlns:cx5="http://schemas.microsoft.com/office/drawing/2016/5/11/chartex" xmlns:cx6="http://schemas.microsoft.com/office/drawing/2016/5/12/chartex" xmlns:cx7="http://schemas.microsoft.com/office/drawing/2016/5/13/chartex" xmlns:cx8="http://schemas.microsoft.com/office/drawing/2016/5/14/chartex" xmlns:mc="http://schemas.openxmlformats.org/markup-compatibility/2006" xmlns:aink="http://schemas.microsoft.com/office/drawing/2016/ink" xmlns:am3d="http://schemas.microsoft.com/office/drawing/2017/model3d" xmlns:o="urn:schemas-microsoft-com:office:office" xmlns:oel="http://schemas.microsoft.com/office/2019/extlst" xmlns:r="http://schemas.openxmlformats.org/officeDocument/2006/relationships" xmlns:m="http://schemas.openxmlformats.org/officeDocument/2006/math" xmlns:v="urn:schemas-microsoft-com:vml" xmlns:wp14="http://schemas.microsoft.com/office/word/2010/wordprocessingDrawing" xmlns:wp="http://schemas.openxmlformats.org/drawingml/2006/wordprocessingDrawing" xmlns:w10="urn:schemas-microsoft-com:office:word" xmlns:w="http://schemas.openxmlformats.org/wordprocessingml/2006/main" xmlns:w14="http://schemas.microsoft.com/office/word/2010/wordml" xmlns:w15="http://schemas.microsoft.com/office/word/2012/wordml" xmlns:w16cex="http://schemas.microsoft.com/office/word/2018/wordml/cex" xmlns:w16cid="http://schemas.microsoft.com/office/word/2016/wordml/cid" xmlns:w16="http://schemas.microsoft.com/office/word/2018/wordml" xmlns:w16du="http://schemas.microsoft.com/office/word/2023/wordml/word16du" xmlns:w16sdtdh="http://schemas.microsoft.com/office/word/2020/wordml/sdtdatahash" xmlns:w16sdtfl="http://schemas.microsoft.com/office/word/2024/wordml/sdtformatlock" xmlns:w16se="http://schemas.microsoft.com/office/word/2015/wordml/symex" xmlns:wpg="http://schemas.microsoft.com/office/word/2010/wordprocessingGroup" xmlns:wpi="http://schemas.microsoft.com/office/word/2010/wordprocessingInk" xmlns:wne="http://schemas.microsoft.com/office/word/2006/wordml" xmlns:wps="http://schemas.microsoft.com/office/word/2010/wordprocessingShape" mc:Ignorable="w14 w15 w16se w16cid w16 w16cex w16sdtdh w16sdtfl w16du wp14">
+<w:numbering xmlns:wpc="http://schemas.microsoft.com/office/word/2010/wordprocessingCanvas" xmlns:cx="http://schemas.microsoft.com/office/drawing/2014/chartex" xmlns:cx1="http://schemas.microsoft.com/office/drawing/2015/9/8/chartex" xmlns:cx2="http://schemas.microsoft.com/office/drawing/2015/10/21/chartex" xmlns:cx3="http://schemas.microsoft.com/office/drawing/2016/5/9/chartex" xmlns:cx4="http://schemas.microsoft.com/office/drawing/2016/5/10/chartex" xmlns:cx5="http://schemas.microsoft.com/office/drawing/2016/5/11/chartex" xmlns:cx6="http://schemas.microsoft.com/office/drawing/2016/5/12/chartex" xmlns:cx7="http://schemas.microsoft.com/office/drawing/2016/5/13/chartex" xmlns:cx8="http://schemas.microsoft.com/office/drawing/2016/5/14/chartex" xmlns:mc="http://schemas.openxmlformats.org/markup-compatibility/2006" xmlns:m="http://schemas.openxmlformats.org/officeDocument/2006/math" xmlns:aink="http://schemas.microsoft.com/office/drawing/2016/ink" xmlns:am3d="http://schemas.microsoft.com/office/drawing/2017/model3d" xmlns:oel="http://schemas.microsoft.com/office/2019/extlst" xmlns:r="http://schemas.openxmlformats.org/officeDocument/2006/relationships" xmlns:wp14="http://schemas.microsoft.com/office/word/2010/wordprocessingDrawing" xmlns:wp="http://schemas.openxmlformats.org/drawingml/2006/wordprocessingDrawing" xmlns:wpg="http://schemas.microsoft.com/office/word/2010/wordprocessingGroup" xmlns:wpi="http://schemas.microsoft.com/office/word/2010/wordprocessingInk" xmlns:wps="http://schemas.microsoft.com/office/word/2010/wordprocessingShape" xmlns:o="urn:schemas-microsoft-com:office:office" xmlns:v="urn:schemas-microsoft-com:vml" xmlns:w10="urn:schemas-microsoft-com:office:word" xmlns:w="http://schemas.openxmlformats.org/wordprocessingml/2006/main" xmlns:w14="http://schemas.microsoft.com/office/word/2010/wordml" xmlns:w15="http://schemas.microsoft.com/office/word/2012/wordml" xmlns:w16cei="http://schemas.microsoft.com/office/word/2026/wordml/cei" xmlns:w16cex="http://schemas.microsoft.com/office/word/2018/wordml/cex" xmlns:w16cid="http://schemas.microsoft.com/office/word/2016/wordml/cid" xmlns:w16="http://schemas.microsoft.com/office/word/2018/wordml" xmlns:w16sdtdh="http://schemas.microsoft.com/office/word/2020/wordml/sdtdatahash" xmlns:w16sdtfl="http://schemas.microsoft.com/office/word/2024/wordml/sdtformatlock" xmlns:w16se="http://schemas.microsoft.com/office/word/2015/wordml/symex" xmlns:w16du="http://schemas.microsoft.com/office/word/2023/wordml/word16du" xmlns:wne="http://schemas.microsoft.com/office/word/2006/wordml" mc:Ignorable="w14 w15 w16se w16cid w16 w16cex w16sdtdh w16sdtfl w16du wp14">
   <w:abstractNum w:abstractNumId="0" w15:restartNumberingAfterBreak="0">
     <w:nsid w:val="061B5C9E"/>
     <w:multiLevelType w:val="hybridMultilevel"/>
@@ -2379,7 +2503,7 @@
 </file>
 
 <file path=word/styles.xml><?xml version="1.0" encoding="utf-8"?>
-<w:styles xmlns:mc="http://schemas.openxmlformats.org/markup-compatibility/2006" xmlns:r="http://schemas.openxmlformats.org/officeDocument/2006/relationships" xmlns:w="http://schemas.openxmlformats.org/wordprocessingml/2006/main" xmlns:w14="http://schemas.microsoft.com/office/word/2010/wordml" xmlns:w15="http://schemas.microsoft.com/office/word/2012/wordml" xmlns:w16cex="http://schemas.microsoft.com/office/word/2018/wordml/cex" xmlns:w16cid="http://schemas.microsoft.com/office/word/2016/wordml/cid" xmlns:w16="http://schemas.microsoft.com/office/word/2018/wordml" xmlns:w16du="http://schemas.microsoft.com/office/word/2023/wordml/word16du" xmlns:w16sdtdh="http://schemas.microsoft.com/office/word/2020/wordml/sdtdatahash" xmlns:w16sdtfl="http://schemas.microsoft.com/office/word/2024/wordml/sdtformatlock" xmlns:w16se="http://schemas.microsoft.com/office/word/2015/wordml/symex" mc:Ignorable="w14 w15 w16se w16cid w16 w16cex w16sdtdh w16sdtfl w16du">
+<w:styles xmlns:mc="http://schemas.openxmlformats.org/markup-compatibility/2006" xmlns:r="http://schemas.openxmlformats.org/officeDocument/2006/relationships" xmlns:w="http://schemas.openxmlformats.org/wordprocessingml/2006/main" xmlns:w14="http://schemas.microsoft.com/office/word/2010/wordml" xmlns:w15="http://schemas.microsoft.com/office/word/2012/wordml" xmlns:w16cex="http://schemas.microsoft.com/office/word/2018/wordml/cex" xmlns:w16cid="http://schemas.microsoft.com/office/word/2016/wordml/cid" xmlns:w16="http://schemas.microsoft.com/office/word/2018/wordml" xmlns:w16sdtdh="http://schemas.microsoft.com/office/word/2020/wordml/sdtdatahash" xmlns:w16sdtfl="http://schemas.microsoft.com/office/word/2024/wordml/sdtformatlock" xmlns:w16se="http://schemas.microsoft.com/office/word/2015/wordml/symex" xmlns:w16du="http://schemas.microsoft.com/office/word/2023/wordml/word16du" mc:Ignorable="w14 w15 w16se w16cid w16 w16cex w16sdtdh w16sdtfl w16du">
   <w:docDefaults>
     <w:rPrDefault>
       <w:rPr>
@@ -3553,15 +3677,6 @@
 </file>
 
 <file path=customXml/item1.xml><?xml version="1.0" encoding="utf-8"?>
-<?mso-contentType ?>
-<FormTemplates xmlns="http://schemas.microsoft.com/sharepoint/v3/contenttype/forms">
-  <Display>DocumentLibraryForm</Display>
-  <Edit>DocumentLibraryForm</Edit>
-  <New>DocumentLibraryForm</New>
-</FormTemplates>
-</file>
-
-<file path=customXml/item2.xml><?xml version="1.0" encoding="utf-8"?>
 <p:properties xmlns:p="http://schemas.microsoft.com/office/2006/metadata/properties" xmlns:xsi="http://www.w3.org/2001/XMLSchema-instance" xmlns:pc="http://schemas.microsoft.com/office/infopath/2007/PartnerControls">
   <documentManagement>
     <TaxCatchAll xmlns="38d2a309-d798-495b-b1a3-e97c37808eef"/>
@@ -3574,11 +3689,16 @@
 </p:properties>
 </file>
 
-<file path=customXml/item3.xml><?xml version="1.0" encoding="utf-8"?>
-<b:Sources xmlns:b="http://schemas.openxmlformats.org/officeDocument/2006/bibliography" xmlns="http://schemas.openxmlformats.org/officeDocument/2006/bibliography" SelectedStyle="\APA.XSL" StyleName="APA"/>
+<file path=customXml/item2.xml><?xml version="1.0" encoding="utf-8"?>
+<?mso-contentType ?>
+<FormTemplates xmlns="http://schemas.microsoft.com/sharepoint/v3/contenttype/forms">
+  <Display>DocumentLibraryForm</Display>
+  <Edit>DocumentLibraryForm</Edit>
+  <New>DocumentLibraryForm</New>
+</FormTemplates>
 </file>
 
-<file path=customXml/item4.xml><?xml version="1.0" encoding="utf-8"?>
+<file path=customXml/item3.xml><?xml version="1.0" encoding="utf-8"?>
 <ct:contentTypeSchema xmlns:ct="http://schemas.microsoft.com/office/2006/metadata/contentType" xmlns:ma="http://schemas.microsoft.com/office/2006/metadata/properties/metaAttributes" ct:_="" ma:_="" ma:contentTypeName="Document" ma:contentTypeID="0x010100E48B1925F2EFB241960044EC5F64C034" ma:contentTypeVersion="16" ma:contentTypeDescription="Create a new document." ma:contentTypeScope="" ma:versionID="b193f1a1adb628ee5f7d642c4cb4fead">
   <xsd:schema xmlns:xsd="http://www.w3.org/2001/XMLSchema" xmlns:xs="http://www.w3.org/2001/XMLSchema" xmlns:p="http://schemas.microsoft.com/office/2006/metadata/properties" xmlns:ns1="http://schemas.microsoft.com/sharepoint/v3" xmlns:ns2="416eecfc-56a7-4354-8013-4a2d9c92e153" xmlns:ns3="38d2a309-d798-495b-b1a3-e97c37808eef" targetNamespace="http://schemas.microsoft.com/office/2006/metadata/properties" ma:root="true" ma:fieldsID="f4c72206c132b1461c2865266b50231c" ns1:_="" ns2:_="" ns3:_="">
     <xsd:import namespace="http://schemas.microsoft.com/sharepoint/v3"/>
@@ -3824,15 +3944,11 @@
 </ct:contentTypeSchema>
 </file>
 
-<file path=customXml/itemProps1.xml><?xml version="1.0" encoding="utf-8"?>
-<ds:datastoreItem xmlns:ds="http://schemas.openxmlformats.org/officeDocument/2006/customXml" ds:itemID="{2ACA00A0-0EB9-4F25-B1A0-9480A1DEA0B5}">
-  <ds:schemaRefs>
-    <ds:schemaRef ds:uri="http://schemas.microsoft.com/sharepoint/v3/contenttype/forms"/>
-  </ds:schemaRefs>
-</ds:datastoreItem>
+<file path=customXml/item4.xml><?xml version="1.0" encoding="utf-8"?>
+<b:Sources xmlns:b="http://schemas.openxmlformats.org/officeDocument/2006/bibliography" xmlns="http://schemas.openxmlformats.org/officeDocument/2006/bibliography" SelectedStyle="\APA.XSL" StyleName="APA"/>
 </file>
 
-<file path=customXml/itemProps2.xml><?xml version="1.0" encoding="utf-8"?>
+<file path=customXml/itemProps1.xml><?xml version="1.0" encoding="utf-8"?>
 <ds:datastoreItem xmlns:ds="http://schemas.openxmlformats.org/officeDocument/2006/customXml" ds:itemID="{5D491C04-0035-45EA-BE2E-2976A5F7A397}">
   <ds:schemaRefs>
     <ds:schemaRef ds:uri="http://schemas.microsoft.com/office/2006/metadata/properties"/>
@@ -3844,15 +3960,15 @@
 </ds:datastoreItem>
 </file>
 
-<file path=customXml/itemProps3.xml><?xml version="1.0" encoding="utf-8"?>
-<ds:datastoreItem xmlns:ds="http://schemas.openxmlformats.org/officeDocument/2006/customXml" ds:itemID="{4202E056-596C-4D43-866F-DBCC294656E0}">
+<file path=customXml/itemProps2.xml><?xml version="1.0" encoding="utf-8"?>
+<ds:datastoreItem xmlns:ds="http://schemas.openxmlformats.org/officeDocument/2006/customXml" ds:itemID="{2ACA00A0-0EB9-4F25-B1A0-9480A1DEA0B5}">
   <ds:schemaRefs>
-    <ds:schemaRef ds:uri="http://schemas.openxmlformats.org/officeDocument/2006/bibliography"/>
+    <ds:schemaRef ds:uri="http://schemas.microsoft.com/sharepoint/v3/contenttype/forms"/>
   </ds:schemaRefs>
 </ds:datastoreItem>
 </file>
 
-<file path=customXml/itemProps4.xml><?xml version="1.0" encoding="utf-8"?>
+<file path=customXml/itemProps3.xml><?xml version="1.0" encoding="utf-8"?>
 <ds:datastoreItem xmlns:ds="http://schemas.openxmlformats.org/officeDocument/2006/customXml" ds:itemID="{3AA634C4-AFF1-45A4-BEEC-3BC128C36838}">
   <ds:schemaRefs>
     <ds:schemaRef ds:uri="http://schemas.microsoft.com/office/2006/metadata/contentType"/>
@@ -3872,6 +3988,14 @@
 </ds:datastoreItem>
 </file>
 
+<file path=customXml/itemProps4.xml><?xml version="1.0" encoding="utf-8"?>
+<ds:datastoreItem xmlns:ds="http://schemas.openxmlformats.org/officeDocument/2006/customXml" ds:itemID="{4202E056-596C-4D43-866F-DBCC294656E0}">
+  <ds:schemaRefs>
+    <ds:schemaRef ds:uri="http://schemas.openxmlformats.org/officeDocument/2006/bibliography"/>
+  </ds:schemaRefs>
+</ds:datastoreItem>
+</file>
+
 <file path=docMetadata/LabelInfo.xml><?xml version="1.0" encoding="utf-8"?>
 <clbl:labelList xmlns:clbl="http://schemas.microsoft.com/office/2020/mipLabelMetadata">
   <clbl:label id="{3de9faa6-9fe1-49b3-9a08-227a296b54a6}" enabled="1" method="Privileged" siteId="{66d73691-ea97-48b1-95d5-e94f0a46b878}" contentBits="0" removed="0"/>

</xml_diff>

<commit_message>
Removed summary from template and combined filter
</commit_message>
<xml_diff>
--- a/app/assets/default_template.docx
+++ b/app/assets/default_template.docx
@@ -1,6 +1,6 @@
 
 <file path=word/document.xml><?xml version="1.0" encoding="utf-8"?>
-<w:document xmlns:wpc="http://schemas.microsoft.com/office/word/2010/wordprocessingCanvas" xmlns:cx="http://schemas.microsoft.com/office/drawing/2014/chartex" xmlns:cx1="http://schemas.microsoft.com/office/drawing/2015/9/8/chartex" xmlns:cx2="http://schemas.microsoft.com/office/drawing/2015/10/21/chartex" xmlns:cx3="http://schemas.microsoft.com/office/drawing/2016/5/9/chartex" xmlns:cx4="http://schemas.microsoft.com/office/drawing/2016/5/10/chartex" xmlns:cx5="http://schemas.microsoft.com/office/drawing/2016/5/11/chartex" xmlns:cx6="http://schemas.microsoft.com/office/drawing/2016/5/12/chartex" xmlns:cx7="http://schemas.microsoft.com/office/drawing/2016/5/13/chartex" xmlns:cx8="http://schemas.microsoft.com/office/drawing/2016/5/14/chartex" xmlns:mc="http://schemas.openxmlformats.org/markup-compatibility/2006" xmlns:aink="http://schemas.microsoft.com/office/drawing/2016/ink" xmlns:am3d="http://schemas.microsoft.com/office/drawing/2017/model3d" xmlns:o="urn:schemas-microsoft-com:office:office" xmlns:oel="http://schemas.microsoft.com/office/2019/extlst" xmlns:r="http://schemas.openxmlformats.org/officeDocument/2006/relationships" xmlns:m="http://schemas.openxmlformats.org/officeDocument/2006/math" xmlns:v="urn:schemas-microsoft-com:vml" xmlns:wp14="http://schemas.microsoft.com/office/word/2010/wordprocessingDrawing" xmlns:wp="http://schemas.openxmlformats.org/drawingml/2006/wordprocessingDrawing" xmlns:w10="urn:schemas-microsoft-com:office:word" xmlns:w="http://schemas.openxmlformats.org/wordprocessingml/2006/main" xmlns:w14="http://schemas.microsoft.com/office/word/2010/wordml" xmlns:w15="http://schemas.microsoft.com/office/word/2012/wordml" xmlns:w16cex="http://schemas.microsoft.com/office/word/2018/wordml/cex" xmlns:w16cid="http://schemas.microsoft.com/office/word/2016/wordml/cid" xmlns:w16="http://schemas.microsoft.com/office/word/2018/wordml" xmlns:w16du="http://schemas.microsoft.com/office/word/2023/wordml/word16du" xmlns:w16sdtdh="http://schemas.microsoft.com/office/word/2020/wordml/sdtdatahash" xmlns:w16sdtfl="http://schemas.microsoft.com/office/word/2024/wordml/sdtformatlock" xmlns:w16se="http://schemas.microsoft.com/office/word/2015/wordml/symex" xmlns:wpg="http://schemas.microsoft.com/office/word/2010/wordprocessingGroup" xmlns:wpi="http://schemas.microsoft.com/office/word/2010/wordprocessingInk" xmlns:wne="http://schemas.microsoft.com/office/word/2006/wordml" xmlns:wps="http://schemas.microsoft.com/office/word/2010/wordprocessingShape" mc:Ignorable="w14 w15 w16se w16cid w16 w16cex w16sdtdh w16sdtfl w16du wp14">
+<w:document xmlns:wpc="http://schemas.microsoft.com/office/word/2010/wordprocessingCanvas" xmlns:cx="http://schemas.microsoft.com/office/drawing/2014/chartex" xmlns:cx1="http://schemas.microsoft.com/office/drawing/2015/9/8/chartex" xmlns:cx2="http://schemas.microsoft.com/office/drawing/2015/10/21/chartex" xmlns:cx3="http://schemas.microsoft.com/office/drawing/2016/5/9/chartex" xmlns:cx4="http://schemas.microsoft.com/office/drawing/2016/5/10/chartex" xmlns:cx5="http://schemas.microsoft.com/office/drawing/2016/5/11/chartex" xmlns:cx6="http://schemas.microsoft.com/office/drawing/2016/5/12/chartex" xmlns:cx7="http://schemas.microsoft.com/office/drawing/2016/5/13/chartex" xmlns:cx8="http://schemas.microsoft.com/office/drawing/2016/5/14/chartex" xmlns:mc="http://schemas.openxmlformats.org/markup-compatibility/2006" xmlns:m="http://schemas.openxmlformats.org/officeDocument/2006/math" xmlns:aink="http://schemas.microsoft.com/office/drawing/2016/ink" xmlns:am3d="http://schemas.microsoft.com/office/drawing/2017/model3d" xmlns:oel="http://schemas.microsoft.com/office/2019/extlst" xmlns:r="http://schemas.openxmlformats.org/officeDocument/2006/relationships" xmlns:wp14="http://schemas.microsoft.com/office/word/2010/wordprocessingDrawing" xmlns:wp="http://schemas.openxmlformats.org/drawingml/2006/wordprocessingDrawing" xmlns:wpg="http://schemas.microsoft.com/office/word/2010/wordprocessingGroup" xmlns:wpi="http://schemas.microsoft.com/office/word/2010/wordprocessingInk" xmlns:wps="http://schemas.microsoft.com/office/word/2010/wordprocessingShape" xmlns:o="urn:schemas-microsoft-com:office:office" xmlns:v="urn:schemas-microsoft-com:vml" xmlns:w10="urn:schemas-microsoft-com:office:word" xmlns:w="http://schemas.openxmlformats.org/wordprocessingml/2006/main" xmlns:w14="http://schemas.microsoft.com/office/word/2010/wordml" xmlns:w15="http://schemas.microsoft.com/office/word/2012/wordml" xmlns:w16cei="http://schemas.microsoft.com/office/word/2026/wordml/cei" xmlns:w16cex="http://schemas.microsoft.com/office/word/2018/wordml/cex" xmlns:w16cid="http://schemas.microsoft.com/office/word/2016/wordml/cid" xmlns:w16="http://schemas.microsoft.com/office/word/2018/wordml" xmlns:w16sdtdh="http://schemas.microsoft.com/office/word/2020/wordml/sdtdatahash" xmlns:w16sdtfl="http://schemas.microsoft.com/office/word/2024/wordml/sdtformatlock" xmlns:w16se="http://schemas.microsoft.com/office/word/2015/wordml/symex" xmlns:w16du="http://schemas.microsoft.com/office/word/2023/wordml/word16du" xmlns:wne="http://schemas.microsoft.com/office/word/2006/wordml" mc:Ignorable="w14 w15 w16se w16cid w16 w16cex w16sdtdh w16sdtfl w16du wp14">
   <w:body>
     <w:p>
       <w:pPr>
@@ -440,25 +440,6 @@
       <w:pPr>
         <w:rPr>
           <w:rFonts w:ascii="Arial" w:hAnsi="Arial" w:cs="Arial"/>
-          <w:sz w:val="20"/>
-          <w:szCs w:val="20"/>
-          <w:lang w:bidi="en-US"/>
-        </w:rPr>
-      </w:pPr>
-      <w:r>
-        <w:rPr>
-          <w:rFonts w:ascii="Arial" w:hAnsi="Arial" w:cs="Arial"/>
-          <w:sz w:val="20"/>
-          <w:szCs w:val="20"/>
-          <w:lang w:bidi="en-US"/>
-        </w:rPr>
-        <w:t>{{article.summary}}</w:t>
-      </w:r>
-    </w:p>
-    <w:p>
-      <w:pPr>
-        <w:rPr>
-          <w:rFonts w:ascii="Arial" w:hAnsi="Arial" w:cs="Arial"/>
           <w:lang w:bidi="en-US"/>
         </w:rPr>
       </w:pPr>
@@ -1086,7 +1067,7 @@
 </file>
 
 <file path=word/endnotes.xml><?xml version="1.0" encoding="utf-8"?>
-<w:endnotes xmlns:wpc="http://schemas.microsoft.com/office/word/2010/wordprocessingCanvas" xmlns:cx="http://schemas.microsoft.com/office/drawing/2014/chartex" xmlns:cx1="http://schemas.microsoft.com/office/drawing/2015/9/8/chartex" xmlns:cx2="http://schemas.microsoft.com/office/drawing/2015/10/21/chartex" xmlns:cx3="http://schemas.microsoft.com/office/drawing/2016/5/9/chartex" xmlns:cx4="http://schemas.microsoft.com/office/drawing/2016/5/10/chartex" xmlns:cx5="http://schemas.microsoft.com/office/drawing/2016/5/11/chartex" xmlns:cx6="http://schemas.microsoft.com/office/drawing/2016/5/12/chartex" xmlns:cx7="http://schemas.microsoft.com/office/drawing/2016/5/13/chartex" xmlns:cx8="http://schemas.microsoft.com/office/drawing/2016/5/14/chartex" xmlns:mc="http://schemas.openxmlformats.org/markup-compatibility/2006" xmlns:aink="http://schemas.microsoft.com/office/drawing/2016/ink" xmlns:am3d="http://schemas.microsoft.com/office/drawing/2017/model3d" xmlns:o="urn:schemas-microsoft-com:office:office" xmlns:oel="http://schemas.microsoft.com/office/2019/extlst" xmlns:r="http://schemas.openxmlformats.org/officeDocument/2006/relationships" xmlns:m="http://schemas.openxmlformats.org/officeDocument/2006/math" xmlns:v="urn:schemas-microsoft-com:vml" xmlns:wp14="http://schemas.microsoft.com/office/word/2010/wordprocessingDrawing" xmlns:wp="http://schemas.openxmlformats.org/drawingml/2006/wordprocessingDrawing" xmlns:w10="urn:schemas-microsoft-com:office:word" xmlns:w="http://schemas.openxmlformats.org/wordprocessingml/2006/main" xmlns:w14="http://schemas.microsoft.com/office/word/2010/wordml" xmlns:w15="http://schemas.microsoft.com/office/word/2012/wordml" xmlns:w16cex="http://schemas.microsoft.com/office/word/2018/wordml/cex" xmlns:w16cid="http://schemas.microsoft.com/office/word/2016/wordml/cid" xmlns:w16="http://schemas.microsoft.com/office/word/2018/wordml" xmlns:w16du="http://schemas.microsoft.com/office/word/2023/wordml/word16du" xmlns:w16sdtdh="http://schemas.microsoft.com/office/word/2020/wordml/sdtdatahash" xmlns:w16sdtfl="http://schemas.microsoft.com/office/word/2024/wordml/sdtformatlock" xmlns:w16se="http://schemas.microsoft.com/office/word/2015/wordml/symex" xmlns:wpg="http://schemas.microsoft.com/office/word/2010/wordprocessingGroup" xmlns:wpi="http://schemas.microsoft.com/office/word/2010/wordprocessingInk" xmlns:wne="http://schemas.microsoft.com/office/word/2006/wordml" xmlns:wps="http://schemas.microsoft.com/office/word/2010/wordprocessingShape" mc:Ignorable="w14 w15 w16se w16cid w16 w16cex w16sdtdh w16sdtfl w16du wp14">
+<w:endnotes xmlns:wpc="http://schemas.microsoft.com/office/word/2010/wordprocessingCanvas" xmlns:cx="http://schemas.microsoft.com/office/drawing/2014/chartex" xmlns:cx1="http://schemas.microsoft.com/office/drawing/2015/9/8/chartex" xmlns:cx2="http://schemas.microsoft.com/office/drawing/2015/10/21/chartex" xmlns:cx3="http://schemas.microsoft.com/office/drawing/2016/5/9/chartex" xmlns:cx4="http://schemas.microsoft.com/office/drawing/2016/5/10/chartex" xmlns:cx5="http://schemas.microsoft.com/office/drawing/2016/5/11/chartex" xmlns:cx6="http://schemas.microsoft.com/office/drawing/2016/5/12/chartex" xmlns:cx7="http://schemas.microsoft.com/office/drawing/2016/5/13/chartex" xmlns:cx8="http://schemas.microsoft.com/office/drawing/2016/5/14/chartex" xmlns:mc="http://schemas.openxmlformats.org/markup-compatibility/2006" xmlns:m="http://schemas.openxmlformats.org/officeDocument/2006/math" xmlns:aink="http://schemas.microsoft.com/office/drawing/2016/ink" xmlns:am3d="http://schemas.microsoft.com/office/drawing/2017/model3d" xmlns:oel="http://schemas.microsoft.com/office/2019/extlst" xmlns:r="http://schemas.openxmlformats.org/officeDocument/2006/relationships" xmlns:wp14="http://schemas.microsoft.com/office/word/2010/wordprocessingDrawing" xmlns:wp="http://schemas.openxmlformats.org/drawingml/2006/wordprocessingDrawing" xmlns:wpg="http://schemas.microsoft.com/office/word/2010/wordprocessingGroup" xmlns:wpi="http://schemas.microsoft.com/office/word/2010/wordprocessingInk" xmlns:wps="http://schemas.microsoft.com/office/word/2010/wordprocessingShape" xmlns:o="urn:schemas-microsoft-com:office:office" xmlns:v="urn:schemas-microsoft-com:vml" xmlns:w10="urn:schemas-microsoft-com:office:word" xmlns:w="http://schemas.openxmlformats.org/wordprocessingml/2006/main" xmlns:w14="http://schemas.microsoft.com/office/word/2010/wordml" xmlns:w15="http://schemas.microsoft.com/office/word/2012/wordml" xmlns:w16cei="http://schemas.microsoft.com/office/word/2026/wordml/cei" xmlns:w16cex="http://schemas.microsoft.com/office/word/2018/wordml/cex" xmlns:w16cid="http://schemas.microsoft.com/office/word/2016/wordml/cid" xmlns:w16="http://schemas.microsoft.com/office/word/2018/wordml" xmlns:w16sdtdh="http://schemas.microsoft.com/office/word/2020/wordml/sdtdatahash" xmlns:w16sdtfl="http://schemas.microsoft.com/office/word/2024/wordml/sdtformatlock" xmlns:w16se="http://schemas.microsoft.com/office/word/2015/wordml/symex" xmlns:w16du="http://schemas.microsoft.com/office/word/2023/wordml/word16du" xmlns:wne="http://schemas.microsoft.com/office/word/2006/wordml" mc:Ignorable="w14 w15 w16se w16cid w16 w16cex w16sdtdh w16sdtfl w16du wp14">
   <w:endnote w:type="separator" w:id="-1">
     <w:p>
       <w:r>
@@ -1105,7 +1086,7 @@
 </file>
 
 <file path=word/footer1.xml><?xml version="1.0" encoding="utf-8"?>
-<w:ftr xmlns:wpc="http://schemas.microsoft.com/office/word/2010/wordprocessingCanvas" xmlns:cx="http://schemas.microsoft.com/office/drawing/2014/chartex" xmlns:cx1="http://schemas.microsoft.com/office/drawing/2015/9/8/chartex" xmlns:cx2="http://schemas.microsoft.com/office/drawing/2015/10/21/chartex" xmlns:cx3="http://schemas.microsoft.com/office/drawing/2016/5/9/chartex" xmlns:cx4="http://schemas.microsoft.com/office/drawing/2016/5/10/chartex" xmlns:cx5="http://schemas.microsoft.com/office/drawing/2016/5/11/chartex" xmlns:cx6="http://schemas.microsoft.com/office/drawing/2016/5/12/chartex" xmlns:cx7="http://schemas.microsoft.com/office/drawing/2016/5/13/chartex" xmlns:cx8="http://schemas.microsoft.com/office/drawing/2016/5/14/chartex" xmlns:mc="http://schemas.openxmlformats.org/markup-compatibility/2006" xmlns:aink="http://schemas.microsoft.com/office/drawing/2016/ink" xmlns:am3d="http://schemas.microsoft.com/office/drawing/2017/model3d" xmlns:o="urn:schemas-microsoft-com:office:office" xmlns:oel="http://schemas.microsoft.com/office/2019/extlst" xmlns:r="http://schemas.openxmlformats.org/officeDocument/2006/relationships" xmlns:m="http://schemas.openxmlformats.org/officeDocument/2006/math" xmlns:v="urn:schemas-microsoft-com:vml" xmlns:wp14="http://schemas.microsoft.com/office/word/2010/wordprocessingDrawing" xmlns:wp="http://schemas.openxmlformats.org/drawingml/2006/wordprocessingDrawing" xmlns:w10="urn:schemas-microsoft-com:office:word" xmlns:w="http://schemas.openxmlformats.org/wordprocessingml/2006/main" xmlns:w14="http://schemas.microsoft.com/office/word/2010/wordml" xmlns:w15="http://schemas.microsoft.com/office/word/2012/wordml" xmlns:w16cex="http://schemas.microsoft.com/office/word/2018/wordml/cex" xmlns:w16cid="http://schemas.microsoft.com/office/word/2016/wordml/cid" xmlns:w16="http://schemas.microsoft.com/office/word/2018/wordml" xmlns:w16du="http://schemas.microsoft.com/office/word/2023/wordml/word16du" xmlns:w16sdtdh="http://schemas.microsoft.com/office/word/2020/wordml/sdtdatahash" xmlns:w16sdtfl="http://schemas.microsoft.com/office/word/2024/wordml/sdtformatlock" xmlns:w16se="http://schemas.microsoft.com/office/word/2015/wordml/symex" xmlns:wpg="http://schemas.microsoft.com/office/word/2010/wordprocessingGroup" xmlns:wpi="http://schemas.microsoft.com/office/word/2010/wordprocessingInk" xmlns:wne="http://schemas.microsoft.com/office/word/2006/wordml" xmlns:wps="http://schemas.microsoft.com/office/word/2010/wordprocessingShape" mc:Ignorable="w14 w15 w16se w16cid w16 w16cex w16sdtdh w16sdtfl w16du wp14">
+<w:ftr xmlns:wpc="http://schemas.microsoft.com/office/word/2010/wordprocessingCanvas" xmlns:cx="http://schemas.microsoft.com/office/drawing/2014/chartex" xmlns:cx1="http://schemas.microsoft.com/office/drawing/2015/9/8/chartex" xmlns:cx2="http://schemas.microsoft.com/office/drawing/2015/10/21/chartex" xmlns:cx3="http://schemas.microsoft.com/office/drawing/2016/5/9/chartex" xmlns:cx4="http://schemas.microsoft.com/office/drawing/2016/5/10/chartex" xmlns:cx5="http://schemas.microsoft.com/office/drawing/2016/5/11/chartex" xmlns:cx6="http://schemas.microsoft.com/office/drawing/2016/5/12/chartex" xmlns:cx7="http://schemas.microsoft.com/office/drawing/2016/5/13/chartex" xmlns:cx8="http://schemas.microsoft.com/office/drawing/2016/5/14/chartex" xmlns:mc="http://schemas.openxmlformats.org/markup-compatibility/2006" xmlns:m="http://schemas.openxmlformats.org/officeDocument/2006/math" xmlns:aink="http://schemas.microsoft.com/office/drawing/2016/ink" xmlns:am3d="http://schemas.microsoft.com/office/drawing/2017/model3d" xmlns:oel="http://schemas.microsoft.com/office/2019/extlst" xmlns:r="http://schemas.openxmlformats.org/officeDocument/2006/relationships" xmlns:wp14="http://schemas.microsoft.com/office/word/2010/wordprocessingDrawing" xmlns:wp="http://schemas.openxmlformats.org/drawingml/2006/wordprocessingDrawing" xmlns:wpg="http://schemas.microsoft.com/office/word/2010/wordprocessingGroup" xmlns:wpi="http://schemas.microsoft.com/office/word/2010/wordprocessingInk" xmlns:wps="http://schemas.microsoft.com/office/word/2010/wordprocessingShape" xmlns:o="urn:schemas-microsoft-com:office:office" xmlns:v="urn:schemas-microsoft-com:vml" xmlns:w10="urn:schemas-microsoft-com:office:word" xmlns:w="http://schemas.openxmlformats.org/wordprocessingml/2006/main" xmlns:w14="http://schemas.microsoft.com/office/word/2010/wordml" xmlns:w15="http://schemas.microsoft.com/office/word/2012/wordml" xmlns:w16cei="http://schemas.microsoft.com/office/word/2026/wordml/cei" xmlns:w16cex="http://schemas.microsoft.com/office/word/2018/wordml/cex" xmlns:w16cid="http://schemas.microsoft.com/office/word/2016/wordml/cid" xmlns:w16="http://schemas.microsoft.com/office/word/2018/wordml" xmlns:w16sdtdh="http://schemas.microsoft.com/office/word/2020/wordml/sdtdatahash" xmlns:w16sdtfl="http://schemas.microsoft.com/office/word/2024/wordml/sdtformatlock" xmlns:w16se="http://schemas.microsoft.com/office/word/2015/wordml/symex" xmlns:w16du="http://schemas.microsoft.com/office/word/2023/wordml/word16du" xmlns:wne="http://schemas.microsoft.com/office/word/2006/wordml" mc:Ignorable="w14 w15 w16se w16cid w16 w16cex w16sdtdh w16sdtfl w16du wp14">
   <w:p>
     <w:pPr>
       <w:pStyle w:val="Footer"/>
@@ -1116,7 +1097,7 @@
 </file>
 
 <file path=word/footer2.xml><?xml version="1.0" encoding="utf-8"?>
-<w:ftr xmlns:wpc="http://schemas.microsoft.com/office/word/2010/wordprocessingCanvas" xmlns:cx="http://schemas.microsoft.com/office/drawing/2014/chartex" xmlns:cx1="http://schemas.microsoft.com/office/drawing/2015/9/8/chartex" xmlns:cx2="http://schemas.microsoft.com/office/drawing/2015/10/21/chartex" xmlns:cx3="http://schemas.microsoft.com/office/drawing/2016/5/9/chartex" xmlns:cx4="http://schemas.microsoft.com/office/drawing/2016/5/10/chartex" xmlns:cx5="http://schemas.microsoft.com/office/drawing/2016/5/11/chartex" xmlns:cx6="http://schemas.microsoft.com/office/drawing/2016/5/12/chartex" xmlns:cx7="http://schemas.microsoft.com/office/drawing/2016/5/13/chartex" xmlns:cx8="http://schemas.microsoft.com/office/drawing/2016/5/14/chartex" xmlns:mc="http://schemas.openxmlformats.org/markup-compatibility/2006" xmlns:aink="http://schemas.microsoft.com/office/drawing/2016/ink" xmlns:am3d="http://schemas.microsoft.com/office/drawing/2017/model3d" xmlns:o="urn:schemas-microsoft-com:office:office" xmlns:oel="http://schemas.microsoft.com/office/2019/extlst" xmlns:r="http://schemas.openxmlformats.org/officeDocument/2006/relationships" xmlns:m="http://schemas.openxmlformats.org/officeDocument/2006/math" xmlns:v="urn:schemas-microsoft-com:vml" xmlns:wp14="http://schemas.microsoft.com/office/word/2010/wordprocessingDrawing" xmlns:wp="http://schemas.openxmlformats.org/drawingml/2006/wordprocessingDrawing" xmlns:w10="urn:schemas-microsoft-com:office:word" xmlns:w="http://schemas.openxmlformats.org/wordprocessingml/2006/main" xmlns:w14="http://schemas.microsoft.com/office/word/2010/wordml" xmlns:w15="http://schemas.microsoft.com/office/word/2012/wordml" xmlns:w16cex="http://schemas.microsoft.com/office/word/2018/wordml/cex" xmlns:w16cid="http://schemas.microsoft.com/office/word/2016/wordml/cid" xmlns:w16="http://schemas.microsoft.com/office/word/2018/wordml" xmlns:w16du="http://schemas.microsoft.com/office/word/2023/wordml/word16du" xmlns:w16sdtdh="http://schemas.microsoft.com/office/word/2020/wordml/sdtdatahash" xmlns:w16sdtfl="http://schemas.microsoft.com/office/word/2024/wordml/sdtformatlock" xmlns:w16se="http://schemas.microsoft.com/office/word/2015/wordml/symex" xmlns:wpg="http://schemas.microsoft.com/office/word/2010/wordprocessingGroup" xmlns:wpi="http://schemas.microsoft.com/office/word/2010/wordprocessingInk" xmlns:wne="http://schemas.microsoft.com/office/word/2006/wordml" xmlns:wps="http://schemas.microsoft.com/office/word/2010/wordprocessingShape" mc:Ignorable="w14 w15 w16se w16cid w16 w16cex w16sdtdh w16sdtfl w16du wp14">
+<w:ftr xmlns:wpc="http://schemas.microsoft.com/office/word/2010/wordprocessingCanvas" xmlns:cx="http://schemas.microsoft.com/office/drawing/2014/chartex" xmlns:cx1="http://schemas.microsoft.com/office/drawing/2015/9/8/chartex" xmlns:cx2="http://schemas.microsoft.com/office/drawing/2015/10/21/chartex" xmlns:cx3="http://schemas.microsoft.com/office/drawing/2016/5/9/chartex" xmlns:cx4="http://schemas.microsoft.com/office/drawing/2016/5/10/chartex" xmlns:cx5="http://schemas.microsoft.com/office/drawing/2016/5/11/chartex" xmlns:cx6="http://schemas.microsoft.com/office/drawing/2016/5/12/chartex" xmlns:cx7="http://schemas.microsoft.com/office/drawing/2016/5/13/chartex" xmlns:cx8="http://schemas.microsoft.com/office/drawing/2016/5/14/chartex" xmlns:mc="http://schemas.openxmlformats.org/markup-compatibility/2006" xmlns:m="http://schemas.openxmlformats.org/officeDocument/2006/math" xmlns:aink="http://schemas.microsoft.com/office/drawing/2016/ink" xmlns:am3d="http://schemas.microsoft.com/office/drawing/2017/model3d" xmlns:oel="http://schemas.microsoft.com/office/2019/extlst" xmlns:r="http://schemas.openxmlformats.org/officeDocument/2006/relationships" xmlns:wp14="http://schemas.microsoft.com/office/word/2010/wordprocessingDrawing" xmlns:wp="http://schemas.openxmlformats.org/drawingml/2006/wordprocessingDrawing" xmlns:wpg="http://schemas.microsoft.com/office/word/2010/wordprocessingGroup" xmlns:wpi="http://schemas.microsoft.com/office/word/2010/wordprocessingInk" xmlns:wps="http://schemas.microsoft.com/office/word/2010/wordprocessingShape" xmlns:o="urn:schemas-microsoft-com:office:office" xmlns:v="urn:schemas-microsoft-com:vml" xmlns:w10="urn:schemas-microsoft-com:office:word" xmlns:w="http://schemas.openxmlformats.org/wordprocessingml/2006/main" xmlns:w14="http://schemas.microsoft.com/office/word/2010/wordml" xmlns:w15="http://schemas.microsoft.com/office/word/2012/wordml" xmlns:w16cei="http://schemas.microsoft.com/office/word/2026/wordml/cei" xmlns:w16cex="http://schemas.microsoft.com/office/word/2018/wordml/cex" xmlns:w16cid="http://schemas.microsoft.com/office/word/2016/wordml/cid" xmlns:w16="http://schemas.microsoft.com/office/word/2018/wordml" xmlns:w16sdtdh="http://schemas.microsoft.com/office/word/2020/wordml/sdtdatahash" xmlns:w16sdtfl="http://schemas.microsoft.com/office/word/2024/wordml/sdtformatlock" xmlns:w16se="http://schemas.microsoft.com/office/word/2015/wordml/symex" xmlns:w16du="http://schemas.microsoft.com/office/word/2023/wordml/word16du" xmlns:wne="http://schemas.microsoft.com/office/word/2006/wordml" mc:Ignorable="w14 w15 w16se w16cid w16 w16cex w16sdtdh w16sdtfl w16du wp14">
   <w:p>
     <w:pPr>
       <w:tabs>
@@ -1135,7 +1116,7 @@
 </file>
 
 <file path=word/footnotes.xml><?xml version="1.0" encoding="utf-8"?>
-<w:footnotes xmlns:wpc="http://schemas.microsoft.com/office/word/2010/wordprocessingCanvas" xmlns:cx="http://schemas.microsoft.com/office/drawing/2014/chartex" xmlns:cx1="http://schemas.microsoft.com/office/drawing/2015/9/8/chartex" xmlns:cx2="http://schemas.microsoft.com/office/drawing/2015/10/21/chartex" xmlns:cx3="http://schemas.microsoft.com/office/drawing/2016/5/9/chartex" xmlns:cx4="http://schemas.microsoft.com/office/drawing/2016/5/10/chartex" xmlns:cx5="http://schemas.microsoft.com/office/drawing/2016/5/11/chartex" xmlns:cx6="http://schemas.microsoft.com/office/drawing/2016/5/12/chartex" xmlns:cx7="http://schemas.microsoft.com/office/drawing/2016/5/13/chartex" xmlns:cx8="http://schemas.microsoft.com/office/drawing/2016/5/14/chartex" xmlns:mc="http://schemas.openxmlformats.org/markup-compatibility/2006" xmlns:aink="http://schemas.microsoft.com/office/drawing/2016/ink" xmlns:am3d="http://schemas.microsoft.com/office/drawing/2017/model3d" xmlns:o="urn:schemas-microsoft-com:office:office" xmlns:oel="http://schemas.microsoft.com/office/2019/extlst" xmlns:r="http://schemas.openxmlformats.org/officeDocument/2006/relationships" xmlns:m="http://schemas.openxmlformats.org/officeDocument/2006/math" xmlns:v="urn:schemas-microsoft-com:vml" xmlns:wp14="http://schemas.microsoft.com/office/word/2010/wordprocessingDrawing" xmlns:wp="http://schemas.openxmlformats.org/drawingml/2006/wordprocessingDrawing" xmlns:w10="urn:schemas-microsoft-com:office:word" xmlns:w="http://schemas.openxmlformats.org/wordprocessingml/2006/main" xmlns:w14="http://schemas.microsoft.com/office/word/2010/wordml" xmlns:w15="http://schemas.microsoft.com/office/word/2012/wordml" xmlns:w16cex="http://schemas.microsoft.com/office/word/2018/wordml/cex" xmlns:w16cid="http://schemas.microsoft.com/office/word/2016/wordml/cid" xmlns:w16="http://schemas.microsoft.com/office/word/2018/wordml" xmlns:w16du="http://schemas.microsoft.com/office/word/2023/wordml/word16du" xmlns:w16sdtdh="http://schemas.microsoft.com/office/word/2020/wordml/sdtdatahash" xmlns:w16sdtfl="http://schemas.microsoft.com/office/word/2024/wordml/sdtformatlock" xmlns:w16se="http://schemas.microsoft.com/office/word/2015/wordml/symex" xmlns:wpg="http://schemas.microsoft.com/office/word/2010/wordprocessingGroup" xmlns:wpi="http://schemas.microsoft.com/office/word/2010/wordprocessingInk" xmlns:wne="http://schemas.microsoft.com/office/word/2006/wordml" xmlns:wps="http://schemas.microsoft.com/office/word/2010/wordprocessingShape" mc:Ignorable="w14 w15 w16se w16cid w16 w16cex w16sdtdh w16sdtfl w16du wp14">
+<w:footnotes xmlns:wpc="http://schemas.microsoft.com/office/word/2010/wordprocessingCanvas" xmlns:cx="http://schemas.microsoft.com/office/drawing/2014/chartex" xmlns:cx1="http://schemas.microsoft.com/office/drawing/2015/9/8/chartex" xmlns:cx2="http://schemas.microsoft.com/office/drawing/2015/10/21/chartex" xmlns:cx3="http://schemas.microsoft.com/office/drawing/2016/5/9/chartex" xmlns:cx4="http://schemas.microsoft.com/office/drawing/2016/5/10/chartex" xmlns:cx5="http://schemas.microsoft.com/office/drawing/2016/5/11/chartex" xmlns:cx6="http://schemas.microsoft.com/office/drawing/2016/5/12/chartex" xmlns:cx7="http://schemas.microsoft.com/office/drawing/2016/5/13/chartex" xmlns:cx8="http://schemas.microsoft.com/office/drawing/2016/5/14/chartex" xmlns:mc="http://schemas.openxmlformats.org/markup-compatibility/2006" xmlns:m="http://schemas.openxmlformats.org/officeDocument/2006/math" xmlns:aink="http://schemas.microsoft.com/office/drawing/2016/ink" xmlns:am3d="http://schemas.microsoft.com/office/drawing/2017/model3d" xmlns:oel="http://schemas.microsoft.com/office/2019/extlst" xmlns:r="http://schemas.openxmlformats.org/officeDocument/2006/relationships" xmlns:wp14="http://schemas.microsoft.com/office/word/2010/wordprocessingDrawing" xmlns:wp="http://schemas.openxmlformats.org/drawingml/2006/wordprocessingDrawing" xmlns:wpg="http://schemas.microsoft.com/office/word/2010/wordprocessingGroup" xmlns:wpi="http://schemas.microsoft.com/office/word/2010/wordprocessingInk" xmlns:wps="http://schemas.microsoft.com/office/word/2010/wordprocessingShape" xmlns:o="urn:schemas-microsoft-com:office:office" xmlns:v="urn:schemas-microsoft-com:vml" xmlns:w10="urn:schemas-microsoft-com:office:word" xmlns:w="http://schemas.openxmlformats.org/wordprocessingml/2006/main" xmlns:w14="http://schemas.microsoft.com/office/word/2010/wordml" xmlns:w15="http://schemas.microsoft.com/office/word/2012/wordml" xmlns:w16cei="http://schemas.microsoft.com/office/word/2026/wordml/cei" xmlns:w16cex="http://schemas.microsoft.com/office/word/2018/wordml/cex" xmlns:w16cid="http://schemas.microsoft.com/office/word/2016/wordml/cid" xmlns:w16="http://schemas.microsoft.com/office/word/2018/wordml" xmlns:w16sdtdh="http://schemas.microsoft.com/office/word/2020/wordml/sdtdatahash" xmlns:w16sdtfl="http://schemas.microsoft.com/office/word/2024/wordml/sdtformatlock" xmlns:w16se="http://schemas.microsoft.com/office/word/2015/wordml/symex" xmlns:w16du="http://schemas.microsoft.com/office/word/2023/wordml/word16du" xmlns:wne="http://schemas.microsoft.com/office/word/2006/wordml" mc:Ignorable="w14 w15 w16se w16cid w16 w16cex w16sdtdh w16sdtfl w16du wp14">
   <w:footnote w:type="separator" w:id="-1">
     <w:p>
       <w:r>
@@ -1154,7 +1135,7 @@
 </file>
 
 <file path=word/header1.xml><?xml version="1.0" encoding="utf-8"?>
-<w:hdr xmlns:wpc="http://schemas.microsoft.com/office/word/2010/wordprocessingCanvas" xmlns:cx="http://schemas.microsoft.com/office/drawing/2014/chartex" xmlns:cx1="http://schemas.microsoft.com/office/drawing/2015/9/8/chartex" xmlns:cx2="http://schemas.microsoft.com/office/drawing/2015/10/21/chartex" xmlns:cx3="http://schemas.microsoft.com/office/drawing/2016/5/9/chartex" xmlns:cx4="http://schemas.microsoft.com/office/drawing/2016/5/10/chartex" xmlns:cx5="http://schemas.microsoft.com/office/drawing/2016/5/11/chartex" xmlns:cx6="http://schemas.microsoft.com/office/drawing/2016/5/12/chartex" xmlns:cx7="http://schemas.microsoft.com/office/drawing/2016/5/13/chartex" xmlns:cx8="http://schemas.microsoft.com/office/drawing/2016/5/14/chartex" xmlns:mc="http://schemas.openxmlformats.org/markup-compatibility/2006" xmlns:aink="http://schemas.microsoft.com/office/drawing/2016/ink" xmlns:am3d="http://schemas.microsoft.com/office/drawing/2017/model3d" xmlns:o="urn:schemas-microsoft-com:office:office" xmlns:oel="http://schemas.microsoft.com/office/2019/extlst" xmlns:r="http://schemas.openxmlformats.org/officeDocument/2006/relationships" xmlns:m="http://schemas.openxmlformats.org/officeDocument/2006/math" xmlns:v="urn:schemas-microsoft-com:vml" xmlns:wp14="http://schemas.microsoft.com/office/word/2010/wordprocessingDrawing" xmlns:wp="http://schemas.openxmlformats.org/drawingml/2006/wordprocessingDrawing" xmlns:w10="urn:schemas-microsoft-com:office:word" xmlns:w="http://schemas.openxmlformats.org/wordprocessingml/2006/main" xmlns:w14="http://schemas.microsoft.com/office/word/2010/wordml" xmlns:w15="http://schemas.microsoft.com/office/word/2012/wordml" xmlns:w16cex="http://schemas.microsoft.com/office/word/2018/wordml/cex" xmlns:w16cid="http://schemas.microsoft.com/office/word/2016/wordml/cid" xmlns:w16="http://schemas.microsoft.com/office/word/2018/wordml" xmlns:w16du="http://schemas.microsoft.com/office/word/2023/wordml/word16du" xmlns:w16sdtdh="http://schemas.microsoft.com/office/word/2020/wordml/sdtdatahash" xmlns:w16sdtfl="http://schemas.microsoft.com/office/word/2024/wordml/sdtformatlock" xmlns:w16se="http://schemas.microsoft.com/office/word/2015/wordml/symex" xmlns:wpg="http://schemas.microsoft.com/office/word/2010/wordprocessingGroup" xmlns:wpi="http://schemas.microsoft.com/office/word/2010/wordprocessingInk" xmlns:wne="http://schemas.microsoft.com/office/word/2006/wordml" xmlns:wps="http://schemas.microsoft.com/office/word/2010/wordprocessingShape" mc:Ignorable="w14 w15 w16se w16cid w16 w16cex w16sdtdh w16sdtfl w16du wp14">
+<w:hdr xmlns:wpc="http://schemas.microsoft.com/office/word/2010/wordprocessingCanvas" xmlns:cx="http://schemas.microsoft.com/office/drawing/2014/chartex" xmlns:cx1="http://schemas.microsoft.com/office/drawing/2015/9/8/chartex" xmlns:cx2="http://schemas.microsoft.com/office/drawing/2015/10/21/chartex" xmlns:cx3="http://schemas.microsoft.com/office/drawing/2016/5/9/chartex" xmlns:cx4="http://schemas.microsoft.com/office/drawing/2016/5/10/chartex" xmlns:cx5="http://schemas.microsoft.com/office/drawing/2016/5/11/chartex" xmlns:cx6="http://schemas.microsoft.com/office/drawing/2016/5/12/chartex" xmlns:cx7="http://schemas.microsoft.com/office/drawing/2016/5/13/chartex" xmlns:cx8="http://schemas.microsoft.com/office/drawing/2016/5/14/chartex" xmlns:mc="http://schemas.openxmlformats.org/markup-compatibility/2006" xmlns:m="http://schemas.openxmlformats.org/officeDocument/2006/math" xmlns:aink="http://schemas.microsoft.com/office/drawing/2016/ink" xmlns:am3d="http://schemas.microsoft.com/office/drawing/2017/model3d" xmlns:oel="http://schemas.microsoft.com/office/2019/extlst" xmlns:r="http://schemas.openxmlformats.org/officeDocument/2006/relationships" xmlns:wp14="http://schemas.microsoft.com/office/word/2010/wordprocessingDrawing" xmlns:wp="http://schemas.openxmlformats.org/drawingml/2006/wordprocessingDrawing" xmlns:wpg="http://schemas.microsoft.com/office/word/2010/wordprocessingGroup" xmlns:wpi="http://schemas.microsoft.com/office/word/2010/wordprocessingInk" xmlns:wps="http://schemas.microsoft.com/office/word/2010/wordprocessingShape" xmlns:o="urn:schemas-microsoft-com:office:office" xmlns:v="urn:schemas-microsoft-com:vml" xmlns:w10="urn:schemas-microsoft-com:office:word" xmlns:w="http://schemas.openxmlformats.org/wordprocessingml/2006/main" xmlns:w14="http://schemas.microsoft.com/office/word/2010/wordml" xmlns:w15="http://schemas.microsoft.com/office/word/2012/wordml" xmlns:w16cei="http://schemas.microsoft.com/office/word/2026/wordml/cei" xmlns:w16cex="http://schemas.microsoft.com/office/word/2018/wordml/cex" xmlns:w16cid="http://schemas.microsoft.com/office/word/2016/wordml/cid" xmlns:w16="http://schemas.microsoft.com/office/word/2018/wordml" xmlns:w16sdtdh="http://schemas.microsoft.com/office/word/2020/wordml/sdtdatahash" xmlns:w16sdtfl="http://schemas.microsoft.com/office/word/2024/wordml/sdtformatlock" xmlns:w16se="http://schemas.microsoft.com/office/word/2015/wordml/symex" xmlns:w16du="http://schemas.microsoft.com/office/word/2023/wordml/word16du" xmlns:wne="http://schemas.microsoft.com/office/word/2006/wordml" mc:Ignorable="w14 w15 w16se w16cid w16 w16cex w16sdtdh w16sdtfl w16du wp14">
   <w:p>
     <w:pPr>
       <w:pStyle w:val="Header"/>
@@ -1184,7 +1165,7 @@
 </file>
 
 <file path=word/header2.xml><?xml version="1.0" encoding="utf-8"?>
-<w:hdr xmlns:wpc="http://schemas.microsoft.com/office/word/2010/wordprocessingCanvas" xmlns:cx="http://schemas.microsoft.com/office/drawing/2014/chartex" xmlns:cx1="http://schemas.microsoft.com/office/drawing/2015/9/8/chartex" xmlns:cx2="http://schemas.microsoft.com/office/drawing/2015/10/21/chartex" xmlns:cx3="http://schemas.microsoft.com/office/drawing/2016/5/9/chartex" xmlns:cx4="http://schemas.microsoft.com/office/drawing/2016/5/10/chartex" xmlns:cx5="http://schemas.microsoft.com/office/drawing/2016/5/11/chartex" xmlns:cx6="http://schemas.microsoft.com/office/drawing/2016/5/12/chartex" xmlns:cx7="http://schemas.microsoft.com/office/drawing/2016/5/13/chartex" xmlns:cx8="http://schemas.microsoft.com/office/drawing/2016/5/14/chartex" xmlns:mc="http://schemas.openxmlformats.org/markup-compatibility/2006" xmlns:aink="http://schemas.microsoft.com/office/drawing/2016/ink" xmlns:am3d="http://schemas.microsoft.com/office/drawing/2017/model3d" xmlns:o="urn:schemas-microsoft-com:office:office" xmlns:oel="http://schemas.microsoft.com/office/2019/extlst" xmlns:r="http://schemas.openxmlformats.org/officeDocument/2006/relationships" xmlns:m="http://schemas.openxmlformats.org/officeDocument/2006/math" xmlns:v="urn:schemas-microsoft-com:vml" xmlns:wp14="http://schemas.microsoft.com/office/word/2010/wordprocessingDrawing" xmlns:wp="http://schemas.openxmlformats.org/drawingml/2006/wordprocessingDrawing" xmlns:w10="urn:schemas-microsoft-com:office:word" xmlns:w="http://schemas.openxmlformats.org/wordprocessingml/2006/main" xmlns:w14="http://schemas.microsoft.com/office/word/2010/wordml" xmlns:w15="http://schemas.microsoft.com/office/word/2012/wordml" xmlns:w16cex="http://schemas.microsoft.com/office/word/2018/wordml/cex" xmlns:w16cid="http://schemas.microsoft.com/office/word/2016/wordml/cid" xmlns:w16="http://schemas.microsoft.com/office/word/2018/wordml" xmlns:w16du="http://schemas.microsoft.com/office/word/2023/wordml/word16du" xmlns:w16sdtdh="http://schemas.microsoft.com/office/word/2020/wordml/sdtdatahash" xmlns:w16sdtfl="http://schemas.microsoft.com/office/word/2024/wordml/sdtformatlock" xmlns:w16se="http://schemas.microsoft.com/office/word/2015/wordml/symex" xmlns:wpg="http://schemas.microsoft.com/office/word/2010/wordprocessingGroup" xmlns:wpi="http://schemas.microsoft.com/office/word/2010/wordprocessingInk" xmlns:wne="http://schemas.microsoft.com/office/word/2006/wordml" xmlns:wps="http://schemas.microsoft.com/office/word/2010/wordprocessingShape" mc:Ignorable="w14 w15 w16se w16cid w16 w16cex w16sdtdh w16sdtfl w16du wp14">
+<w:hdr xmlns:wpc="http://schemas.microsoft.com/office/word/2010/wordprocessingCanvas" xmlns:cx="http://schemas.microsoft.com/office/drawing/2014/chartex" xmlns:cx1="http://schemas.microsoft.com/office/drawing/2015/9/8/chartex" xmlns:cx2="http://schemas.microsoft.com/office/drawing/2015/10/21/chartex" xmlns:cx3="http://schemas.microsoft.com/office/drawing/2016/5/9/chartex" xmlns:cx4="http://schemas.microsoft.com/office/drawing/2016/5/10/chartex" xmlns:cx5="http://schemas.microsoft.com/office/drawing/2016/5/11/chartex" xmlns:cx6="http://schemas.microsoft.com/office/drawing/2016/5/12/chartex" xmlns:cx7="http://schemas.microsoft.com/office/drawing/2016/5/13/chartex" xmlns:cx8="http://schemas.microsoft.com/office/drawing/2016/5/14/chartex" xmlns:mc="http://schemas.openxmlformats.org/markup-compatibility/2006" xmlns:m="http://schemas.openxmlformats.org/officeDocument/2006/math" xmlns:aink="http://schemas.microsoft.com/office/drawing/2016/ink" xmlns:am3d="http://schemas.microsoft.com/office/drawing/2017/model3d" xmlns:oel="http://schemas.microsoft.com/office/2019/extlst" xmlns:r="http://schemas.openxmlformats.org/officeDocument/2006/relationships" xmlns:wp14="http://schemas.microsoft.com/office/word/2010/wordprocessingDrawing" xmlns:wp="http://schemas.openxmlformats.org/drawingml/2006/wordprocessingDrawing" xmlns:wpg="http://schemas.microsoft.com/office/word/2010/wordprocessingGroup" xmlns:wpi="http://schemas.microsoft.com/office/word/2010/wordprocessingInk" xmlns:wps="http://schemas.microsoft.com/office/word/2010/wordprocessingShape" xmlns:o="urn:schemas-microsoft-com:office:office" xmlns:v="urn:schemas-microsoft-com:vml" xmlns:w10="urn:schemas-microsoft-com:office:word" xmlns:w="http://schemas.openxmlformats.org/wordprocessingml/2006/main" xmlns:w14="http://schemas.microsoft.com/office/word/2010/wordml" xmlns:w15="http://schemas.microsoft.com/office/word/2012/wordml" xmlns:w16cei="http://schemas.microsoft.com/office/word/2026/wordml/cei" xmlns:w16cex="http://schemas.microsoft.com/office/word/2018/wordml/cex" xmlns:w16cid="http://schemas.microsoft.com/office/word/2016/wordml/cid" xmlns:w16="http://schemas.microsoft.com/office/word/2018/wordml" xmlns:w16sdtdh="http://schemas.microsoft.com/office/word/2020/wordml/sdtdatahash" xmlns:w16sdtfl="http://schemas.microsoft.com/office/word/2024/wordml/sdtformatlock" xmlns:w16se="http://schemas.microsoft.com/office/word/2015/wordml/symex" xmlns:w16du="http://schemas.microsoft.com/office/word/2023/wordml/word16du" xmlns:wne="http://schemas.microsoft.com/office/word/2006/wordml" mc:Ignorable="w14 w15 w16se w16cid w16 w16cex w16sdtdh w16sdtfl w16du wp14">
   <w:p>
     <w:pPr>
       <w:pStyle w:val="Header"/>
@@ -1532,7 +1513,7 @@
 </file>
 
 <file path=word/numbering.xml><?xml version="1.0" encoding="utf-8"?>
-<w:numbering xmlns:wpc="http://schemas.microsoft.com/office/word/2010/wordprocessingCanvas" xmlns:cx="http://schemas.microsoft.com/office/drawing/2014/chartex" xmlns:cx1="http://schemas.microsoft.com/office/drawing/2015/9/8/chartex" xmlns:cx2="http://schemas.microsoft.com/office/drawing/2015/10/21/chartex" xmlns:cx3="http://schemas.microsoft.com/office/drawing/2016/5/9/chartex" xmlns:cx4="http://schemas.microsoft.com/office/drawing/2016/5/10/chartex" xmlns:cx5="http://schemas.microsoft.com/office/drawing/2016/5/11/chartex" xmlns:cx6="http://schemas.microsoft.com/office/drawing/2016/5/12/chartex" xmlns:cx7="http://schemas.microsoft.com/office/drawing/2016/5/13/chartex" xmlns:cx8="http://schemas.microsoft.com/office/drawing/2016/5/14/chartex" xmlns:mc="http://schemas.openxmlformats.org/markup-compatibility/2006" xmlns:aink="http://schemas.microsoft.com/office/drawing/2016/ink" xmlns:am3d="http://schemas.microsoft.com/office/drawing/2017/model3d" xmlns:o="urn:schemas-microsoft-com:office:office" xmlns:oel="http://schemas.microsoft.com/office/2019/extlst" xmlns:r="http://schemas.openxmlformats.org/officeDocument/2006/relationships" xmlns:m="http://schemas.openxmlformats.org/officeDocument/2006/math" xmlns:v="urn:schemas-microsoft-com:vml" xmlns:wp14="http://schemas.microsoft.com/office/word/2010/wordprocessingDrawing" xmlns:wp="http://schemas.openxmlformats.org/drawingml/2006/wordprocessingDrawing" xmlns:w10="urn:schemas-microsoft-com:office:word" xmlns:w="http://schemas.openxmlformats.org/wordprocessingml/2006/main" xmlns:w14="http://schemas.microsoft.com/office/word/2010/wordml" xmlns:w15="http://schemas.microsoft.com/office/word/2012/wordml" xmlns:w16cex="http://schemas.microsoft.com/office/word/2018/wordml/cex" xmlns:w16cid="http://schemas.microsoft.com/office/word/2016/wordml/cid" xmlns:w16="http://schemas.microsoft.com/office/word/2018/wordml" xmlns:w16du="http://schemas.microsoft.com/office/word/2023/wordml/word16du" xmlns:w16sdtdh="http://schemas.microsoft.com/office/word/2020/wordml/sdtdatahash" xmlns:w16sdtfl="http://schemas.microsoft.com/office/word/2024/wordml/sdtformatlock" xmlns:w16se="http://schemas.microsoft.com/office/word/2015/wordml/symex" xmlns:wpg="http://schemas.microsoft.com/office/word/2010/wordprocessingGroup" xmlns:wpi="http://schemas.microsoft.com/office/word/2010/wordprocessingInk" xmlns:wne="http://schemas.microsoft.com/office/word/2006/wordml" xmlns:wps="http://schemas.microsoft.com/office/word/2010/wordprocessingShape" mc:Ignorable="w14 w15 w16se w16cid w16 w16cex w16sdtdh w16sdtfl w16du wp14">
+<w:numbering xmlns:wpc="http://schemas.microsoft.com/office/word/2010/wordprocessingCanvas" xmlns:cx="http://schemas.microsoft.com/office/drawing/2014/chartex" xmlns:cx1="http://schemas.microsoft.com/office/drawing/2015/9/8/chartex" xmlns:cx2="http://schemas.microsoft.com/office/drawing/2015/10/21/chartex" xmlns:cx3="http://schemas.microsoft.com/office/drawing/2016/5/9/chartex" xmlns:cx4="http://schemas.microsoft.com/office/drawing/2016/5/10/chartex" xmlns:cx5="http://schemas.microsoft.com/office/drawing/2016/5/11/chartex" xmlns:cx6="http://schemas.microsoft.com/office/drawing/2016/5/12/chartex" xmlns:cx7="http://schemas.microsoft.com/office/drawing/2016/5/13/chartex" xmlns:cx8="http://schemas.microsoft.com/office/drawing/2016/5/14/chartex" xmlns:mc="http://schemas.openxmlformats.org/markup-compatibility/2006" xmlns:m="http://schemas.openxmlformats.org/officeDocument/2006/math" xmlns:aink="http://schemas.microsoft.com/office/drawing/2016/ink" xmlns:am3d="http://schemas.microsoft.com/office/drawing/2017/model3d" xmlns:oel="http://schemas.microsoft.com/office/2019/extlst" xmlns:r="http://schemas.openxmlformats.org/officeDocument/2006/relationships" xmlns:wp14="http://schemas.microsoft.com/office/word/2010/wordprocessingDrawing" xmlns:wp="http://schemas.openxmlformats.org/drawingml/2006/wordprocessingDrawing" xmlns:wpg="http://schemas.microsoft.com/office/word/2010/wordprocessingGroup" xmlns:wpi="http://schemas.microsoft.com/office/word/2010/wordprocessingInk" xmlns:wps="http://schemas.microsoft.com/office/word/2010/wordprocessingShape" xmlns:o="urn:schemas-microsoft-com:office:office" xmlns:v="urn:schemas-microsoft-com:vml" xmlns:w10="urn:schemas-microsoft-com:office:word" xmlns:w="http://schemas.openxmlformats.org/wordprocessingml/2006/main" xmlns:w14="http://schemas.microsoft.com/office/word/2010/wordml" xmlns:w15="http://schemas.microsoft.com/office/word/2012/wordml" xmlns:w16cei="http://schemas.microsoft.com/office/word/2026/wordml/cei" xmlns:w16cex="http://schemas.microsoft.com/office/word/2018/wordml/cex" xmlns:w16cid="http://schemas.microsoft.com/office/word/2016/wordml/cid" xmlns:w16="http://schemas.microsoft.com/office/word/2018/wordml" xmlns:w16sdtdh="http://schemas.microsoft.com/office/word/2020/wordml/sdtdatahash" xmlns:w16sdtfl="http://schemas.microsoft.com/office/word/2024/wordml/sdtformatlock" xmlns:w16se="http://schemas.microsoft.com/office/word/2015/wordml/symex" xmlns:w16du="http://schemas.microsoft.com/office/word/2023/wordml/word16du" xmlns:wne="http://schemas.microsoft.com/office/word/2006/wordml" mc:Ignorable="w14 w15 w16se w16cid w16 w16cex w16sdtdh w16sdtfl w16du wp14">
   <w:abstractNum w:abstractNumId="0" w15:restartNumberingAfterBreak="0">
     <w:nsid w:val="061B5C9E"/>
     <w:multiLevelType w:val="hybridMultilevel"/>
@@ -2379,7 +2360,7 @@
 </file>
 
 <file path=word/styles.xml><?xml version="1.0" encoding="utf-8"?>
-<w:styles xmlns:mc="http://schemas.openxmlformats.org/markup-compatibility/2006" xmlns:r="http://schemas.openxmlformats.org/officeDocument/2006/relationships" xmlns:w="http://schemas.openxmlformats.org/wordprocessingml/2006/main" xmlns:w14="http://schemas.microsoft.com/office/word/2010/wordml" xmlns:w15="http://schemas.microsoft.com/office/word/2012/wordml" xmlns:w16cex="http://schemas.microsoft.com/office/word/2018/wordml/cex" xmlns:w16cid="http://schemas.microsoft.com/office/word/2016/wordml/cid" xmlns:w16="http://schemas.microsoft.com/office/word/2018/wordml" xmlns:w16du="http://schemas.microsoft.com/office/word/2023/wordml/word16du" xmlns:w16sdtdh="http://schemas.microsoft.com/office/word/2020/wordml/sdtdatahash" xmlns:w16sdtfl="http://schemas.microsoft.com/office/word/2024/wordml/sdtformatlock" xmlns:w16se="http://schemas.microsoft.com/office/word/2015/wordml/symex" mc:Ignorable="w14 w15 w16se w16cid w16 w16cex w16sdtdh w16sdtfl w16du">
+<w:styles xmlns:mc="http://schemas.openxmlformats.org/markup-compatibility/2006" xmlns:r="http://schemas.openxmlformats.org/officeDocument/2006/relationships" xmlns:w="http://schemas.openxmlformats.org/wordprocessingml/2006/main" xmlns:w14="http://schemas.microsoft.com/office/word/2010/wordml" xmlns:w15="http://schemas.microsoft.com/office/word/2012/wordml" xmlns:w16cex="http://schemas.microsoft.com/office/word/2018/wordml/cex" xmlns:w16cid="http://schemas.microsoft.com/office/word/2016/wordml/cid" xmlns:w16="http://schemas.microsoft.com/office/word/2018/wordml" xmlns:w16sdtdh="http://schemas.microsoft.com/office/word/2020/wordml/sdtdatahash" xmlns:w16sdtfl="http://schemas.microsoft.com/office/word/2024/wordml/sdtformatlock" xmlns:w16se="http://schemas.microsoft.com/office/word/2015/wordml/symex" xmlns:w16du="http://schemas.microsoft.com/office/word/2023/wordml/word16du" mc:Ignorable="w14 w15 w16se w16cid w16 w16cex w16sdtdh w16sdtfl w16du">
   <w:docDefaults>
     <w:rPrDefault>
       <w:rPr>
@@ -3562,23 +3543,6 @@
 </file>
 
 <file path=customXml/item2.xml><?xml version="1.0" encoding="utf-8"?>
-<p:properties xmlns:p="http://schemas.microsoft.com/office/2006/metadata/properties" xmlns:xsi="http://www.w3.org/2001/XMLSchema-instance" xmlns:pc="http://schemas.microsoft.com/office/infopath/2007/PartnerControls">
-  <documentManagement>
-    <TaxCatchAll xmlns="38d2a309-d798-495b-b1a3-e97c37808eef"/>
-    <_ip_UnifiedCompliancePolicyUIAction xmlns="http://schemas.microsoft.com/sharepoint/v3" xsi:nil="true"/>
-    <_ip_UnifiedCompliancePolicyProperties xmlns="http://schemas.microsoft.com/sharepoint/v3" xsi:nil="true"/>
-    <lcf76f155ced4ddcb4097134ff3c332f xmlns="416eecfc-56a7-4354-8013-4a2d9c92e153">
-      <Terms xmlns="http://schemas.microsoft.com/office/infopath/2007/PartnerControls"/>
-    </lcf76f155ced4ddcb4097134ff3c332f>
-  </documentManagement>
-</p:properties>
-</file>
-
-<file path=customXml/item3.xml><?xml version="1.0" encoding="utf-8"?>
-<b:Sources xmlns:b="http://schemas.openxmlformats.org/officeDocument/2006/bibliography" xmlns="http://schemas.openxmlformats.org/officeDocument/2006/bibliography" SelectedStyle="\APA.XSL" StyleName="APA"/>
-</file>
-
-<file path=customXml/item4.xml><?xml version="1.0" encoding="utf-8"?>
 <ct:contentTypeSchema xmlns:ct="http://schemas.microsoft.com/office/2006/metadata/contentType" xmlns:ma="http://schemas.microsoft.com/office/2006/metadata/properties/metaAttributes" ct:_="" ma:_="" ma:contentTypeName="Document" ma:contentTypeID="0x010100E48B1925F2EFB241960044EC5F64C034" ma:contentTypeVersion="16" ma:contentTypeDescription="Create a new document." ma:contentTypeScope="" ma:versionID="b193f1a1adb628ee5f7d642c4cb4fead">
   <xsd:schema xmlns:xsd="http://www.w3.org/2001/XMLSchema" xmlns:xs="http://www.w3.org/2001/XMLSchema" xmlns:p="http://schemas.microsoft.com/office/2006/metadata/properties" xmlns:ns1="http://schemas.microsoft.com/sharepoint/v3" xmlns:ns2="416eecfc-56a7-4354-8013-4a2d9c92e153" xmlns:ns3="38d2a309-d798-495b-b1a3-e97c37808eef" targetNamespace="http://schemas.microsoft.com/office/2006/metadata/properties" ma:root="true" ma:fieldsID="f4c72206c132b1461c2865266b50231c" ns1:_="" ns2:_="" ns3:_="">
     <xsd:import namespace="http://schemas.microsoft.com/sharepoint/v3"/>
@@ -3824,6 +3788,23 @@
 </ct:contentTypeSchema>
 </file>
 
+<file path=customXml/item3.xml><?xml version="1.0" encoding="utf-8"?>
+<b:Sources xmlns:b="http://schemas.openxmlformats.org/officeDocument/2006/bibliography" xmlns="http://schemas.openxmlformats.org/officeDocument/2006/bibliography" SelectedStyle="\APA.XSL" StyleName="APA"/>
+</file>
+
+<file path=customXml/item4.xml><?xml version="1.0" encoding="utf-8"?>
+<p:properties xmlns:p="http://schemas.microsoft.com/office/2006/metadata/properties" xmlns:xsi="http://www.w3.org/2001/XMLSchema-instance" xmlns:pc="http://schemas.microsoft.com/office/infopath/2007/PartnerControls">
+  <documentManagement>
+    <TaxCatchAll xmlns="38d2a309-d798-495b-b1a3-e97c37808eef"/>
+    <_ip_UnifiedCompliancePolicyUIAction xmlns="http://schemas.microsoft.com/sharepoint/v3" xsi:nil="true"/>
+    <_ip_UnifiedCompliancePolicyProperties xmlns="http://schemas.microsoft.com/sharepoint/v3" xsi:nil="true"/>
+    <lcf76f155ced4ddcb4097134ff3c332f xmlns="416eecfc-56a7-4354-8013-4a2d9c92e153">
+      <Terms xmlns="http://schemas.microsoft.com/office/infopath/2007/PartnerControls"/>
+    </lcf76f155ced4ddcb4097134ff3c332f>
+  </documentManagement>
+</p:properties>
+</file>
+
 <file path=customXml/itemProps1.xml><?xml version="1.0" encoding="utf-8"?>
 <ds:datastoreItem xmlns:ds="http://schemas.openxmlformats.org/officeDocument/2006/customXml" ds:itemID="{2ACA00A0-0EB9-4F25-B1A0-9480A1DEA0B5}">
   <ds:schemaRefs>
@@ -3833,26 +3814,6 @@
 </file>
 
 <file path=customXml/itemProps2.xml><?xml version="1.0" encoding="utf-8"?>
-<ds:datastoreItem xmlns:ds="http://schemas.openxmlformats.org/officeDocument/2006/customXml" ds:itemID="{5D491C04-0035-45EA-BE2E-2976A5F7A397}">
-  <ds:schemaRefs>
-    <ds:schemaRef ds:uri="http://schemas.microsoft.com/office/2006/metadata/properties"/>
-    <ds:schemaRef ds:uri="http://schemas.microsoft.com/office/infopath/2007/PartnerControls"/>
-    <ds:schemaRef ds:uri="38d2a309-d798-495b-b1a3-e97c37808eef"/>
-    <ds:schemaRef ds:uri="http://schemas.microsoft.com/sharepoint/v3"/>
-    <ds:schemaRef ds:uri="416eecfc-56a7-4354-8013-4a2d9c92e153"/>
-  </ds:schemaRefs>
-</ds:datastoreItem>
-</file>
-
-<file path=customXml/itemProps3.xml><?xml version="1.0" encoding="utf-8"?>
-<ds:datastoreItem xmlns:ds="http://schemas.openxmlformats.org/officeDocument/2006/customXml" ds:itemID="{4202E056-596C-4D43-866F-DBCC294656E0}">
-  <ds:schemaRefs>
-    <ds:schemaRef ds:uri="http://schemas.openxmlformats.org/officeDocument/2006/bibliography"/>
-  </ds:schemaRefs>
-</ds:datastoreItem>
-</file>
-
-<file path=customXml/itemProps4.xml><?xml version="1.0" encoding="utf-8"?>
 <ds:datastoreItem xmlns:ds="http://schemas.openxmlformats.org/officeDocument/2006/customXml" ds:itemID="{3AA634C4-AFF1-45A4-BEEC-3BC128C36838}">
   <ds:schemaRefs>
     <ds:schemaRef ds:uri="http://schemas.microsoft.com/office/2006/metadata/contentType"/>
@@ -3872,6 +3833,26 @@
 </ds:datastoreItem>
 </file>
 
+<file path=customXml/itemProps3.xml><?xml version="1.0" encoding="utf-8"?>
+<ds:datastoreItem xmlns:ds="http://schemas.openxmlformats.org/officeDocument/2006/customXml" ds:itemID="{4202E056-596C-4D43-866F-DBCC294656E0}">
+  <ds:schemaRefs>
+    <ds:schemaRef ds:uri="http://schemas.openxmlformats.org/officeDocument/2006/bibliography"/>
+  </ds:schemaRefs>
+</ds:datastoreItem>
+</file>
+
+<file path=customXml/itemProps4.xml><?xml version="1.0" encoding="utf-8"?>
+<ds:datastoreItem xmlns:ds="http://schemas.openxmlformats.org/officeDocument/2006/customXml" ds:itemID="{5D491C04-0035-45EA-BE2E-2976A5F7A397}">
+  <ds:schemaRefs>
+    <ds:schemaRef ds:uri="http://schemas.microsoft.com/office/2006/metadata/properties"/>
+    <ds:schemaRef ds:uri="http://schemas.microsoft.com/office/infopath/2007/PartnerControls"/>
+    <ds:schemaRef ds:uri="38d2a309-d798-495b-b1a3-e97c37808eef"/>
+    <ds:schemaRef ds:uri="http://schemas.microsoft.com/sharepoint/v3"/>
+    <ds:schemaRef ds:uri="416eecfc-56a7-4354-8013-4a2d9c92e153"/>
+  </ds:schemaRefs>
+</ds:datastoreItem>
+</file>
+
 <file path=docMetadata/LabelInfo.xml><?xml version="1.0" encoding="utf-8"?>
 <clbl:labelList xmlns:clbl="http://schemas.microsoft.com/office/2020/mipLabelMetadata">
   <clbl:label id="{3de9faa6-9fe1-49b3-9a08-227a296b54a6}" enabled="1" method="Privileged" siteId="{66d73691-ea97-48b1-95d5-e94f0a46b878}" contentBits="0" removed="0"/>

</xml_diff>

<commit_message>
Added author field to article
</commit_message>
<xml_diff>
--- a/app/assets/default_template.docx
+++ b/app/assets/default_template.docx
@@ -515,25 +515,6 @@
       <w:pPr>
         <w:rPr>
           <w:rFonts w:ascii="Arial" w:hAnsi="Arial" w:cs="Arial"/>
-          <w:sz w:val="20"/>
-          <w:szCs w:val="20"/>
-          <w:lang w:bidi="en-US"/>
-        </w:rPr>
-      </w:pPr>
-      <w:r>
-        <w:rPr>
-          <w:rFonts w:ascii="Arial" w:hAnsi="Arial" w:cs="Arial"/>
-          <w:sz w:val="20"/>
-          <w:szCs w:val="20"/>
-          <w:lang w:bidi="en-US"/>
-        </w:rPr>
-        <w:t>{{article.summary}}</w:t>
-      </w:r>
-    </w:p>
-    <w:p>
-      <w:pPr>
-        <w:rPr>
-          <w:rFonts w:ascii="Arial" w:hAnsi="Arial" w:cs="Arial"/>
           <w:lang w:bidi="en-US"/>
         </w:rPr>
       </w:pPr>
@@ -880,74 +861,43 @@
           <w:szCs w:val="20"/>
           <w:lang w:bidi="en-US"/>
         </w:rPr>
-        <w:t>({{</w:t>
-      </w:r>
-      <w:proofErr w:type="spellStart"/>
-      <w:r>
-        <w:rPr>
-          <w:rFonts w:ascii="Arial" w:hAnsi="Arial" w:cs="Arial"/>
-          <w:sz w:val="20"/>
-          <w:szCs w:val="20"/>
-          <w:lang w:bidi="en-US"/>
-        </w:rPr>
-        <w:t>article.source</w:t>
-      </w:r>
-      <w:proofErr w:type="spellEnd"/>
-      <w:r>
-        <w:rPr>
-          <w:rFonts w:ascii="Arial" w:hAnsi="Arial" w:cs="Arial"/>
-          <w:sz w:val="20"/>
-          <w:szCs w:val="20"/>
-          <w:lang w:bidi="en-US"/>
-        </w:rPr>
-        <w:t>}}</w:t>
-      </w:r>
-      <w:r>
-        <w:rPr>
-          <w:rFonts w:ascii="Arial" w:hAnsi="Arial" w:cs="Arial"/>
-          <w:sz w:val="20"/>
-          <w:szCs w:val="20"/>
-          <w:lang w:bidi="en-US"/>
-        </w:rPr>
-        <w:t>/{{</w:t>
-      </w:r>
-      <w:proofErr w:type="spellStart"/>
-      <w:r>
-        <w:rPr>
-          <w:rFonts w:ascii="Arial" w:hAnsi="Arial" w:cs="Arial"/>
-          <w:sz w:val="20"/>
-          <w:szCs w:val="20"/>
-          <w:lang w:bidi="en-US"/>
-        </w:rPr>
-        <w:t>article.author</w:t>
-      </w:r>
-      <w:proofErr w:type="spellEnd"/>
-      <w:r>
-        <w:rPr>
-          <w:rFonts w:ascii="Arial" w:hAnsi="Arial" w:cs="Arial"/>
-          <w:sz w:val="20"/>
-          <w:szCs w:val="20"/>
-          <w:lang w:bidi="en-US"/>
-        </w:rPr>
-        <w:t>}}</w:t>
-      </w:r>
-      <w:r>
-        <w:rPr>
-          <w:rFonts w:ascii="Arial" w:hAnsi="Arial" w:cs="Arial"/>
-          <w:sz w:val="20"/>
-          <w:szCs w:val="20"/>
-          <w:lang w:bidi="en-US"/>
-        </w:rPr>
-        <w:t xml:space="preserve">) </w:t>
-      </w:r>
-      <w:r>
-        <w:rPr>
-          <w:rFonts w:ascii="Arial" w:hAnsi="Arial" w:cs="Arial"/>
-          <w:sz w:val="20"/>
-          <w:szCs w:val="20"/>
-          <w:lang w:bidi="en-US"/>
-        </w:rPr>
-        <w:t>{{article.date}}</w:t>
+        <w:t>(</w:t>
+      </w:r>
+      <w:r>
+        <w:rPr>
+          <w:rFonts w:ascii="Arial" w:hAnsi="Arial" w:cs="Arial"/>
+          <w:sz w:val="20"/>
+          <w:szCs w:val="20"/>
+          <w:lang w:bidi="en-US"/>
+        </w:rPr>
+        <w:t>{{article.source}}</w:t>
+      </w:r>
+      <w:r>
+        <w:rPr>
+          <w:rFonts w:ascii="Arial" w:hAnsi="Arial" w:cs="Arial"/>
+          <w:sz w:val="20"/>
+          <w:szCs w:val="20"/>
+          <w:lang w:bidi="en-US"/>
+        </w:rPr>
+        <w:t>/{{article.author}}</w:t>
+      </w:r>
+      <w:r>
+        <w:rPr>
+          <w:rFonts w:ascii="Arial" w:hAnsi="Arial" w:cs="Arial"/>
+          <w:sz w:val="20"/>
+          <w:szCs w:val="20"/>
+          <w:lang w:bidi="en-US"/>
+        </w:rPr>
+        <w:t>)</w:t>
+      </w:r>
+      <w:r>
+        <w:rPr>
+          <w:rFonts w:ascii="Arial" w:hAnsi="Arial" w:cs="Arial"/>
+          <w:sz w:val="20"/>
+          <w:szCs w:val="20"/>
+          <w:lang w:bidi="en-US"/>
+        </w:rPr>
+        <w:t xml:space="preserve"> {{article.date}}</w:t>
       </w:r>
     </w:p>
     <w:p>
@@ -3677,19 +3627,6 @@
 </file>
 
 <file path=customXml/item1.xml><?xml version="1.0" encoding="utf-8"?>
-<p:properties xmlns:p="http://schemas.microsoft.com/office/2006/metadata/properties" xmlns:xsi="http://www.w3.org/2001/XMLSchema-instance" xmlns:pc="http://schemas.microsoft.com/office/infopath/2007/PartnerControls">
-  <documentManagement>
-    <TaxCatchAll xmlns="38d2a309-d798-495b-b1a3-e97c37808eef"/>
-    <_ip_UnifiedCompliancePolicyUIAction xmlns="http://schemas.microsoft.com/sharepoint/v3" xsi:nil="true"/>
-    <_ip_UnifiedCompliancePolicyProperties xmlns="http://schemas.microsoft.com/sharepoint/v3" xsi:nil="true"/>
-    <lcf76f155ced4ddcb4097134ff3c332f xmlns="416eecfc-56a7-4354-8013-4a2d9c92e153">
-      <Terms xmlns="http://schemas.microsoft.com/office/infopath/2007/PartnerControls"/>
-    </lcf76f155ced4ddcb4097134ff3c332f>
-  </documentManagement>
-</p:properties>
-</file>
-
-<file path=customXml/item2.xml><?xml version="1.0" encoding="utf-8"?>
 <?mso-contentType ?>
 <FormTemplates xmlns="http://schemas.microsoft.com/sharepoint/v3/contenttype/forms">
   <Display>DocumentLibraryForm</Display>
@@ -3698,7 +3635,7 @@
 </FormTemplates>
 </file>
 
-<file path=customXml/item3.xml><?xml version="1.0" encoding="utf-8"?>
+<file path=customXml/item2.xml><?xml version="1.0" encoding="utf-8"?>
 <ct:contentTypeSchema xmlns:ct="http://schemas.microsoft.com/office/2006/metadata/contentType" xmlns:ma="http://schemas.microsoft.com/office/2006/metadata/properties/metaAttributes" ct:_="" ma:_="" ma:contentTypeName="Document" ma:contentTypeID="0x010100E48B1925F2EFB241960044EC5F64C034" ma:contentTypeVersion="16" ma:contentTypeDescription="Create a new document." ma:contentTypeScope="" ma:versionID="b193f1a1adb628ee5f7d642c4cb4fead">
   <xsd:schema xmlns:xsd="http://www.w3.org/2001/XMLSchema" xmlns:xs="http://www.w3.org/2001/XMLSchema" xmlns:p="http://schemas.microsoft.com/office/2006/metadata/properties" xmlns:ns1="http://schemas.microsoft.com/sharepoint/v3" xmlns:ns2="416eecfc-56a7-4354-8013-4a2d9c92e153" xmlns:ns3="38d2a309-d798-495b-b1a3-e97c37808eef" targetNamespace="http://schemas.microsoft.com/office/2006/metadata/properties" ma:root="true" ma:fieldsID="f4c72206c132b1461c2865266b50231c" ns1:_="" ns2:_="" ns3:_="">
     <xsd:import namespace="http://schemas.microsoft.com/sharepoint/v3"/>
@@ -3944,23 +3881,24 @@
 </ct:contentTypeSchema>
 </file>
 
-<file path=customXml/item4.xml><?xml version="1.0" encoding="utf-8"?>
+<file path=customXml/item3.xml><?xml version="1.0" encoding="utf-8"?>
 <b:Sources xmlns:b="http://schemas.openxmlformats.org/officeDocument/2006/bibliography" xmlns="http://schemas.openxmlformats.org/officeDocument/2006/bibliography" SelectedStyle="\APA.XSL" StyleName="APA"/>
 </file>
 
-<file path=customXml/itemProps1.xml><?xml version="1.0" encoding="utf-8"?>
-<ds:datastoreItem xmlns:ds="http://schemas.openxmlformats.org/officeDocument/2006/customXml" ds:itemID="{5D491C04-0035-45EA-BE2E-2976A5F7A397}">
-  <ds:schemaRefs>
-    <ds:schemaRef ds:uri="http://schemas.microsoft.com/office/2006/metadata/properties"/>
-    <ds:schemaRef ds:uri="http://schemas.microsoft.com/office/infopath/2007/PartnerControls"/>
-    <ds:schemaRef ds:uri="38d2a309-d798-495b-b1a3-e97c37808eef"/>
-    <ds:schemaRef ds:uri="http://schemas.microsoft.com/sharepoint/v3"/>
-    <ds:schemaRef ds:uri="416eecfc-56a7-4354-8013-4a2d9c92e153"/>
-  </ds:schemaRefs>
-</ds:datastoreItem>
+<file path=customXml/item4.xml><?xml version="1.0" encoding="utf-8"?>
+<p:properties xmlns:p="http://schemas.microsoft.com/office/2006/metadata/properties" xmlns:xsi="http://www.w3.org/2001/XMLSchema-instance" xmlns:pc="http://schemas.microsoft.com/office/infopath/2007/PartnerControls">
+  <documentManagement>
+    <TaxCatchAll xmlns="38d2a309-d798-495b-b1a3-e97c37808eef"/>
+    <_ip_UnifiedCompliancePolicyUIAction xmlns="http://schemas.microsoft.com/sharepoint/v3" xsi:nil="true"/>
+    <_ip_UnifiedCompliancePolicyProperties xmlns="http://schemas.microsoft.com/sharepoint/v3" xsi:nil="true"/>
+    <lcf76f155ced4ddcb4097134ff3c332f xmlns="416eecfc-56a7-4354-8013-4a2d9c92e153">
+      <Terms xmlns="http://schemas.microsoft.com/office/infopath/2007/PartnerControls"/>
+    </lcf76f155ced4ddcb4097134ff3c332f>
+  </documentManagement>
+</p:properties>
 </file>
 
-<file path=customXml/itemProps2.xml><?xml version="1.0" encoding="utf-8"?>
+<file path=customXml/itemProps1.xml><?xml version="1.0" encoding="utf-8"?>
 <ds:datastoreItem xmlns:ds="http://schemas.openxmlformats.org/officeDocument/2006/customXml" ds:itemID="{2ACA00A0-0EB9-4F25-B1A0-9480A1DEA0B5}">
   <ds:schemaRefs>
     <ds:schemaRef ds:uri="http://schemas.microsoft.com/sharepoint/v3/contenttype/forms"/>
@@ -3968,7 +3906,7 @@
 </ds:datastoreItem>
 </file>
 
-<file path=customXml/itemProps3.xml><?xml version="1.0" encoding="utf-8"?>
+<file path=customXml/itemProps2.xml><?xml version="1.0" encoding="utf-8"?>
 <ds:datastoreItem xmlns:ds="http://schemas.openxmlformats.org/officeDocument/2006/customXml" ds:itemID="{3AA634C4-AFF1-45A4-BEEC-3BC128C36838}">
   <ds:schemaRefs>
     <ds:schemaRef ds:uri="http://schemas.microsoft.com/office/2006/metadata/contentType"/>
@@ -3988,10 +3926,22 @@
 </ds:datastoreItem>
 </file>
 
-<file path=customXml/itemProps4.xml><?xml version="1.0" encoding="utf-8"?>
+<file path=customXml/itemProps3.xml><?xml version="1.0" encoding="utf-8"?>
 <ds:datastoreItem xmlns:ds="http://schemas.openxmlformats.org/officeDocument/2006/customXml" ds:itemID="{4202E056-596C-4D43-866F-DBCC294656E0}">
   <ds:schemaRefs>
     <ds:schemaRef ds:uri="http://schemas.openxmlformats.org/officeDocument/2006/bibliography"/>
+  </ds:schemaRefs>
+</ds:datastoreItem>
+</file>
+
+<file path=customXml/itemProps4.xml><?xml version="1.0" encoding="utf-8"?>
+<ds:datastoreItem xmlns:ds="http://schemas.openxmlformats.org/officeDocument/2006/customXml" ds:itemID="{5D491C04-0035-45EA-BE2E-2976A5F7A397}">
+  <ds:schemaRefs>
+    <ds:schemaRef ds:uri="http://schemas.microsoft.com/office/2006/metadata/properties"/>
+    <ds:schemaRef ds:uri="http://schemas.microsoft.com/office/infopath/2007/PartnerControls"/>
+    <ds:schemaRef ds:uri="38d2a309-d798-495b-b1a3-e97c37808eef"/>
+    <ds:schemaRef ds:uri="http://schemas.microsoft.com/sharepoint/v3"/>
+    <ds:schemaRef ds:uri="416eecfc-56a7-4354-8013-4a2d9c92e153"/>
   </ds:schemaRefs>
 </ds:datastoreItem>
 </file>

</xml_diff>

<commit_message>
Update report template to add author
</commit_message>
<xml_diff>
--- a/app/assets/default_template.docx
+++ b/app/assets/default_template.docx
@@ -415,25 +415,91 @@
           <w:szCs w:val="20"/>
           <w:lang w:bidi="en-US"/>
         </w:rPr>
-        <w:t>(</w:t>
-      </w:r>
-      <w:r>
-        <w:rPr>
-          <w:rFonts w:ascii="Arial" w:hAnsi="Arial" w:cs="Arial"/>
-          <w:sz w:val="20"/>
-          <w:szCs w:val="20"/>
-          <w:lang w:bidi="en-US"/>
-        </w:rPr>
-        <w:t>{{article.source}}</w:t>
-      </w:r>
-      <w:r>
-        <w:rPr>
-          <w:rFonts w:ascii="Arial" w:hAnsi="Arial" w:cs="Arial"/>
-          <w:sz w:val="20"/>
-          <w:szCs w:val="20"/>
-          <w:lang w:bidi="en-US"/>
-        </w:rPr>
-        <w:t>) {{article.date}}</w:t>
+        <w:t>({{</w:t>
+      </w:r>
+      <w:proofErr w:type="spellStart"/>
+      <w:proofErr w:type="gramStart"/>
+      <w:r>
+        <w:rPr>
+          <w:rFonts w:ascii="Arial" w:hAnsi="Arial" w:cs="Arial"/>
+          <w:sz w:val="20"/>
+          <w:szCs w:val="20"/>
+          <w:lang w:bidi="en-US"/>
+        </w:rPr>
+        <w:t>article.source</w:t>
+      </w:r>
+      <w:proofErr w:type="spellEnd"/>
+      <w:proofErr w:type="gramEnd"/>
+      <w:r>
+        <w:rPr>
+          <w:rFonts w:ascii="Arial" w:hAnsi="Arial" w:cs="Arial"/>
+          <w:sz w:val="20"/>
+          <w:szCs w:val="20"/>
+          <w:lang w:bidi="en-US"/>
+        </w:rPr>
+        <w:t>}}</w:t>
+      </w:r>
+      <w:r>
+        <w:rPr>
+          <w:rFonts w:ascii="Arial" w:hAnsi="Arial" w:cs="Arial"/>
+          <w:sz w:val="20"/>
+          <w:szCs w:val="20"/>
+          <w:lang w:bidi="en-US"/>
+        </w:rPr>
+        <w:t>/{{</w:t>
+      </w:r>
+      <w:proofErr w:type="spellStart"/>
+      <w:proofErr w:type="gramStart"/>
+      <w:r>
+        <w:rPr>
+          <w:rFonts w:ascii="Arial" w:hAnsi="Arial" w:cs="Arial"/>
+          <w:sz w:val="20"/>
+          <w:szCs w:val="20"/>
+          <w:lang w:bidi="en-US"/>
+        </w:rPr>
+        <w:t>article.author</w:t>
+      </w:r>
+      <w:proofErr w:type="spellEnd"/>
+      <w:proofErr w:type="gramEnd"/>
+      <w:r>
+        <w:rPr>
+          <w:rFonts w:ascii="Arial" w:hAnsi="Arial" w:cs="Arial"/>
+          <w:sz w:val="20"/>
+          <w:szCs w:val="20"/>
+          <w:lang w:bidi="en-US"/>
+        </w:rPr>
+        <w:t>}}</w:t>
+      </w:r>
+      <w:r>
+        <w:rPr>
+          <w:rFonts w:ascii="Arial" w:hAnsi="Arial" w:cs="Arial"/>
+          <w:sz w:val="20"/>
+          <w:szCs w:val="20"/>
+          <w:lang w:bidi="en-US"/>
+        </w:rPr>
+        <w:t>) {{</w:t>
+      </w:r>
+      <w:proofErr w:type="spellStart"/>
+      <w:proofErr w:type="gramStart"/>
+      <w:r>
+        <w:rPr>
+          <w:rFonts w:ascii="Arial" w:hAnsi="Arial" w:cs="Arial"/>
+          <w:sz w:val="20"/>
+          <w:szCs w:val="20"/>
+          <w:lang w:bidi="en-US"/>
+        </w:rPr>
+        <w:t>article.date</w:t>
+      </w:r>
+      <w:proofErr w:type="spellEnd"/>
+      <w:proofErr w:type="gramEnd"/>
+      <w:r>
+        <w:rPr>
+          <w:rFonts w:ascii="Arial" w:hAnsi="Arial" w:cs="Arial"/>
+          <w:sz w:val="20"/>
+          <w:szCs w:val="20"/>
+          <w:lang w:bidi="en-US"/>
+        </w:rPr>
+        <w:t>}}</w:t>
       </w:r>
     </w:p>
     <w:p>
@@ -773,38 +839,103 @@
       <w:pPr>
         <w:rPr>
           <w:rFonts w:ascii="Arial" w:hAnsi="Arial" w:cs="Arial"/>
-          <w:color w:val="0000FF"/>
-          <w:sz w:val="20"/>
-          <w:szCs w:val="20"/>
-          <w:lang w:bidi="en-US"/>
-        </w:rPr>
-      </w:pPr>
-      <w:r>
-        <w:rPr>
-          <w:rFonts w:ascii="Arial" w:hAnsi="Arial" w:cs="Arial"/>
-          <w:sz w:val="20"/>
-          <w:szCs w:val="20"/>
-          <w:lang w:bidi="en-US"/>
-        </w:rPr>
-        <w:t>(</w:t>
-      </w:r>
-      <w:r>
-        <w:rPr>
-          <w:rFonts w:ascii="Arial" w:hAnsi="Arial" w:cs="Arial"/>
-          <w:sz w:val="20"/>
-          <w:szCs w:val="20"/>
-          <w:lang w:bidi="en-US"/>
-        </w:rPr>
-        <w:t>{{article.source}})</w:t>
-      </w:r>
-      <w:r>
-        <w:rPr>
-          <w:rFonts w:ascii="Arial" w:hAnsi="Arial" w:cs="Arial"/>
-          <w:sz w:val="20"/>
-          <w:szCs w:val="20"/>
-          <w:lang w:bidi="en-US"/>
-        </w:rPr>
-        <w:t xml:space="preserve"> {{article.date}}</w:t>
+          <w:sz w:val="20"/>
+          <w:szCs w:val="20"/>
+          <w:lang w:bidi="en-US"/>
+        </w:rPr>
+      </w:pPr>
+      <w:r>
+        <w:rPr>
+          <w:rFonts w:ascii="Arial" w:hAnsi="Arial" w:cs="Arial"/>
+          <w:sz w:val="20"/>
+          <w:szCs w:val="20"/>
+          <w:lang w:bidi="en-US"/>
+        </w:rPr>
+        <w:t>({{</w:t>
+      </w:r>
+      <w:proofErr w:type="spellStart"/>
+      <w:proofErr w:type="gramStart"/>
+      <w:r>
+        <w:rPr>
+          <w:rFonts w:ascii="Arial" w:hAnsi="Arial" w:cs="Arial"/>
+          <w:sz w:val="20"/>
+          <w:szCs w:val="20"/>
+          <w:lang w:bidi="en-US"/>
+        </w:rPr>
+        <w:t>article.source</w:t>
+      </w:r>
+      <w:proofErr w:type="spellEnd"/>
+      <w:proofErr w:type="gramEnd"/>
+      <w:r>
+        <w:rPr>
+          <w:rFonts w:ascii="Arial" w:hAnsi="Arial" w:cs="Arial"/>
+          <w:sz w:val="20"/>
+          <w:szCs w:val="20"/>
+          <w:lang w:bidi="en-US"/>
+        </w:rPr>
+        <w:t>}}</w:t>
+      </w:r>
+      <w:r>
+        <w:rPr>
+          <w:rFonts w:ascii="Arial" w:hAnsi="Arial" w:cs="Arial"/>
+          <w:sz w:val="20"/>
+          <w:szCs w:val="20"/>
+          <w:lang w:bidi="en-US"/>
+        </w:rPr>
+        <w:t>/{{</w:t>
+      </w:r>
+      <w:proofErr w:type="spellStart"/>
+      <w:proofErr w:type="gramStart"/>
+      <w:r>
+        <w:rPr>
+          <w:rFonts w:ascii="Arial" w:hAnsi="Arial" w:cs="Arial"/>
+          <w:sz w:val="20"/>
+          <w:szCs w:val="20"/>
+          <w:lang w:bidi="en-US"/>
+        </w:rPr>
+        <w:t>article.author</w:t>
+      </w:r>
+      <w:proofErr w:type="spellEnd"/>
+      <w:proofErr w:type="gramEnd"/>
+      <w:r>
+        <w:rPr>
+          <w:rFonts w:ascii="Arial" w:hAnsi="Arial" w:cs="Arial"/>
+          <w:sz w:val="20"/>
+          <w:szCs w:val="20"/>
+          <w:lang w:bidi="en-US"/>
+        </w:rPr>
+        <w:t>}}</w:t>
+      </w:r>
+      <w:r>
+        <w:rPr>
+          <w:rFonts w:ascii="Arial" w:hAnsi="Arial" w:cs="Arial"/>
+          <w:sz w:val="20"/>
+          <w:szCs w:val="20"/>
+          <w:lang w:bidi="en-US"/>
+        </w:rPr>
+        <w:t>) {{</w:t>
+      </w:r>
+      <w:proofErr w:type="spellStart"/>
+      <w:proofErr w:type="gramStart"/>
+      <w:r>
+        <w:rPr>
+          <w:rFonts w:ascii="Arial" w:hAnsi="Arial" w:cs="Arial"/>
+          <w:sz w:val="20"/>
+          <w:szCs w:val="20"/>
+          <w:lang w:bidi="en-US"/>
+        </w:rPr>
+        <w:t>article.date</w:t>
+      </w:r>
+      <w:proofErr w:type="spellEnd"/>
+      <w:proofErr w:type="gramEnd"/>
+      <w:r>
+        <w:rPr>
+          <w:rFonts w:ascii="Arial" w:hAnsi="Arial" w:cs="Arial"/>
+          <w:sz w:val="20"/>
+          <w:szCs w:val="20"/>
+          <w:lang w:bidi="en-US"/>
+        </w:rPr>
+        <w:t>}}</w:t>
       </w:r>
     </w:p>
     <w:p>
@@ -3534,15 +3665,23 @@
 </file>
 
 <file path=customXml/item1.xml><?xml version="1.0" encoding="utf-8"?>
-<?mso-contentType ?>
-<FormTemplates xmlns="http://schemas.microsoft.com/sharepoint/v3/contenttype/forms">
-  <Display>DocumentLibraryForm</Display>
-  <Edit>DocumentLibraryForm</Edit>
-  <New>DocumentLibraryForm</New>
-</FormTemplates>
+<p:properties xmlns:p="http://schemas.microsoft.com/office/2006/metadata/properties" xmlns:xsi="http://www.w3.org/2001/XMLSchema-instance" xmlns:pc="http://schemas.microsoft.com/office/infopath/2007/PartnerControls">
+  <documentManagement>
+    <TaxCatchAll xmlns="38d2a309-d798-495b-b1a3-e97c37808eef"/>
+    <_ip_UnifiedCompliancePolicyUIAction xmlns="http://schemas.microsoft.com/sharepoint/v3" xsi:nil="true"/>
+    <_ip_UnifiedCompliancePolicyProperties xmlns="http://schemas.microsoft.com/sharepoint/v3" xsi:nil="true"/>
+    <lcf76f155ced4ddcb4097134ff3c332f xmlns="416eecfc-56a7-4354-8013-4a2d9c92e153">
+      <Terms xmlns="http://schemas.microsoft.com/office/infopath/2007/PartnerControls"/>
+    </lcf76f155ced4ddcb4097134ff3c332f>
+  </documentManagement>
+</p:properties>
 </file>
 
 <file path=customXml/item2.xml><?xml version="1.0" encoding="utf-8"?>
+<b:Sources xmlns:b="http://schemas.openxmlformats.org/officeDocument/2006/bibliography" xmlns="http://schemas.openxmlformats.org/officeDocument/2006/bibliography" SelectedStyle="\APA.XSL" StyleName="APA"/>
+</file>
+
+<file path=customXml/item3.xml><?xml version="1.0" encoding="utf-8"?>
 <ct:contentTypeSchema xmlns:ct="http://schemas.microsoft.com/office/2006/metadata/contentType" xmlns:ma="http://schemas.microsoft.com/office/2006/metadata/properties/metaAttributes" ct:_="" ma:_="" ma:contentTypeName="Document" ma:contentTypeID="0x010100E48B1925F2EFB241960044EC5F64C034" ma:contentTypeVersion="16" ma:contentTypeDescription="Create a new document." ma:contentTypeScope="" ma:versionID="b193f1a1adb628ee5f7d642c4cb4fead">
   <xsd:schema xmlns:xsd="http://www.w3.org/2001/XMLSchema" xmlns:xs="http://www.w3.org/2001/XMLSchema" xmlns:p="http://schemas.microsoft.com/office/2006/metadata/properties" xmlns:ns1="http://schemas.microsoft.com/sharepoint/v3" xmlns:ns2="416eecfc-56a7-4354-8013-4a2d9c92e153" xmlns:ns3="38d2a309-d798-495b-b1a3-e97c37808eef" targetNamespace="http://schemas.microsoft.com/office/2006/metadata/properties" ma:root="true" ma:fieldsID="f4c72206c132b1461c2865266b50231c" ns1:_="" ns2:_="" ns3:_="">
     <xsd:import namespace="http://schemas.microsoft.com/sharepoint/v3"/>
@@ -3788,32 +3927,36 @@
 </ct:contentTypeSchema>
 </file>
 
-<file path=customXml/item3.xml><?xml version="1.0" encoding="utf-8"?>
-<b:Sources xmlns:b="http://schemas.openxmlformats.org/officeDocument/2006/bibliography" xmlns="http://schemas.openxmlformats.org/officeDocument/2006/bibliography" SelectedStyle="\APA.XSL" StyleName="APA"/>
-</file>
-
 <file path=customXml/item4.xml><?xml version="1.0" encoding="utf-8"?>
-<p:properties xmlns:p="http://schemas.microsoft.com/office/2006/metadata/properties" xmlns:xsi="http://www.w3.org/2001/XMLSchema-instance" xmlns:pc="http://schemas.microsoft.com/office/infopath/2007/PartnerControls">
-  <documentManagement>
-    <TaxCatchAll xmlns="38d2a309-d798-495b-b1a3-e97c37808eef"/>
-    <_ip_UnifiedCompliancePolicyUIAction xmlns="http://schemas.microsoft.com/sharepoint/v3" xsi:nil="true"/>
-    <_ip_UnifiedCompliancePolicyProperties xmlns="http://schemas.microsoft.com/sharepoint/v3" xsi:nil="true"/>
-    <lcf76f155ced4ddcb4097134ff3c332f xmlns="416eecfc-56a7-4354-8013-4a2d9c92e153">
-      <Terms xmlns="http://schemas.microsoft.com/office/infopath/2007/PartnerControls"/>
-    </lcf76f155ced4ddcb4097134ff3c332f>
-  </documentManagement>
-</p:properties>
+<?mso-contentType ?>
+<FormTemplates xmlns="http://schemas.microsoft.com/sharepoint/v3/contenttype/forms">
+  <Display>DocumentLibraryForm</Display>
+  <Edit>DocumentLibraryForm</Edit>
+  <New>DocumentLibraryForm</New>
+</FormTemplates>
 </file>
 
 <file path=customXml/itemProps1.xml><?xml version="1.0" encoding="utf-8"?>
-<ds:datastoreItem xmlns:ds="http://schemas.openxmlformats.org/officeDocument/2006/customXml" ds:itemID="{2ACA00A0-0EB9-4F25-B1A0-9480A1DEA0B5}">
+<ds:datastoreItem xmlns:ds="http://schemas.openxmlformats.org/officeDocument/2006/customXml" ds:itemID="{5D491C04-0035-45EA-BE2E-2976A5F7A397}">
   <ds:schemaRefs>
-    <ds:schemaRef ds:uri="http://schemas.microsoft.com/sharepoint/v3/contenttype/forms"/>
+    <ds:schemaRef ds:uri="http://schemas.microsoft.com/office/2006/metadata/properties"/>
+    <ds:schemaRef ds:uri="http://schemas.microsoft.com/office/infopath/2007/PartnerControls"/>
+    <ds:schemaRef ds:uri="38d2a309-d798-495b-b1a3-e97c37808eef"/>
+    <ds:schemaRef ds:uri="http://schemas.microsoft.com/sharepoint/v3"/>
+    <ds:schemaRef ds:uri="416eecfc-56a7-4354-8013-4a2d9c92e153"/>
   </ds:schemaRefs>
 </ds:datastoreItem>
 </file>
 
 <file path=customXml/itemProps2.xml><?xml version="1.0" encoding="utf-8"?>
+<ds:datastoreItem xmlns:ds="http://schemas.openxmlformats.org/officeDocument/2006/customXml" ds:itemID="{4202E056-596C-4D43-866F-DBCC294656E0}">
+  <ds:schemaRefs>
+    <ds:schemaRef ds:uri="http://schemas.openxmlformats.org/officeDocument/2006/bibliography"/>
+  </ds:schemaRefs>
+</ds:datastoreItem>
+</file>
+
+<file path=customXml/itemProps3.xml><?xml version="1.0" encoding="utf-8"?>
 <ds:datastoreItem xmlns:ds="http://schemas.openxmlformats.org/officeDocument/2006/customXml" ds:itemID="{3AA634C4-AFF1-45A4-BEEC-3BC128C36838}">
   <ds:schemaRefs>
     <ds:schemaRef ds:uri="http://schemas.microsoft.com/office/2006/metadata/contentType"/>
@@ -3833,22 +3976,10 @@
 </ds:datastoreItem>
 </file>
 
-<file path=customXml/itemProps3.xml><?xml version="1.0" encoding="utf-8"?>
-<ds:datastoreItem xmlns:ds="http://schemas.openxmlformats.org/officeDocument/2006/customXml" ds:itemID="{4202E056-596C-4D43-866F-DBCC294656E0}">
+<file path=customXml/itemProps4.xml><?xml version="1.0" encoding="utf-8"?>
+<ds:datastoreItem xmlns:ds="http://schemas.openxmlformats.org/officeDocument/2006/customXml" ds:itemID="{2ACA00A0-0EB9-4F25-B1A0-9480A1DEA0B5}">
   <ds:schemaRefs>
-    <ds:schemaRef ds:uri="http://schemas.openxmlformats.org/officeDocument/2006/bibliography"/>
-  </ds:schemaRefs>
-</ds:datastoreItem>
-</file>
-
-<file path=customXml/itemProps4.xml><?xml version="1.0" encoding="utf-8"?>
-<ds:datastoreItem xmlns:ds="http://schemas.openxmlformats.org/officeDocument/2006/customXml" ds:itemID="{5D491C04-0035-45EA-BE2E-2976A5F7A397}">
-  <ds:schemaRefs>
-    <ds:schemaRef ds:uri="http://schemas.microsoft.com/office/2006/metadata/properties"/>
-    <ds:schemaRef ds:uri="http://schemas.microsoft.com/office/infopath/2007/PartnerControls"/>
-    <ds:schemaRef ds:uri="38d2a309-d798-495b-b1a3-e97c37808eef"/>
-    <ds:schemaRef ds:uri="http://schemas.microsoft.com/sharepoint/v3"/>
-    <ds:schemaRef ds:uri="416eecfc-56a7-4354-8013-4a2d9c92e153"/>
+    <ds:schemaRef ds:uri="http://schemas.microsoft.com/sharepoint/v3/contenttype/forms"/>
   </ds:schemaRefs>
 </ds:datastoreItem>
 </file>

</xml_diff>

<commit_message>
Modified document template to add internal navigation links to empty sections
</commit_message>
<xml_diff>
--- a/app/assets/default_template.docx
+++ b/app/assets/default_template.docx
@@ -1,6 +1,6 @@
 
 <file path=word/document.xml><?xml version="1.0" encoding="utf-8"?>
-<w:document xmlns:wpc="http://schemas.microsoft.com/office/word/2010/wordprocessingCanvas" xmlns:cx="http://schemas.microsoft.com/office/drawing/2014/chartex" xmlns:cx1="http://schemas.microsoft.com/office/drawing/2015/9/8/chartex" xmlns:cx2="http://schemas.microsoft.com/office/drawing/2015/10/21/chartex" xmlns:cx3="http://schemas.microsoft.com/office/drawing/2016/5/9/chartex" xmlns:cx4="http://schemas.microsoft.com/office/drawing/2016/5/10/chartex" xmlns:cx5="http://schemas.microsoft.com/office/drawing/2016/5/11/chartex" xmlns:cx6="http://schemas.microsoft.com/office/drawing/2016/5/12/chartex" xmlns:cx7="http://schemas.microsoft.com/office/drawing/2016/5/13/chartex" xmlns:cx8="http://schemas.microsoft.com/office/drawing/2016/5/14/chartex" xmlns:mc="http://schemas.openxmlformats.org/markup-compatibility/2006" xmlns:m="http://schemas.openxmlformats.org/officeDocument/2006/math" xmlns:aink="http://schemas.microsoft.com/office/drawing/2016/ink" xmlns:am3d="http://schemas.microsoft.com/office/drawing/2017/model3d" xmlns:oel="http://schemas.microsoft.com/office/2019/extlst" xmlns:r="http://schemas.openxmlformats.org/officeDocument/2006/relationships" xmlns:wp14="http://schemas.microsoft.com/office/word/2010/wordprocessingDrawing" xmlns:wp="http://schemas.openxmlformats.org/drawingml/2006/wordprocessingDrawing" xmlns:wpg="http://schemas.microsoft.com/office/word/2010/wordprocessingGroup" xmlns:wpi="http://schemas.microsoft.com/office/word/2010/wordprocessingInk" xmlns:wps="http://schemas.microsoft.com/office/word/2010/wordprocessingShape" xmlns:o="urn:schemas-microsoft-com:office:office" xmlns:v="urn:schemas-microsoft-com:vml" xmlns:w10="urn:schemas-microsoft-com:office:word" xmlns:w="http://schemas.openxmlformats.org/wordprocessingml/2006/main" xmlns:w14="http://schemas.microsoft.com/office/word/2010/wordml" xmlns:w15="http://schemas.microsoft.com/office/word/2012/wordml" xmlns:w16cei="http://schemas.microsoft.com/office/word/2026/wordml/cei" xmlns:w16cex="http://schemas.microsoft.com/office/word/2018/wordml/cex" xmlns:w16cid="http://schemas.microsoft.com/office/word/2016/wordml/cid" xmlns:w16="http://schemas.microsoft.com/office/word/2018/wordml" xmlns:w16sdtdh="http://schemas.microsoft.com/office/word/2020/wordml/sdtdatahash" xmlns:w16sdtfl="http://schemas.microsoft.com/office/word/2024/wordml/sdtformatlock" xmlns:w16se="http://schemas.microsoft.com/office/word/2015/wordml/symex" xmlns:w16du="http://schemas.microsoft.com/office/word/2023/wordml/word16du" xmlns:wne="http://schemas.microsoft.com/office/word/2006/wordml" mc:Ignorable="w14 w15 w16se w16cid w16 w16cex w16sdtdh w16sdtfl w16du wp14">
+<w:document xmlns:wpc="http://schemas.microsoft.com/office/word/2010/wordprocessingCanvas" xmlns:cx="http://schemas.microsoft.com/office/drawing/2014/chartex" xmlns:cx1="http://schemas.microsoft.com/office/drawing/2015/9/8/chartex" xmlns:cx2="http://schemas.microsoft.com/office/drawing/2015/10/21/chartex" xmlns:cx3="http://schemas.microsoft.com/office/drawing/2016/5/9/chartex" xmlns:cx4="http://schemas.microsoft.com/office/drawing/2016/5/10/chartex" xmlns:cx5="http://schemas.microsoft.com/office/drawing/2016/5/11/chartex" xmlns:cx6="http://schemas.microsoft.com/office/drawing/2016/5/12/chartex" xmlns:cx7="http://schemas.microsoft.com/office/drawing/2016/5/13/chartex" xmlns:cx8="http://schemas.microsoft.com/office/drawing/2016/5/14/chartex" xmlns:mc="http://schemas.openxmlformats.org/markup-compatibility/2006" xmlns:m="http://schemas.openxmlformats.org/officeDocument/2006/math" xmlns:aink="http://schemas.microsoft.com/office/drawing/2016/ink" xmlns:am3d="http://schemas.microsoft.com/office/drawing/2017/model3d" xmlns:oel="http://schemas.microsoft.com/office/2019/extlst" xmlns:r="http://schemas.openxmlformats.org/officeDocument/2006/relationships" xmlns:wp14="http://schemas.microsoft.com/office/word/2010/wordprocessingDrawing" xmlns:wp="http://schemas.openxmlformats.org/drawingml/2006/wordprocessingDrawing" xmlns:wpg="http://schemas.microsoft.com/office/word/2010/wordprocessingGroup" xmlns:wpi="http://schemas.microsoft.com/office/word/2010/wordprocessingInk" xmlns:wps="http://schemas.microsoft.com/office/word/2010/wordprocessingShape" xmlns:o="urn:schemas-microsoft-com:office:office" xmlns:v="urn:schemas-microsoft-com:vml" xmlns:w10="urn:schemas-microsoft-com:office:word" xmlns:w="http://schemas.openxmlformats.org/wordprocessingml/2006/main" xmlns:w14="http://schemas.microsoft.com/office/word/2010/wordml" xmlns:w15="http://schemas.microsoft.com/office/word/2012/wordml" xmlns:w16cex="http://schemas.microsoft.com/office/word/2018/wordml/cex" xmlns:w16cid="http://schemas.microsoft.com/office/word/2016/wordml/cid" xmlns:w16="http://schemas.microsoft.com/office/word/2018/wordml" xmlns:w16sdtdh="http://schemas.microsoft.com/office/word/2020/wordml/sdtdatahash" xmlns:w16sdtfl="http://schemas.microsoft.com/office/word/2024/wordml/sdtformatlock" xmlns:w16se="http://schemas.microsoft.com/office/word/2015/wordml/symex" xmlns:w16du="http://schemas.microsoft.com/office/word/2023/wordml/word16du" xmlns:wne="http://schemas.microsoft.com/office/word/2006/wordml" mc:Ignorable="w14 w15 w16se w16cid w16 w16cex w16sdtdh w16sdtfl w16du wp14">
   <w:body>
     <w:p>
       <w:pPr>
@@ -98,7 +98,7 @@
               </wp:anchor>
             </w:drawing>
           </mc:Choice>
-          <mc:Fallback>
+          <mc:Fallback xmlns:w16cei="http://schemas.microsoft.com/office/word/2026/wordml/cei">
             <w:pict>
               <v:group w14:anchorId="08AC1105" id="Group 11" o:spid="_x0000_s1026" style="position:absolute;margin-left:-18pt;margin-top:10.95pt;width:450pt;height:3.9pt;z-index:251659264" coordorigin="9906,7302" coordsize="68580,1080" o:gfxdata="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">
                 <v:line id="Straight Connector 8" o:spid="_x0000_s1027" style="position:absolute;visibility:visible;mso-wrap-style:square" from="9906,7302" to="78486,7302" o:connectortype="straight" o:gfxdata="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" strokecolor="#ffc000" strokeweight="6pt"/>
@@ -334,6 +334,53 @@
         </w:rPr>
         <w:t>}}</w:t>
       </w:r>
+    </w:p>
+    <w:p/>
+    <w:p>
+      <w:pPr>
+        <w:rPr>
+          <w:rFonts w:ascii="Arial" w:hAnsi="Arial" w:cs="Arial"/>
+          <w:sz w:val="18"/>
+          <w:szCs w:val="18"/>
+        </w:rPr>
+      </w:pPr>
+      <w:hyperlink w:anchor="_FULL_ARTICLES" w:history="1">
+        <w:r>
+          <w:rPr>
+            <w:rStyle w:val="Hyperlink"/>
+            <w:rFonts w:ascii="Arial" w:hAnsi="Arial" w:cs="Arial"/>
+            <w:b/>
+            <w:sz w:val="18"/>
+            <w:szCs w:val="18"/>
+            <w:lang w:bidi="en-US"/>
+          </w:rPr>
+          <w:t>Full Articles</w:t>
+        </w:r>
+      </w:hyperlink>
+      <w:r>
+        <w:rPr>
+          <w:rFonts w:ascii="Arial" w:hAnsi="Arial" w:cs="Arial"/>
+          <w:b/>
+          <w:color w:val="000000"/>
+          <w:sz w:val="18"/>
+          <w:szCs w:val="18"/>
+          <w:lang w:bidi="en-US"/>
+        </w:rPr>
+        <w:t xml:space="preserve"> </w:t>
+      </w:r>
+      <w:hyperlink w:anchor="_top" w:history="1">
+        <w:r>
+          <w:rPr>
+            <w:rStyle w:val="Hyperlink"/>
+            <w:rFonts w:ascii="Arial" w:hAnsi="Arial" w:cs="Arial"/>
+            <w:b/>
+            <w:sz w:val="18"/>
+            <w:szCs w:val="18"/>
+            <w:lang w:bidi="en-US"/>
+          </w:rPr>
+          <w:t>Back to Top</w:t>
+        </w:r>
+      </w:hyperlink>
     </w:p>
     <w:p>
       <w:pPr>
@@ -766,6 +813,36 @@
         <w:t>}}</w:t>
       </w:r>
     </w:p>
+    <w:p/>
+    <w:p>
+      <w:pPr>
+        <w:rPr>
+          <w:rFonts w:ascii="Arial" w:hAnsi="Arial" w:cs="Arial"/>
+          <w:sz w:val="18"/>
+          <w:szCs w:val="18"/>
+        </w:rPr>
+      </w:pPr>
+      <w:hyperlink w:anchor="_top" w:history="1">
+        <w:r>
+          <w:rPr>
+            <w:rStyle w:val="Hyperlink"/>
+            <w:rFonts w:ascii="Arial" w:hAnsi="Arial" w:cs="Arial"/>
+            <w:b/>
+            <w:sz w:val="18"/>
+            <w:szCs w:val="18"/>
+            <w:lang w:bidi="en-US"/>
+          </w:rPr>
+          <w:t>Back to Summaries</w:t>
+        </w:r>
+      </w:hyperlink>
+    </w:p>
+    <w:p>
+      <w:pPr>
+        <w:rPr>
+          <w:lang w:bidi="en-US"/>
+        </w:rPr>
+      </w:pPr>
+    </w:p>
     <w:p>
       <w:pPr>
         <w:rPr>
@@ -1198,7 +1275,7 @@
 </file>
 
 <file path=word/endnotes.xml><?xml version="1.0" encoding="utf-8"?>
-<w:endnotes xmlns:wpc="http://schemas.microsoft.com/office/word/2010/wordprocessingCanvas" xmlns:cx="http://schemas.microsoft.com/office/drawing/2014/chartex" xmlns:cx1="http://schemas.microsoft.com/office/drawing/2015/9/8/chartex" xmlns:cx2="http://schemas.microsoft.com/office/drawing/2015/10/21/chartex" xmlns:cx3="http://schemas.microsoft.com/office/drawing/2016/5/9/chartex" xmlns:cx4="http://schemas.microsoft.com/office/drawing/2016/5/10/chartex" xmlns:cx5="http://schemas.microsoft.com/office/drawing/2016/5/11/chartex" xmlns:cx6="http://schemas.microsoft.com/office/drawing/2016/5/12/chartex" xmlns:cx7="http://schemas.microsoft.com/office/drawing/2016/5/13/chartex" xmlns:cx8="http://schemas.microsoft.com/office/drawing/2016/5/14/chartex" xmlns:mc="http://schemas.openxmlformats.org/markup-compatibility/2006" xmlns:m="http://schemas.openxmlformats.org/officeDocument/2006/math" xmlns:aink="http://schemas.microsoft.com/office/drawing/2016/ink" xmlns:am3d="http://schemas.microsoft.com/office/drawing/2017/model3d" xmlns:oel="http://schemas.microsoft.com/office/2019/extlst" xmlns:r="http://schemas.openxmlformats.org/officeDocument/2006/relationships" xmlns:wp14="http://schemas.microsoft.com/office/word/2010/wordprocessingDrawing" xmlns:wp="http://schemas.openxmlformats.org/drawingml/2006/wordprocessingDrawing" xmlns:wpg="http://schemas.microsoft.com/office/word/2010/wordprocessingGroup" xmlns:wpi="http://schemas.microsoft.com/office/word/2010/wordprocessingInk" xmlns:wps="http://schemas.microsoft.com/office/word/2010/wordprocessingShape" xmlns:o="urn:schemas-microsoft-com:office:office" xmlns:v="urn:schemas-microsoft-com:vml" xmlns:w10="urn:schemas-microsoft-com:office:word" xmlns:w="http://schemas.openxmlformats.org/wordprocessingml/2006/main" xmlns:w14="http://schemas.microsoft.com/office/word/2010/wordml" xmlns:w15="http://schemas.microsoft.com/office/word/2012/wordml" xmlns:w16cei="http://schemas.microsoft.com/office/word/2026/wordml/cei" xmlns:w16cex="http://schemas.microsoft.com/office/word/2018/wordml/cex" xmlns:w16cid="http://schemas.microsoft.com/office/word/2016/wordml/cid" xmlns:w16="http://schemas.microsoft.com/office/word/2018/wordml" xmlns:w16sdtdh="http://schemas.microsoft.com/office/word/2020/wordml/sdtdatahash" xmlns:w16sdtfl="http://schemas.microsoft.com/office/word/2024/wordml/sdtformatlock" xmlns:w16se="http://schemas.microsoft.com/office/word/2015/wordml/symex" xmlns:w16du="http://schemas.microsoft.com/office/word/2023/wordml/word16du" xmlns:wne="http://schemas.microsoft.com/office/word/2006/wordml" mc:Ignorable="w14 w15 w16se w16cid w16 w16cex w16sdtdh w16sdtfl w16du wp14">
+<w:endnotes xmlns:wpc="http://schemas.microsoft.com/office/word/2010/wordprocessingCanvas" xmlns:cx="http://schemas.microsoft.com/office/drawing/2014/chartex" xmlns:cx1="http://schemas.microsoft.com/office/drawing/2015/9/8/chartex" xmlns:cx2="http://schemas.microsoft.com/office/drawing/2015/10/21/chartex" xmlns:cx3="http://schemas.microsoft.com/office/drawing/2016/5/9/chartex" xmlns:cx4="http://schemas.microsoft.com/office/drawing/2016/5/10/chartex" xmlns:cx5="http://schemas.microsoft.com/office/drawing/2016/5/11/chartex" xmlns:cx6="http://schemas.microsoft.com/office/drawing/2016/5/12/chartex" xmlns:cx7="http://schemas.microsoft.com/office/drawing/2016/5/13/chartex" xmlns:cx8="http://schemas.microsoft.com/office/drawing/2016/5/14/chartex" xmlns:mc="http://schemas.openxmlformats.org/markup-compatibility/2006" xmlns:m="http://schemas.openxmlformats.org/officeDocument/2006/math" xmlns:aink="http://schemas.microsoft.com/office/drawing/2016/ink" xmlns:am3d="http://schemas.microsoft.com/office/drawing/2017/model3d" xmlns:oel="http://schemas.microsoft.com/office/2019/extlst" xmlns:r="http://schemas.openxmlformats.org/officeDocument/2006/relationships" xmlns:wp14="http://schemas.microsoft.com/office/word/2010/wordprocessingDrawing" xmlns:wp="http://schemas.openxmlformats.org/drawingml/2006/wordprocessingDrawing" xmlns:wpg="http://schemas.microsoft.com/office/word/2010/wordprocessingGroup" xmlns:wpi="http://schemas.microsoft.com/office/word/2010/wordprocessingInk" xmlns:wps="http://schemas.microsoft.com/office/word/2010/wordprocessingShape" xmlns:o="urn:schemas-microsoft-com:office:office" xmlns:v="urn:schemas-microsoft-com:vml" xmlns:w10="urn:schemas-microsoft-com:office:word" xmlns:w="http://schemas.openxmlformats.org/wordprocessingml/2006/main" xmlns:w14="http://schemas.microsoft.com/office/word/2010/wordml" xmlns:w15="http://schemas.microsoft.com/office/word/2012/wordml" xmlns:w16cex="http://schemas.microsoft.com/office/word/2018/wordml/cex" xmlns:w16cid="http://schemas.microsoft.com/office/word/2016/wordml/cid" xmlns:w16="http://schemas.microsoft.com/office/word/2018/wordml" xmlns:w16sdtdh="http://schemas.microsoft.com/office/word/2020/wordml/sdtdatahash" xmlns:w16sdtfl="http://schemas.microsoft.com/office/word/2024/wordml/sdtformatlock" xmlns:w16se="http://schemas.microsoft.com/office/word/2015/wordml/symex" xmlns:w16du="http://schemas.microsoft.com/office/word/2023/wordml/word16du" xmlns:wne="http://schemas.microsoft.com/office/word/2006/wordml" mc:Ignorable="w14 w15 w16se w16cid w16 w16cex w16sdtdh w16sdtfl w16du wp14">
   <w:endnote w:type="separator" w:id="-1">
     <w:p>
       <w:r>
@@ -1217,7 +1294,7 @@
 </file>
 
 <file path=word/footer1.xml><?xml version="1.0" encoding="utf-8"?>
-<w:ftr xmlns:wpc="http://schemas.microsoft.com/office/word/2010/wordprocessingCanvas" xmlns:cx="http://schemas.microsoft.com/office/drawing/2014/chartex" xmlns:cx1="http://schemas.microsoft.com/office/drawing/2015/9/8/chartex" xmlns:cx2="http://schemas.microsoft.com/office/drawing/2015/10/21/chartex" xmlns:cx3="http://schemas.microsoft.com/office/drawing/2016/5/9/chartex" xmlns:cx4="http://schemas.microsoft.com/office/drawing/2016/5/10/chartex" xmlns:cx5="http://schemas.microsoft.com/office/drawing/2016/5/11/chartex" xmlns:cx6="http://schemas.microsoft.com/office/drawing/2016/5/12/chartex" xmlns:cx7="http://schemas.microsoft.com/office/drawing/2016/5/13/chartex" xmlns:cx8="http://schemas.microsoft.com/office/drawing/2016/5/14/chartex" xmlns:mc="http://schemas.openxmlformats.org/markup-compatibility/2006" xmlns:m="http://schemas.openxmlformats.org/officeDocument/2006/math" xmlns:aink="http://schemas.microsoft.com/office/drawing/2016/ink" xmlns:am3d="http://schemas.microsoft.com/office/drawing/2017/model3d" xmlns:oel="http://schemas.microsoft.com/office/2019/extlst" xmlns:r="http://schemas.openxmlformats.org/officeDocument/2006/relationships" xmlns:wp14="http://schemas.microsoft.com/office/word/2010/wordprocessingDrawing" xmlns:wp="http://schemas.openxmlformats.org/drawingml/2006/wordprocessingDrawing" xmlns:wpg="http://schemas.microsoft.com/office/word/2010/wordprocessingGroup" xmlns:wpi="http://schemas.microsoft.com/office/word/2010/wordprocessingInk" xmlns:wps="http://schemas.microsoft.com/office/word/2010/wordprocessingShape" xmlns:o="urn:schemas-microsoft-com:office:office" xmlns:v="urn:schemas-microsoft-com:vml" xmlns:w10="urn:schemas-microsoft-com:office:word" xmlns:w="http://schemas.openxmlformats.org/wordprocessingml/2006/main" xmlns:w14="http://schemas.microsoft.com/office/word/2010/wordml" xmlns:w15="http://schemas.microsoft.com/office/word/2012/wordml" xmlns:w16cei="http://schemas.microsoft.com/office/word/2026/wordml/cei" xmlns:w16cex="http://schemas.microsoft.com/office/word/2018/wordml/cex" xmlns:w16cid="http://schemas.microsoft.com/office/word/2016/wordml/cid" xmlns:w16="http://schemas.microsoft.com/office/word/2018/wordml" xmlns:w16sdtdh="http://schemas.microsoft.com/office/word/2020/wordml/sdtdatahash" xmlns:w16sdtfl="http://schemas.microsoft.com/office/word/2024/wordml/sdtformatlock" xmlns:w16se="http://schemas.microsoft.com/office/word/2015/wordml/symex" xmlns:w16du="http://schemas.microsoft.com/office/word/2023/wordml/word16du" xmlns:wne="http://schemas.microsoft.com/office/word/2006/wordml" mc:Ignorable="w14 w15 w16se w16cid w16 w16cex w16sdtdh w16sdtfl w16du wp14">
+<w:ftr xmlns:wpc="http://schemas.microsoft.com/office/word/2010/wordprocessingCanvas" xmlns:cx="http://schemas.microsoft.com/office/drawing/2014/chartex" xmlns:cx1="http://schemas.microsoft.com/office/drawing/2015/9/8/chartex" xmlns:cx2="http://schemas.microsoft.com/office/drawing/2015/10/21/chartex" xmlns:cx3="http://schemas.microsoft.com/office/drawing/2016/5/9/chartex" xmlns:cx4="http://schemas.microsoft.com/office/drawing/2016/5/10/chartex" xmlns:cx5="http://schemas.microsoft.com/office/drawing/2016/5/11/chartex" xmlns:cx6="http://schemas.microsoft.com/office/drawing/2016/5/12/chartex" xmlns:cx7="http://schemas.microsoft.com/office/drawing/2016/5/13/chartex" xmlns:cx8="http://schemas.microsoft.com/office/drawing/2016/5/14/chartex" xmlns:mc="http://schemas.openxmlformats.org/markup-compatibility/2006" xmlns:m="http://schemas.openxmlformats.org/officeDocument/2006/math" xmlns:aink="http://schemas.microsoft.com/office/drawing/2016/ink" xmlns:am3d="http://schemas.microsoft.com/office/drawing/2017/model3d" xmlns:oel="http://schemas.microsoft.com/office/2019/extlst" xmlns:r="http://schemas.openxmlformats.org/officeDocument/2006/relationships" xmlns:wp14="http://schemas.microsoft.com/office/word/2010/wordprocessingDrawing" xmlns:wp="http://schemas.openxmlformats.org/drawingml/2006/wordprocessingDrawing" xmlns:wpg="http://schemas.microsoft.com/office/word/2010/wordprocessingGroup" xmlns:wpi="http://schemas.microsoft.com/office/word/2010/wordprocessingInk" xmlns:wps="http://schemas.microsoft.com/office/word/2010/wordprocessingShape" xmlns:o="urn:schemas-microsoft-com:office:office" xmlns:v="urn:schemas-microsoft-com:vml" xmlns:w10="urn:schemas-microsoft-com:office:word" xmlns:w="http://schemas.openxmlformats.org/wordprocessingml/2006/main" xmlns:w14="http://schemas.microsoft.com/office/word/2010/wordml" xmlns:w15="http://schemas.microsoft.com/office/word/2012/wordml" xmlns:w16cex="http://schemas.microsoft.com/office/word/2018/wordml/cex" xmlns:w16cid="http://schemas.microsoft.com/office/word/2016/wordml/cid" xmlns:w16="http://schemas.microsoft.com/office/word/2018/wordml" xmlns:w16sdtdh="http://schemas.microsoft.com/office/word/2020/wordml/sdtdatahash" xmlns:w16sdtfl="http://schemas.microsoft.com/office/word/2024/wordml/sdtformatlock" xmlns:w16se="http://schemas.microsoft.com/office/word/2015/wordml/symex" xmlns:w16du="http://schemas.microsoft.com/office/word/2023/wordml/word16du" xmlns:wne="http://schemas.microsoft.com/office/word/2006/wordml" mc:Ignorable="w14 w15 w16se w16cid w16 w16cex w16sdtdh w16sdtfl w16du wp14">
   <w:p>
     <w:pPr>
       <w:pStyle w:val="Footer"/>
@@ -1228,7 +1305,7 @@
 </file>
 
 <file path=word/footer2.xml><?xml version="1.0" encoding="utf-8"?>
-<w:ftr xmlns:wpc="http://schemas.microsoft.com/office/word/2010/wordprocessingCanvas" xmlns:cx="http://schemas.microsoft.com/office/drawing/2014/chartex" xmlns:cx1="http://schemas.microsoft.com/office/drawing/2015/9/8/chartex" xmlns:cx2="http://schemas.microsoft.com/office/drawing/2015/10/21/chartex" xmlns:cx3="http://schemas.microsoft.com/office/drawing/2016/5/9/chartex" xmlns:cx4="http://schemas.microsoft.com/office/drawing/2016/5/10/chartex" xmlns:cx5="http://schemas.microsoft.com/office/drawing/2016/5/11/chartex" xmlns:cx6="http://schemas.microsoft.com/office/drawing/2016/5/12/chartex" xmlns:cx7="http://schemas.microsoft.com/office/drawing/2016/5/13/chartex" xmlns:cx8="http://schemas.microsoft.com/office/drawing/2016/5/14/chartex" xmlns:mc="http://schemas.openxmlformats.org/markup-compatibility/2006" xmlns:m="http://schemas.openxmlformats.org/officeDocument/2006/math" xmlns:aink="http://schemas.microsoft.com/office/drawing/2016/ink" xmlns:am3d="http://schemas.microsoft.com/office/drawing/2017/model3d" xmlns:oel="http://schemas.microsoft.com/office/2019/extlst" xmlns:r="http://schemas.openxmlformats.org/officeDocument/2006/relationships" xmlns:wp14="http://schemas.microsoft.com/office/word/2010/wordprocessingDrawing" xmlns:wp="http://schemas.openxmlformats.org/drawingml/2006/wordprocessingDrawing" xmlns:wpg="http://schemas.microsoft.com/office/word/2010/wordprocessingGroup" xmlns:wpi="http://schemas.microsoft.com/office/word/2010/wordprocessingInk" xmlns:wps="http://schemas.microsoft.com/office/word/2010/wordprocessingShape" xmlns:o="urn:schemas-microsoft-com:office:office" xmlns:v="urn:schemas-microsoft-com:vml" xmlns:w10="urn:schemas-microsoft-com:office:word" xmlns:w="http://schemas.openxmlformats.org/wordprocessingml/2006/main" xmlns:w14="http://schemas.microsoft.com/office/word/2010/wordml" xmlns:w15="http://schemas.microsoft.com/office/word/2012/wordml" xmlns:w16cei="http://schemas.microsoft.com/office/word/2026/wordml/cei" xmlns:w16cex="http://schemas.microsoft.com/office/word/2018/wordml/cex" xmlns:w16cid="http://schemas.microsoft.com/office/word/2016/wordml/cid" xmlns:w16="http://schemas.microsoft.com/office/word/2018/wordml" xmlns:w16sdtdh="http://schemas.microsoft.com/office/word/2020/wordml/sdtdatahash" xmlns:w16sdtfl="http://schemas.microsoft.com/office/word/2024/wordml/sdtformatlock" xmlns:w16se="http://schemas.microsoft.com/office/word/2015/wordml/symex" xmlns:w16du="http://schemas.microsoft.com/office/word/2023/wordml/word16du" xmlns:wne="http://schemas.microsoft.com/office/word/2006/wordml" mc:Ignorable="w14 w15 w16se w16cid w16 w16cex w16sdtdh w16sdtfl w16du wp14">
+<w:ftr xmlns:wpc="http://schemas.microsoft.com/office/word/2010/wordprocessingCanvas" xmlns:cx="http://schemas.microsoft.com/office/drawing/2014/chartex" xmlns:cx1="http://schemas.microsoft.com/office/drawing/2015/9/8/chartex" xmlns:cx2="http://schemas.microsoft.com/office/drawing/2015/10/21/chartex" xmlns:cx3="http://schemas.microsoft.com/office/drawing/2016/5/9/chartex" xmlns:cx4="http://schemas.microsoft.com/office/drawing/2016/5/10/chartex" xmlns:cx5="http://schemas.microsoft.com/office/drawing/2016/5/11/chartex" xmlns:cx6="http://schemas.microsoft.com/office/drawing/2016/5/12/chartex" xmlns:cx7="http://schemas.microsoft.com/office/drawing/2016/5/13/chartex" xmlns:cx8="http://schemas.microsoft.com/office/drawing/2016/5/14/chartex" xmlns:mc="http://schemas.openxmlformats.org/markup-compatibility/2006" xmlns:m="http://schemas.openxmlformats.org/officeDocument/2006/math" xmlns:aink="http://schemas.microsoft.com/office/drawing/2016/ink" xmlns:am3d="http://schemas.microsoft.com/office/drawing/2017/model3d" xmlns:oel="http://schemas.microsoft.com/office/2019/extlst" xmlns:r="http://schemas.openxmlformats.org/officeDocument/2006/relationships" xmlns:wp14="http://schemas.microsoft.com/office/word/2010/wordprocessingDrawing" xmlns:wp="http://schemas.openxmlformats.org/drawingml/2006/wordprocessingDrawing" xmlns:wpg="http://schemas.microsoft.com/office/word/2010/wordprocessingGroup" xmlns:wpi="http://schemas.microsoft.com/office/word/2010/wordprocessingInk" xmlns:wps="http://schemas.microsoft.com/office/word/2010/wordprocessingShape" xmlns:o="urn:schemas-microsoft-com:office:office" xmlns:v="urn:schemas-microsoft-com:vml" xmlns:w10="urn:schemas-microsoft-com:office:word" xmlns:w="http://schemas.openxmlformats.org/wordprocessingml/2006/main" xmlns:w14="http://schemas.microsoft.com/office/word/2010/wordml" xmlns:w15="http://schemas.microsoft.com/office/word/2012/wordml" xmlns:w16cex="http://schemas.microsoft.com/office/word/2018/wordml/cex" xmlns:w16cid="http://schemas.microsoft.com/office/word/2016/wordml/cid" xmlns:w16="http://schemas.microsoft.com/office/word/2018/wordml" xmlns:w16sdtdh="http://schemas.microsoft.com/office/word/2020/wordml/sdtdatahash" xmlns:w16sdtfl="http://schemas.microsoft.com/office/word/2024/wordml/sdtformatlock" xmlns:w16se="http://schemas.microsoft.com/office/word/2015/wordml/symex" xmlns:w16du="http://schemas.microsoft.com/office/word/2023/wordml/word16du" xmlns:wne="http://schemas.microsoft.com/office/word/2006/wordml" mc:Ignorable="w14 w15 w16se w16cid w16 w16cex w16sdtdh w16sdtfl w16du wp14">
   <w:p>
     <w:pPr>
       <w:tabs>
@@ -1247,7 +1324,7 @@
 </file>
 
 <file path=word/footnotes.xml><?xml version="1.0" encoding="utf-8"?>
-<w:footnotes xmlns:wpc="http://schemas.microsoft.com/office/word/2010/wordprocessingCanvas" xmlns:cx="http://schemas.microsoft.com/office/drawing/2014/chartex" xmlns:cx1="http://schemas.microsoft.com/office/drawing/2015/9/8/chartex" xmlns:cx2="http://schemas.microsoft.com/office/drawing/2015/10/21/chartex" xmlns:cx3="http://schemas.microsoft.com/office/drawing/2016/5/9/chartex" xmlns:cx4="http://schemas.microsoft.com/office/drawing/2016/5/10/chartex" xmlns:cx5="http://schemas.microsoft.com/office/drawing/2016/5/11/chartex" xmlns:cx6="http://schemas.microsoft.com/office/drawing/2016/5/12/chartex" xmlns:cx7="http://schemas.microsoft.com/office/drawing/2016/5/13/chartex" xmlns:cx8="http://schemas.microsoft.com/office/drawing/2016/5/14/chartex" xmlns:mc="http://schemas.openxmlformats.org/markup-compatibility/2006" xmlns:m="http://schemas.openxmlformats.org/officeDocument/2006/math" xmlns:aink="http://schemas.microsoft.com/office/drawing/2016/ink" xmlns:am3d="http://schemas.microsoft.com/office/drawing/2017/model3d" xmlns:oel="http://schemas.microsoft.com/office/2019/extlst" xmlns:r="http://schemas.openxmlformats.org/officeDocument/2006/relationships" xmlns:wp14="http://schemas.microsoft.com/office/word/2010/wordprocessingDrawing" xmlns:wp="http://schemas.openxmlformats.org/drawingml/2006/wordprocessingDrawing" xmlns:wpg="http://schemas.microsoft.com/office/word/2010/wordprocessingGroup" xmlns:wpi="http://schemas.microsoft.com/office/word/2010/wordprocessingInk" xmlns:wps="http://schemas.microsoft.com/office/word/2010/wordprocessingShape" xmlns:o="urn:schemas-microsoft-com:office:office" xmlns:v="urn:schemas-microsoft-com:vml" xmlns:w10="urn:schemas-microsoft-com:office:word" xmlns:w="http://schemas.openxmlformats.org/wordprocessingml/2006/main" xmlns:w14="http://schemas.microsoft.com/office/word/2010/wordml" xmlns:w15="http://schemas.microsoft.com/office/word/2012/wordml" xmlns:w16cei="http://schemas.microsoft.com/office/word/2026/wordml/cei" xmlns:w16cex="http://schemas.microsoft.com/office/word/2018/wordml/cex" xmlns:w16cid="http://schemas.microsoft.com/office/word/2016/wordml/cid" xmlns:w16="http://schemas.microsoft.com/office/word/2018/wordml" xmlns:w16sdtdh="http://schemas.microsoft.com/office/word/2020/wordml/sdtdatahash" xmlns:w16sdtfl="http://schemas.microsoft.com/office/word/2024/wordml/sdtformatlock" xmlns:w16se="http://schemas.microsoft.com/office/word/2015/wordml/symex" xmlns:w16du="http://schemas.microsoft.com/office/word/2023/wordml/word16du" xmlns:wne="http://schemas.microsoft.com/office/word/2006/wordml" mc:Ignorable="w14 w15 w16se w16cid w16 w16cex w16sdtdh w16sdtfl w16du wp14">
+<w:footnotes xmlns:wpc="http://schemas.microsoft.com/office/word/2010/wordprocessingCanvas" xmlns:cx="http://schemas.microsoft.com/office/drawing/2014/chartex" xmlns:cx1="http://schemas.microsoft.com/office/drawing/2015/9/8/chartex" xmlns:cx2="http://schemas.microsoft.com/office/drawing/2015/10/21/chartex" xmlns:cx3="http://schemas.microsoft.com/office/drawing/2016/5/9/chartex" xmlns:cx4="http://schemas.microsoft.com/office/drawing/2016/5/10/chartex" xmlns:cx5="http://schemas.microsoft.com/office/drawing/2016/5/11/chartex" xmlns:cx6="http://schemas.microsoft.com/office/drawing/2016/5/12/chartex" xmlns:cx7="http://schemas.microsoft.com/office/drawing/2016/5/13/chartex" xmlns:cx8="http://schemas.microsoft.com/office/drawing/2016/5/14/chartex" xmlns:mc="http://schemas.openxmlformats.org/markup-compatibility/2006" xmlns:m="http://schemas.openxmlformats.org/officeDocument/2006/math" xmlns:aink="http://schemas.microsoft.com/office/drawing/2016/ink" xmlns:am3d="http://schemas.microsoft.com/office/drawing/2017/model3d" xmlns:oel="http://schemas.microsoft.com/office/2019/extlst" xmlns:r="http://schemas.openxmlformats.org/officeDocument/2006/relationships" xmlns:wp14="http://schemas.microsoft.com/office/word/2010/wordprocessingDrawing" xmlns:wp="http://schemas.openxmlformats.org/drawingml/2006/wordprocessingDrawing" xmlns:wpg="http://schemas.microsoft.com/office/word/2010/wordprocessingGroup" xmlns:wpi="http://schemas.microsoft.com/office/word/2010/wordprocessingInk" xmlns:wps="http://schemas.microsoft.com/office/word/2010/wordprocessingShape" xmlns:o="urn:schemas-microsoft-com:office:office" xmlns:v="urn:schemas-microsoft-com:vml" xmlns:w10="urn:schemas-microsoft-com:office:word" xmlns:w="http://schemas.openxmlformats.org/wordprocessingml/2006/main" xmlns:w14="http://schemas.microsoft.com/office/word/2010/wordml" xmlns:w15="http://schemas.microsoft.com/office/word/2012/wordml" xmlns:w16cex="http://schemas.microsoft.com/office/word/2018/wordml/cex" xmlns:w16cid="http://schemas.microsoft.com/office/word/2016/wordml/cid" xmlns:w16="http://schemas.microsoft.com/office/word/2018/wordml" xmlns:w16sdtdh="http://schemas.microsoft.com/office/word/2020/wordml/sdtdatahash" xmlns:w16sdtfl="http://schemas.microsoft.com/office/word/2024/wordml/sdtformatlock" xmlns:w16se="http://schemas.microsoft.com/office/word/2015/wordml/symex" xmlns:w16du="http://schemas.microsoft.com/office/word/2023/wordml/word16du" xmlns:wne="http://schemas.microsoft.com/office/word/2006/wordml" mc:Ignorable="w14 w15 w16se w16cid w16 w16cex w16sdtdh w16sdtfl w16du wp14">
   <w:footnote w:type="separator" w:id="-1">
     <w:p>
       <w:r>
@@ -1266,7 +1343,7 @@
 </file>
 
 <file path=word/header1.xml><?xml version="1.0" encoding="utf-8"?>
-<w:hdr xmlns:wpc="http://schemas.microsoft.com/office/word/2010/wordprocessingCanvas" xmlns:cx="http://schemas.microsoft.com/office/drawing/2014/chartex" xmlns:cx1="http://schemas.microsoft.com/office/drawing/2015/9/8/chartex" xmlns:cx2="http://schemas.microsoft.com/office/drawing/2015/10/21/chartex" xmlns:cx3="http://schemas.microsoft.com/office/drawing/2016/5/9/chartex" xmlns:cx4="http://schemas.microsoft.com/office/drawing/2016/5/10/chartex" xmlns:cx5="http://schemas.microsoft.com/office/drawing/2016/5/11/chartex" xmlns:cx6="http://schemas.microsoft.com/office/drawing/2016/5/12/chartex" xmlns:cx7="http://schemas.microsoft.com/office/drawing/2016/5/13/chartex" xmlns:cx8="http://schemas.microsoft.com/office/drawing/2016/5/14/chartex" xmlns:mc="http://schemas.openxmlformats.org/markup-compatibility/2006" xmlns:m="http://schemas.openxmlformats.org/officeDocument/2006/math" xmlns:aink="http://schemas.microsoft.com/office/drawing/2016/ink" xmlns:am3d="http://schemas.microsoft.com/office/drawing/2017/model3d" xmlns:oel="http://schemas.microsoft.com/office/2019/extlst" xmlns:r="http://schemas.openxmlformats.org/officeDocument/2006/relationships" xmlns:wp14="http://schemas.microsoft.com/office/word/2010/wordprocessingDrawing" xmlns:wp="http://schemas.openxmlformats.org/drawingml/2006/wordprocessingDrawing" xmlns:wpg="http://schemas.microsoft.com/office/word/2010/wordprocessingGroup" xmlns:wpi="http://schemas.microsoft.com/office/word/2010/wordprocessingInk" xmlns:wps="http://schemas.microsoft.com/office/word/2010/wordprocessingShape" xmlns:o="urn:schemas-microsoft-com:office:office" xmlns:v="urn:schemas-microsoft-com:vml" xmlns:w10="urn:schemas-microsoft-com:office:word" xmlns:w="http://schemas.openxmlformats.org/wordprocessingml/2006/main" xmlns:w14="http://schemas.microsoft.com/office/word/2010/wordml" xmlns:w15="http://schemas.microsoft.com/office/word/2012/wordml" xmlns:w16cei="http://schemas.microsoft.com/office/word/2026/wordml/cei" xmlns:w16cex="http://schemas.microsoft.com/office/word/2018/wordml/cex" xmlns:w16cid="http://schemas.microsoft.com/office/word/2016/wordml/cid" xmlns:w16="http://schemas.microsoft.com/office/word/2018/wordml" xmlns:w16sdtdh="http://schemas.microsoft.com/office/word/2020/wordml/sdtdatahash" xmlns:w16sdtfl="http://schemas.microsoft.com/office/word/2024/wordml/sdtformatlock" xmlns:w16se="http://schemas.microsoft.com/office/word/2015/wordml/symex" xmlns:w16du="http://schemas.microsoft.com/office/word/2023/wordml/word16du" xmlns:wne="http://schemas.microsoft.com/office/word/2006/wordml" mc:Ignorable="w14 w15 w16se w16cid w16 w16cex w16sdtdh w16sdtfl w16du wp14">
+<w:hdr xmlns:wpc="http://schemas.microsoft.com/office/word/2010/wordprocessingCanvas" xmlns:cx="http://schemas.microsoft.com/office/drawing/2014/chartex" xmlns:cx1="http://schemas.microsoft.com/office/drawing/2015/9/8/chartex" xmlns:cx2="http://schemas.microsoft.com/office/drawing/2015/10/21/chartex" xmlns:cx3="http://schemas.microsoft.com/office/drawing/2016/5/9/chartex" xmlns:cx4="http://schemas.microsoft.com/office/drawing/2016/5/10/chartex" xmlns:cx5="http://schemas.microsoft.com/office/drawing/2016/5/11/chartex" xmlns:cx6="http://schemas.microsoft.com/office/drawing/2016/5/12/chartex" xmlns:cx7="http://schemas.microsoft.com/office/drawing/2016/5/13/chartex" xmlns:cx8="http://schemas.microsoft.com/office/drawing/2016/5/14/chartex" xmlns:mc="http://schemas.openxmlformats.org/markup-compatibility/2006" xmlns:m="http://schemas.openxmlformats.org/officeDocument/2006/math" xmlns:aink="http://schemas.microsoft.com/office/drawing/2016/ink" xmlns:am3d="http://schemas.microsoft.com/office/drawing/2017/model3d" xmlns:oel="http://schemas.microsoft.com/office/2019/extlst" xmlns:r="http://schemas.openxmlformats.org/officeDocument/2006/relationships" xmlns:wp14="http://schemas.microsoft.com/office/word/2010/wordprocessingDrawing" xmlns:wp="http://schemas.openxmlformats.org/drawingml/2006/wordprocessingDrawing" xmlns:wpg="http://schemas.microsoft.com/office/word/2010/wordprocessingGroup" xmlns:wpi="http://schemas.microsoft.com/office/word/2010/wordprocessingInk" xmlns:wps="http://schemas.microsoft.com/office/word/2010/wordprocessingShape" xmlns:o="urn:schemas-microsoft-com:office:office" xmlns:v="urn:schemas-microsoft-com:vml" xmlns:w10="urn:schemas-microsoft-com:office:word" xmlns:w="http://schemas.openxmlformats.org/wordprocessingml/2006/main" xmlns:w14="http://schemas.microsoft.com/office/word/2010/wordml" xmlns:w15="http://schemas.microsoft.com/office/word/2012/wordml" xmlns:w16cex="http://schemas.microsoft.com/office/word/2018/wordml/cex" xmlns:w16cid="http://schemas.microsoft.com/office/word/2016/wordml/cid" xmlns:w16="http://schemas.microsoft.com/office/word/2018/wordml" xmlns:w16sdtdh="http://schemas.microsoft.com/office/word/2020/wordml/sdtdatahash" xmlns:w16sdtfl="http://schemas.microsoft.com/office/word/2024/wordml/sdtformatlock" xmlns:w16se="http://schemas.microsoft.com/office/word/2015/wordml/symex" xmlns:w16du="http://schemas.microsoft.com/office/word/2023/wordml/word16du" xmlns:wne="http://schemas.microsoft.com/office/word/2006/wordml" mc:Ignorable="w14 w15 w16se w16cid w16 w16cex w16sdtdh w16sdtfl w16du wp14">
   <w:p>
     <w:pPr>
       <w:pStyle w:val="Header"/>
@@ -1296,7 +1373,7 @@
 </file>
 
 <file path=word/header2.xml><?xml version="1.0" encoding="utf-8"?>
-<w:hdr xmlns:wpc="http://schemas.microsoft.com/office/word/2010/wordprocessingCanvas" xmlns:cx="http://schemas.microsoft.com/office/drawing/2014/chartex" xmlns:cx1="http://schemas.microsoft.com/office/drawing/2015/9/8/chartex" xmlns:cx2="http://schemas.microsoft.com/office/drawing/2015/10/21/chartex" xmlns:cx3="http://schemas.microsoft.com/office/drawing/2016/5/9/chartex" xmlns:cx4="http://schemas.microsoft.com/office/drawing/2016/5/10/chartex" xmlns:cx5="http://schemas.microsoft.com/office/drawing/2016/5/11/chartex" xmlns:cx6="http://schemas.microsoft.com/office/drawing/2016/5/12/chartex" xmlns:cx7="http://schemas.microsoft.com/office/drawing/2016/5/13/chartex" xmlns:cx8="http://schemas.microsoft.com/office/drawing/2016/5/14/chartex" xmlns:mc="http://schemas.openxmlformats.org/markup-compatibility/2006" xmlns:m="http://schemas.openxmlformats.org/officeDocument/2006/math" xmlns:aink="http://schemas.microsoft.com/office/drawing/2016/ink" xmlns:am3d="http://schemas.microsoft.com/office/drawing/2017/model3d" xmlns:oel="http://schemas.microsoft.com/office/2019/extlst" xmlns:r="http://schemas.openxmlformats.org/officeDocument/2006/relationships" xmlns:wp14="http://schemas.microsoft.com/office/word/2010/wordprocessingDrawing" xmlns:wp="http://schemas.openxmlformats.org/drawingml/2006/wordprocessingDrawing" xmlns:wpg="http://schemas.microsoft.com/office/word/2010/wordprocessingGroup" xmlns:wpi="http://schemas.microsoft.com/office/word/2010/wordprocessingInk" xmlns:wps="http://schemas.microsoft.com/office/word/2010/wordprocessingShape" xmlns:o="urn:schemas-microsoft-com:office:office" xmlns:v="urn:schemas-microsoft-com:vml" xmlns:w10="urn:schemas-microsoft-com:office:word" xmlns:w="http://schemas.openxmlformats.org/wordprocessingml/2006/main" xmlns:w14="http://schemas.microsoft.com/office/word/2010/wordml" xmlns:w15="http://schemas.microsoft.com/office/word/2012/wordml" xmlns:w16cei="http://schemas.microsoft.com/office/word/2026/wordml/cei" xmlns:w16cex="http://schemas.microsoft.com/office/word/2018/wordml/cex" xmlns:w16cid="http://schemas.microsoft.com/office/word/2016/wordml/cid" xmlns:w16="http://schemas.microsoft.com/office/word/2018/wordml" xmlns:w16sdtdh="http://schemas.microsoft.com/office/word/2020/wordml/sdtdatahash" xmlns:w16sdtfl="http://schemas.microsoft.com/office/word/2024/wordml/sdtformatlock" xmlns:w16se="http://schemas.microsoft.com/office/word/2015/wordml/symex" xmlns:w16du="http://schemas.microsoft.com/office/word/2023/wordml/word16du" xmlns:wne="http://schemas.microsoft.com/office/word/2006/wordml" mc:Ignorable="w14 w15 w16se w16cid w16 w16cex w16sdtdh w16sdtfl w16du wp14">
+<w:hdr xmlns:wpc="http://schemas.microsoft.com/office/word/2010/wordprocessingCanvas" xmlns:cx="http://schemas.microsoft.com/office/drawing/2014/chartex" xmlns:cx1="http://schemas.microsoft.com/office/drawing/2015/9/8/chartex" xmlns:cx2="http://schemas.microsoft.com/office/drawing/2015/10/21/chartex" xmlns:cx3="http://schemas.microsoft.com/office/drawing/2016/5/9/chartex" xmlns:cx4="http://schemas.microsoft.com/office/drawing/2016/5/10/chartex" xmlns:cx5="http://schemas.microsoft.com/office/drawing/2016/5/11/chartex" xmlns:cx6="http://schemas.microsoft.com/office/drawing/2016/5/12/chartex" xmlns:cx7="http://schemas.microsoft.com/office/drawing/2016/5/13/chartex" xmlns:cx8="http://schemas.microsoft.com/office/drawing/2016/5/14/chartex" xmlns:mc="http://schemas.openxmlformats.org/markup-compatibility/2006" xmlns:m="http://schemas.openxmlformats.org/officeDocument/2006/math" xmlns:aink="http://schemas.microsoft.com/office/drawing/2016/ink" xmlns:am3d="http://schemas.microsoft.com/office/drawing/2017/model3d" xmlns:oel="http://schemas.microsoft.com/office/2019/extlst" xmlns:r="http://schemas.openxmlformats.org/officeDocument/2006/relationships" xmlns:wp14="http://schemas.microsoft.com/office/word/2010/wordprocessingDrawing" xmlns:wp="http://schemas.openxmlformats.org/drawingml/2006/wordprocessingDrawing" xmlns:wpg="http://schemas.microsoft.com/office/word/2010/wordprocessingGroup" xmlns:wpi="http://schemas.microsoft.com/office/word/2010/wordprocessingInk" xmlns:wps="http://schemas.microsoft.com/office/word/2010/wordprocessingShape" xmlns:o="urn:schemas-microsoft-com:office:office" xmlns:v="urn:schemas-microsoft-com:vml" xmlns:w10="urn:schemas-microsoft-com:office:word" xmlns:w="http://schemas.openxmlformats.org/wordprocessingml/2006/main" xmlns:w14="http://schemas.microsoft.com/office/word/2010/wordml" xmlns:w15="http://schemas.microsoft.com/office/word/2012/wordml" xmlns:w16cex="http://schemas.microsoft.com/office/word/2018/wordml/cex" xmlns:w16cid="http://schemas.microsoft.com/office/word/2016/wordml/cid" xmlns:w16="http://schemas.microsoft.com/office/word/2018/wordml" xmlns:w16sdtdh="http://schemas.microsoft.com/office/word/2020/wordml/sdtdatahash" xmlns:w16sdtfl="http://schemas.microsoft.com/office/word/2024/wordml/sdtformatlock" xmlns:w16se="http://schemas.microsoft.com/office/word/2015/wordml/symex" xmlns:w16du="http://schemas.microsoft.com/office/word/2023/wordml/word16du" xmlns:wne="http://schemas.microsoft.com/office/word/2006/wordml" mc:Ignorable="w14 w15 w16se w16cid w16 w16cex w16sdtdh w16sdtfl w16du wp14">
   <w:p>
     <w:pPr>
       <w:pStyle w:val="Header"/>
@@ -1437,7 +1514,7 @@
             </wp:anchor>
           </w:drawing>
         </mc:Choice>
-        <mc:Fallback>
+        <mc:Fallback xmlns:w16cei="http://schemas.microsoft.com/office/word/2026/wordml/cei">
           <w:pict>
             <v:shapetype w14:anchorId="6DE74C12" id="_x0000_t202" coordsize="21600,21600" o:spt="202" path="m,l,21600r21600,l21600,xe">
               <v:stroke joinstyle="miter"/>
@@ -1644,7 +1721,7 @@
 </file>
 
 <file path=word/numbering.xml><?xml version="1.0" encoding="utf-8"?>
-<w:numbering xmlns:wpc="http://schemas.microsoft.com/office/word/2010/wordprocessingCanvas" xmlns:cx="http://schemas.microsoft.com/office/drawing/2014/chartex" xmlns:cx1="http://schemas.microsoft.com/office/drawing/2015/9/8/chartex" xmlns:cx2="http://schemas.microsoft.com/office/drawing/2015/10/21/chartex" xmlns:cx3="http://schemas.microsoft.com/office/drawing/2016/5/9/chartex" xmlns:cx4="http://schemas.microsoft.com/office/drawing/2016/5/10/chartex" xmlns:cx5="http://schemas.microsoft.com/office/drawing/2016/5/11/chartex" xmlns:cx6="http://schemas.microsoft.com/office/drawing/2016/5/12/chartex" xmlns:cx7="http://schemas.microsoft.com/office/drawing/2016/5/13/chartex" xmlns:cx8="http://schemas.microsoft.com/office/drawing/2016/5/14/chartex" xmlns:mc="http://schemas.openxmlformats.org/markup-compatibility/2006" xmlns:m="http://schemas.openxmlformats.org/officeDocument/2006/math" xmlns:aink="http://schemas.microsoft.com/office/drawing/2016/ink" xmlns:am3d="http://schemas.microsoft.com/office/drawing/2017/model3d" xmlns:oel="http://schemas.microsoft.com/office/2019/extlst" xmlns:r="http://schemas.openxmlformats.org/officeDocument/2006/relationships" xmlns:wp14="http://schemas.microsoft.com/office/word/2010/wordprocessingDrawing" xmlns:wp="http://schemas.openxmlformats.org/drawingml/2006/wordprocessingDrawing" xmlns:wpg="http://schemas.microsoft.com/office/word/2010/wordprocessingGroup" xmlns:wpi="http://schemas.microsoft.com/office/word/2010/wordprocessingInk" xmlns:wps="http://schemas.microsoft.com/office/word/2010/wordprocessingShape" xmlns:o="urn:schemas-microsoft-com:office:office" xmlns:v="urn:schemas-microsoft-com:vml" xmlns:w10="urn:schemas-microsoft-com:office:word" xmlns:w="http://schemas.openxmlformats.org/wordprocessingml/2006/main" xmlns:w14="http://schemas.microsoft.com/office/word/2010/wordml" xmlns:w15="http://schemas.microsoft.com/office/word/2012/wordml" xmlns:w16cei="http://schemas.microsoft.com/office/word/2026/wordml/cei" xmlns:w16cex="http://schemas.microsoft.com/office/word/2018/wordml/cex" xmlns:w16cid="http://schemas.microsoft.com/office/word/2016/wordml/cid" xmlns:w16="http://schemas.microsoft.com/office/word/2018/wordml" xmlns:w16sdtdh="http://schemas.microsoft.com/office/word/2020/wordml/sdtdatahash" xmlns:w16sdtfl="http://schemas.microsoft.com/office/word/2024/wordml/sdtformatlock" xmlns:w16se="http://schemas.microsoft.com/office/word/2015/wordml/symex" xmlns:w16du="http://schemas.microsoft.com/office/word/2023/wordml/word16du" xmlns:wne="http://schemas.microsoft.com/office/word/2006/wordml" mc:Ignorable="w14 w15 w16se w16cid w16 w16cex w16sdtdh w16sdtfl w16du wp14">
+<w:numbering xmlns:wpc="http://schemas.microsoft.com/office/word/2010/wordprocessingCanvas" xmlns:cx="http://schemas.microsoft.com/office/drawing/2014/chartex" xmlns:cx1="http://schemas.microsoft.com/office/drawing/2015/9/8/chartex" xmlns:cx2="http://schemas.microsoft.com/office/drawing/2015/10/21/chartex" xmlns:cx3="http://schemas.microsoft.com/office/drawing/2016/5/9/chartex" xmlns:cx4="http://schemas.microsoft.com/office/drawing/2016/5/10/chartex" xmlns:cx5="http://schemas.microsoft.com/office/drawing/2016/5/11/chartex" xmlns:cx6="http://schemas.microsoft.com/office/drawing/2016/5/12/chartex" xmlns:cx7="http://schemas.microsoft.com/office/drawing/2016/5/13/chartex" xmlns:cx8="http://schemas.microsoft.com/office/drawing/2016/5/14/chartex" xmlns:mc="http://schemas.openxmlformats.org/markup-compatibility/2006" xmlns:m="http://schemas.openxmlformats.org/officeDocument/2006/math" xmlns:aink="http://schemas.microsoft.com/office/drawing/2016/ink" xmlns:am3d="http://schemas.microsoft.com/office/drawing/2017/model3d" xmlns:oel="http://schemas.microsoft.com/office/2019/extlst" xmlns:r="http://schemas.openxmlformats.org/officeDocument/2006/relationships" xmlns:wp14="http://schemas.microsoft.com/office/word/2010/wordprocessingDrawing" xmlns:wp="http://schemas.openxmlformats.org/drawingml/2006/wordprocessingDrawing" xmlns:wpg="http://schemas.microsoft.com/office/word/2010/wordprocessingGroup" xmlns:wpi="http://schemas.microsoft.com/office/word/2010/wordprocessingInk" xmlns:wps="http://schemas.microsoft.com/office/word/2010/wordprocessingShape" xmlns:o="urn:schemas-microsoft-com:office:office" xmlns:v="urn:schemas-microsoft-com:vml" xmlns:w10="urn:schemas-microsoft-com:office:word" xmlns:w="http://schemas.openxmlformats.org/wordprocessingml/2006/main" xmlns:w14="http://schemas.microsoft.com/office/word/2010/wordml" xmlns:w15="http://schemas.microsoft.com/office/word/2012/wordml" xmlns:w16cex="http://schemas.microsoft.com/office/word/2018/wordml/cex" xmlns:w16cid="http://schemas.microsoft.com/office/word/2016/wordml/cid" xmlns:w16="http://schemas.microsoft.com/office/word/2018/wordml" xmlns:w16sdtdh="http://schemas.microsoft.com/office/word/2020/wordml/sdtdatahash" xmlns:w16sdtfl="http://schemas.microsoft.com/office/word/2024/wordml/sdtformatlock" xmlns:w16se="http://schemas.microsoft.com/office/word/2015/wordml/symex" xmlns:w16du="http://schemas.microsoft.com/office/word/2023/wordml/word16du" xmlns:wne="http://schemas.microsoft.com/office/word/2006/wordml" mc:Ignorable="w14 w15 w16se w16cid w16 w16cex w16sdtdh w16sdtfl w16du wp14">
   <w:abstractNum w:abstractNumId="0" w15:restartNumberingAfterBreak="0">
     <w:nsid w:val="061B5C9E"/>
     <w:multiLevelType w:val="hybridMultilevel"/>
@@ -3665,6 +3742,10 @@
 </file>
 
 <file path=customXml/item1.xml><?xml version="1.0" encoding="utf-8"?>
+<b:Sources xmlns:b="http://schemas.openxmlformats.org/officeDocument/2006/bibliography" xmlns="http://schemas.openxmlformats.org/officeDocument/2006/bibliography" SelectedStyle="\APA.XSL" StyleName="APA"/>
+</file>
+
+<file path=customXml/item2.xml><?xml version="1.0" encoding="utf-8"?>
 <p:properties xmlns:p="http://schemas.microsoft.com/office/2006/metadata/properties" xmlns:xsi="http://www.w3.org/2001/XMLSchema-instance" xmlns:pc="http://schemas.microsoft.com/office/infopath/2007/PartnerControls">
   <documentManagement>
     <TaxCatchAll xmlns="38d2a309-d798-495b-b1a3-e97c37808eef"/>
@@ -3677,11 +3758,16 @@
 </p:properties>
 </file>
 
-<file path=customXml/item2.xml><?xml version="1.0" encoding="utf-8"?>
-<b:Sources xmlns:b="http://schemas.openxmlformats.org/officeDocument/2006/bibliography" xmlns="http://schemas.openxmlformats.org/officeDocument/2006/bibliography" SelectedStyle="\APA.XSL" StyleName="APA"/>
+<file path=customXml/item3.xml><?xml version="1.0" encoding="utf-8"?>
+<?mso-contentType ?>
+<FormTemplates xmlns="http://schemas.microsoft.com/sharepoint/v3/contenttype/forms">
+  <Display>DocumentLibraryForm</Display>
+  <Edit>DocumentLibraryForm</Edit>
+  <New>DocumentLibraryForm</New>
+</FormTemplates>
 </file>
 
-<file path=customXml/item3.xml><?xml version="1.0" encoding="utf-8"?>
+<file path=customXml/item4.xml><?xml version="1.0" encoding="utf-8"?>
 <ct:contentTypeSchema xmlns:ct="http://schemas.microsoft.com/office/2006/metadata/contentType" xmlns:ma="http://schemas.microsoft.com/office/2006/metadata/properties/metaAttributes" ct:_="" ma:_="" ma:contentTypeName="Document" ma:contentTypeID="0x010100E48B1925F2EFB241960044EC5F64C034" ma:contentTypeVersion="16" ma:contentTypeDescription="Create a new document." ma:contentTypeScope="" ma:versionID="b193f1a1adb628ee5f7d642c4cb4fead">
   <xsd:schema xmlns:xsd="http://www.w3.org/2001/XMLSchema" xmlns:xs="http://www.w3.org/2001/XMLSchema" xmlns:p="http://schemas.microsoft.com/office/2006/metadata/properties" xmlns:ns1="http://schemas.microsoft.com/sharepoint/v3" xmlns:ns2="416eecfc-56a7-4354-8013-4a2d9c92e153" xmlns:ns3="38d2a309-d798-495b-b1a3-e97c37808eef" targetNamespace="http://schemas.microsoft.com/office/2006/metadata/properties" ma:root="true" ma:fieldsID="f4c72206c132b1461c2865266b50231c" ns1:_="" ns2:_="" ns3:_="">
     <xsd:import namespace="http://schemas.microsoft.com/sharepoint/v3"/>
@@ -3927,16 +4013,15 @@
 </ct:contentTypeSchema>
 </file>
 
-<file path=customXml/item4.xml><?xml version="1.0" encoding="utf-8"?>
-<?mso-contentType ?>
-<FormTemplates xmlns="http://schemas.microsoft.com/sharepoint/v3/contenttype/forms">
-  <Display>DocumentLibraryForm</Display>
-  <Edit>DocumentLibraryForm</Edit>
-  <New>DocumentLibraryForm</New>
-</FormTemplates>
+<file path=customXml/itemProps1.xml><?xml version="1.0" encoding="utf-8"?>
+<ds:datastoreItem xmlns:ds="http://schemas.openxmlformats.org/officeDocument/2006/customXml" ds:itemID="{4202E056-596C-4D43-866F-DBCC294656E0}">
+  <ds:schemaRefs>
+    <ds:schemaRef ds:uri="http://schemas.openxmlformats.org/officeDocument/2006/bibliography"/>
+  </ds:schemaRefs>
+</ds:datastoreItem>
 </file>
 
-<file path=customXml/itemProps1.xml><?xml version="1.0" encoding="utf-8"?>
+<file path=customXml/itemProps2.xml><?xml version="1.0" encoding="utf-8"?>
 <ds:datastoreItem xmlns:ds="http://schemas.openxmlformats.org/officeDocument/2006/customXml" ds:itemID="{5D491C04-0035-45EA-BE2E-2976A5F7A397}">
   <ds:schemaRefs>
     <ds:schemaRef ds:uri="http://schemas.microsoft.com/office/2006/metadata/properties"/>
@@ -3948,15 +4033,15 @@
 </ds:datastoreItem>
 </file>
 
-<file path=customXml/itemProps2.xml><?xml version="1.0" encoding="utf-8"?>
-<ds:datastoreItem xmlns:ds="http://schemas.openxmlformats.org/officeDocument/2006/customXml" ds:itemID="{4202E056-596C-4D43-866F-DBCC294656E0}">
+<file path=customXml/itemProps3.xml><?xml version="1.0" encoding="utf-8"?>
+<ds:datastoreItem xmlns:ds="http://schemas.openxmlformats.org/officeDocument/2006/customXml" ds:itemID="{2ACA00A0-0EB9-4F25-B1A0-9480A1DEA0B5}">
   <ds:schemaRefs>
-    <ds:schemaRef ds:uri="http://schemas.openxmlformats.org/officeDocument/2006/bibliography"/>
+    <ds:schemaRef ds:uri="http://schemas.microsoft.com/sharepoint/v3/contenttype/forms"/>
   </ds:schemaRefs>
 </ds:datastoreItem>
 </file>
 
-<file path=customXml/itemProps3.xml><?xml version="1.0" encoding="utf-8"?>
+<file path=customXml/itemProps4.xml><?xml version="1.0" encoding="utf-8"?>
 <ds:datastoreItem xmlns:ds="http://schemas.openxmlformats.org/officeDocument/2006/customXml" ds:itemID="{3AA634C4-AFF1-45A4-BEEC-3BC128C36838}">
   <ds:schemaRefs>
     <ds:schemaRef ds:uri="http://schemas.microsoft.com/office/2006/metadata/contentType"/>
@@ -3976,14 +4061,6 @@
 </ds:datastoreItem>
 </file>
 
-<file path=customXml/itemProps4.xml><?xml version="1.0" encoding="utf-8"?>
-<ds:datastoreItem xmlns:ds="http://schemas.openxmlformats.org/officeDocument/2006/customXml" ds:itemID="{2ACA00A0-0EB9-4F25-B1A0-9480A1DEA0B5}">
-  <ds:schemaRefs>
-    <ds:schemaRef ds:uri="http://schemas.microsoft.com/sharepoint/v3/contenttype/forms"/>
-  </ds:schemaRefs>
-</ds:datastoreItem>
-</file>
-
 <file path=docMetadata/LabelInfo.xml><?xml version="1.0" encoding="utf-8"?>
 <clbl:labelList xmlns:clbl="http://schemas.microsoft.com/office/2020/mipLabelMetadata">
   <clbl:label id="{3de9faa6-9fe1-49b3-9a08-227a296b54a6}" enabled="1" method="Privileged" siteId="{66d73691-ea97-48b1-95d5-e94f0a46b878}" contentBits="0" removed="0"/>

</xml_diff>

<commit_message>
Fixed internal links to only display once per section on the report.
</commit_message>
<xml_diff>
--- a/app/assets/default_template.docx
+++ b/app/assets/default_template.docx
@@ -1,6 +1,6 @@
 
 <file path=word/document.xml><?xml version="1.0" encoding="utf-8"?>
-<w:document xmlns:wpc="http://schemas.microsoft.com/office/word/2010/wordprocessingCanvas" xmlns:cx="http://schemas.microsoft.com/office/drawing/2014/chartex" xmlns:cx1="http://schemas.microsoft.com/office/drawing/2015/9/8/chartex" xmlns:cx2="http://schemas.microsoft.com/office/drawing/2015/10/21/chartex" xmlns:cx3="http://schemas.microsoft.com/office/drawing/2016/5/9/chartex" xmlns:cx4="http://schemas.microsoft.com/office/drawing/2016/5/10/chartex" xmlns:cx5="http://schemas.microsoft.com/office/drawing/2016/5/11/chartex" xmlns:cx6="http://schemas.microsoft.com/office/drawing/2016/5/12/chartex" xmlns:cx7="http://schemas.microsoft.com/office/drawing/2016/5/13/chartex" xmlns:cx8="http://schemas.microsoft.com/office/drawing/2016/5/14/chartex" xmlns:mc="http://schemas.openxmlformats.org/markup-compatibility/2006" xmlns:m="http://schemas.openxmlformats.org/officeDocument/2006/math" xmlns:aink="http://schemas.microsoft.com/office/drawing/2016/ink" xmlns:am3d="http://schemas.microsoft.com/office/drawing/2017/model3d" xmlns:oel="http://schemas.microsoft.com/office/2019/extlst" xmlns:r="http://schemas.openxmlformats.org/officeDocument/2006/relationships" xmlns:wp14="http://schemas.microsoft.com/office/word/2010/wordprocessingDrawing" xmlns:wp="http://schemas.openxmlformats.org/drawingml/2006/wordprocessingDrawing" xmlns:wpg="http://schemas.microsoft.com/office/word/2010/wordprocessingGroup" xmlns:wpi="http://schemas.microsoft.com/office/word/2010/wordprocessingInk" xmlns:wps="http://schemas.microsoft.com/office/word/2010/wordprocessingShape" xmlns:o="urn:schemas-microsoft-com:office:office" xmlns:v="urn:schemas-microsoft-com:vml" xmlns:w10="urn:schemas-microsoft-com:office:word" xmlns:w="http://schemas.openxmlformats.org/wordprocessingml/2006/main" xmlns:w14="http://schemas.microsoft.com/office/word/2010/wordml" xmlns:w15="http://schemas.microsoft.com/office/word/2012/wordml" xmlns:w16cex="http://schemas.microsoft.com/office/word/2018/wordml/cex" xmlns:w16cid="http://schemas.microsoft.com/office/word/2016/wordml/cid" xmlns:w16="http://schemas.microsoft.com/office/word/2018/wordml" xmlns:w16sdtdh="http://schemas.microsoft.com/office/word/2020/wordml/sdtdatahash" xmlns:w16sdtfl="http://schemas.microsoft.com/office/word/2024/wordml/sdtformatlock" xmlns:w16se="http://schemas.microsoft.com/office/word/2015/wordml/symex" xmlns:w16du="http://schemas.microsoft.com/office/word/2023/wordml/word16du" xmlns:wne="http://schemas.microsoft.com/office/word/2006/wordml" mc:Ignorable="w14 w15 w16se w16cid w16 w16cex w16sdtdh w16sdtfl w16du wp14">
+<w:document xmlns:wpc="http://schemas.microsoft.com/office/word/2010/wordprocessingCanvas" xmlns:cx="http://schemas.microsoft.com/office/drawing/2014/chartex" xmlns:cx1="http://schemas.microsoft.com/office/drawing/2015/9/8/chartex" xmlns:cx2="http://schemas.microsoft.com/office/drawing/2015/10/21/chartex" xmlns:cx3="http://schemas.microsoft.com/office/drawing/2016/5/9/chartex" xmlns:cx4="http://schemas.microsoft.com/office/drawing/2016/5/10/chartex" xmlns:cx5="http://schemas.microsoft.com/office/drawing/2016/5/11/chartex" xmlns:cx6="http://schemas.microsoft.com/office/drawing/2016/5/12/chartex" xmlns:cx7="http://schemas.microsoft.com/office/drawing/2016/5/13/chartex" xmlns:cx8="http://schemas.microsoft.com/office/drawing/2016/5/14/chartex" xmlns:mc="http://schemas.openxmlformats.org/markup-compatibility/2006" xmlns:aink="http://schemas.microsoft.com/office/drawing/2016/ink" xmlns:am3d="http://schemas.microsoft.com/office/drawing/2017/model3d" xmlns:o="urn:schemas-microsoft-com:office:office" xmlns:oel="http://schemas.microsoft.com/office/2019/extlst" xmlns:r="http://schemas.openxmlformats.org/officeDocument/2006/relationships" xmlns:m="http://schemas.openxmlformats.org/officeDocument/2006/math" xmlns:v="urn:schemas-microsoft-com:vml" xmlns:wp14="http://schemas.microsoft.com/office/word/2010/wordprocessingDrawing" xmlns:wp="http://schemas.openxmlformats.org/drawingml/2006/wordprocessingDrawing" xmlns:w10="urn:schemas-microsoft-com:office:word" xmlns:w="http://schemas.openxmlformats.org/wordprocessingml/2006/main" xmlns:w14="http://schemas.microsoft.com/office/word/2010/wordml" xmlns:w15="http://schemas.microsoft.com/office/word/2012/wordml" xmlns:w16cei="http://schemas.microsoft.com/office/word/2026/wordml/cei" xmlns:w16cex="http://schemas.microsoft.com/office/word/2018/wordml/cex" xmlns:w16cid="http://schemas.microsoft.com/office/word/2016/wordml/cid" xmlns:w16="http://schemas.microsoft.com/office/word/2018/wordml" xmlns:w16du="http://schemas.microsoft.com/office/word/2023/wordml/word16du" xmlns:w16sdtdh="http://schemas.microsoft.com/office/word/2020/wordml/sdtdatahash" xmlns:w16sdtfl="http://schemas.microsoft.com/office/word/2024/wordml/sdtformatlock" xmlns:w16se="http://schemas.microsoft.com/office/word/2015/wordml/symex" xmlns:wpg="http://schemas.microsoft.com/office/word/2010/wordprocessingGroup" xmlns:wpi="http://schemas.microsoft.com/office/word/2010/wordprocessingInk" xmlns:wne="http://schemas.microsoft.com/office/word/2006/wordml" xmlns:wps="http://schemas.microsoft.com/office/word/2010/wordprocessingShape" mc:Ignorable="w14 w15 w16se w16cid w16 w16cex w16sdtdh w16sdtfl w16du wp14">
   <w:body>
     <w:p>
       <w:pPr>
@@ -98,7 +98,7 @@
               </wp:anchor>
             </w:drawing>
           </mc:Choice>
-          <mc:Fallback xmlns:w16cei="http://schemas.microsoft.com/office/word/2026/wordml/cei">
+          <mc:Fallback>
             <w:pict>
               <v:group w14:anchorId="08AC1105" id="Group 11" o:spid="_x0000_s1026" style="position:absolute;margin-left:-18pt;margin-top:10.95pt;width:450pt;height:3.9pt;z-index:251659264" coordorigin="9906,7302" coordsize="68580,1080" o:gfxdata="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">
                 <v:line id="Straight Connector 8" o:spid="_x0000_s1027" style="position:absolute;visibility:visible;mso-wrap-style:square" from="9906,7302" to="78486,7302" o:connectortype="straight" o:gfxdata="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" strokecolor="#ffc000" strokeweight="6pt"/>
@@ -335,7 +335,191 @@
         <w:t>}}</w:t>
       </w:r>
     </w:p>
-    <w:p/>
+    <w:p>
+      <w:pPr>
+        <w:rPr>
+          <w:rFonts w:ascii="Arial" w:hAnsi="Arial" w:cs="Arial"/>
+          <w:lang w:bidi="en-US"/>
+        </w:rPr>
+      </w:pPr>
+    </w:p>
+    <w:p>
+      <w:pPr>
+        <w:rPr>
+          <w:rFonts w:ascii="Arial" w:hAnsi="Arial" w:cs="Arial"/>
+          <w:lang w:bidi="en-US"/>
+        </w:rPr>
+      </w:pPr>
+      <w:r>
+        <w:rPr>
+          <w:rFonts w:ascii="Arial" w:hAnsi="Arial" w:cs="Arial"/>
+          <w:lang w:bidi="en-US"/>
+        </w:rPr>
+        <w:t>{% for article in section.articles %}</w:t>
+      </w:r>
+    </w:p>
+    <w:p>
+      <w:pPr>
+        <w:rPr>
+          <w:rFonts w:ascii="Arial" w:hAnsi="Arial" w:cs="Arial"/>
+          <w:color w:val="000000" w:themeColor="text1"/>
+          <w:sz w:val="20"/>
+          <w:szCs w:val="20"/>
+          <w:lang w:bidi="en-US"/>
+        </w:rPr>
+      </w:pPr>
+      <w:r>
+        <w:rPr>
+          <w:rFonts w:ascii="Arial" w:hAnsi="Arial" w:cs="Arial"/>
+          <w:color w:val="000000" w:themeColor="text1"/>
+          <w:sz w:val="20"/>
+          <w:szCs w:val="20"/>
+          <w:lang w:bidi="en-US"/>
+        </w:rPr>
+        <w:t>{{</w:t>
+      </w:r>
+      <w:r>
+        <w:rPr>
+          <w:rFonts w:ascii="Arial" w:hAnsi="Arial" w:cs="Arial"/>
+          <w:color w:val="000000" w:themeColor="text1"/>
+          <w:sz w:val="20"/>
+          <w:szCs w:val="20"/>
+          <w:lang w:bidi="en-US"/>
+        </w:rPr>
+        <w:t xml:space="preserve">r </w:t>
+      </w:r>
+      <w:r>
+        <w:rPr>
+          <w:rFonts w:ascii="Arial" w:hAnsi="Arial" w:cs="Arial"/>
+          <w:color w:val="000000" w:themeColor="text1"/>
+          <w:sz w:val="20"/>
+          <w:szCs w:val="20"/>
+          <w:lang w:bidi="en-US"/>
+        </w:rPr>
+        <w:t>article.title_with_link}}</w:t>
+      </w:r>
+    </w:p>
+    <w:p>
+      <w:pPr>
+        <w:rPr>
+          <w:rFonts w:ascii="Arial" w:hAnsi="Arial" w:cs="Arial"/>
+          <w:sz w:val="20"/>
+          <w:szCs w:val="20"/>
+          <w:lang w:bidi="en-US"/>
+        </w:rPr>
+      </w:pPr>
+      <w:r>
+        <w:rPr>
+          <w:rFonts w:ascii="Arial" w:hAnsi="Arial" w:cs="Arial"/>
+          <w:sz w:val="20"/>
+          <w:szCs w:val="20"/>
+          <w:lang w:bidi="en-US"/>
+        </w:rPr>
+        <w:t>({{</w:t>
+      </w:r>
+      <w:proofErr w:type="spellStart"/>
+      <w:r>
+        <w:rPr>
+          <w:rFonts w:ascii="Arial" w:hAnsi="Arial" w:cs="Arial"/>
+          <w:sz w:val="20"/>
+          <w:szCs w:val="20"/>
+          <w:lang w:bidi="en-US"/>
+        </w:rPr>
+        <w:t>article.source</w:t>
+      </w:r>
+      <w:proofErr w:type="spellEnd"/>
+      <w:r>
+        <w:rPr>
+          <w:rFonts w:ascii="Arial" w:hAnsi="Arial" w:cs="Arial"/>
+          <w:sz w:val="20"/>
+          <w:szCs w:val="20"/>
+          <w:lang w:bidi="en-US"/>
+        </w:rPr>
+        <w:t>}}</w:t>
+      </w:r>
+      <w:r>
+        <w:rPr>
+          <w:rFonts w:ascii="Arial" w:hAnsi="Arial" w:cs="Arial"/>
+          <w:sz w:val="20"/>
+          <w:szCs w:val="20"/>
+          <w:lang w:bidi="en-US"/>
+        </w:rPr>
+        <w:t>/{{</w:t>
+      </w:r>
+      <w:proofErr w:type="spellStart"/>
+      <w:r>
+        <w:rPr>
+          <w:rFonts w:ascii="Arial" w:hAnsi="Arial" w:cs="Arial"/>
+          <w:sz w:val="20"/>
+          <w:szCs w:val="20"/>
+          <w:lang w:bidi="en-US"/>
+        </w:rPr>
+        <w:t>article.author</w:t>
+      </w:r>
+      <w:proofErr w:type="spellEnd"/>
+      <w:r>
+        <w:rPr>
+          <w:rFonts w:ascii="Arial" w:hAnsi="Arial" w:cs="Arial"/>
+          <w:sz w:val="20"/>
+          <w:szCs w:val="20"/>
+          <w:lang w:bidi="en-US"/>
+        </w:rPr>
+        <w:t>}}</w:t>
+      </w:r>
+      <w:r>
+        <w:rPr>
+          <w:rFonts w:ascii="Arial" w:hAnsi="Arial" w:cs="Arial"/>
+          <w:sz w:val="20"/>
+          <w:szCs w:val="20"/>
+          <w:lang w:bidi="en-US"/>
+        </w:rPr>
+        <w:t>) {{</w:t>
+      </w:r>
+      <w:proofErr w:type="spellStart"/>
+      <w:r>
+        <w:rPr>
+          <w:rFonts w:ascii="Arial" w:hAnsi="Arial" w:cs="Arial"/>
+          <w:sz w:val="20"/>
+          <w:szCs w:val="20"/>
+          <w:lang w:bidi="en-US"/>
+        </w:rPr>
+        <w:t>article.date</w:t>
+      </w:r>
+      <w:proofErr w:type="spellEnd"/>
+      <w:r>
+        <w:rPr>
+          <w:rFonts w:ascii="Arial" w:hAnsi="Arial" w:cs="Arial"/>
+          <w:sz w:val="20"/>
+          <w:szCs w:val="20"/>
+          <w:lang w:bidi="en-US"/>
+        </w:rPr>
+        <w:t>}}</w:t>
+      </w:r>
+    </w:p>
+    <w:p>
+      <w:pPr>
+        <w:rPr>
+          <w:rFonts w:ascii="Arial" w:hAnsi="Arial" w:cs="Arial"/>
+          <w:sz w:val="18"/>
+          <w:szCs w:val="18"/>
+        </w:rPr>
+      </w:pPr>
+    </w:p>
+    <w:p>
+      <w:pPr>
+        <w:rPr>
+          <w:rFonts w:ascii="Arial" w:hAnsi="Arial" w:cs="Arial"/>
+          <w:lang w:bidi="en-US"/>
+        </w:rPr>
+      </w:pPr>
+      <w:r>
+        <w:rPr>
+          <w:rFonts w:ascii="Arial" w:hAnsi="Arial" w:cs="Arial"/>
+          <w:lang w:bidi="en-US"/>
+        </w:rPr>
+        <w:t>{% endfor %}</w:t>
+      </w:r>
+    </w:p>
     <w:p>
       <w:pPr>
         <w:rPr>
@@ -384,273 +568,6 @@
     </w:p>
     <w:p>
       <w:pPr>
-        <w:rPr>
-          <w:rFonts w:ascii="Arial" w:hAnsi="Arial" w:cs="Arial"/>
-          <w:lang w:bidi="en-US"/>
-        </w:rPr>
-      </w:pPr>
-    </w:p>
-    <w:p>
-      <w:pPr>
-        <w:rPr>
-          <w:rFonts w:ascii="Arial" w:hAnsi="Arial" w:cs="Arial"/>
-          <w:lang w:bidi="en-US"/>
-        </w:rPr>
-      </w:pPr>
-      <w:r>
-        <w:rPr>
-          <w:rFonts w:ascii="Arial" w:hAnsi="Arial" w:cs="Arial"/>
-          <w:lang w:bidi="en-US"/>
-        </w:rPr>
-        <w:t>{% for article in section.articles %}</w:t>
-      </w:r>
-    </w:p>
-    <w:p>
-      <w:pPr>
-        <w:rPr>
-          <w:rFonts w:ascii="Arial" w:hAnsi="Arial" w:cs="Arial"/>
-          <w:color w:val="000000" w:themeColor="text1"/>
-          <w:sz w:val="20"/>
-          <w:szCs w:val="20"/>
-          <w:lang w:bidi="en-US"/>
-        </w:rPr>
-      </w:pPr>
-      <w:r>
-        <w:rPr>
-          <w:rFonts w:ascii="Arial" w:hAnsi="Arial" w:cs="Arial"/>
-          <w:color w:val="000000" w:themeColor="text1"/>
-          <w:sz w:val="20"/>
-          <w:szCs w:val="20"/>
-          <w:lang w:bidi="en-US"/>
-        </w:rPr>
-        <w:t>{{</w:t>
-      </w:r>
-      <w:r>
-        <w:rPr>
-          <w:rFonts w:ascii="Arial" w:hAnsi="Arial" w:cs="Arial"/>
-          <w:color w:val="000000" w:themeColor="text1"/>
-          <w:sz w:val="20"/>
-          <w:szCs w:val="20"/>
-          <w:lang w:bidi="en-US"/>
-        </w:rPr>
-        <w:t xml:space="preserve">r </w:t>
-      </w:r>
-      <w:r>
-        <w:rPr>
-          <w:rFonts w:ascii="Arial" w:hAnsi="Arial" w:cs="Arial"/>
-          <w:color w:val="000000" w:themeColor="text1"/>
-          <w:sz w:val="20"/>
-          <w:szCs w:val="20"/>
-          <w:lang w:bidi="en-US"/>
-        </w:rPr>
-        <w:t>article.title_with_link}}</w:t>
-      </w:r>
-    </w:p>
-    <w:p>
-      <w:pPr>
-        <w:rPr>
-          <w:rFonts w:ascii="Arial" w:hAnsi="Arial" w:cs="Arial"/>
-          <w:sz w:val="20"/>
-          <w:szCs w:val="20"/>
-          <w:lang w:bidi="en-US"/>
-        </w:rPr>
-      </w:pPr>
-      <w:r>
-        <w:rPr>
-          <w:rFonts w:ascii="Arial" w:hAnsi="Arial" w:cs="Arial"/>
-          <w:sz w:val="20"/>
-          <w:szCs w:val="20"/>
-          <w:lang w:bidi="en-US"/>
-        </w:rPr>
-        <w:t>({{</w:t>
-      </w:r>
-      <w:proofErr w:type="spellStart"/>
-      <w:proofErr w:type="gramStart"/>
-      <w:r>
-        <w:rPr>
-          <w:rFonts w:ascii="Arial" w:hAnsi="Arial" w:cs="Arial"/>
-          <w:sz w:val="20"/>
-          <w:szCs w:val="20"/>
-          <w:lang w:bidi="en-US"/>
-        </w:rPr>
-        <w:t>article.source</w:t>
-      </w:r>
-      <w:proofErr w:type="spellEnd"/>
-      <w:proofErr w:type="gramEnd"/>
-      <w:r>
-        <w:rPr>
-          <w:rFonts w:ascii="Arial" w:hAnsi="Arial" w:cs="Arial"/>
-          <w:sz w:val="20"/>
-          <w:szCs w:val="20"/>
-          <w:lang w:bidi="en-US"/>
-        </w:rPr>
-        <w:t>}}</w:t>
-      </w:r>
-      <w:r>
-        <w:rPr>
-          <w:rFonts w:ascii="Arial" w:hAnsi="Arial" w:cs="Arial"/>
-          <w:sz w:val="20"/>
-          <w:szCs w:val="20"/>
-          <w:lang w:bidi="en-US"/>
-        </w:rPr>
-        <w:t>/{{</w:t>
-      </w:r>
-      <w:proofErr w:type="spellStart"/>
-      <w:proofErr w:type="gramStart"/>
-      <w:r>
-        <w:rPr>
-          <w:rFonts w:ascii="Arial" w:hAnsi="Arial" w:cs="Arial"/>
-          <w:sz w:val="20"/>
-          <w:szCs w:val="20"/>
-          <w:lang w:bidi="en-US"/>
-        </w:rPr>
-        <w:t>article.author</w:t>
-      </w:r>
-      <w:proofErr w:type="spellEnd"/>
-      <w:proofErr w:type="gramEnd"/>
-      <w:r>
-        <w:rPr>
-          <w:rFonts w:ascii="Arial" w:hAnsi="Arial" w:cs="Arial"/>
-          <w:sz w:val="20"/>
-          <w:szCs w:val="20"/>
-          <w:lang w:bidi="en-US"/>
-        </w:rPr>
-        <w:t>}}</w:t>
-      </w:r>
-      <w:r>
-        <w:rPr>
-          <w:rFonts w:ascii="Arial" w:hAnsi="Arial" w:cs="Arial"/>
-          <w:sz w:val="20"/>
-          <w:szCs w:val="20"/>
-          <w:lang w:bidi="en-US"/>
-        </w:rPr>
-        <w:t>) {{</w:t>
-      </w:r>
-      <w:proofErr w:type="spellStart"/>
-      <w:proofErr w:type="gramStart"/>
-      <w:r>
-        <w:rPr>
-          <w:rFonts w:ascii="Arial" w:hAnsi="Arial" w:cs="Arial"/>
-          <w:sz w:val="20"/>
-          <w:szCs w:val="20"/>
-          <w:lang w:bidi="en-US"/>
-        </w:rPr>
-        <w:t>article.date</w:t>
-      </w:r>
-      <w:proofErr w:type="spellEnd"/>
-      <w:proofErr w:type="gramEnd"/>
-      <w:r>
-        <w:rPr>
-          <w:rFonts w:ascii="Arial" w:hAnsi="Arial" w:cs="Arial"/>
-          <w:sz w:val="20"/>
-          <w:szCs w:val="20"/>
-          <w:lang w:bidi="en-US"/>
-        </w:rPr>
-        <w:t>}}</w:t>
-      </w:r>
-    </w:p>
-    <w:p>
-      <w:pPr>
-        <w:rPr>
-          <w:rFonts w:ascii="Arial" w:hAnsi="Arial" w:cs="Arial"/>
-          <w:lang w:bidi="en-US"/>
-        </w:rPr>
-      </w:pPr>
-    </w:p>
-    <w:bookmarkStart w:id="8" w:name="_Hlk190227748"/>
-    <w:p>
-      <w:pPr>
-        <w:rPr>
-          <w:rFonts w:ascii="Arial" w:hAnsi="Arial" w:cs="Arial"/>
-          <w:sz w:val="18"/>
-          <w:szCs w:val="18"/>
-        </w:rPr>
-      </w:pPr>
-      <w:r>
-        <w:fldChar w:fldCharType="begin"/>
-      </w:r>
-      <w:r>
-        <w:instrText>HYPERLINK  \l "_FULL_ARTICLES"</w:instrText>
-      </w:r>
-      <w:r>
-        <w:fldChar w:fldCharType="separate"/>
-      </w:r>
-      <w:r>
-        <w:rPr>
-          <w:rStyle w:val="Hyperlink"/>
-          <w:rFonts w:ascii="Arial" w:hAnsi="Arial" w:cs="Arial"/>
-          <w:b/>
-          <w:sz w:val="18"/>
-          <w:szCs w:val="18"/>
-          <w:lang w:bidi="en-US"/>
-        </w:rPr>
-        <w:t>Full Articles</w:t>
-      </w:r>
-      <w:r>
-        <w:rPr>
-          <w:rStyle w:val="Hyperlink"/>
-          <w:rFonts w:ascii="Arial" w:hAnsi="Arial" w:cs="Arial"/>
-          <w:b/>
-          <w:sz w:val="18"/>
-          <w:szCs w:val="18"/>
-          <w:lang w:bidi="en-US"/>
-        </w:rPr>
-        <w:fldChar w:fldCharType="end"/>
-      </w:r>
-      <w:r>
-        <w:rPr>
-          <w:rFonts w:ascii="Arial" w:hAnsi="Arial" w:cs="Arial"/>
-          <w:b/>
-          <w:color w:val="000000"/>
-          <w:sz w:val="18"/>
-          <w:szCs w:val="18"/>
-          <w:lang w:bidi="en-US"/>
-        </w:rPr>
-        <w:t xml:space="preserve"> </w:t>
-      </w:r>
-      <w:hyperlink w:anchor="_top" w:history="1">
-        <w:r>
-          <w:rPr>
-            <w:rStyle w:val="Hyperlink"/>
-            <w:rFonts w:ascii="Arial" w:hAnsi="Arial" w:cs="Arial"/>
-            <w:b/>
-            <w:sz w:val="18"/>
-            <w:szCs w:val="18"/>
-            <w:lang w:bidi="en-US"/>
-          </w:rPr>
-          <w:t>Back to Top</w:t>
-        </w:r>
-      </w:hyperlink>
-      <w:bookmarkStart w:id="9" w:name="_ALASKA,_ARCTIC_1"/>
-      <w:bookmarkEnd w:id="8"/>
-      <w:bookmarkEnd w:id="9"/>
-    </w:p>
-    <w:p>
-      <w:pPr>
-        <w:rPr>
-          <w:rFonts w:ascii="Arial" w:hAnsi="Arial" w:cs="Arial"/>
-          <w:sz w:val="18"/>
-          <w:szCs w:val="18"/>
-        </w:rPr>
-      </w:pPr>
-    </w:p>
-    <w:p>
-      <w:pPr>
-        <w:rPr>
-          <w:rFonts w:ascii="Arial" w:hAnsi="Arial" w:cs="Arial"/>
-          <w:lang w:bidi="en-US"/>
-        </w:rPr>
-      </w:pPr>
-      <w:r>
-        <w:rPr>
-          <w:rFonts w:ascii="Arial" w:hAnsi="Arial" w:cs="Arial"/>
-          <w:lang w:bidi="en-US"/>
-        </w:rPr>
-        <w:t>{% endfor %}</w:t>
-      </w:r>
-    </w:p>
-    <w:p>
-      <w:pPr>
         <w:pBdr>
           <w:bottom w:val="single" w:sz="6" w:space="1" w:color="auto"/>
         </w:pBdr>
@@ -706,8 +623,8 @@
           <w:lang w:bidi="en-US"/>
         </w:rPr>
       </w:pPr>
-      <w:bookmarkStart w:id="10" w:name="_Build_Lethality_&amp;"/>
-      <w:bookmarkEnd w:id="10"/>
+      <w:bookmarkStart w:id="8" w:name="_Build_Lethality_&amp;"/>
+      <w:bookmarkEnd w:id="8"/>
     </w:p>
     <w:p>
       <w:pPr>
@@ -722,8 +639,8 @@
           <w:lang w:bidi="en-US"/>
         </w:rPr>
       </w:pPr>
-      <w:bookmarkStart w:id="11" w:name="_FULL_ARTICLES"/>
-      <w:bookmarkEnd w:id="11"/>
+      <w:bookmarkStart w:id="9" w:name="_FULL_ARTICLES"/>
+      <w:bookmarkEnd w:id="9"/>
       <w:r>
         <w:rPr>
           <w:rFonts w:ascii="Arial" w:hAnsi="Arial" w:cs="Arial"/>
@@ -813,7 +730,215 @@
         <w:t>}}</w:t>
       </w:r>
     </w:p>
-    <w:p/>
+    <w:p>
+      <w:pPr>
+        <w:rPr>
+          <w:rFonts w:ascii="Arial" w:hAnsi="Arial" w:cs="Arial"/>
+          <w:b/>
+          <w:color w:val="000000"/>
+          <w:sz w:val="20"/>
+          <w:szCs w:val="20"/>
+          <w:u w:val="single"/>
+          <w:lang w:bidi="en-US"/>
+        </w:rPr>
+      </w:pPr>
+    </w:p>
+    <w:p>
+      <w:pPr>
+        <w:rPr>
+          <w:rFonts w:ascii="Arial" w:hAnsi="Arial" w:cs="Arial"/>
+          <w:lang w:bidi="en-US"/>
+        </w:rPr>
+      </w:pPr>
+      <w:r>
+        <w:rPr>
+          <w:rFonts w:ascii="Arial" w:hAnsi="Arial" w:cs="Arial"/>
+          <w:lang w:bidi="en-US"/>
+        </w:rPr>
+        <w:t>{% for article in section.articles %}</w:t>
+      </w:r>
+    </w:p>
+    <w:p>
+      <w:pPr>
+        <w:rPr>
+          <w:rFonts w:ascii="Arial" w:hAnsi="Arial" w:cs="Arial"/>
+          <w:color w:val="000000" w:themeColor="text1"/>
+          <w:sz w:val="20"/>
+          <w:szCs w:val="20"/>
+          <w:lang w:bidi="en-US"/>
+        </w:rPr>
+      </w:pPr>
+      <w:r>
+        <w:rPr>
+          <w:rFonts w:ascii="Arial" w:hAnsi="Arial" w:cs="Arial"/>
+          <w:color w:val="000000" w:themeColor="text1"/>
+          <w:sz w:val="20"/>
+          <w:szCs w:val="20"/>
+          <w:lang w:bidi="en-US"/>
+        </w:rPr>
+        <w:t>{{</w:t>
+      </w:r>
+      <w:r>
+        <w:rPr>
+          <w:rFonts w:ascii="Arial" w:hAnsi="Arial" w:cs="Arial"/>
+          <w:color w:val="000000" w:themeColor="text1"/>
+          <w:sz w:val="20"/>
+          <w:szCs w:val="20"/>
+          <w:lang w:bidi="en-US"/>
+        </w:rPr>
+        <w:t xml:space="preserve">r </w:t>
+      </w:r>
+      <w:r>
+        <w:rPr>
+          <w:rFonts w:ascii="Arial" w:hAnsi="Arial" w:cs="Arial"/>
+          <w:color w:val="000000" w:themeColor="text1"/>
+          <w:sz w:val="20"/>
+          <w:szCs w:val="20"/>
+          <w:lang w:bidi="en-US"/>
+        </w:rPr>
+        <w:t>article.title_with_link}}</w:t>
+      </w:r>
+    </w:p>
+    <w:p>
+      <w:pPr>
+        <w:rPr>
+          <w:rFonts w:ascii="Arial" w:hAnsi="Arial" w:cs="Arial"/>
+          <w:sz w:val="20"/>
+          <w:szCs w:val="20"/>
+          <w:lang w:bidi="en-US"/>
+        </w:rPr>
+      </w:pPr>
+      <w:r>
+        <w:rPr>
+          <w:rFonts w:ascii="Arial" w:hAnsi="Arial" w:cs="Arial"/>
+          <w:sz w:val="20"/>
+          <w:szCs w:val="20"/>
+          <w:lang w:bidi="en-US"/>
+        </w:rPr>
+        <w:t>({{</w:t>
+      </w:r>
+      <w:proofErr w:type="spellStart"/>
+      <w:r>
+        <w:rPr>
+          <w:rFonts w:ascii="Arial" w:hAnsi="Arial" w:cs="Arial"/>
+          <w:sz w:val="20"/>
+          <w:szCs w:val="20"/>
+          <w:lang w:bidi="en-US"/>
+        </w:rPr>
+        <w:t>article.source</w:t>
+      </w:r>
+      <w:proofErr w:type="spellEnd"/>
+      <w:r>
+        <w:rPr>
+          <w:rFonts w:ascii="Arial" w:hAnsi="Arial" w:cs="Arial"/>
+          <w:sz w:val="20"/>
+          <w:szCs w:val="20"/>
+          <w:lang w:bidi="en-US"/>
+        </w:rPr>
+        <w:t>}}</w:t>
+      </w:r>
+      <w:r>
+        <w:rPr>
+          <w:rFonts w:ascii="Arial" w:hAnsi="Arial" w:cs="Arial"/>
+          <w:sz w:val="20"/>
+          <w:szCs w:val="20"/>
+          <w:lang w:bidi="en-US"/>
+        </w:rPr>
+        <w:t>/{{</w:t>
+      </w:r>
+      <w:proofErr w:type="spellStart"/>
+      <w:r>
+        <w:rPr>
+          <w:rFonts w:ascii="Arial" w:hAnsi="Arial" w:cs="Arial"/>
+          <w:sz w:val="20"/>
+          <w:szCs w:val="20"/>
+          <w:lang w:bidi="en-US"/>
+        </w:rPr>
+        <w:t>article.author</w:t>
+      </w:r>
+      <w:proofErr w:type="spellEnd"/>
+      <w:r>
+        <w:rPr>
+          <w:rFonts w:ascii="Arial" w:hAnsi="Arial" w:cs="Arial"/>
+          <w:sz w:val="20"/>
+          <w:szCs w:val="20"/>
+          <w:lang w:bidi="en-US"/>
+        </w:rPr>
+        <w:t>}}</w:t>
+      </w:r>
+      <w:r>
+        <w:rPr>
+          <w:rFonts w:ascii="Arial" w:hAnsi="Arial" w:cs="Arial"/>
+          <w:sz w:val="20"/>
+          <w:szCs w:val="20"/>
+          <w:lang w:bidi="en-US"/>
+        </w:rPr>
+        <w:t>) {{</w:t>
+      </w:r>
+      <w:proofErr w:type="spellStart"/>
+      <w:r>
+        <w:rPr>
+          <w:rFonts w:ascii="Arial" w:hAnsi="Arial" w:cs="Arial"/>
+          <w:sz w:val="20"/>
+          <w:szCs w:val="20"/>
+          <w:lang w:bidi="en-US"/>
+        </w:rPr>
+        <w:t>article.date</w:t>
+      </w:r>
+      <w:proofErr w:type="spellEnd"/>
+      <w:r>
+        <w:rPr>
+          <w:rFonts w:ascii="Arial" w:hAnsi="Arial" w:cs="Arial"/>
+          <w:sz w:val="20"/>
+          <w:szCs w:val="20"/>
+          <w:lang w:bidi="en-US"/>
+        </w:rPr>
+        <w:t>}}</w:t>
+      </w:r>
+    </w:p>
+    <w:p>
+      <w:pPr>
+        <w:rPr>
+          <w:rFonts w:ascii="Arial" w:hAnsi="Arial" w:cs="Arial"/>
+          <w:sz w:val="20"/>
+          <w:szCs w:val="20"/>
+          <w:lang w:bidi="en-US"/>
+        </w:rPr>
+      </w:pPr>
+      <w:r>
+        <w:rPr>
+          <w:rFonts w:ascii="Arial" w:hAnsi="Arial" w:cs="Arial"/>
+          <w:sz w:val="20"/>
+          <w:szCs w:val="20"/>
+          <w:lang w:bidi="en-US"/>
+        </w:rPr>
+        <w:t>{{article.full_text}}</w:t>
+      </w:r>
+    </w:p>
+    <w:p>
+      <w:pPr>
+        <w:rPr>
+          <w:rFonts w:ascii="Arial" w:hAnsi="Arial" w:cs="Arial"/>
+          <w:sz w:val="18"/>
+          <w:szCs w:val="18"/>
+        </w:rPr>
+      </w:pPr>
+    </w:p>
+    <w:p>
+      <w:pPr>
+        <w:rPr>
+          <w:rFonts w:ascii="Arial" w:hAnsi="Arial" w:cs="Arial"/>
+          <w:lang w:bidi="en-US"/>
+        </w:rPr>
+      </w:pPr>
+      <w:r>
+        <w:rPr>
+          <w:rFonts w:ascii="Arial" w:hAnsi="Arial" w:cs="Arial"/>
+          <w:lang w:bidi="en-US"/>
+        </w:rPr>
+        <w:t>{% endfor %}</w:t>
+      </w:r>
+    </w:p>
     <w:p>
       <w:pPr>
         <w:rPr>
@@ -835,260 +960,6 @@
           <w:t>Back to Summaries</w:t>
         </w:r>
       </w:hyperlink>
-    </w:p>
-    <w:p>
-      <w:pPr>
-        <w:rPr>
-          <w:lang w:bidi="en-US"/>
-        </w:rPr>
-      </w:pPr>
-    </w:p>
-    <w:p>
-      <w:pPr>
-        <w:rPr>
-          <w:rFonts w:ascii="Arial" w:hAnsi="Arial" w:cs="Arial"/>
-          <w:b/>
-          <w:color w:val="000000"/>
-          <w:sz w:val="20"/>
-          <w:szCs w:val="20"/>
-          <w:u w:val="single"/>
-          <w:lang w:bidi="en-US"/>
-        </w:rPr>
-      </w:pPr>
-    </w:p>
-    <w:p>
-      <w:pPr>
-        <w:rPr>
-          <w:rFonts w:ascii="Arial" w:hAnsi="Arial" w:cs="Arial"/>
-          <w:lang w:bidi="en-US"/>
-        </w:rPr>
-      </w:pPr>
-      <w:r>
-        <w:rPr>
-          <w:rFonts w:ascii="Arial" w:hAnsi="Arial" w:cs="Arial"/>
-          <w:lang w:bidi="en-US"/>
-        </w:rPr>
-        <w:t>{% for article in section.articles %}</w:t>
-      </w:r>
-    </w:p>
-    <w:p>
-      <w:pPr>
-        <w:rPr>
-          <w:rFonts w:ascii="Arial" w:hAnsi="Arial" w:cs="Arial"/>
-          <w:color w:val="000000" w:themeColor="text1"/>
-          <w:sz w:val="20"/>
-          <w:szCs w:val="20"/>
-          <w:lang w:bidi="en-US"/>
-        </w:rPr>
-      </w:pPr>
-      <w:r>
-        <w:rPr>
-          <w:rFonts w:ascii="Arial" w:hAnsi="Arial" w:cs="Arial"/>
-          <w:color w:val="000000" w:themeColor="text1"/>
-          <w:sz w:val="20"/>
-          <w:szCs w:val="20"/>
-          <w:lang w:bidi="en-US"/>
-        </w:rPr>
-        <w:t>{{</w:t>
-      </w:r>
-      <w:r>
-        <w:rPr>
-          <w:rFonts w:ascii="Arial" w:hAnsi="Arial" w:cs="Arial"/>
-          <w:color w:val="000000" w:themeColor="text1"/>
-          <w:sz w:val="20"/>
-          <w:szCs w:val="20"/>
-          <w:lang w:bidi="en-US"/>
-        </w:rPr>
-        <w:t xml:space="preserve">r </w:t>
-      </w:r>
-      <w:r>
-        <w:rPr>
-          <w:rFonts w:ascii="Arial" w:hAnsi="Arial" w:cs="Arial"/>
-          <w:color w:val="000000" w:themeColor="text1"/>
-          <w:sz w:val="20"/>
-          <w:szCs w:val="20"/>
-          <w:lang w:bidi="en-US"/>
-        </w:rPr>
-        <w:t>article.title_with_link}}</w:t>
-      </w:r>
-    </w:p>
-    <w:p>
-      <w:pPr>
-        <w:rPr>
-          <w:rFonts w:ascii="Arial" w:hAnsi="Arial" w:cs="Arial"/>
-          <w:sz w:val="20"/>
-          <w:szCs w:val="20"/>
-          <w:lang w:bidi="en-US"/>
-        </w:rPr>
-      </w:pPr>
-      <w:r>
-        <w:rPr>
-          <w:rFonts w:ascii="Arial" w:hAnsi="Arial" w:cs="Arial"/>
-          <w:sz w:val="20"/>
-          <w:szCs w:val="20"/>
-          <w:lang w:bidi="en-US"/>
-        </w:rPr>
-        <w:t>({{</w:t>
-      </w:r>
-      <w:proofErr w:type="spellStart"/>
-      <w:proofErr w:type="gramStart"/>
-      <w:r>
-        <w:rPr>
-          <w:rFonts w:ascii="Arial" w:hAnsi="Arial" w:cs="Arial"/>
-          <w:sz w:val="20"/>
-          <w:szCs w:val="20"/>
-          <w:lang w:bidi="en-US"/>
-        </w:rPr>
-        <w:t>article.source</w:t>
-      </w:r>
-      <w:proofErr w:type="spellEnd"/>
-      <w:proofErr w:type="gramEnd"/>
-      <w:r>
-        <w:rPr>
-          <w:rFonts w:ascii="Arial" w:hAnsi="Arial" w:cs="Arial"/>
-          <w:sz w:val="20"/>
-          <w:szCs w:val="20"/>
-          <w:lang w:bidi="en-US"/>
-        </w:rPr>
-        <w:t>}}</w:t>
-      </w:r>
-      <w:r>
-        <w:rPr>
-          <w:rFonts w:ascii="Arial" w:hAnsi="Arial" w:cs="Arial"/>
-          <w:sz w:val="20"/>
-          <w:szCs w:val="20"/>
-          <w:lang w:bidi="en-US"/>
-        </w:rPr>
-        <w:t>/{{</w:t>
-      </w:r>
-      <w:proofErr w:type="spellStart"/>
-      <w:proofErr w:type="gramStart"/>
-      <w:r>
-        <w:rPr>
-          <w:rFonts w:ascii="Arial" w:hAnsi="Arial" w:cs="Arial"/>
-          <w:sz w:val="20"/>
-          <w:szCs w:val="20"/>
-          <w:lang w:bidi="en-US"/>
-        </w:rPr>
-        <w:t>article.author</w:t>
-      </w:r>
-      <w:proofErr w:type="spellEnd"/>
-      <w:proofErr w:type="gramEnd"/>
-      <w:r>
-        <w:rPr>
-          <w:rFonts w:ascii="Arial" w:hAnsi="Arial" w:cs="Arial"/>
-          <w:sz w:val="20"/>
-          <w:szCs w:val="20"/>
-          <w:lang w:bidi="en-US"/>
-        </w:rPr>
-        <w:t>}}</w:t>
-      </w:r>
-      <w:r>
-        <w:rPr>
-          <w:rFonts w:ascii="Arial" w:hAnsi="Arial" w:cs="Arial"/>
-          <w:sz w:val="20"/>
-          <w:szCs w:val="20"/>
-          <w:lang w:bidi="en-US"/>
-        </w:rPr>
-        <w:t>) {{</w:t>
-      </w:r>
-      <w:proofErr w:type="spellStart"/>
-      <w:proofErr w:type="gramStart"/>
-      <w:r>
-        <w:rPr>
-          <w:rFonts w:ascii="Arial" w:hAnsi="Arial" w:cs="Arial"/>
-          <w:sz w:val="20"/>
-          <w:szCs w:val="20"/>
-          <w:lang w:bidi="en-US"/>
-        </w:rPr>
-        <w:t>article.date</w:t>
-      </w:r>
-      <w:proofErr w:type="spellEnd"/>
-      <w:proofErr w:type="gramEnd"/>
-      <w:r>
-        <w:rPr>
-          <w:rFonts w:ascii="Arial" w:hAnsi="Arial" w:cs="Arial"/>
-          <w:sz w:val="20"/>
-          <w:szCs w:val="20"/>
-          <w:lang w:bidi="en-US"/>
-        </w:rPr>
-        <w:t>}}</w:t>
-      </w:r>
-    </w:p>
-    <w:p>
-      <w:pPr>
-        <w:rPr>
-          <w:rFonts w:ascii="Arial" w:hAnsi="Arial" w:cs="Arial"/>
-          <w:sz w:val="20"/>
-          <w:szCs w:val="20"/>
-          <w:lang w:bidi="en-US"/>
-        </w:rPr>
-      </w:pPr>
-      <w:r>
-        <w:rPr>
-          <w:rFonts w:ascii="Arial" w:hAnsi="Arial" w:cs="Arial"/>
-          <w:sz w:val="20"/>
-          <w:szCs w:val="20"/>
-          <w:lang w:bidi="en-US"/>
-        </w:rPr>
-        <w:t>{{article.full_text}}</w:t>
-      </w:r>
-    </w:p>
-    <w:p>
-      <w:pPr>
-        <w:rPr>
-          <w:rFonts w:ascii="Arial" w:hAnsi="Arial" w:cs="Arial"/>
-          <w:sz w:val="20"/>
-          <w:szCs w:val="20"/>
-          <w:lang w:bidi="en-US"/>
-        </w:rPr>
-      </w:pPr>
-    </w:p>
-    <w:p>
-      <w:pPr>
-        <w:rPr>
-          <w:rFonts w:ascii="Arial" w:hAnsi="Arial" w:cs="Arial"/>
-          <w:sz w:val="18"/>
-          <w:szCs w:val="18"/>
-        </w:rPr>
-      </w:pPr>
-      <w:hyperlink w:anchor="_top" w:history="1">
-        <w:r>
-          <w:rPr>
-            <w:rStyle w:val="Hyperlink"/>
-            <w:rFonts w:ascii="Arial" w:hAnsi="Arial" w:cs="Arial"/>
-            <w:b/>
-            <w:sz w:val="18"/>
-            <w:szCs w:val="18"/>
-            <w:lang w:bidi="en-US"/>
-          </w:rPr>
-          <w:t>Back to Summaries</w:t>
-        </w:r>
-      </w:hyperlink>
-    </w:p>
-    <w:p>
-      <w:pPr>
-        <w:rPr>
-          <w:rFonts w:ascii="Arial" w:hAnsi="Arial" w:cs="Arial"/>
-          <w:sz w:val="18"/>
-          <w:szCs w:val="18"/>
-        </w:rPr>
-      </w:pPr>
-    </w:p>
-    <w:p>
-      <w:pPr>
-        <w:rPr>
-          <w:rFonts w:ascii="Arial" w:hAnsi="Arial" w:cs="Arial"/>
-          <w:lang w:bidi="en-US"/>
-        </w:rPr>
-      </w:pPr>
-      <w:r>
-        <w:rPr>
-          <w:rFonts w:ascii="Arial" w:hAnsi="Arial" w:cs="Arial"/>
-          <w:lang w:bidi="en-US"/>
-        </w:rPr>
-        <w:t>{% endfor %}</w:t>
-      </w:r>
     </w:p>
     <w:p>
       <w:pPr>
@@ -1275,7 +1146,7 @@
 </file>
 
 <file path=word/endnotes.xml><?xml version="1.0" encoding="utf-8"?>
-<w:endnotes xmlns:wpc="http://schemas.microsoft.com/office/word/2010/wordprocessingCanvas" xmlns:cx="http://schemas.microsoft.com/office/drawing/2014/chartex" xmlns:cx1="http://schemas.microsoft.com/office/drawing/2015/9/8/chartex" xmlns:cx2="http://schemas.microsoft.com/office/drawing/2015/10/21/chartex" xmlns:cx3="http://schemas.microsoft.com/office/drawing/2016/5/9/chartex" xmlns:cx4="http://schemas.microsoft.com/office/drawing/2016/5/10/chartex" xmlns:cx5="http://schemas.microsoft.com/office/drawing/2016/5/11/chartex" xmlns:cx6="http://schemas.microsoft.com/office/drawing/2016/5/12/chartex" xmlns:cx7="http://schemas.microsoft.com/office/drawing/2016/5/13/chartex" xmlns:cx8="http://schemas.microsoft.com/office/drawing/2016/5/14/chartex" xmlns:mc="http://schemas.openxmlformats.org/markup-compatibility/2006" xmlns:m="http://schemas.openxmlformats.org/officeDocument/2006/math" xmlns:aink="http://schemas.microsoft.com/office/drawing/2016/ink" xmlns:am3d="http://schemas.microsoft.com/office/drawing/2017/model3d" xmlns:oel="http://schemas.microsoft.com/office/2019/extlst" xmlns:r="http://schemas.openxmlformats.org/officeDocument/2006/relationships" xmlns:wp14="http://schemas.microsoft.com/office/word/2010/wordprocessingDrawing" xmlns:wp="http://schemas.openxmlformats.org/drawingml/2006/wordprocessingDrawing" xmlns:wpg="http://schemas.microsoft.com/office/word/2010/wordprocessingGroup" xmlns:wpi="http://schemas.microsoft.com/office/word/2010/wordprocessingInk" xmlns:wps="http://schemas.microsoft.com/office/word/2010/wordprocessingShape" xmlns:o="urn:schemas-microsoft-com:office:office" xmlns:v="urn:schemas-microsoft-com:vml" xmlns:w10="urn:schemas-microsoft-com:office:word" xmlns:w="http://schemas.openxmlformats.org/wordprocessingml/2006/main" xmlns:w14="http://schemas.microsoft.com/office/word/2010/wordml" xmlns:w15="http://schemas.microsoft.com/office/word/2012/wordml" xmlns:w16cex="http://schemas.microsoft.com/office/word/2018/wordml/cex" xmlns:w16cid="http://schemas.microsoft.com/office/word/2016/wordml/cid" xmlns:w16="http://schemas.microsoft.com/office/word/2018/wordml" xmlns:w16sdtdh="http://schemas.microsoft.com/office/word/2020/wordml/sdtdatahash" xmlns:w16sdtfl="http://schemas.microsoft.com/office/word/2024/wordml/sdtformatlock" xmlns:w16se="http://schemas.microsoft.com/office/word/2015/wordml/symex" xmlns:w16du="http://schemas.microsoft.com/office/word/2023/wordml/word16du" xmlns:wne="http://schemas.microsoft.com/office/word/2006/wordml" mc:Ignorable="w14 w15 w16se w16cid w16 w16cex w16sdtdh w16sdtfl w16du wp14">
+<w:endnotes xmlns:wpc="http://schemas.microsoft.com/office/word/2010/wordprocessingCanvas" xmlns:cx="http://schemas.microsoft.com/office/drawing/2014/chartex" xmlns:cx1="http://schemas.microsoft.com/office/drawing/2015/9/8/chartex" xmlns:cx2="http://schemas.microsoft.com/office/drawing/2015/10/21/chartex" xmlns:cx3="http://schemas.microsoft.com/office/drawing/2016/5/9/chartex" xmlns:cx4="http://schemas.microsoft.com/office/drawing/2016/5/10/chartex" xmlns:cx5="http://schemas.microsoft.com/office/drawing/2016/5/11/chartex" xmlns:cx6="http://schemas.microsoft.com/office/drawing/2016/5/12/chartex" xmlns:cx7="http://schemas.microsoft.com/office/drawing/2016/5/13/chartex" xmlns:cx8="http://schemas.microsoft.com/office/drawing/2016/5/14/chartex" xmlns:mc="http://schemas.openxmlformats.org/markup-compatibility/2006" xmlns:aink="http://schemas.microsoft.com/office/drawing/2016/ink" xmlns:am3d="http://schemas.microsoft.com/office/drawing/2017/model3d" xmlns:o="urn:schemas-microsoft-com:office:office" xmlns:oel="http://schemas.microsoft.com/office/2019/extlst" xmlns:r="http://schemas.openxmlformats.org/officeDocument/2006/relationships" xmlns:m="http://schemas.openxmlformats.org/officeDocument/2006/math" xmlns:v="urn:schemas-microsoft-com:vml" xmlns:wp14="http://schemas.microsoft.com/office/word/2010/wordprocessingDrawing" xmlns:wp="http://schemas.openxmlformats.org/drawingml/2006/wordprocessingDrawing" xmlns:w10="urn:schemas-microsoft-com:office:word" xmlns:w="http://schemas.openxmlformats.org/wordprocessingml/2006/main" xmlns:w14="http://schemas.microsoft.com/office/word/2010/wordml" xmlns:w15="http://schemas.microsoft.com/office/word/2012/wordml" xmlns:w16cei="http://schemas.microsoft.com/office/word/2026/wordml/cei" xmlns:w16cex="http://schemas.microsoft.com/office/word/2018/wordml/cex" xmlns:w16cid="http://schemas.microsoft.com/office/word/2016/wordml/cid" xmlns:w16="http://schemas.microsoft.com/office/word/2018/wordml" xmlns:w16du="http://schemas.microsoft.com/office/word/2023/wordml/word16du" xmlns:w16sdtdh="http://schemas.microsoft.com/office/word/2020/wordml/sdtdatahash" xmlns:w16sdtfl="http://schemas.microsoft.com/office/word/2024/wordml/sdtformatlock" xmlns:w16se="http://schemas.microsoft.com/office/word/2015/wordml/symex" xmlns:wpg="http://schemas.microsoft.com/office/word/2010/wordprocessingGroup" xmlns:wpi="http://schemas.microsoft.com/office/word/2010/wordprocessingInk" xmlns:wne="http://schemas.microsoft.com/office/word/2006/wordml" xmlns:wps="http://schemas.microsoft.com/office/word/2010/wordprocessingShape" mc:Ignorable="w14 w15 w16se w16cid w16 w16cex w16sdtdh w16sdtfl w16du wp14">
   <w:endnote w:type="separator" w:id="-1">
     <w:p>
       <w:r>
@@ -1294,7 +1165,7 @@
 </file>
 
 <file path=word/footer1.xml><?xml version="1.0" encoding="utf-8"?>
-<w:ftr xmlns:wpc="http://schemas.microsoft.com/office/word/2010/wordprocessingCanvas" xmlns:cx="http://schemas.microsoft.com/office/drawing/2014/chartex" xmlns:cx1="http://schemas.microsoft.com/office/drawing/2015/9/8/chartex" xmlns:cx2="http://schemas.microsoft.com/office/drawing/2015/10/21/chartex" xmlns:cx3="http://schemas.microsoft.com/office/drawing/2016/5/9/chartex" xmlns:cx4="http://schemas.microsoft.com/office/drawing/2016/5/10/chartex" xmlns:cx5="http://schemas.microsoft.com/office/drawing/2016/5/11/chartex" xmlns:cx6="http://schemas.microsoft.com/office/drawing/2016/5/12/chartex" xmlns:cx7="http://schemas.microsoft.com/office/drawing/2016/5/13/chartex" xmlns:cx8="http://schemas.microsoft.com/office/drawing/2016/5/14/chartex" xmlns:mc="http://schemas.openxmlformats.org/markup-compatibility/2006" xmlns:m="http://schemas.openxmlformats.org/officeDocument/2006/math" xmlns:aink="http://schemas.microsoft.com/office/drawing/2016/ink" xmlns:am3d="http://schemas.microsoft.com/office/drawing/2017/model3d" xmlns:oel="http://schemas.microsoft.com/office/2019/extlst" xmlns:r="http://schemas.openxmlformats.org/officeDocument/2006/relationships" xmlns:wp14="http://schemas.microsoft.com/office/word/2010/wordprocessingDrawing" xmlns:wp="http://schemas.openxmlformats.org/drawingml/2006/wordprocessingDrawing" xmlns:wpg="http://schemas.microsoft.com/office/word/2010/wordprocessingGroup" xmlns:wpi="http://schemas.microsoft.com/office/word/2010/wordprocessingInk" xmlns:wps="http://schemas.microsoft.com/office/word/2010/wordprocessingShape" xmlns:o="urn:schemas-microsoft-com:office:office" xmlns:v="urn:schemas-microsoft-com:vml" xmlns:w10="urn:schemas-microsoft-com:office:word" xmlns:w="http://schemas.openxmlformats.org/wordprocessingml/2006/main" xmlns:w14="http://schemas.microsoft.com/office/word/2010/wordml" xmlns:w15="http://schemas.microsoft.com/office/word/2012/wordml" xmlns:w16cex="http://schemas.microsoft.com/office/word/2018/wordml/cex" xmlns:w16cid="http://schemas.microsoft.com/office/word/2016/wordml/cid" xmlns:w16="http://schemas.microsoft.com/office/word/2018/wordml" xmlns:w16sdtdh="http://schemas.microsoft.com/office/word/2020/wordml/sdtdatahash" xmlns:w16sdtfl="http://schemas.microsoft.com/office/word/2024/wordml/sdtformatlock" xmlns:w16se="http://schemas.microsoft.com/office/word/2015/wordml/symex" xmlns:w16du="http://schemas.microsoft.com/office/word/2023/wordml/word16du" xmlns:wne="http://schemas.microsoft.com/office/word/2006/wordml" mc:Ignorable="w14 w15 w16se w16cid w16 w16cex w16sdtdh w16sdtfl w16du wp14">
+<w:ftr xmlns:wpc="http://schemas.microsoft.com/office/word/2010/wordprocessingCanvas" xmlns:cx="http://schemas.microsoft.com/office/drawing/2014/chartex" xmlns:cx1="http://schemas.microsoft.com/office/drawing/2015/9/8/chartex" xmlns:cx2="http://schemas.microsoft.com/office/drawing/2015/10/21/chartex" xmlns:cx3="http://schemas.microsoft.com/office/drawing/2016/5/9/chartex" xmlns:cx4="http://schemas.microsoft.com/office/drawing/2016/5/10/chartex" xmlns:cx5="http://schemas.microsoft.com/office/drawing/2016/5/11/chartex" xmlns:cx6="http://schemas.microsoft.com/office/drawing/2016/5/12/chartex" xmlns:cx7="http://schemas.microsoft.com/office/drawing/2016/5/13/chartex" xmlns:cx8="http://schemas.microsoft.com/office/drawing/2016/5/14/chartex" xmlns:mc="http://schemas.openxmlformats.org/markup-compatibility/2006" xmlns:aink="http://schemas.microsoft.com/office/drawing/2016/ink" xmlns:am3d="http://schemas.microsoft.com/office/drawing/2017/model3d" xmlns:o="urn:schemas-microsoft-com:office:office" xmlns:oel="http://schemas.microsoft.com/office/2019/extlst" xmlns:r="http://schemas.openxmlformats.org/officeDocument/2006/relationships" xmlns:m="http://schemas.openxmlformats.org/officeDocument/2006/math" xmlns:v="urn:schemas-microsoft-com:vml" xmlns:wp14="http://schemas.microsoft.com/office/word/2010/wordprocessingDrawing" xmlns:wp="http://schemas.openxmlformats.org/drawingml/2006/wordprocessingDrawing" xmlns:w10="urn:schemas-microsoft-com:office:word" xmlns:w="http://schemas.openxmlformats.org/wordprocessingml/2006/main" xmlns:w14="http://schemas.microsoft.com/office/word/2010/wordml" xmlns:w15="http://schemas.microsoft.com/office/word/2012/wordml" xmlns:w16cei="http://schemas.microsoft.com/office/word/2026/wordml/cei" xmlns:w16cex="http://schemas.microsoft.com/office/word/2018/wordml/cex" xmlns:w16cid="http://schemas.microsoft.com/office/word/2016/wordml/cid" xmlns:w16="http://schemas.microsoft.com/office/word/2018/wordml" xmlns:w16du="http://schemas.microsoft.com/office/word/2023/wordml/word16du" xmlns:w16sdtdh="http://schemas.microsoft.com/office/word/2020/wordml/sdtdatahash" xmlns:w16sdtfl="http://schemas.microsoft.com/office/word/2024/wordml/sdtformatlock" xmlns:w16se="http://schemas.microsoft.com/office/word/2015/wordml/symex" xmlns:wpg="http://schemas.microsoft.com/office/word/2010/wordprocessingGroup" xmlns:wpi="http://schemas.microsoft.com/office/word/2010/wordprocessingInk" xmlns:wne="http://schemas.microsoft.com/office/word/2006/wordml" xmlns:wps="http://schemas.microsoft.com/office/word/2010/wordprocessingShape" mc:Ignorable="w14 w15 w16se w16cid w16 w16cex w16sdtdh w16sdtfl w16du wp14">
   <w:p>
     <w:pPr>
       <w:pStyle w:val="Footer"/>
@@ -1305,7 +1176,7 @@
 </file>
 
 <file path=word/footer2.xml><?xml version="1.0" encoding="utf-8"?>
-<w:ftr xmlns:wpc="http://schemas.microsoft.com/office/word/2010/wordprocessingCanvas" xmlns:cx="http://schemas.microsoft.com/office/drawing/2014/chartex" xmlns:cx1="http://schemas.microsoft.com/office/drawing/2015/9/8/chartex" xmlns:cx2="http://schemas.microsoft.com/office/drawing/2015/10/21/chartex" xmlns:cx3="http://schemas.microsoft.com/office/drawing/2016/5/9/chartex" xmlns:cx4="http://schemas.microsoft.com/office/drawing/2016/5/10/chartex" xmlns:cx5="http://schemas.microsoft.com/office/drawing/2016/5/11/chartex" xmlns:cx6="http://schemas.microsoft.com/office/drawing/2016/5/12/chartex" xmlns:cx7="http://schemas.microsoft.com/office/drawing/2016/5/13/chartex" xmlns:cx8="http://schemas.microsoft.com/office/drawing/2016/5/14/chartex" xmlns:mc="http://schemas.openxmlformats.org/markup-compatibility/2006" xmlns:m="http://schemas.openxmlformats.org/officeDocument/2006/math" xmlns:aink="http://schemas.microsoft.com/office/drawing/2016/ink" xmlns:am3d="http://schemas.microsoft.com/office/drawing/2017/model3d" xmlns:oel="http://schemas.microsoft.com/office/2019/extlst" xmlns:r="http://schemas.openxmlformats.org/officeDocument/2006/relationships" xmlns:wp14="http://schemas.microsoft.com/office/word/2010/wordprocessingDrawing" xmlns:wp="http://schemas.openxmlformats.org/drawingml/2006/wordprocessingDrawing" xmlns:wpg="http://schemas.microsoft.com/office/word/2010/wordprocessingGroup" xmlns:wpi="http://schemas.microsoft.com/office/word/2010/wordprocessingInk" xmlns:wps="http://schemas.microsoft.com/office/word/2010/wordprocessingShape" xmlns:o="urn:schemas-microsoft-com:office:office" xmlns:v="urn:schemas-microsoft-com:vml" xmlns:w10="urn:schemas-microsoft-com:office:word" xmlns:w="http://schemas.openxmlformats.org/wordprocessingml/2006/main" xmlns:w14="http://schemas.microsoft.com/office/word/2010/wordml" xmlns:w15="http://schemas.microsoft.com/office/word/2012/wordml" xmlns:w16cex="http://schemas.microsoft.com/office/word/2018/wordml/cex" xmlns:w16cid="http://schemas.microsoft.com/office/word/2016/wordml/cid" xmlns:w16="http://schemas.microsoft.com/office/word/2018/wordml" xmlns:w16sdtdh="http://schemas.microsoft.com/office/word/2020/wordml/sdtdatahash" xmlns:w16sdtfl="http://schemas.microsoft.com/office/word/2024/wordml/sdtformatlock" xmlns:w16se="http://schemas.microsoft.com/office/word/2015/wordml/symex" xmlns:w16du="http://schemas.microsoft.com/office/word/2023/wordml/word16du" xmlns:wne="http://schemas.microsoft.com/office/word/2006/wordml" mc:Ignorable="w14 w15 w16se w16cid w16 w16cex w16sdtdh w16sdtfl w16du wp14">
+<w:ftr xmlns:wpc="http://schemas.microsoft.com/office/word/2010/wordprocessingCanvas" xmlns:cx="http://schemas.microsoft.com/office/drawing/2014/chartex" xmlns:cx1="http://schemas.microsoft.com/office/drawing/2015/9/8/chartex" xmlns:cx2="http://schemas.microsoft.com/office/drawing/2015/10/21/chartex" xmlns:cx3="http://schemas.microsoft.com/office/drawing/2016/5/9/chartex" xmlns:cx4="http://schemas.microsoft.com/office/drawing/2016/5/10/chartex" xmlns:cx5="http://schemas.microsoft.com/office/drawing/2016/5/11/chartex" xmlns:cx6="http://schemas.microsoft.com/office/drawing/2016/5/12/chartex" xmlns:cx7="http://schemas.microsoft.com/office/drawing/2016/5/13/chartex" xmlns:cx8="http://schemas.microsoft.com/office/drawing/2016/5/14/chartex" xmlns:mc="http://schemas.openxmlformats.org/markup-compatibility/2006" xmlns:aink="http://schemas.microsoft.com/office/drawing/2016/ink" xmlns:am3d="http://schemas.microsoft.com/office/drawing/2017/model3d" xmlns:o="urn:schemas-microsoft-com:office:office" xmlns:oel="http://schemas.microsoft.com/office/2019/extlst" xmlns:r="http://schemas.openxmlformats.org/officeDocument/2006/relationships" xmlns:m="http://schemas.openxmlformats.org/officeDocument/2006/math" xmlns:v="urn:schemas-microsoft-com:vml" xmlns:wp14="http://schemas.microsoft.com/office/word/2010/wordprocessingDrawing" xmlns:wp="http://schemas.openxmlformats.org/drawingml/2006/wordprocessingDrawing" xmlns:w10="urn:schemas-microsoft-com:office:word" xmlns:w="http://schemas.openxmlformats.org/wordprocessingml/2006/main" xmlns:w14="http://schemas.microsoft.com/office/word/2010/wordml" xmlns:w15="http://schemas.microsoft.com/office/word/2012/wordml" xmlns:w16cei="http://schemas.microsoft.com/office/word/2026/wordml/cei" xmlns:w16cex="http://schemas.microsoft.com/office/word/2018/wordml/cex" xmlns:w16cid="http://schemas.microsoft.com/office/word/2016/wordml/cid" xmlns:w16="http://schemas.microsoft.com/office/word/2018/wordml" xmlns:w16du="http://schemas.microsoft.com/office/word/2023/wordml/word16du" xmlns:w16sdtdh="http://schemas.microsoft.com/office/word/2020/wordml/sdtdatahash" xmlns:w16sdtfl="http://schemas.microsoft.com/office/word/2024/wordml/sdtformatlock" xmlns:w16se="http://schemas.microsoft.com/office/word/2015/wordml/symex" xmlns:wpg="http://schemas.microsoft.com/office/word/2010/wordprocessingGroup" xmlns:wpi="http://schemas.microsoft.com/office/word/2010/wordprocessingInk" xmlns:wne="http://schemas.microsoft.com/office/word/2006/wordml" xmlns:wps="http://schemas.microsoft.com/office/word/2010/wordprocessingShape" mc:Ignorable="w14 w15 w16se w16cid w16 w16cex w16sdtdh w16sdtfl w16du wp14">
   <w:p>
     <w:pPr>
       <w:tabs>
@@ -1324,7 +1195,7 @@
 </file>
 
 <file path=word/footnotes.xml><?xml version="1.0" encoding="utf-8"?>
-<w:footnotes xmlns:wpc="http://schemas.microsoft.com/office/word/2010/wordprocessingCanvas" xmlns:cx="http://schemas.microsoft.com/office/drawing/2014/chartex" xmlns:cx1="http://schemas.microsoft.com/office/drawing/2015/9/8/chartex" xmlns:cx2="http://schemas.microsoft.com/office/drawing/2015/10/21/chartex" xmlns:cx3="http://schemas.microsoft.com/office/drawing/2016/5/9/chartex" xmlns:cx4="http://schemas.microsoft.com/office/drawing/2016/5/10/chartex" xmlns:cx5="http://schemas.microsoft.com/office/drawing/2016/5/11/chartex" xmlns:cx6="http://schemas.microsoft.com/office/drawing/2016/5/12/chartex" xmlns:cx7="http://schemas.microsoft.com/office/drawing/2016/5/13/chartex" xmlns:cx8="http://schemas.microsoft.com/office/drawing/2016/5/14/chartex" xmlns:mc="http://schemas.openxmlformats.org/markup-compatibility/2006" xmlns:m="http://schemas.openxmlformats.org/officeDocument/2006/math" xmlns:aink="http://schemas.microsoft.com/office/drawing/2016/ink" xmlns:am3d="http://schemas.microsoft.com/office/drawing/2017/model3d" xmlns:oel="http://schemas.microsoft.com/office/2019/extlst" xmlns:r="http://schemas.openxmlformats.org/officeDocument/2006/relationships" xmlns:wp14="http://schemas.microsoft.com/office/word/2010/wordprocessingDrawing" xmlns:wp="http://schemas.openxmlformats.org/drawingml/2006/wordprocessingDrawing" xmlns:wpg="http://schemas.microsoft.com/office/word/2010/wordprocessingGroup" xmlns:wpi="http://schemas.microsoft.com/office/word/2010/wordprocessingInk" xmlns:wps="http://schemas.microsoft.com/office/word/2010/wordprocessingShape" xmlns:o="urn:schemas-microsoft-com:office:office" xmlns:v="urn:schemas-microsoft-com:vml" xmlns:w10="urn:schemas-microsoft-com:office:word" xmlns:w="http://schemas.openxmlformats.org/wordprocessingml/2006/main" xmlns:w14="http://schemas.microsoft.com/office/word/2010/wordml" xmlns:w15="http://schemas.microsoft.com/office/word/2012/wordml" xmlns:w16cex="http://schemas.microsoft.com/office/word/2018/wordml/cex" xmlns:w16cid="http://schemas.microsoft.com/office/word/2016/wordml/cid" xmlns:w16="http://schemas.microsoft.com/office/word/2018/wordml" xmlns:w16sdtdh="http://schemas.microsoft.com/office/word/2020/wordml/sdtdatahash" xmlns:w16sdtfl="http://schemas.microsoft.com/office/word/2024/wordml/sdtformatlock" xmlns:w16se="http://schemas.microsoft.com/office/word/2015/wordml/symex" xmlns:w16du="http://schemas.microsoft.com/office/word/2023/wordml/word16du" xmlns:wne="http://schemas.microsoft.com/office/word/2006/wordml" mc:Ignorable="w14 w15 w16se w16cid w16 w16cex w16sdtdh w16sdtfl w16du wp14">
+<w:footnotes xmlns:wpc="http://schemas.microsoft.com/office/word/2010/wordprocessingCanvas" xmlns:cx="http://schemas.microsoft.com/office/drawing/2014/chartex" xmlns:cx1="http://schemas.microsoft.com/office/drawing/2015/9/8/chartex" xmlns:cx2="http://schemas.microsoft.com/office/drawing/2015/10/21/chartex" xmlns:cx3="http://schemas.microsoft.com/office/drawing/2016/5/9/chartex" xmlns:cx4="http://schemas.microsoft.com/office/drawing/2016/5/10/chartex" xmlns:cx5="http://schemas.microsoft.com/office/drawing/2016/5/11/chartex" xmlns:cx6="http://schemas.microsoft.com/office/drawing/2016/5/12/chartex" xmlns:cx7="http://schemas.microsoft.com/office/drawing/2016/5/13/chartex" xmlns:cx8="http://schemas.microsoft.com/office/drawing/2016/5/14/chartex" xmlns:mc="http://schemas.openxmlformats.org/markup-compatibility/2006" xmlns:aink="http://schemas.microsoft.com/office/drawing/2016/ink" xmlns:am3d="http://schemas.microsoft.com/office/drawing/2017/model3d" xmlns:o="urn:schemas-microsoft-com:office:office" xmlns:oel="http://schemas.microsoft.com/office/2019/extlst" xmlns:r="http://schemas.openxmlformats.org/officeDocument/2006/relationships" xmlns:m="http://schemas.openxmlformats.org/officeDocument/2006/math" xmlns:v="urn:schemas-microsoft-com:vml" xmlns:wp14="http://schemas.microsoft.com/office/word/2010/wordprocessingDrawing" xmlns:wp="http://schemas.openxmlformats.org/drawingml/2006/wordprocessingDrawing" xmlns:w10="urn:schemas-microsoft-com:office:word" xmlns:w="http://schemas.openxmlformats.org/wordprocessingml/2006/main" xmlns:w14="http://schemas.microsoft.com/office/word/2010/wordml" xmlns:w15="http://schemas.microsoft.com/office/word/2012/wordml" xmlns:w16cei="http://schemas.microsoft.com/office/word/2026/wordml/cei" xmlns:w16cex="http://schemas.microsoft.com/office/word/2018/wordml/cex" xmlns:w16cid="http://schemas.microsoft.com/office/word/2016/wordml/cid" xmlns:w16="http://schemas.microsoft.com/office/word/2018/wordml" xmlns:w16du="http://schemas.microsoft.com/office/word/2023/wordml/word16du" xmlns:w16sdtdh="http://schemas.microsoft.com/office/word/2020/wordml/sdtdatahash" xmlns:w16sdtfl="http://schemas.microsoft.com/office/word/2024/wordml/sdtformatlock" xmlns:w16se="http://schemas.microsoft.com/office/word/2015/wordml/symex" xmlns:wpg="http://schemas.microsoft.com/office/word/2010/wordprocessingGroup" xmlns:wpi="http://schemas.microsoft.com/office/word/2010/wordprocessingInk" xmlns:wne="http://schemas.microsoft.com/office/word/2006/wordml" xmlns:wps="http://schemas.microsoft.com/office/word/2010/wordprocessingShape" mc:Ignorable="w14 w15 w16se w16cid w16 w16cex w16sdtdh w16sdtfl w16du wp14">
   <w:footnote w:type="separator" w:id="-1">
     <w:p>
       <w:r>
@@ -1343,7 +1214,7 @@
 </file>
 
 <file path=word/header1.xml><?xml version="1.0" encoding="utf-8"?>
-<w:hdr xmlns:wpc="http://schemas.microsoft.com/office/word/2010/wordprocessingCanvas" xmlns:cx="http://schemas.microsoft.com/office/drawing/2014/chartex" xmlns:cx1="http://schemas.microsoft.com/office/drawing/2015/9/8/chartex" xmlns:cx2="http://schemas.microsoft.com/office/drawing/2015/10/21/chartex" xmlns:cx3="http://schemas.microsoft.com/office/drawing/2016/5/9/chartex" xmlns:cx4="http://schemas.microsoft.com/office/drawing/2016/5/10/chartex" xmlns:cx5="http://schemas.microsoft.com/office/drawing/2016/5/11/chartex" xmlns:cx6="http://schemas.microsoft.com/office/drawing/2016/5/12/chartex" xmlns:cx7="http://schemas.microsoft.com/office/drawing/2016/5/13/chartex" xmlns:cx8="http://schemas.microsoft.com/office/drawing/2016/5/14/chartex" xmlns:mc="http://schemas.openxmlformats.org/markup-compatibility/2006" xmlns:m="http://schemas.openxmlformats.org/officeDocument/2006/math" xmlns:aink="http://schemas.microsoft.com/office/drawing/2016/ink" xmlns:am3d="http://schemas.microsoft.com/office/drawing/2017/model3d" xmlns:oel="http://schemas.microsoft.com/office/2019/extlst" xmlns:r="http://schemas.openxmlformats.org/officeDocument/2006/relationships" xmlns:wp14="http://schemas.microsoft.com/office/word/2010/wordprocessingDrawing" xmlns:wp="http://schemas.openxmlformats.org/drawingml/2006/wordprocessingDrawing" xmlns:wpg="http://schemas.microsoft.com/office/word/2010/wordprocessingGroup" xmlns:wpi="http://schemas.microsoft.com/office/word/2010/wordprocessingInk" xmlns:wps="http://schemas.microsoft.com/office/word/2010/wordprocessingShape" xmlns:o="urn:schemas-microsoft-com:office:office" xmlns:v="urn:schemas-microsoft-com:vml" xmlns:w10="urn:schemas-microsoft-com:office:word" xmlns:w="http://schemas.openxmlformats.org/wordprocessingml/2006/main" xmlns:w14="http://schemas.microsoft.com/office/word/2010/wordml" xmlns:w15="http://schemas.microsoft.com/office/word/2012/wordml" xmlns:w16cex="http://schemas.microsoft.com/office/word/2018/wordml/cex" xmlns:w16cid="http://schemas.microsoft.com/office/word/2016/wordml/cid" xmlns:w16="http://schemas.microsoft.com/office/word/2018/wordml" xmlns:w16sdtdh="http://schemas.microsoft.com/office/word/2020/wordml/sdtdatahash" xmlns:w16sdtfl="http://schemas.microsoft.com/office/word/2024/wordml/sdtformatlock" xmlns:w16se="http://schemas.microsoft.com/office/word/2015/wordml/symex" xmlns:w16du="http://schemas.microsoft.com/office/word/2023/wordml/word16du" xmlns:wne="http://schemas.microsoft.com/office/word/2006/wordml" mc:Ignorable="w14 w15 w16se w16cid w16 w16cex w16sdtdh w16sdtfl w16du wp14">
+<w:hdr xmlns:wpc="http://schemas.microsoft.com/office/word/2010/wordprocessingCanvas" xmlns:cx="http://schemas.microsoft.com/office/drawing/2014/chartex" xmlns:cx1="http://schemas.microsoft.com/office/drawing/2015/9/8/chartex" xmlns:cx2="http://schemas.microsoft.com/office/drawing/2015/10/21/chartex" xmlns:cx3="http://schemas.microsoft.com/office/drawing/2016/5/9/chartex" xmlns:cx4="http://schemas.microsoft.com/office/drawing/2016/5/10/chartex" xmlns:cx5="http://schemas.microsoft.com/office/drawing/2016/5/11/chartex" xmlns:cx6="http://schemas.microsoft.com/office/drawing/2016/5/12/chartex" xmlns:cx7="http://schemas.microsoft.com/office/drawing/2016/5/13/chartex" xmlns:cx8="http://schemas.microsoft.com/office/drawing/2016/5/14/chartex" xmlns:mc="http://schemas.openxmlformats.org/markup-compatibility/2006" xmlns:aink="http://schemas.microsoft.com/office/drawing/2016/ink" xmlns:am3d="http://schemas.microsoft.com/office/drawing/2017/model3d" xmlns:o="urn:schemas-microsoft-com:office:office" xmlns:oel="http://schemas.microsoft.com/office/2019/extlst" xmlns:r="http://schemas.openxmlformats.org/officeDocument/2006/relationships" xmlns:m="http://schemas.openxmlformats.org/officeDocument/2006/math" xmlns:v="urn:schemas-microsoft-com:vml" xmlns:wp14="http://schemas.microsoft.com/office/word/2010/wordprocessingDrawing" xmlns:wp="http://schemas.openxmlformats.org/drawingml/2006/wordprocessingDrawing" xmlns:w10="urn:schemas-microsoft-com:office:word" xmlns:w="http://schemas.openxmlformats.org/wordprocessingml/2006/main" xmlns:w14="http://schemas.microsoft.com/office/word/2010/wordml" xmlns:w15="http://schemas.microsoft.com/office/word/2012/wordml" xmlns:w16cei="http://schemas.microsoft.com/office/word/2026/wordml/cei" xmlns:w16cex="http://schemas.microsoft.com/office/word/2018/wordml/cex" xmlns:w16cid="http://schemas.microsoft.com/office/word/2016/wordml/cid" xmlns:w16="http://schemas.microsoft.com/office/word/2018/wordml" xmlns:w16du="http://schemas.microsoft.com/office/word/2023/wordml/word16du" xmlns:w16sdtdh="http://schemas.microsoft.com/office/word/2020/wordml/sdtdatahash" xmlns:w16sdtfl="http://schemas.microsoft.com/office/word/2024/wordml/sdtformatlock" xmlns:w16se="http://schemas.microsoft.com/office/word/2015/wordml/symex" xmlns:wpg="http://schemas.microsoft.com/office/word/2010/wordprocessingGroup" xmlns:wpi="http://schemas.microsoft.com/office/word/2010/wordprocessingInk" xmlns:wne="http://schemas.microsoft.com/office/word/2006/wordml" xmlns:wps="http://schemas.microsoft.com/office/word/2010/wordprocessingShape" mc:Ignorable="w14 w15 w16se w16cid w16 w16cex w16sdtdh w16sdtfl w16du wp14">
   <w:p>
     <w:pPr>
       <w:pStyle w:val="Header"/>
@@ -1373,7 +1244,7 @@
 </file>
 
 <file path=word/header2.xml><?xml version="1.0" encoding="utf-8"?>
-<w:hdr xmlns:wpc="http://schemas.microsoft.com/office/word/2010/wordprocessingCanvas" xmlns:cx="http://schemas.microsoft.com/office/drawing/2014/chartex" xmlns:cx1="http://schemas.microsoft.com/office/drawing/2015/9/8/chartex" xmlns:cx2="http://schemas.microsoft.com/office/drawing/2015/10/21/chartex" xmlns:cx3="http://schemas.microsoft.com/office/drawing/2016/5/9/chartex" xmlns:cx4="http://schemas.microsoft.com/office/drawing/2016/5/10/chartex" xmlns:cx5="http://schemas.microsoft.com/office/drawing/2016/5/11/chartex" xmlns:cx6="http://schemas.microsoft.com/office/drawing/2016/5/12/chartex" xmlns:cx7="http://schemas.microsoft.com/office/drawing/2016/5/13/chartex" xmlns:cx8="http://schemas.microsoft.com/office/drawing/2016/5/14/chartex" xmlns:mc="http://schemas.openxmlformats.org/markup-compatibility/2006" xmlns:m="http://schemas.openxmlformats.org/officeDocument/2006/math" xmlns:aink="http://schemas.microsoft.com/office/drawing/2016/ink" xmlns:am3d="http://schemas.microsoft.com/office/drawing/2017/model3d" xmlns:oel="http://schemas.microsoft.com/office/2019/extlst" xmlns:r="http://schemas.openxmlformats.org/officeDocument/2006/relationships" xmlns:wp14="http://schemas.microsoft.com/office/word/2010/wordprocessingDrawing" xmlns:wp="http://schemas.openxmlformats.org/drawingml/2006/wordprocessingDrawing" xmlns:wpg="http://schemas.microsoft.com/office/word/2010/wordprocessingGroup" xmlns:wpi="http://schemas.microsoft.com/office/word/2010/wordprocessingInk" xmlns:wps="http://schemas.microsoft.com/office/word/2010/wordprocessingShape" xmlns:o="urn:schemas-microsoft-com:office:office" xmlns:v="urn:schemas-microsoft-com:vml" xmlns:w10="urn:schemas-microsoft-com:office:word" xmlns:w="http://schemas.openxmlformats.org/wordprocessingml/2006/main" xmlns:w14="http://schemas.microsoft.com/office/word/2010/wordml" xmlns:w15="http://schemas.microsoft.com/office/word/2012/wordml" xmlns:w16cex="http://schemas.microsoft.com/office/word/2018/wordml/cex" xmlns:w16cid="http://schemas.microsoft.com/office/word/2016/wordml/cid" xmlns:w16="http://schemas.microsoft.com/office/word/2018/wordml" xmlns:w16sdtdh="http://schemas.microsoft.com/office/word/2020/wordml/sdtdatahash" xmlns:w16sdtfl="http://schemas.microsoft.com/office/word/2024/wordml/sdtformatlock" xmlns:w16se="http://schemas.microsoft.com/office/word/2015/wordml/symex" xmlns:w16du="http://schemas.microsoft.com/office/word/2023/wordml/word16du" xmlns:wne="http://schemas.microsoft.com/office/word/2006/wordml" mc:Ignorable="w14 w15 w16se w16cid w16 w16cex w16sdtdh w16sdtfl w16du wp14">
+<w:hdr xmlns:wpc="http://schemas.microsoft.com/office/word/2010/wordprocessingCanvas" xmlns:cx="http://schemas.microsoft.com/office/drawing/2014/chartex" xmlns:cx1="http://schemas.microsoft.com/office/drawing/2015/9/8/chartex" xmlns:cx2="http://schemas.microsoft.com/office/drawing/2015/10/21/chartex" xmlns:cx3="http://schemas.microsoft.com/office/drawing/2016/5/9/chartex" xmlns:cx4="http://schemas.microsoft.com/office/drawing/2016/5/10/chartex" xmlns:cx5="http://schemas.microsoft.com/office/drawing/2016/5/11/chartex" xmlns:cx6="http://schemas.microsoft.com/office/drawing/2016/5/12/chartex" xmlns:cx7="http://schemas.microsoft.com/office/drawing/2016/5/13/chartex" xmlns:cx8="http://schemas.microsoft.com/office/drawing/2016/5/14/chartex" xmlns:mc="http://schemas.openxmlformats.org/markup-compatibility/2006" xmlns:aink="http://schemas.microsoft.com/office/drawing/2016/ink" xmlns:am3d="http://schemas.microsoft.com/office/drawing/2017/model3d" xmlns:o="urn:schemas-microsoft-com:office:office" xmlns:oel="http://schemas.microsoft.com/office/2019/extlst" xmlns:r="http://schemas.openxmlformats.org/officeDocument/2006/relationships" xmlns:m="http://schemas.openxmlformats.org/officeDocument/2006/math" xmlns:v="urn:schemas-microsoft-com:vml" xmlns:wp14="http://schemas.microsoft.com/office/word/2010/wordprocessingDrawing" xmlns:wp="http://schemas.openxmlformats.org/drawingml/2006/wordprocessingDrawing" xmlns:w10="urn:schemas-microsoft-com:office:word" xmlns:w="http://schemas.openxmlformats.org/wordprocessingml/2006/main" xmlns:w14="http://schemas.microsoft.com/office/word/2010/wordml" xmlns:w15="http://schemas.microsoft.com/office/word/2012/wordml" xmlns:w16cei="http://schemas.microsoft.com/office/word/2026/wordml/cei" xmlns:w16cex="http://schemas.microsoft.com/office/word/2018/wordml/cex" xmlns:w16cid="http://schemas.microsoft.com/office/word/2016/wordml/cid" xmlns:w16="http://schemas.microsoft.com/office/word/2018/wordml" xmlns:w16du="http://schemas.microsoft.com/office/word/2023/wordml/word16du" xmlns:w16sdtdh="http://schemas.microsoft.com/office/word/2020/wordml/sdtdatahash" xmlns:w16sdtfl="http://schemas.microsoft.com/office/word/2024/wordml/sdtformatlock" xmlns:w16se="http://schemas.microsoft.com/office/word/2015/wordml/symex" xmlns:wpg="http://schemas.microsoft.com/office/word/2010/wordprocessingGroup" xmlns:wpi="http://schemas.microsoft.com/office/word/2010/wordprocessingInk" xmlns:wne="http://schemas.microsoft.com/office/word/2006/wordml" xmlns:wps="http://schemas.microsoft.com/office/word/2010/wordprocessingShape" mc:Ignorable="w14 w15 w16se w16cid w16 w16cex w16sdtdh w16sdtfl w16du wp14">
   <w:p>
     <w:pPr>
       <w:pStyle w:val="Header"/>
@@ -1514,7 +1385,7 @@
             </wp:anchor>
           </w:drawing>
         </mc:Choice>
-        <mc:Fallback xmlns:w16cei="http://schemas.microsoft.com/office/word/2026/wordml/cei">
+        <mc:Fallback>
           <w:pict>
             <v:shapetype w14:anchorId="6DE74C12" id="_x0000_t202" coordsize="21600,21600" o:spt="202" path="m,l,21600r21600,l21600,xe">
               <v:stroke joinstyle="miter"/>
@@ -1721,7 +1592,7 @@
 </file>
 
 <file path=word/numbering.xml><?xml version="1.0" encoding="utf-8"?>
-<w:numbering xmlns:wpc="http://schemas.microsoft.com/office/word/2010/wordprocessingCanvas" xmlns:cx="http://schemas.microsoft.com/office/drawing/2014/chartex" xmlns:cx1="http://schemas.microsoft.com/office/drawing/2015/9/8/chartex" xmlns:cx2="http://schemas.microsoft.com/office/drawing/2015/10/21/chartex" xmlns:cx3="http://schemas.microsoft.com/office/drawing/2016/5/9/chartex" xmlns:cx4="http://schemas.microsoft.com/office/drawing/2016/5/10/chartex" xmlns:cx5="http://schemas.microsoft.com/office/drawing/2016/5/11/chartex" xmlns:cx6="http://schemas.microsoft.com/office/drawing/2016/5/12/chartex" xmlns:cx7="http://schemas.microsoft.com/office/drawing/2016/5/13/chartex" xmlns:cx8="http://schemas.microsoft.com/office/drawing/2016/5/14/chartex" xmlns:mc="http://schemas.openxmlformats.org/markup-compatibility/2006" xmlns:m="http://schemas.openxmlformats.org/officeDocument/2006/math" xmlns:aink="http://schemas.microsoft.com/office/drawing/2016/ink" xmlns:am3d="http://schemas.microsoft.com/office/drawing/2017/model3d" xmlns:oel="http://schemas.microsoft.com/office/2019/extlst" xmlns:r="http://schemas.openxmlformats.org/officeDocument/2006/relationships" xmlns:wp14="http://schemas.microsoft.com/office/word/2010/wordprocessingDrawing" xmlns:wp="http://schemas.openxmlformats.org/drawingml/2006/wordprocessingDrawing" xmlns:wpg="http://schemas.microsoft.com/office/word/2010/wordprocessingGroup" xmlns:wpi="http://schemas.microsoft.com/office/word/2010/wordprocessingInk" xmlns:wps="http://schemas.microsoft.com/office/word/2010/wordprocessingShape" xmlns:o="urn:schemas-microsoft-com:office:office" xmlns:v="urn:schemas-microsoft-com:vml" xmlns:w10="urn:schemas-microsoft-com:office:word" xmlns:w="http://schemas.openxmlformats.org/wordprocessingml/2006/main" xmlns:w14="http://schemas.microsoft.com/office/word/2010/wordml" xmlns:w15="http://schemas.microsoft.com/office/word/2012/wordml" xmlns:w16cex="http://schemas.microsoft.com/office/word/2018/wordml/cex" xmlns:w16cid="http://schemas.microsoft.com/office/word/2016/wordml/cid" xmlns:w16="http://schemas.microsoft.com/office/word/2018/wordml" xmlns:w16sdtdh="http://schemas.microsoft.com/office/word/2020/wordml/sdtdatahash" xmlns:w16sdtfl="http://schemas.microsoft.com/office/word/2024/wordml/sdtformatlock" xmlns:w16se="http://schemas.microsoft.com/office/word/2015/wordml/symex" xmlns:w16du="http://schemas.microsoft.com/office/word/2023/wordml/word16du" xmlns:wne="http://schemas.microsoft.com/office/word/2006/wordml" mc:Ignorable="w14 w15 w16se w16cid w16 w16cex w16sdtdh w16sdtfl w16du wp14">
+<w:numbering xmlns:wpc="http://schemas.microsoft.com/office/word/2010/wordprocessingCanvas" xmlns:cx="http://schemas.microsoft.com/office/drawing/2014/chartex" xmlns:cx1="http://schemas.microsoft.com/office/drawing/2015/9/8/chartex" xmlns:cx2="http://schemas.microsoft.com/office/drawing/2015/10/21/chartex" xmlns:cx3="http://schemas.microsoft.com/office/drawing/2016/5/9/chartex" xmlns:cx4="http://schemas.microsoft.com/office/drawing/2016/5/10/chartex" xmlns:cx5="http://schemas.microsoft.com/office/drawing/2016/5/11/chartex" xmlns:cx6="http://schemas.microsoft.com/office/drawing/2016/5/12/chartex" xmlns:cx7="http://schemas.microsoft.com/office/drawing/2016/5/13/chartex" xmlns:cx8="http://schemas.microsoft.com/office/drawing/2016/5/14/chartex" xmlns:mc="http://schemas.openxmlformats.org/markup-compatibility/2006" xmlns:aink="http://schemas.microsoft.com/office/drawing/2016/ink" xmlns:am3d="http://schemas.microsoft.com/office/drawing/2017/model3d" xmlns:o="urn:schemas-microsoft-com:office:office" xmlns:oel="http://schemas.microsoft.com/office/2019/extlst" xmlns:r="http://schemas.openxmlformats.org/officeDocument/2006/relationships" xmlns:m="http://schemas.openxmlformats.org/officeDocument/2006/math" xmlns:v="urn:schemas-microsoft-com:vml" xmlns:wp14="http://schemas.microsoft.com/office/word/2010/wordprocessingDrawing" xmlns:wp="http://schemas.openxmlformats.org/drawingml/2006/wordprocessingDrawing" xmlns:w10="urn:schemas-microsoft-com:office:word" xmlns:w="http://schemas.openxmlformats.org/wordprocessingml/2006/main" xmlns:w14="http://schemas.microsoft.com/office/word/2010/wordml" xmlns:w15="http://schemas.microsoft.com/office/word/2012/wordml" xmlns:w16cei="http://schemas.microsoft.com/office/word/2026/wordml/cei" xmlns:w16cex="http://schemas.microsoft.com/office/word/2018/wordml/cex" xmlns:w16cid="http://schemas.microsoft.com/office/word/2016/wordml/cid" xmlns:w16="http://schemas.microsoft.com/office/word/2018/wordml" xmlns:w16du="http://schemas.microsoft.com/office/word/2023/wordml/word16du" xmlns:w16sdtdh="http://schemas.microsoft.com/office/word/2020/wordml/sdtdatahash" xmlns:w16sdtfl="http://schemas.microsoft.com/office/word/2024/wordml/sdtformatlock" xmlns:w16se="http://schemas.microsoft.com/office/word/2015/wordml/symex" xmlns:wpg="http://schemas.microsoft.com/office/word/2010/wordprocessingGroup" xmlns:wpi="http://schemas.microsoft.com/office/word/2010/wordprocessingInk" xmlns:wne="http://schemas.microsoft.com/office/word/2006/wordml" xmlns:wps="http://schemas.microsoft.com/office/word/2010/wordprocessingShape" mc:Ignorable="w14 w15 w16se w16cid w16 w16cex w16sdtdh w16sdtfl w16du wp14">
   <w:abstractNum w:abstractNumId="0" w15:restartNumberingAfterBreak="0">
     <w:nsid w:val="061B5C9E"/>
     <w:multiLevelType w:val="hybridMultilevel"/>
@@ -2568,7 +2439,7 @@
 </file>
 
 <file path=word/styles.xml><?xml version="1.0" encoding="utf-8"?>
-<w:styles xmlns:mc="http://schemas.openxmlformats.org/markup-compatibility/2006" xmlns:r="http://schemas.openxmlformats.org/officeDocument/2006/relationships" xmlns:w="http://schemas.openxmlformats.org/wordprocessingml/2006/main" xmlns:w14="http://schemas.microsoft.com/office/word/2010/wordml" xmlns:w15="http://schemas.microsoft.com/office/word/2012/wordml" xmlns:w16cex="http://schemas.microsoft.com/office/word/2018/wordml/cex" xmlns:w16cid="http://schemas.microsoft.com/office/word/2016/wordml/cid" xmlns:w16="http://schemas.microsoft.com/office/word/2018/wordml" xmlns:w16sdtdh="http://schemas.microsoft.com/office/word/2020/wordml/sdtdatahash" xmlns:w16sdtfl="http://schemas.microsoft.com/office/word/2024/wordml/sdtformatlock" xmlns:w16se="http://schemas.microsoft.com/office/word/2015/wordml/symex" xmlns:w16du="http://schemas.microsoft.com/office/word/2023/wordml/word16du" mc:Ignorable="w14 w15 w16se w16cid w16 w16cex w16sdtdh w16sdtfl w16du">
+<w:styles xmlns:mc="http://schemas.openxmlformats.org/markup-compatibility/2006" xmlns:r="http://schemas.openxmlformats.org/officeDocument/2006/relationships" xmlns:w="http://schemas.openxmlformats.org/wordprocessingml/2006/main" xmlns:w14="http://schemas.microsoft.com/office/word/2010/wordml" xmlns:w15="http://schemas.microsoft.com/office/word/2012/wordml" xmlns:w16cex="http://schemas.microsoft.com/office/word/2018/wordml/cex" xmlns:w16cid="http://schemas.microsoft.com/office/word/2016/wordml/cid" xmlns:w16="http://schemas.microsoft.com/office/word/2018/wordml" xmlns:w16du="http://schemas.microsoft.com/office/word/2023/wordml/word16du" xmlns:w16sdtdh="http://schemas.microsoft.com/office/word/2020/wordml/sdtdatahash" xmlns:w16sdtfl="http://schemas.microsoft.com/office/word/2024/wordml/sdtformatlock" xmlns:w16se="http://schemas.microsoft.com/office/word/2015/wordml/symex" mc:Ignorable="w14 w15 w16se w16cid w16 w16cex w16sdtdh w16sdtfl w16du">
   <w:docDefaults>
     <w:rPrDefault>
       <w:rPr>
@@ -3742,7 +3613,12 @@
 </file>
 
 <file path=customXml/item1.xml><?xml version="1.0" encoding="utf-8"?>
-<b:Sources xmlns:b="http://schemas.openxmlformats.org/officeDocument/2006/bibliography" xmlns="http://schemas.openxmlformats.org/officeDocument/2006/bibliography" SelectedStyle="\APA.XSL" StyleName="APA"/>
+<?mso-contentType ?>
+<FormTemplates xmlns="http://schemas.microsoft.com/sharepoint/v3/contenttype/forms">
+  <Display>DocumentLibraryForm</Display>
+  <Edit>DocumentLibraryForm</Edit>
+  <New>DocumentLibraryForm</New>
+</FormTemplates>
 </file>
 
 <file path=customXml/item2.xml><?xml version="1.0" encoding="utf-8"?>
@@ -3759,12 +3635,7 @@
 </file>
 
 <file path=customXml/item3.xml><?xml version="1.0" encoding="utf-8"?>
-<?mso-contentType ?>
-<FormTemplates xmlns="http://schemas.microsoft.com/sharepoint/v3/contenttype/forms">
-  <Display>DocumentLibraryForm</Display>
-  <Edit>DocumentLibraryForm</Edit>
-  <New>DocumentLibraryForm</New>
-</FormTemplates>
+<b:Sources xmlns:b="http://schemas.openxmlformats.org/officeDocument/2006/bibliography" xmlns="http://schemas.openxmlformats.org/officeDocument/2006/bibliography" SelectedStyle="\APA.XSL" StyleName="APA"/>
 </file>
 
 <file path=customXml/item4.xml><?xml version="1.0" encoding="utf-8"?>
@@ -4014,9 +3885,9 @@
 </file>
 
 <file path=customXml/itemProps1.xml><?xml version="1.0" encoding="utf-8"?>
-<ds:datastoreItem xmlns:ds="http://schemas.openxmlformats.org/officeDocument/2006/customXml" ds:itemID="{4202E056-596C-4D43-866F-DBCC294656E0}">
+<ds:datastoreItem xmlns:ds="http://schemas.openxmlformats.org/officeDocument/2006/customXml" ds:itemID="{2ACA00A0-0EB9-4F25-B1A0-9480A1DEA0B5}">
   <ds:schemaRefs>
-    <ds:schemaRef ds:uri="http://schemas.openxmlformats.org/officeDocument/2006/bibliography"/>
+    <ds:schemaRef ds:uri="http://schemas.microsoft.com/sharepoint/v3/contenttype/forms"/>
   </ds:schemaRefs>
 </ds:datastoreItem>
 </file>
@@ -4034,9 +3905,9 @@
 </file>
 
 <file path=customXml/itemProps3.xml><?xml version="1.0" encoding="utf-8"?>
-<ds:datastoreItem xmlns:ds="http://schemas.openxmlformats.org/officeDocument/2006/customXml" ds:itemID="{2ACA00A0-0EB9-4F25-B1A0-9480A1DEA0B5}">
+<ds:datastoreItem xmlns:ds="http://schemas.openxmlformats.org/officeDocument/2006/customXml" ds:itemID="{4202E056-596C-4D43-866F-DBCC294656E0}">
   <ds:schemaRefs>
-    <ds:schemaRef ds:uri="http://schemas.microsoft.com/sharepoint/v3/contenttype/forms"/>
+    <ds:schemaRef ds:uri="http://schemas.openxmlformats.org/officeDocument/2006/bibliography"/>
   </ds:schemaRefs>
 </ds:datastoreItem>
 </file>

</xml_diff>

<commit_message>
Fixed internal links on report to only display once per section.
</commit_message>
<xml_diff>
--- a/app/assets/default_template.docx
+++ b/app/assets/default_template.docx
@@ -1,6 +1,6 @@
 
 <file path=word/document.xml><?xml version="1.0" encoding="utf-8"?>
-<w:document xmlns:wpc="http://schemas.microsoft.com/office/word/2010/wordprocessingCanvas" xmlns:cx="http://schemas.microsoft.com/office/drawing/2014/chartex" xmlns:cx1="http://schemas.microsoft.com/office/drawing/2015/9/8/chartex" xmlns:cx2="http://schemas.microsoft.com/office/drawing/2015/10/21/chartex" xmlns:cx3="http://schemas.microsoft.com/office/drawing/2016/5/9/chartex" xmlns:cx4="http://schemas.microsoft.com/office/drawing/2016/5/10/chartex" xmlns:cx5="http://schemas.microsoft.com/office/drawing/2016/5/11/chartex" xmlns:cx6="http://schemas.microsoft.com/office/drawing/2016/5/12/chartex" xmlns:cx7="http://schemas.microsoft.com/office/drawing/2016/5/13/chartex" xmlns:cx8="http://schemas.microsoft.com/office/drawing/2016/5/14/chartex" xmlns:mc="http://schemas.openxmlformats.org/markup-compatibility/2006" xmlns:m="http://schemas.openxmlformats.org/officeDocument/2006/math" xmlns:aink="http://schemas.microsoft.com/office/drawing/2016/ink" xmlns:am3d="http://schemas.microsoft.com/office/drawing/2017/model3d" xmlns:oel="http://schemas.microsoft.com/office/2019/extlst" xmlns:r="http://schemas.openxmlformats.org/officeDocument/2006/relationships" xmlns:wp14="http://schemas.microsoft.com/office/word/2010/wordprocessingDrawing" xmlns:wp="http://schemas.openxmlformats.org/drawingml/2006/wordprocessingDrawing" xmlns:wpg="http://schemas.microsoft.com/office/word/2010/wordprocessingGroup" xmlns:wpi="http://schemas.microsoft.com/office/word/2010/wordprocessingInk" xmlns:wps="http://schemas.microsoft.com/office/word/2010/wordprocessingShape" xmlns:o="urn:schemas-microsoft-com:office:office" xmlns:v="urn:schemas-microsoft-com:vml" xmlns:w10="urn:schemas-microsoft-com:office:word" xmlns:w="http://schemas.openxmlformats.org/wordprocessingml/2006/main" xmlns:w14="http://schemas.microsoft.com/office/word/2010/wordml" xmlns:w15="http://schemas.microsoft.com/office/word/2012/wordml" xmlns:w16cex="http://schemas.microsoft.com/office/word/2018/wordml/cex" xmlns:w16cid="http://schemas.microsoft.com/office/word/2016/wordml/cid" xmlns:w16="http://schemas.microsoft.com/office/word/2018/wordml" xmlns:w16sdtdh="http://schemas.microsoft.com/office/word/2020/wordml/sdtdatahash" xmlns:w16sdtfl="http://schemas.microsoft.com/office/word/2024/wordml/sdtformatlock" xmlns:w16se="http://schemas.microsoft.com/office/word/2015/wordml/symex" xmlns:w16du="http://schemas.microsoft.com/office/word/2023/wordml/word16du" xmlns:wne="http://schemas.microsoft.com/office/word/2006/wordml" mc:Ignorable="w14 w15 w16se w16cid w16 w16cex w16sdtdh w16sdtfl w16du wp14">
+<w:document xmlns:wpc="http://schemas.microsoft.com/office/word/2010/wordprocessingCanvas" xmlns:cx="http://schemas.microsoft.com/office/drawing/2014/chartex" xmlns:cx1="http://schemas.microsoft.com/office/drawing/2015/9/8/chartex" xmlns:cx2="http://schemas.microsoft.com/office/drawing/2015/10/21/chartex" xmlns:cx3="http://schemas.microsoft.com/office/drawing/2016/5/9/chartex" xmlns:cx4="http://schemas.microsoft.com/office/drawing/2016/5/10/chartex" xmlns:cx5="http://schemas.microsoft.com/office/drawing/2016/5/11/chartex" xmlns:cx6="http://schemas.microsoft.com/office/drawing/2016/5/12/chartex" xmlns:cx7="http://schemas.microsoft.com/office/drawing/2016/5/13/chartex" xmlns:cx8="http://schemas.microsoft.com/office/drawing/2016/5/14/chartex" xmlns:mc="http://schemas.openxmlformats.org/markup-compatibility/2006" xmlns:aink="http://schemas.microsoft.com/office/drawing/2016/ink" xmlns:am3d="http://schemas.microsoft.com/office/drawing/2017/model3d" xmlns:o="urn:schemas-microsoft-com:office:office" xmlns:oel="http://schemas.microsoft.com/office/2019/extlst" xmlns:r="http://schemas.openxmlformats.org/officeDocument/2006/relationships" xmlns:m="http://schemas.openxmlformats.org/officeDocument/2006/math" xmlns:v="urn:schemas-microsoft-com:vml" xmlns:wp14="http://schemas.microsoft.com/office/word/2010/wordprocessingDrawing" xmlns:wp="http://schemas.openxmlformats.org/drawingml/2006/wordprocessingDrawing" xmlns:w10="urn:schemas-microsoft-com:office:word" xmlns:w="http://schemas.openxmlformats.org/wordprocessingml/2006/main" xmlns:w14="http://schemas.microsoft.com/office/word/2010/wordml" xmlns:w15="http://schemas.microsoft.com/office/word/2012/wordml" xmlns:w16cei="http://schemas.microsoft.com/office/word/2026/wordml/cei" xmlns:w16cex="http://schemas.microsoft.com/office/word/2018/wordml/cex" xmlns:w16cid="http://schemas.microsoft.com/office/word/2016/wordml/cid" xmlns:w16="http://schemas.microsoft.com/office/word/2018/wordml" xmlns:w16du="http://schemas.microsoft.com/office/word/2023/wordml/word16du" xmlns:w16sdtdh="http://schemas.microsoft.com/office/word/2020/wordml/sdtdatahash" xmlns:w16sdtfl="http://schemas.microsoft.com/office/word/2024/wordml/sdtformatlock" xmlns:w16se="http://schemas.microsoft.com/office/word/2015/wordml/symex" xmlns:wpg="http://schemas.microsoft.com/office/word/2010/wordprocessingGroup" xmlns:wpi="http://schemas.microsoft.com/office/word/2010/wordprocessingInk" xmlns:wne="http://schemas.microsoft.com/office/word/2006/wordml" xmlns:wps="http://schemas.microsoft.com/office/word/2010/wordprocessingShape" mc:Ignorable="w14 w15 w16se w16cid w16 w16cex w16sdtdh w16sdtfl w16du wp14">
   <w:body>
     <w:p>
       <w:pPr>
@@ -98,7 +98,7 @@
               </wp:anchor>
             </w:drawing>
           </mc:Choice>
-          <mc:Fallback xmlns:w16cei="http://schemas.microsoft.com/office/word/2026/wordml/cei">
+          <mc:Fallback>
             <w:pict>
               <v:group w14:anchorId="08AC1105" id="Group 11" o:spid="_x0000_s1026" style="position:absolute;margin-left:-18pt;margin-top:10.95pt;width:450pt;height:3.9pt;z-index:251659264" coordorigin="9906,7302" coordsize="68580,1080" o:gfxdata="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">
                 <v:line id="Straight Connector 8" o:spid="_x0000_s1027" style="position:absolute;visibility:visible;mso-wrap-style:square" from="9906,7302" to="78486,7302" o:connectortype="straight" o:gfxdata="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" strokecolor="#ffc000" strokeweight="6pt"/>
@@ -335,7 +335,189 @@
         <w:t>}}</w:t>
       </w:r>
     </w:p>
-    <w:p/>
+    <w:p>
+      <w:pPr>
+        <w:rPr>
+          <w:rFonts w:ascii="Arial" w:hAnsi="Arial" w:cs="Arial"/>
+          <w:lang w:bidi="en-US"/>
+        </w:rPr>
+      </w:pPr>
+    </w:p>
+    <w:p>
+      <w:pPr>
+        <w:rPr>
+          <w:rFonts w:ascii="Arial" w:hAnsi="Arial" w:cs="Arial"/>
+          <w:lang w:bidi="en-US"/>
+        </w:rPr>
+      </w:pPr>
+      <w:r>
+        <w:rPr>
+          <w:rFonts w:ascii="Arial" w:hAnsi="Arial" w:cs="Arial"/>
+          <w:lang w:bidi="en-US"/>
+        </w:rPr>
+        <w:t xml:space="preserve">{% for article in </w:t>
+      </w:r>
+      <w:proofErr w:type="gramStart"/>
+      <w:r>
+        <w:rPr>
+          <w:rFonts w:ascii="Arial" w:hAnsi="Arial" w:cs="Arial"/>
+          <w:lang w:bidi="en-US"/>
+        </w:rPr>
+        <w:t>section.articles</w:t>
+      </w:r>
+      <w:proofErr w:type="gramEnd"/>
+      <w:r>
+        <w:rPr>
+          <w:rFonts w:ascii="Arial" w:hAnsi="Arial" w:cs="Arial"/>
+          <w:lang w:bidi="en-US"/>
+        </w:rPr>
+        <w:t xml:space="preserve"> %}</w:t>
+      </w:r>
+    </w:p>
+    <w:p>
+      <w:pPr>
+        <w:rPr>
+          <w:rFonts w:ascii="Arial" w:hAnsi="Arial" w:cs="Arial"/>
+          <w:color w:val="000000" w:themeColor="text1"/>
+          <w:sz w:val="20"/>
+          <w:szCs w:val="20"/>
+          <w:lang w:bidi="en-US"/>
+        </w:rPr>
+      </w:pPr>
+      <w:r>
+        <w:rPr>
+          <w:rFonts w:ascii="Arial" w:hAnsi="Arial" w:cs="Arial"/>
+          <w:color w:val="000000" w:themeColor="text1"/>
+          <w:sz w:val="20"/>
+          <w:szCs w:val="20"/>
+          <w:lang w:bidi="en-US"/>
+        </w:rPr>
+        <w:t>{{</w:t>
+      </w:r>
+      <w:r>
+        <w:rPr>
+          <w:rFonts w:ascii="Arial" w:hAnsi="Arial" w:cs="Arial"/>
+          <w:color w:val="000000" w:themeColor="text1"/>
+          <w:sz w:val="20"/>
+          <w:szCs w:val="20"/>
+          <w:lang w:bidi="en-US"/>
+        </w:rPr>
+        <w:t xml:space="preserve">r </w:t>
+      </w:r>
+      <w:r>
+        <w:rPr>
+          <w:rFonts w:ascii="Arial" w:hAnsi="Arial" w:cs="Arial"/>
+          <w:color w:val="000000" w:themeColor="text1"/>
+          <w:sz w:val="20"/>
+          <w:szCs w:val="20"/>
+          <w:lang w:bidi="en-US"/>
+        </w:rPr>
+        <w:t>article.title_with_link}}</w:t>
+      </w:r>
+    </w:p>
+    <w:p>
+      <w:pPr>
+        <w:rPr>
+          <w:rFonts w:ascii="Arial" w:hAnsi="Arial" w:cs="Arial"/>
+          <w:sz w:val="20"/>
+          <w:szCs w:val="20"/>
+          <w:lang w:bidi="en-US"/>
+        </w:rPr>
+      </w:pPr>
+      <w:r>
+        <w:rPr>
+          <w:rFonts w:ascii="Arial" w:hAnsi="Arial" w:cs="Arial"/>
+          <w:sz w:val="20"/>
+          <w:szCs w:val="20"/>
+          <w:lang w:bidi="en-US"/>
+        </w:rPr>
+        <w:t>({{</w:t>
+      </w:r>
+      <w:proofErr w:type="spellStart"/>
+      <w:proofErr w:type="gramStart"/>
+      <w:r>
+        <w:rPr>
+          <w:rFonts w:ascii="Arial" w:hAnsi="Arial" w:cs="Arial"/>
+          <w:sz w:val="20"/>
+          <w:szCs w:val="20"/>
+          <w:lang w:bidi="en-US"/>
+        </w:rPr>
+        <w:t>article.source</w:t>
+      </w:r>
+      <w:proofErr w:type="spellEnd"/>
+      <w:proofErr w:type="gramEnd"/>
+      <w:r>
+        <w:rPr>
+          <w:rFonts w:ascii="Arial" w:hAnsi="Arial" w:cs="Arial"/>
+          <w:sz w:val="20"/>
+          <w:szCs w:val="20"/>
+          <w:lang w:bidi="en-US"/>
+        </w:rPr>
+        <w:t>}}</w:t>
+      </w:r>
+      <w:r>
+        <w:rPr>
+          <w:rFonts w:ascii="Arial" w:hAnsi="Arial" w:cs="Arial"/>
+          <w:sz w:val="20"/>
+          <w:szCs w:val="20"/>
+          <w:lang w:bidi="en-US"/>
+        </w:rPr>
+        <w:t>/{{</w:t>
+      </w:r>
+      <w:proofErr w:type="spellStart"/>
+      <w:proofErr w:type="gramStart"/>
+      <w:r>
+        <w:rPr>
+          <w:rFonts w:ascii="Arial" w:hAnsi="Arial" w:cs="Arial"/>
+          <w:sz w:val="20"/>
+          <w:szCs w:val="20"/>
+          <w:lang w:bidi="en-US"/>
+        </w:rPr>
+        <w:t>article.author</w:t>
+      </w:r>
+      <w:proofErr w:type="spellEnd"/>
+      <w:proofErr w:type="gramEnd"/>
+      <w:r>
+        <w:rPr>
+          <w:rFonts w:ascii="Arial" w:hAnsi="Arial" w:cs="Arial"/>
+          <w:sz w:val="20"/>
+          <w:szCs w:val="20"/>
+          <w:lang w:bidi="en-US"/>
+        </w:rPr>
+        <w:t>}}</w:t>
+      </w:r>
+      <w:r>
+        <w:rPr>
+          <w:rFonts w:ascii="Arial" w:hAnsi="Arial" w:cs="Arial"/>
+          <w:sz w:val="20"/>
+          <w:szCs w:val="20"/>
+          <w:lang w:bidi="en-US"/>
+        </w:rPr>
+        <w:t>) {{</w:t>
+      </w:r>
+      <w:proofErr w:type="spellStart"/>
+      <w:proofErr w:type="gramStart"/>
+      <w:r>
+        <w:rPr>
+          <w:rFonts w:ascii="Arial" w:hAnsi="Arial" w:cs="Arial"/>
+          <w:sz w:val="20"/>
+          <w:szCs w:val="20"/>
+          <w:lang w:bidi="en-US"/>
+        </w:rPr>
+        <w:t>article.date</w:t>
+      </w:r>
+      <w:proofErr w:type="spellEnd"/>
+      <w:proofErr w:type="gramEnd"/>
+      <w:r>
+        <w:rPr>
+          <w:rFonts w:ascii="Arial" w:hAnsi="Arial" w:cs="Arial"/>
+          <w:sz w:val="20"/>
+          <w:szCs w:val="20"/>
+          <w:lang w:bidi="en-US"/>
+        </w:rPr>
+        <w:t>}}</w:t>
+      </w:r>
+    </w:p>
     <w:p>
       <w:pPr>
         <w:rPr>
@@ -344,218 +526,21 @@
           <w:szCs w:val="18"/>
         </w:rPr>
       </w:pPr>
-      <w:hyperlink w:anchor="_FULL_ARTICLES" w:history="1">
-        <w:r>
-          <w:rPr>
-            <w:rStyle w:val="Hyperlink"/>
-            <w:rFonts w:ascii="Arial" w:hAnsi="Arial" w:cs="Arial"/>
-            <w:b/>
-            <w:sz w:val="18"/>
-            <w:szCs w:val="18"/>
-            <w:lang w:bidi="en-US"/>
-          </w:rPr>
-          <w:t>Full Articles</w:t>
-        </w:r>
-      </w:hyperlink>
-      <w:r>
-        <w:rPr>
-          <w:rFonts w:ascii="Arial" w:hAnsi="Arial" w:cs="Arial"/>
-          <w:b/>
-          <w:color w:val="000000"/>
-          <w:sz w:val="18"/>
-          <w:szCs w:val="18"/>
-          <w:lang w:bidi="en-US"/>
-        </w:rPr>
-        <w:t xml:space="preserve"> </w:t>
-      </w:r>
-      <w:hyperlink w:anchor="_top" w:history="1">
-        <w:r>
-          <w:rPr>
-            <w:rStyle w:val="Hyperlink"/>
-            <w:rFonts w:ascii="Arial" w:hAnsi="Arial" w:cs="Arial"/>
-            <w:b/>
-            <w:sz w:val="18"/>
-            <w:szCs w:val="18"/>
-            <w:lang w:bidi="en-US"/>
-          </w:rPr>
-          <w:t>Back to Top</w:t>
-        </w:r>
-      </w:hyperlink>
-    </w:p>
-    <w:p>
-      <w:pPr>
-        <w:rPr>
-          <w:rFonts w:ascii="Arial" w:hAnsi="Arial" w:cs="Arial"/>
-          <w:lang w:bidi="en-US"/>
-        </w:rPr>
-      </w:pPr>
-    </w:p>
-    <w:p>
-      <w:pPr>
-        <w:rPr>
-          <w:rFonts w:ascii="Arial" w:hAnsi="Arial" w:cs="Arial"/>
-          <w:lang w:bidi="en-US"/>
-        </w:rPr>
-      </w:pPr>
-      <w:r>
-        <w:rPr>
-          <w:rFonts w:ascii="Arial" w:hAnsi="Arial" w:cs="Arial"/>
-          <w:lang w:bidi="en-US"/>
-        </w:rPr>
-        <w:t>{% for article in section.articles %}</w:t>
-      </w:r>
-    </w:p>
-    <w:p>
-      <w:pPr>
-        <w:rPr>
-          <w:rFonts w:ascii="Arial" w:hAnsi="Arial" w:cs="Arial"/>
-          <w:color w:val="000000" w:themeColor="text1"/>
-          <w:sz w:val="20"/>
-          <w:szCs w:val="20"/>
-          <w:lang w:bidi="en-US"/>
-        </w:rPr>
-      </w:pPr>
-      <w:r>
-        <w:rPr>
-          <w:rFonts w:ascii="Arial" w:hAnsi="Arial" w:cs="Arial"/>
-          <w:color w:val="000000" w:themeColor="text1"/>
-          <w:sz w:val="20"/>
-          <w:szCs w:val="20"/>
-          <w:lang w:bidi="en-US"/>
-        </w:rPr>
-        <w:t>{{</w:t>
-      </w:r>
-      <w:r>
-        <w:rPr>
-          <w:rFonts w:ascii="Arial" w:hAnsi="Arial" w:cs="Arial"/>
-          <w:color w:val="000000" w:themeColor="text1"/>
-          <w:sz w:val="20"/>
-          <w:szCs w:val="20"/>
-          <w:lang w:bidi="en-US"/>
-        </w:rPr>
-        <w:t xml:space="preserve">r </w:t>
-      </w:r>
-      <w:r>
-        <w:rPr>
-          <w:rFonts w:ascii="Arial" w:hAnsi="Arial" w:cs="Arial"/>
-          <w:color w:val="000000" w:themeColor="text1"/>
-          <w:sz w:val="20"/>
-          <w:szCs w:val="20"/>
-          <w:lang w:bidi="en-US"/>
-        </w:rPr>
-        <w:t>article.title_with_link}}</w:t>
-      </w:r>
-    </w:p>
-    <w:p>
-      <w:pPr>
-        <w:rPr>
-          <w:rFonts w:ascii="Arial" w:hAnsi="Arial" w:cs="Arial"/>
-          <w:sz w:val="20"/>
-          <w:szCs w:val="20"/>
-          <w:lang w:bidi="en-US"/>
-        </w:rPr>
-      </w:pPr>
-      <w:r>
-        <w:rPr>
-          <w:rFonts w:ascii="Arial" w:hAnsi="Arial" w:cs="Arial"/>
-          <w:sz w:val="20"/>
-          <w:szCs w:val="20"/>
-          <w:lang w:bidi="en-US"/>
-        </w:rPr>
-        <w:t>({{</w:t>
-      </w:r>
-      <w:proofErr w:type="spellStart"/>
-      <w:proofErr w:type="gramStart"/>
-      <w:r>
-        <w:rPr>
-          <w:rFonts w:ascii="Arial" w:hAnsi="Arial" w:cs="Arial"/>
-          <w:sz w:val="20"/>
-          <w:szCs w:val="20"/>
-          <w:lang w:bidi="en-US"/>
-        </w:rPr>
-        <w:t>article.source</w:t>
-      </w:r>
-      <w:proofErr w:type="spellEnd"/>
-      <w:proofErr w:type="gramEnd"/>
-      <w:r>
-        <w:rPr>
-          <w:rFonts w:ascii="Arial" w:hAnsi="Arial" w:cs="Arial"/>
-          <w:sz w:val="20"/>
-          <w:szCs w:val="20"/>
-          <w:lang w:bidi="en-US"/>
-        </w:rPr>
-        <w:t>}}</w:t>
-      </w:r>
-      <w:r>
-        <w:rPr>
-          <w:rFonts w:ascii="Arial" w:hAnsi="Arial" w:cs="Arial"/>
-          <w:sz w:val="20"/>
-          <w:szCs w:val="20"/>
-          <w:lang w:bidi="en-US"/>
-        </w:rPr>
-        <w:t>/{{</w:t>
-      </w:r>
-      <w:proofErr w:type="spellStart"/>
-      <w:proofErr w:type="gramStart"/>
-      <w:r>
-        <w:rPr>
-          <w:rFonts w:ascii="Arial" w:hAnsi="Arial" w:cs="Arial"/>
-          <w:sz w:val="20"/>
-          <w:szCs w:val="20"/>
-          <w:lang w:bidi="en-US"/>
-        </w:rPr>
-        <w:t>article.author</w:t>
-      </w:r>
-      <w:proofErr w:type="spellEnd"/>
-      <w:proofErr w:type="gramEnd"/>
-      <w:r>
-        <w:rPr>
-          <w:rFonts w:ascii="Arial" w:hAnsi="Arial" w:cs="Arial"/>
-          <w:sz w:val="20"/>
-          <w:szCs w:val="20"/>
-          <w:lang w:bidi="en-US"/>
-        </w:rPr>
-        <w:t>}}</w:t>
-      </w:r>
-      <w:r>
-        <w:rPr>
-          <w:rFonts w:ascii="Arial" w:hAnsi="Arial" w:cs="Arial"/>
-          <w:sz w:val="20"/>
-          <w:szCs w:val="20"/>
-          <w:lang w:bidi="en-US"/>
-        </w:rPr>
-        <w:t>) {{</w:t>
-      </w:r>
-      <w:proofErr w:type="spellStart"/>
-      <w:proofErr w:type="gramStart"/>
-      <w:r>
-        <w:rPr>
-          <w:rFonts w:ascii="Arial" w:hAnsi="Arial" w:cs="Arial"/>
-          <w:sz w:val="20"/>
-          <w:szCs w:val="20"/>
-          <w:lang w:bidi="en-US"/>
-        </w:rPr>
-        <w:t>article.date</w:t>
-      </w:r>
-      <w:proofErr w:type="spellEnd"/>
-      <w:proofErr w:type="gramEnd"/>
-      <w:r>
-        <w:rPr>
-          <w:rFonts w:ascii="Arial" w:hAnsi="Arial" w:cs="Arial"/>
-          <w:sz w:val="20"/>
-          <w:szCs w:val="20"/>
-          <w:lang w:bidi="en-US"/>
-        </w:rPr>
-        <w:t>}}</w:t>
-      </w:r>
-    </w:p>
-    <w:p>
-      <w:pPr>
-        <w:rPr>
-          <w:rFonts w:ascii="Arial" w:hAnsi="Arial" w:cs="Arial"/>
-          <w:lang w:bidi="en-US"/>
-        </w:rPr>
-      </w:pPr>
+    </w:p>
+    <w:p>
+      <w:pPr>
+        <w:rPr>
+          <w:rFonts w:ascii="Arial" w:hAnsi="Arial" w:cs="Arial"/>
+          <w:lang w:bidi="en-US"/>
+        </w:rPr>
+      </w:pPr>
+      <w:r>
+        <w:rPr>
+          <w:rFonts w:ascii="Arial" w:hAnsi="Arial" w:cs="Arial"/>
+          <w:lang w:bidi="en-US"/>
+        </w:rPr>
+        <w:t>{% endfor %}</w:t>
+      </w:r>
     </w:p>
     <w:bookmarkStart w:id="8" w:name="_Hlk190227748"/>
     <w:p>
@@ -627,30 +612,6 @@
     </w:p>
     <w:p>
       <w:pPr>
-        <w:rPr>
-          <w:rFonts w:ascii="Arial" w:hAnsi="Arial" w:cs="Arial"/>
-          <w:sz w:val="18"/>
-          <w:szCs w:val="18"/>
-        </w:rPr>
-      </w:pPr>
-    </w:p>
-    <w:p>
-      <w:pPr>
-        <w:rPr>
-          <w:rFonts w:ascii="Arial" w:hAnsi="Arial" w:cs="Arial"/>
-          <w:lang w:bidi="en-US"/>
-        </w:rPr>
-      </w:pPr>
-      <w:r>
-        <w:rPr>
-          <w:rFonts w:ascii="Arial" w:hAnsi="Arial" w:cs="Arial"/>
-          <w:lang w:bidi="en-US"/>
-        </w:rPr>
-        <w:t>{% endfor %}</w:t>
-      </w:r>
-    </w:p>
-    <w:p>
-      <w:pPr>
         <w:pBdr>
           <w:bottom w:val="single" w:sz="6" w:space="1" w:color="auto"/>
         </w:pBdr>
@@ -813,7 +774,237 @@
         <w:t>}}</w:t>
       </w:r>
     </w:p>
-    <w:p/>
+    <w:p>
+      <w:pPr>
+        <w:rPr>
+          <w:rFonts w:ascii="Arial" w:hAnsi="Arial" w:cs="Arial"/>
+          <w:b/>
+          <w:color w:val="000000"/>
+          <w:sz w:val="20"/>
+          <w:szCs w:val="20"/>
+          <w:u w:val="single"/>
+          <w:lang w:bidi="en-US"/>
+        </w:rPr>
+      </w:pPr>
+    </w:p>
+    <w:p>
+      <w:pPr>
+        <w:rPr>
+          <w:rFonts w:ascii="Arial" w:hAnsi="Arial" w:cs="Arial"/>
+          <w:lang w:bidi="en-US"/>
+        </w:rPr>
+      </w:pPr>
+      <w:r>
+        <w:rPr>
+          <w:rFonts w:ascii="Arial" w:hAnsi="Arial" w:cs="Arial"/>
+          <w:lang w:bidi="en-US"/>
+        </w:rPr>
+        <w:t xml:space="preserve">{% for article in </w:t>
+      </w:r>
+      <w:proofErr w:type="gramStart"/>
+      <w:r>
+        <w:rPr>
+          <w:rFonts w:ascii="Arial" w:hAnsi="Arial" w:cs="Arial"/>
+          <w:lang w:bidi="en-US"/>
+        </w:rPr>
+        <w:t>section.articles</w:t>
+      </w:r>
+      <w:proofErr w:type="gramEnd"/>
+      <w:r>
+        <w:rPr>
+          <w:rFonts w:ascii="Arial" w:hAnsi="Arial" w:cs="Arial"/>
+          <w:lang w:bidi="en-US"/>
+        </w:rPr>
+        <w:t xml:space="preserve"> %}</w:t>
+      </w:r>
+    </w:p>
+    <w:p>
+      <w:pPr>
+        <w:rPr>
+          <w:rFonts w:ascii="Arial" w:hAnsi="Arial" w:cs="Arial"/>
+          <w:color w:val="000000" w:themeColor="text1"/>
+          <w:sz w:val="20"/>
+          <w:szCs w:val="20"/>
+          <w:lang w:bidi="en-US"/>
+        </w:rPr>
+      </w:pPr>
+      <w:r>
+        <w:rPr>
+          <w:rFonts w:ascii="Arial" w:hAnsi="Arial" w:cs="Arial"/>
+          <w:color w:val="000000" w:themeColor="text1"/>
+          <w:sz w:val="20"/>
+          <w:szCs w:val="20"/>
+          <w:lang w:bidi="en-US"/>
+        </w:rPr>
+        <w:t>{{</w:t>
+      </w:r>
+      <w:r>
+        <w:rPr>
+          <w:rFonts w:ascii="Arial" w:hAnsi="Arial" w:cs="Arial"/>
+          <w:color w:val="000000" w:themeColor="text1"/>
+          <w:sz w:val="20"/>
+          <w:szCs w:val="20"/>
+          <w:lang w:bidi="en-US"/>
+        </w:rPr>
+        <w:t xml:space="preserve">r </w:t>
+      </w:r>
+      <w:r>
+        <w:rPr>
+          <w:rFonts w:ascii="Arial" w:hAnsi="Arial" w:cs="Arial"/>
+          <w:color w:val="000000" w:themeColor="text1"/>
+          <w:sz w:val="20"/>
+          <w:szCs w:val="20"/>
+          <w:lang w:bidi="en-US"/>
+        </w:rPr>
+        <w:t>article.title_with_link}}</w:t>
+      </w:r>
+    </w:p>
+    <w:p>
+      <w:pPr>
+        <w:rPr>
+          <w:rFonts w:ascii="Arial" w:hAnsi="Arial" w:cs="Arial"/>
+          <w:sz w:val="20"/>
+          <w:szCs w:val="20"/>
+          <w:lang w:bidi="en-US"/>
+        </w:rPr>
+      </w:pPr>
+      <w:r>
+        <w:rPr>
+          <w:rFonts w:ascii="Arial" w:hAnsi="Arial" w:cs="Arial"/>
+          <w:sz w:val="20"/>
+          <w:szCs w:val="20"/>
+          <w:lang w:bidi="en-US"/>
+        </w:rPr>
+        <w:t>({{</w:t>
+      </w:r>
+      <w:proofErr w:type="spellStart"/>
+      <w:proofErr w:type="gramStart"/>
+      <w:r>
+        <w:rPr>
+          <w:rFonts w:ascii="Arial" w:hAnsi="Arial" w:cs="Arial"/>
+          <w:sz w:val="20"/>
+          <w:szCs w:val="20"/>
+          <w:lang w:bidi="en-US"/>
+        </w:rPr>
+        <w:t>article.source</w:t>
+      </w:r>
+      <w:proofErr w:type="spellEnd"/>
+      <w:proofErr w:type="gramEnd"/>
+      <w:r>
+        <w:rPr>
+          <w:rFonts w:ascii="Arial" w:hAnsi="Arial" w:cs="Arial"/>
+          <w:sz w:val="20"/>
+          <w:szCs w:val="20"/>
+          <w:lang w:bidi="en-US"/>
+        </w:rPr>
+        <w:t>}}</w:t>
+      </w:r>
+      <w:r>
+        <w:rPr>
+          <w:rFonts w:ascii="Arial" w:hAnsi="Arial" w:cs="Arial"/>
+          <w:sz w:val="20"/>
+          <w:szCs w:val="20"/>
+          <w:lang w:bidi="en-US"/>
+        </w:rPr>
+        <w:t>/{{</w:t>
+      </w:r>
+      <w:proofErr w:type="spellStart"/>
+      <w:proofErr w:type="gramStart"/>
+      <w:r>
+        <w:rPr>
+          <w:rFonts w:ascii="Arial" w:hAnsi="Arial" w:cs="Arial"/>
+          <w:sz w:val="20"/>
+          <w:szCs w:val="20"/>
+          <w:lang w:bidi="en-US"/>
+        </w:rPr>
+        <w:t>article.author</w:t>
+      </w:r>
+      <w:proofErr w:type="spellEnd"/>
+      <w:proofErr w:type="gramEnd"/>
+      <w:r>
+        <w:rPr>
+          <w:rFonts w:ascii="Arial" w:hAnsi="Arial" w:cs="Arial"/>
+          <w:sz w:val="20"/>
+          <w:szCs w:val="20"/>
+          <w:lang w:bidi="en-US"/>
+        </w:rPr>
+        <w:t>}}</w:t>
+      </w:r>
+      <w:r>
+        <w:rPr>
+          <w:rFonts w:ascii="Arial" w:hAnsi="Arial" w:cs="Arial"/>
+          <w:sz w:val="20"/>
+          <w:szCs w:val="20"/>
+          <w:lang w:bidi="en-US"/>
+        </w:rPr>
+        <w:t>) {{</w:t>
+      </w:r>
+      <w:proofErr w:type="spellStart"/>
+      <w:proofErr w:type="gramStart"/>
+      <w:r>
+        <w:rPr>
+          <w:rFonts w:ascii="Arial" w:hAnsi="Arial" w:cs="Arial"/>
+          <w:sz w:val="20"/>
+          <w:szCs w:val="20"/>
+          <w:lang w:bidi="en-US"/>
+        </w:rPr>
+        <w:t>article.date</w:t>
+      </w:r>
+      <w:proofErr w:type="spellEnd"/>
+      <w:proofErr w:type="gramEnd"/>
+      <w:r>
+        <w:rPr>
+          <w:rFonts w:ascii="Arial" w:hAnsi="Arial" w:cs="Arial"/>
+          <w:sz w:val="20"/>
+          <w:szCs w:val="20"/>
+          <w:lang w:bidi="en-US"/>
+        </w:rPr>
+        <w:t>}}</w:t>
+      </w:r>
+    </w:p>
+    <w:p>
+      <w:pPr>
+        <w:rPr>
+          <w:rFonts w:ascii="Arial" w:hAnsi="Arial" w:cs="Arial"/>
+          <w:sz w:val="20"/>
+          <w:szCs w:val="20"/>
+          <w:lang w:bidi="en-US"/>
+        </w:rPr>
+      </w:pPr>
+      <w:r>
+        <w:rPr>
+          <w:rFonts w:ascii="Arial" w:hAnsi="Arial" w:cs="Arial"/>
+          <w:sz w:val="20"/>
+          <w:szCs w:val="20"/>
+          <w:lang w:bidi="en-US"/>
+        </w:rPr>
+        <w:t>{{article.full_text}}</w:t>
+      </w:r>
+    </w:p>
+    <w:p>
+      <w:pPr>
+        <w:rPr>
+          <w:rFonts w:ascii="Arial" w:hAnsi="Arial" w:cs="Arial"/>
+          <w:sz w:val="18"/>
+          <w:szCs w:val="18"/>
+        </w:rPr>
+      </w:pPr>
+    </w:p>
+    <w:p>
+      <w:pPr>
+        <w:rPr>
+          <w:rFonts w:ascii="Arial" w:hAnsi="Arial" w:cs="Arial"/>
+          <w:lang w:bidi="en-US"/>
+        </w:rPr>
+      </w:pPr>
+      <w:r>
+        <w:rPr>
+          <w:rFonts w:ascii="Arial" w:hAnsi="Arial" w:cs="Arial"/>
+          <w:lang w:bidi="en-US"/>
+        </w:rPr>
+        <w:t>{% endfor %}</w:t>
+      </w:r>
+    </w:p>
     <w:p>
       <w:pPr>
         <w:rPr>
@@ -835,260 +1026,6 @@
           <w:t>Back to Summaries</w:t>
         </w:r>
       </w:hyperlink>
-    </w:p>
-    <w:p>
-      <w:pPr>
-        <w:rPr>
-          <w:lang w:bidi="en-US"/>
-        </w:rPr>
-      </w:pPr>
-    </w:p>
-    <w:p>
-      <w:pPr>
-        <w:rPr>
-          <w:rFonts w:ascii="Arial" w:hAnsi="Arial" w:cs="Arial"/>
-          <w:b/>
-          <w:color w:val="000000"/>
-          <w:sz w:val="20"/>
-          <w:szCs w:val="20"/>
-          <w:u w:val="single"/>
-          <w:lang w:bidi="en-US"/>
-        </w:rPr>
-      </w:pPr>
-    </w:p>
-    <w:p>
-      <w:pPr>
-        <w:rPr>
-          <w:rFonts w:ascii="Arial" w:hAnsi="Arial" w:cs="Arial"/>
-          <w:lang w:bidi="en-US"/>
-        </w:rPr>
-      </w:pPr>
-      <w:r>
-        <w:rPr>
-          <w:rFonts w:ascii="Arial" w:hAnsi="Arial" w:cs="Arial"/>
-          <w:lang w:bidi="en-US"/>
-        </w:rPr>
-        <w:t>{% for article in section.articles %}</w:t>
-      </w:r>
-    </w:p>
-    <w:p>
-      <w:pPr>
-        <w:rPr>
-          <w:rFonts w:ascii="Arial" w:hAnsi="Arial" w:cs="Arial"/>
-          <w:color w:val="000000" w:themeColor="text1"/>
-          <w:sz w:val="20"/>
-          <w:szCs w:val="20"/>
-          <w:lang w:bidi="en-US"/>
-        </w:rPr>
-      </w:pPr>
-      <w:r>
-        <w:rPr>
-          <w:rFonts w:ascii="Arial" w:hAnsi="Arial" w:cs="Arial"/>
-          <w:color w:val="000000" w:themeColor="text1"/>
-          <w:sz w:val="20"/>
-          <w:szCs w:val="20"/>
-          <w:lang w:bidi="en-US"/>
-        </w:rPr>
-        <w:t>{{</w:t>
-      </w:r>
-      <w:r>
-        <w:rPr>
-          <w:rFonts w:ascii="Arial" w:hAnsi="Arial" w:cs="Arial"/>
-          <w:color w:val="000000" w:themeColor="text1"/>
-          <w:sz w:val="20"/>
-          <w:szCs w:val="20"/>
-          <w:lang w:bidi="en-US"/>
-        </w:rPr>
-        <w:t xml:space="preserve">r </w:t>
-      </w:r>
-      <w:r>
-        <w:rPr>
-          <w:rFonts w:ascii="Arial" w:hAnsi="Arial" w:cs="Arial"/>
-          <w:color w:val="000000" w:themeColor="text1"/>
-          <w:sz w:val="20"/>
-          <w:szCs w:val="20"/>
-          <w:lang w:bidi="en-US"/>
-        </w:rPr>
-        <w:t>article.title_with_link}}</w:t>
-      </w:r>
-    </w:p>
-    <w:p>
-      <w:pPr>
-        <w:rPr>
-          <w:rFonts w:ascii="Arial" w:hAnsi="Arial" w:cs="Arial"/>
-          <w:sz w:val="20"/>
-          <w:szCs w:val="20"/>
-          <w:lang w:bidi="en-US"/>
-        </w:rPr>
-      </w:pPr>
-      <w:r>
-        <w:rPr>
-          <w:rFonts w:ascii="Arial" w:hAnsi="Arial" w:cs="Arial"/>
-          <w:sz w:val="20"/>
-          <w:szCs w:val="20"/>
-          <w:lang w:bidi="en-US"/>
-        </w:rPr>
-        <w:t>({{</w:t>
-      </w:r>
-      <w:proofErr w:type="spellStart"/>
-      <w:proofErr w:type="gramStart"/>
-      <w:r>
-        <w:rPr>
-          <w:rFonts w:ascii="Arial" w:hAnsi="Arial" w:cs="Arial"/>
-          <w:sz w:val="20"/>
-          <w:szCs w:val="20"/>
-          <w:lang w:bidi="en-US"/>
-        </w:rPr>
-        <w:t>article.source</w:t>
-      </w:r>
-      <w:proofErr w:type="spellEnd"/>
-      <w:proofErr w:type="gramEnd"/>
-      <w:r>
-        <w:rPr>
-          <w:rFonts w:ascii="Arial" w:hAnsi="Arial" w:cs="Arial"/>
-          <w:sz w:val="20"/>
-          <w:szCs w:val="20"/>
-          <w:lang w:bidi="en-US"/>
-        </w:rPr>
-        <w:t>}}</w:t>
-      </w:r>
-      <w:r>
-        <w:rPr>
-          <w:rFonts w:ascii="Arial" w:hAnsi="Arial" w:cs="Arial"/>
-          <w:sz w:val="20"/>
-          <w:szCs w:val="20"/>
-          <w:lang w:bidi="en-US"/>
-        </w:rPr>
-        <w:t>/{{</w:t>
-      </w:r>
-      <w:proofErr w:type="spellStart"/>
-      <w:proofErr w:type="gramStart"/>
-      <w:r>
-        <w:rPr>
-          <w:rFonts w:ascii="Arial" w:hAnsi="Arial" w:cs="Arial"/>
-          <w:sz w:val="20"/>
-          <w:szCs w:val="20"/>
-          <w:lang w:bidi="en-US"/>
-        </w:rPr>
-        <w:t>article.author</w:t>
-      </w:r>
-      <w:proofErr w:type="spellEnd"/>
-      <w:proofErr w:type="gramEnd"/>
-      <w:r>
-        <w:rPr>
-          <w:rFonts w:ascii="Arial" w:hAnsi="Arial" w:cs="Arial"/>
-          <w:sz w:val="20"/>
-          <w:szCs w:val="20"/>
-          <w:lang w:bidi="en-US"/>
-        </w:rPr>
-        <w:t>}}</w:t>
-      </w:r>
-      <w:r>
-        <w:rPr>
-          <w:rFonts w:ascii="Arial" w:hAnsi="Arial" w:cs="Arial"/>
-          <w:sz w:val="20"/>
-          <w:szCs w:val="20"/>
-          <w:lang w:bidi="en-US"/>
-        </w:rPr>
-        <w:t>) {{</w:t>
-      </w:r>
-      <w:proofErr w:type="spellStart"/>
-      <w:proofErr w:type="gramStart"/>
-      <w:r>
-        <w:rPr>
-          <w:rFonts w:ascii="Arial" w:hAnsi="Arial" w:cs="Arial"/>
-          <w:sz w:val="20"/>
-          <w:szCs w:val="20"/>
-          <w:lang w:bidi="en-US"/>
-        </w:rPr>
-        <w:t>article.date</w:t>
-      </w:r>
-      <w:proofErr w:type="spellEnd"/>
-      <w:proofErr w:type="gramEnd"/>
-      <w:r>
-        <w:rPr>
-          <w:rFonts w:ascii="Arial" w:hAnsi="Arial" w:cs="Arial"/>
-          <w:sz w:val="20"/>
-          <w:szCs w:val="20"/>
-          <w:lang w:bidi="en-US"/>
-        </w:rPr>
-        <w:t>}}</w:t>
-      </w:r>
-    </w:p>
-    <w:p>
-      <w:pPr>
-        <w:rPr>
-          <w:rFonts w:ascii="Arial" w:hAnsi="Arial" w:cs="Arial"/>
-          <w:sz w:val="20"/>
-          <w:szCs w:val="20"/>
-          <w:lang w:bidi="en-US"/>
-        </w:rPr>
-      </w:pPr>
-      <w:r>
-        <w:rPr>
-          <w:rFonts w:ascii="Arial" w:hAnsi="Arial" w:cs="Arial"/>
-          <w:sz w:val="20"/>
-          <w:szCs w:val="20"/>
-          <w:lang w:bidi="en-US"/>
-        </w:rPr>
-        <w:t>{{article.full_text}}</w:t>
-      </w:r>
-    </w:p>
-    <w:p>
-      <w:pPr>
-        <w:rPr>
-          <w:rFonts w:ascii="Arial" w:hAnsi="Arial" w:cs="Arial"/>
-          <w:sz w:val="20"/>
-          <w:szCs w:val="20"/>
-          <w:lang w:bidi="en-US"/>
-        </w:rPr>
-      </w:pPr>
-    </w:p>
-    <w:p>
-      <w:pPr>
-        <w:rPr>
-          <w:rFonts w:ascii="Arial" w:hAnsi="Arial" w:cs="Arial"/>
-          <w:sz w:val="18"/>
-          <w:szCs w:val="18"/>
-        </w:rPr>
-      </w:pPr>
-      <w:hyperlink w:anchor="_top" w:history="1">
-        <w:r>
-          <w:rPr>
-            <w:rStyle w:val="Hyperlink"/>
-            <w:rFonts w:ascii="Arial" w:hAnsi="Arial" w:cs="Arial"/>
-            <w:b/>
-            <w:sz w:val="18"/>
-            <w:szCs w:val="18"/>
-            <w:lang w:bidi="en-US"/>
-          </w:rPr>
-          <w:t>Back to Summaries</w:t>
-        </w:r>
-      </w:hyperlink>
-    </w:p>
-    <w:p>
-      <w:pPr>
-        <w:rPr>
-          <w:rFonts w:ascii="Arial" w:hAnsi="Arial" w:cs="Arial"/>
-          <w:sz w:val="18"/>
-          <w:szCs w:val="18"/>
-        </w:rPr>
-      </w:pPr>
-    </w:p>
-    <w:p>
-      <w:pPr>
-        <w:rPr>
-          <w:rFonts w:ascii="Arial" w:hAnsi="Arial" w:cs="Arial"/>
-          <w:lang w:bidi="en-US"/>
-        </w:rPr>
-      </w:pPr>
-      <w:r>
-        <w:rPr>
-          <w:rFonts w:ascii="Arial" w:hAnsi="Arial" w:cs="Arial"/>
-          <w:lang w:bidi="en-US"/>
-        </w:rPr>
-        <w:t>{% endfor %}</w:t>
-      </w:r>
     </w:p>
     <w:p>
       <w:pPr>
@@ -1275,7 +1212,7 @@
 </file>
 
 <file path=word/endnotes.xml><?xml version="1.0" encoding="utf-8"?>
-<w:endnotes xmlns:wpc="http://schemas.microsoft.com/office/word/2010/wordprocessingCanvas" xmlns:cx="http://schemas.microsoft.com/office/drawing/2014/chartex" xmlns:cx1="http://schemas.microsoft.com/office/drawing/2015/9/8/chartex" xmlns:cx2="http://schemas.microsoft.com/office/drawing/2015/10/21/chartex" xmlns:cx3="http://schemas.microsoft.com/office/drawing/2016/5/9/chartex" xmlns:cx4="http://schemas.microsoft.com/office/drawing/2016/5/10/chartex" xmlns:cx5="http://schemas.microsoft.com/office/drawing/2016/5/11/chartex" xmlns:cx6="http://schemas.microsoft.com/office/drawing/2016/5/12/chartex" xmlns:cx7="http://schemas.microsoft.com/office/drawing/2016/5/13/chartex" xmlns:cx8="http://schemas.microsoft.com/office/drawing/2016/5/14/chartex" xmlns:mc="http://schemas.openxmlformats.org/markup-compatibility/2006" xmlns:m="http://schemas.openxmlformats.org/officeDocument/2006/math" xmlns:aink="http://schemas.microsoft.com/office/drawing/2016/ink" xmlns:am3d="http://schemas.microsoft.com/office/drawing/2017/model3d" xmlns:oel="http://schemas.microsoft.com/office/2019/extlst" xmlns:r="http://schemas.openxmlformats.org/officeDocument/2006/relationships" xmlns:wp14="http://schemas.microsoft.com/office/word/2010/wordprocessingDrawing" xmlns:wp="http://schemas.openxmlformats.org/drawingml/2006/wordprocessingDrawing" xmlns:wpg="http://schemas.microsoft.com/office/word/2010/wordprocessingGroup" xmlns:wpi="http://schemas.microsoft.com/office/word/2010/wordprocessingInk" xmlns:wps="http://schemas.microsoft.com/office/word/2010/wordprocessingShape" xmlns:o="urn:schemas-microsoft-com:office:office" xmlns:v="urn:schemas-microsoft-com:vml" xmlns:w10="urn:schemas-microsoft-com:office:word" xmlns:w="http://schemas.openxmlformats.org/wordprocessingml/2006/main" xmlns:w14="http://schemas.microsoft.com/office/word/2010/wordml" xmlns:w15="http://schemas.microsoft.com/office/word/2012/wordml" xmlns:w16cex="http://schemas.microsoft.com/office/word/2018/wordml/cex" xmlns:w16cid="http://schemas.microsoft.com/office/word/2016/wordml/cid" xmlns:w16="http://schemas.microsoft.com/office/word/2018/wordml" xmlns:w16sdtdh="http://schemas.microsoft.com/office/word/2020/wordml/sdtdatahash" xmlns:w16sdtfl="http://schemas.microsoft.com/office/word/2024/wordml/sdtformatlock" xmlns:w16se="http://schemas.microsoft.com/office/word/2015/wordml/symex" xmlns:w16du="http://schemas.microsoft.com/office/word/2023/wordml/word16du" xmlns:wne="http://schemas.microsoft.com/office/word/2006/wordml" mc:Ignorable="w14 w15 w16se w16cid w16 w16cex w16sdtdh w16sdtfl w16du wp14">
+<w:endnotes xmlns:wpc="http://schemas.microsoft.com/office/word/2010/wordprocessingCanvas" xmlns:cx="http://schemas.microsoft.com/office/drawing/2014/chartex" xmlns:cx1="http://schemas.microsoft.com/office/drawing/2015/9/8/chartex" xmlns:cx2="http://schemas.microsoft.com/office/drawing/2015/10/21/chartex" xmlns:cx3="http://schemas.microsoft.com/office/drawing/2016/5/9/chartex" xmlns:cx4="http://schemas.microsoft.com/office/drawing/2016/5/10/chartex" xmlns:cx5="http://schemas.microsoft.com/office/drawing/2016/5/11/chartex" xmlns:cx6="http://schemas.microsoft.com/office/drawing/2016/5/12/chartex" xmlns:cx7="http://schemas.microsoft.com/office/drawing/2016/5/13/chartex" xmlns:cx8="http://schemas.microsoft.com/office/drawing/2016/5/14/chartex" xmlns:mc="http://schemas.openxmlformats.org/markup-compatibility/2006" xmlns:aink="http://schemas.microsoft.com/office/drawing/2016/ink" xmlns:am3d="http://schemas.microsoft.com/office/drawing/2017/model3d" xmlns:o="urn:schemas-microsoft-com:office:office" xmlns:oel="http://schemas.microsoft.com/office/2019/extlst" xmlns:r="http://schemas.openxmlformats.org/officeDocument/2006/relationships" xmlns:m="http://schemas.openxmlformats.org/officeDocument/2006/math" xmlns:v="urn:schemas-microsoft-com:vml" xmlns:wp14="http://schemas.microsoft.com/office/word/2010/wordprocessingDrawing" xmlns:wp="http://schemas.openxmlformats.org/drawingml/2006/wordprocessingDrawing" xmlns:w10="urn:schemas-microsoft-com:office:word" xmlns:w="http://schemas.openxmlformats.org/wordprocessingml/2006/main" xmlns:w14="http://schemas.microsoft.com/office/word/2010/wordml" xmlns:w15="http://schemas.microsoft.com/office/word/2012/wordml" xmlns:w16cei="http://schemas.microsoft.com/office/word/2026/wordml/cei" xmlns:w16cex="http://schemas.microsoft.com/office/word/2018/wordml/cex" xmlns:w16cid="http://schemas.microsoft.com/office/word/2016/wordml/cid" xmlns:w16="http://schemas.microsoft.com/office/word/2018/wordml" xmlns:w16du="http://schemas.microsoft.com/office/word/2023/wordml/word16du" xmlns:w16sdtdh="http://schemas.microsoft.com/office/word/2020/wordml/sdtdatahash" xmlns:w16sdtfl="http://schemas.microsoft.com/office/word/2024/wordml/sdtformatlock" xmlns:w16se="http://schemas.microsoft.com/office/word/2015/wordml/symex" xmlns:wpg="http://schemas.microsoft.com/office/word/2010/wordprocessingGroup" xmlns:wpi="http://schemas.microsoft.com/office/word/2010/wordprocessingInk" xmlns:wne="http://schemas.microsoft.com/office/word/2006/wordml" xmlns:wps="http://schemas.microsoft.com/office/word/2010/wordprocessingShape" mc:Ignorable="w14 w15 w16se w16cid w16 w16cex w16sdtdh w16sdtfl w16du wp14">
   <w:endnote w:type="separator" w:id="-1">
     <w:p>
       <w:r>
@@ -1294,7 +1231,7 @@
 </file>
 
 <file path=word/footer1.xml><?xml version="1.0" encoding="utf-8"?>
-<w:ftr xmlns:wpc="http://schemas.microsoft.com/office/word/2010/wordprocessingCanvas" xmlns:cx="http://schemas.microsoft.com/office/drawing/2014/chartex" xmlns:cx1="http://schemas.microsoft.com/office/drawing/2015/9/8/chartex" xmlns:cx2="http://schemas.microsoft.com/office/drawing/2015/10/21/chartex" xmlns:cx3="http://schemas.microsoft.com/office/drawing/2016/5/9/chartex" xmlns:cx4="http://schemas.microsoft.com/office/drawing/2016/5/10/chartex" xmlns:cx5="http://schemas.microsoft.com/office/drawing/2016/5/11/chartex" xmlns:cx6="http://schemas.microsoft.com/office/drawing/2016/5/12/chartex" xmlns:cx7="http://schemas.microsoft.com/office/drawing/2016/5/13/chartex" xmlns:cx8="http://schemas.microsoft.com/office/drawing/2016/5/14/chartex" xmlns:mc="http://schemas.openxmlformats.org/markup-compatibility/2006" xmlns:m="http://schemas.openxmlformats.org/officeDocument/2006/math" xmlns:aink="http://schemas.microsoft.com/office/drawing/2016/ink" xmlns:am3d="http://schemas.microsoft.com/office/drawing/2017/model3d" xmlns:oel="http://schemas.microsoft.com/office/2019/extlst" xmlns:r="http://schemas.openxmlformats.org/officeDocument/2006/relationships" xmlns:wp14="http://schemas.microsoft.com/office/word/2010/wordprocessingDrawing" xmlns:wp="http://schemas.openxmlformats.org/drawingml/2006/wordprocessingDrawing" xmlns:wpg="http://schemas.microsoft.com/office/word/2010/wordprocessingGroup" xmlns:wpi="http://schemas.microsoft.com/office/word/2010/wordprocessingInk" xmlns:wps="http://schemas.microsoft.com/office/word/2010/wordprocessingShape" xmlns:o="urn:schemas-microsoft-com:office:office" xmlns:v="urn:schemas-microsoft-com:vml" xmlns:w10="urn:schemas-microsoft-com:office:word" xmlns:w="http://schemas.openxmlformats.org/wordprocessingml/2006/main" xmlns:w14="http://schemas.microsoft.com/office/word/2010/wordml" xmlns:w15="http://schemas.microsoft.com/office/word/2012/wordml" xmlns:w16cex="http://schemas.microsoft.com/office/word/2018/wordml/cex" xmlns:w16cid="http://schemas.microsoft.com/office/word/2016/wordml/cid" xmlns:w16="http://schemas.microsoft.com/office/word/2018/wordml" xmlns:w16sdtdh="http://schemas.microsoft.com/office/word/2020/wordml/sdtdatahash" xmlns:w16sdtfl="http://schemas.microsoft.com/office/word/2024/wordml/sdtformatlock" xmlns:w16se="http://schemas.microsoft.com/office/word/2015/wordml/symex" xmlns:w16du="http://schemas.microsoft.com/office/word/2023/wordml/word16du" xmlns:wne="http://schemas.microsoft.com/office/word/2006/wordml" mc:Ignorable="w14 w15 w16se w16cid w16 w16cex w16sdtdh w16sdtfl w16du wp14">
+<w:ftr xmlns:wpc="http://schemas.microsoft.com/office/word/2010/wordprocessingCanvas" xmlns:cx="http://schemas.microsoft.com/office/drawing/2014/chartex" xmlns:cx1="http://schemas.microsoft.com/office/drawing/2015/9/8/chartex" xmlns:cx2="http://schemas.microsoft.com/office/drawing/2015/10/21/chartex" xmlns:cx3="http://schemas.microsoft.com/office/drawing/2016/5/9/chartex" xmlns:cx4="http://schemas.microsoft.com/office/drawing/2016/5/10/chartex" xmlns:cx5="http://schemas.microsoft.com/office/drawing/2016/5/11/chartex" xmlns:cx6="http://schemas.microsoft.com/office/drawing/2016/5/12/chartex" xmlns:cx7="http://schemas.microsoft.com/office/drawing/2016/5/13/chartex" xmlns:cx8="http://schemas.microsoft.com/office/drawing/2016/5/14/chartex" xmlns:mc="http://schemas.openxmlformats.org/markup-compatibility/2006" xmlns:aink="http://schemas.microsoft.com/office/drawing/2016/ink" xmlns:am3d="http://schemas.microsoft.com/office/drawing/2017/model3d" xmlns:o="urn:schemas-microsoft-com:office:office" xmlns:oel="http://schemas.microsoft.com/office/2019/extlst" xmlns:r="http://schemas.openxmlformats.org/officeDocument/2006/relationships" xmlns:m="http://schemas.openxmlformats.org/officeDocument/2006/math" xmlns:v="urn:schemas-microsoft-com:vml" xmlns:wp14="http://schemas.microsoft.com/office/word/2010/wordprocessingDrawing" xmlns:wp="http://schemas.openxmlformats.org/drawingml/2006/wordprocessingDrawing" xmlns:w10="urn:schemas-microsoft-com:office:word" xmlns:w="http://schemas.openxmlformats.org/wordprocessingml/2006/main" xmlns:w14="http://schemas.microsoft.com/office/word/2010/wordml" xmlns:w15="http://schemas.microsoft.com/office/word/2012/wordml" xmlns:w16cei="http://schemas.microsoft.com/office/word/2026/wordml/cei" xmlns:w16cex="http://schemas.microsoft.com/office/word/2018/wordml/cex" xmlns:w16cid="http://schemas.microsoft.com/office/word/2016/wordml/cid" xmlns:w16="http://schemas.microsoft.com/office/word/2018/wordml" xmlns:w16du="http://schemas.microsoft.com/office/word/2023/wordml/word16du" xmlns:w16sdtdh="http://schemas.microsoft.com/office/word/2020/wordml/sdtdatahash" xmlns:w16sdtfl="http://schemas.microsoft.com/office/word/2024/wordml/sdtformatlock" xmlns:w16se="http://schemas.microsoft.com/office/word/2015/wordml/symex" xmlns:wpg="http://schemas.microsoft.com/office/word/2010/wordprocessingGroup" xmlns:wpi="http://schemas.microsoft.com/office/word/2010/wordprocessingInk" xmlns:wne="http://schemas.microsoft.com/office/word/2006/wordml" xmlns:wps="http://schemas.microsoft.com/office/word/2010/wordprocessingShape" mc:Ignorable="w14 w15 w16se w16cid w16 w16cex w16sdtdh w16sdtfl w16du wp14">
   <w:p>
     <w:pPr>
       <w:pStyle w:val="Footer"/>
@@ -1305,7 +1242,7 @@
 </file>
 
 <file path=word/footer2.xml><?xml version="1.0" encoding="utf-8"?>
-<w:ftr xmlns:wpc="http://schemas.microsoft.com/office/word/2010/wordprocessingCanvas" xmlns:cx="http://schemas.microsoft.com/office/drawing/2014/chartex" xmlns:cx1="http://schemas.microsoft.com/office/drawing/2015/9/8/chartex" xmlns:cx2="http://schemas.microsoft.com/office/drawing/2015/10/21/chartex" xmlns:cx3="http://schemas.microsoft.com/office/drawing/2016/5/9/chartex" xmlns:cx4="http://schemas.microsoft.com/office/drawing/2016/5/10/chartex" xmlns:cx5="http://schemas.microsoft.com/office/drawing/2016/5/11/chartex" xmlns:cx6="http://schemas.microsoft.com/office/drawing/2016/5/12/chartex" xmlns:cx7="http://schemas.microsoft.com/office/drawing/2016/5/13/chartex" xmlns:cx8="http://schemas.microsoft.com/office/drawing/2016/5/14/chartex" xmlns:mc="http://schemas.openxmlformats.org/markup-compatibility/2006" xmlns:m="http://schemas.openxmlformats.org/officeDocument/2006/math" xmlns:aink="http://schemas.microsoft.com/office/drawing/2016/ink" xmlns:am3d="http://schemas.microsoft.com/office/drawing/2017/model3d" xmlns:oel="http://schemas.microsoft.com/office/2019/extlst" xmlns:r="http://schemas.openxmlformats.org/officeDocument/2006/relationships" xmlns:wp14="http://schemas.microsoft.com/office/word/2010/wordprocessingDrawing" xmlns:wp="http://schemas.openxmlformats.org/drawingml/2006/wordprocessingDrawing" xmlns:wpg="http://schemas.microsoft.com/office/word/2010/wordprocessingGroup" xmlns:wpi="http://schemas.microsoft.com/office/word/2010/wordprocessingInk" xmlns:wps="http://schemas.microsoft.com/office/word/2010/wordprocessingShape" xmlns:o="urn:schemas-microsoft-com:office:office" xmlns:v="urn:schemas-microsoft-com:vml" xmlns:w10="urn:schemas-microsoft-com:office:word" xmlns:w="http://schemas.openxmlformats.org/wordprocessingml/2006/main" xmlns:w14="http://schemas.microsoft.com/office/word/2010/wordml" xmlns:w15="http://schemas.microsoft.com/office/word/2012/wordml" xmlns:w16cex="http://schemas.microsoft.com/office/word/2018/wordml/cex" xmlns:w16cid="http://schemas.microsoft.com/office/word/2016/wordml/cid" xmlns:w16="http://schemas.microsoft.com/office/word/2018/wordml" xmlns:w16sdtdh="http://schemas.microsoft.com/office/word/2020/wordml/sdtdatahash" xmlns:w16sdtfl="http://schemas.microsoft.com/office/word/2024/wordml/sdtformatlock" xmlns:w16se="http://schemas.microsoft.com/office/word/2015/wordml/symex" xmlns:w16du="http://schemas.microsoft.com/office/word/2023/wordml/word16du" xmlns:wne="http://schemas.microsoft.com/office/word/2006/wordml" mc:Ignorable="w14 w15 w16se w16cid w16 w16cex w16sdtdh w16sdtfl w16du wp14">
+<w:ftr xmlns:wpc="http://schemas.microsoft.com/office/word/2010/wordprocessingCanvas" xmlns:cx="http://schemas.microsoft.com/office/drawing/2014/chartex" xmlns:cx1="http://schemas.microsoft.com/office/drawing/2015/9/8/chartex" xmlns:cx2="http://schemas.microsoft.com/office/drawing/2015/10/21/chartex" xmlns:cx3="http://schemas.microsoft.com/office/drawing/2016/5/9/chartex" xmlns:cx4="http://schemas.microsoft.com/office/drawing/2016/5/10/chartex" xmlns:cx5="http://schemas.microsoft.com/office/drawing/2016/5/11/chartex" xmlns:cx6="http://schemas.microsoft.com/office/drawing/2016/5/12/chartex" xmlns:cx7="http://schemas.microsoft.com/office/drawing/2016/5/13/chartex" xmlns:cx8="http://schemas.microsoft.com/office/drawing/2016/5/14/chartex" xmlns:mc="http://schemas.openxmlformats.org/markup-compatibility/2006" xmlns:aink="http://schemas.microsoft.com/office/drawing/2016/ink" xmlns:am3d="http://schemas.microsoft.com/office/drawing/2017/model3d" xmlns:o="urn:schemas-microsoft-com:office:office" xmlns:oel="http://schemas.microsoft.com/office/2019/extlst" xmlns:r="http://schemas.openxmlformats.org/officeDocument/2006/relationships" xmlns:m="http://schemas.openxmlformats.org/officeDocument/2006/math" xmlns:v="urn:schemas-microsoft-com:vml" xmlns:wp14="http://schemas.microsoft.com/office/word/2010/wordprocessingDrawing" xmlns:wp="http://schemas.openxmlformats.org/drawingml/2006/wordprocessingDrawing" xmlns:w10="urn:schemas-microsoft-com:office:word" xmlns:w="http://schemas.openxmlformats.org/wordprocessingml/2006/main" xmlns:w14="http://schemas.microsoft.com/office/word/2010/wordml" xmlns:w15="http://schemas.microsoft.com/office/word/2012/wordml" xmlns:w16cei="http://schemas.microsoft.com/office/word/2026/wordml/cei" xmlns:w16cex="http://schemas.microsoft.com/office/word/2018/wordml/cex" xmlns:w16cid="http://schemas.microsoft.com/office/word/2016/wordml/cid" xmlns:w16="http://schemas.microsoft.com/office/word/2018/wordml" xmlns:w16du="http://schemas.microsoft.com/office/word/2023/wordml/word16du" xmlns:w16sdtdh="http://schemas.microsoft.com/office/word/2020/wordml/sdtdatahash" xmlns:w16sdtfl="http://schemas.microsoft.com/office/word/2024/wordml/sdtformatlock" xmlns:w16se="http://schemas.microsoft.com/office/word/2015/wordml/symex" xmlns:wpg="http://schemas.microsoft.com/office/word/2010/wordprocessingGroup" xmlns:wpi="http://schemas.microsoft.com/office/word/2010/wordprocessingInk" xmlns:wne="http://schemas.microsoft.com/office/word/2006/wordml" xmlns:wps="http://schemas.microsoft.com/office/word/2010/wordprocessingShape" mc:Ignorable="w14 w15 w16se w16cid w16 w16cex w16sdtdh w16sdtfl w16du wp14">
   <w:p>
     <w:pPr>
       <w:tabs>
@@ -1324,7 +1261,7 @@
 </file>
 
 <file path=word/footnotes.xml><?xml version="1.0" encoding="utf-8"?>
-<w:footnotes xmlns:wpc="http://schemas.microsoft.com/office/word/2010/wordprocessingCanvas" xmlns:cx="http://schemas.microsoft.com/office/drawing/2014/chartex" xmlns:cx1="http://schemas.microsoft.com/office/drawing/2015/9/8/chartex" xmlns:cx2="http://schemas.microsoft.com/office/drawing/2015/10/21/chartex" xmlns:cx3="http://schemas.microsoft.com/office/drawing/2016/5/9/chartex" xmlns:cx4="http://schemas.microsoft.com/office/drawing/2016/5/10/chartex" xmlns:cx5="http://schemas.microsoft.com/office/drawing/2016/5/11/chartex" xmlns:cx6="http://schemas.microsoft.com/office/drawing/2016/5/12/chartex" xmlns:cx7="http://schemas.microsoft.com/office/drawing/2016/5/13/chartex" xmlns:cx8="http://schemas.microsoft.com/office/drawing/2016/5/14/chartex" xmlns:mc="http://schemas.openxmlformats.org/markup-compatibility/2006" xmlns:m="http://schemas.openxmlformats.org/officeDocument/2006/math" xmlns:aink="http://schemas.microsoft.com/office/drawing/2016/ink" xmlns:am3d="http://schemas.microsoft.com/office/drawing/2017/model3d" xmlns:oel="http://schemas.microsoft.com/office/2019/extlst" xmlns:r="http://schemas.openxmlformats.org/officeDocument/2006/relationships" xmlns:wp14="http://schemas.microsoft.com/office/word/2010/wordprocessingDrawing" xmlns:wp="http://schemas.openxmlformats.org/drawingml/2006/wordprocessingDrawing" xmlns:wpg="http://schemas.microsoft.com/office/word/2010/wordprocessingGroup" xmlns:wpi="http://schemas.microsoft.com/office/word/2010/wordprocessingInk" xmlns:wps="http://schemas.microsoft.com/office/word/2010/wordprocessingShape" xmlns:o="urn:schemas-microsoft-com:office:office" xmlns:v="urn:schemas-microsoft-com:vml" xmlns:w10="urn:schemas-microsoft-com:office:word" xmlns:w="http://schemas.openxmlformats.org/wordprocessingml/2006/main" xmlns:w14="http://schemas.microsoft.com/office/word/2010/wordml" xmlns:w15="http://schemas.microsoft.com/office/word/2012/wordml" xmlns:w16cex="http://schemas.microsoft.com/office/word/2018/wordml/cex" xmlns:w16cid="http://schemas.microsoft.com/office/word/2016/wordml/cid" xmlns:w16="http://schemas.microsoft.com/office/word/2018/wordml" xmlns:w16sdtdh="http://schemas.microsoft.com/office/word/2020/wordml/sdtdatahash" xmlns:w16sdtfl="http://schemas.microsoft.com/office/word/2024/wordml/sdtformatlock" xmlns:w16se="http://schemas.microsoft.com/office/word/2015/wordml/symex" xmlns:w16du="http://schemas.microsoft.com/office/word/2023/wordml/word16du" xmlns:wne="http://schemas.microsoft.com/office/word/2006/wordml" mc:Ignorable="w14 w15 w16se w16cid w16 w16cex w16sdtdh w16sdtfl w16du wp14">
+<w:footnotes xmlns:wpc="http://schemas.microsoft.com/office/word/2010/wordprocessingCanvas" xmlns:cx="http://schemas.microsoft.com/office/drawing/2014/chartex" xmlns:cx1="http://schemas.microsoft.com/office/drawing/2015/9/8/chartex" xmlns:cx2="http://schemas.microsoft.com/office/drawing/2015/10/21/chartex" xmlns:cx3="http://schemas.microsoft.com/office/drawing/2016/5/9/chartex" xmlns:cx4="http://schemas.microsoft.com/office/drawing/2016/5/10/chartex" xmlns:cx5="http://schemas.microsoft.com/office/drawing/2016/5/11/chartex" xmlns:cx6="http://schemas.microsoft.com/office/drawing/2016/5/12/chartex" xmlns:cx7="http://schemas.microsoft.com/office/drawing/2016/5/13/chartex" xmlns:cx8="http://schemas.microsoft.com/office/drawing/2016/5/14/chartex" xmlns:mc="http://schemas.openxmlformats.org/markup-compatibility/2006" xmlns:aink="http://schemas.microsoft.com/office/drawing/2016/ink" xmlns:am3d="http://schemas.microsoft.com/office/drawing/2017/model3d" xmlns:o="urn:schemas-microsoft-com:office:office" xmlns:oel="http://schemas.microsoft.com/office/2019/extlst" xmlns:r="http://schemas.openxmlformats.org/officeDocument/2006/relationships" xmlns:m="http://schemas.openxmlformats.org/officeDocument/2006/math" xmlns:v="urn:schemas-microsoft-com:vml" xmlns:wp14="http://schemas.microsoft.com/office/word/2010/wordprocessingDrawing" xmlns:wp="http://schemas.openxmlformats.org/drawingml/2006/wordprocessingDrawing" xmlns:w10="urn:schemas-microsoft-com:office:word" xmlns:w="http://schemas.openxmlformats.org/wordprocessingml/2006/main" xmlns:w14="http://schemas.microsoft.com/office/word/2010/wordml" xmlns:w15="http://schemas.microsoft.com/office/word/2012/wordml" xmlns:w16cei="http://schemas.microsoft.com/office/word/2026/wordml/cei" xmlns:w16cex="http://schemas.microsoft.com/office/word/2018/wordml/cex" xmlns:w16cid="http://schemas.microsoft.com/office/word/2016/wordml/cid" xmlns:w16="http://schemas.microsoft.com/office/word/2018/wordml" xmlns:w16du="http://schemas.microsoft.com/office/word/2023/wordml/word16du" xmlns:w16sdtdh="http://schemas.microsoft.com/office/word/2020/wordml/sdtdatahash" xmlns:w16sdtfl="http://schemas.microsoft.com/office/word/2024/wordml/sdtformatlock" xmlns:w16se="http://schemas.microsoft.com/office/word/2015/wordml/symex" xmlns:wpg="http://schemas.microsoft.com/office/word/2010/wordprocessingGroup" xmlns:wpi="http://schemas.microsoft.com/office/word/2010/wordprocessingInk" xmlns:wne="http://schemas.microsoft.com/office/word/2006/wordml" xmlns:wps="http://schemas.microsoft.com/office/word/2010/wordprocessingShape" mc:Ignorable="w14 w15 w16se w16cid w16 w16cex w16sdtdh w16sdtfl w16du wp14">
   <w:footnote w:type="separator" w:id="-1">
     <w:p>
       <w:r>
@@ -1343,7 +1280,7 @@
 </file>
 
 <file path=word/header1.xml><?xml version="1.0" encoding="utf-8"?>
-<w:hdr xmlns:wpc="http://schemas.microsoft.com/office/word/2010/wordprocessingCanvas" xmlns:cx="http://schemas.microsoft.com/office/drawing/2014/chartex" xmlns:cx1="http://schemas.microsoft.com/office/drawing/2015/9/8/chartex" xmlns:cx2="http://schemas.microsoft.com/office/drawing/2015/10/21/chartex" xmlns:cx3="http://schemas.microsoft.com/office/drawing/2016/5/9/chartex" xmlns:cx4="http://schemas.microsoft.com/office/drawing/2016/5/10/chartex" xmlns:cx5="http://schemas.microsoft.com/office/drawing/2016/5/11/chartex" xmlns:cx6="http://schemas.microsoft.com/office/drawing/2016/5/12/chartex" xmlns:cx7="http://schemas.microsoft.com/office/drawing/2016/5/13/chartex" xmlns:cx8="http://schemas.microsoft.com/office/drawing/2016/5/14/chartex" xmlns:mc="http://schemas.openxmlformats.org/markup-compatibility/2006" xmlns:m="http://schemas.openxmlformats.org/officeDocument/2006/math" xmlns:aink="http://schemas.microsoft.com/office/drawing/2016/ink" xmlns:am3d="http://schemas.microsoft.com/office/drawing/2017/model3d" xmlns:oel="http://schemas.microsoft.com/office/2019/extlst" xmlns:r="http://schemas.openxmlformats.org/officeDocument/2006/relationships" xmlns:wp14="http://schemas.microsoft.com/office/word/2010/wordprocessingDrawing" xmlns:wp="http://schemas.openxmlformats.org/drawingml/2006/wordprocessingDrawing" xmlns:wpg="http://schemas.microsoft.com/office/word/2010/wordprocessingGroup" xmlns:wpi="http://schemas.microsoft.com/office/word/2010/wordprocessingInk" xmlns:wps="http://schemas.microsoft.com/office/word/2010/wordprocessingShape" xmlns:o="urn:schemas-microsoft-com:office:office" xmlns:v="urn:schemas-microsoft-com:vml" xmlns:w10="urn:schemas-microsoft-com:office:word" xmlns:w="http://schemas.openxmlformats.org/wordprocessingml/2006/main" xmlns:w14="http://schemas.microsoft.com/office/word/2010/wordml" xmlns:w15="http://schemas.microsoft.com/office/word/2012/wordml" xmlns:w16cex="http://schemas.microsoft.com/office/word/2018/wordml/cex" xmlns:w16cid="http://schemas.microsoft.com/office/word/2016/wordml/cid" xmlns:w16="http://schemas.microsoft.com/office/word/2018/wordml" xmlns:w16sdtdh="http://schemas.microsoft.com/office/word/2020/wordml/sdtdatahash" xmlns:w16sdtfl="http://schemas.microsoft.com/office/word/2024/wordml/sdtformatlock" xmlns:w16se="http://schemas.microsoft.com/office/word/2015/wordml/symex" xmlns:w16du="http://schemas.microsoft.com/office/word/2023/wordml/word16du" xmlns:wne="http://schemas.microsoft.com/office/word/2006/wordml" mc:Ignorable="w14 w15 w16se w16cid w16 w16cex w16sdtdh w16sdtfl w16du wp14">
+<w:hdr xmlns:wpc="http://schemas.microsoft.com/office/word/2010/wordprocessingCanvas" xmlns:cx="http://schemas.microsoft.com/office/drawing/2014/chartex" xmlns:cx1="http://schemas.microsoft.com/office/drawing/2015/9/8/chartex" xmlns:cx2="http://schemas.microsoft.com/office/drawing/2015/10/21/chartex" xmlns:cx3="http://schemas.microsoft.com/office/drawing/2016/5/9/chartex" xmlns:cx4="http://schemas.microsoft.com/office/drawing/2016/5/10/chartex" xmlns:cx5="http://schemas.microsoft.com/office/drawing/2016/5/11/chartex" xmlns:cx6="http://schemas.microsoft.com/office/drawing/2016/5/12/chartex" xmlns:cx7="http://schemas.microsoft.com/office/drawing/2016/5/13/chartex" xmlns:cx8="http://schemas.microsoft.com/office/drawing/2016/5/14/chartex" xmlns:mc="http://schemas.openxmlformats.org/markup-compatibility/2006" xmlns:aink="http://schemas.microsoft.com/office/drawing/2016/ink" xmlns:am3d="http://schemas.microsoft.com/office/drawing/2017/model3d" xmlns:o="urn:schemas-microsoft-com:office:office" xmlns:oel="http://schemas.microsoft.com/office/2019/extlst" xmlns:r="http://schemas.openxmlformats.org/officeDocument/2006/relationships" xmlns:m="http://schemas.openxmlformats.org/officeDocument/2006/math" xmlns:v="urn:schemas-microsoft-com:vml" xmlns:wp14="http://schemas.microsoft.com/office/word/2010/wordprocessingDrawing" xmlns:wp="http://schemas.openxmlformats.org/drawingml/2006/wordprocessingDrawing" xmlns:w10="urn:schemas-microsoft-com:office:word" xmlns:w="http://schemas.openxmlformats.org/wordprocessingml/2006/main" xmlns:w14="http://schemas.microsoft.com/office/word/2010/wordml" xmlns:w15="http://schemas.microsoft.com/office/word/2012/wordml" xmlns:w16cei="http://schemas.microsoft.com/office/word/2026/wordml/cei" xmlns:w16cex="http://schemas.microsoft.com/office/word/2018/wordml/cex" xmlns:w16cid="http://schemas.microsoft.com/office/word/2016/wordml/cid" xmlns:w16="http://schemas.microsoft.com/office/word/2018/wordml" xmlns:w16du="http://schemas.microsoft.com/office/word/2023/wordml/word16du" xmlns:w16sdtdh="http://schemas.microsoft.com/office/word/2020/wordml/sdtdatahash" xmlns:w16sdtfl="http://schemas.microsoft.com/office/word/2024/wordml/sdtformatlock" xmlns:w16se="http://schemas.microsoft.com/office/word/2015/wordml/symex" xmlns:wpg="http://schemas.microsoft.com/office/word/2010/wordprocessingGroup" xmlns:wpi="http://schemas.microsoft.com/office/word/2010/wordprocessingInk" xmlns:wne="http://schemas.microsoft.com/office/word/2006/wordml" xmlns:wps="http://schemas.microsoft.com/office/word/2010/wordprocessingShape" mc:Ignorable="w14 w15 w16se w16cid w16 w16cex w16sdtdh w16sdtfl w16du wp14">
   <w:p>
     <w:pPr>
       <w:pStyle w:val="Header"/>
@@ -1373,7 +1310,7 @@
 </file>
 
 <file path=word/header2.xml><?xml version="1.0" encoding="utf-8"?>
-<w:hdr xmlns:wpc="http://schemas.microsoft.com/office/word/2010/wordprocessingCanvas" xmlns:cx="http://schemas.microsoft.com/office/drawing/2014/chartex" xmlns:cx1="http://schemas.microsoft.com/office/drawing/2015/9/8/chartex" xmlns:cx2="http://schemas.microsoft.com/office/drawing/2015/10/21/chartex" xmlns:cx3="http://schemas.microsoft.com/office/drawing/2016/5/9/chartex" xmlns:cx4="http://schemas.microsoft.com/office/drawing/2016/5/10/chartex" xmlns:cx5="http://schemas.microsoft.com/office/drawing/2016/5/11/chartex" xmlns:cx6="http://schemas.microsoft.com/office/drawing/2016/5/12/chartex" xmlns:cx7="http://schemas.microsoft.com/office/drawing/2016/5/13/chartex" xmlns:cx8="http://schemas.microsoft.com/office/drawing/2016/5/14/chartex" xmlns:mc="http://schemas.openxmlformats.org/markup-compatibility/2006" xmlns:m="http://schemas.openxmlformats.org/officeDocument/2006/math" xmlns:aink="http://schemas.microsoft.com/office/drawing/2016/ink" xmlns:am3d="http://schemas.microsoft.com/office/drawing/2017/model3d" xmlns:oel="http://schemas.microsoft.com/office/2019/extlst" xmlns:r="http://schemas.openxmlformats.org/officeDocument/2006/relationships" xmlns:wp14="http://schemas.microsoft.com/office/word/2010/wordprocessingDrawing" xmlns:wp="http://schemas.openxmlformats.org/drawingml/2006/wordprocessingDrawing" xmlns:wpg="http://schemas.microsoft.com/office/word/2010/wordprocessingGroup" xmlns:wpi="http://schemas.microsoft.com/office/word/2010/wordprocessingInk" xmlns:wps="http://schemas.microsoft.com/office/word/2010/wordprocessingShape" xmlns:o="urn:schemas-microsoft-com:office:office" xmlns:v="urn:schemas-microsoft-com:vml" xmlns:w10="urn:schemas-microsoft-com:office:word" xmlns:w="http://schemas.openxmlformats.org/wordprocessingml/2006/main" xmlns:w14="http://schemas.microsoft.com/office/word/2010/wordml" xmlns:w15="http://schemas.microsoft.com/office/word/2012/wordml" xmlns:w16cex="http://schemas.microsoft.com/office/word/2018/wordml/cex" xmlns:w16cid="http://schemas.microsoft.com/office/word/2016/wordml/cid" xmlns:w16="http://schemas.microsoft.com/office/word/2018/wordml" xmlns:w16sdtdh="http://schemas.microsoft.com/office/word/2020/wordml/sdtdatahash" xmlns:w16sdtfl="http://schemas.microsoft.com/office/word/2024/wordml/sdtformatlock" xmlns:w16se="http://schemas.microsoft.com/office/word/2015/wordml/symex" xmlns:w16du="http://schemas.microsoft.com/office/word/2023/wordml/word16du" xmlns:wne="http://schemas.microsoft.com/office/word/2006/wordml" mc:Ignorable="w14 w15 w16se w16cid w16 w16cex w16sdtdh w16sdtfl w16du wp14">
+<w:hdr xmlns:wpc="http://schemas.microsoft.com/office/word/2010/wordprocessingCanvas" xmlns:cx="http://schemas.microsoft.com/office/drawing/2014/chartex" xmlns:cx1="http://schemas.microsoft.com/office/drawing/2015/9/8/chartex" xmlns:cx2="http://schemas.microsoft.com/office/drawing/2015/10/21/chartex" xmlns:cx3="http://schemas.microsoft.com/office/drawing/2016/5/9/chartex" xmlns:cx4="http://schemas.microsoft.com/office/drawing/2016/5/10/chartex" xmlns:cx5="http://schemas.microsoft.com/office/drawing/2016/5/11/chartex" xmlns:cx6="http://schemas.microsoft.com/office/drawing/2016/5/12/chartex" xmlns:cx7="http://schemas.microsoft.com/office/drawing/2016/5/13/chartex" xmlns:cx8="http://schemas.microsoft.com/office/drawing/2016/5/14/chartex" xmlns:mc="http://schemas.openxmlformats.org/markup-compatibility/2006" xmlns:aink="http://schemas.microsoft.com/office/drawing/2016/ink" xmlns:am3d="http://schemas.microsoft.com/office/drawing/2017/model3d" xmlns:o="urn:schemas-microsoft-com:office:office" xmlns:oel="http://schemas.microsoft.com/office/2019/extlst" xmlns:r="http://schemas.openxmlformats.org/officeDocument/2006/relationships" xmlns:m="http://schemas.openxmlformats.org/officeDocument/2006/math" xmlns:v="urn:schemas-microsoft-com:vml" xmlns:wp14="http://schemas.microsoft.com/office/word/2010/wordprocessingDrawing" xmlns:wp="http://schemas.openxmlformats.org/drawingml/2006/wordprocessingDrawing" xmlns:w10="urn:schemas-microsoft-com:office:word" xmlns:w="http://schemas.openxmlformats.org/wordprocessingml/2006/main" xmlns:w14="http://schemas.microsoft.com/office/word/2010/wordml" xmlns:w15="http://schemas.microsoft.com/office/word/2012/wordml" xmlns:w16cei="http://schemas.microsoft.com/office/word/2026/wordml/cei" xmlns:w16cex="http://schemas.microsoft.com/office/word/2018/wordml/cex" xmlns:w16cid="http://schemas.microsoft.com/office/word/2016/wordml/cid" xmlns:w16="http://schemas.microsoft.com/office/word/2018/wordml" xmlns:w16du="http://schemas.microsoft.com/office/word/2023/wordml/word16du" xmlns:w16sdtdh="http://schemas.microsoft.com/office/word/2020/wordml/sdtdatahash" xmlns:w16sdtfl="http://schemas.microsoft.com/office/word/2024/wordml/sdtformatlock" xmlns:w16se="http://schemas.microsoft.com/office/word/2015/wordml/symex" xmlns:wpg="http://schemas.microsoft.com/office/word/2010/wordprocessingGroup" xmlns:wpi="http://schemas.microsoft.com/office/word/2010/wordprocessingInk" xmlns:wne="http://schemas.microsoft.com/office/word/2006/wordml" xmlns:wps="http://schemas.microsoft.com/office/word/2010/wordprocessingShape" mc:Ignorable="w14 w15 w16se w16cid w16 w16cex w16sdtdh w16sdtfl w16du wp14">
   <w:p>
     <w:pPr>
       <w:pStyle w:val="Header"/>
@@ -1514,7 +1451,7 @@
             </wp:anchor>
           </w:drawing>
         </mc:Choice>
-        <mc:Fallback xmlns:w16cei="http://schemas.microsoft.com/office/word/2026/wordml/cei">
+        <mc:Fallback>
           <w:pict>
             <v:shapetype w14:anchorId="6DE74C12" id="_x0000_t202" coordsize="21600,21600" o:spt="202" path="m,l,21600r21600,l21600,xe">
               <v:stroke joinstyle="miter"/>
@@ -1721,7 +1658,7 @@
 </file>
 
 <file path=word/numbering.xml><?xml version="1.0" encoding="utf-8"?>
-<w:numbering xmlns:wpc="http://schemas.microsoft.com/office/word/2010/wordprocessingCanvas" xmlns:cx="http://schemas.microsoft.com/office/drawing/2014/chartex" xmlns:cx1="http://schemas.microsoft.com/office/drawing/2015/9/8/chartex" xmlns:cx2="http://schemas.microsoft.com/office/drawing/2015/10/21/chartex" xmlns:cx3="http://schemas.microsoft.com/office/drawing/2016/5/9/chartex" xmlns:cx4="http://schemas.microsoft.com/office/drawing/2016/5/10/chartex" xmlns:cx5="http://schemas.microsoft.com/office/drawing/2016/5/11/chartex" xmlns:cx6="http://schemas.microsoft.com/office/drawing/2016/5/12/chartex" xmlns:cx7="http://schemas.microsoft.com/office/drawing/2016/5/13/chartex" xmlns:cx8="http://schemas.microsoft.com/office/drawing/2016/5/14/chartex" xmlns:mc="http://schemas.openxmlformats.org/markup-compatibility/2006" xmlns:m="http://schemas.openxmlformats.org/officeDocument/2006/math" xmlns:aink="http://schemas.microsoft.com/office/drawing/2016/ink" xmlns:am3d="http://schemas.microsoft.com/office/drawing/2017/model3d" xmlns:oel="http://schemas.microsoft.com/office/2019/extlst" xmlns:r="http://schemas.openxmlformats.org/officeDocument/2006/relationships" xmlns:wp14="http://schemas.microsoft.com/office/word/2010/wordprocessingDrawing" xmlns:wp="http://schemas.openxmlformats.org/drawingml/2006/wordprocessingDrawing" xmlns:wpg="http://schemas.microsoft.com/office/word/2010/wordprocessingGroup" xmlns:wpi="http://schemas.microsoft.com/office/word/2010/wordprocessingInk" xmlns:wps="http://schemas.microsoft.com/office/word/2010/wordprocessingShape" xmlns:o="urn:schemas-microsoft-com:office:office" xmlns:v="urn:schemas-microsoft-com:vml" xmlns:w10="urn:schemas-microsoft-com:office:word" xmlns:w="http://schemas.openxmlformats.org/wordprocessingml/2006/main" xmlns:w14="http://schemas.microsoft.com/office/word/2010/wordml" xmlns:w15="http://schemas.microsoft.com/office/word/2012/wordml" xmlns:w16cex="http://schemas.microsoft.com/office/word/2018/wordml/cex" xmlns:w16cid="http://schemas.microsoft.com/office/word/2016/wordml/cid" xmlns:w16="http://schemas.microsoft.com/office/word/2018/wordml" xmlns:w16sdtdh="http://schemas.microsoft.com/office/word/2020/wordml/sdtdatahash" xmlns:w16sdtfl="http://schemas.microsoft.com/office/word/2024/wordml/sdtformatlock" xmlns:w16se="http://schemas.microsoft.com/office/word/2015/wordml/symex" xmlns:w16du="http://schemas.microsoft.com/office/word/2023/wordml/word16du" xmlns:wne="http://schemas.microsoft.com/office/word/2006/wordml" mc:Ignorable="w14 w15 w16se w16cid w16 w16cex w16sdtdh w16sdtfl w16du wp14">
+<w:numbering xmlns:wpc="http://schemas.microsoft.com/office/word/2010/wordprocessingCanvas" xmlns:cx="http://schemas.microsoft.com/office/drawing/2014/chartex" xmlns:cx1="http://schemas.microsoft.com/office/drawing/2015/9/8/chartex" xmlns:cx2="http://schemas.microsoft.com/office/drawing/2015/10/21/chartex" xmlns:cx3="http://schemas.microsoft.com/office/drawing/2016/5/9/chartex" xmlns:cx4="http://schemas.microsoft.com/office/drawing/2016/5/10/chartex" xmlns:cx5="http://schemas.microsoft.com/office/drawing/2016/5/11/chartex" xmlns:cx6="http://schemas.microsoft.com/office/drawing/2016/5/12/chartex" xmlns:cx7="http://schemas.microsoft.com/office/drawing/2016/5/13/chartex" xmlns:cx8="http://schemas.microsoft.com/office/drawing/2016/5/14/chartex" xmlns:mc="http://schemas.openxmlformats.org/markup-compatibility/2006" xmlns:aink="http://schemas.microsoft.com/office/drawing/2016/ink" xmlns:am3d="http://schemas.microsoft.com/office/drawing/2017/model3d" xmlns:o="urn:schemas-microsoft-com:office:office" xmlns:oel="http://schemas.microsoft.com/office/2019/extlst" xmlns:r="http://schemas.openxmlformats.org/officeDocument/2006/relationships" xmlns:m="http://schemas.openxmlformats.org/officeDocument/2006/math" xmlns:v="urn:schemas-microsoft-com:vml" xmlns:wp14="http://schemas.microsoft.com/office/word/2010/wordprocessingDrawing" xmlns:wp="http://schemas.openxmlformats.org/drawingml/2006/wordprocessingDrawing" xmlns:w10="urn:schemas-microsoft-com:office:word" xmlns:w="http://schemas.openxmlformats.org/wordprocessingml/2006/main" xmlns:w14="http://schemas.microsoft.com/office/word/2010/wordml" xmlns:w15="http://schemas.microsoft.com/office/word/2012/wordml" xmlns:w16cei="http://schemas.microsoft.com/office/word/2026/wordml/cei" xmlns:w16cex="http://schemas.microsoft.com/office/word/2018/wordml/cex" xmlns:w16cid="http://schemas.microsoft.com/office/word/2016/wordml/cid" xmlns:w16="http://schemas.microsoft.com/office/word/2018/wordml" xmlns:w16du="http://schemas.microsoft.com/office/word/2023/wordml/word16du" xmlns:w16sdtdh="http://schemas.microsoft.com/office/word/2020/wordml/sdtdatahash" xmlns:w16sdtfl="http://schemas.microsoft.com/office/word/2024/wordml/sdtformatlock" xmlns:w16se="http://schemas.microsoft.com/office/word/2015/wordml/symex" xmlns:wpg="http://schemas.microsoft.com/office/word/2010/wordprocessingGroup" xmlns:wpi="http://schemas.microsoft.com/office/word/2010/wordprocessingInk" xmlns:wne="http://schemas.microsoft.com/office/word/2006/wordml" xmlns:wps="http://schemas.microsoft.com/office/word/2010/wordprocessingShape" mc:Ignorable="w14 w15 w16se w16cid w16 w16cex w16sdtdh w16sdtfl w16du wp14">
   <w:abstractNum w:abstractNumId="0" w15:restartNumberingAfterBreak="0">
     <w:nsid w:val="061B5C9E"/>
     <w:multiLevelType w:val="hybridMultilevel"/>
@@ -2568,7 +2505,7 @@
 </file>
 
 <file path=word/styles.xml><?xml version="1.0" encoding="utf-8"?>
-<w:styles xmlns:mc="http://schemas.openxmlformats.org/markup-compatibility/2006" xmlns:r="http://schemas.openxmlformats.org/officeDocument/2006/relationships" xmlns:w="http://schemas.openxmlformats.org/wordprocessingml/2006/main" xmlns:w14="http://schemas.microsoft.com/office/word/2010/wordml" xmlns:w15="http://schemas.microsoft.com/office/word/2012/wordml" xmlns:w16cex="http://schemas.microsoft.com/office/word/2018/wordml/cex" xmlns:w16cid="http://schemas.microsoft.com/office/word/2016/wordml/cid" xmlns:w16="http://schemas.microsoft.com/office/word/2018/wordml" xmlns:w16sdtdh="http://schemas.microsoft.com/office/word/2020/wordml/sdtdatahash" xmlns:w16sdtfl="http://schemas.microsoft.com/office/word/2024/wordml/sdtformatlock" xmlns:w16se="http://schemas.microsoft.com/office/word/2015/wordml/symex" xmlns:w16du="http://schemas.microsoft.com/office/word/2023/wordml/word16du" mc:Ignorable="w14 w15 w16se w16cid w16 w16cex w16sdtdh w16sdtfl w16du">
+<w:styles xmlns:mc="http://schemas.openxmlformats.org/markup-compatibility/2006" xmlns:r="http://schemas.openxmlformats.org/officeDocument/2006/relationships" xmlns:w="http://schemas.openxmlformats.org/wordprocessingml/2006/main" xmlns:w14="http://schemas.microsoft.com/office/word/2010/wordml" xmlns:w15="http://schemas.microsoft.com/office/word/2012/wordml" xmlns:w16cex="http://schemas.microsoft.com/office/word/2018/wordml/cex" xmlns:w16cid="http://schemas.microsoft.com/office/word/2016/wordml/cid" xmlns:w16="http://schemas.microsoft.com/office/word/2018/wordml" xmlns:w16du="http://schemas.microsoft.com/office/word/2023/wordml/word16du" xmlns:w16sdtdh="http://schemas.microsoft.com/office/word/2020/wordml/sdtdatahash" xmlns:w16sdtfl="http://schemas.microsoft.com/office/word/2024/wordml/sdtformatlock" xmlns:w16se="http://schemas.microsoft.com/office/word/2015/wordml/symex" mc:Ignorable="w14 w15 w16se w16cid w16 w16cex w16sdtdh w16sdtfl w16du">
   <w:docDefaults>
     <w:rPrDefault>
       <w:rPr>
@@ -3742,10 +3679,6 @@
 </file>
 
 <file path=customXml/item1.xml><?xml version="1.0" encoding="utf-8"?>
-<b:Sources xmlns:b="http://schemas.openxmlformats.org/officeDocument/2006/bibliography" xmlns="http://schemas.openxmlformats.org/officeDocument/2006/bibliography" SelectedStyle="\APA.XSL" StyleName="APA"/>
-</file>
-
-<file path=customXml/item2.xml><?xml version="1.0" encoding="utf-8"?>
 <p:properties xmlns:p="http://schemas.microsoft.com/office/2006/metadata/properties" xmlns:xsi="http://www.w3.org/2001/XMLSchema-instance" xmlns:pc="http://schemas.microsoft.com/office/infopath/2007/PartnerControls">
   <documentManagement>
     <TaxCatchAll xmlns="38d2a309-d798-495b-b1a3-e97c37808eef"/>
@@ -3758,16 +3691,11 @@
 </p:properties>
 </file>
 
-<file path=customXml/item3.xml><?xml version="1.0" encoding="utf-8"?>
-<?mso-contentType ?>
-<FormTemplates xmlns="http://schemas.microsoft.com/sharepoint/v3/contenttype/forms">
-  <Display>DocumentLibraryForm</Display>
-  <Edit>DocumentLibraryForm</Edit>
-  <New>DocumentLibraryForm</New>
-</FormTemplates>
+<file path=customXml/item2.xml><?xml version="1.0" encoding="utf-8"?>
+<b:Sources xmlns:b="http://schemas.openxmlformats.org/officeDocument/2006/bibliography" xmlns="http://schemas.openxmlformats.org/officeDocument/2006/bibliography" SelectedStyle="\APA.XSL" StyleName="APA"/>
 </file>
 
-<file path=customXml/item4.xml><?xml version="1.0" encoding="utf-8"?>
+<file path=customXml/item3.xml><?xml version="1.0" encoding="utf-8"?>
 <ct:contentTypeSchema xmlns:ct="http://schemas.microsoft.com/office/2006/metadata/contentType" xmlns:ma="http://schemas.microsoft.com/office/2006/metadata/properties/metaAttributes" ct:_="" ma:_="" ma:contentTypeName="Document" ma:contentTypeID="0x010100E48B1925F2EFB241960044EC5F64C034" ma:contentTypeVersion="16" ma:contentTypeDescription="Create a new document." ma:contentTypeScope="" ma:versionID="b193f1a1adb628ee5f7d642c4cb4fead">
   <xsd:schema xmlns:xsd="http://www.w3.org/2001/XMLSchema" xmlns:xs="http://www.w3.org/2001/XMLSchema" xmlns:p="http://schemas.microsoft.com/office/2006/metadata/properties" xmlns:ns1="http://schemas.microsoft.com/sharepoint/v3" xmlns:ns2="416eecfc-56a7-4354-8013-4a2d9c92e153" xmlns:ns3="38d2a309-d798-495b-b1a3-e97c37808eef" targetNamespace="http://schemas.microsoft.com/office/2006/metadata/properties" ma:root="true" ma:fieldsID="f4c72206c132b1461c2865266b50231c" ns1:_="" ns2:_="" ns3:_="">
     <xsd:import namespace="http://schemas.microsoft.com/sharepoint/v3"/>
@@ -4013,15 +3941,16 @@
 </ct:contentTypeSchema>
 </file>
 
-<file path=customXml/itemProps1.xml><?xml version="1.0" encoding="utf-8"?>
-<ds:datastoreItem xmlns:ds="http://schemas.openxmlformats.org/officeDocument/2006/customXml" ds:itemID="{4202E056-596C-4D43-866F-DBCC294656E0}">
-  <ds:schemaRefs>
-    <ds:schemaRef ds:uri="http://schemas.openxmlformats.org/officeDocument/2006/bibliography"/>
-  </ds:schemaRefs>
-</ds:datastoreItem>
+<file path=customXml/item4.xml><?xml version="1.0" encoding="utf-8"?>
+<?mso-contentType ?>
+<FormTemplates xmlns="http://schemas.microsoft.com/sharepoint/v3/contenttype/forms">
+  <Display>DocumentLibraryForm</Display>
+  <Edit>DocumentLibraryForm</Edit>
+  <New>DocumentLibraryForm</New>
+</FormTemplates>
 </file>
 
-<file path=customXml/itemProps2.xml><?xml version="1.0" encoding="utf-8"?>
+<file path=customXml/itemProps1.xml><?xml version="1.0" encoding="utf-8"?>
 <ds:datastoreItem xmlns:ds="http://schemas.openxmlformats.org/officeDocument/2006/customXml" ds:itemID="{5D491C04-0035-45EA-BE2E-2976A5F7A397}">
   <ds:schemaRefs>
     <ds:schemaRef ds:uri="http://schemas.microsoft.com/office/2006/metadata/properties"/>
@@ -4033,15 +3962,15 @@
 </ds:datastoreItem>
 </file>
 
-<file path=customXml/itemProps3.xml><?xml version="1.0" encoding="utf-8"?>
-<ds:datastoreItem xmlns:ds="http://schemas.openxmlformats.org/officeDocument/2006/customXml" ds:itemID="{2ACA00A0-0EB9-4F25-B1A0-9480A1DEA0B5}">
+<file path=customXml/itemProps2.xml><?xml version="1.0" encoding="utf-8"?>
+<ds:datastoreItem xmlns:ds="http://schemas.openxmlformats.org/officeDocument/2006/customXml" ds:itemID="{4202E056-596C-4D43-866F-DBCC294656E0}">
   <ds:schemaRefs>
-    <ds:schemaRef ds:uri="http://schemas.microsoft.com/sharepoint/v3/contenttype/forms"/>
+    <ds:schemaRef ds:uri="http://schemas.openxmlformats.org/officeDocument/2006/bibliography"/>
   </ds:schemaRefs>
 </ds:datastoreItem>
 </file>
 
-<file path=customXml/itemProps4.xml><?xml version="1.0" encoding="utf-8"?>
+<file path=customXml/itemProps3.xml><?xml version="1.0" encoding="utf-8"?>
 <ds:datastoreItem xmlns:ds="http://schemas.openxmlformats.org/officeDocument/2006/customXml" ds:itemID="{3AA634C4-AFF1-45A4-BEEC-3BC128C36838}">
   <ds:schemaRefs>
     <ds:schemaRef ds:uri="http://schemas.microsoft.com/office/2006/metadata/contentType"/>
@@ -4061,6 +3990,14 @@
 </ds:datastoreItem>
 </file>
 
+<file path=customXml/itemProps4.xml><?xml version="1.0" encoding="utf-8"?>
+<ds:datastoreItem xmlns:ds="http://schemas.openxmlformats.org/officeDocument/2006/customXml" ds:itemID="{2ACA00A0-0EB9-4F25-B1A0-9480A1DEA0B5}">
+  <ds:schemaRefs>
+    <ds:schemaRef ds:uri="http://schemas.microsoft.com/sharepoint/v3/contenttype/forms"/>
+  </ds:schemaRefs>
+</ds:datastoreItem>
+</file>
+
 <file path=docMetadata/LabelInfo.xml><?xml version="1.0" encoding="utf-8"?>
 <clbl:labelList xmlns:clbl="http://schemas.microsoft.com/office/2020/mipLabelMetadata">
   <clbl:label id="{3de9faa6-9fe1-49b3-9a08-227a296b54a6}" enabled="1" method="Privileged" siteId="{66d73691-ea97-48b1-95d5-e94f0a46b878}" contentBits="0" removed="0"/>

</xml_diff>